<commit_message>
Bring back more original wording for Tobiko experience from main branch
</commit_message>
<xml_diff>
--- a/resume.docx
+++ b/resume.docx
@@ -373,7 +373,7 @@
         </w:numPr>
       </w:pPr>
       <w:r>
-        <w:t xml:space="preserve">Designed and operated a scalable cloud platform enabling engineering teams to deliver production workloads faster, with a focus on reliability, security, and operational excellence.</w:t>
+        <w:t xml:space="preserve">Collaborated with a fast-paced team to architect and implement a robust, scalable, modern cloud platform serving customer workloads.</w:t>
       </w:r>
     </w:p>
     <w:p>
@@ -385,7 +385,7 @@
         </w:numPr>
       </w:pPr>
       <w:r>
-        <w:t xml:space="preserve">Built and maintained CI/CD pipelines enabling automated build, test, and deployment workflows, reducing manual intervention and improving delivery speed.</w:t>
+        <w:t xml:space="preserve">Built out CI/CD patterns including mono-repo conditional workflows, workload identity federation, and continuous delivery.</w:t>
       </w:r>
     </w:p>
     <w:p>
@@ -397,7 +397,7 @@
         </w:numPr>
       </w:pPr>
       <w:r>
-        <w:t xml:space="preserve">Operated Kubernetes-based platforms across cloud environments, supporting containerized services with strong observability and incident response practices.</w:t>
+        <w:t xml:space="preserve">Implemented a Slack-based customer support and incident response platform, and onboarded teammates and customers.</w:t>
       </w:r>
     </w:p>
     <w:p>
@@ -409,19 +409,7 @@
         </w:numPr>
       </w:pPr>
       <w:r>
-        <w:t xml:space="preserve">Implemented infrastructure as code and automation patterns to ensure consistency, scalability, and repeatable deployments.</w:t>
-      </w:r>
-    </w:p>
-    <w:p>
-      <w:pPr>
-        <w:pStyle w:val="Compact"/>
-        <w:numPr>
-          <w:ilvl w:val="0"/>
-          <w:numId w:val="1003"/>
-        </w:numPr>
-      </w:pPr>
-      <w:r>
-        <w:t xml:space="preserve">Partnered cross-functionally with engineering and operations teams to improve platform stability and developer workflows.</w:t>
+        <w:t xml:space="preserve">Python, Pulumi, Google Cloud Platform, Google Kubernetes Engine, Google Cloud Run, CI/CD with CircleCI, Helm, SQLMesh.</w:t>
       </w:r>
     </w:p>
     <w:bookmarkEnd w:id="27"/>
@@ -453,7 +441,7 @@
         </w:numPr>
       </w:pPr>
       <w:r>
-        <w:t xml:space="preserve">Led large-scale modernization initiatives, reducing technical debt by standardizing CI/CD, improving test automation, and introducing tooling patterns that accelerated developer velocity and reduced operational load.</w:t>
+        <w:t xml:space="preserve">Led the design, operation, and evolution of mission-critical infrastructure platforms supporting large-scale, distributed production systems.</w:t>
       </w:r>
     </w:p>
     <w:p>
@@ -465,7 +453,7 @@
         </w:numPr>
       </w:pPr>
       <w:r>
-        <w:t xml:space="preserve">Led the design, operation, and evolution of mission-critical infrastructure platforms supporting large-scale, distributed production systems.</w:t>
+        <w:t xml:space="preserve">Recruited and led an infrastructure and DevOps team, driving adoption of modern SRE and cloud-native practices across the organization.</w:t>
       </w:r>
     </w:p>
     <w:p>
@@ -477,7 +465,7 @@
         </w:numPr>
       </w:pPr>
       <w:r>
-        <w:t xml:space="preserve">Recruited and led an infrastructure and DevOps team, driving adoption of modern SRE and cloud-native practices across the organization.</w:t>
+        <w:t xml:space="preserve">Reduced technical debt by standardizing CI/CD pipelines, improving test automation, and transitioning legacy infrastructure to modern, cloud-native tooling.</w:t>
       </w:r>
     </w:p>
     <w:p>

</xml_diff>

<commit_message>
Bring back more original wording for Mavenlink experience
</commit_message>
<xml_diff>
--- a/resume.docx
+++ b/resume.docx
@@ -293,7 +293,7 @@
         </w:numPr>
       </w:pPr>
       <w:r>
-        <w:t xml:space="preserve">Co-architecting HumaneBench.ai, an open-source benchmark for evaluating AI systems against humane technology principles.</w:t>
+        <w:t xml:space="preserve">Co-architecting and leading development of HumaneBench.ai, an open-source benchmark for evaluating AI systems against humane technology principles.</w:t>
       </w:r>
     </w:p>
     <w:p>
@@ -414,13 +414,13 @@
     </w:p>
     <w:bookmarkEnd w:id="27"/>
     <w:bookmarkEnd w:id="28"/>
-    <w:bookmarkStart w:id="30" w:name="principal-devops-engineer"/>
+    <w:bookmarkStart w:id="30" w:name="X7a2c313efdde198d901363c762c81839771c845"/>
     <w:p>
       <w:pPr>
         <w:pStyle w:val="Heading3"/>
       </w:pPr>
       <w:r>
-        <w:t xml:space="preserve">Principal DevOps Engineer</w:t>
+        <w:t xml:space="preserve">Engineering Manager / Principal Software Engineer</w:t>
       </w:r>
     </w:p>
     <w:bookmarkStart w:id="29" w:name="X47289269eb944414c9285d314973b45c253bcef"/>
@@ -441,7 +441,14 @@
         </w:numPr>
       </w:pPr>
       <w:r>
-        <w:t xml:space="preserve">Led the design, operation, and evolution of mission-critical infrastructure platforms supporting large-scale, distributed production systems.</w:t>
+        <w:rPr>
+          <w:b/>
+          <w:bCs/>
+        </w:rPr>
+        <w:t xml:space="preserve">Operations Team Leadership</w:t>
+      </w:r>
+      <w:r>
+        <w:t xml:space="preserve">: Over four years, recruited and led a new infrastructure team dedicated to building and scaling the platform. Instrumental in leading the organization’s transition towards a DevOps culture, serving as a change agent and technical authority across engineering. Created a clear, calm, and constructive environment that allowed the team to thrive. Responsible for roadmap stewardship, untangling requirements, and arranging priorities to maximize flow. Transitioned a large legacy infrastructure codebase to cutting-edge, cloud-native, IAC-oriented tools while remaining hands-on with coding, architecture, and collaboration on mission-critical projects.</w:t>
       </w:r>
     </w:p>
     <w:p>
@@ -453,7 +460,14 @@
         </w:numPr>
       </w:pPr>
       <w:r>
-        <w:t xml:space="preserve">Recruited and led an infrastructure and DevOps team, driving adoption of modern SRE and cloud-native practices across the organization.</w:t>
+        <w:rPr>
+          <w:b/>
+          <w:bCs/>
+        </w:rPr>
+        <w:t xml:space="preserve">M-Bridge Platform Leadership</w:t>
+      </w:r>
+      <w:r>
+        <w:t xml:space="preserve">: For two years, spearheaded a team to stabilize and enhance an agent-based integration platform. Established operational metrics and monitoring systems that reduced platform errors and incidents by approximately 100x. Successfully performed a migration to Kubernetes with zero downtime, including relational, document, and cache databases. Demonstrated ability to measure impact and drive data-informed decisions.</w:t>
       </w:r>
     </w:p>
     <w:p>
@@ -465,7 +479,14 @@
         </w:numPr>
       </w:pPr>
       <w:r>
-        <w:t xml:space="preserve">Reduced technical debt by standardizing CI/CD pipelines, improving test automation, and transitioning legacy infrastructure to modern, cloud-native tooling.</w:t>
+        <w:rPr>
+          <w:b/>
+          <w:bCs/>
+        </w:rPr>
+        <w:t xml:space="preserve">Insights Platform Leadership</w:t>
+      </w:r>
+      <w:r>
+        <w:t xml:space="preserve">: For three months, led a transition team responsible for overseeing and improving the BI data pipeline. Successfully migrated the pipeline to Kubernetes, accelerating modernization initiatives.</w:t>
       </w:r>
     </w:p>
     <w:p>
@@ -477,43 +498,14 @@
         </w:numPr>
       </w:pPr>
       <w:r>
-        <w:t xml:space="preserve">Migrated legacy infrastructure to Kubernetes-based platforms using infrastructure-as-code tooling, achieving zero-downtime deployments for critical services.</w:t>
-      </w:r>
-    </w:p>
-    <w:p>
-      <w:pPr>
-        <w:pStyle w:val="Compact"/>
-        <w:numPr>
-          <w:ilvl w:val="0"/>
-          <w:numId w:val="1004"/>
-        </w:numPr>
-      </w:pPr>
-      <w:r>
-        <w:t xml:space="preserve">Designed and operated CI/CD pipelines for secure software delivery across multiple environments, integrating automated testing, deployment, and observability.</w:t>
-      </w:r>
-    </w:p>
-    <w:p>
-      <w:pPr>
-        <w:pStyle w:val="Compact"/>
-        <w:numPr>
-          <w:ilvl w:val="0"/>
-          <w:numId w:val="1004"/>
-        </w:numPr>
-      </w:pPr>
-      <w:r>
-        <w:t xml:space="preserve">Established operational metrics and monitoring systems that reduced platform errors and production incidents by ~100x.</w:t>
-      </w:r>
-    </w:p>
-    <w:p>
-      <w:pPr>
-        <w:pStyle w:val="Compact"/>
-        <w:numPr>
-          <w:ilvl w:val="0"/>
-          <w:numId w:val="1004"/>
-        </w:numPr>
-      </w:pPr>
-      <w:r>
-        <w:t xml:space="preserve">Collaborated closely with application engineers, security stakeholders, and leadership to ensure systems met reliability, scalability, and security requirements.</w:t>
+        <w:rPr>
+          <w:b/>
+          <w:bCs/>
+        </w:rPr>
+        <w:t xml:space="preserve">Cross-Functional Leadership &amp; Organizational Impact</w:t>
+      </w:r>
+      <w:r>
+        <w:t xml:space="preserve">: Took on organization-wide roles including mentorship and coaching, interviewing and hiring, and organizational change management and process optimization. Influenced decisions at all levels and promoted best practices across the engineering organization. Recognized with Top Performer Award in 2021 for contributions to technical excellence and team development.</w:t>
       </w:r>
     </w:p>
     <w:bookmarkEnd w:id="29"/>

</xml_diff>

<commit_message>
Tailor resume for Aircall AI Productivity Engineer
Co-Authored-By: Claude Opus 4.6 <noreply@anthropic.com>
</commit_message>
<xml_diff>
--- a/resume.docx
+++ b/resume.docx
@@ -2,7 +2,7 @@
 <file path=word/document.xml><?xml version="1.0" encoding="utf-8"?>
 <w:document xmlns:w="http://schemas.openxmlformats.org/wordprocessingml/2006/main" xmlns:m="http://schemas.openxmlformats.org/officeDocument/2006/math" xmlns:r="http://schemas.openxmlformats.org/officeDocument/2006/relationships" xmlns:o="urn:schemas-microsoft-com:office:office" xmlns:v="urn:schemas-microsoft-com:vml" xmlns:w10="urn:schemas-microsoft-com:office:word" xmlns:a="http://schemas.openxmlformats.org/drawingml/2006/main" xmlns:pic="http://schemas.openxmlformats.org/drawingml/2006/picture" xmlns:wp="http://schemas.openxmlformats.org/drawingml/2006/wordprocessingDrawing">
   <w:body>
-    <w:bookmarkStart w:id="46" w:name="jack-senechal"/>
+    <w:bookmarkStart w:id="47" w:name="jack-senechal"/>
     <w:p>
       <w:pPr>
         <w:pStyle w:val="Heading1"/>
@@ -11,13 +11,13 @@
         <w:t xml:space="preserve">Jack Senechal</w:t>
       </w:r>
     </w:p>
-    <w:bookmarkStart w:id="23" w:name="engineering-leader-entrepreneur"/>
+    <w:bookmarkStart w:id="23" w:name="X685a3cd5501c646c8585e056574d55bd0c774f7"/>
     <w:p>
       <w:pPr>
         <w:pStyle w:val="Heading2"/>
       </w:pPr>
       <w:r>
-        <w:t xml:space="preserve">Engineering Leader / Entrepreneur</w:t>
+        <w:t xml:space="preserve">AI Productivity &amp; Developer Tooling Engineer</w:t>
       </w:r>
     </w:p>
     <w:p>
@@ -32,13 +32,13 @@
         <w:t xml:space="preserve">Located in Novato, CA</w:t>
       </w:r>
       <w:r>
-        <w:br/>
+        <w:t xml:space="preserve"> </w:t>
       </w:r>
       <w:r>
         <w:t xml:space="preserve">Phone: 415-779-2701</w:t>
       </w:r>
       <w:r>
-        <w:br/>
+        <w:t xml:space="preserve"> </w:t>
       </w:r>
       <w:r>
         <w:t xml:space="preserve">Email:</w:t>
@@ -55,7 +55,7 @@
         </w:r>
       </w:hyperlink>
       <w:r>
-        <w:br/>
+        <w:t xml:space="preserve"> </w:t>
       </w:r>
       <w:r>
         <w:t xml:space="preserve">GitHub:</w:t>
@@ -68,11 +68,11 @@
           <w:rPr>
             <w:rStyle w:val="Hyperlink"/>
           </w:rPr>
-          <w:t xml:space="preserve">https://github.com/jacksenechal</w:t>
+          <w:t xml:space="preserve">github.com/jacksenechal</w:t>
         </w:r>
       </w:hyperlink>
       <w:r>
-        <w:br/>
+        <w:t xml:space="preserve"> </w:t>
       </w:r>
       <w:r>
         <w:t xml:space="preserve">LinkedIn:</w:t>
@@ -85,7 +85,7 @@
           <w:rPr>
             <w:rStyle w:val="Hyperlink"/>
           </w:rPr>
-          <w:t xml:space="preserve">https://linkedin.com/in/jacksenechal</w:t>
+          <w:t xml:space="preserve">linkedin.com/in/jacksenechal</w:t>
         </w:r>
       </w:hyperlink>
     </w:p>
@@ -108,27 +108,27 @@
         </w:numPr>
       </w:pPr>
       <w:r>
-        <w:t xml:space="preserve">Proven leader in software development, infrastructure, and</w:t>
-      </w:r>
-      <w:r>
-        <w:t xml:space="preserve"> </w:t>
-      </w:r>
-      <w:r>
-        <w:rPr>
-          <w:b/>
-          <w:bCs/>
-        </w:rPr>
-        <w:t xml:space="preserve">team management</w:t>
-      </w:r>
-      <w:r>
-        <w:t xml:space="preserve"> </w:t>
-      </w:r>
-      <w:r>
-        <w:t xml:space="preserve">with</w:t>
-      </w:r>
-      <w:r>
-        <w:t xml:space="preserve"> </w:t>
-      </w:r>
+        <w:rPr>
+          <w:b/>
+          <w:bCs/>
+        </w:rPr>
+        <w:t xml:space="preserve">Principal-level engineer</w:t>
+      </w:r>
+      <w:r>
+        <w:t xml:space="preserve"> </w:t>
+      </w:r>
+      <w:r>
+        <w:t xml:space="preserve">specializing in AI-powered developer tooling, engineering productivity systems, and platform modernization</w:t>
+      </w:r>
+    </w:p>
+    <w:p>
+      <w:pPr>
+        <w:pStyle w:val="Compact"/>
+        <w:numPr>
+          <w:ilvl w:val="0"/>
+          <w:numId w:val="1001"/>
+        </w:numPr>
+      </w:pPr>
       <w:r>
         <w:rPr>
           <w:b/>
@@ -140,7 +140,23 @@
         <w:t xml:space="preserve"> </w:t>
       </w:r>
       <w:r>
-        <w:t xml:space="preserve">of hands-on experience</w:t>
+        <w:t xml:space="preserve">building and shipping software, with</w:t>
+      </w:r>
+      <w:r>
+        <w:t xml:space="preserve"> </w:t>
+      </w:r>
+      <w:r>
+        <w:rPr>
+          <w:b/>
+          <w:bCs/>
+        </w:rPr>
+        <w:t xml:space="preserve">6+ years leading teams</w:t>
+      </w:r>
+      <w:r>
+        <w:t xml:space="preserve"> </w:t>
+      </w:r>
+      <w:r>
+        <w:t xml:space="preserve">across infrastructure, DevOps, and integration platforms</w:t>
       </w:r>
     </w:p>
     <w:p>
@@ -152,6 +168,58 @@
         </w:numPr>
       </w:pPr>
       <w:r>
+        <w:t xml:space="preserve">Hands-on with LLMs, MCP servers, prompt engineering, and AI-assisted developer workflows — building production-grade tools engineers use daily</w:t>
+      </w:r>
+    </w:p>
+    <w:p>
+      <w:pPr>
+        <w:pStyle w:val="Compact"/>
+        <w:numPr>
+          <w:ilvl w:val="0"/>
+          <w:numId w:val="1001"/>
+        </w:numPr>
+      </w:pPr>
+      <w:r>
+        <w:t xml:space="preserve">Track record of driving</w:t>
+      </w:r>
+      <w:r>
+        <w:t xml:space="preserve"> </w:t>
+      </w:r>
+      <w:r>
+        <w:rPr>
+          <w:b/>
+          <w:bCs/>
+        </w:rPr>
+        <w:t xml:space="preserve">DevOps culture transformation</w:t>
+      </w:r>
+      <w:r>
+        <w:t xml:space="preserve"> </w:t>
+      </w:r>
+      <w:r>
+        <w:t xml:space="preserve">and measurably improving engineering velocity through tooling and automation</w:t>
+      </w:r>
+    </w:p>
+    <w:p>
+      <w:pPr>
+        <w:pStyle w:val="Compact"/>
+        <w:numPr>
+          <w:ilvl w:val="0"/>
+          <w:numId w:val="1001"/>
+        </w:numPr>
+      </w:pPr>
+      <w:r>
+        <w:t xml:space="preserve">Strong product mindset with experience operating autonomously in ambiguous problem spaces</w:t>
+      </w:r>
+    </w:p>
+    <w:p>
+      <w:pPr>
+        <w:pStyle w:val="Compact"/>
+        <w:numPr>
+          <w:ilvl w:val="0"/>
+          <w:numId w:val="1001"/>
+        </w:numPr>
+      </w:pPr>
+      <w:r>
         <w:t xml:space="preserve">Committed</w:t>
       </w:r>
       <w:r>
@@ -165,99 +233,14 @@
         <w:t xml:space="preserve">mentor and coach</w:t>
       </w:r>
       <w:r>
-        <w:t xml:space="preserve">, elevating team members’ skill sets and fostering professional growth</w:t>
-      </w:r>
-    </w:p>
-    <w:p>
-      <w:pPr>
-        <w:pStyle w:val="Compact"/>
-        <w:numPr>
-          <w:ilvl w:val="0"/>
-          <w:numId w:val="1001"/>
-        </w:numPr>
-      </w:pPr>
-      <w:r>
-        <w:t xml:space="preserve">Strategic thinker, mercurial innovator, and expert problem solver</w:t>
-      </w:r>
-    </w:p>
-    <w:p>
-      <w:pPr>
-        <w:pStyle w:val="Compact"/>
-        <w:numPr>
-          <w:ilvl w:val="0"/>
-          <w:numId w:val="1001"/>
-        </w:numPr>
-      </w:pPr>
-      <w:r>
-        <w:t xml:space="preserve">Resilient and dedicated, ready to embrace challenges and opportunities</w:t>
-      </w:r>
-    </w:p>
-    <w:p>
-      <w:pPr>
-        <w:pStyle w:val="Compact"/>
-        <w:numPr>
-          <w:ilvl w:val="0"/>
-          <w:numId w:val="1001"/>
-        </w:numPr>
-      </w:pPr>
-      <w:r>
-        <w:t xml:space="preserve">Strong customer focus,</w:t>
-      </w:r>
-      <w:r>
-        <w:t xml:space="preserve"> </w:t>
-      </w:r>
-      <w:r>
-        <w:rPr>
-          <w:b/>
-          <w:bCs/>
-        </w:rPr>
-        <w:t xml:space="preserve">advocating for impactful changes</w:t>
-      </w:r>
-      <w:r>
-        <w:t xml:space="preserve"> </w:t>
-      </w:r>
-      <w:r>
-        <w:t xml:space="preserve">and ensuring product value</w:t>
-      </w:r>
-    </w:p>
-    <w:p>
-      <w:pPr>
-        <w:pStyle w:val="Compact"/>
-        <w:numPr>
-          <w:ilvl w:val="0"/>
-          <w:numId w:val="1001"/>
-        </w:numPr>
-      </w:pPr>
-      <w:r>
-        <w:t xml:space="preserve">Entrepreneurial spirit with multiple co-founding experiences</w:t>
-      </w:r>
-    </w:p>
-    <w:p>
-      <w:pPr>
-        <w:pStyle w:val="Compact"/>
-        <w:numPr>
-          <w:ilvl w:val="0"/>
-          <w:numId w:val="1001"/>
-        </w:numPr>
-      </w:pPr>
-      <w:r>
-        <w:t xml:space="preserve">Principal-level engineer specializing in AI-powered developer tooling, platform modernization, and large-scale engineering productivity</w:t>
-      </w:r>
-    </w:p>
-    <w:p>
-      <w:pPr>
-        <w:pStyle w:val="Compact"/>
-        <w:numPr>
-          <w:ilvl w:val="0"/>
-          <w:numId w:val="1001"/>
-        </w:numPr>
-      </w:pPr>
-      <w:r>
-        <w:t xml:space="preserve">Full-stack generalist with deep experience applying AI/LLMs, DevOps, and cloud-native systems to accelerate software delivery</w:t>
+        <w:t xml:space="preserve"> </w:t>
+      </w:r>
+      <w:r>
+        <w:t xml:space="preserve">who elevated junior engineers to senior technical and engineering management positions</w:t>
       </w:r>
     </w:p>
     <w:bookmarkEnd w:id="24"/>
-    <w:bookmarkStart w:id="31" w:name="industry-experience"/>
+    <w:bookmarkStart w:id="36" w:name="industry-experience"/>
     <w:p>
       <w:pPr>
         <w:pStyle w:val="Heading2"/>
@@ -275,13 +258,13 @@
         <w:t xml:space="preserve">Technical Lead</w:t>
       </w:r>
     </w:p>
-    <w:bookmarkStart w:id="25" w:name="X75167482f34e06a01a656d1f4cef9a03bec6c7a"/>
+    <w:bookmarkStart w:id="25" w:name="X6dafa89e46c32694395442a9a6ca99eae379ab9"/>
     <w:p>
       <w:pPr>
         <w:pStyle w:val="Heading4"/>
       </w:pPr>
       <w:r>
-        <w:t xml:space="preserve">Building Humane Technology | June 2025 - Present | Remote (US)</w:t>
+        <w:t xml:space="preserve">Building Humane Technology | June 2025 - Present | Remote</w:t>
       </w:r>
     </w:p>
     <w:p>
@@ -293,7 +276,7 @@
         </w:numPr>
       </w:pPr>
       <w:r>
-        <w:t xml:space="preserve">Co-architecting and leading development of HumaneBench.ai, an open-source benchmark for evaluating AI systems against humane technology principles.</w:t>
+        <w:t xml:space="preserve">Co-architecting and leading development of HumaneBench.ai, an open-source AI evaluation framework built on AISI Inspect. Python.</w:t>
       </w:r>
     </w:p>
     <w:p>
@@ -305,7 +288,7 @@
         </w:numPr>
       </w:pPr>
       <w:r>
-        <w:t xml:space="preserve">Developing an extensible AI evaluation framework built on AISI Inspect, focused on measuring and improving LLM behavior in real-world developer and operational workflows.</w:t>
+        <w:t xml:space="preserve">Developing extensible evaluation tooling for LLM behavior in real-world developer and operational workflows — designed for measurable adoption and continuous improvement.</w:t>
       </w:r>
     </w:p>
     <w:p>
@@ -317,51 +300,27 @@
         </w:numPr>
       </w:pPr>
       <w:r>
-        <w:t xml:space="preserve">Shaping product and technical roadmap for AI-driven tooling, including production monitoring concepts, multi-turn evaluation, and maturity models to support adoption, measurement, and continuous improvement.</w:t>
-      </w:r>
-    </w:p>
-    <w:p>
-      <w:pPr>
-        <w:pStyle w:val="Compact"/>
-        <w:numPr>
-          <w:ilvl w:val="0"/>
-          <w:numId w:val="1002"/>
-        </w:numPr>
-      </w:pPr>
-      <w:r>
-        <w:t xml:space="preserve">Contributing to education initiatives including Humane Tech and Agentic AI training for the UN Secretariat and broader developer community, plus coordinating hackathons and public AMAs.</w:t>
-      </w:r>
-    </w:p>
-    <w:p>
-      <w:pPr>
-        <w:pStyle w:val="Compact"/>
-        <w:numPr>
-          <w:ilvl w:val="0"/>
-          <w:numId w:val="1002"/>
-        </w:numPr>
-      </w:pPr>
-      <w:r>
-        <w:t xml:space="preserve">Building partnerships and fostering open-source community engagement around humane AI evaluation standards.</w:t>
+        <w:t xml:space="preserve">Driving product and technical roadmap including production monitoring, multi-turn evaluation, and maturity models to guide AI tool adoption across teams.</w:t>
       </w:r>
     </w:p>
     <w:bookmarkEnd w:id="25"/>
     <w:bookmarkEnd w:id="26"/>
-    <w:bookmarkStart w:id="28" w:name="infrastructure-engineer"/>
+    <w:bookmarkStart w:id="28" w:name="co-founder-lead-developer"/>
     <w:p>
       <w:pPr>
         <w:pStyle w:val="Heading3"/>
       </w:pPr>
       <w:r>
-        <w:t xml:space="preserve">Infrastructure Engineer</w:t>
-      </w:r>
-    </w:p>
-    <w:bookmarkStart w:id="27" w:name="tobiko-mar-2024---oct-2024-remote-us"/>
+        <w:t xml:space="preserve">Co-founder &amp; Lead Developer</w:t>
+      </w:r>
+    </w:p>
+    <w:bookmarkStart w:id="27" w:name="Xffd4b369c0bcf0f7e3f28f0e84324bac520d95a"/>
     <w:p>
       <w:pPr>
         <w:pStyle w:val="Heading4"/>
       </w:pPr>
       <w:r>
-        <w:t xml:space="preserve">Tobiko | Mar 2024 - Oct 2024 | Remote (US)</w:t>
+        <w:t xml:space="preserve">Mirror Astrology | Nov 2024 - Present | Remote</w:t>
       </w:r>
     </w:p>
     <w:p>
@@ -373,7 +332,7 @@
         </w:numPr>
       </w:pPr>
       <w:r>
-        <w:t xml:space="preserve">Collaborated with a fast-paced team to architect and implement a robust, scalable, modern cloud platform serving customer workloads.</w:t>
+        <w:t xml:space="preserve">Built production AI chatbot integrating multiple LLMs (OpenAI, Anthropic) with complex prompting, tool use, retrieval, and context augmentation.</w:t>
       </w:r>
     </w:p>
     <w:p>
@@ -385,7 +344,7 @@
         </w:numPr>
       </w:pPr>
       <w:r>
-        <w:t xml:space="preserve">Built out CI/CD patterns including mono-repo conditional workflows, workload identity federation, and continuous delivery.</w:t>
+        <w:t xml:space="preserve">Owned full-stack development: Ruby on Rails backend, JavaScript frontend, API design, and responsive UI/UX.</w:t>
       </w:r>
     </w:p>
     <w:p>
@@ -397,39 +356,27 @@
         </w:numPr>
       </w:pPr>
       <w:r>
-        <w:t xml:space="preserve">Implemented a Slack-based customer support and incident response platform, and onboarded teammates and customers.</w:t>
-      </w:r>
-    </w:p>
-    <w:p>
-      <w:pPr>
-        <w:pStyle w:val="Compact"/>
-        <w:numPr>
-          <w:ilvl w:val="0"/>
-          <w:numId w:val="1003"/>
-        </w:numPr>
-      </w:pPr>
-      <w:r>
-        <w:t xml:space="preserve">Python, Pulumi, Google Cloud Platform, Google Kubernetes Engine, Google Cloud Run, CI/CD with CircleCI, Helm, SQLMesh.</w:t>
+        <w:t xml:space="preserve">Collaborated closely with co-founders on product direction, roadmap planning, and prioritization.</w:t>
       </w:r>
     </w:p>
     <w:bookmarkEnd w:id="27"/>
     <w:bookmarkEnd w:id="28"/>
-    <w:bookmarkStart w:id="30" w:name="X7a2c313efdde198d901363c762c81839771c845"/>
+    <w:bookmarkStart w:id="30" w:name="infrastructure-engineer"/>
     <w:p>
       <w:pPr>
         <w:pStyle w:val="Heading3"/>
       </w:pPr>
       <w:r>
-        <w:t xml:space="preserve">Engineering Manager / Principal Software Engineer</w:t>
-      </w:r>
-    </w:p>
-    <w:bookmarkStart w:id="29" w:name="X47289269eb944414c9285d314973b45c253bcef"/>
+        <w:t xml:space="preserve">Infrastructure Engineer</w:t>
+      </w:r>
+    </w:p>
+    <w:bookmarkStart w:id="29" w:name="tobiko-mar-2024---oct-2024-remote"/>
     <w:p>
       <w:pPr>
         <w:pStyle w:val="Heading4"/>
       </w:pPr>
       <w:r>
-        <w:t xml:space="preserve">Mavenlink / Kantata | Apr 2017 - Dec 2023 | San Francisco, CA</w:t>
+        <w:t xml:space="preserve">Tobiko | Mar 2024 - Oct 2024 | Remote</w:t>
       </w:r>
     </w:p>
     <w:p>
@@ -441,14 +388,7 @@
         </w:numPr>
       </w:pPr>
       <w:r>
-        <w:rPr>
-          <w:b/>
-          <w:bCs/>
-        </w:rPr>
-        <w:t xml:space="preserve">Operations Team Leadership</w:t>
-      </w:r>
-      <w:r>
-        <w:t xml:space="preserve">: Over four years, recruited and led a new infrastructure team dedicated to building and scaling the platform. Instrumental in leading the organization’s transition towards a DevOps culture, serving as a change agent and technical authority across engineering. Created a clear, calm, and constructive environment that allowed the team to thrive. Responsible for roadmap stewardship, untangling requirements, and arranging priorities to maximize flow. Transitioned a large legacy infrastructure codebase to cutting-edge, cloud-native, IAC-oriented tools while remaining hands-on with coding, architecture, and collaboration on mission-critical projects.</w:t>
+        <w:t xml:space="preserve">Architected scalable cloud platform and CI/CD patterns including mono-repo conditional workflows, workload identity federation, and continuous delivery pipelines.</w:t>
       </w:r>
     </w:p>
     <w:p>
@@ -460,14 +400,7 @@
         </w:numPr>
       </w:pPr>
       <w:r>
-        <w:rPr>
-          <w:b/>
-          <w:bCs/>
-        </w:rPr>
-        <w:t xml:space="preserve">M-Bridge Platform Leadership</w:t>
-      </w:r>
-      <w:r>
-        <w:t xml:space="preserve">: For two years, spearheaded a team to stabilize and enhance an agent-based integration platform. Established operational metrics and monitoring systems that reduced platform errors and incidents by approximately 100x. Successfully performed a migration to Kubernetes with zero downtime, including relational, document, and cache databases. Demonstrated ability to measure impact and drive data-informed decisions.</w:t>
+        <w:t xml:space="preserve">Automated developer workflows and built Slack-based operational tooling for support and incident response; onboarded teammates and customers.</w:t>
       </w:r>
     </w:p>
     <w:p>
@@ -479,226 +412,170 @@
         </w:numPr>
       </w:pPr>
       <w:r>
-        <w:rPr>
-          <w:b/>
-          <w:bCs/>
-        </w:rPr>
-        <w:t xml:space="preserve">Insights Platform Leadership</w:t>
-      </w:r>
-      <w:r>
-        <w:t xml:space="preserve">: For three months, led a transition team responsible for overseeing and improving the BI data pipeline. Successfully migrated the pipeline to Kubernetes, accelerating modernization initiatives.</w:t>
-      </w:r>
-    </w:p>
-    <w:p>
-      <w:pPr>
-        <w:pStyle w:val="Compact"/>
-        <w:numPr>
-          <w:ilvl w:val="0"/>
-          <w:numId w:val="1004"/>
-        </w:numPr>
-      </w:pPr>
-      <w:r>
-        <w:rPr>
-          <w:b/>
-          <w:bCs/>
-        </w:rPr>
-        <w:t xml:space="preserve">Cross-Functional Leadership &amp; Organizational Impact</w:t>
-      </w:r>
-      <w:r>
-        <w:t xml:space="preserve">: Took on organization-wide roles including mentorship and coaching, interviewing and hiring, and organizational change management and process optimization. Influenced decisions at all levels and promoted best practices across the engineering organization. Recognized with Top Performer Award in 2021 for contributions to technical excellence and team development.</w:t>
+        <w:t xml:space="preserve">Python, Pulumi, GCP, GKE, Cloud Run, CircleCI, Helm, SQLMesh.</w:t>
       </w:r>
     </w:p>
     <w:bookmarkEnd w:id="29"/>
     <w:bookmarkEnd w:id="30"/>
+    <w:bookmarkStart w:id="32" w:name="X7a2c313efdde198d901363c762c81839771c845"/>
+    <w:p>
+      <w:pPr>
+        <w:pStyle w:val="Heading3"/>
+      </w:pPr>
+      <w:r>
+        <w:t xml:space="preserve">Engineering Manager / Principal Software Engineer</w:t>
+      </w:r>
+    </w:p>
+    <w:bookmarkStart w:id="31" w:name="X47289269eb944414c9285d314973b45c253bcef"/>
+    <w:p>
+      <w:pPr>
+        <w:pStyle w:val="Heading4"/>
+      </w:pPr>
+      <w:r>
+        <w:t xml:space="preserve">Mavenlink / Kantata | Apr 2017 - Dec 2023 | San Francisco, CA</w:t>
+      </w:r>
+    </w:p>
+    <w:p>
+      <w:pPr>
+        <w:pStyle w:val="Compact"/>
+        <w:numPr>
+          <w:ilvl w:val="0"/>
+          <w:numId w:val="1005"/>
+        </w:numPr>
+      </w:pPr>
+      <w:r>
+        <w:rPr>
+          <w:b/>
+          <w:bCs/>
+        </w:rPr>
+        <w:t xml:space="preserve">Infrastructure Platform</w:t>
+      </w:r>
+      <w:r>
+        <w:t xml:space="preserve"> </w:t>
+      </w:r>
+      <w:r>
+        <w:t xml:space="preserve">(4 years): Recruited and built a team from scratch dedicated to the infrastructure platform. Led the organization’s DevOps culture transformation, serving as a change agent and technical authority across engineering. Transitioned a large legacy codebase to cloud-native, Infrastructure-as-Code tooling (Terraform, Ansible, Kubernetes). Owned roadmap stewardship while staying hands-on with coding, architecture, and code review.</w:t>
+      </w:r>
+    </w:p>
+    <w:p>
+      <w:pPr>
+        <w:pStyle w:val="Compact"/>
+        <w:numPr>
+          <w:ilvl w:val="0"/>
+          <w:numId w:val="1005"/>
+        </w:numPr>
+      </w:pPr>
+      <w:r>
+        <w:rPr>
+          <w:b/>
+          <w:bCs/>
+        </w:rPr>
+        <w:t xml:space="preserve">M-Bridge Integration Platform</w:t>
+      </w:r>
+      <w:r>
+        <w:t xml:space="preserve"> </w:t>
+      </w:r>
+      <w:r>
+        <w:t xml:space="preserve">(2 years): Stabilized and scaled an agent-based integration platform handling multi-system data orchestration. Established operational metrics and monitoring that reduced errors and incidents by ~100x. Executed a zero-downtime migration to Kubernetes.</w:t>
+      </w:r>
+    </w:p>
+    <w:p>
+      <w:pPr>
+        <w:pStyle w:val="Compact"/>
+        <w:numPr>
+          <w:ilvl w:val="0"/>
+          <w:numId w:val="1005"/>
+        </w:numPr>
+      </w:pPr>
+      <w:r>
+        <w:rPr>
+          <w:b/>
+          <w:bCs/>
+        </w:rPr>
+        <w:t xml:space="preserve">Cross-Functional Impact</w:t>
+      </w:r>
+      <w:r>
+        <w:t xml:space="preserve">: Mentored engineers across teams — coached a junior engineer who grew to Engineering Manager. Led interviewing, hiring, and organizational change management.</w:t>
+      </w:r>
+      <w:r>
+        <w:t xml:space="preserve"> </w:t>
+      </w:r>
+      <w:r>
+        <w:rPr>
+          <w:b/>
+          <w:bCs/>
+        </w:rPr>
+        <w:t xml:space="preserve">Top Performer Award, 2021</w:t>
+      </w:r>
+      <w:r>
+        <w:t xml:space="preserve">.</w:t>
+      </w:r>
+    </w:p>
     <w:bookmarkEnd w:id="31"/>
-    <w:bookmarkStart w:id="36" w:name="skills"/>
-    <w:p>
-      <w:pPr>
-        <w:pStyle w:val="Heading2"/>
-      </w:pPr>
-      <w:r>
-        <w:t xml:space="preserve">Skills</w:t>
-      </w:r>
-    </w:p>
-    <w:bookmarkStart w:id="32" w:name="technical-skills"/>
+    <w:bookmarkEnd w:id="32"/>
+    <w:bookmarkStart w:id="34" w:name="lead-developer-co-founder"/>
     <w:p>
       <w:pPr>
         <w:pStyle w:val="Heading3"/>
       </w:pPr>
       <w:r>
-        <w:t xml:space="preserve">Technical Skills</w:t>
-      </w:r>
-    </w:p>
-    <w:p>
-      <w:pPr>
-        <w:pStyle w:val="Compact"/>
-        <w:numPr>
-          <w:ilvl w:val="0"/>
-          <w:numId w:val="1005"/>
-        </w:numPr>
-      </w:pPr>
-      <w:r>
-        <w:rPr>
-          <w:b/>
-          <w:bCs/>
-        </w:rPr>
-        <w:t xml:space="preserve">Languages &amp; Frameworks</w:t>
-      </w:r>
-      <w:r>
-        <w:t xml:space="preserve">: Ruby on Rails, Python, Node.js, JavaScript, TypeScript, Bash.</w:t>
-      </w:r>
-    </w:p>
-    <w:p>
-      <w:pPr>
-        <w:pStyle w:val="Compact"/>
-        <w:numPr>
-          <w:ilvl w:val="0"/>
-          <w:numId w:val="1005"/>
-        </w:numPr>
-      </w:pPr>
-      <w:r>
-        <w:rPr>
-          <w:b/>
-          <w:bCs/>
-        </w:rPr>
-        <w:t xml:space="preserve">AI/LLM Development</w:t>
-      </w:r>
-      <w:r>
-        <w:t xml:space="preserve">: MCP (Model Context Protocol), chatbot development, prompt engineering, tool use, context augmentation, AI-assisted developer workflows.</w:t>
-      </w:r>
-    </w:p>
-    <w:p>
-      <w:pPr>
-        <w:pStyle w:val="Compact"/>
-        <w:numPr>
-          <w:ilvl w:val="0"/>
-          <w:numId w:val="1005"/>
-        </w:numPr>
-      </w:pPr>
-      <w:r>
-        <w:rPr>
-          <w:b/>
-          <w:bCs/>
-        </w:rPr>
-        <w:t xml:space="preserve">Databases</w:t>
-      </w:r>
-      <w:r>
-        <w:t xml:space="preserve">: MySQL, PostgreSQL, MongoDB, Redis, Cloud-based data services.</w:t>
-      </w:r>
-    </w:p>
-    <w:p>
-      <w:pPr>
-        <w:pStyle w:val="Compact"/>
-        <w:numPr>
-          <w:ilvl w:val="0"/>
-          <w:numId w:val="1005"/>
-        </w:numPr>
-      </w:pPr>
-      <w:r>
-        <w:rPr>
-          <w:b/>
-          <w:bCs/>
-        </w:rPr>
-        <w:t xml:space="preserve">Tools &amp; Platforms</w:t>
-      </w:r>
-      <w:r>
-        <w:t xml:space="preserve">: Kubernetes, AWS (Amazon Web Services), Google Cloud Platform, CircleCI, GitHub Actions, Terraform, Ansible, Pulumi, Linux, Git, Webpack, Cloudfront, Helm.</w:t>
-      </w:r>
-    </w:p>
-    <w:p>
-      <w:pPr>
-        <w:pStyle w:val="Compact"/>
-        <w:numPr>
-          <w:ilvl w:val="0"/>
-          <w:numId w:val="1005"/>
-        </w:numPr>
-      </w:pPr>
-      <w:r>
-        <w:rPr>
-          <w:b/>
-          <w:bCs/>
-        </w:rPr>
-        <w:t xml:space="preserve">Web Technologies</w:t>
-      </w:r>
-      <w:r>
-        <w:t xml:space="preserve">: HTML, CSS, Tailwind, Front-end Development, Responsive Design, Back-end Development, Distributed Systems, Web3/DWeb, Decentralized Technologies.</w:t>
-      </w:r>
-    </w:p>
-    <w:p>
-      <w:pPr>
-        <w:pStyle w:val="Compact"/>
-        <w:numPr>
-          <w:ilvl w:val="0"/>
-          <w:numId w:val="1005"/>
-        </w:numPr>
-      </w:pPr>
-      <w:r>
-        <w:rPr>
-          <w:b/>
-          <w:bCs/>
-        </w:rPr>
-        <w:t xml:space="preserve">Software Development</w:t>
-      </w:r>
-      <w:r>
-        <w:t xml:space="preserve">: Object-oriented programming (OOP), Functional Programming, API Design and Development, Automated Testing, Continuous Integration, Continuous Deployment, CI/CD, System Architecture, Microservices.</w:t>
-      </w:r>
-    </w:p>
-    <w:bookmarkEnd w:id="32"/>
-    <w:bookmarkStart w:id="33" w:name="methodologies"/>
+        <w:t xml:space="preserve">Lead Developer, Co-founder</w:t>
+      </w:r>
+    </w:p>
+    <w:bookmarkStart w:id="33" w:name="pegg-2014---2017-san-francisco-ca"/>
+    <w:p>
+      <w:pPr>
+        <w:pStyle w:val="Heading4"/>
+      </w:pPr>
+      <w:r>
+        <w:t xml:space="preserve">Pegg | 2014 - 2017 | San Francisco, CA</w:t>
+      </w:r>
+    </w:p>
+    <w:p>
+      <w:pPr>
+        <w:pStyle w:val="Compact"/>
+        <w:numPr>
+          <w:ilvl w:val="0"/>
+          <w:numId w:val="1006"/>
+        </w:numPr>
+      </w:pPr>
+      <w:r>
+        <w:t xml:space="preserve">Designed, architected, and built a cross-platform mobile app from scratch (iOS/Android). Node.js backend, JS/Phonegap frontend, Firebase real-time systems, CI/CD to AWS/CloudFront via CircleCI.</w:t>
+      </w:r>
+    </w:p>
+    <w:p>
+      <w:pPr>
+        <w:pStyle w:val="Compact"/>
+        <w:numPr>
+          <w:ilvl w:val="0"/>
+          <w:numId w:val="1006"/>
+        </w:numPr>
+      </w:pPr>
+      <w:r>
+        <w:t xml:space="preserve">Established engineering workflow: pair programming, automated testing (Karma/Chai), continuous integration, and rapid deployment processes.</w:t>
+      </w:r>
+    </w:p>
+    <w:p>
+      <w:pPr>
+        <w:pStyle w:val="Compact"/>
+        <w:numPr>
+          <w:ilvl w:val="0"/>
+          <w:numId w:val="1006"/>
+        </w:numPr>
+      </w:pPr>
+      <w:r>
+        <w:t xml:space="preserve">Co-led product strategy, monetization, and launch planning.</w:t>
+      </w:r>
+    </w:p>
+    <w:bookmarkEnd w:id="33"/>
+    <w:bookmarkEnd w:id="34"/>
+    <w:bookmarkStart w:id="35" w:name="earlier-career-2001---2014"/>
     <w:p>
       <w:pPr>
         <w:pStyle w:val="Heading3"/>
       </w:pPr>
       <w:r>
-        <w:t xml:space="preserve">Methodologies</w:t>
-      </w:r>
-    </w:p>
-    <w:p>
-      <w:pPr>
-        <w:pStyle w:val="Compact"/>
-        <w:numPr>
-          <w:ilvl w:val="0"/>
-          <w:numId w:val="1006"/>
-        </w:numPr>
-      </w:pPr>
-      <w:r>
-        <w:rPr>
-          <w:b/>
-          <w:bCs/>
-        </w:rPr>
-        <w:t xml:space="preserve">Project Management</w:t>
-      </w:r>
-      <w:r>
-        <w:t xml:space="preserve">: Agile, Pair Programming, Test-Driven Development (TDD), DevOps, Lean Thinking, Rapid Prototyping, Scrum, Kanban.</w:t>
-      </w:r>
-    </w:p>
-    <w:p>
-      <w:pPr>
-        <w:pStyle w:val="Compact"/>
-        <w:numPr>
-          <w:ilvl w:val="0"/>
-          <w:numId w:val="1006"/>
-        </w:numPr>
-      </w:pPr>
-      <w:r>
-        <w:rPr>
-          <w:b/>
-          <w:bCs/>
-        </w:rPr>
-        <w:t xml:space="preserve">Design &amp; Architecture</w:t>
-      </w:r>
-      <w:r>
-        <w:t xml:space="preserve">: Software Design Patterns, Systems Design, Infrastructure as Code (IAC), Data Pipeline Design, Cloud-Native Architecture, User Interface Design.</w:t>
-      </w:r>
-    </w:p>
-    <w:bookmarkEnd w:id="33"/>
-    <w:bookmarkStart w:id="34" w:name="organizational-soft-skills"/>
-    <w:p>
-      <w:pPr>
-        <w:pStyle w:val="Heading3"/>
-      </w:pPr>
-      <w:r>
-        <w:t xml:space="preserve">Organizational &amp; Soft Skills</w:t>
+        <w:t xml:space="preserve">Earlier Career (2001 - 2014)</w:t>
       </w:r>
     </w:p>
     <w:p>
@@ -714,10 +591,13 @@
           <w:b/>
           <w:bCs/>
         </w:rPr>
-        <w:t xml:space="preserve">Leadership &amp; Management</w:t>
-      </w:r>
-      <w:r>
-        <w:t xml:space="preserve">: Team Building, Cross-Functional Leadership, Coaching &amp; Mentoring, Talent Recruitment &amp; Development, High-Performance Team Management, Strategic Planning, Decision Making, Change Management.</w:t>
+        <w:t xml:space="preserve">Consultant &amp; Entrepreneur</w:t>
+      </w:r>
+      <w:r>
+        <w:t xml:space="preserve"> </w:t>
+      </w:r>
+      <w:r>
+        <w:t xml:space="preserve">(2008 - 2014): Founded OpenTest Pro (automated testing education). Built e-commerce ordering system for Turnbull &amp; Asser shirtmakers. Full-stack consulting in Ruby on Rails, Node.js, D3 data visualization. Rapid prototyping and client delivery.</w:t>
       </w:r>
     </w:p>
     <w:p>
@@ -733,10 +613,13 @@
           <w:b/>
           <w:bCs/>
         </w:rPr>
-        <w:t xml:space="preserve">Communication &amp; Collaboration</w:t>
-      </w:r>
-      <w:r>
-        <w:t xml:space="preserve">: Effective Communication, Stakeholder Engagement, Negotiation, Problem-Solving, Conflict Resolution, Customer-Oriented Approach.</w:t>
+        <w:t xml:space="preserve">Web Developer, OnForce, Inc</w:t>
+      </w:r>
+      <w:r>
+        <w:t xml:space="preserve"> </w:t>
+      </w:r>
+      <w:r>
+        <w:t xml:space="preserve">(2006 - 2007): Introduced automated testing and CI. Built comprehensive API test suite. Integrated platform with Salesforce APIs.</w:t>
       </w:r>
     </w:p>
     <w:p>
@@ -752,143 +635,32 @@
           <w:b/>
           <w:bCs/>
         </w:rPr>
-        <w:t xml:space="preserve">Innovation &amp; Creativity</w:t>
-      </w:r>
-      <w:r>
-        <w:t xml:space="preserve">: Entrepreneurship, Creative Problem Solving, Product Development and Innovation, Adaptive Learning, Forward-Thinking.</w:t>
-      </w:r>
-    </w:p>
-    <w:bookmarkEnd w:id="34"/>
-    <w:bookmarkStart w:id="35" w:name="additional-competencies"/>
-    <w:p>
-      <w:pPr>
-        <w:pStyle w:val="Heading3"/>
-      </w:pPr>
-      <w:r>
-        <w:t xml:space="preserve">Additional Competencies</w:t>
-      </w:r>
-    </w:p>
-    <w:p>
-      <w:pPr>
-        <w:pStyle w:val="Compact"/>
-        <w:numPr>
-          <w:ilvl w:val="0"/>
-          <w:numId w:val="1008"/>
-        </w:numPr>
-      </w:pPr>
-      <w:r>
-        <w:rPr>
-          <w:b/>
-          <w:bCs/>
-        </w:rPr>
-        <w:t xml:space="preserve">Industry Knowledge</w:t>
-      </w:r>
-      <w:r>
-        <w:t xml:space="preserve">: Software Engineering, Web Development, Cloud Computing, AI/ML Development, Startup Ecosystem, SaaS, PaaS, B2B Software, Humane Technology.</w:t>
-      </w:r>
-    </w:p>
-    <w:p>
-      <w:pPr>
-        <w:pStyle w:val="Compact"/>
-        <w:numPr>
-          <w:ilvl w:val="0"/>
-          <w:numId w:val="1008"/>
-        </w:numPr>
-      </w:pPr>
-      <w:r>
-        <w:rPr>
-          <w:b/>
-          <w:bCs/>
-        </w:rPr>
-        <w:t xml:space="preserve">Personal Attributes</w:t>
-      </w:r>
-      <w:r>
-        <w:t xml:space="preserve">: Resilient, Innovative, Dedicated, Entrepreneurial, Strategic Thinker, Out of the Box Thinker, Detail-Oriented, Analytical, Kind and Compassionate, Truth Seeker.</w:t>
+        <w:t xml:space="preserve">Development Lead, JBA Network</w:t>
+      </w:r>
+      <w:r>
+        <w:t xml:space="preserve"> </w:t>
+      </w:r>
+      <w:r>
+        <w:t xml:space="preserve">(2003 - 2006): Lead programmer and project manager for mynewsletterbuilder.com — architected initial release, then built and scaled the development team.</w:t>
       </w:r>
     </w:p>
     <w:bookmarkEnd w:id="35"/>
     <w:bookmarkEnd w:id="36"/>
-    <w:bookmarkStart w:id="39" w:name="education"/>
+    <w:bookmarkStart w:id="41" w:name="open-source-projects"/>
     <w:p>
       <w:pPr>
         <w:pStyle w:val="Heading2"/>
       </w:pPr>
       <w:r>
-        <w:t xml:space="preserve">Education</w:t>
-      </w:r>
-    </w:p>
-    <w:bookmarkStart w:id="38" w:name="bachelor-of-arts-in-mathematics"/>
+        <w:t xml:space="preserve">Open Source Projects</w:t>
+      </w:r>
+    </w:p>
+    <w:bookmarkStart w:id="38" w:name="scan-mcp-2024---present"/>
     <w:p>
       <w:pPr>
         <w:pStyle w:val="Heading3"/>
       </w:pPr>
       <w:r>
-        <w:t xml:space="preserve">Bachelor of Arts in Mathematics</w:t>
-      </w:r>
-    </w:p>
-    <w:bookmarkStart w:id="37" w:name="Xe220d86d70cd5bf8ee7040adf9411d63a6235ab"/>
-    <w:p>
-      <w:pPr>
-        <w:pStyle w:val="Heading4"/>
-      </w:pPr>
-      <w:r>
-        <w:t xml:space="preserve">University of North Carolina at Asheville | May 2003</w:t>
-      </w:r>
-    </w:p>
-    <w:p>
-      <w:pPr>
-        <w:pStyle w:val="Compact"/>
-        <w:numPr>
-          <w:ilvl w:val="0"/>
-          <w:numId w:val="1009"/>
-        </w:numPr>
-      </w:pPr>
-      <w:r>
-        <w:t xml:space="preserve">Minor in Computer Science.</w:t>
-      </w:r>
-    </w:p>
-    <w:p>
-      <w:pPr>
-        <w:pStyle w:val="Compact"/>
-        <w:numPr>
-          <w:ilvl w:val="0"/>
-          <w:numId w:val="1009"/>
-        </w:numPr>
-      </w:pPr>
-      <w:r>
-        <w:t xml:space="preserve">Graduated with distinction in Mathematics.</w:t>
-      </w:r>
-    </w:p>
-    <w:p>
-      <w:pPr>
-        <w:pStyle w:val="Compact"/>
-        <w:numPr>
-          <w:ilvl w:val="0"/>
-          <w:numId w:val="1009"/>
-        </w:numPr>
-      </w:pPr>
-      <w:r>
-        <w:t xml:space="preserve">Undergraduate research in 4D fractals.</w:t>
-      </w:r>
-    </w:p>
-    <w:bookmarkEnd w:id="37"/>
-    <w:bookmarkEnd w:id="38"/>
-    <w:bookmarkEnd w:id="39"/>
-    <w:bookmarkStart w:id="44" w:name="open-source-projects"/>
-    <w:p>
-      <w:pPr>
-        <w:pStyle w:val="Heading2"/>
-      </w:pPr>
-      <w:r>
-        <w:t xml:space="preserve">Open Source Projects</w:t>
-      </w:r>
-    </w:p>
-    <w:bookmarkStart w:id="41" w:name="scan-mcp-2024---present"/>
-    <w:p>
-      <w:pPr>
-        <w:pStyle w:val="Heading3"/>
-      </w:pPr>
-      <w:r>
         <w:t xml:space="preserve">Scan MCP (2024 - Present)</w:t>
       </w:r>
     </w:p>
@@ -897,14 +669,14 @@
         <w:pStyle w:val="FirstParagraph"/>
       </w:pPr>
       <w:r>
-        <w:t xml:space="preserve">MCP (Model Context Protocol) server for scanner automation and document digitization. Privacy-first architecture with smart device discovery, JSON Schema validation, and support for both local stdio and network HTTP transports. TypeScript/Node.js.</w:t>
+        <w:t xml:space="preserve">MCP (Model Context Protocol) server for scanner automation and document digitization. Designed and built an end-to-end MCP service with smart device discovery, JSON Schema validation, and support for both local stdio and network HTTP transports. TypeScript/Node.js.</w:t>
       </w:r>
     </w:p>
     <w:p>
       <w:pPr>
         <w:pStyle w:val="BodyText"/>
       </w:pPr>
-      <w:hyperlink r:id="rId40">
+      <w:hyperlink r:id="rId37">
         <w:r>
           <w:rPr>
             <w:rStyle w:val="Hyperlink"/>
@@ -913,8 +685,8 @@
         </w:r>
       </w:hyperlink>
     </w:p>
-    <w:bookmarkEnd w:id="41"/>
-    <w:bookmarkStart w:id="43" w:name="humanebench-2024---present"/>
+    <w:bookmarkEnd w:id="38"/>
+    <w:bookmarkStart w:id="40" w:name="humanebench-2024---present"/>
     <w:p>
       <w:pPr>
         <w:pStyle w:val="Heading3"/>
@@ -928,14 +700,14 @@
         <w:pStyle w:val="FirstParagraph"/>
       </w:pPr>
       <w:r>
-        <w:t xml:space="preserve">Evaluation framework for measuring human-friendly behavior in AI assistants, built on AISI Inspect. Tests AI responses across humane technology principles including loneliness, mental health, transparency, and privacy. Supports multiple LLM providers with extensible scenario datasets. Python.</w:t>
+        <w:t xml:space="preserve">AI evaluation framework built on AISI Inspect. Measures LLM behavior across multiple dimensions with extensible scenario datasets. Supports multiple LLM providers (OpenAI, Anthropic). Python.</w:t>
       </w:r>
     </w:p>
     <w:p>
       <w:pPr>
         <w:pStyle w:val="BodyText"/>
       </w:pPr>
-      <w:hyperlink r:id="rId42">
+      <w:hyperlink r:id="rId39">
         <w:r>
           <w:rPr>
             <w:rStyle w:val="Hyperlink"/>
@@ -944,9 +716,194 @@
         </w:r>
       </w:hyperlink>
     </w:p>
+    <w:bookmarkEnd w:id="40"/>
+    <w:bookmarkEnd w:id="41"/>
+    <w:bookmarkStart w:id="42" w:name="skills"/>
+    <w:p>
+      <w:pPr>
+        <w:pStyle w:val="Heading2"/>
+      </w:pPr>
+      <w:r>
+        <w:t xml:space="preserve">Skills</w:t>
+      </w:r>
+    </w:p>
+    <w:p>
+      <w:pPr>
+        <w:pStyle w:val="Compact"/>
+        <w:numPr>
+          <w:ilvl w:val="0"/>
+          <w:numId w:val="1008"/>
+        </w:numPr>
+      </w:pPr>
+      <w:r>
+        <w:rPr>
+          <w:b/>
+          <w:bCs/>
+        </w:rPr>
+        <w:t xml:space="preserve">AI/LLM</w:t>
+      </w:r>
+      <w:r>
+        <w:t xml:space="preserve">: MCP (Model Context Protocol) server design, LLMs (OpenAI, Anthropic), prompt engineering, tool use, retrieval &amp; context injection, AI-assisted developer workflows, AI evaluation frameworks.</w:t>
+      </w:r>
+    </w:p>
+    <w:p>
+      <w:pPr>
+        <w:pStyle w:val="Compact"/>
+        <w:numPr>
+          <w:ilvl w:val="0"/>
+          <w:numId w:val="1008"/>
+        </w:numPr>
+      </w:pPr>
+      <w:r>
+        <w:rPr>
+          <w:b/>
+          <w:bCs/>
+        </w:rPr>
+        <w:t xml:space="preserve">Languages &amp; Frameworks</w:t>
+      </w:r>
+      <w:r>
+        <w:t xml:space="preserve">: Python, TypeScript, JavaScript, Node.js, Ruby on Rails, Bash.</w:t>
+      </w:r>
+    </w:p>
+    <w:p>
+      <w:pPr>
+        <w:pStyle w:val="Compact"/>
+        <w:numPr>
+          <w:ilvl w:val="0"/>
+          <w:numId w:val="1008"/>
+        </w:numPr>
+      </w:pPr>
+      <w:r>
+        <w:rPr>
+          <w:b/>
+          <w:bCs/>
+        </w:rPr>
+        <w:t xml:space="preserve">Back-end &amp; Data</w:t>
+      </w:r>
+      <w:r>
+        <w:t xml:space="preserve">: API Design, Microservices, Distributed Systems, PostgreSQL, MySQL, MongoDB, Redis.</w:t>
+      </w:r>
+    </w:p>
+    <w:p>
+      <w:pPr>
+        <w:pStyle w:val="Compact"/>
+        <w:numPr>
+          <w:ilvl w:val="0"/>
+          <w:numId w:val="1008"/>
+        </w:numPr>
+      </w:pPr>
+      <w:r>
+        <w:rPr>
+          <w:b/>
+          <w:bCs/>
+        </w:rPr>
+        <w:t xml:space="preserve">Cloud &amp; Infrastructure</w:t>
+      </w:r>
+      <w:r>
+        <w:t xml:space="preserve">: AWS, Google Cloud Platform, Kubernetes, Docker, Terraform, Ansible, Pulumi, Helm.</w:t>
+      </w:r>
+    </w:p>
+    <w:p>
+      <w:pPr>
+        <w:pStyle w:val="Compact"/>
+        <w:numPr>
+          <w:ilvl w:val="0"/>
+          <w:numId w:val="1008"/>
+        </w:numPr>
+      </w:pPr>
+      <w:r>
+        <w:rPr>
+          <w:b/>
+          <w:bCs/>
+        </w:rPr>
+        <w:t xml:space="preserve">CI/CD &amp; DevOps</w:t>
+      </w:r>
+      <w:r>
+        <w:t xml:space="preserve">: CircleCI, GitHub Actions, GitLab CI, Automated Testing, TDD, Infrastructure as Code, Cloud-Native Architecture.</w:t>
+      </w:r>
+    </w:p>
+    <w:p>
+      <w:pPr>
+        <w:pStyle w:val="Compact"/>
+        <w:numPr>
+          <w:ilvl w:val="0"/>
+          <w:numId w:val="1008"/>
+        </w:numPr>
+      </w:pPr>
+      <w:r>
+        <w:rPr>
+          <w:b/>
+          <w:bCs/>
+        </w:rPr>
+        <w:t xml:space="preserve">Developer Tooling</w:t>
+      </w:r>
+      <w:r>
+        <w:t xml:space="preserve">: Internal platform development, developer experience optimization, workflow automation, Slack integrations, observability.</w:t>
+      </w:r>
+    </w:p>
+    <w:p>
+      <w:pPr>
+        <w:pStyle w:val="Compact"/>
+        <w:numPr>
+          <w:ilvl w:val="0"/>
+          <w:numId w:val="1008"/>
+        </w:numPr>
+      </w:pPr>
+      <w:r>
+        <w:rPr>
+          <w:b/>
+          <w:bCs/>
+        </w:rPr>
+        <w:t xml:space="preserve">Leadership</w:t>
+      </w:r>
+      <w:r>
+        <w:t xml:space="preserve">: Team Building, Coaching &amp; Mentoring, Cross-Functional Collaboration, Roadmap Ownership, Hiring, Change Management.</w:t>
+      </w:r>
+    </w:p>
+    <w:bookmarkEnd w:id="42"/>
+    <w:bookmarkStart w:id="45" w:name="education"/>
+    <w:p>
+      <w:pPr>
+        <w:pStyle w:val="Heading2"/>
+      </w:pPr>
+      <w:r>
+        <w:t xml:space="preserve">Education</w:t>
+      </w:r>
+    </w:p>
+    <w:bookmarkStart w:id="44" w:name="X8aa14d071da44b7f3006e1d49a262db674bce64"/>
+    <w:p>
+      <w:pPr>
+        <w:pStyle w:val="Heading3"/>
+      </w:pPr>
+      <w:r>
+        <w:t xml:space="preserve">BA in Mathematics, minor in Computer Science</w:t>
+      </w:r>
+    </w:p>
+    <w:bookmarkStart w:id="43" w:name="Xe220d86d70cd5bf8ee7040adf9411d63a6235ab"/>
+    <w:p>
+      <w:pPr>
+        <w:pStyle w:val="Heading4"/>
+      </w:pPr>
+      <w:r>
+        <w:t xml:space="preserve">University of North Carolina at Asheville | May 2003</w:t>
+      </w:r>
+    </w:p>
+    <w:p>
+      <w:pPr>
+        <w:pStyle w:val="Compact"/>
+        <w:numPr>
+          <w:ilvl w:val="0"/>
+          <w:numId w:val="1009"/>
+        </w:numPr>
+      </w:pPr>
+      <w:r>
+        <w:t xml:space="preserve">Graduated with distinction in Mathematics. Undergraduate research in 4D fractals.</w:t>
+      </w:r>
+    </w:p>
     <w:bookmarkEnd w:id="43"/>
     <w:bookmarkEnd w:id="44"/>
-    <w:bookmarkStart w:id="45" w:name="recommendations"/>
+    <w:bookmarkEnd w:id="45"/>
+    <w:bookmarkStart w:id="46" w:name="recommendations"/>
     <w:p>
       <w:pPr>
         <w:pStyle w:val="Heading2"/>
@@ -1002,7 +959,7 @@
         <w:t xml:space="preserve">the solutions he architects, builds, and collaborates on come out better</w:t>
       </w:r>
       <w:r>
-        <w:t xml:space="preserve">. Jack also strives to be at the forefront of new technology and assess how he can leverage it. Newer tech like GenAI can be complex and ever-evolving, and Jack is not one to back down but step up and embrace. He does all this with a</w:t>
+        <w:t xml:space="preserve">. Jack also strives to be at the forefront of new technology and assess how he can leverage it. He does all this with a</w:t>
       </w:r>
       <w:r>
         <w:t xml:space="preserve"> </w:t>
@@ -1048,33 +1005,46 @@
         <w:pStyle w:val="BodyText"/>
       </w:pPr>
       <w:r>
-        <w:t xml:space="preserve">“Jack is a fantastic engineer always ready to</w:t>
-      </w:r>
-      <w:r>
-        <w:t xml:space="preserve"> </w:t>
-      </w:r>
-      <w:r>
-        <w:rPr>
-          <w:b/>
-          <w:bCs/>
-        </w:rPr>
-        <w:t xml:space="preserve">help solve problems and more importantly, teach you how to solve them</w:t>
-      </w:r>
-      <w:r>
-        <w:t xml:space="preserve">. He guided me and my team through a bunch of challenging GitOps situations with patience and kindness, leading by example. Always diligent with his work, willing to roll up his sleeves to get things done and</w:t>
-      </w:r>
-      <w:r>
-        <w:t xml:space="preserve"> </w:t>
-      </w:r>
-      <w:r>
-        <w:rPr>
-          <w:b/>
-          <w:bCs/>
-        </w:rPr>
-        <w:t xml:space="preserve">find creative solutions</w:t>
-      </w:r>
-      <w:r>
-        <w:t xml:space="preserve">, maybe tinkering in some kind of script that would make the manual processes easier and more resilient. Everyone would be lucky to have someone like him in their teams!”</w:t>
+        <w:t xml:space="preserve">“Jack has</w:t>
+      </w:r>
+      <w:r>
+        <w:t xml:space="preserve"> </w:t>
+      </w:r>
+      <w:r>
+        <w:rPr>
+          <w:b/>
+          <w:bCs/>
+        </w:rPr>
+        <w:t xml:space="preserve">had quite a profound impact on my career</w:t>
+      </w:r>
+      <w:r>
+        <w:t xml:space="preserve">. As a young engineer, I was fortunate enough to work with Jack as my coach. He served as a great mentor, helping me build both technical and professional skills and</w:t>
+      </w:r>
+      <w:r>
+        <w:t xml:space="preserve"> </w:t>
+      </w:r>
+      <w:r>
+        <w:rPr>
+          <w:b/>
+          <w:bCs/>
+        </w:rPr>
+        <w:t xml:space="preserve">forming me into the engineer that I am today</w:t>
+      </w:r>
+      <w:r>
+        <w:t xml:space="preserve">.</w:t>
+      </w:r>
+      <w:r>
+        <w:t xml:space="preserve"> </w:t>
+      </w:r>
+      <w:r>
+        <w:rPr>
+          <w:b/>
+          <w:bCs/>
+        </w:rPr>
+        <w:t xml:space="preserve">His mentorship was a key factor in elevating me from an incoming Junior Engineer to an Engineering Manager</w:t>
+      </w:r>
+      <w:r>
+        <w:t xml:space="preserve">. Jack has a great curiosity and a strong set of technical capabilities that allow him to serve as a great example for others and a key contributor to any team!”</w:t>
       </w:r>
     </w:p>
     <w:p>
@@ -1086,7 +1056,7 @@
           <w:i/>
           <w:iCs/>
         </w:rPr>
-        <w:t xml:space="preserve">— Cesar Palafox Garza, Principal Software Engineer, Kantata</w:t>
+        <w:t xml:space="preserve">— Wesley Morlock, Engineering Manager, Kantata</w:t>
       </w:r>
     </w:p>
     <w:p>
@@ -1094,46 +1064,33 @@
         <w:pStyle w:val="BodyText"/>
       </w:pPr>
       <w:r>
-        <w:t xml:space="preserve">“Jack has</w:t>
-      </w:r>
-      <w:r>
-        <w:t xml:space="preserve"> </w:t>
-      </w:r>
-      <w:r>
-        <w:rPr>
-          <w:b/>
-          <w:bCs/>
-        </w:rPr>
-        <w:t xml:space="preserve">had quite a profound impact on my career</w:t>
-      </w:r>
-      <w:r>
-        <w:t xml:space="preserve">. As a young engineer, I was fortunate enough to work with Jack as my coach. He served as a great mentor, helping me build both technical and professional skills and</w:t>
-      </w:r>
-      <w:r>
-        <w:t xml:space="preserve"> </w:t>
-      </w:r>
-      <w:r>
-        <w:rPr>
-          <w:b/>
-          <w:bCs/>
-        </w:rPr>
-        <w:t xml:space="preserve">forming me into the engineer that I am today</w:t>
-      </w:r>
-      <w:r>
-        <w:t xml:space="preserve">. Throughout our time together, Jack was caring and invested in helping me set goals and develop my career.</w:t>
-      </w:r>
-      <w:r>
-        <w:t xml:space="preserve"> </w:t>
-      </w:r>
-      <w:r>
-        <w:rPr>
-          <w:b/>
-          <w:bCs/>
-        </w:rPr>
-        <w:t xml:space="preserve">His mentorship was a key factor in elevating me from an incoming Junior Engineer to an Engineering Manager</w:t>
-      </w:r>
-      <w:r>
-        <w:t xml:space="preserve">. Jack has a great curiosity and a strong set of technical capabilities that allow him to serve as a great example for others and a key contributor to any team!”</w:t>
+        <w:t xml:space="preserve">“Jack is a fantastic engineer always ready to</w:t>
+      </w:r>
+      <w:r>
+        <w:t xml:space="preserve"> </w:t>
+      </w:r>
+      <w:r>
+        <w:rPr>
+          <w:b/>
+          <w:bCs/>
+        </w:rPr>
+        <w:t xml:space="preserve">help solve problems and more importantly, teach you how to solve them</w:t>
+      </w:r>
+      <w:r>
+        <w:t xml:space="preserve">. He guided me and my team through a bunch of challenging GitOps situations with patience and kindness, leading by example. Always diligent with his work, willing to roll up his sleeves to get things done and</w:t>
+      </w:r>
+      <w:r>
+        <w:t xml:space="preserve"> </w:t>
+      </w:r>
+      <w:r>
+        <w:rPr>
+          <w:b/>
+          <w:bCs/>
+        </w:rPr>
+        <w:t xml:space="preserve">find creative solutions</w:t>
+      </w:r>
+      <w:r>
+        <w:t xml:space="preserve">. Everyone would be lucky to have someone like him in their teams!”</w:t>
       </w:r>
     </w:p>
     <w:p>
@@ -1145,7 +1102,7 @@
           <w:i/>
           <w:iCs/>
         </w:rPr>
-        <w:t xml:space="preserve">— Wesley Morlock, Engineering Manager, Kantata</w:t>
+        <w:t xml:space="preserve">— Cesar Palafox Garza, Principal Software Engineer, Kantata</w:t>
       </w:r>
     </w:p>
     <w:p>
@@ -1153,20 +1110,33 @@
         <w:pStyle w:val="BodyText"/>
       </w:pPr>
       <w:r>
-        <w:t xml:space="preserve">“Jack provided invaluable leadership as a Principal Software Engineer at Kantata. He was a powerful voice for the technology but made sure to</w:t>
-      </w:r>
-      <w:r>
-        <w:t xml:space="preserve"> </w:t>
-      </w:r>
-      <w:r>
-        <w:rPr>
-          <w:b/>
-          <w:bCs/>
-        </w:rPr>
-        <w:t xml:space="preserve">advocate for changes that were also certain to provide immediate impact to the customer</w:t>
-      </w:r>
-      <w:r>
-        <w:t xml:space="preserve">. I highly recommend Jack as an excellent dev ops engineer and as a technical leader.”</w:t>
+        <w:t xml:space="preserve">“Jack is</w:t>
+      </w:r>
+      <w:r>
+        <w:t xml:space="preserve"> </w:t>
+      </w:r>
+      <w:r>
+        <w:rPr>
+          <w:b/>
+          <w:bCs/>
+        </w:rPr>
+        <w:t xml:space="preserve">awesome at understanding the direction teams need to go to make important improvements in Kantata’s Engineering organization as a whole</w:t>
+      </w:r>
+      <w:r>
+        <w:t xml:space="preserve">. He has been instrumental in building and implementing strategies to upgrade Ruby, Rails, and React. If I had any questions about infrastructure and Kubernetes he would be able to answer and</w:t>
+      </w:r>
+      <w:r>
+        <w:t xml:space="preserve"> </w:t>
+      </w:r>
+      <w:r>
+        <w:rPr>
+          <w:b/>
+          <w:bCs/>
+        </w:rPr>
+        <w:t xml:space="preserve">provide solid explanations to the entire team</w:t>
+      </w:r>
+      <w:r>
+        <w:t xml:space="preserve">.”</w:t>
       </w:r>
     </w:p>
     <w:p>
@@ -1178,223 +1148,24 @@
           <w:i/>
           <w:iCs/>
         </w:rPr>
-        <w:t xml:space="preserve">— Nathan Perry, Principal Software Engineer, Kantata</w:t>
+        <w:t xml:space="preserve">— Justin Hurstwright, Principal Software Engineer, Kantata</w:t>
       </w:r>
     </w:p>
     <w:p>
       <w:pPr>
         <w:pStyle w:val="BodyText"/>
       </w:pPr>
-      <w:r>
-        <w:t xml:space="preserve">“Jack is talented both as a software developer and as an operations engineer. While working together in a Principal Engineer capacity, I saw how</w:t>
-      </w:r>
-      <w:r>
-        <w:t xml:space="preserve"> </w:t>
-      </w:r>
-      <w:r>
-        <w:rPr>
-          <w:b/>
-          <w:bCs/>
-        </w:rPr>
-        <w:t xml:space="preserve">passionate Jack is about helping his colleagues and his organization level up</w:t>
-      </w:r>
-      <w:r>
-        <w:t xml:space="preserve">. He is a great engineer with excellent leadership and organizational abilities.”</w:t>
-      </w:r>
-    </w:p>
-    <w:p>
-      <w:pPr>
-        <w:pStyle w:val="BodyText"/>
-      </w:pPr>
-      <w:r>
-        <w:rPr>
-          <w:i/>
-          <w:iCs/>
-        </w:rPr>
-        <w:t xml:space="preserve">— Jason Larsen, Software Engineering Manager, Kantata</w:t>
-      </w:r>
-    </w:p>
-    <w:p>
-      <w:pPr>
-        <w:pStyle w:val="BodyText"/>
-      </w:pPr>
-      <w:r>
-        <w:t xml:space="preserve">“Jack is a great co-worker. He is</w:t>
-      </w:r>
-      <w:r>
-        <w:t xml:space="preserve"> </w:t>
-      </w:r>
-      <w:r>
-        <w:rPr>
-          <w:b/>
-          <w:bCs/>
-        </w:rPr>
-        <w:t xml:space="preserve">awesome at understanding the direction teams need to go to make important improvements in Kantata’s Engineering organization as a whole</w:t>
-      </w:r>
-      <w:r>
-        <w:t xml:space="preserve">. He has been instrumental in building and implementing strategies to upgrade Ruby, Rails, and React. If I had any questions about infrastructure and Kubernetes he would be able to answer and</w:t>
-      </w:r>
-      <w:r>
-        <w:t xml:space="preserve"> </w:t>
-      </w:r>
-      <w:r>
-        <w:rPr>
-          <w:b/>
-          <w:bCs/>
-        </w:rPr>
-        <w:t xml:space="preserve">provide solid explanations to the entire team</w:t>
-      </w:r>
-      <w:r>
-        <w:t xml:space="preserve">.”</w:t>
-      </w:r>
-    </w:p>
-    <w:p>
-      <w:pPr>
-        <w:pStyle w:val="BodyText"/>
-      </w:pPr>
-      <w:r>
-        <w:rPr>
-          <w:i/>
-          <w:iCs/>
-        </w:rPr>
-        <w:t xml:space="preserve">— Justin Hurstwright, Principal Software Engineer, Kantata</w:t>
-      </w:r>
-    </w:p>
-    <w:p>
-      <w:pPr>
-        <w:pStyle w:val="BodyText"/>
-      </w:pPr>
-      <w:r>
-        <w:t xml:space="preserve">“Jack is a phenomenal resource to work with. He is</w:t>
-      </w:r>
-      <w:r>
-        <w:t xml:space="preserve"> </w:t>
-      </w:r>
-      <w:r>
-        <w:rPr>
-          <w:b/>
-          <w:bCs/>
-        </w:rPr>
-        <w:t xml:space="preserve">very knowledgeable about programming and cloud infrastructure</w:t>
-      </w:r>
-      <w:r>
-        <w:t xml:space="preserve"> </w:t>
-      </w:r>
-      <w:r>
-        <w:t xml:space="preserve">and is always eager to learn new things.”</w:t>
-      </w:r>
-    </w:p>
-    <w:p>
-      <w:pPr>
-        <w:pStyle w:val="BodyText"/>
-      </w:pPr>
-      <w:r>
-        <w:rPr>
-          <w:i/>
-          <w:iCs/>
-        </w:rPr>
-        <w:t xml:space="preserve">— Donovan Hubbard, Senior DevOps Engineer, Kantata</w:t>
-      </w:r>
-    </w:p>
-    <w:p>
-      <w:pPr>
-        <w:pStyle w:val="BodyText"/>
-      </w:pPr>
-      <w:r>
-        <w:t xml:space="preserve">“Jack has a flair for finding better, faster, and more reliable ways to get things done. He</w:t>
-      </w:r>
-      <w:r>
-        <w:t xml:space="preserve"> </w:t>
-      </w:r>
-      <w:r>
-        <w:rPr>
-          <w:b/>
-          <w:bCs/>
-        </w:rPr>
-        <w:t xml:space="preserve">advocates best practices, like unit testing, and has a deep knowledge of OO architecture</w:t>
-      </w:r>
-      <w:r>
-        <w:t xml:space="preserve">. Jack thinks on his toes, and will always be there with the team at 4 a.m. if circumstance requires it.</w:t>
-      </w:r>
-      <w:r>
-        <w:t xml:space="preserve"> </w:t>
-      </w:r>
-      <w:r>
-        <w:rPr>
-          <w:rStyle w:val="VerbatimChar"/>
-        </w:rPr>
-        <w:t xml:space="preserve">:%s/average developers/developers like jack/g</w:t>
-      </w:r>
-      <w:r>
-        <w:t xml:space="preserve"> </w:t>
-      </w:r>
-      <w:r>
-        <w:t xml:space="preserve">if you know what’s good for you.”</w:t>
-      </w:r>
-    </w:p>
-    <w:p>
-      <w:pPr>
-        <w:pStyle w:val="BodyText"/>
-      </w:pPr>
-      <w:r>
-        <w:rPr>
-          <w:i/>
-          <w:iCs/>
-        </w:rPr>
-        <w:t xml:space="preserve">— Greg Whitescarver, Founder, Mojave</w:t>
-      </w:r>
-    </w:p>
-    <w:p>
-      <w:pPr>
-        <w:pStyle w:val="BodyText"/>
-      </w:pPr>
-      <w:r>
-        <w:t xml:space="preserve">“With Jack,</w:t>
-      </w:r>
-      <w:r>
-        <w:t xml:space="preserve"> </w:t>
-      </w:r>
-      <w:r>
-        <w:rPr>
-          <w:b/>
-          <w:bCs/>
-        </w:rPr>
-        <w:t xml:space="preserve">the more complex the problem, the more simple his solutions</w:t>
-      </w:r>
-      <w:r>
-        <w:t xml:space="preserve">. From eradicating dynamic php bugs to providing innovative javascript capabilities, Master Senechal is more than a mind to be reckoned with, he’s an</w:t>
-      </w:r>
-      <w:r>
-        <w:t xml:space="preserve"> </w:t>
-      </w:r>
-      <w:r>
-        <w:rPr>
-          <w:b/>
-          <w:bCs/>
-        </w:rPr>
-        <w:t xml:space="preserve">integrative capacity builder</w:t>
-      </w:r>
-      <w:r>
-        <w:t xml:space="preserve"> </w:t>
-      </w:r>
-      <w:r>
-        <w:t xml:space="preserve">with a wide range of technological expertise. If there is anything that can be done through web development, Jack can figure out how to do it, and make it happen.”</w:t>
-      </w:r>
-    </w:p>
-    <w:p>
-      <w:pPr>
-        <w:pStyle w:val="BodyText"/>
-      </w:pPr>
-      <w:r>
-        <w:rPr>
-          <w:i/>
-          <w:iCs/>
-        </w:rPr>
-        <w:t xml:space="preserve">— Adam Apollo, Cofounder &amp; CEO, Superluminal Systems</w:t>
-      </w:r>
-    </w:p>
-    <w:bookmarkEnd w:id="45"/>
+      <w:hyperlink r:id="rId22">
+        <w:r>
+          <w:rPr>
+            <w:rStyle w:val="Hyperlink"/>
+          </w:rPr>
+          <w:t xml:space="preserve">See additional recommendations on LinkedIn</w:t>
+        </w:r>
+      </w:hyperlink>
+    </w:p>
     <w:bookmarkEnd w:id="46"/>
+    <w:bookmarkEnd w:id="47"/>
     <w:sectPr/>
   </w:body>
 </w:document>

</xml_diff>

<commit_message>
Tailor resume for Baseten Software Engineer - AI Enablement
</commit_message>
<xml_diff>
--- a/resume.docx
+++ b/resume.docx
@@ -2,7 +2,7 @@
 <file path=word/document.xml><?xml version="1.0" encoding="utf-8"?>
 <w:document xmlns:w="http://schemas.openxmlformats.org/wordprocessingml/2006/main" xmlns:m="http://schemas.openxmlformats.org/officeDocument/2006/math" xmlns:r="http://schemas.openxmlformats.org/officeDocument/2006/relationships" xmlns:o="urn:schemas-microsoft-com:office:office" xmlns:v="urn:schemas-microsoft-com:vml" xmlns:w10="urn:schemas-microsoft-com:office:word" xmlns:a="http://schemas.openxmlformats.org/drawingml/2006/main" xmlns:pic="http://schemas.openxmlformats.org/drawingml/2006/picture" xmlns:wp="http://schemas.openxmlformats.org/drawingml/2006/wordprocessingDrawing">
   <w:body>
-    <w:bookmarkStart w:id="46" w:name="jack-senechal"/>
+    <w:bookmarkStart w:id="47" w:name="jack-senechal"/>
     <w:p>
       <w:pPr>
         <w:pStyle w:val="Heading1"/>
@@ -11,13 +11,13 @@
         <w:t xml:space="preserve">Jack Senechal</w:t>
       </w:r>
     </w:p>
-    <w:bookmarkStart w:id="23" w:name="engineering-leader-entrepreneur"/>
+    <w:bookmarkStart w:id="23" w:name="ai-enablement-platform-engineer"/>
     <w:p>
       <w:pPr>
         <w:pStyle w:val="Heading2"/>
       </w:pPr>
       <w:r>
-        <w:t xml:space="preserve">Engineering Leader / Entrepreneur</w:t>
+        <w:t xml:space="preserve">AI Enablement &amp; Platform Engineer</w:t>
       </w:r>
     </w:p>
     <w:p>
@@ -32,13 +32,13 @@
         <w:t xml:space="preserve">Located in Novato, CA</w:t>
       </w:r>
       <w:r>
-        <w:br/>
+        <w:t xml:space="preserve"> </w:t>
       </w:r>
       <w:r>
         <w:t xml:space="preserve">Phone: 415-779-2701</w:t>
       </w:r>
       <w:r>
-        <w:br/>
+        <w:t xml:space="preserve"> </w:t>
       </w:r>
       <w:r>
         <w:t xml:space="preserve">Email:</w:t>
@@ -55,7 +55,7 @@
         </w:r>
       </w:hyperlink>
       <w:r>
-        <w:br/>
+        <w:t xml:space="preserve"> </w:t>
       </w:r>
       <w:r>
         <w:t xml:space="preserve">GitHub:</w:t>
@@ -68,11 +68,11 @@
           <w:rPr>
             <w:rStyle w:val="Hyperlink"/>
           </w:rPr>
-          <w:t xml:space="preserve">https://github.com/jacksenechal</w:t>
+          <w:t xml:space="preserve">github.com/jacksenechal</w:t>
         </w:r>
       </w:hyperlink>
       <w:r>
-        <w:br/>
+        <w:t xml:space="preserve"> </w:t>
       </w:r>
       <w:r>
         <w:t xml:space="preserve">LinkedIn:</w:t>
@@ -85,7 +85,7 @@
           <w:rPr>
             <w:rStyle w:val="Hyperlink"/>
           </w:rPr>
-          <w:t xml:space="preserve">https://linkedin.com/in/jacksenechal</w:t>
+          <w:t xml:space="preserve">linkedin.com/in/jacksenechal</w:t>
         </w:r>
       </w:hyperlink>
     </w:p>
@@ -108,27 +108,27 @@
         </w:numPr>
       </w:pPr>
       <w:r>
-        <w:t xml:space="preserve">Proven leader in software development, infrastructure, and</w:t>
-      </w:r>
-      <w:r>
-        <w:t xml:space="preserve"> </w:t>
-      </w:r>
-      <w:r>
-        <w:rPr>
-          <w:b/>
-          <w:bCs/>
-        </w:rPr>
-        <w:t xml:space="preserve">team management</w:t>
-      </w:r>
-      <w:r>
-        <w:t xml:space="preserve"> </w:t>
-      </w:r>
-      <w:r>
-        <w:t xml:space="preserve">with</w:t>
-      </w:r>
-      <w:r>
-        <w:t xml:space="preserve"> </w:t>
-      </w:r>
+        <w:rPr>
+          <w:b/>
+          <w:bCs/>
+        </w:rPr>
+        <w:t xml:space="preserve">Principal-level engineer</w:t>
+      </w:r>
+      <w:r>
+        <w:t xml:space="preserve"> </w:t>
+      </w:r>
+      <w:r>
+        <w:t xml:space="preserve">specializing in AI-powered developer tooling, agent infrastructure, and engineering productivity at scale</w:t>
+      </w:r>
+    </w:p>
+    <w:p>
+      <w:pPr>
+        <w:pStyle w:val="Compact"/>
+        <w:numPr>
+          <w:ilvl w:val="0"/>
+          <w:numId w:val="1001"/>
+        </w:numPr>
+      </w:pPr>
       <w:r>
         <w:rPr>
           <w:b/>
@@ -140,7 +140,23 @@
         <w:t xml:space="preserve"> </w:t>
       </w:r>
       <w:r>
-        <w:t xml:space="preserve">of hands-on experience</w:t>
+        <w:t xml:space="preserve">building and shipping software, with</w:t>
+      </w:r>
+      <w:r>
+        <w:t xml:space="preserve"> </w:t>
+      </w:r>
+      <w:r>
+        <w:rPr>
+          <w:b/>
+          <w:bCs/>
+        </w:rPr>
+        <w:t xml:space="preserve">6+ years leading teams</w:t>
+      </w:r>
+      <w:r>
+        <w:t xml:space="preserve"> </w:t>
+      </w:r>
+      <w:r>
+        <w:t xml:space="preserve">across multiple product domains</w:t>
       </w:r>
     </w:p>
     <w:p>
@@ -152,6 +168,46 @@
         </w:numPr>
       </w:pPr>
       <w:r>
+        <w:t xml:space="preserve">Hands-on builder of</w:t>
+      </w:r>
+      <w:r>
+        <w:t xml:space="preserve"> </w:t>
+      </w:r>
+      <w:r>
+        <w:rPr>
+          <w:b/>
+          <w:bCs/>
+        </w:rPr>
+        <w:t xml:space="preserve">AI agents, LLM-powered workflows, and coding assistant integrations</w:t>
+      </w:r>
+      <w:r>
+        <w:t xml:space="preserve"> </w:t>
+      </w:r>
+      <w:r>
+        <w:t xml:space="preserve">— from evaluation and deployment to measurement and adoption</w:t>
+      </w:r>
+    </w:p>
+    <w:p>
+      <w:pPr>
+        <w:pStyle w:val="Compact"/>
+        <w:numPr>
+          <w:ilvl w:val="0"/>
+          <w:numId w:val="1001"/>
+        </w:numPr>
+      </w:pPr>
+      <w:r>
+        <w:t xml:space="preserve">Full-stack generalist with deep experience in DevOps, cloud-native systems, and internal platform engineering</w:t>
+      </w:r>
+    </w:p>
+    <w:p>
+      <w:pPr>
+        <w:pStyle w:val="Compact"/>
+        <w:numPr>
+          <w:ilvl w:val="0"/>
+          <w:numId w:val="1001"/>
+        </w:numPr>
+      </w:pPr>
+      <w:r>
         <w:t xml:space="preserve">Committed</w:t>
       </w:r>
       <w:r>
@@ -165,7 +221,10 @@
         <w:t xml:space="preserve">mentor and coach</w:t>
       </w:r>
       <w:r>
-        <w:t xml:space="preserve">, elevating team members’ skill sets and fostering professional growth</w:t>
+        <w:t xml:space="preserve"> </w:t>
+      </w:r>
+      <w:r>
+        <w:t xml:space="preserve">who elevated junior engineers to senior technical and engineering management positions</w:t>
       </w:r>
     </w:p>
     <w:p>
@@ -177,87 +236,11 @@
         </w:numPr>
       </w:pPr>
       <w:r>
-        <w:t xml:space="preserve">Strategic thinker, mercurial innovator, and expert problem solver</w:t>
-      </w:r>
-    </w:p>
-    <w:p>
-      <w:pPr>
-        <w:pStyle w:val="Compact"/>
-        <w:numPr>
-          <w:ilvl w:val="0"/>
-          <w:numId w:val="1001"/>
-        </w:numPr>
-      </w:pPr>
-      <w:r>
-        <w:t xml:space="preserve">Resilient and dedicated, ready to embrace challenges and opportunities</w:t>
-      </w:r>
-    </w:p>
-    <w:p>
-      <w:pPr>
-        <w:pStyle w:val="Compact"/>
-        <w:numPr>
-          <w:ilvl w:val="0"/>
-          <w:numId w:val="1001"/>
-        </w:numPr>
-      </w:pPr>
-      <w:r>
-        <w:t xml:space="preserve">Strong customer focus,</w:t>
-      </w:r>
-      <w:r>
-        <w:t xml:space="preserve"> </w:t>
-      </w:r>
-      <w:r>
-        <w:rPr>
-          <w:b/>
-          <w:bCs/>
-        </w:rPr>
-        <w:t xml:space="preserve">advocating for impactful changes</w:t>
-      </w:r>
-      <w:r>
-        <w:t xml:space="preserve"> </w:t>
-      </w:r>
-      <w:r>
-        <w:t xml:space="preserve">and ensuring product value</w:t>
-      </w:r>
-    </w:p>
-    <w:p>
-      <w:pPr>
-        <w:pStyle w:val="Compact"/>
-        <w:numPr>
-          <w:ilvl w:val="0"/>
-          <w:numId w:val="1001"/>
-        </w:numPr>
-      </w:pPr>
-      <w:r>
         <w:t xml:space="preserve">Entrepreneurial spirit with multiple co-founding experiences</w:t>
       </w:r>
     </w:p>
-    <w:p>
-      <w:pPr>
-        <w:pStyle w:val="Compact"/>
-        <w:numPr>
-          <w:ilvl w:val="0"/>
-          <w:numId w:val="1001"/>
-        </w:numPr>
-      </w:pPr>
-      <w:r>
-        <w:t xml:space="preserve">Principal-level engineer specializing in AI-powered developer tooling, platform modernization, and large-scale engineering productivity</w:t>
-      </w:r>
-    </w:p>
-    <w:p>
-      <w:pPr>
-        <w:pStyle w:val="Compact"/>
-        <w:numPr>
-          <w:ilvl w:val="0"/>
-          <w:numId w:val="1001"/>
-        </w:numPr>
-      </w:pPr>
-      <w:r>
-        <w:t xml:space="preserve">Full-stack generalist with deep experience applying AI/LLMs, DevOps, and cloud-native systems to accelerate software delivery</w:t>
-      </w:r>
-    </w:p>
     <w:bookmarkEnd w:id="24"/>
-    <w:bookmarkStart w:id="31" w:name="industry-experience"/>
+    <w:bookmarkStart w:id="36" w:name="industry-experience"/>
     <w:p>
       <w:pPr>
         <w:pStyle w:val="Heading2"/>
@@ -275,13 +258,13 @@
         <w:t xml:space="preserve">Technical Lead</w:t>
       </w:r>
     </w:p>
-    <w:bookmarkStart w:id="25" w:name="X75167482f34e06a01a656d1f4cef9a03bec6c7a"/>
+    <w:bookmarkStart w:id="25" w:name="X6dafa89e46c32694395442a9a6ca99eae379ab9"/>
     <w:p>
       <w:pPr>
         <w:pStyle w:val="Heading4"/>
       </w:pPr>
       <w:r>
-        <w:t xml:space="preserve">Building Humane Technology | June 2025 - Present | Remote (US)</w:t>
+        <w:t xml:space="preserve">Building Humane Technology | June 2025 - Present | Remote</w:t>
       </w:r>
     </w:p>
     <w:p>
@@ -293,7 +276,7 @@
         </w:numPr>
       </w:pPr>
       <w:r>
-        <w:t xml:space="preserve">Co-architecting and leading development of HumaneBench.ai, an open-source benchmark for evaluating AI systems against humane technology principles.</w:t>
+        <w:t xml:space="preserve">Co-architecting and leading development of HumaneBench.ai, an open-source AI evaluation framework built on AISI Inspect. Python.</w:t>
       </w:r>
     </w:p>
     <w:p>
@@ -305,7 +288,7 @@
         </w:numPr>
       </w:pPr>
       <w:r>
-        <w:t xml:space="preserve">Developing an extensible AI evaluation framework built on AISI Inspect, focused on measuring and improving LLM behavior in real-world developer and operational workflows.</w:t>
+        <w:t xml:space="preserve">Developing extensible evaluation tooling focused on measuring and improving LLM behavior in real-world developer and operational workflows.</w:t>
       </w:r>
     </w:p>
     <w:p>
@@ -317,51 +300,27 @@
         </w:numPr>
       </w:pPr>
       <w:r>
-        <w:t xml:space="preserve">Shaping product and technical roadmap for AI-driven tooling, including production monitoring concepts, multi-turn evaluation, and maturity models to support adoption, measurement, and continuous improvement.</w:t>
-      </w:r>
-    </w:p>
-    <w:p>
-      <w:pPr>
-        <w:pStyle w:val="Compact"/>
-        <w:numPr>
-          <w:ilvl w:val="0"/>
-          <w:numId w:val="1002"/>
-        </w:numPr>
-      </w:pPr>
-      <w:r>
-        <w:t xml:space="preserve">Contributing to education initiatives including Humane Tech and Agentic AI training for the UN Secretariat and broader developer community, plus coordinating hackathons and public AMAs.</w:t>
-      </w:r>
-    </w:p>
-    <w:p>
-      <w:pPr>
-        <w:pStyle w:val="Compact"/>
-        <w:numPr>
-          <w:ilvl w:val="0"/>
-          <w:numId w:val="1002"/>
-        </w:numPr>
-      </w:pPr>
-      <w:r>
-        <w:t xml:space="preserve">Building partnerships and fostering open-source community engagement around humane AI evaluation standards.</w:t>
+        <w:t xml:space="preserve">Defining AI adoption strategy and maturity models — measuring impact, championing best practices, and guiding teams through AI-assisted workflow integration.</w:t>
       </w:r>
     </w:p>
     <w:bookmarkEnd w:id="25"/>
     <w:bookmarkEnd w:id="26"/>
-    <w:bookmarkStart w:id="28" w:name="infrastructure-engineer"/>
+    <w:bookmarkStart w:id="28" w:name="co-founder-lead-developer"/>
     <w:p>
       <w:pPr>
         <w:pStyle w:val="Heading3"/>
       </w:pPr>
       <w:r>
-        <w:t xml:space="preserve">Infrastructure Engineer</w:t>
-      </w:r>
-    </w:p>
-    <w:bookmarkStart w:id="27" w:name="tobiko-mar-2024---oct-2024-remote-us"/>
+        <w:t xml:space="preserve">Co-founder &amp; Lead Developer</w:t>
+      </w:r>
+    </w:p>
+    <w:bookmarkStart w:id="27" w:name="Xffd4b369c0bcf0f7e3f28f0e84324bac520d95a"/>
     <w:p>
       <w:pPr>
         <w:pStyle w:val="Heading4"/>
       </w:pPr>
       <w:r>
-        <w:t xml:space="preserve">Tobiko | Mar 2024 - Oct 2024 | Remote (US)</w:t>
+        <w:t xml:space="preserve">Mirror Astrology | Nov 2024 - Present | Remote</w:t>
       </w:r>
     </w:p>
     <w:p>
@@ -373,7 +332,7 @@
         </w:numPr>
       </w:pPr>
       <w:r>
-        <w:t xml:space="preserve">Collaborated with a fast-paced team to architect and implement a robust, scalable, modern cloud platform serving customer workloads.</w:t>
+        <w:t xml:space="preserve">Built AI chatbot/agent integrating multiple LLMs with complex prompting, tool use, context augmentation, and multi-turn conversational workflows.</w:t>
       </w:r>
     </w:p>
     <w:p>
@@ -385,7 +344,7 @@
         </w:numPr>
       </w:pPr>
       <w:r>
-        <w:t xml:space="preserve">Built out CI/CD patterns including mono-repo conditional workflows, workload identity federation, and continuous delivery.</w:t>
+        <w:t xml:space="preserve">Owned the entire frontend: Ruby on Rails views, JavaScript, HTML+CSS, Tailwind, responsive UI/UX. Contributed to backend development.</w:t>
       </w:r>
     </w:p>
     <w:p>
@@ -397,39 +356,27 @@
         </w:numPr>
       </w:pPr>
       <w:r>
-        <w:t xml:space="preserve">Implemented a Slack-based customer support and incident response platform, and onboarded teammates and customers.</w:t>
-      </w:r>
-    </w:p>
-    <w:p>
-      <w:pPr>
-        <w:pStyle w:val="Compact"/>
-        <w:numPr>
-          <w:ilvl w:val="0"/>
-          <w:numId w:val="1003"/>
-        </w:numPr>
-      </w:pPr>
-      <w:r>
-        <w:t xml:space="preserve">Python, Pulumi, Google Cloud Platform, Google Kubernetes Engine, Google Cloud Run, CI/CD with CircleCI, Helm, SQLMesh.</w:t>
+        <w:t xml:space="preserve">Collaborated closely with co-founders on product direction, UX, roadmap planning, and prioritization.</w:t>
       </w:r>
     </w:p>
     <w:bookmarkEnd w:id="27"/>
     <w:bookmarkEnd w:id="28"/>
-    <w:bookmarkStart w:id="30" w:name="X7a2c313efdde198d901363c762c81839771c845"/>
+    <w:bookmarkStart w:id="30" w:name="infrastructure-engineer"/>
     <w:p>
       <w:pPr>
         <w:pStyle w:val="Heading3"/>
       </w:pPr>
       <w:r>
-        <w:t xml:space="preserve">Engineering Manager / Principal Software Engineer</w:t>
-      </w:r>
-    </w:p>
-    <w:bookmarkStart w:id="29" w:name="X47289269eb944414c9285d314973b45c253bcef"/>
+        <w:t xml:space="preserve">Infrastructure Engineer</w:t>
+      </w:r>
+    </w:p>
+    <w:bookmarkStart w:id="29" w:name="tobiko-mar-2024---oct-2024-remote"/>
     <w:p>
       <w:pPr>
         <w:pStyle w:val="Heading4"/>
       </w:pPr>
       <w:r>
-        <w:t xml:space="preserve">Mavenlink / Kantata | Apr 2017 - Dec 2023 | San Francisco, CA</w:t>
+        <w:t xml:space="preserve">Tobiko | Mar 2024 - Oct 2024 | Remote</w:t>
       </w:r>
     </w:p>
     <w:p>
@@ -441,14 +388,7 @@
         </w:numPr>
       </w:pPr>
       <w:r>
-        <w:rPr>
-          <w:b/>
-          <w:bCs/>
-        </w:rPr>
-        <w:t xml:space="preserve">Operations Team Leadership</w:t>
-      </w:r>
-      <w:r>
-        <w:t xml:space="preserve">: Over four years, recruited and led a new infrastructure team dedicated to building and scaling the platform. Instrumental in leading the organization’s transition towards a DevOps culture, serving as a change agent and technical authority across engineering. Created a clear, calm, and constructive environment that allowed the team to thrive. Responsible for roadmap stewardship, untangling requirements, and arranging priorities to maximize flow. Transitioned a large legacy infrastructure codebase to cutting-edge, cloud-native, IAC-oriented tools while remaining hands-on with coding, architecture, and collaboration on mission-critical projects.</w:t>
+        <w:t xml:space="preserve">Architected and implemented a scalable cloud platform serving customer workloads at a fast-paced startup.</w:t>
       </w:r>
     </w:p>
     <w:p>
@@ -460,14 +400,7 @@
         </w:numPr>
       </w:pPr>
       <w:r>
-        <w:rPr>
-          <w:b/>
-          <w:bCs/>
-        </w:rPr>
-        <w:t xml:space="preserve">M-Bridge Platform Leadership</w:t>
-      </w:r>
-      <w:r>
-        <w:t xml:space="preserve">: For two years, spearheaded a team to stabilize and enhance an agent-based integration platform. Established operational metrics and monitoring systems that reduced platform errors and incidents by approximately 100x. Successfully performed a migration to Kubernetes with zero downtime, including relational, document, and cache databases. Demonstrated ability to measure impact and drive data-informed decisions.</w:t>
+        <w:t xml:space="preserve">Built CI/CD patterns including mono-repo conditional workflows, workload identity federation, and continuous delivery.</w:t>
       </w:r>
     </w:p>
     <w:p>
@@ -479,14 +412,7 @@
         </w:numPr>
       </w:pPr>
       <w:r>
-        <w:rPr>
-          <w:b/>
-          <w:bCs/>
-        </w:rPr>
-        <w:t xml:space="preserve">Insights Platform Leadership</w:t>
-      </w:r>
-      <w:r>
-        <w:t xml:space="preserve">: For three months, led a transition team responsible for overseeing and improving the BI data pipeline. Successfully migrated the pipeline to Kubernetes, accelerating modernization initiatives.</w:t>
+        <w:t xml:space="preserve">Implemented a Slack-based customer support and incident response platform; onboarded teammates and customers.</w:t>
       </w:r>
     </w:p>
     <w:p>
@@ -498,207 +424,192 @@
         </w:numPr>
       </w:pPr>
       <w:r>
-        <w:rPr>
-          <w:b/>
-          <w:bCs/>
-        </w:rPr>
-        <w:t xml:space="preserve">Cross-Functional Leadership &amp; Organizational Impact</w:t>
-      </w:r>
-      <w:r>
-        <w:t xml:space="preserve">: Took on organization-wide roles including mentorship and coaching, interviewing and hiring, and organizational change management and process optimization. Influenced decisions at all levels and promoted best practices across the engineering organization. Recognized with Top Performer Award in 2021 for contributions to technical excellence and team development.</w:t>
+        <w:t xml:space="preserve">Python, Pulumi, GCP, GKE, Cloud Run, CircleCI, Helm, SQLMesh.</w:t>
       </w:r>
     </w:p>
     <w:bookmarkEnd w:id="29"/>
     <w:bookmarkEnd w:id="30"/>
+    <w:bookmarkStart w:id="32" w:name="X7a2c313efdde198d901363c762c81839771c845"/>
+    <w:p>
+      <w:pPr>
+        <w:pStyle w:val="Heading3"/>
+      </w:pPr>
+      <w:r>
+        <w:t xml:space="preserve">Engineering Manager / Principal Software Engineer</w:t>
+      </w:r>
+    </w:p>
+    <w:bookmarkStart w:id="31" w:name="X47289269eb944414c9285d314973b45c253bcef"/>
+    <w:p>
+      <w:pPr>
+        <w:pStyle w:val="Heading4"/>
+      </w:pPr>
+      <w:r>
+        <w:t xml:space="preserve">Mavenlink / Kantata | Apr 2017 - Dec 2023 | San Francisco, CA</w:t>
+      </w:r>
+    </w:p>
+    <w:p>
+      <w:pPr>
+        <w:pStyle w:val="Compact"/>
+        <w:numPr>
+          <w:ilvl w:val="0"/>
+          <w:numId w:val="1005"/>
+        </w:numPr>
+      </w:pPr>
+      <w:r>
+        <w:rPr>
+          <w:b/>
+          <w:bCs/>
+        </w:rPr>
+        <w:t xml:space="preserve">M-Bridge Integration Platform</w:t>
+      </w:r>
+      <w:r>
+        <w:t xml:space="preserve"> </w:t>
+      </w:r>
+      <w:r>
+        <w:t xml:space="preserve">(2 years): Led a team to stabilize and scale an agent-based integration platform handling multi-system data orchestration. Established operational metrics and monitoring that reduced errors and incidents by ~100x. Executed a zero-downtime migration to Kubernetes including relational, document, and cache databases.</w:t>
+      </w:r>
+    </w:p>
+    <w:p>
+      <w:pPr>
+        <w:pStyle w:val="Compact"/>
+        <w:numPr>
+          <w:ilvl w:val="0"/>
+          <w:numId w:val="1005"/>
+        </w:numPr>
+      </w:pPr>
+      <w:r>
+        <w:rPr>
+          <w:b/>
+          <w:bCs/>
+        </w:rPr>
+        <w:t xml:space="preserve">Infrastructure Platform</w:t>
+      </w:r>
+      <w:r>
+        <w:t xml:space="preserve"> </w:t>
+      </w:r>
+      <w:r>
+        <w:t xml:space="preserve">(4 years): Recruited and built a new team from scratch dedicated to the infrastructure platform. Led the organization’s DevOps culture transformation, serving as a change agent and technical authority across engineering. Owned roadmap stewardship, requirements triage, and priority management while staying hands-on with coding, architecture, and code review. Transitioned a large legacy codebase to cloud-native, Infrastructure-as-Code tooling (Terraform, Ansible, Kubernetes).</w:t>
+      </w:r>
+    </w:p>
+    <w:p>
+      <w:pPr>
+        <w:pStyle w:val="Compact"/>
+        <w:numPr>
+          <w:ilvl w:val="0"/>
+          <w:numId w:val="1005"/>
+        </w:numPr>
+      </w:pPr>
+      <w:r>
+        <w:rPr>
+          <w:b/>
+          <w:bCs/>
+        </w:rPr>
+        <w:t xml:space="preserve">BI Data Pipeline</w:t>
+      </w:r>
+      <w:r>
+        <w:t xml:space="preserve"> </w:t>
+      </w:r>
+      <w:r>
+        <w:t xml:space="preserve">(3 months): Led a transition team to take ownership of and improve the analytics data pipeline. Migrated the pipeline to Kubernetes.</w:t>
+      </w:r>
+    </w:p>
+    <w:p>
+      <w:pPr>
+        <w:pStyle w:val="Compact"/>
+        <w:numPr>
+          <w:ilvl w:val="0"/>
+          <w:numId w:val="1005"/>
+        </w:numPr>
+      </w:pPr>
+      <w:r>
+        <w:rPr>
+          <w:b/>
+          <w:bCs/>
+        </w:rPr>
+        <w:t xml:space="preserve">Cross-Functional Impact</w:t>
+      </w:r>
+      <w:r>
+        <w:t xml:space="preserve">: Mentored engineers across teams — notably coached a junior engineer who grew to Engineering Manager. Led interviewing and hiring. Drove organizational change management and process optimization.</w:t>
+      </w:r>
+      <w:r>
+        <w:t xml:space="preserve"> </w:t>
+      </w:r>
+      <w:r>
+        <w:rPr>
+          <w:b/>
+          <w:bCs/>
+        </w:rPr>
+        <w:t xml:space="preserve">Top Performer Award, 2021</w:t>
+      </w:r>
+      <w:r>
+        <w:t xml:space="preserve">.</w:t>
+      </w:r>
+    </w:p>
     <w:bookmarkEnd w:id="31"/>
-    <w:bookmarkStart w:id="36" w:name="skills"/>
-    <w:p>
-      <w:pPr>
-        <w:pStyle w:val="Heading2"/>
-      </w:pPr>
-      <w:r>
-        <w:t xml:space="preserve">Skills</w:t>
-      </w:r>
-    </w:p>
-    <w:bookmarkStart w:id="32" w:name="technical-skills"/>
+    <w:bookmarkEnd w:id="32"/>
+    <w:bookmarkStart w:id="34" w:name="lead-developer-co-founder"/>
     <w:p>
       <w:pPr>
         <w:pStyle w:val="Heading3"/>
       </w:pPr>
       <w:r>
-        <w:t xml:space="preserve">Technical Skills</w:t>
-      </w:r>
-    </w:p>
-    <w:p>
-      <w:pPr>
-        <w:pStyle w:val="Compact"/>
-        <w:numPr>
-          <w:ilvl w:val="0"/>
-          <w:numId w:val="1005"/>
-        </w:numPr>
-      </w:pPr>
-      <w:r>
-        <w:rPr>
-          <w:b/>
-          <w:bCs/>
-        </w:rPr>
-        <w:t xml:space="preserve">Languages &amp; Frameworks</w:t>
-      </w:r>
-      <w:r>
-        <w:t xml:space="preserve">: Ruby on Rails, Python, Node.js, JavaScript, TypeScript, Bash.</w:t>
-      </w:r>
-    </w:p>
-    <w:p>
-      <w:pPr>
-        <w:pStyle w:val="Compact"/>
-        <w:numPr>
-          <w:ilvl w:val="0"/>
-          <w:numId w:val="1005"/>
-        </w:numPr>
-      </w:pPr>
-      <w:r>
-        <w:rPr>
-          <w:b/>
-          <w:bCs/>
-        </w:rPr>
-        <w:t xml:space="preserve">AI/LLM Development</w:t>
-      </w:r>
-      <w:r>
-        <w:t xml:space="preserve">: MCP (Model Context Protocol), chatbot development, prompt engineering, tool use, context augmentation, AI-assisted developer workflows.</w:t>
-      </w:r>
-    </w:p>
-    <w:p>
-      <w:pPr>
-        <w:pStyle w:val="Compact"/>
-        <w:numPr>
-          <w:ilvl w:val="0"/>
-          <w:numId w:val="1005"/>
-        </w:numPr>
-      </w:pPr>
-      <w:r>
-        <w:rPr>
-          <w:b/>
-          <w:bCs/>
-        </w:rPr>
-        <w:t xml:space="preserve">Databases</w:t>
-      </w:r>
-      <w:r>
-        <w:t xml:space="preserve">: MySQL, PostgreSQL, MongoDB, Redis, Cloud-based data services.</w:t>
-      </w:r>
-    </w:p>
-    <w:p>
-      <w:pPr>
-        <w:pStyle w:val="Compact"/>
-        <w:numPr>
-          <w:ilvl w:val="0"/>
-          <w:numId w:val="1005"/>
-        </w:numPr>
-      </w:pPr>
-      <w:r>
-        <w:rPr>
-          <w:b/>
-          <w:bCs/>
-        </w:rPr>
-        <w:t xml:space="preserve">Tools &amp; Platforms</w:t>
-      </w:r>
-      <w:r>
-        <w:t xml:space="preserve">: Kubernetes, AWS (Amazon Web Services), Google Cloud Platform, CircleCI, GitHub Actions, Terraform, Ansible, Pulumi, Linux, Git, Webpack, Cloudfront, Helm.</w:t>
-      </w:r>
-    </w:p>
-    <w:p>
-      <w:pPr>
-        <w:pStyle w:val="Compact"/>
-        <w:numPr>
-          <w:ilvl w:val="0"/>
-          <w:numId w:val="1005"/>
-        </w:numPr>
-      </w:pPr>
-      <w:r>
-        <w:rPr>
-          <w:b/>
-          <w:bCs/>
-        </w:rPr>
-        <w:t xml:space="preserve">Web Technologies</w:t>
-      </w:r>
-      <w:r>
-        <w:t xml:space="preserve">: HTML, CSS, Tailwind, Front-end Development, Responsive Design, Back-end Development, Distributed Systems, Web3/DWeb, Decentralized Technologies.</w:t>
-      </w:r>
-    </w:p>
-    <w:p>
-      <w:pPr>
-        <w:pStyle w:val="Compact"/>
-        <w:numPr>
-          <w:ilvl w:val="0"/>
-          <w:numId w:val="1005"/>
-        </w:numPr>
-      </w:pPr>
-      <w:r>
-        <w:rPr>
-          <w:b/>
-          <w:bCs/>
-        </w:rPr>
-        <w:t xml:space="preserve">Software Development</w:t>
-      </w:r>
-      <w:r>
-        <w:t xml:space="preserve">: Object-oriented programming (OOP), Functional Programming, API Design and Development, Automated Testing, Continuous Integration, Continuous Deployment, CI/CD, System Architecture, Microservices.</w:t>
-      </w:r>
-    </w:p>
-    <w:bookmarkEnd w:id="32"/>
-    <w:bookmarkStart w:id="33" w:name="methodologies"/>
+        <w:t xml:space="preserve">Lead Developer, Co-founder</w:t>
+      </w:r>
+    </w:p>
+    <w:bookmarkStart w:id="33" w:name="pegg-2014---2017-san-francisco-ca"/>
+    <w:p>
+      <w:pPr>
+        <w:pStyle w:val="Heading4"/>
+      </w:pPr>
+      <w:r>
+        <w:t xml:space="preserve">Pegg | 2014 - 2017 | San Francisco, CA</w:t>
+      </w:r>
+    </w:p>
+    <w:p>
+      <w:pPr>
+        <w:pStyle w:val="Compact"/>
+        <w:numPr>
+          <w:ilvl w:val="0"/>
+          <w:numId w:val="1006"/>
+        </w:numPr>
+      </w:pPr>
+      <w:r>
+        <w:t xml:space="preserve">Designed, architected, and built a cross-platform mobile app from scratch (iOS/Android). Node.js backend, JS/Phonegap frontend, Firebase real-time systems, CI/CD to AWS/CloudFront via CircleCI.</w:t>
+      </w:r>
+    </w:p>
+    <w:p>
+      <w:pPr>
+        <w:pStyle w:val="Compact"/>
+        <w:numPr>
+          <w:ilvl w:val="0"/>
+          <w:numId w:val="1006"/>
+        </w:numPr>
+      </w:pPr>
+      <w:r>
+        <w:t xml:space="preserve">Established engineering workflow: pair programming, automated testing (Karma/Chai), continuous integration, and rapid deployment processes.</w:t>
+      </w:r>
+    </w:p>
+    <w:p>
+      <w:pPr>
+        <w:pStyle w:val="Compact"/>
+        <w:numPr>
+          <w:ilvl w:val="0"/>
+          <w:numId w:val="1006"/>
+        </w:numPr>
+      </w:pPr>
+      <w:r>
+        <w:t xml:space="preserve">Co-led product strategy, monetization, and launch planning.</w:t>
+      </w:r>
+    </w:p>
+    <w:bookmarkEnd w:id="33"/>
+    <w:bookmarkEnd w:id="34"/>
+    <w:bookmarkStart w:id="35" w:name="earlier-career-2001---2014"/>
     <w:p>
       <w:pPr>
         <w:pStyle w:val="Heading3"/>
       </w:pPr>
       <w:r>
-        <w:t xml:space="preserve">Methodologies</w:t>
-      </w:r>
-    </w:p>
-    <w:p>
-      <w:pPr>
-        <w:pStyle w:val="Compact"/>
-        <w:numPr>
-          <w:ilvl w:val="0"/>
-          <w:numId w:val="1006"/>
-        </w:numPr>
-      </w:pPr>
-      <w:r>
-        <w:rPr>
-          <w:b/>
-          <w:bCs/>
-        </w:rPr>
-        <w:t xml:space="preserve">Project Management</w:t>
-      </w:r>
-      <w:r>
-        <w:t xml:space="preserve">: Agile, Pair Programming, Test-Driven Development (TDD), DevOps, Lean Thinking, Rapid Prototyping, Scrum, Kanban.</w:t>
-      </w:r>
-    </w:p>
-    <w:p>
-      <w:pPr>
-        <w:pStyle w:val="Compact"/>
-        <w:numPr>
-          <w:ilvl w:val="0"/>
-          <w:numId w:val="1006"/>
-        </w:numPr>
-      </w:pPr>
-      <w:r>
-        <w:rPr>
-          <w:b/>
-          <w:bCs/>
-        </w:rPr>
-        <w:t xml:space="preserve">Design &amp; Architecture</w:t>
-      </w:r>
-      <w:r>
-        <w:t xml:space="preserve">: Software Design Patterns, Systems Design, Infrastructure as Code (IAC), Data Pipeline Design, Cloud-Native Architecture, User Interface Design.</w:t>
-      </w:r>
-    </w:p>
-    <w:bookmarkEnd w:id="33"/>
-    <w:bookmarkStart w:id="34" w:name="organizational-soft-skills"/>
-    <w:p>
-      <w:pPr>
-        <w:pStyle w:val="Heading3"/>
-      </w:pPr>
-      <w:r>
-        <w:t xml:space="preserve">Organizational &amp; Soft Skills</w:t>
+        <w:t xml:space="preserve">Earlier Career (2001 - 2014)</w:t>
       </w:r>
     </w:p>
     <w:p>
@@ -714,10 +625,13 @@
           <w:b/>
           <w:bCs/>
         </w:rPr>
-        <w:t xml:space="preserve">Leadership &amp; Management</w:t>
-      </w:r>
-      <w:r>
-        <w:t xml:space="preserve">: Team Building, Cross-Functional Leadership, Coaching &amp; Mentoring, Talent Recruitment &amp; Development, High-Performance Team Management, Strategic Planning, Decision Making, Change Management.</w:t>
+        <w:t xml:space="preserve">Consultant &amp; Entrepreneur</w:t>
+      </w:r>
+      <w:r>
+        <w:t xml:space="preserve"> </w:t>
+      </w:r>
+      <w:r>
+        <w:t xml:space="preserve">(2008 - 2014): Founded OpenTest Pro (automated testing education). Built e-commerce ordering system for Turnbull &amp; Asser shirtmakers. Full-stack consulting in Ruby on Rails, Node.js, D3 data visualization. Rapid prototyping and client delivery.</w:t>
       </w:r>
     </w:p>
     <w:p>
@@ -733,10 +647,13 @@
           <w:b/>
           <w:bCs/>
         </w:rPr>
-        <w:t xml:space="preserve">Communication &amp; Collaboration</w:t>
-      </w:r>
-      <w:r>
-        <w:t xml:space="preserve">: Effective Communication, Stakeholder Engagement, Negotiation, Problem-Solving, Conflict Resolution, Customer-Oriented Approach.</w:t>
+        <w:t xml:space="preserve">Web Developer, OnForce, Inc</w:t>
+      </w:r>
+      <w:r>
+        <w:t xml:space="preserve"> </w:t>
+      </w:r>
+      <w:r>
+        <w:t xml:space="preserve">(2006 - 2007): Introduced automated testing and CI. Built comprehensive API test suite. Integrated platform with Salesforce APIs.</w:t>
       </w:r>
     </w:p>
     <w:p>
@@ -752,143 +669,32 @@
           <w:b/>
           <w:bCs/>
         </w:rPr>
-        <w:t xml:space="preserve">Innovation &amp; Creativity</w:t>
-      </w:r>
-      <w:r>
-        <w:t xml:space="preserve">: Entrepreneurship, Creative Problem Solving, Product Development and Innovation, Adaptive Learning, Forward-Thinking.</w:t>
-      </w:r>
-    </w:p>
-    <w:bookmarkEnd w:id="34"/>
-    <w:bookmarkStart w:id="35" w:name="additional-competencies"/>
-    <w:p>
-      <w:pPr>
-        <w:pStyle w:val="Heading3"/>
-      </w:pPr>
-      <w:r>
-        <w:t xml:space="preserve">Additional Competencies</w:t>
-      </w:r>
-    </w:p>
-    <w:p>
-      <w:pPr>
-        <w:pStyle w:val="Compact"/>
-        <w:numPr>
-          <w:ilvl w:val="0"/>
-          <w:numId w:val="1008"/>
-        </w:numPr>
-      </w:pPr>
-      <w:r>
-        <w:rPr>
-          <w:b/>
-          <w:bCs/>
-        </w:rPr>
-        <w:t xml:space="preserve">Industry Knowledge</w:t>
-      </w:r>
-      <w:r>
-        <w:t xml:space="preserve">: Software Engineering, Web Development, Cloud Computing, AI/ML Development, Startup Ecosystem, SaaS, PaaS, B2B Software, Humane Technology.</w:t>
-      </w:r>
-    </w:p>
-    <w:p>
-      <w:pPr>
-        <w:pStyle w:val="Compact"/>
-        <w:numPr>
-          <w:ilvl w:val="0"/>
-          <w:numId w:val="1008"/>
-        </w:numPr>
-      </w:pPr>
-      <w:r>
-        <w:rPr>
-          <w:b/>
-          <w:bCs/>
-        </w:rPr>
-        <w:t xml:space="preserve">Personal Attributes</w:t>
-      </w:r>
-      <w:r>
-        <w:t xml:space="preserve">: Resilient, Innovative, Dedicated, Entrepreneurial, Strategic Thinker, Out of the Box Thinker, Detail-Oriented, Analytical, Kind and Compassionate, Truth Seeker.</w:t>
+        <w:t xml:space="preserve">Development Lead, JBA Network</w:t>
+      </w:r>
+      <w:r>
+        <w:t xml:space="preserve"> </w:t>
+      </w:r>
+      <w:r>
+        <w:t xml:space="preserve">(2003 - 2006): Lead programmer and project manager for mynewsletterbuilder.com — architected initial release, then built and scaled the development team.</w:t>
       </w:r>
     </w:p>
     <w:bookmarkEnd w:id="35"/>
     <w:bookmarkEnd w:id="36"/>
-    <w:bookmarkStart w:id="39" w:name="education"/>
+    <w:bookmarkStart w:id="41" w:name="open-source-projects"/>
     <w:p>
       <w:pPr>
         <w:pStyle w:val="Heading2"/>
       </w:pPr>
       <w:r>
-        <w:t xml:space="preserve">Education</w:t>
-      </w:r>
-    </w:p>
-    <w:bookmarkStart w:id="38" w:name="bachelor-of-arts-in-mathematics"/>
+        <w:t xml:space="preserve">Open Source Projects</w:t>
+      </w:r>
+    </w:p>
+    <w:bookmarkStart w:id="38" w:name="scan-mcp-2024---present"/>
     <w:p>
       <w:pPr>
         <w:pStyle w:val="Heading3"/>
       </w:pPr>
       <w:r>
-        <w:t xml:space="preserve">Bachelor of Arts in Mathematics</w:t>
-      </w:r>
-    </w:p>
-    <w:bookmarkStart w:id="37" w:name="Xe220d86d70cd5bf8ee7040adf9411d63a6235ab"/>
-    <w:p>
-      <w:pPr>
-        <w:pStyle w:val="Heading4"/>
-      </w:pPr>
-      <w:r>
-        <w:t xml:space="preserve">University of North Carolina at Asheville | May 2003</w:t>
-      </w:r>
-    </w:p>
-    <w:p>
-      <w:pPr>
-        <w:pStyle w:val="Compact"/>
-        <w:numPr>
-          <w:ilvl w:val="0"/>
-          <w:numId w:val="1009"/>
-        </w:numPr>
-      </w:pPr>
-      <w:r>
-        <w:t xml:space="preserve">Minor in Computer Science.</w:t>
-      </w:r>
-    </w:p>
-    <w:p>
-      <w:pPr>
-        <w:pStyle w:val="Compact"/>
-        <w:numPr>
-          <w:ilvl w:val="0"/>
-          <w:numId w:val="1009"/>
-        </w:numPr>
-      </w:pPr>
-      <w:r>
-        <w:t xml:space="preserve">Graduated with distinction in Mathematics.</w:t>
-      </w:r>
-    </w:p>
-    <w:p>
-      <w:pPr>
-        <w:pStyle w:val="Compact"/>
-        <w:numPr>
-          <w:ilvl w:val="0"/>
-          <w:numId w:val="1009"/>
-        </w:numPr>
-      </w:pPr>
-      <w:r>
-        <w:t xml:space="preserve">Undergraduate research in 4D fractals.</w:t>
-      </w:r>
-    </w:p>
-    <w:bookmarkEnd w:id="37"/>
-    <w:bookmarkEnd w:id="38"/>
-    <w:bookmarkEnd w:id="39"/>
-    <w:bookmarkStart w:id="44" w:name="open-source-projects"/>
-    <w:p>
-      <w:pPr>
-        <w:pStyle w:val="Heading2"/>
-      </w:pPr>
-      <w:r>
-        <w:t xml:space="preserve">Open Source Projects</w:t>
-      </w:r>
-    </w:p>
-    <w:bookmarkStart w:id="41" w:name="scan-mcp-2024---present"/>
-    <w:p>
-      <w:pPr>
-        <w:pStyle w:val="Heading3"/>
-      </w:pPr>
-      <w:r>
         <w:t xml:space="preserve">Scan MCP (2024 - Present)</w:t>
       </w:r>
     </w:p>
@@ -897,14 +703,14 @@
         <w:pStyle w:val="FirstParagraph"/>
       </w:pPr>
       <w:r>
-        <w:t xml:space="preserve">MCP (Model Context Protocol) server for scanner automation and document digitization. Privacy-first architecture with smart device discovery, JSON Schema validation, and support for both local stdio and network HTTP transports. TypeScript/Node.js.</w:t>
+        <w:t xml:space="preserve">MCP (Model Context Protocol) server enabling AI agents to automate scanner hardware for document digitization. Privacy-first architecture with smart device discovery, JSON Schema validation, and support for both local stdio and network HTTP transports. TypeScript/Node.js.</w:t>
       </w:r>
     </w:p>
     <w:p>
       <w:pPr>
         <w:pStyle w:val="BodyText"/>
       </w:pPr>
-      <w:hyperlink r:id="rId40">
+      <w:hyperlink r:id="rId37">
         <w:r>
           <w:rPr>
             <w:rStyle w:val="Hyperlink"/>
@@ -913,8 +719,8 @@
         </w:r>
       </w:hyperlink>
     </w:p>
-    <w:bookmarkEnd w:id="41"/>
-    <w:bookmarkStart w:id="43" w:name="humanebench-2024---present"/>
+    <w:bookmarkEnd w:id="38"/>
+    <w:bookmarkStart w:id="40" w:name="humanebench-2024---present"/>
     <w:p>
       <w:pPr>
         <w:pStyle w:val="Heading3"/>
@@ -935,7 +741,7 @@
       <w:pPr>
         <w:pStyle w:val="BodyText"/>
       </w:pPr>
-      <w:hyperlink r:id="rId42">
+      <w:hyperlink r:id="rId39">
         <w:r>
           <w:rPr>
             <w:rStyle w:val="Hyperlink"/>
@@ -944,9 +750,194 @@
         </w:r>
       </w:hyperlink>
     </w:p>
+    <w:bookmarkEnd w:id="40"/>
+    <w:bookmarkEnd w:id="41"/>
+    <w:bookmarkStart w:id="42" w:name="skills"/>
+    <w:p>
+      <w:pPr>
+        <w:pStyle w:val="Heading2"/>
+      </w:pPr>
+      <w:r>
+        <w:t xml:space="preserve">Skills</w:t>
+      </w:r>
+    </w:p>
+    <w:p>
+      <w:pPr>
+        <w:pStyle w:val="Compact"/>
+        <w:numPr>
+          <w:ilvl w:val="0"/>
+          <w:numId w:val="1008"/>
+        </w:numPr>
+      </w:pPr>
+      <w:r>
+        <w:rPr>
+          <w:b/>
+          <w:bCs/>
+        </w:rPr>
+        <w:t xml:space="preserve">Languages &amp; Frameworks</w:t>
+      </w:r>
+      <w:r>
+        <w:t xml:space="preserve">: JavaScript, TypeScript, Python, Ruby on Rails, Node.js, Bash.</w:t>
+      </w:r>
+    </w:p>
+    <w:p>
+      <w:pPr>
+        <w:pStyle w:val="Compact"/>
+        <w:numPr>
+          <w:ilvl w:val="0"/>
+          <w:numId w:val="1008"/>
+        </w:numPr>
+      </w:pPr>
+      <w:r>
+        <w:rPr>
+          <w:b/>
+          <w:bCs/>
+        </w:rPr>
+        <w:t xml:space="preserve">Front-end</w:t>
+      </w:r>
+      <w:r>
+        <w:t xml:space="preserve">: React, Vue, HTML, CSS, Tailwind, Responsive Design, UI/UX.</w:t>
+      </w:r>
+    </w:p>
+    <w:p>
+      <w:pPr>
+        <w:pStyle w:val="Compact"/>
+        <w:numPr>
+          <w:ilvl w:val="0"/>
+          <w:numId w:val="1008"/>
+        </w:numPr>
+      </w:pPr>
+      <w:r>
+        <w:rPr>
+          <w:b/>
+          <w:bCs/>
+        </w:rPr>
+        <w:t xml:space="preserve">Back-end &amp; Data</w:t>
+      </w:r>
+      <w:r>
+        <w:t xml:space="preserve">: API Design, Microservices, Distributed Systems, PostgreSQL, MySQL, MongoDB, Redis.</w:t>
+      </w:r>
+    </w:p>
+    <w:p>
+      <w:pPr>
+        <w:pStyle w:val="Compact"/>
+        <w:numPr>
+          <w:ilvl w:val="0"/>
+          <w:numId w:val="1008"/>
+        </w:numPr>
+      </w:pPr>
+      <w:r>
+        <w:rPr>
+          <w:b/>
+          <w:bCs/>
+        </w:rPr>
+        <w:t xml:space="preserve">Cloud &amp; Infrastructure</w:t>
+      </w:r>
+      <w:r>
+        <w:t xml:space="preserve">: AWS, Google Cloud Platform, Kubernetes, Docker, Terraform, Ansible, Pulumi, Helm.</w:t>
+      </w:r>
+    </w:p>
+    <w:p>
+      <w:pPr>
+        <w:pStyle w:val="Compact"/>
+        <w:numPr>
+          <w:ilvl w:val="0"/>
+          <w:numId w:val="1008"/>
+        </w:numPr>
+      </w:pPr>
+      <w:r>
+        <w:rPr>
+          <w:b/>
+          <w:bCs/>
+        </w:rPr>
+        <w:t xml:space="preserve">CI/CD &amp; DevOps</w:t>
+      </w:r>
+      <w:r>
+        <w:t xml:space="preserve">: CircleCI, GitHub Actions, Automated Testing, TDD, Infrastructure as Code, Cloud-Native Architecture.</w:t>
+      </w:r>
+    </w:p>
+    <w:p>
+      <w:pPr>
+        <w:pStyle w:val="Compact"/>
+        <w:numPr>
+          <w:ilvl w:val="0"/>
+          <w:numId w:val="1008"/>
+        </w:numPr>
+      </w:pPr>
+      <w:r>
+        <w:rPr>
+          <w:b/>
+          <w:bCs/>
+        </w:rPr>
+        <w:t xml:space="preserve">AI/LLM</w:t>
+      </w:r>
+      <w:r>
+        <w:t xml:space="preserve">: AI agent development, coding assistant evaluation &amp; deployment (Claude Code, Cursor), MCP (Model Context Protocol), prompt engineering, tool use, context augmentation, LLM-powered workflow automation.</w:t>
+      </w:r>
+    </w:p>
+    <w:p>
+      <w:pPr>
+        <w:pStyle w:val="Compact"/>
+        <w:numPr>
+          <w:ilvl w:val="0"/>
+          <w:numId w:val="1008"/>
+        </w:numPr>
+      </w:pPr>
+      <w:r>
+        <w:rPr>
+          <w:b/>
+          <w:bCs/>
+        </w:rPr>
+        <w:t xml:space="preserve">Leadership</w:t>
+      </w:r>
+      <w:r>
+        <w:t xml:space="preserve">: Team Building, Coaching &amp; Mentoring, Cross-Functional Collaboration, Roadmap Ownership, Hiring, Agile/Scrum/Kanban, Change Management.</w:t>
+      </w:r>
+    </w:p>
+    <w:bookmarkEnd w:id="42"/>
+    <w:bookmarkStart w:id="45" w:name="education"/>
+    <w:p>
+      <w:pPr>
+        <w:pStyle w:val="Heading2"/>
+      </w:pPr>
+      <w:r>
+        <w:t xml:space="preserve">Education</w:t>
+      </w:r>
+    </w:p>
+    <w:bookmarkStart w:id="44" w:name="X8aa14d071da44b7f3006e1d49a262db674bce64"/>
+    <w:p>
+      <w:pPr>
+        <w:pStyle w:val="Heading3"/>
+      </w:pPr>
+      <w:r>
+        <w:t xml:space="preserve">BA in Mathematics, minor in Computer Science</w:t>
+      </w:r>
+    </w:p>
+    <w:bookmarkStart w:id="43" w:name="Xe220d86d70cd5bf8ee7040adf9411d63a6235ab"/>
+    <w:p>
+      <w:pPr>
+        <w:pStyle w:val="Heading4"/>
+      </w:pPr>
+      <w:r>
+        <w:t xml:space="preserve">University of North Carolina at Asheville | May 2003</w:t>
+      </w:r>
+    </w:p>
+    <w:p>
+      <w:pPr>
+        <w:pStyle w:val="Compact"/>
+        <w:numPr>
+          <w:ilvl w:val="0"/>
+          <w:numId w:val="1009"/>
+        </w:numPr>
+      </w:pPr>
+      <w:r>
+        <w:t xml:space="preserve">Graduated with distinction in Mathematics. Undergraduate research in 4D fractals.</w:t>
+      </w:r>
+    </w:p>
     <w:bookmarkEnd w:id="43"/>
     <w:bookmarkEnd w:id="44"/>
-    <w:bookmarkStart w:id="45" w:name="recommendations"/>
+    <w:bookmarkEnd w:id="45"/>
+    <w:bookmarkStart w:id="46" w:name="recommendations"/>
     <w:p>
       <w:pPr>
         <w:pStyle w:val="Heading2"/>
@@ -1002,7 +993,7 @@
         <w:t xml:space="preserve">the solutions he architects, builds, and collaborates on come out better</w:t>
       </w:r>
       <w:r>
-        <w:t xml:space="preserve">. Jack also strives to be at the forefront of new technology and assess how he can leverage it. Newer tech like GenAI can be complex and ever-evolving, and Jack is not one to back down but step up and embrace. He does all this with a</w:t>
+        <w:t xml:space="preserve">. Jack also strives to be at the forefront of new technology and assess how he can leverage it. He does all this with a</w:t>
       </w:r>
       <w:r>
         <w:t xml:space="preserve"> </w:t>
@@ -1048,33 +1039,46 @@
         <w:pStyle w:val="BodyText"/>
       </w:pPr>
       <w:r>
-        <w:t xml:space="preserve">“Jack is a fantastic engineer always ready to</w:t>
-      </w:r>
-      <w:r>
-        <w:t xml:space="preserve"> </w:t>
-      </w:r>
-      <w:r>
-        <w:rPr>
-          <w:b/>
-          <w:bCs/>
-        </w:rPr>
-        <w:t xml:space="preserve">help solve problems and more importantly, teach you how to solve them</w:t>
-      </w:r>
-      <w:r>
-        <w:t xml:space="preserve">. He guided me and my team through a bunch of challenging GitOps situations with patience and kindness, leading by example. Always diligent with his work, willing to roll up his sleeves to get things done and</w:t>
-      </w:r>
-      <w:r>
-        <w:t xml:space="preserve"> </w:t>
-      </w:r>
-      <w:r>
-        <w:rPr>
-          <w:b/>
-          <w:bCs/>
-        </w:rPr>
-        <w:t xml:space="preserve">find creative solutions</w:t>
-      </w:r>
-      <w:r>
-        <w:t xml:space="preserve">, maybe tinkering in some kind of script that would make the manual processes easier and more resilient. Everyone would be lucky to have someone like him in their teams!”</w:t>
+        <w:t xml:space="preserve">“Jack has</w:t>
+      </w:r>
+      <w:r>
+        <w:t xml:space="preserve"> </w:t>
+      </w:r>
+      <w:r>
+        <w:rPr>
+          <w:b/>
+          <w:bCs/>
+        </w:rPr>
+        <w:t xml:space="preserve">had quite a profound impact on my career</w:t>
+      </w:r>
+      <w:r>
+        <w:t xml:space="preserve">. As a young engineer, I was fortunate enough to work with Jack as my coach. He served as a great mentor, helping me build both technical and professional skills and</w:t>
+      </w:r>
+      <w:r>
+        <w:t xml:space="preserve"> </w:t>
+      </w:r>
+      <w:r>
+        <w:rPr>
+          <w:b/>
+          <w:bCs/>
+        </w:rPr>
+        <w:t xml:space="preserve">forming me into the engineer that I am today</w:t>
+      </w:r>
+      <w:r>
+        <w:t xml:space="preserve">.</w:t>
+      </w:r>
+      <w:r>
+        <w:t xml:space="preserve"> </w:t>
+      </w:r>
+      <w:r>
+        <w:rPr>
+          <w:b/>
+          <w:bCs/>
+        </w:rPr>
+        <w:t xml:space="preserve">His mentorship was a key factor in elevating me from an incoming Junior Engineer to an Engineering Manager</w:t>
+      </w:r>
+      <w:r>
+        <w:t xml:space="preserve">. Jack has a great curiosity and a strong set of technical capabilities that allow him to serve as a great example for others and a key contributor to any team!”</w:t>
       </w:r>
     </w:p>
     <w:p>
@@ -1086,7 +1090,7 @@
           <w:i/>
           <w:iCs/>
         </w:rPr>
-        <w:t xml:space="preserve">— Cesar Palafox Garza, Principal Software Engineer, Kantata</w:t>
+        <w:t xml:space="preserve">— Wesley Morlock, Engineering Manager, Kantata</w:t>
       </w:r>
     </w:p>
     <w:p>
@@ -1094,46 +1098,33 @@
         <w:pStyle w:val="BodyText"/>
       </w:pPr>
       <w:r>
-        <w:t xml:space="preserve">“Jack has</w:t>
-      </w:r>
-      <w:r>
-        <w:t xml:space="preserve"> </w:t>
-      </w:r>
-      <w:r>
-        <w:rPr>
-          <w:b/>
-          <w:bCs/>
-        </w:rPr>
-        <w:t xml:space="preserve">had quite a profound impact on my career</w:t>
-      </w:r>
-      <w:r>
-        <w:t xml:space="preserve">. As a young engineer, I was fortunate enough to work with Jack as my coach. He served as a great mentor, helping me build both technical and professional skills and</w:t>
-      </w:r>
-      <w:r>
-        <w:t xml:space="preserve"> </w:t>
-      </w:r>
-      <w:r>
-        <w:rPr>
-          <w:b/>
-          <w:bCs/>
-        </w:rPr>
-        <w:t xml:space="preserve">forming me into the engineer that I am today</w:t>
-      </w:r>
-      <w:r>
-        <w:t xml:space="preserve">. Throughout our time together, Jack was caring and invested in helping me set goals and develop my career.</w:t>
-      </w:r>
-      <w:r>
-        <w:t xml:space="preserve"> </w:t>
-      </w:r>
-      <w:r>
-        <w:rPr>
-          <w:b/>
-          <w:bCs/>
-        </w:rPr>
-        <w:t xml:space="preserve">His mentorship was a key factor in elevating me from an incoming Junior Engineer to an Engineering Manager</w:t>
-      </w:r>
-      <w:r>
-        <w:t xml:space="preserve">. Jack has a great curiosity and a strong set of technical capabilities that allow him to serve as a great example for others and a key contributor to any team!”</w:t>
+        <w:t xml:space="preserve">“Jack is a fantastic engineer always ready to</w:t>
+      </w:r>
+      <w:r>
+        <w:t xml:space="preserve"> </w:t>
+      </w:r>
+      <w:r>
+        <w:rPr>
+          <w:b/>
+          <w:bCs/>
+        </w:rPr>
+        <w:t xml:space="preserve">help solve problems and more importantly, teach you how to solve them</w:t>
+      </w:r>
+      <w:r>
+        <w:t xml:space="preserve">. He guided me and my team through a bunch of challenging GitOps situations with patience and kindness, leading by example. Always diligent with his work, willing to roll up his sleeves to get things done and</w:t>
+      </w:r>
+      <w:r>
+        <w:t xml:space="preserve"> </w:t>
+      </w:r>
+      <w:r>
+        <w:rPr>
+          <w:b/>
+          <w:bCs/>
+        </w:rPr>
+        <w:t xml:space="preserve">find creative solutions</w:t>
+      </w:r>
+      <w:r>
+        <w:t xml:space="preserve">. Everyone would be lucky to have someone like him in their teams!”</w:t>
       </w:r>
     </w:p>
     <w:p>
@@ -1145,7 +1136,7 @@
           <w:i/>
           <w:iCs/>
         </w:rPr>
-        <w:t xml:space="preserve">— Wesley Morlock, Engineering Manager, Kantata</w:t>
+        <w:t xml:space="preserve">— Cesar Palafox Garza, Principal Software Engineer, Kantata</w:t>
       </w:r>
     </w:p>
     <w:p>
@@ -1153,20 +1144,33 @@
         <w:pStyle w:val="BodyText"/>
       </w:pPr>
       <w:r>
-        <w:t xml:space="preserve">“Jack provided invaluable leadership as a Principal Software Engineer at Kantata. He was a powerful voice for the technology but made sure to</w:t>
-      </w:r>
-      <w:r>
-        <w:t xml:space="preserve"> </w:t>
-      </w:r>
-      <w:r>
-        <w:rPr>
-          <w:b/>
-          <w:bCs/>
-        </w:rPr>
-        <w:t xml:space="preserve">advocate for changes that were also certain to provide immediate impact to the customer</w:t>
-      </w:r>
-      <w:r>
-        <w:t xml:space="preserve">. I highly recommend Jack as an excellent dev ops engineer and as a technical leader.”</w:t>
+        <w:t xml:space="preserve">“Jack is</w:t>
+      </w:r>
+      <w:r>
+        <w:t xml:space="preserve"> </w:t>
+      </w:r>
+      <w:r>
+        <w:rPr>
+          <w:b/>
+          <w:bCs/>
+        </w:rPr>
+        <w:t xml:space="preserve">awesome at understanding the direction teams need to go to make important improvements in Kantata’s Engineering organization as a whole</w:t>
+      </w:r>
+      <w:r>
+        <w:t xml:space="preserve">. He has been instrumental in building and implementing strategies to upgrade Ruby, Rails, and React. If I had any questions about infrastructure and Kubernetes he would be able to answer and</w:t>
+      </w:r>
+      <w:r>
+        <w:t xml:space="preserve"> </w:t>
+      </w:r>
+      <w:r>
+        <w:rPr>
+          <w:b/>
+          <w:bCs/>
+        </w:rPr>
+        <w:t xml:space="preserve">provide solid explanations to the entire team</w:t>
+      </w:r>
+      <w:r>
+        <w:t xml:space="preserve">.”</w:t>
       </w:r>
     </w:p>
     <w:p>
@@ -1178,223 +1182,24 @@
           <w:i/>
           <w:iCs/>
         </w:rPr>
-        <w:t xml:space="preserve">— Nathan Perry, Principal Software Engineer, Kantata</w:t>
+        <w:t xml:space="preserve">— Justin Hurstwright, Principal Software Engineer, Kantata</w:t>
       </w:r>
     </w:p>
     <w:p>
       <w:pPr>
         <w:pStyle w:val="BodyText"/>
       </w:pPr>
-      <w:r>
-        <w:t xml:space="preserve">“Jack is talented both as a software developer and as an operations engineer. While working together in a Principal Engineer capacity, I saw how</w:t>
-      </w:r>
-      <w:r>
-        <w:t xml:space="preserve"> </w:t>
-      </w:r>
-      <w:r>
-        <w:rPr>
-          <w:b/>
-          <w:bCs/>
-        </w:rPr>
-        <w:t xml:space="preserve">passionate Jack is about helping his colleagues and his organization level up</w:t>
-      </w:r>
-      <w:r>
-        <w:t xml:space="preserve">. He is a great engineer with excellent leadership and organizational abilities.”</w:t>
-      </w:r>
-    </w:p>
-    <w:p>
-      <w:pPr>
-        <w:pStyle w:val="BodyText"/>
-      </w:pPr>
-      <w:r>
-        <w:rPr>
-          <w:i/>
-          <w:iCs/>
-        </w:rPr>
-        <w:t xml:space="preserve">— Jason Larsen, Software Engineering Manager, Kantata</w:t>
-      </w:r>
-    </w:p>
-    <w:p>
-      <w:pPr>
-        <w:pStyle w:val="BodyText"/>
-      </w:pPr>
-      <w:r>
-        <w:t xml:space="preserve">“Jack is a great co-worker. He is</w:t>
-      </w:r>
-      <w:r>
-        <w:t xml:space="preserve"> </w:t>
-      </w:r>
-      <w:r>
-        <w:rPr>
-          <w:b/>
-          <w:bCs/>
-        </w:rPr>
-        <w:t xml:space="preserve">awesome at understanding the direction teams need to go to make important improvements in Kantata’s Engineering organization as a whole</w:t>
-      </w:r>
-      <w:r>
-        <w:t xml:space="preserve">. He has been instrumental in building and implementing strategies to upgrade Ruby, Rails, and React. If I had any questions about infrastructure and Kubernetes he would be able to answer and</w:t>
-      </w:r>
-      <w:r>
-        <w:t xml:space="preserve"> </w:t>
-      </w:r>
-      <w:r>
-        <w:rPr>
-          <w:b/>
-          <w:bCs/>
-        </w:rPr>
-        <w:t xml:space="preserve">provide solid explanations to the entire team</w:t>
-      </w:r>
-      <w:r>
-        <w:t xml:space="preserve">.”</w:t>
-      </w:r>
-    </w:p>
-    <w:p>
-      <w:pPr>
-        <w:pStyle w:val="BodyText"/>
-      </w:pPr>
-      <w:r>
-        <w:rPr>
-          <w:i/>
-          <w:iCs/>
-        </w:rPr>
-        <w:t xml:space="preserve">— Justin Hurstwright, Principal Software Engineer, Kantata</w:t>
-      </w:r>
-    </w:p>
-    <w:p>
-      <w:pPr>
-        <w:pStyle w:val="BodyText"/>
-      </w:pPr>
-      <w:r>
-        <w:t xml:space="preserve">“Jack is a phenomenal resource to work with. He is</w:t>
-      </w:r>
-      <w:r>
-        <w:t xml:space="preserve"> </w:t>
-      </w:r>
-      <w:r>
-        <w:rPr>
-          <w:b/>
-          <w:bCs/>
-        </w:rPr>
-        <w:t xml:space="preserve">very knowledgeable about programming and cloud infrastructure</w:t>
-      </w:r>
-      <w:r>
-        <w:t xml:space="preserve"> </w:t>
-      </w:r>
-      <w:r>
-        <w:t xml:space="preserve">and is always eager to learn new things.”</w:t>
-      </w:r>
-    </w:p>
-    <w:p>
-      <w:pPr>
-        <w:pStyle w:val="BodyText"/>
-      </w:pPr>
-      <w:r>
-        <w:rPr>
-          <w:i/>
-          <w:iCs/>
-        </w:rPr>
-        <w:t xml:space="preserve">— Donovan Hubbard, Senior DevOps Engineer, Kantata</w:t>
-      </w:r>
-    </w:p>
-    <w:p>
-      <w:pPr>
-        <w:pStyle w:val="BodyText"/>
-      </w:pPr>
-      <w:r>
-        <w:t xml:space="preserve">“Jack has a flair for finding better, faster, and more reliable ways to get things done. He</w:t>
-      </w:r>
-      <w:r>
-        <w:t xml:space="preserve"> </w:t>
-      </w:r>
-      <w:r>
-        <w:rPr>
-          <w:b/>
-          <w:bCs/>
-        </w:rPr>
-        <w:t xml:space="preserve">advocates best practices, like unit testing, and has a deep knowledge of OO architecture</w:t>
-      </w:r>
-      <w:r>
-        <w:t xml:space="preserve">. Jack thinks on his toes, and will always be there with the team at 4 a.m. if circumstance requires it.</w:t>
-      </w:r>
-      <w:r>
-        <w:t xml:space="preserve"> </w:t>
-      </w:r>
-      <w:r>
-        <w:rPr>
-          <w:rStyle w:val="VerbatimChar"/>
-        </w:rPr>
-        <w:t xml:space="preserve">:%s/average developers/developers like jack/g</w:t>
-      </w:r>
-      <w:r>
-        <w:t xml:space="preserve"> </w:t>
-      </w:r>
-      <w:r>
-        <w:t xml:space="preserve">if you know what’s good for you.”</w:t>
-      </w:r>
-    </w:p>
-    <w:p>
-      <w:pPr>
-        <w:pStyle w:val="BodyText"/>
-      </w:pPr>
-      <w:r>
-        <w:rPr>
-          <w:i/>
-          <w:iCs/>
-        </w:rPr>
-        <w:t xml:space="preserve">— Greg Whitescarver, Founder, Mojave</w:t>
-      </w:r>
-    </w:p>
-    <w:p>
-      <w:pPr>
-        <w:pStyle w:val="BodyText"/>
-      </w:pPr>
-      <w:r>
-        <w:t xml:space="preserve">“With Jack,</w:t>
-      </w:r>
-      <w:r>
-        <w:t xml:space="preserve"> </w:t>
-      </w:r>
-      <w:r>
-        <w:rPr>
-          <w:b/>
-          <w:bCs/>
-        </w:rPr>
-        <w:t xml:space="preserve">the more complex the problem, the more simple his solutions</w:t>
-      </w:r>
-      <w:r>
-        <w:t xml:space="preserve">. From eradicating dynamic php bugs to providing innovative javascript capabilities, Master Senechal is more than a mind to be reckoned with, he’s an</w:t>
-      </w:r>
-      <w:r>
-        <w:t xml:space="preserve"> </w:t>
-      </w:r>
-      <w:r>
-        <w:rPr>
-          <w:b/>
-          <w:bCs/>
-        </w:rPr>
-        <w:t xml:space="preserve">integrative capacity builder</w:t>
-      </w:r>
-      <w:r>
-        <w:t xml:space="preserve"> </w:t>
-      </w:r>
-      <w:r>
-        <w:t xml:space="preserve">with a wide range of technological expertise. If there is anything that can be done through web development, Jack can figure out how to do it, and make it happen.”</w:t>
-      </w:r>
-    </w:p>
-    <w:p>
-      <w:pPr>
-        <w:pStyle w:val="BodyText"/>
-      </w:pPr>
-      <w:r>
-        <w:rPr>
-          <w:i/>
-          <w:iCs/>
-        </w:rPr>
-        <w:t xml:space="preserve">— Adam Apollo, Cofounder &amp; CEO, Superluminal Systems</w:t>
-      </w:r>
-    </w:p>
-    <w:bookmarkEnd w:id="45"/>
+      <w:hyperlink r:id="rId22">
+        <w:r>
+          <w:rPr>
+            <w:rStyle w:val="Hyperlink"/>
+          </w:rPr>
+          <w:t xml:space="preserve">See additional recommendations on LinkedIn</w:t>
+        </w:r>
+      </w:hyperlink>
+    </w:p>
     <w:bookmarkEnd w:id="46"/>
+    <w:bookmarkEnd w:id="47"/>
     <w:sectPr/>
   </w:body>
 </w:document>

</xml_diff>

<commit_message>
Tailor resume for Academia.edu Senior Full-stack Engineer
</commit_message>
<xml_diff>
--- a/resume.docx
+++ b/resume.docx
@@ -2,7 +2,7 @@
 <file path=word/document.xml><?xml version="1.0" encoding="utf-8"?>
 <w:document xmlns:w="http://schemas.openxmlformats.org/wordprocessingml/2006/main" xmlns:m="http://schemas.openxmlformats.org/officeDocument/2006/math" xmlns:r="http://schemas.openxmlformats.org/officeDocument/2006/relationships" xmlns:o="urn:schemas-microsoft-com:office:office" xmlns:v="urn:schemas-microsoft-com:vml" xmlns:w10="urn:schemas-microsoft-com:office:word" xmlns:a="http://schemas.openxmlformats.org/drawingml/2006/main" xmlns:pic="http://schemas.openxmlformats.org/drawingml/2006/picture" xmlns:wp="http://schemas.openxmlformats.org/drawingml/2006/wordprocessingDrawing">
   <w:body>
-    <w:bookmarkStart w:id="46" w:name="jack-senechal"/>
+    <w:bookmarkStart w:id="47" w:name="jack-senechal"/>
     <w:p>
       <w:pPr>
         <w:pStyle w:val="Heading1"/>
@@ -11,13 +11,13 @@
         <w:t xml:space="preserve">Jack Senechal</w:t>
       </w:r>
     </w:p>
-    <w:bookmarkStart w:id="23" w:name="engineering-leader-entrepreneur"/>
+    <w:bookmarkStart w:id="23" w:name="X80de4e637b1a79a8023d98e61edde2bc1506549"/>
     <w:p>
       <w:pPr>
         <w:pStyle w:val="Heading2"/>
       </w:pPr>
       <w:r>
-        <w:t xml:space="preserve">Engineering Leader / Entrepreneur</w:t>
+        <w:t xml:space="preserve">Senior Full-Stack Engineer | AI Agents &amp; Web Applications</w:t>
       </w:r>
     </w:p>
     <w:p>
@@ -32,13 +32,13 @@
         <w:t xml:space="preserve">Located in Novato, CA</w:t>
       </w:r>
       <w:r>
-        <w:br/>
+        <w:t xml:space="preserve"> </w:t>
       </w:r>
       <w:r>
         <w:t xml:space="preserve">Phone: 415-779-2701</w:t>
       </w:r>
       <w:r>
-        <w:br/>
+        <w:t xml:space="preserve"> </w:t>
       </w:r>
       <w:r>
         <w:t xml:space="preserve">Email:</w:t>
@@ -55,7 +55,7 @@
         </w:r>
       </w:hyperlink>
       <w:r>
-        <w:br/>
+        <w:t xml:space="preserve"> </w:t>
       </w:r>
       <w:r>
         <w:t xml:space="preserve">GitHub:</w:t>
@@ -68,11 +68,11 @@
           <w:rPr>
             <w:rStyle w:val="Hyperlink"/>
           </w:rPr>
-          <w:t xml:space="preserve">https://github.com/jacksenechal</w:t>
+          <w:t xml:space="preserve">github.com/jacksenechal</w:t>
         </w:r>
       </w:hyperlink>
       <w:r>
-        <w:br/>
+        <w:t xml:space="preserve"> </w:t>
       </w:r>
       <w:r>
         <w:t xml:space="preserve">LinkedIn:</w:t>
@@ -85,7 +85,7 @@
           <w:rPr>
             <w:rStyle w:val="Hyperlink"/>
           </w:rPr>
-          <w:t xml:space="preserve">https://linkedin.com/in/jacksenechal</w:t>
+          <w:t xml:space="preserve">linkedin.com/in/jacksenechal</w:t>
         </w:r>
       </w:hyperlink>
     </w:p>
@@ -108,39 +108,17 @@
         </w:numPr>
       </w:pPr>
       <w:r>
-        <w:t xml:space="preserve">Proven leader in software development, infrastructure, and</w:t>
-      </w:r>
-      <w:r>
-        <w:t xml:space="preserve"> </w:t>
-      </w:r>
-      <w:r>
-        <w:rPr>
-          <w:b/>
-          <w:bCs/>
-        </w:rPr>
-        <w:t xml:space="preserve">team management</w:t>
-      </w:r>
-      <w:r>
-        <w:t xml:space="preserve"> </w:t>
-      </w:r>
-      <w:r>
-        <w:t xml:space="preserve">with</w:t>
-      </w:r>
-      <w:r>
-        <w:t xml:space="preserve"> </w:t>
-      </w:r>
-      <w:r>
-        <w:rPr>
-          <w:b/>
-          <w:bCs/>
-        </w:rPr>
-        <w:t xml:space="preserve">15+ years</w:t>
-      </w:r>
-      <w:r>
-        <w:t xml:space="preserve"> </w:t>
-      </w:r>
-      <w:r>
-        <w:t xml:space="preserve">of hands-on experience</w:t>
+        <w:rPr>
+          <w:b/>
+          <w:bCs/>
+        </w:rPr>
+        <w:t xml:space="preserve">Senior full-stack engineer</w:t>
+      </w:r>
+      <w:r>
+        <w:t xml:space="preserve"> </w:t>
+      </w:r>
+      <w:r>
+        <w:t xml:space="preserve">with 15+ years shipping web applications end-to-end — React/TypeScript frontends to Rails/Node backends to production infrastructure</w:t>
       </w:r>
     </w:p>
     <w:p>
@@ -152,20 +130,7 @@
         </w:numPr>
       </w:pPr>
       <w:r>
-        <w:t xml:space="preserve">Committed</w:t>
-      </w:r>
-      <w:r>
-        <w:t xml:space="preserve"> </w:t>
-      </w:r>
-      <w:r>
-        <w:rPr>
-          <w:b/>
-          <w:bCs/>
-        </w:rPr>
-        <w:t xml:space="preserve">mentor and coach</w:t>
-      </w:r>
-      <w:r>
-        <w:t xml:space="preserve">, elevating team members’ skill sets and fostering professional growth</w:t>
+        <w:t xml:space="preserve">Builder of AI agents and LLM-powered features: chatbots, evaluation frameworks, tool-use pipelines, and context augmentation systems</w:t>
       </w:r>
     </w:p>
     <w:p>
@@ -177,7 +142,7 @@
         </w:numPr>
       </w:pPr>
       <w:r>
-        <w:t xml:space="preserve">Strategic thinker, mercurial innovator, and expert problem solver</w:t>
+        <w:t xml:space="preserve">Hands-on Ruby on Rails experience spanning consulting, feature development, and Rails/React upgrade leadership at scale</w:t>
       </w:r>
     </w:p>
     <w:p>
@@ -189,7 +154,23 @@
         </w:numPr>
       </w:pPr>
       <w:r>
-        <w:t xml:space="preserve">Resilient and dedicated, ready to embrace challenges and opportunities</w:t>
+        <w:t xml:space="preserve">Bias for</w:t>
+      </w:r>
+      <w:r>
+        <w:t xml:space="preserve"> </w:t>
+      </w:r>
+      <w:r>
+        <w:rPr>
+          <w:b/>
+          <w:bCs/>
+        </w:rPr>
+        <w:t xml:space="preserve">product velocity and 80/20 thinking</w:t>
+      </w:r>
+      <w:r>
+        <w:t xml:space="preserve"> </w:t>
+      </w:r>
+      <w:r>
+        <w:t xml:space="preserve">— ships fast to gather real user feedback, iterates from there</w:t>
       </w:r>
     </w:p>
     <w:p>
@@ -201,23 +182,14 @@
         </w:numPr>
       </w:pPr>
       <w:r>
-        <w:t xml:space="preserve">Strong customer focus,</w:t>
-      </w:r>
-      <w:r>
-        <w:t xml:space="preserve"> </w:t>
-      </w:r>
-      <w:r>
-        <w:rPr>
-          <w:b/>
-          <w:bCs/>
-        </w:rPr>
-        <w:t xml:space="preserve">advocating for impactful changes</w:t>
-      </w:r>
-      <w:r>
-        <w:t xml:space="preserve"> </w:t>
-      </w:r>
-      <w:r>
-        <w:t xml:space="preserve">and ensuring product value</w:t>
+        <w:rPr>
+          <w:b/>
+          <w:bCs/>
+        </w:rPr>
+        <w:t xml:space="preserve">Entrepreneurial background</w:t>
+      </w:r>
+      <w:r>
+        <w:t xml:space="preserve">: co-founded two startups, owned products end-to-end from 0 to 1</w:t>
       </w:r>
     </w:p>
     <w:p>
@@ -229,35 +201,11 @@
         </w:numPr>
       </w:pPr>
       <w:r>
-        <w:t xml:space="preserve">Entrepreneurial spirit with multiple co-founding experiences</w:t>
-      </w:r>
-    </w:p>
-    <w:p>
-      <w:pPr>
-        <w:pStyle w:val="Compact"/>
-        <w:numPr>
-          <w:ilvl w:val="0"/>
-          <w:numId w:val="1001"/>
-        </w:numPr>
-      </w:pPr>
-      <w:r>
-        <w:t xml:space="preserve">Principal-level engineer specializing in AI-powered developer tooling, platform modernization, and large-scale engineering productivity</w:t>
-      </w:r>
-    </w:p>
-    <w:p>
-      <w:pPr>
-        <w:pStyle w:val="Compact"/>
-        <w:numPr>
-          <w:ilvl w:val="0"/>
-          <w:numId w:val="1001"/>
-        </w:numPr>
-      </w:pPr>
-      <w:r>
-        <w:t xml:space="preserve">Full-stack generalist with deep experience applying AI/LLMs, DevOps, and cloud-native systems to accelerate software delivery</w:t>
+        <w:t xml:space="preserve">Strong user empathy and cross-functional instincts — equally comfortable talking product direction and diving into code</w:t>
       </w:r>
     </w:p>
     <w:bookmarkEnd w:id="24"/>
-    <w:bookmarkStart w:id="31" w:name="industry-experience"/>
+    <w:bookmarkStart w:id="36" w:name="industry-experience"/>
     <w:p>
       <w:pPr>
         <w:pStyle w:val="Heading2"/>
@@ -275,13 +223,13 @@
         <w:t xml:space="preserve">Technical Lead</w:t>
       </w:r>
     </w:p>
-    <w:bookmarkStart w:id="25" w:name="X75167482f34e06a01a656d1f4cef9a03bec6c7a"/>
+    <w:bookmarkStart w:id="25" w:name="X6dafa89e46c32694395442a9a6ca99eae379ab9"/>
     <w:p>
       <w:pPr>
         <w:pStyle w:val="Heading4"/>
       </w:pPr>
       <w:r>
-        <w:t xml:space="preserve">Building Humane Technology | June 2025 - Present | Remote (US)</w:t>
+        <w:t xml:space="preserve">Building Humane Technology | June 2025 - Present | Remote</w:t>
       </w:r>
     </w:p>
     <w:p>
@@ -293,7 +241,7 @@
         </w:numPr>
       </w:pPr>
       <w:r>
-        <w:t xml:space="preserve">Co-architecting and leading development of HumaneBench.ai, an open-source benchmark for evaluating AI systems against humane technology principles.</w:t>
+        <w:t xml:space="preserve">Co-architecting and leading development of HumaneBench.ai, an open-source AI evaluation framework built on AISI Inspect. Python.</w:t>
       </w:r>
     </w:p>
     <w:p>
@@ -305,7 +253,7 @@
         </w:numPr>
       </w:pPr>
       <w:r>
-        <w:t xml:space="preserve">Developing an extensible AI evaluation framework built on AISI Inspect, focused on measuring and improving LLM behavior in real-world developer and operational workflows.</w:t>
+        <w:t xml:space="preserve">Developing extensible evaluation tooling focused on measuring and improving LLM behavior in real-world developer and operational workflows.</w:t>
       </w:r>
     </w:p>
     <w:p>
@@ -317,51 +265,27 @@
         </w:numPr>
       </w:pPr>
       <w:r>
-        <w:t xml:space="preserve">Shaping product and technical roadmap for AI-driven tooling, including production monitoring concepts, multi-turn evaluation, and maturity models to support adoption, measurement, and continuous improvement.</w:t>
-      </w:r>
-    </w:p>
-    <w:p>
-      <w:pPr>
-        <w:pStyle w:val="Compact"/>
-        <w:numPr>
-          <w:ilvl w:val="0"/>
-          <w:numId w:val="1002"/>
-        </w:numPr>
-      </w:pPr>
-      <w:r>
-        <w:t xml:space="preserve">Contributing to education initiatives including Humane Tech and Agentic AI training for the UN Secretariat and broader developer community, plus coordinating hackathons and public AMAs.</w:t>
-      </w:r>
-    </w:p>
-    <w:p>
-      <w:pPr>
-        <w:pStyle w:val="Compact"/>
-        <w:numPr>
-          <w:ilvl w:val="0"/>
-          <w:numId w:val="1002"/>
-        </w:numPr>
-      </w:pPr>
-      <w:r>
-        <w:t xml:space="preserve">Building partnerships and fostering open-source community engagement around humane AI evaluation standards.</w:t>
+        <w:t xml:space="preserve">Shaping product and technical roadmap for AI-driven tooling, including production monitoring, multi-turn evaluation, and maturity models for adoption and continuous improvement.</w:t>
       </w:r>
     </w:p>
     <w:bookmarkEnd w:id="25"/>
     <w:bookmarkEnd w:id="26"/>
-    <w:bookmarkStart w:id="28" w:name="infrastructure-engineer"/>
+    <w:bookmarkStart w:id="28" w:name="co-founder-lead-developer"/>
     <w:p>
       <w:pPr>
         <w:pStyle w:val="Heading3"/>
       </w:pPr>
       <w:r>
-        <w:t xml:space="preserve">Infrastructure Engineer</w:t>
-      </w:r>
-    </w:p>
-    <w:bookmarkStart w:id="27" w:name="tobiko-mar-2024---oct-2024-remote-us"/>
+        <w:t xml:space="preserve">Co-founder &amp; Lead Developer</w:t>
+      </w:r>
+    </w:p>
+    <w:bookmarkStart w:id="27" w:name="Xffd4b369c0bcf0f7e3f28f0e84324bac520d95a"/>
     <w:p>
       <w:pPr>
         <w:pStyle w:val="Heading4"/>
       </w:pPr>
       <w:r>
-        <w:t xml:space="preserve">Tobiko | Mar 2024 - Oct 2024 | Remote (US)</w:t>
+        <w:t xml:space="preserve">Mirror Astrology | Nov 2024 - Present | Remote</w:t>
       </w:r>
     </w:p>
     <w:p>
@@ -373,7 +297,7 @@
         </w:numPr>
       </w:pPr>
       <w:r>
-        <w:t xml:space="preserve">Collaborated with a fast-paced team to architect and implement a robust, scalable, modern cloud platform serving customer workloads.</w:t>
+        <w:t xml:space="preserve">Built and shipped a production AI application end-to-end: Ruby on Rails backend, React/TypeScript, HTML+CSS/Tailwind, PostgreSQL, responsive UI/UX.</w:t>
       </w:r>
     </w:p>
     <w:p>
@@ -385,7 +309,7 @@
         </w:numPr>
       </w:pPr>
       <w:r>
-        <w:t xml:space="preserve">Built out CI/CD patterns including mono-repo conditional workflows, workload identity federation, and continuous delivery.</w:t>
+        <w:t xml:space="preserve">Designed and implemented an AI chatbot integrating multiple LLMs with complex multi-turn prompting, tool use, and context augmentation.</w:t>
       </w:r>
     </w:p>
     <w:p>
@@ -397,39 +321,27 @@
         </w:numPr>
       </w:pPr>
       <w:r>
-        <w:t xml:space="preserve">Implemented a Slack-based customer support and incident response platform, and onboarded teammates and customers.</w:t>
-      </w:r>
-    </w:p>
-    <w:p>
-      <w:pPr>
-        <w:pStyle w:val="Compact"/>
-        <w:numPr>
-          <w:ilvl w:val="0"/>
-          <w:numId w:val="1003"/>
-        </w:numPr>
-      </w:pPr>
-      <w:r>
-        <w:t xml:space="preserve">Python, Pulumi, Google Cloud Platform, Google Kubernetes Engine, Google Cloud Run, CI/CD with CircleCI, Helm, SQLMesh.</w:t>
+        <w:t xml:space="preserve">Owned full product lifecycle: Figma design → implementation → deployment → iteration based on user feedback.</w:t>
       </w:r>
     </w:p>
     <w:bookmarkEnd w:id="27"/>
     <w:bookmarkEnd w:id="28"/>
-    <w:bookmarkStart w:id="30" w:name="X7a2c313efdde198d901363c762c81839771c845"/>
+    <w:bookmarkStart w:id="30" w:name="infrastructure-engineer"/>
     <w:p>
       <w:pPr>
         <w:pStyle w:val="Heading3"/>
       </w:pPr>
       <w:r>
-        <w:t xml:space="preserve">Engineering Manager / Principal Software Engineer</w:t>
-      </w:r>
-    </w:p>
-    <w:bookmarkStart w:id="29" w:name="X47289269eb944414c9285d314973b45c253bcef"/>
+        <w:t xml:space="preserve">Infrastructure Engineer</w:t>
+      </w:r>
+    </w:p>
+    <w:bookmarkStart w:id="29" w:name="tobiko-mar-2024---oct-2024-remote"/>
     <w:p>
       <w:pPr>
         <w:pStyle w:val="Heading4"/>
       </w:pPr>
       <w:r>
-        <w:t xml:space="preserve">Mavenlink / Kantata | Apr 2017 - Dec 2023 | San Francisco, CA</w:t>
+        <w:t xml:space="preserve">Tobiko | Mar 2024 - Oct 2024 | Remote</w:t>
       </w:r>
     </w:p>
     <w:p>
@@ -441,14 +353,7 @@
         </w:numPr>
       </w:pPr>
       <w:r>
-        <w:rPr>
-          <w:b/>
-          <w:bCs/>
-        </w:rPr>
-        <w:t xml:space="preserve">Operations Team Leadership</w:t>
-      </w:r>
-      <w:r>
-        <w:t xml:space="preserve">: Over four years, recruited and led a new infrastructure team dedicated to building and scaling the platform. Instrumental in leading the organization’s transition towards a DevOps culture, serving as a change agent and technical authority across engineering. Created a clear, calm, and constructive environment that allowed the team to thrive. Responsible for roadmap stewardship, untangling requirements, and arranging priorities to maximize flow. Transitioned a large legacy infrastructure codebase to cutting-edge, cloud-native, IAC-oriented tools while remaining hands-on with coding, architecture, and collaboration on mission-critical projects.</w:t>
+        <w:t xml:space="preserve">Built scalable cloud platform and CI/CD patterns (mono-repo workflows, workload identity, continuous delivery) at a fast-paced startup.</w:t>
       </w:r>
     </w:p>
     <w:p>
@@ -460,14 +365,7 @@
         </w:numPr>
       </w:pPr>
       <w:r>
-        <w:rPr>
-          <w:b/>
-          <w:bCs/>
-        </w:rPr>
-        <w:t xml:space="preserve">M-Bridge Platform Leadership</w:t>
-      </w:r>
-      <w:r>
-        <w:t xml:space="preserve">: For two years, spearheaded a team to stabilize and enhance an agent-based integration platform. Established operational metrics and monitoring systems that reduced platform errors and incidents by approximately 100x. Successfully performed a migration to Kubernetes with zero downtime, including relational, document, and cache databases. Demonstrated ability to measure impact and drive data-informed decisions.</w:t>
+        <w:t xml:space="preserve">Implemented Slack-based customer support and incident response tooling; onboarded teammates and customers.</w:t>
       </w:r>
     </w:p>
     <w:p>
@@ -479,226 +377,189 @@
         </w:numPr>
       </w:pPr>
       <w:r>
-        <w:rPr>
-          <w:b/>
-          <w:bCs/>
-        </w:rPr>
-        <w:t xml:space="preserve">Insights Platform Leadership</w:t>
-      </w:r>
-      <w:r>
-        <w:t xml:space="preserve">: For three months, led a transition team responsible for overseeing and improving the BI data pipeline. Successfully migrated the pipeline to Kubernetes, accelerating modernization initiatives.</w:t>
-      </w:r>
-    </w:p>
-    <w:p>
-      <w:pPr>
-        <w:pStyle w:val="Compact"/>
-        <w:numPr>
-          <w:ilvl w:val="0"/>
-          <w:numId w:val="1004"/>
-        </w:numPr>
-      </w:pPr>
-      <w:r>
-        <w:rPr>
-          <w:b/>
-          <w:bCs/>
-        </w:rPr>
-        <w:t xml:space="preserve">Cross-Functional Leadership &amp; Organizational Impact</w:t>
-      </w:r>
-      <w:r>
-        <w:t xml:space="preserve">: Took on organization-wide roles including mentorship and coaching, interviewing and hiring, and organizational change management and process optimization. Influenced decisions at all levels and promoted best practices across the engineering organization. Recognized with Top Performer Award in 2021 for contributions to technical excellence and team development.</w:t>
+        <w:t xml:space="preserve">Python, Pulumi, GCP, CircleCI, Kubernetes.</w:t>
       </w:r>
     </w:p>
     <w:bookmarkEnd w:id="29"/>
     <w:bookmarkEnd w:id="30"/>
+    <w:bookmarkStart w:id="32" w:name="X7a2c313efdde198d901363c762c81839771c845"/>
+    <w:p>
+      <w:pPr>
+        <w:pStyle w:val="Heading3"/>
+      </w:pPr>
+      <w:r>
+        <w:t xml:space="preserve">Engineering Manager / Principal Software Engineer</w:t>
+      </w:r>
+    </w:p>
+    <w:bookmarkStart w:id="31" w:name="X47289269eb944414c9285d314973b45c253bcef"/>
+    <w:p>
+      <w:pPr>
+        <w:pStyle w:val="Heading4"/>
+      </w:pPr>
+      <w:r>
+        <w:t xml:space="preserve">Mavenlink / Kantata | Apr 2017 - Dec 2023 | San Francisco, CA</w:t>
+      </w:r>
+    </w:p>
+    <w:p>
+      <w:pPr>
+        <w:pStyle w:val="Compact"/>
+        <w:numPr>
+          <w:ilvl w:val="0"/>
+          <w:numId w:val="1005"/>
+        </w:numPr>
+      </w:pPr>
+      <w:r>
+        <w:rPr>
+          <w:b/>
+          <w:bCs/>
+        </w:rPr>
+        <w:t xml:space="preserve">Full-Stack Product Work</w:t>
+      </w:r>
+      <w:r>
+        <w:t xml:space="preserve">: Led Ruby/Rails and React upgrade initiatives across a large-scale SaaS product. Stayed hands-on with coding, architecture, and code review throughout.</w:t>
+      </w:r>
+      <w:r>
+        <w:t xml:space="preserve"> </w:t>
+      </w:r>
+      <w:r>
+        <w:rPr>
+          <w:b/>
+          <w:bCs/>
+        </w:rPr>
+        <w:t xml:space="preserve">Top Performer Award, 2021</w:t>
+      </w:r>
+      <w:r>
+        <w:t xml:space="preserve">.</w:t>
+      </w:r>
+    </w:p>
+    <w:p>
+      <w:pPr>
+        <w:pStyle w:val="Compact"/>
+        <w:numPr>
+          <w:ilvl w:val="0"/>
+          <w:numId w:val="1005"/>
+        </w:numPr>
+      </w:pPr>
+      <w:r>
+        <w:rPr>
+          <w:b/>
+          <w:bCs/>
+        </w:rPr>
+        <w:t xml:space="preserve">M-Bridge Integration Platform</w:t>
+      </w:r>
+      <w:r>
+        <w:t xml:space="preserve"> </w:t>
+      </w:r>
+      <w:r>
+        <w:t xml:space="preserve">(2 years): Led stabilization and scaling of an agent-based integration platform handling multi-system data orchestration. Reduced errors and incidents by ~100x through observability and operational improvements.</w:t>
+      </w:r>
+    </w:p>
+    <w:p>
+      <w:pPr>
+        <w:pStyle w:val="Compact"/>
+        <w:numPr>
+          <w:ilvl w:val="0"/>
+          <w:numId w:val="1005"/>
+        </w:numPr>
+      </w:pPr>
+      <w:r>
+        <w:rPr>
+          <w:b/>
+          <w:bCs/>
+        </w:rPr>
+        <w:t xml:space="preserve">Infrastructure Platform</w:t>
+      </w:r>
+      <w:r>
+        <w:t xml:space="preserve"> </w:t>
+      </w:r>
+      <w:r>
+        <w:t xml:space="preserve">(4 years): Built a new team from scratch, led DevOps transformation, and transitioned a large legacy codebase to cloud-native, Infrastructure-as-Code tooling (Terraform, Ansible, Kubernetes).</w:t>
+      </w:r>
+    </w:p>
+    <w:p>
+      <w:pPr>
+        <w:pStyle w:val="Compact"/>
+        <w:numPr>
+          <w:ilvl w:val="0"/>
+          <w:numId w:val="1005"/>
+        </w:numPr>
+      </w:pPr>
+      <w:r>
+        <w:rPr>
+          <w:b/>
+          <w:bCs/>
+        </w:rPr>
+        <w:t xml:space="preserve">Cross-Functional Impact</w:t>
+      </w:r>
+      <w:r>
+        <w:t xml:space="preserve">: Mentored engineers and coached a junior engineer from entry-level to Engineering Manager. Led hiring and drove organizational process improvements.</w:t>
+      </w:r>
+    </w:p>
     <w:bookmarkEnd w:id="31"/>
-    <w:bookmarkStart w:id="36" w:name="skills"/>
-    <w:p>
-      <w:pPr>
-        <w:pStyle w:val="Heading2"/>
-      </w:pPr>
-      <w:r>
-        <w:t xml:space="preserve">Skills</w:t>
-      </w:r>
-    </w:p>
-    <w:bookmarkStart w:id="32" w:name="technical-skills"/>
+    <w:bookmarkEnd w:id="32"/>
+    <w:bookmarkStart w:id="34" w:name="lead-developer-co-founder"/>
     <w:p>
       <w:pPr>
         <w:pStyle w:val="Heading3"/>
       </w:pPr>
       <w:r>
-        <w:t xml:space="preserve">Technical Skills</w:t>
-      </w:r>
-    </w:p>
-    <w:p>
-      <w:pPr>
-        <w:pStyle w:val="Compact"/>
-        <w:numPr>
-          <w:ilvl w:val="0"/>
-          <w:numId w:val="1005"/>
-        </w:numPr>
-      </w:pPr>
-      <w:r>
-        <w:rPr>
-          <w:b/>
-          <w:bCs/>
-        </w:rPr>
-        <w:t xml:space="preserve">Languages &amp; Frameworks</w:t>
-      </w:r>
-      <w:r>
-        <w:t xml:space="preserve">: Ruby on Rails, Python, Node.js, JavaScript, TypeScript, Bash.</w:t>
-      </w:r>
-    </w:p>
-    <w:p>
-      <w:pPr>
-        <w:pStyle w:val="Compact"/>
-        <w:numPr>
-          <w:ilvl w:val="0"/>
-          <w:numId w:val="1005"/>
-        </w:numPr>
-      </w:pPr>
-      <w:r>
-        <w:rPr>
-          <w:b/>
-          <w:bCs/>
-        </w:rPr>
-        <w:t xml:space="preserve">AI/LLM Development</w:t>
-      </w:r>
-      <w:r>
-        <w:t xml:space="preserve">: MCP (Model Context Protocol), chatbot development, prompt engineering, tool use, context augmentation, AI-assisted developer workflows.</w:t>
-      </w:r>
-    </w:p>
-    <w:p>
-      <w:pPr>
-        <w:pStyle w:val="Compact"/>
-        <w:numPr>
-          <w:ilvl w:val="0"/>
-          <w:numId w:val="1005"/>
-        </w:numPr>
-      </w:pPr>
-      <w:r>
-        <w:rPr>
-          <w:b/>
-          <w:bCs/>
-        </w:rPr>
-        <w:t xml:space="preserve">Databases</w:t>
-      </w:r>
-      <w:r>
-        <w:t xml:space="preserve">: MySQL, PostgreSQL, MongoDB, Redis, Cloud-based data services.</w:t>
-      </w:r>
-    </w:p>
-    <w:p>
-      <w:pPr>
-        <w:pStyle w:val="Compact"/>
-        <w:numPr>
-          <w:ilvl w:val="0"/>
-          <w:numId w:val="1005"/>
-        </w:numPr>
-      </w:pPr>
-      <w:r>
-        <w:rPr>
-          <w:b/>
-          <w:bCs/>
-        </w:rPr>
-        <w:t xml:space="preserve">Tools &amp; Platforms</w:t>
-      </w:r>
-      <w:r>
-        <w:t xml:space="preserve">: Kubernetes, AWS (Amazon Web Services), Google Cloud Platform, CircleCI, GitHub Actions, Terraform, Ansible, Pulumi, Linux, Git, Webpack, Cloudfront, Helm.</w:t>
-      </w:r>
-    </w:p>
-    <w:p>
-      <w:pPr>
-        <w:pStyle w:val="Compact"/>
-        <w:numPr>
-          <w:ilvl w:val="0"/>
-          <w:numId w:val="1005"/>
-        </w:numPr>
-      </w:pPr>
-      <w:r>
-        <w:rPr>
-          <w:b/>
-          <w:bCs/>
-        </w:rPr>
-        <w:t xml:space="preserve">Web Technologies</w:t>
-      </w:r>
-      <w:r>
-        <w:t xml:space="preserve">: HTML, CSS, Tailwind, Front-end Development, Responsive Design, Back-end Development, Distributed Systems, Web3/DWeb, Decentralized Technologies.</w:t>
-      </w:r>
-    </w:p>
-    <w:p>
-      <w:pPr>
-        <w:pStyle w:val="Compact"/>
-        <w:numPr>
-          <w:ilvl w:val="0"/>
-          <w:numId w:val="1005"/>
-        </w:numPr>
-      </w:pPr>
-      <w:r>
-        <w:rPr>
-          <w:b/>
-          <w:bCs/>
-        </w:rPr>
-        <w:t xml:space="preserve">Software Development</w:t>
-      </w:r>
-      <w:r>
-        <w:t xml:space="preserve">: Object-oriented programming (OOP), Functional Programming, API Design and Development, Automated Testing, Continuous Integration, Continuous Deployment, CI/CD, System Architecture, Microservices.</w:t>
-      </w:r>
-    </w:p>
-    <w:bookmarkEnd w:id="32"/>
-    <w:bookmarkStart w:id="33" w:name="methodologies"/>
+        <w:t xml:space="preserve">Lead Developer, Co-founder</w:t>
+      </w:r>
+    </w:p>
+    <w:bookmarkStart w:id="33" w:name="pegg-2014---2017-san-francisco-ca"/>
+    <w:p>
+      <w:pPr>
+        <w:pStyle w:val="Heading4"/>
+      </w:pPr>
+      <w:r>
+        <w:t xml:space="preserve">Pegg | 2014 - 2017 | San Francisco, CA</w:t>
+      </w:r>
+    </w:p>
+    <w:p>
+      <w:pPr>
+        <w:pStyle w:val="Compact"/>
+        <w:numPr>
+          <w:ilvl w:val="0"/>
+          <w:numId w:val="1006"/>
+        </w:numPr>
+      </w:pPr>
+      <w:r>
+        <w:t xml:space="preserve">Designed, architected, and built a cross-platform mobile app from scratch (iOS/Android). Node.js backend, JS/Phonegap frontend, Firebase real-time systems, CI/CD to AWS/CloudFront via CircleCI.</w:t>
+      </w:r>
+    </w:p>
+    <w:p>
+      <w:pPr>
+        <w:pStyle w:val="Compact"/>
+        <w:numPr>
+          <w:ilvl w:val="0"/>
+          <w:numId w:val="1006"/>
+        </w:numPr>
+      </w:pPr>
+      <w:r>
+        <w:t xml:space="preserve">Established engineering workflow: pair programming, automated testing (Karma/Chai), continuous integration, and rapid deployment processes.</w:t>
+      </w:r>
+    </w:p>
+    <w:p>
+      <w:pPr>
+        <w:pStyle w:val="Compact"/>
+        <w:numPr>
+          <w:ilvl w:val="0"/>
+          <w:numId w:val="1006"/>
+        </w:numPr>
+      </w:pPr>
+      <w:r>
+        <w:t xml:space="preserve">Co-led product strategy, monetization, and launch planning.</w:t>
+      </w:r>
+    </w:p>
+    <w:bookmarkEnd w:id="33"/>
+    <w:bookmarkEnd w:id="34"/>
+    <w:bookmarkStart w:id="35" w:name="earlier-career-2001---2014"/>
     <w:p>
       <w:pPr>
         <w:pStyle w:val="Heading3"/>
       </w:pPr>
       <w:r>
-        <w:t xml:space="preserve">Methodologies</w:t>
-      </w:r>
-    </w:p>
-    <w:p>
-      <w:pPr>
-        <w:pStyle w:val="Compact"/>
-        <w:numPr>
-          <w:ilvl w:val="0"/>
-          <w:numId w:val="1006"/>
-        </w:numPr>
-      </w:pPr>
-      <w:r>
-        <w:rPr>
-          <w:b/>
-          <w:bCs/>
-        </w:rPr>
-        <w:t xml:space="preserve">Project Management</w:t>
-      </w:r>
-      <w:r>
-        <w:t xml:space="preserve">: Agile, Pair Programming, Test-Driven Development (TDD), DevOps, Lean Thinking, Rapid Prototyping, Scrum, Kanban.</w:t>
-      </w:r>
-    </w:p>
-    <w:p>
-      <w:pPr>
-        <w:pStyle w:val="Compact"/>
-        <w:numPr>
-          <w:ilvl w:val="0"/>
-          <w:numId w:val="1006"/>
-        </w:numPr>
-      </w:pPr>
-      <w:r>
-        <w:rPr>
-          <w:b/>
-          <w:bCs/>
-        </w:rPr>
-        <w:t xml:space="preserve">Design &amp; Architecture</w:t>
-      </w:r>
-      <w:r>
-        <w:t xml:space="preserve">: Software Design Patterns, Systems Design, Infrastructure as Code (IAC), Data Pipeline Design, Cloud-Native Architecture, User Interface Design.</w:t>
-      </w:r>
-    </w:p>
-    <w:bookmarkEnd w:id="33"/>
-    <w:bookmarkStart w:id="34" w:name="organizational-soft-skills"/>
-    <w:p>
-      <w:pPr>
-        <w:pStyle w:val="Heading3"/>
-      </w:pPr>
-      <w:r>
-        <w:t xml:space="preserve">Organizational &amp; Soft Skills</w:t>
+        <w:t xml:space="preserve">Earlier Career (2001 - 2014)</w:t>
       </w:r>
     </w:p>
     <w:p>
@@ -714,10 +575,29 @@
           <w:b/>
           <w:bCs/>
         </w:rPr>
-        <w:t xml:space="preserve">Leadership &amp; Management</w:t>
-      </w:r>
-      <w:r>
-        <w:t xml:space="preserve">: Team Building, Cross-Functional Leadership, Coaching &amp; Mentoring, Talent Recruitment &amp; Development, High-Performance Team Management, Strategic Planning, Decision Making, Change Management.</w:t>
+        <w:t xml:space="preserve">Consultant &amp; Entrepreneur</w:t>
+      </w:r>
+      <w:r>
+        <w:t xml:space="preserve"> </w:t>
+      </w:r>
+      <w:r>
+        <w:t xml:space="preserve">(2008 - 2014): Full-stack consulting in</w:t>
+      </w:r>
+      <w:r>
+        <w:t xml:space="preserve"> </w:t>
+      </w:r>
+      <w:r>
+        <w:rPr>
+          <w:b/>
+          <w:bCs/>
+        </w:rPr>
+        <w:t xml:space="preserve">Ruby on Rails</w:t>
+      </w:r>
+      <w:r>
+        <w:t xml:space="preserve"> </w:t>
+      </w:r>
+      <w:r>
+        <w:t xml:space="preserve">and Node.js. Built e-commerce systems, data visualizations (D3), and client products from scratch with rapid iteration.</w:t>
       </w:r>
     </w:p>
     <w:p>
@@ -733,10 +613,13 @@
           <w:b/>
           <w:bCs/>
         </w:rPr>
-        <w:t xml:space="preserve">Communication &amp; Collaboration</w:t>
-      </w:r>
-      <w:r>
-        <w:t xml:space="preserve">: Effective Communication, Stakeholder Engagement, Negotiation, Problem-Solving, Conflict Resolution, Customer-Oriented Approach.</w:t>
+        <w:t xml:space="preserve">Web Developer, OnForce, Inc</w:t>
+      </w:r>
+      <w:r>
+        <w:t xml:space="preserve"> </w:t>
+      </w:r>
+      <w:r>
+        <w:t xml:space="preserve">(2006 - 2007): Introduced automated testing and CI. Built comprehensive API test suite. Integrated platform with Salesforce APIs.</w:t>
       </w:r>
     </w:p>
     <w:p>
@@ -752,143 +635,32 @@
           <w:b/>
           <w:bCs/>
         </w:rPr>
-        <w:t xml:space="preserve">Innovation &amp; Creativity</w:t>
-      </w:r>
-      <w:r>
-        <w:t xml:space="preserve">: Entrepreneurship, Creative Problem Solving, Product Development and Innovation, Adaptive Learning, Forward-Thinking.</w:t>
-      </w:r>
-    </w:p>
-    <w:bookmarkEnd w:id="34"/>
-    <w:bookmarkStart w:id="35" w:name="additional-competencies"/>
-    <w:p>
-      <w:pPr>
-        <w:pStyle w:val="Heading3"/>
-      </w:pPr>
-      <w:r>
-        <w:t xml:space="preserve">Additional Competencies</w:t>
-      </w:r>
-    </w:p>
-    <w:p>
-      <w:pPr>
-        <w:pStyle w:val="Compact"/>
-        <w:numPr>
-          <w:ilvl w:val="0"/>
-          <w:numId w:val="1008"/>
-        </w:numPr>
-      </w:pPr>
-      <w:r>
-        <w:rPr>
-          <w:b/>
-          <w:bCs/>
-        </w:rPr>
-        <w:t xml:space="preserve">Industry Knowledge</w:t>
-      </w:r>
-      <w:r>
-        <w:t xml:space="preserve">: Software Engineering, Web Development, Cloud Computing, AI/ML Development, Startup Ecosystem, SaaS, PaaS, B2B Software, Humane Technology.</w:t>
-      </w:r>
-    </w:p>
-    <w:p>
-      <w:pPr>
-        <w:pStyle w:val="Compact"/>
-        <w:numPr>
-          <w:ilvl w:val="0"/>
-          <w:numId w:val="1008"/>
-        </w:numPr>
-      </w:pPr>
-      <w:r>
-        <w:rPr>
-          <w:b/>
-          <w:bCs/>
-        </w:rPr>
-        <w:t xml:space="preserve">Personal Attributes</w:t>
-      </w:r>
-      <w:r>
-        <w:t xml:space="preserve">: Resilient, Innovative, Dedicated, Entrepreneurial, Strategic Thinker, Out of the Box Thinker, Detail-Oriented, Analytical, Kind and Compassionate, Truth Seeker.</w:t>
+        <w:t xml:space="preserve">Development Lead, JBA Network</w:t>
+      </w:r>
+      <w:r>
+        <w:t xml:space="preserve"> </w:t>
+      </w:r>
+      <w:r>
+        <w:t xml:space="preserve">(2003 - 2006): Lead programmer for mynewsletterbuilder.com — architected initial release, then built and scaled the development team.</w:t>
       </w:r>
     </w:p>
     <w:bookmarkEnd w:id="35"/>
     <w:bookmarkEnd w:id="36"/>
-    <w:bookmarkStart w:id="39" w:name="education"/>
+    <w:bookmarkStart w:id="41" w:name="open-source-projects"/>
     <w:p>
       <w:pPr>
         <w:pStyle w:val="Heading2"/>
       </w:pPr>
       <w:r>
-        <w:t xml:space="preserve">Education</w:t>
-      </w:r>
-    </w:p>
-    <w:bookmarkStart w:id="38" w:name="bachelor-of-arts-in-mathematics"/>
+        <w:t xml:space="preserve">Open Source Projects</w:t>
+      </w:r>
+    </w:p>
+    <w:bookmarkStart w:id="38" w:name="scan-mcp-2024---present"/>
     <w:p>
       <w:pPr>
         <w:pStyle w:val="Heading3"/>
       </w:pPr>
       <w:r>
-        <w:t xml:space="preserve">Bachelor of Arts in Mathematics</w:t>
-      </w:r>
-    </w:p>
-    <w:bookmarkStart w:id="37" w:name="Xe220d86d70cd5bf8ee7040adf9411d63a6235ab"/>
-    <w:p>
-      <w:pPr>
-        <w:pStyle w:val="Heading4"/>
-      </w:pPr>
-      <w:r>
-        <w:t xml:space="preserve">University of North Carolina at Asheville | May 2003</w:t>
-      </w:r>
-    </w:p>
-    <w:p>
-      <w:pPr>
-        <w:pStyle w:val="Compact"/>
-        <w:numPr>
-          <w:ilvl w:val="0"/>
-          <w:numId w:val="1009"/>
-        </w:numPr>
-      </w:pPr>
-      <w:r>
-        <w:t xml:space="preserve">Minor in Computer Science.</w:t>
-      </w:r>
-    </w:p>
-    <w:p>
-      <w:pPr>
-        <w:pStyle w:val="Compact"/>
-        <w:numPr>
-          <w:ilvl w:val="0"/>
-          <w:numId w:val="1009"/>
-        </w:numPr>
-      </w:pPr>
-      <w:r>
-        <w:t xml:space="preserve">Graduated with distinction in Mathematics.</w:t>
-      </w:r>
-    </w:p>
-    <w:p>
-      <w:pPr>
-        <w:pStyle w:val="Compact"/>
-        <w:numPr>
-          <w:ilvl w:val="0"/>
-          <w:numId w:val="1009"/>
-        </w:numPr>
-      </w:pPr>
-      <w:r>
-        <w:t xml:space="preserve">Undergraduate research in 4D fractals.</w:t>
-      </w:r>
-    </w:p>
-    <w:bookmarkEnd w:id="37"/>
-    <w:bookmarkEnd w:id="38"/>
-    <w:bookmarkEnd w:id="39"/>
-    <w:bookmarkStart w:id="44" w:name="open-source-projects"/>
-    <w:p>
-      <w:pPr>
-        <w:pStyle w:val="Heading2"/>
-      </w:pPr>
-      <w:r>
-        <w:t xml:space="preserve">Open Source Projects</w:t>
-      </w:r>
-    </w:p>
-    <w:bookmarkStart w:id="41" w:name="scan-mcp-2024---present"/>
-    <w:p>
-      <w:pPr>
-        <w:pStyle w:val="Heading3"/>
-      </w:pPr>
-      <w:r>
         <w:t xml:space="preserve">Scan MCP (2024 - Present)</w:t>
       </w:r>
     </w:p>
@@ -904,7 +676,7 @@
       <w:pPr>
         <w:pStyle w:val="BodyText"/>
       </w:pPr>
-      <w:hyperlink r:id="rId40">
+      <w:hyperlink r:id="rId37">
         <w:r>
           <w:rPr>
             <w:rStyle w:val="Hyperlink"/>
@@ -913,8 +685,8 @@
         </w:r>
       </w:hyperlink>
     </w:p>
-    <w:bookmarkEnd w:id="41"/>
-    <w:bookmarkStart w:id="43" w:name="humanebench-2024---present"/>
+    <w:bookmarkEnd w:id="38"/>
+    <w:bookmarkStart w:id="40" w:name="humanebench-2024---present"/>
     <w:p>
       <w:pPr>
         <w:pStyle w:val="Heading3"/>
@@ -935,7 +707,7 @@
       <w:pPr>
         <w:pStyle w:val="BodyText"/>
       </w:pPr>
-      <w:hyperlink r:id="rId42">
+      <w:hyperlink r:id="rId39">
         <w:r>
           <w:rPr>
             <w:rStyle w:val="Hyperlink"/>
@@ -944,9 +716,194 @@
         </w:r>
       </w:hyperlink>
     </w:p>
+    <w:bookmarkEnd w:id="40"/>
+    <w:bookmarkEnd w:id="41"/>
+    <w:bookmarkStart w:id="42" w:name="skills"/>
+    <w:p>
+      <w:pPr>
+        <w:pStyle w:val="Heading2"/>
+      </w:pPr>
+      <w:r>
+        <w:t xml:space="preserve">Skills</w:t>
+      </w:r>
+    </w:p>
+    <w:p>
+      <w:pPr>
+        <w:pStyle w:val="Compact"/>
+        <w:numPr>
+          <w:ilvl w:val="0"/>
+          <w:numId w:val="1008"/>
+        </w:numPr>
+      </w:pPr>
+      <w:r>
+        <w:rPr>
+          <w:b/>
+          <w:bCs/>
+        </w:rPr>
+        <w:t xml:space="preserve">Languages &amp; Frameworks</w:t>
+      </w:r>
+      <w:r>
+        <w:t xml:space="preserve">: Ruby on Rails, JavaScript, TypeScript, Python, Node.js, Bash.</w:t>
+      </w:r>
+    </w:p>
+    <w:p>
+      <w:pPr>
+        <w:pStyle w:val="Compact"/>
+        <w:numPr>
+          <w:ilvl w:val="0"/>
+          <w:numId w:val="1008"/>
+        </w:numPr>
+      </w:pPr>
+      <w:r>
+        <w:rPr>
+          <w:b/>
+          <w:bCs/>
+        </w:rPr>
+        <w:t xml:space="preserve">Front-end</w:t>
+      </w:r>
+      <w:r>
+        <w:t xml:space="preserve">: React, TypeScript, HTML, CSS, Tailwind, Responsive Design, UI/UX.</w:t>
+      </w:r>
+    </w:p>
+    <w:p>
+      <w:pPr>
+        <w:pStyle w:val="Compact"/>
+        <w:numPr>
+          <w:ilvl w:val="0"/>
+          <w:numId w:val="1008"/>
+        </w:numPr>
+      </w:pPr>
+      <w:r>
+        <w:rPr>
+          <w:b/>
+          <w:bCs/>
+        </w:rPr>
+        <w:t xml:space="preserve">Back-end &amp; Data</w:t>
+      </w:r>
+      <w:r>
+        <w:t xml:space="preserve">: PostgreSQL, Redis, Elasticsearch, API Design, Microservices, Distributed Systems, MySQL, MongoDB.</w:t>
+      </w:r>
+    </w:p>
+    <w:p>
+      <w:pPr>
+        <w:pStyle w:val="Compact"/>
+        <w:numPr>
+          <w:ilvl w:val="0"/>
+          <w:numId w:val="1008"/>
+        </w:numPr>
+      </w:pPr>
+      <w:r>
+        <w:rPr>
+          <w:b/>
+          <w:bCs/>
+        </w:rPr>
+        <w:t xml:space="preserve">Cloud &amp; Infrastructure</w:t>
+      </w:r>
+      <w:r>
+        <w:t xml:space="preserve">: AWS, Google Cloud Platform, Kubernetes, Docker, Terraform, Ansible, Pulumi, Helm.</w:t>
+      </w:r>
+    </w:p>
+    <w:p>
+      <w:pPr>
+        <w:pStyle w:val="Compact"/>
+        <w:numPr>
+          <w:ilvl w:val="0"/>
+          <w:numId w:val="1008"/>
+        </w:numPr>
+      </w:pPr>
+      <w:r>
+        <w:rPr>
+          <w:b/>
+          <w:bCs/>
+        </w:rPr>
+        <w:t xml:space="preserve">CI/CD &amp; DevOps</w:t>
+      </w:r>
+      <w:r>
+        <w:t xml:space="preserve">: CircleCI, GitHub Actions, Automated Testing, TDD, Infrastructure as Code, Cloud-Native Architecture.</w:t>
+      </w:r>
+    </w:p>
+    <w:p>
+      <w:pPr>
+        <w:pStyle w:val="Compact"/>
+        <w:numPr>
+          <w:ilvl w:val="0"/>
+          <w:numId w:val="1008"/>
+        </w:numPr>
+      </w:pPr>
+      <w:r>
+        <w:rPr>
+          <w:b/>
+          <w:bCs/>
+        </w:rPr>
+        <w:t xml:space="preserve">AI/LLM</w:t>
+      </w:r>
+      <w:r>
+        <w:t xml:space="preserve">: MCP (Model Context Protocol), chatbot development, prompt engineering, tool use, context augmentation, AI-assisted developer workflows.</w:t>
+      </w:r>
+    </w:p>
+    <w:p>
+      <w:pPr>
+        <w:pStyle w:val="Compact"/>
+        <w:numPr>
+          <w:ilvl w:val="0"/>
+          <w:numId w:val="1008"/>
+        </w:numPr>
+      </w:pPr>
+      <w:r>
+        <w:rPr>
+          <w:b/>
+          <w:bCs/>
+        </w:rPr>
+        <w:t xml:space="preserve">Leadership</w:t>
+      </w:r>
+      <w:r>
+        <w:t xml:space="preserve">: Team Building, Coaching &amp; Mentoring, Cross-Functional Collaboration, Roadmap Ownership, Hiring, Agile/Scrum/Kanban, Change Management.</w:t>
+      </w:r>
+    </w:p>
+    <w:bookmarkEnd w:id="42"/>
+    <w:bookmarkStart w:id="45" w:name="education"/>
+    <w:p>
+      <w:pPr>
+        <w:pStyle w:val="Heading2"/>
+      </w:pPr>
+      <w:r>
+        <w:t xml:space="preserve">Education</w:t>
+      </w:r>
+    </w:p>
+    <w:bookmarkStart w:id="44" w:name="X8aa14d071da44b7f3006e1d49a262db674bce64"/>
+    <w:p>
+      <w:pPr>
+        <w:pStyle w:val="Heading3"/>
+      </w:pPr>
+      <w:r>
+        <w:t xml:space="preserve">BA in Mathematics, minor in Computer Science</w:t>
+      </w:r>
+    </w:p>
+    <w:bookmarkStart w:id="43" w:name="Xe220d86d70cd5bf8ee7040adf9411d63a6235ab"/>
+    <w:p>
+      <w:pPr>
+        <w:pStyle w:val="Heading4"/>
+      </w:pPr>
+      <w:r>
+        <w:t xml:space="preserve">University of North Carolina at Asheville | May 2003</w:t>
+      </w:r>
+    </w:p>
+    <w:p>
+      <w:pPr>
+        <w:pStyle w:val="Compact"/>
+        <w:numPr>
+          <w:ilvl w:val="0"/>
+          <w:numId w:val="1009"/>
+        </w:numPr>
+      </w:pPr>
+      <w:r>
+        <w:t xml:space="preserve">Graduated with distinction in Mathematics. Undergraduate research in 4D fractals.</w:t>
+      </w:r>
+    </w:p>
     <w:bookmarkEnd w:id="43"/>
     <w:bookmarkEnd w:id="44"/>
-    <w:bookmarkStart w:id="45" w:name="recommendations"/>
+    <w:bookmarkEnd w:id="45"/>
+    <w:bookmarkStart w:id="46" w:name="recommendations"/>
     <w:p>
       <w:pPr>
         <w:pStyle w:val="Heading2"/>
@@ -1002,7 +959,7 @@
         <w:t xml:space="preserve">the solutions he architects, builds, and collaborates on come out better</w:t>
       </w:r>
       <w:r>
-        <w:t xml:space="preserve">. Jack also strives to be at the forefront of new technology and assess how he can leverage it. Newer tech like GenAI can be complex and ever-evolving, and Jack is not one to back down but step up and embrace. He does all this with a</w:t>
+        <w:t xml:space="preserve">. Jack also strives to be at the forefront of new technology and assess how he can leverage it. He does all this with a</w:t>
       </w:r>
       <w:r>
         <w:t xml:space="preserve"> </w:t>
@@ -1048,33 +1005,46 @@
         <w:pStyle w:val="BodyText"/>
       </w:pPr>
       <w:r>
-        <w:t xml:space="preserve">“Jack is a fantastic engineer always ready to</w:t>
-      </w:r>
-      <w:r>
-        <w:t xml:space="preserve"> </w:t>
-      </w:r>
-      <w:r>
-        <w:rPr>
-          <w:b/>
-          <w:bCs/>
-        </w:rPr>
-        <w:t xml:space="preserve">help solve problems and more importantly, teach you how to solve them</w:t>
-      </w:r>
-      <w:r>
-        <w:t xml:space="preserve">. He guided me and my team through a bunch of challenging GitOps situations with patience and kindness, leading by example. Always diligent with his work, willing to roll up his sleeves to get things done and</w:t>
-      </w:r>
-      <w:r>
-        <w:t xml:space="preserve"> </w:t>
-      </w:r>
-      <w:r>
-        <w:rPr>
-          <w:b/>
-          <w:bCs/>
-        </w:rPr>
-        <w:t xml:space="preserve">find creative solutions</w:t>
-      </w:r>
-      <w:r>
-        <w:t xml:space="preserve">, maybe tinkering in some kind of script that would make the manual processes easier and more resilient. Everyone would be lucky to have someone like him in their teams!”</w:t>
+        <w:t xml:space="preserve">“Jack has</w:t>
+      </w:r>
+      <w:r>
+        <w:t xml:space="preserve"> </w:t>
+      </w:r>
+      <w:r>
+        <w:rPr>
+          <w:b/>
+          <w:bCs/>
+        </w:rPr>
+        <w:t xml:space="preserve">had quite a profound impact on my career</w:t>
+      </w:r>
+      <w:r>
+        <w:t xml:space="preserve">. As a young engineer, I was fortunate enough to work with Jack as my coach. He served as a great mentor, helping me build both technical and professional skills and</w:t>
+      </w:r>
+      <w:r>
+        <w:t xml:space="preserve"> </w:t>
+      </w:r>
+      <w:r>
+        <w:rPr>
+          <w:b/>
+          <w:bCs/>
+        </w:rPr>
+        <w:t xml:space="preserve">forming me into the engineer that I am today</w:t>
+      </w:r>
+      <w:r>
+        <w:t xml:space="preserve">.</w:t>
+      </w:r>
+      <w:r>
+        <w:t xml:space="preserve"> </w:t>
+      </w:r>
+      <w:r>
+        <w:rPr>
+          <w:b/>
+          <w:bCs/>
+        </w:rPr>
+        <w:t xml:space="preserve">His mentorship was a key factor in elevating me from an incoming Junior Engineer to an Engineering Manager</w:t>
+      </w:r>
+      <w:r>
+        <w:t xml:space="preserve">. Jack has a great curiosity and a strong set of technical capabilities that allow him to serve as a great example for others and a key contributor to any team!”</w:t>
       </w:r>
     </w:p>
     <w:p>
@@ -1086,7 +1056,7 @@
           <w:i/>
           <w:iCs/>
         </w:rPr>
-        <w:t xml:space="preserve">— Cesar Palafox Garza, Principal Software Engineer, Kantata</w:t>
+        <w:t xml:space="preserve">— Wesley Morlock, Engineering Manager, Kantata</w:t>
       </w:r>
     </w:p>
     <w:p>
@@ -1094,46 +1064,33 @@
         <w:pStyle w:val="BodyText"/>
       </w:pPr>
       <w:r>
-        <w:t xml:space="preserve">“Jack has</w:t>
-      </w:r>
-      <w:r>
-        <w:t xml:space="preserve"> </w:t>
-      </w:r>
-      <w:r>
-        <w:rPr>
-          <w:b/>
-          <w:bCs/>
-        </w:rPr>
-        <w:t xml:space="preserve">had quite a profound impact on my career</w:t>
-      </w:r>
-      <w:r>
-        <w:t xml:space="preserve">. As a young engineer, I was fortunate enough to work with Jack as my coach. He served as a great mentor, helping me build both technical and professional skills and</w:t>
-      </w:r>
-      <w:r>
-        <w:t xml:space="preserve"> </w:t>
-      </w:r>
-      <w:r>
-        <w:rPr>
-          <w:b/>
-          <w:bCs/>
-        </w:rPr>
-        <w:t xml:space="preserve">forming me into the engineer that I am today</w:t>
-      </w:r>
-      <w:r>
-        <w:t xml:space="preserve">. Throughout our time together, Jack was caring and invested in helping me set goals and develop my career.</w:t>
-      </w:r>
-      <w:r>
-        <w:t xml:space="preserve"> </w:t>
-      </w:r>
-      <w:r>
-        <w:rPr>
-          <w:b/>
-          <w:bCs/>
-        </w:rPr>
-        <w:t xml:space="preserve">His mentorship was a key factor in elevating me from an incoming Junior Engineer to an Engineering Manager</w:t>
-      </w:r>
-      <w:r>
-        <w:t xml:space="preserve">. Jack has a great curiosity and a strong set of technical capabilities that allow him to serve as a great example for others and a key contributor to any team!”</w:t>
+        <w:t xml:space="preserve">“Jack is a fantastic engineer always ready to</w:t>
+      </w:r>
+      <w:r>
+        <w:t xml:space="preserve"> </w:t>
+      </w:r>
+      <w:r>
+        <w:rPr>
+          <w:b/>
+          <w:bCs/>
+        </w:rPr>
+        <w:t xml:space="preserve">help solve problems and more importantly, teach you how to solve them</w:t>
+      </w:r>
+      <w:r>
+        <w:t xml:space="preserve">. He guided me and my team through a bunch of challenging GitOps situations with patience and kindness, leading by example. Always diligent with his work, willing to roll up his sleeves to get things done and</w:t>
+      </w:r>
+      <w:r>
+        <w:t xml:space="preserve"> </w:t>
+      </w:r>
+      <w:r>
+        <w:rPr>
+          <w:b/>
+          <w:bCs/>
+        </w:rPr>
+        <w:t xml:space="preserve">find creative solutions</w:t>
+      </w:r>
+      <w:r>
+        <w:t xml:space="preserve">. Everyone would be lucky to have someone like him in their teams!”</w:t>
       </w:r>
     </w:p>
     <w:p>
@@ -1145,7 +1102,7 @@
           <w:i/>
           <w:iCs/>
         </w:rPr>
-        <w:t xml:space="preserve">— Wesley Morlock, Engineering Manager, Kantata</w:t>
+        <w:t xml:space="preserve">— Cesar Palafox Garza, Principal Software Engineer, Kantata</w:t>
       </w:r>
     </w:p>
     <w:p>
@@ -1153,20 +1110,33 @@
         <w:pStyle w:val="BodyText"/>
       </w:pPr>
       <w:r>
-        <w:t xml:space="preserve">“Jack provided invaluable leadership as a Principal Software Engineer at Kantata. He was a powerful voice for the technology but made sure to</w:t>
-      </w:r>
-      <w:r>
-        <w:t xml:space="preserve"> </w:t>
-      </w:r>
-      <w:r>
-        <w:rPr>
-          <w:b/>
-          <w:bCs/>
-        </w:rPr>
-        <w:t xml:space="preserve">advocate for changes that were also certain to provide immediate impact to the customer</w:t>
-      </w:r>
-      <w:r>
-        <w:t xml:space="preserve">. I highly recommend Jack as an excellent dev ops engineer and as a technical leader.”</w:t>
+        <w:t xml:space="preserve">“Jack is</w:t>
+      </w:r>
+      <w:r>
+        <w:t xml:space="preserve"> </w:t>
+      </w:r>
+      <w:r>
+        <w:rPr>
+          <w:b/>
+          <w:bCs/>
+        </w:rPr>
+        <w:t xml:space="preserve">awesome at understanding the direction teams need to go to make important improvements in Kantata’s Engineering organization as a whole</w:t>
+      </w:r>
+      <w:r>
+        <w:t xml:space="preserve">. He has been instrumental in building and implementing strategies to upgrade Ruby, Rails, and React. If I had any questions about infrastructure and Kubernetes he would be able to answer and</w:t>
+      </w:r>
+      <w:r>
+        <w:t xml:space="preserve"> </w:t>
+      </w:r>
+      <w:r>
+        <w:rPr>
+          <w:b/>
+          <w:bCs/>
+        </w:rPr>
+        <w:t xml:space="preserve">provide solid explanations to the entire team</w:t>
+      </w:r>
+      <w:r>
+        <w:t xml:space="preserve">.”</w:t>
       </w:r>
     </w:p>
     <w:p>
@@ -1178,223 +1148,24 @@
           <w:i/>
           <w:iCs/>
         </w:rPr>
-        <w:t xml:space="preserve">— Nathan Perry, Principal Software Engineer, Kantata</w:t>
+        <w:t xml:space="preserve">— Justin Hurstwright, Principal Software Engineer, Kantata</w:t>
       </w:r>
     </w:p>
     <w:p>
       <w:pPr>
         <w:pStyle w:val="BodyText"/>
       </w:pPr>
-      <w:r>
-        <w:t xml:space="preserve">“Jack is talented both as a software developer and as an operations engineer. While working together in a Principal Engineer capacity, I saw how</w:t>
-      </w:r>
-      <w:r>
-        <w:t xml:space="preserve"> </w:t>
-      </w:r>
-      <w:r>
-        <w:rPr>
-          <w:b/>
-          <w:bCs/>
-        </w:rPr>
-        <w:t xml:space="preserve">passionate Jack is about helping his colleagues and his organization level up</w:t>
-      </w:r>
-      <w:r>
-        <w:t xml:space="preserve">. He is a great engineer with excellent leadership and organizational abilities.”</w:t>
-      </w:r>
-    </w:p>
-    <w:p>
-      <w:pPr>
-        <w:pStyle w:val="BodyText"/>
-      </w:pPr>
-      <w:r>
-        <w:rPr>
-          <w:i/>
-          <w:iCs/>
-        </w:rPr>
-        <w:t xml:space="preserve">— Jason Larsen, Software Engineering Manager, Kantata</w:t>
-      </w:r>
-    </w:p>
-    <w:p>
-      <w:pPr>
-        <w:pStyle w:val="BodyText"/>
-      </w:pPr>
-      <w:r>
-        <w:t xml:space="preserve">“Jack is a great co-worker. He is</w:t>
-      </w:r>
-      <w:r>
-        <w:t xml:space="preserve"> </w:t>
-      </w:r>
-      <w:r>
-        <w:rPr>
-          <w:b/>
-          <w:bCs/>
-        </w:rPr>
-        <w:t xml:space="preserve">awesome at understanding the direction teams need to go to make important improvements in Kantata’s Engineering organization as a whole</w:t>
-      </w:r>
-      <w:r>
-        <w:t xml:space="preserve">. He has been instrumental in building and implementing strategies to upgrade Ruby, Rails, and React. If I had any questions about infrastructure and Kubernetes he would be able to answer and</w:t>
-      </w:r>
-      <w:r>
-        <w:t xml:space="preserve"> </w:t>
-      </w:r>
-      <w:r>
-        <w:rPr>
-          <w:b/>
-          <w:bCs/>
-        </w:rPr>
-        <w:t xml:space="preserve">provide solid explanations to the entire team</w:t>
-      </w:r>
-      <w:r>
-        <w:t xml:space="preserve">.”</w:t>
-      </w:r>
-    </w:p>
-    <w:p>
-      <w:pPr>
-        <w:pStyle w:val="BodyText"/>
-      </w:pPr>
-      <w:r>
-        <w:rPr>
-          <w:i/>
-          <w:iCs/>
-        </w:rPr>
-        <w:t xml:space="preserve">— Justin Hurstwright, Principal Software Engineer, Kantata</w:t>
-      </w:r>
-    </w:p>
-    <w:p>
-      <w:pPr>
-        <w:pStyle w:val="BodyText"/>
-      </w:pPr>
-      <w:r>
-        <w:t xml:space="preserve">“Jack is a phenomenal resource to work with. He is</w:t>
-      </w:r>
-      <w:r>
-        <w:t xml:space="preserve"> </w:t>
-      </w:r>
-      <w:r>
-        <w:rPr>
-          <w:b/>
-          <w:bCs/>
-        </w:rPr>
-        <w:t xml:space="preserve">very knowledgeable about programming and cloud infrastructure</w:t>
-      </w:r>
-      <w:r>
-        <w:t xml:space="preserve"> </w:t>
-      </w:r>
-      <w:r>
-        <w:t xml:space="preserve">and is always eager to learn new things.”</w:t>
-      </w:r>
-    </w:p>
-    <w:p>
-      <w:pPr>
-        <w:pStyle w:val="BodyText"/>
-      </w:pPr>
-      <w:r>
-        <w:rPr>
-          <w:i/>
-          <w:iCs/>
-        </w:rPr>
-        <w:t xml:space="preserve">— Donovan Hubbard, Senior DevOps Engineer, Kantata</w:t>
-      </w:r>
-    </w:p>
-    <w:p>
-      <w:pPr>
-        <w:pStyle w:val="BodyText"/>
-      </w:pPr>
-      <w:r>
-        <w:t xml:space="preserve">“Jack has a flair for finding better, faster, and more reliable ways to get things done. He</w:t>
-      </w:r>
-      <w:r>
-        <w:t xml:space="preserve"> </w:t>
-      </w:r>
-      <w:r>
-        <w:rPr>
-          <w:b/>
-          <w:bCs/>
-        </w:rPr>
-        <w:t xml:space="preserve">advocates best practices, like unit testing, and has a deep knowledge of OO architecture</w:t>
-      </w:r>
-      <w:r>
-        <w:t xml:space="preserve">. Jack thinks on his toes, and will always be there with the team at 4 a.m. if circumstance requires it.</w:t>
-      </w:r>
-      <w:r>
-        <w:t xml:space="preserve"> </w:t>
-      </w:r>
-      <w:r>
-        <w:rPr>
-          <w:rStyle w:val="VerbatimChar"/>
-        </w:rPr>
-        <w:t xml:space="preserve">:%s/average developers/developers like jack/g</w:t>
-      </w:r>
-      <w:r>
-        <w:t xml:space="preserve"> </w:t>
-      </w:r>
-      <w:r>
-        <w:t xml:space="preserve">if you know what’s good for you.”</w:t>
-      </w:r>
-    </w:p>
-    <w:p>
-      <w:pPr>
-        <w:pStyle w:val="BodyText"/>
-      </w:pPr>
-      <w:r>
-        <w:rPr>
-          <w:i/>
-          <w:iCs/>
-        </w:rPr>
-        <w:t xml:space="preserve">— Greg Whitescarver, Founder, Mojave</w:t>
-      </w:r>
-    </w:p>
-    <w:p>
-      <w:pPr>
-        <w:pStyle w:val="BodyText"/>
-      </w:pPr>
-      <w:r>
-        <w:t xml:space="preserve">“With Jack,</w:t>
-      </w:r>
-      <w:r>
-        <w:t xml:space="preserve"> </w:t>
-      </w:r>
-      <w:r>
-        <w:rPr>
-          <w:b/>
-          <w:bCs/>
-        </w:rPr>
-        <w:t xml:space="preserve">the more complex the problem, the more simple his solutions</w:t>
-      </w:r>
-      <w:r>
-        <w:t xml:space="preserve">. From eradicating dynamic php bugs to providing innovative javascript capabilities, Master Senechal is more than a mind to be reckoned with, he’s an</w:t>
-      </w:r>
-      <w:r>
-        <w:t xml:space="preserve"> </w:t>
-      </w:r>
-      <w:r>
-        <w:rPr>
-          <w:b/>
-          <w:bCs/>
-        </w:rPr>
-        <w:t xml:space="preserve">integrative capacity builder</w:t>
-      </w:r>
-      <w:r>
-        <w:t xml:space="preserve"> </w:t>
-      </w:r>
-      <w:r>
-        <w:t xml:space="preserve">with a wide range of technological expertise. If there is anything that can be done through web development, Jack can figure out how to do it, and make it happen.”</w:t>
-      </w:r>
-    </w:p>
-    <w:p>
-      <w:pPr>
-        <w:pStyle w:val="BodyText"/>
-      </w:pPr>
-      <w:r>
-        <w:rPr>
-          <w:i/>
-          <w:iCs/>
-        </w:rPr>
-        <w:t xml:space="preserve">— Adam Apollo, Cofounder &amp; CEO, Superluminal Systems</w:t>
-      </w:r>
-    </w:p>
-    <w:bookmarkEnd w:id="45"/>
+      <w:hyperlink r:id="rId22">
+        <w:r>
+          <w:rPr>
+            <w:rStyle w:val="Hyperlink"/>
+          </w:rPr>
+          <w:t xml:space="preserve">See additional recommendations on LinkedIn</w:t>
+        </w:r>
+      </w:hyperlink>
+    </w:p>
     <w:bookmarkEnd w:id="46"/>
+    <w:bookmarkEnd w:id="47"/>
     <w:sectPr/>
   </w:body>
 </w:document>

</xml_diff>

<commit_message>
Tailor resume for Hightouch AI Productivity Engineer
</commit_message>
<xml_diff>
--- a/resume.docx
+++ b/resume.docx
@@ -2,7 +2,7 @@
 <file path=word/document.xml><?xml version="1.0" encoding="utf-8"?>
 <w:document xmlns:w="http://schemas.openxmlformats.org/wordprocessingml/2006/main" xmlns:m="http://schemas.openxmlformats.org/officeDocument/2006/math" xmlns:r="http://schemas.openxmlformats.org/officeDocument/2006/relationships" xmlns:o="urn:schemas-microsoft-com:office:office" xmlns:v="urn:schemas-microsoft-com:vml" xmlns:w10="urn:schemas-microsoft-com:office:word" xmlns:a="http://schemas.openxmlformats.org/drawingml/2006/main" xmlns:pic="http://schemas.openxmlformats.org/drawingml/2006/picture" xmlns:wp="http://schemas.openxmlformats.org/drawingml/2006/wordprocessingDrawing">
   <w:body>
-    <w:bookmarkStart w:id="46" w:name="jack-senechal"/>
+    <w:bookmarkStart w:id="47" w:name="jack-senechal"/>
     <w:p>
       <w:pPr>
         <w:pStyle w:val="Heading1"/>
@@ -11,13 +11,13 @@
         <w:t xml:space="preserve">Jack Senechal</w:t>
       </w:r>
     </w:p>
-    <w:bookmarkStart w:id="23" w:name="engineering-leader-entrepreneur"/>
+    <w:bookmarkStart w:id="23" w:name="staff-ai-productivity-engineer"/>
     <w:p>
       <w:pPr>
         <w:pStyle w:val="Heading2"/>
       </w:pPr>
       <w:r>
-        <w:t xml:space="preserve">Engineering Leader / Entrepreneur</w:t>
+        <w:t xml:space="preserve">Staff AI Productivity Engineer</w:t>
       </w:r>
     </w:p>
     <w:p>
@@ -32,13 +32,13 @@
         <w:t xml:space="preserve">Located in Novato, CA</w:t>
       </w:r>
       <w:r>
-        <w:br/>
+        <w:t xml:space="preserve"> </w:t>
       </w:r>
       <w:r>
         <w:t xml:space="preserve">Phone: 415-779-2701</w:t>
       </w:r>
       <w:r>
-        <w:br/>
+        <w:t xml:space="preserve"> </w:t>
       </w:r>
       <w:r>
         <w:t xml:space="preserve">Email:</w:t>
@@ -55,7 +55,7 @@
         </w:r>
       </w:hyperlink>
       <w:r>
-        <w:br/>
+        <w:t xml:space="preserve"> </w:t>
       </w:r>
       <w:r>
         <w:t xml:space="preserve">GitHub:</w:t>
@@ -68,11 +68,11 @@
           <w:rPr>
             <w:rStyle w:val="Hyperlink"/>
           </w:rPr>
-          <w:t xml:space="preserve">https://github.com/jacksenechal</w:t>
+          <w:t xml:space="preserve">github.com/jacksenechal</w:t>
         </w:r>
       </w:hyperlink>
       <w:r>
-        <w:br/>
+        <w:t xml:space="preserve"> </w:t>
       </w:r>
       <w:r>
         <w:t xml:space="preserve">LinkedIn:</w:t>
@@ -85,7 +85,7 @@
           <w:rPr>
             <w:rStyle w:val="Hyperlink"/>
           </w:rPr>
-          <w:t xml:space="preserve">https://linkedin.com/in/jacksenechal</w:t>
+          <w:t xml:space="preserve">linkedin.com/in/jacksenechal</w:t>
         </w:r>
       </w:hyperlink>
     </w:p>
@@ -108,27 +108,49 @@
         </w:numPr>
       </w:pPr>
       <w:r>
-        <w:t xml:space="preserve">Proven leader in software development, infrastructure, and</w:t>
-      </w:r>
-      <w:r>
-        <w:t xml:space="preserve"> </w:t>
-      </w:r>
-      <w:r>
-        <w:rPr>
-          <w:b/>
-          <w:bCs/>
-        </w:rPr>
-        <w:t xml:space="preserve">team management</w:t>
-      </w:r>
-      <w:r>
-        <w:t xml:space="preserve"> </w:t>
-      </w:r>
-      <w:r>
-        <w:t xml:space="preserve">with</w:t>
-      </w:r>
-      <w:r>
-        <w:t xml:space="preserve"> </w:t>
-      </w:r>
+        <w:rPr>
+          <w:b/>
+          <w:bCs/>
+        </w:rPr>
+        <w:t xml:space="preserve">Principal-level engineer</w:t>
+      </w:r>
+      <w:r>
+        <w:t xml:space="preserve"> </w:t>
+      </w:r>
+      <w:r>
+        <w:t xml:space="preserve">building infrastructure and tooling that makes AI coding agents dramatically more effective across engineering organizations</w:t>
+      </w:r>
+    </w:p>
+    <w:p>
+      <w:pPr>
+        <w:pStyle w:val="Compact"/>
+        <w:numPr>
+          <w:ilvl w:val="0"/>
+          <w:numId w:val="1001"/>
+        </w:numPr>
+      </w:pPr>
+      <w:r>
+        <w:rPr>
+          <w:b/>
+          <w:bCs/>
+        </w:rPr>
+        <w:t xml:space="preserve">Deep hands-on experience with AI coding agents</w:t>
+      </w:r>
+      <w:r>
+        <w:t xml:space="preserve"> </w:t>
+      </w:r>
+      <w:r>
+        <w:t xml:space="preserve">— daily Claude Code power user, MCP server developer, and author of agent documentation, custom instructions, and context files (CLAUDE.md, agents.md, skill libraries)</w:t>
+      </w:r>
+    </w:p>
+    <w:p>
+      <w:pPr>
+        <w:pStyle w:val="Compact"/>
+        <w:numPr>
+          <w:ilvl w:val="0"/>
+          <w:numId w:val="1001"/>
+        </w:numPr>
+      </w:pPr>
       <w:r>
         <w:rPr>
           <w:b/>
@@ -140,7 +162,20 @@
         <w:t xml:space="preserve"> </w:t>
       </w:r>
       <w:r>
-        <w:t xml:space="preserve">of hands-on experience</w:t>
+        <w:t xml:space="preserve">shipping software with</w:t>
+      </w:r>
+      <w:r>
+        <w:t xml:space="preserve"> </w:t>
+      </w:r>
+      <w:r>
+        <w:rPr>
+          <w:b/>
+          <w:bCs/>
+        </w:rPr>
+        <w:t xml:space="preserve">6+ years leading teams</w:t>
+      </w:r>
+      <w:r>
+        <w:t xml:space="preserve">; track record of building developer tools and platform infrastructure that engineers actually use</w:t>
       </w:r>
     </w:p>
     <w:p>
@@ -152,6 +187,18 @@
         </w:numPr>
       </w:pPr>
       <w:r>
+        <w:t xml:space="preserve">Full-stack comfort spanning CI/CD, cloud infrastructure, internal tooling, and application code — with a sharp focus on AI-augmented developer workflows</w:t>
+      </w:r>
+    </w:p>
+    <w:p>
+      <w:pPr>
+        <w:pStyle w:val="Compact"/>
+        <w:numPr>
+          <w:ilvl w:val="0"/>
+          <w:numId w:val="1001"/>
+        </w:numPr>
+      </w:pPr>
+      <w:r>
         <w:t xml:space="preserve">Committed</w:t>
       </w:r>
       <w:r>
@@ -165,7 +212,10 @@
         <w:t xml:space="preserve">mentor and coach</w:t>
       </w:r>
       <w:r>
-        <w:t xml:space="preserve">, elevating team members’ skill sets and fostering professional growth</w:t>
+        <w:t xml:space="preserve"> </w:t>
+      </w:r>
+      <w:r>
+        <w:t xml:space="preserve">who elevated junior engineers to senior technical and engineering management positions</w:t>
       </w:r>
     </w:p>
     <w:p>
@@ -177,87 +227,11 @@
         </w:numPr>
       </w:pPr>
       <w:r>
-        <w:t xml:space="preserve">Strategic thinker, mercurial innovator, and expert problem solver</w:t>
-      </w:r>
-    </w:p>
-    <w:p>
-      <w:pPr>
-        <w:pStyle w:val="Compact"/>
-        <w:numPr>
-          <w:ilvl w:val="0"/>
-          <w:numId w:val="1001"/>
-        </w:numPr>
-      </w:pPr>
-      <w:r>
-        <w:t xml:space="preserve">Resilient and dedicated, ready to embrace challenges and opportunities</w:t>
-      </w:r>
-    </w:p>
-    <w:p>
-      <w:pPr>
-        <w:pStyle w:val="Compact"/>
-        <w:numPr>
-          <w:ilvl w:val="0"/>
-          <w:numId w:val="1001"/>
-        </w:numPr>
-      </w:pPr>
-      <w:r>
-        <w:t xml:space="preserve">Strong customer focus,</w:t>
-      </w:r>
-      <w:r>
-        <w:t xml:space="preserve"> </w:t>
-      </w:r>
-      <w:r>
-        <w:rPr>
-          <w:b/>
-          <w:bCs/>
-        </w:rPr>
-        <w:t xml:space="preserve">advocating for impactful changes</w:t>
-      </w:r>
-      <w:r>
-        <w:t xml:space="preserve"> </w:t>
-      </w:r>
-      <w:r>
-        <w:t xml:space="preserve">and ensuring product value</w:t>
-      </w:r>
-    </w:p>
-    <w:p>
-      <w:pPr>
-        <w:pStyle w:val="Compact"/>
-        <w:numPr>
-          <w:ilvl w:val="0"/>
-          <w:numId w:val="1001"/>
-        </w:numPr>
-      </w:pPr>
-      <w:r>
         <w:t xml:space="preserve">Entrepreneurial spirit with multiple co-founding experiences</w:t>
       </w:r>
     </w:p>
-    <w:p>
-      <w:pPr>
-        <w:pStyle w:val="Compact"/>
-        <w:numPr>
-          <w:ilvl w:val="0"/>
-          <w:numId w:val="1001"/>
-        </w:numPr>
-      </w:pPr>
-      <w:r>
-        <w:t xml:space="preserve">Principal-level engineer specializing in AI-powered developer tooling, platform modernization, and large-scale engineering productivity</w:t>
-      </w:r>
-    </w:p>
-    <w:p>
-      <w:pPr>
-        <w:pStyle w:val="Compact"/>
-        <w:numPr>
-          <w:ilvl w:val="0"/>
-          <w:numId w:val="1001"/>
-        </w:numPr>
-      </w:pPr>
-      <w:r>
-        <w:t xml:space="preserve">Full-stack generalist with deep experience applying AI/LLMs, DevOps, and cloud-native systems to accelerate software delivery</w:t>
-      </w:r>
-    </w:p>
     <w:bookmarkEnd w:id="24"/>
-    <w:bookmarkStart w:id="31" w:name="industry-experience"/>
+    <w:bookmarkStart w:id="36" w:name="industry-experience"/>
     <w:p>
       <w:pPr>
         <w:pStyle w:val="Heading2"/>
@@ -275,13 +249,13 @@
         <w:t xml:space="preserve">Technical Lead</w:t>
       </w:r>
     </w:p>
-    <w:bookmarkStart w:id="25" w:name="X75167482f34e06a01a656d1f4cef9a03bec6c7a"/>
+    <w:bookmarkStart w:id="25" w:name="X6dafa89e46c32694395442a9a6ca99eae379ab9"/>
     <w:p>
       <w:pPr>
         <w:pStyle w:val="Heading4"/>
       </w:pPr>
       <w:r>
-        <w:t xml:space="preserve">Building Humane Technology | June 2025 - Present | Remote (US)</w:t>
+        <w:t xml:space="preserve">Building Humane Technology | June 2025 - Present | Remote</w:t>
       </w:r>
     </w:p>
     <w:p>
@@ -293,7 +267,7 @@
         </w:numPr>
       </w:pPr>
       <w:r>
-        <w:t xml:space="preserve">Co-architecting and leading development of HumaneBench.ai, an open-source benchmark for evaluating AI systems against humane technology principles.</w:t>
+        <w:t xml:space="preserve">Co-designed and led development of HumaneBench.ai, an open-source AI evaluation framework built on AISI Inspect. Authored the benchmark specification, implemented evaluation tooling, and published the project. Python.</w:t>
       </w:r>
     </w:p>
     <w:p>
@@ -305,7 +279,7 @@
         </w:numPr>
       </w:pPr>
       <w:r>
-        <w:t xml:space="preserve">Developing an extensible AI evaluation framework built on AISI Inspect, focused on measuring and improving LLM behavior in real-world developer and operational workflows.</w:t>
+        <w:t xml:space="preserve">Developed extensive AI agent documentation and custom instruction files (CLAUDE.md, skill definitions) to enable effective agentic development workflows across the project.</w:t>
       </w:r>
     </w:p>
     <w:p>
@@ -317,51 +291,27 @@
         </w:numPr>
       </w:pPr>
       <w:r>
-        <w:t xml:space="preserve">Shaping product and technical roadmap for AI-driven tooling, including production monitoring concepts, multi-turn evaluation, and maturity models to support adoption, measurement, and continuous improvement.</w:t>
-      </w:r>
-    </w:p>
-    <w:p>
-      <w:pPr>
-        <w:pStyle w:val="Compact"/>
-        <w:numPr>
-          <w:ilvl w:val="0"/>
-          <w:numId w:val="1002"/>
-        </w:numPr>
-      </w:pPr>
-      <w:r>
-        <w:t xml:space="preserve">Contributing to education initiatives including Humane Tech and Agentic AI training for the UN Secretariat and broader developer community, plus coordinating hackathons and public AMAs.</w:t>
-      </w:r>
-    </w:p>
-    <w:p>
-      <w:pPr>
-        <w:pStyle w:val="Compact"/>
-        <w:numPr>
-          <w:ilvl w:val="0"/>
-          <w:numId w:val="1002"/>
-        </w:numPr>
-      </w:pPr>
-      <w:r>
-        <w:t xml:space="preserve">Building partnerships and fostering open-source community engagement around humane AI evaluation standards.</w:t>
+        <w:t xml:space="preserve">Shaped technical roadmap for AI evaluation tooling including multi-turn assessment scenarios and extensible dataset architecture.</w:t>
       </w:r>
     </w:p>
     <w:bookmarkEnd w:id="25"/>
     <w:bookmarkEnd w:id="26"/>
-    <w:bookmarkStart w:id="28" w:name="infrastructure-engineer"/>
+    <w:bookmarkStart w:id="28" w:name="co-founder-lead-developer"/>
     <w:p>
       <w:pPr>
         <w:pStyle w:val="Heading3"/>
       </w:pPr>
       <w:r>
-        <w:t xml:space="preserve">Infrastructure Engineer</w:t>
-      </w:r>
-    </w:p>
-    <w:bookmarkStart w:id="27" w:name="tobiko-mar-2024---oct-2024-remote-us"/>
+        <w:t xml:space="preserve">Co-founder &amp; Lead Developer</w:t>
+      </w:r>
+    </w:p>
+    <w:bookmarkStart w:id="27" w:name="Xffd4b369c0bcf0f7e3f28f0e84324bac520d95a"/>
     <w:p>
       <w:pPr>
         <w:pStyle w:val="Heading4"/>
       </w:pPr>
       <w:r>
-        <w:t xml:space="preserve">Tobiko | Mar 2024 - Oct 2024 | Remote (US)</w:t>
+        <w:t xml:space="preserve">Mirror Astrology | Nov 2024 - Present | Remote</w:t>
       </w:r>
     </w:p>
     <w:p>
@@ -373,7 +323,7 @@
         </w:numPr>
       </w:pPr>
       <w:r>
-        <w:t xml:space="preserve">Collaborated with a fast-paced team to architect and implement a robust, scalable, modern cloud platform serving customer workloads.</w:t>
+        <w:t xml:space="preserve">Built AI chatbot integrating multiple LLMs with complex prompting, tool use, and context augmentation for a production consumer application.</w:t>
       </w:r>
     </w:p>
     <w:p>
@@ -385,51 +335,27 @@
         </w:numPr>
       </w:pPr>
       <w:r>
-        <w:t xml:space="preserve">Built out CI/CD patterns including mono-repo conditional workflows, workload identity federation, and continuous delivery.</w:t>
-      </w:r>
-    </w:p>
-    <w:p>
-      <w:pPr>
-        <w:pStyle w:val="Compact"/>
-        <w:numPr>
-          <w:ilvl w:val="0"/>
-          <w:numId w:val="1003"/>
-        </w:numPr>
-      </w:pPr>
-      <w:r>
-        <w:t xml:space="preserve">Implemented a Slack-based customer support and incident response platform, and onboarded teammates and customers.</w:t>
-      </w:r>
-    </w:p>
-    <w:p>
-      <w:pPr>
-        <w:pStyle w:val="Compact"/>
-        <w:numPr>
-          <w:ilvl w:val="0"/>
-          <w:numId w:val="1003"/>
-        </w:numPr>
-      </w:pPr>
-      <w:r>
-        <w:t xml:space="preserve">Python, Pulumi, Google Cloud Platform, Google Kubernetes Engine, Google Cloud Run, CI/CD with CircleCI, Helm, SQLMesh.</w:t>
+        <w:t xml:space="preserve">Owned entire frontend (Ruby on Rails, JavaScript, Tailwind) and collaborated on product direction, UX, and roadmap.</w:t>
       </w:r>
     </w:p>
     <w:bookmarkEnd w:id="27"/>
     <w:bookmarkEnd w:id="28"/>
-    <w:bookmarkStart w:id="30" w:name="X7a2c313efdde198d901363c762c81839771c845"/>
+    <w:bookmarkStart w:id="30" w:name="infrastructure-engineer"/>
     <w:p>
       <w:pPr>
         <w:pStyle w:val="Heading3"/>
       </w:pPr>
       <w:r>
-        <w:t xml:space="preserve">Engineering Manager / Principal Software Engineer</w:t>
-      </w:r>
-    </w:p>
-    <w:bookmarkStart w:id="29" w:name="X47289269eb944414c9285d314973b45c253bcef"/>
+        <w:t xml:space="preserve">Infrastructure Engineer</w:t>
+      </w:r>
+    </w:p>
+    <w:bookmarkStart w:id="29" w:name="tobiko-mar-2024---oct-2024-remote"/>
     <w:p>
       <w:pPr>
         <w:pStyle w:val="Heading4"/>
       </w:pPr>
       <w:r>
-        <w:t xml:space="preserve">Mavenlink / Kantata | Apr 2017 - Dec 2023 | San Francisco, CA</w:t>
+        <w:t xml:space="preserve">Tobiko | Mar 2024 - Oct 2024 | Remote</w:t>
       </w:r>
     </w:p>
     <w:p>
@@ -441,14 +367,7 @@
         </w:numPr>
       </w:pPr>
       <w:r>
-        <w:rPr>
-          <w:b/>
-          <w:bCs/>
-        </w:rPr>
-        <w:t xml:space="preserve">Operations Team Leadership</w:t>
-      </w:r>
-      <w:r>
-        <w:t xml:space="preserve">: Over four years, recruited and led a new infrastructure team dedicated to building and scaling the platform. Instrumental in leading the organization’s transition towards a DevOps culture, serving as a change agent and technical authority across engineering. Created a clear, calm, and constructive environment that allowed the team to thrive. Responsible for roadmap stewardship, untangling requirements, and arranging priorities to maximize flow. Transitioned a large legacy infrastructure codebase to cutting-edge, cloud-native, IAC-oriented tools while remaining hands-on with coding, architecture, and collaboration on mission-critical projects.</w:t>
+        <w:t xml:space="preserve">Architected and implemented a scalable cloud platform serving customer workloads, building CI/CD patterns including mono-repo conditional workflows, workload identity federation, and continuous delivery via CircleCI.</w:t>
       </w:r>
     </w:p>
     <w:p>
@@ -460,14 +379,7 @@
         </w:numPr>
       </w:pPr>
       <w:r>
-        <w:rPr>
-          <w:b/>
-          <w:bCs/>
-        </w:rPr>
-        <w:t xml:space="preserve">M-Bridge Platform Leadership</w:t>
-      </w:r>
-      <w:r>
-        <w:t xml:space="preserve">: For two years, spearheaded a team to stabilize and enhance an agent-based integration platform. Established operational metrics and monitoring systems that reduced platform errors and incidents by approximately 100x. Successfully performed a migration to Kubernetes with zero downtime, including relational, document, and cache databases. Demonstrated ability to measure impact and drive data-informed decisions.</w:t>
+        <w:t xml:space="preserve">Built a Slack-based integration platform for customer support and incident response — connecting internal systems with external communication channels; onboarded teammates and customers.</w:t>
       </w:r>
     </w:p>
     <w:p>
@@ -479,226 +391,192 @@
         </w:numPr>
       </w:pPr>
       <w:r>
-        <w:rPr>
-          <w:b/>
-          <w:bCs/>
-        </w:rPr>
-        <w:t xml:space="preserve">Insights Platform Leadership</w:t>
-      </w:r>
-      <w:r>
-        <w:t xml:space="preserve">: For three months, led a transition team responsible for overseeing and improving the BI data pipeline. Successfully migrated the pipeline to Kubernetes, accelerating modernization initiatives.</w:t>
-      </w:r>
-    </w:p>
-    <w:p>
-      <w:pPr>
-        <w:pStyle w:val="Compact"/>
-        <w:numPr>
-          <w:ilvl w:val="0"/>
-          <w:numId w:val="1004"/>
-        </w:numPr>
-      </w:pPr>
-      <w:r>
-        <w:rPr>
-          <w:b/>
-          <w:bCs/>
-        </w:rPr>
-        <w:t xml:space="preserve">Cross-Functional Leadership &amp; Organizational Impact</w:t>
-      </w:r>
-      <w:r>
-        <w:t xml:space="preserve">: Took on organization-wide roles including mentorship and coaching, interviewing and hiring, and organizational change management and process optimization. Influenced decisions at all levels and promoted best practices across the engineering organization. Recognized with Top Performer Award in 2021 for contributions to technical excellence and team development.</w:t>
+        <w:t xml:space="preserve">Developed cloud-native infrastructure tooling across Python, Pulumi, GCP, GKE, Cloud Run, CircleCI, and Helm — directly analogous to building MCP server integrations connecting agents to CI, Slack, and cloud services.</w:t>
       </w:r>
     </w:p>
     <w:bookmarkEnd w:id="29"/>
     <w:bookmarkEnd w:id="30"/>
+    <w:bookmarkStart w:id="32" w:name="X7a2c313efdde198d901363c762c81839771c845"/>
+    <w:p>
+      <w:pPr>
+        <w:pStyle w:val="Heading3"/>
+      </w:pPr>
+      <w:r>
+        <w:t xml:space="preserve">Engineering Manager / Principal Software Engineer</w:t>
+      </w:r>
+    </w:p>
+    <w:bookmarkStart w:id="31" w:name="X47289269eb944414c9285d314973b45c253bcef"/>
+    <w:p>
+      <w:pPr>
+        <w:pStyle w:val="Heading4"/>
+      </w:pPr>
+      <w:r>
+        <w:t xml:space="preserve">Mavenlink / Kantata | Apr 2017 - Dec 2023 | San Francisco, CA</w:t>
+      </w:r>
+    </w:p>
+    <w:p>
+      <w:pPr>
+        <w:pStyle w:val="Compact"/>
+        <w:numPr>
+          <w:ilvl w:val="0"/>
+          <w:numId w:val="1005"/>
+        </w:numPr>
+      </w:pPr>
+      <w:r>
+        <w:rPr>
+          <w:b/>
+          <w:bCs/>
+        </w:rPr>
+        <w:t xml:space="preserve">M-Bridge Integration Platform</w:t>
+      </w:r>
+      <w:r>
+        <w:t xml:space="preserve"> </w:t>
+      </w:r>
+      <w:r>
+        <w:t xml:space="preserve">(2 years): Led a team to stabilize and scale an agent-based integration platform handling multi-system data orchestration. Established operational metrics and monitoring that reduced errors and incidents by ~100x. Executed a zero-downtime migration to Kubernetes including relational, document, and cache databases.</w:t>
+      </w:r>
+    </w:p>
+    <w:p>
+      <w:pPr>
+        <w:pStyle w:val="Compact"/>
+        <w:numPr>
+          <w:ilvl w:val="0"/>
+          <w:numId w:val="1005"/>
+        </w:numPr>
+      </w:pPr>
+      <w:r>
+        <w:rPr>
+          <w:b/>
+          <w:bCs/>
+        </w:rPr>
+        <w:t xml:space="preserve">Infrastructure Platform</w:t>
+      </w:r>
+      <w:r>
+        <w:t xml:space="preserve"> </w:t>
+      </w:r>
+      <w:r>
+        <w:t xml:space="preserve">(4 years): Recruited and built a new team from scratch dedicated to the infrastructure platform. Led the organization’s DevOps culture transformation — served as the internal enablement champion and technical authority across engineering, addressing root causes of developer struggles through improved tooling, documentation, and access. Owned roadmap stewardship, requirements triage, and priority management while staying hands-on with coding, architecture, and code review. Transitioned a large legacy codebase to cloud-native, Infrastructure-as-Code tooling (Terraform, Ansible, Kubernetes).</w:t>
+      </w:r>
+    </w:p>
+    <w:p>
+      <w:pPr>
+        <w:pStyle w:val="Compact"/>
+        <w:numPr>
+          <w:ilvl w:val="0"/>
+          <w:numId w:val="1005"/>
+        </w:numPr>
+      </w:pPr>
+      <w:r>
+        <w:rPr>
+          <w:b/>
+          <w:bCs/>
+        </w:rPr>
+        <w:t xml:space="preserve">BI Data Pipeline</w:t>
+      </w:r>
+      <w:r>
+        <w:t xml:space="preserve"> </w:t>
+      </w:r>
+      <w:r>
+        <w:t xml:space="preserve">(3 months): Led a transition team to take ownership of and improve the analytics data pipeline. Migrated the pipeline to Kubernetes.</w:t>
+      </w:r>
+    </w:p>
+    <w:p>
+      <w:pPr>
+        <w:pStyle w:val="Compact"/>
+        <w:numPr>
+          <w:ilvl w:val="0"/>
+          <w:numId w:val="1005"/>
+        </w:numPr>
+      </w:pPr>
+      <w:r>
+        <w:rPr>
+          <w:b/>
+          <w:bCs/>
+        </w:rPr>
+        <w:t xml:space="preserve">Cross-Functional Impact</w:t>
+      </w:r>
+      <w:r>
+        <w:t xml:space="preserve">: Mentored engineers across teams — notably coached a junior engineer who grew to Engineering Manager. Led interviewing and hiring. Drove organizational change management and process optimization.</w:t>
+      </w:r>
+      <w:r>
+        <w:t xml:space="preserve"> </w:t>
+      </w:r>
+      <w:r>
+        <w:rPr>
+          <w:b/>
+          <w:bCs/>
+        </w:rPr>
+        <w:t xml:space="preserve">Top Performer Award, 2021</w:t>
+      </w:r>
+      <w:r>
+        <w:t xml:space="preserve">.</w:t>
+      </w:r>
+    </w:p>
     <w:bookmarkEnd w:id="31"/>
-    <w:bookmarkStart w:id="36" w:name="skills"/>
-    <w:p>
-      <w:pPr>
-        <w:pStyle w:val="Heading2"/>
-      </w:pPr>
-      <w:r>
-        <w:t xml:space="preserve">Skills</w:t>
-      </w:r>
-    </w:p>
-    <w:bookmarkStart w:id="32" w:name="technical-skills"/>
+    <w:bookmarkEnd w:id="32"/>
+    <w:bookmarkStart w:id="34" w:name="lead-developer-co-founder"/>
     <w:p>
       <w:pPr>
         <w:pStyle w:val="Heading3"/>
       </w:pPr>
       <w:r>
-        <w:t xml:space="preserve">Technical Skills</w:t>
-      </w:r>
-    </w:p>
-    <w:p>
-      <w:pPr>
-        <w:pStyle w:val="Compact"/>
-        <w:numPr>
-          <w:ilvl w:val="0"/>
-          <w:numId w:val="1005"/>
-        </w:numPr>
-      </w:pPr>
-      <w:r>
-        <w:rPr>
-          <w:b/>
-          <w:bCs/>
-        </w:rPr>
-        <w:t xml:space="preserve">Languages &amp; Frameworks</w:t>
-      </w:r>
-      <w:r>
-        <w:t xml:space="preserve">: Ruby on Rails, Python, Node.js, JavaScript, TypeScript, Bash.</w:t>
-      </w:r>
-    </w:p>
-    <w:p>
-      <w:pPr>
-        <w:pStyle w:val="Compact"/>
-        <w:numPr>
-          <w:ilvl w:val="0"/>
-          <w:numId w:val="1005"/>
-        </w:numPr>
-      </w:pPr>
-      <w:r>
-        <w:rPr>
-          <w:b/>
-          <w:bCs/>
-        </w:rPr>
-        <w:t xml:space="preserve">AI/LLM Development</w:t>
-      </w:r>
-      <w:r>
-        <w:t xml:space="preserve">: MCP (Model Context Protocol), chatbot development, prompt engineering, tool use, context augmentation, AI-assisted developer workflows.</w:t>
-      </w:r>
-    </w:p>
-    <w:p>
-      <w:pPr>
-        <w:pStyle w:val="Compact"/>
-        <w:numPr>
-          <w:ilvl w:val="0"/>
-          <w:numId w:val="1005"/>
-        </w:numPr>
-      </w:pPr>
-      <w:r>
-        <w:rPr>
-          <w:b/>
-          <w:bCs/>
-        </w:rPr>
-        <w:t xml:space="preserve">Databases</w:t>
-      </w:r>
-      <w:r>
-        <w:t xml:space="preserve">: MySQL, PostgreSQL, MongoDB, Redis, Cloud-based data services.</w:t>
-      </w:r>
-    </w:p>
-    <w:p>
-      <w:pPr>
-        <w:pStyle w:val="Compact"/>
-        <w:numPr>
-          <w:ilvl w:val="0"/>
-          <w:numId w:val="1005"/>
-        </w:numPr>
-      </w:pPr>
-      <w:r>
-        <w:rPr>
-          <w:b/>
-          <w:bCs/>
-        </w:rPr>
-        <w:t xml:space="preserve">Tools &amp; Platforms</w:t>
-      </w:r>
-      <w:r>
-        <w:t xml:space="preserve">: Kubernetes, AWS (Amazon Web Services), Google Cloud Platform, CircleCI, GitHub Actions, Terraform, Ansible, Pulumi, Linux, Git, Webpack, Cloudfront, Helm.</w:t>
-      </w:r>
-    </w:p>
-    <w:p>
-      <w:pPr>
-        <w:pStyle w:val="Compact"/>
-        <w:numPr>
-          <w:ilvl w:val="0"/>
-          <w:numId w:val="1005"/>
-        </w:numPr>
-      </w:pPr>
-      <w:r>
-        <w:rPr>
-          <w:b/>
-          <w:bCs/>
-        </w:rPr>
-        <w:t xml:space="preserve">Web Technologies</w:t>
-      </w:r>
-      <w:r>
-        <w:t xml:space="preserve">: HTML, CSS, Tailwind, Front-end Development, Responsive Design, Back-end Development, Distributed Systems, Web3/DWeb, Decentralized Technologies.</w:t>
-      </w:r>
-    </w:p>
-    <w:p>
-      <w:pPr>
-        <w:pStyle w:val="Compact"/>
-        <w:numPr>
-          <w:ilvl w:val="0"/>
-          <w:numId w:val="1005"/>
-        </w:numPr>
-      </w:pPr>
-      <w:r>
-        <w:rPr>
-          <w:b/>
-          <w:bCs/>
-        </w:rPr>
-        <w:t xml:space="preserve">Software Development</w:t>
-      </w:r>
-      <w:r>
-        <w:t xml:space="preserve">: Object-oriented programming (OOP), Functional Programming, API Design and Development, Automated Testing, Continuous Integration, Continuous Deployment, CI/CD, System Architecture, Microservices.</w:t>
-      </w:r>
-    </w:p>
-    <w:bookmarkEnd w:id="32"/>
-    <w:bookmarkStart w:id="33" w:name="methodologies"/>
+        <w:t xml:space="preserve">Lead Developer, Co-founder</w:t>
+      </w:r>
+    </w:p>
+    <w:bookmarkStart w:id="33" w:name="pegg-2014---2017-san-francisco-ca"/>
+    <w:p>
+      <w:pPr>
+        <w:pStyle w:val="Heading4"/>
+      </w:pPr>
+      <w:r>
+        <w:t xml:space="preserve">Pegg | 2014 - 2017 | San Francisco, CA</w:t>
+      </w:r>
+    </w:p>
+    <w:p>
+      <w:pPr>
+        <w:pStyle w:val="Compact"/>
+        <w:numPr>
+          <w:ilvl w:val="0"/>
+          <w:numId w:val="1006"/>
+        </w:numPr>
+      </w:pPr>
+      <w:r>
+        <w:t xml:space="preserve">Designed, architected, and built a cross-platform mobile app from scratch (iOS/Android). Node.js backend, JS/Phonegap frontend, Firebase real-time systems, CI/CD to AWS/CloudFront via CircleCI.</w:t>
+      </w:r>
+    </w:p>
+    <w:p>
+      <w:pPr>
+        <w:pStyle w:val="Compact"/>
+        <w:numPr>
+          <w:ilvl w:val="0"/>
+          <w:numId w:val="1006"/>
+        </w:numPr>
+      </w:pPr>
+      <w:r>
+        <w:t xml:space="preserve">Established engineering workflow: pair programming, automated testing (Karma/Chai), continuous integration, and rapid deployment processes.</w:t>
+      </w:r>
+    </w:p>
+    <w:p>
+      <w:pPr>
+        <w:pStyle w:val="Compact"/>
+        <w:numPr>
+          <w:ilvl w:val="0"/>
+          <w:numId w:val="1006"/>
+        </w:numPr>
+      </w:pPr>
+      <w:r>
+        <w:t xml:space="preserve">Co-led product strategy, monetization, and launch planning.</w:t>
+      </w:r>
+    </w:p>
+    <w:bookmarkEnd w:id="33"/>
+    <w:bookmarkEnd w:id="34"/>
+    <w:bookmarkStart w:id="35" w:name="earlier-career-2001---2014"/>
     <w:p>
       <w:pPr>
         <w:pStyle w:val="Heading3"/>
       </w:pPr>
       <w:r>
-        <w:t xml:space="preserve">Methodologies</w:t>
-      </w:r>
-    </w:p>
-    <w:p>
-      <w:pPr>
-        <w:pStyle w:val="Compact"/>
-        <w:numPr>
-          <w:ilvl w:val="0"/>
-          <w:numId w:val="1006"/>
-        </w:numPr>
-      </w:pPr>
-      <w:r>
-        <w:rPr>
-          <w:b/>
-          <w:bCs/>
-        </w:rPr>
-        <w:t xml:space="preserve">Project Management</w:t>
-      </w:r>
-      <w:r>
-        <w:t xml:space="preserve">: Agile, Pair Programming, Test-Driven Development (TDD), DevOps, Lean Thinking, Rapid Prototyping, Scrum, Kanban.</w:t>
-      </w:r>
-    </w:p>
-    <w:p>
-      <w:pPr>
-        <w:pStyle w:val="Compact"/>
-        <w:numPr>
-          <w:ilvl w:val="0"/>
-          <w:numId w:val="1006"/>
-        </w:numPr>
-      </w:pPr>
-      <w:r>
-        <w:rPr>
-          <w:b/>
-          <w:bCs/>
-        </w:rPr>
-        <w:t xml:space="preserve">Design &amp; Architecture</w:t>
-      </w:r>
-      <w:r>
-        <w:t xml:space="preserve">: Software Design Patterns, Systems Design, Infrastructure as Code (IAC), Data Pipeline Design, Cloud-Native Architecture, User Interface Design.</w:t>
-      </w:r>
-    </w:p>
-    <w:bookmarkEnd w:id="33"/>
-    <w:bookmarkStart w:id="34" w:name="organizational-soft-skills"/>
-    <w:p>
-      <w:pPr>
-        <w:pStyle w:val="Heading3"/>
-      </w:pPr>
-      <w:r>
-        <w:t xml:space="preserve">Organizational &amp; Soft Skills</w:t>
+        <w:t xml:space="preserve">Earlier Career (2001 - 2014)</w:t>
       </w:r>
     </w:p>
     <w:p>
@@ -714,10 +592,13 @@
           <w:b/>
           <w:bCs/>
         </w:rPr>
-        <w:t xml:space="preserve">Leadership &amp; Management</w:t>
-      </w:r>
-      <w:r>
-        <w:t xml:space="preserve">: Team Building, Cross-Functional Leadership, Coaching &amp; Mentoring, Talent Recruitment &amp; Development, High-Performance Team Management, Strategic Planning, Decision Making, Change Management.</w:t>
+        <w:t xml:space="preserve">Consultant &amp; Entrepreneur</w:t>
+      </w:r>
+      <w:r>
+        <w:t xml:space="preserve"> </w:t>
+      </w:r>
+      <w:r>
+        <w:t xml:space="preserve">(2008 - 2014): Founded OpenTest Pro (automated testing education). Built e-commerce ordering system for Turnbull &amp; Asser shirtmakers. Full-stack consulting in Ruby on Rails, Node.js, D3 data visualization. Rapid prototyping and client delivery.</w:t>
       </w:r>
     </w:p>
     <w:p>
@@ -733,10 +614,13 @@
           <w:b/>
           <w:bCs/>
         </w:rPr>
-        <w:t xml:space="preserve">Communication &amp; Collaboration</w:t>
-      </w:r>
-      <w:r>
-        <w:t xml:space="preserve">: Effective Communication, Stakeholder Engagement, Negotiation, Problem-Solving, Conflict Resolution, Customer-Oriented Approach.</w:t>
+        <w:t xml:space="preserve">Web Developer, OnForce, Inc</w:t>
+      </w:r>
+      <w:r>
+        <w:t xml:space="preserve"> </w:t>
+      </w:r>
+      <w:r>
+        <w:t xml:space="preserve">(2006 - 2007): Introduced automated testing and CI. Built comprehensive API test suite. Integrated platform with Salesforce APIs.</w:t>
       </w:r>
     </w:p>
     <w:p>
@@ -752,143 +636,32 @@
           <w:b/>
           <w:bCs/>
         </w:rPr>
-        <w:t xml:space="preserve">Innovation &amp; Creativity</w:t>
-      </w:r>
-      <w:r>
-        <w:t xml:space="preserve">: Entrepreneurship, Creative Problem Solving, Product Development and Innovation, Adaptive Learning, Forward-Thinking.</w:t>
-      </w:r>
-    </w:p>
-    <w:bookmarkEnd w:id="34"/>
-    <w:bookmarkStart w:id="35" w:name="additional-competencies"/>
-    <w:p>
-      <w:pPr>
-        <w:pStyle w:val="Heading3"/>
-      </w:pPr>
-      <w:r>
-        <w:t xml:space="preserve">Additional Competencies</w:t>
-      </w:r>
-    </w:p>
-    <w:p>
-      <w:pPr>
-        <w:pStyle w:val="Compact"/>
-        <w:numPr>
-          <w:ilvl w:val="0"/>
-          <w:numId w:val="1008"/>
-        </w:numPr>
-      </w:pPr>
-      <w:r>
-        <w:rPr>
-          <w:b/>
-          <w:bCs/>
-        </w:rPr>
-        <w:t xml:space="preserve">Industry Knowledge</w:t>
-      </w:r>
-      <w:r>
-        <w:t xml:space="preserve">: Software Engineering, Web Development, Cloud Computing, AI/ML Development, Startup Ecosystem, SaaS, PaaS, B2B Software, Humane Technology.</w:t>
-      </w:r>
-    </w:p>
-    <w:p>
-      <w:pPr>
-        <w:pStyle w:val="Compact"/>
-        <w:numPr>
-          <w:ilvl w:val="0"/>
-          <w:numId w:val="1008"/>
-        </w:numPr>
-      </w:pPr>
-      <w:r>
-        <w:rPr>
-          <w:b/>
-          <w:bCs/>
-        </w:rPr>
-        <w:t xml:space="preserve">Personal Attributes</w:t>
-      </w:r>
-      <w:r>
-        <w:t xml:space="preserve">: Resilient, Innovative, Dedicated, Entrepreneurial, Strategic Thinker, Out of the Box Thinker, Detail-Oriented, Analytical, Kind and Compassionate, Truth Seeker.</w:t>
+        <w:t xml:space="preserve">Development Lead, JBA Network</w:t>
+      </w:r>
+      <w:r>
+        <w:t xml:space="preserve"> </w:t>
+      </w:r>
+      <w:r>
+        <w:t xml:space="preserve">(2003 - 2006): Lead programmer and project manager for mynewsletterbuilder.com — architected initial release, then built and scaled the development team.</w:t>
       </w:r>
     </w:p>
     <w:bookmarkEnd w:id="35"/>
     <w:bookmarkEnd w:id="36"/>
-    <w:bookmarkStart w:id="39" w:name="education"/>
+    <w:bookmarkStart w:id="41" w:name="open-source-projects"/>
     <w:p>
       <w:pPr>
         <w:pStyle w:val="Heading2"/>
       </w:pPr>
       <w:r>
-        <w:t xml:space="preserve">Education</w:t>
-      </w:r>
-    </w:p>
-    <w:bookmarkStart w:id="38" w:name="bachelor-of-arts-in-mathematics"/>
+        <w:t xml:space="preserve">Open Source Projects</w:t>
+      </w:r>
+    </w:p>
+    <w:bookmarkStart w:id="38" w:name="scan-mcp-2024---present"/>
     <w:p>
       <w:pPr>
         <w:pStyle w:val="Heading3"/>
       </w:pPr>
       <w:r>
-        <w:t xml:space="preserve">Bachelor of Arts in Mathematics</w:t>
-      </w:r>
-    </w:p>
-    <w:bookmarkStart w:id="37" w:name="Xe220d86d70cd5bf8ee7040adf9411d63a6235ab"/>
-    <w:p>
-      <w:pPr>
-        <w:pStyle w:val="Heading4"/>
-      </w:pPr>
-      <w:r>
-        <w:t xml:space="preserve">University of North Carolina at Asheville | May 2003</w:t>
-      </w:r>
-    </w:p>
-    <w:p>
-      <w:pPr>
-        <w:pStyle w:val="Compact"/>
-        <w:numPr>
-          <w:ilvl w:val="0"/>
-          <w:numId w:val="1009"/>
-        </w:numPr>
-      </w:pPr>
-      <w:r>
-        <w:t xml:space="preserve">Minor in Computer Science.</w:t>
-      </w:r>
-    </w:p>
-    <w:p>
-      <w:pPr>
-        <w:pStyle w:val="Compact"/>
-        <w:numPr>
-          <w:ilvl w:val="0"/>
-          <w:numId w:val="1009"/>
-        </w:numPr>
-      </w:pPr>
-      <w:r>
-        <w:t xml:space="preserve">Graduated with distinction in Mathematics.</w:t>
-      </w:r>
-    </w:p>
-    <w:p>
-      <w:pPr>
-        <w:pStyle w:val="Compact"/>
-        <w:numPr>
-          <w:ilvl w:val="0"/>
-          <w:numId w:val="1009"/>
-        </w:numPr>
-      </w:pPr>
-      <w:r>
-        <w:t xml:space="preserve">Undergraduate research in 4D fractals.</w:t>
-      </w:r>
-    </w:p>
-    <w:bookmarkEnd w:id="37"/>
-    <w:bookmarkEnd w:id="38"/>
-    <w:bookmarkEnd w:id="39"/>
-    <w:bookmarkStart w:id="44" w:name="open-source-projects"/>
-    <w:p>
-      <w:pPr>
-        <w:pStyle w:val="Heading2"/>
-      </w:pPr>
-      <w:r>
-        <w:t xml:space="preserve">Open Source Projects</w:t>
-      </w:r>
-    </w:p>
-    <w:bookmarkStart w:id="41" w:name="scan-mcp-2024---present"/>
-    <w:p>
-      <w:pPr>
-        <w:pStyle w:val="Heading3"/>
-      </w:pPr>
-      <w:r>
         <w:t xml:space="preserve">Scan MCP (2024 - Present)</w:t>
       </w:r>
     </w:p>
@@ -897,14 +670,14 @@
         <w:pStyle w:val="FirstParagraph"/>
       </w:pPr>
       <w:r>
-        <w:t xml:space="preserve">MCP (Model Context Protocol) server for scanner automation and document digitization. Privacy-first architecture with smart device discovery, JSON Schema validation, and support for both local stdio and network HTTP transports. TypeScript/Node.js.</w:t>
+        <w:t xml:space="preserve">MCP (Model Context Protocol) server enabling AI agents to autonomously control scanner hardware for document digitization. Demonstrates end-to-end MCP server development: tool definitions, JSON Schema validation, device discovery, and dual-transport support (local stdio and network HTTP) for seamless agent integration. TypeScript/Node.js.</w:t>
       </w:r>
     </w:p>
     <w:p>
       <w:pPr>
         <w:pStyle w:val="BodyText"/>
       </w:pPr>
-      <w:hyperlink r:id="rId40">
+      <w:hyperlink r:id="rId37">
         <w:r>
           <w:rPr>
             <w:rStyle w:val="Hyperlink"/>
@@ -913,8 +686,8 @@
         </w:r>
       </w:hyperlink>
     </w:p>
-    <w:bookmarkEnd w:id="41"/>
-    <w:bookmarkStart w:id="43" w:name="humanebench-2024---present"/>
+    <w:bookmarkEnd w:id="38"/>
+    <w:bookmarkStart w:id="40" w:name="humanebench-2024---present"/>
     <w:p>
       <w:pPr>
         <w:pStyle w:val="Heading3"/>
@@ -935,7 +708,7 @@
       <w:pPr>
         <w:pStyle w:val="BodyText"/>
       </w:pPr>
-      <w:hyperlink r:id="rId42">
+      <w:hyperlink r:id="rId39">
         <w:r>
           <w:rPr>
             <w:rStyle w:val="Hyperlink"/>
@@ -944,9 +717,194 @@
         </w:r>
       </w:hyperlink>
     </w:p>
+    <w:bookmarkEnd w:id="40"/>
+    <w:bookmarkEnd w:id="41"/>
+    <w:bookmarkStart w:id="42" w:name="skills"/>
+    <w:p>
+      <w:pPr>
+        <w:pStyle w:val="Heading2"/>
+      </w:pPr>
+      <w:r>
+        <w:t xml:space="preserve">Skills</w:t>
+      </w:r>
+    </w:p>
+    <w:p>
+      <w:pPr>
+        <w:pStyle w:val="Compact"/>
+        <w:numPr>
+          <w:ilvl w:val="0"/>
+          <w:numId w:val="1008"/>
+        </w:numPr>
+      </w:pPr>
+      <w:r>
+        <w:rPr>
+          <w:b/>
+          <w:bCs/>
+        </w:rPr>
+        <w:t xml:space="preserve">AI/LLM &amp; Agent Tooling</w:t>
+      </w:r>
+      <w:r>
+        <w:t xml:space="preserve">: Claude Code, Cursor, MCP server development, agent documentation authoring (CLAUDE.md, agents.md, skill libraries), prompt engineering, tool use, context augmentation, AI-assisted developer workflows, LLM evaluation frameworks.</w:t>
+      </w:r>
+    </w:p>
+    <w:p>
+      <w:pPr>
+        <w:pStyle w:val="Compact"/>
+        <w:numPr>
+          <w:ilvl w:val="0"/>
+          <w:numId w:val="1008"/>
+        </w:numPr>
+      </w:pPr>
+      <w:r>
+        <w:rPr>
+          <w:b/>
+          <w:bCs/>
+        </w:rPr>
+        <w:t xml:space="preserve">CI/CD &amp; DevOps</w:t>
+      </w:r>
+      <w:r>
+        <w:t xml:space="preserve">: CircleCI, GitHub Actions, Automated Testing, TDD, Infrastructure as Code, Cloud-Native Architecture.</w:t>
+      </w:r>
+    </w:p>
+    <w:p>
+      <w:pPr>
+        <w:pStyle w:val="Compact"/>
+        <w:numPr>
+          <w:ilvl w:val="0"/>
+          <w:numId w:val="1008"/>
+        </w:numPr>
+      </w:pPr>
+      <w:r>
+        <w:rPr>
+          <w:b/>
+          <w:bCs/>
+        </w:rPr>
+        <w:t xml:space="preserve">Cloud &amp; Infrastructure</w:t>
+      </w:r>
+      <w:r>
+        <w:t xml:space="preserve">: AWS, Google Cloud Platform, Kubernetes, Docker, Terraform, Ansible, Pulumi, Helm, sandboxed/containerized environments.</w:t>
+      </w:r>
+    </w:p>
+    <w:p>
+      <w:pPr>
+        <w:pStyle w:val="Compact"/>
+        <w:numPr>
+          <w:ilvl w:val="0"/>
+          <w:numId w:val="1008"/>
+        </w:numPr>
+      </w:pPr>
+      <w:r>
+        <w:rPr>
+          <w:b/>
+          <w:bCs/>
+        </w:rPr>
+        <w:t xml:space="preserve">Languages &amp; Frameworks</w:t>
+      </w:r>
+      <w:r>
+        <w:t xml:space="preserve">: TypeScript, JavaScript, Python, Ruby on Rails, Node.js, Bash, Go (reading proficiency).</w:t>
+      </w:r>
+    </w:p>
+    <w:p>
+      <w:pPr>
+        <w:pStyle w:val="Compact"/>
+        <w:numPr>
+          <w:ilvl w:val="0"/>
+          <w:numId w:val="1008"/>
+        </w:numPr>
+      </w:pPr>
+      <w:r>
+        <w:rPr>
+          <w:b/>
+          <w:bCs/>
+        </w:rPr>
+        <w:t xml:space="preserve">Back-end &amp; Data</w:t>
+      </w:r>
+      <w:r>
+        <w:t xml:space="preserve">: API Design, Microservices, Distributed Systems, GraphQL, PostgreSQL, MySQL, MongoDB, Redis.</w:t>
+      </w:r>
+    </w:p>
+    <w:p>
+      <w:pPr>
+        <w:pStyle w:val="Compact"/>
+        <w:numPr>
+          <w:ilvl w:val="0"/>
+          <w:numId w:val="1008"/>
+        </w:numPr>
+      </w:pPr>
+      <w:r>
+        <w:rPr>
+          <w:b/>
+          <w:bCs/>
+        </w:rPr>
+        <w:t xml:space="preserve">Front-end</w:t>
+      </w:r>
+      <w:r>
+        <w:t xml:space="preserve">: React, Vue, HTML, CSS, Tailwind, Responsive Design, UI/UX.</w:t>
+      </w:r>
+    </w:p>
+    <w:p>
+      <w:pPr>
+        <w:pStyle w:val="Compact"/>
+        <w:numPr>
+          <w:ilvl w:val="0"/>
+          <w:numId w:val="1008"/>
+        </w:numPr>
+      </w:pPr>
+      <w:r>
+        <w:rPr>
+          <w:b/>
+          <w:bCs/>
+        </w:rPr>
+        <w:t xml:space="preserve">Leadership</w:t>
+      </w:r>
+      <w:r>
+        <w:t xml:space="preserve">: Team Building, Coaching &amp; Mentoring, Cross-Functional Collaboration, Developer Enablement, Roadmap Ownership, Hiring, Agile/Scrum/Kanban, Change Management.</w:t>
+      </w:r>
+    </w:p>
+    <w:bookmarkEnd w:id="42"/>
+    <w:bookmarkStart w:id="45" w:name="education"/>
+    <w:p>
+      <w:pPr>
+        <w:pStyle w:val="Heading2"/>
+      </w:pPr>
+      <w:r>
+        <w:t xml:space="preserve">Education</w:t>
+      </w:r>
+    </w:p>
+    <w:bookmarkStart w:id="44" w:name="X8aa14d071da44b7f3006e1d49a262db674bce64"/>
+    <w:p>
+      <w:pPr>
+        <w:pStyle w:val="Heading3"/>
+      </w:pPr>
+      <w:r>
+        <w:t xml:space="preserve">BA in Mathematics, minor in Computer Science</w:t>
+      </w:r>
+    </w:p>
+    <w:bookmarkStart w:id="43" w:name="Xe220d86d70cd5bf8ee7040adf9411d63a6235ab"/>
+    <w:p>
+      <w:pPr>
+        <w:pStyle w:val="Heading4"/>
+      </w:pPr>
+      <w:r>
+        <w:t xml:space="preserve">University of North Carolina at Asheville | May 2003</w:t>
+      </w:r>
+    </w:p>
+    <w:p>
+      <w:pPr>
+        <w:pStyle w:val="Compact"/>
+        <w:numPr>
+          <w:ilvl w:val="0"/>
+          <w:numId w:val="1009"/>
+        </w:numPr>
+      </w:pPr>
+      <w:r>
+        <w:t xml:space="preserve">Graduated with distinction in Mathematics. Undergraduate research in 4D fractals.</w:t>
+      </w:r>
+    </w:p>
     <w:bookmarkEnd w:id="43"/>
     <w:bookmarkEnd w:id="44"/>
-    <w:bookmarkStart w:id="45" w:name="recommendations"/>
+    <w:bookmarkEnd w:id="45"/>
+    <w:bookmarkStart w:id="46" w:name="recommendations"/>
     <w:p>
       <w:pPr>
         <w:pStyle w:val="Heading2"/>
@@ -1002,7 +960,7 @@
         <w:t xml:space="preserve">the solutions he architects, builds, and collaborates on come out better</w:t>
       </w:r>
       <w:r>
-        <w:t xml:space="preserve">. Jack also strives to be at the forefront of new technology and assess how he can leverage it. Newer tech like GenAI can be complex and ever-evolving, and Jack is not one to back down but step up and embrace. He does all this with a</w:t>
+        <w:t xml:space="preserve">. Jack also strives to be at the forefront of new technology and assess how he can leverage it. He does all this with a</w:t>
       </w:r>
       <w:r>
         <w:t xml:space="preserve"> </w:t>
@@ -1048,33 +1006,46 @@
         <w:pStyle w:val="BodyText"/>
       </w:pPr>
       <w:r>
-        <w:t xml:space="preserve">“Jack is a fantastic engineer always ready to</w:t>
-      </w:r>
-      <w:r>
-        <w:t xml:space="preserve"> </w:t>
-      </w:r>
-      <w:r>
-        <w:rPr>
-          <w:b/>
-          <w:bCs/>
-        </w:rPr>
-        <w:t xml:space="preserve">help solve problems and more importantly, teach you how to solve them</w:t>
-      </w:r>
-      <w:r>
-        <w:t xml:space="preserve">. He guided me and my team through a bunch of challenging GitOps situations with patience and kindness, leading by example. Always diligent with his work, willing to roll up his sleeves to get things done and</w:t>
-      </w:r>
-      <w:r>
-        <w:t xml:space="preserve"> </w:t>
-      </w:r>
-      <w:r>
-        <w:rPr>
-          <w:b/>
-          <w:bCs/>
-        </w:rPr>
-        <w:t xml:space="preserve">find creative solutions</w:t>
-      </w:r>
-      <w:r>
-        <w:t xml:space="preserve">, maybe tinkering in some kind of script that would make the manual processes easier and more resilient. Everyone would be lucky to have someone like him in their teams!”</w:t>
+        <w:t xml:space="preserve">“Jack has</w:t>
+      </w:r>
+      <w:r>
+        <w:t xml:space="preserve"> </w:t>
+      </w:r>
+      <w:r>
+        <w:rPr>
+          <w:b/>
+          <w:bCs/>
+        </w:rPr>
+        <w:t xml:space="preserve">had quite a profound impact on my career</w:t>
+      </w:r>
+      <w:r>
+        <w:t xml:space="preserve">. As a young engineer, I was fortunate enough to work with Jack as my coach. He served as a great mentor, helping me build both technical and professional skills and</w:t>
+      </w:r>
+      <w:r>
+        <w:t xml:space="preserve"> </w:t>
+      </w:r>
+      <w:r>
+        <w:rPr>
+          <w:b/>
+          <w:bCs/>
+        </w:rPr>
+        <w:t xml:space="preserve">forming me into the engineer that I am today</w:t>
+      </w:r>
+      <w:r>
+        <w:t xml:space="preserve">.</w:t>
+      </w:r>
+      <w:r>
+        <w:t xml:space="preserve"> </w:t>
+      </w:r>
+      <w:r>
+        <w:rPr>
+          <w:b/>
+          <w:bCs/>
+        </w:rPr>
+        <w:t xml:space="preserve">His mentorship was a key factor in elevating me from an incoming Junior Engineer to an Engineering Manager</w:t>
+      </w:r>
+      <w:r>
+        <w:t xml:space="preserve">. Jack has a great curiosity and a strong set of technical capabilities that allow him to serve as a great example for others and a key contributor to any team!”</w:t>
       </w:r>
     </w:p>
     <w:p>
@@ -1086,7 +1057,7 @@
           <w:i/>
           <w:iCs/>
         </w:rPr>
-        <w:t xml:space="preserve">— Cesar Palafox Garza, Principal Software Engineer, Kantata</w:t>
+        <w:t xml:space="preserve">— Wesley Morlock, Engineering Manager, Kantata</w:t>
       </w:r>
     </w:p>
     <w:p>
@@ -1094,46 +1065,33 @@
         <w:pStyle w:val="BodyText"/>
       </w:pPr>
       <w:r>
-        <w:t xml:space="preserve">“Jack has</w:t>
-      </w:r>
-      <w:r>
-        <w:t xml:space="preserve"> </w:t>
-      </w:r>
-      <w:r>
-        <w:rPr>
-          <w:b/>
-          <w:bCs/>
-        </w:rPr>
-        <w:t xml:space="preserve">had quite a profound impact on my career</w:t>
-      </w:r>
-      <w:r>
-        <w:t xml:space="preserve">. As a young engineer, I was fortunate enough to work with Jack as my coach. He served as a great mentor, helping me build both technical and professional skills and</w:t>
-      </w:r>
-      <w:r>
-        <w:t xml:space="preserve"> </w:t>
-      </w:r>
-      <w:r>
-        <w:rPr>
-          <w:b/>
-          <w:bCs/>
-        </w:rPr>
-        <w:t xml:space="preserve">forming me into the engineer that I am today</w:t>
-      </w:r>
-      <w:r>
-        <w:t xml:space="preserve">. Throughout our time together, Jack was caring and invested in helping me set goals and develop my career.</w:t>
-      </w:r>
-      <w:r>
-        <w:t xml:space="preserve"> </w:t>
-      </w:r>
-      <w:r>
-        <w:rPr>
-          <w:b/>
-          <w:bCs/>
-        </w:rPr>
-        <w:t xml:space="preserve">His mentorship was a key factor in elevating me from an incoming Junior Engineer to an Engineering Manager</w:t>
-      </w:r>
-      <w:r>
-        <w:t xml:space="preserve">. Jack has a great curiosity and a strong set of technical capabilities that allow him to serve as a great example for others and a key contributor to any team!”</w:t>
+        <w:t xml:space="preserve">“Jack is a fantastic engineer always ready to</w:t>
+      </w:r>
+      <w:r>
+        <w:t xml:space="preserve"> </w:t>
+      </w:r>
+      <w:r>
+        <w:rPr>
+          <w:b/>
+          <w:bCs/>
+        </w:rPr>
+        <w:t xml:space="preserve">help solve problems and more importantly, teach you how to solve them</w:t>
+      </w:r>
+      <w:r>
+        <w:t xml:space="preserve">. He guided me and my team through a bunch of challenging GitOps situations with patience and kindness, leading by example. Always diligent with his work, willing to roll up his sleeves to get things done and</w:t>
+      </w:r>
+      <w:r>
+        <w:t xml:space="preserve"> </w:t>
+      </w:r>
+      <w:r>
+        <w:rPr>
+          <w:b/>
+          <w:bCs/>
+        </w:rPr>
+        <w:t xml:space="preserve">find creative solutions</w:t>
+      </w:r>
+      <w:r>
+        <w:t xml:space="preserve">. Everyone would be lucky to have someone like him in their teams!”</w:t>
       </w:r>
     </w:p>
     <w:p>
@@ -1145,7 +1103,7 @@
           <w:i/>
           <w:iCs/>
         </w:rPr>
-        <w:t xml:space="preserve">— Wesley Morlock, Engineering Manager, Kantata</w:t>
+        <w:t xml:space="preserve">— Cesar Palafox Garza, Principal Software Engineer, Kantata</w:t>
       </w:r>
     </w:p>
     <w:p>
@@ -1153,20 +1111,33 @@
         <w:pStyle w:val="BodyText"/>
       </w:pPr>
       <w:r>
-        <w:t xml:space="preserve">“Jack provided invaluable leadership as a Principal Software Engineer at Kantata. He was a powerful voice for the technology but made sure to</w:t>
-      </w:r>
-      <w:r>
-        <w:t xml:space="preserve"> </w:t>
-      </w:r>
-      <w:r>
-        <w:rPr>
-          <w:b/>
-          <w:bCs/>
-        </w:rPr>
-        <w:t xml:space="preserve">advocate for changes that were also certain to provide immediate impact to the customer</w:t>
-      </w:r>
-      <w:r>
-        <w:t xml:space="preserve">. I highly recommend Jack as an excellent dev ops engineer and as a technical leader.”</w:t>
+        <w:t xml:space="preserve">“Jack is</w:t>
+      </w:r>
+      <w:r>
+        <w:t xml:space="preserve"> </w:t>
+      </w:r>
+      <w:r>
+        <w:rPr>
+          <w:b/>
+          <w:bCs/>
+        </w:rPr>
+        <w:t xml:space="preserve">awesome at understanding the direction teams need to go to make important improvements in Kantata’s Engineering organization as a whole</w:t>
+      </w:r>
+      <w:r>
+        <w:t xml:space="preserve">. He has been instrumental in building and implementing strategies to upgrade Ruby, Rails, and React. If I had any questions about infrastructure and Kubernetes he would be able to answer and</w:t>
+      </w:r>
+      <w:r>
+        <w:t xml:space="preserve"> </w:t>
+      </w:r>
+      <w:r>
+        <w:rPr>
+          <w:b/>
+          <w:bCs/>
+        </w:rPr>
+        <w:t xml:space="preserve">provide solid explanations to the entire team</w:t>
+      </w:r>
+      <w:r>
+        <w:t xml:space="preserve">.”</w:t>
       </w:r>
     </w:p>
     <w:p>
@@ -1178,223 +1149,24 @@
           <w:i/>
           <w:iCs/>
         </w:rPr>
-        <w:t xml:space="preserve">— Nathan Perry, Principal Software Engineer, Kantata</w:t>
+        <w:t xml:space="preserve">— Justin Hurstwright, Principal Software Engineer, Kantata</w:t>
       </w:r>
     </w:p>
     <w:p>
       <w:pPr>
         <w:pStyle w:val="BodyText"/>
       </w:pPr>
-      <w:r>
-        <w:t xml:space="preserve">“Jack is talented both as a software developer and as an operations engineer. While working together in a Principal Engineer capacity, I saw how</w:t>
-      </w:r>
-      <w:r>
-        <w:t xml:space="preserve"> </w:t>
-      </w:r>
-      <w:r>
-        <w:rPr>
-          <w:b/>
-          <w:bCs/>
-        </w:rPr>
-        <w:t xml:space="preserve">passionate Jack is about helping his colleagues and his organization level up</w:t>
-      </w:r>
-      <w:r>
-        <w:t xml:space="preserve">. He is a great engineer with excellent leadership and organizational abilities.”</w:t>
-      </w:r>
-    </w:p>
-    <w:p>
-      <w:pPr>
-        <w:pStyle w:val="BodyText"/>
-      </w:pPr>
-      <w:r>
-        <w:rPr>
-          <w:i/>
-          <w:iCs/>
-        </w:rPr>
-        <w:t xml:space="preserve">— Jason Larsen, Software Engineering Manager, Kantata</w:t>
-      </w:r>
-    </w:p>
-    <w:p>
-      <w:pPr>
-        <w:pStyle w:val="BodyText"/>
-      </w:pPr>
-      <w:r>
-        <w:t xml:space="preserve">“Jack is a great co-worker. He is</w:t>
-      </w:r>
-      <w:r>
-        <w:t xml:space="preserve"> </w:t>
-      </w:r>
-      <w:r>
-        <w:rPr>
-          <w:b/>
-          <w:bCs/>
-        </w:rPr>
-        <w:t xml:space="preserve">awesome at understanding the direction teams need to go to make important improvements in Kantata’s Engineering organization as a whole</w:t>
-      </w:r>
-      <w:r>
-        <w:t xml:space="preserve">. He has been instrumental in building and implementing strategies to upgrade Ruby, Rails, and React. If I had any questions about infrastructure and Kubernetes he would be able to answer and</w:t>
-      </w:r>
-      <w:r>
-        <w:t xml:space="preserve"> </w:t>
-      </w:r>
-      <w:r>
-        <w:rPr>
-          <w:b/>
-          <w:bCs/>
-        </w:rPr>
-        <w:t xml:space="preserve">provide solid explanations to the entire team</w:t>
-      </w:r>
-      <w:r>
-        <w:t xml:space="preserve">.”</w:t>
-      </w:r>
-    </w:p>
-    <w:p>
-      <w:pPr>
-        <w:pStyle w:val="BodyText"/>
-      </w:pPr>
-      <w:r>
-        <w:rPr>
-          <w:i/>
-          <w:iCs/>
-        </w:rPr>
-        <w:t xml:space="preserve">— Justin Hurstwright, Principal Software Engineer, Kantata</w:t>
-      </w:r>
-    </w:p>
-    <w:p>
-      <w:pPr>
-        <w:pStyle w:val="BodyText"/>
-      </w:pPr>
-      <w:r>
-        <w:t xml:space="preserve">“Jack is a phenomenal resource to work with. He is</w:t>
-      </w:r>
-      <w:r>
-        <w:t xml:space="preserve"> </w:t>
-      </w:r>
-      <w:r>
-        <w:rPr>
-          <w:b/>
-          <w:bCs/>
-        </w:rPr>
-        <w:t xml:space="preserve">very knowledgeable about programming and cloud infrastructure</w:t>
-      </w:r>
-      <w:r>
-        <w:t xml:space="preserve"> </w:t>
-      </w:r>
-      <w:r>
-        <w:t xml:space="preserve">and is always eager to learn new things.”</w:t>
-      </w:r>
-    </w:p>
-    <w:p>
-      <w:pPr>
-        <w:pStyle w:val="BodyText"/>
-      </w:pPr>
-      <w:r>
-        <w:rPr>
-          <w:i/>
-          <w:iCs/>
-        </w:rPr>
-        <w:t xml:space="preserve">— Donovan Hubbard, Senior DevOps Engineer, Kantata</w:t>
-      </w:r>
-    </w:p>
-    <w:p>
-      <w:pPr>
-        <w:pStyle w:val="BodyText"/>
-      </w:pPr>
-      <w:r>
-        <w:t xml:space="preserve">“Jack has a flair for finding better, faster, and more reliable ways to get things done. He</w:t>
-      </w:r>
-      <w:r>
-        <w:t xml:space="preserve"> </w:t>
-      </w:r>
-      <w:r>
-        <w:rPr>
-          <w:b/>
-          <w:bCs/>
-        </w:rPr>
-        <w:t xml:space="preserve">advocates best practices, like unit testing, and has a deep knowledge of OO architecture</w:t>
-      </w:r>
-      <w:r>
-        <w:t xml:space="preserve">. Jack thinks on his toes, and will always be there with the team at 4 a.m. if circumstance requires it.</w:t>
-      </w:r>
-      <w:r>
-        <w:t xml:space="preserve"> </w:t>
-      </w:r>
-      <w:r>
-        <w:rPr>
-          <w:rStyle w:val="VerbatimChar"/>
-        </w:rPr>
-        <w:t xml:space="preserve">:%s/average developers/developers like jack/g</w:t>
-      </w:r>
-      <w:r>
-        <w:t xml:space="preserve"> </w:t>
-      </w:r>
-      <w:r>
-        <w:t xml:space="preserve">if you know what’s good for you.”</w:t>
-      </w:r>
-    </w:p>
-    <w:p>
-      <w:pPr>
-        <w:pStyle w:val="BodyText"/>
-      </w:pPr>
-      <w:r>
-        <w:rPr>
-          <w:i/>
-          <w:iCs/>
-        </w:rPr>
-        <w:t xml:space="preserve">— Greg Whitescarver, Founder, Mojave</w:t>
-      </w:r>
-    </w:p>
-    <w:p>
-      <w:pPr>
-        <w:pStyle w:val="BodyText"/>
-      </w:pPr>
-      <w:r>
-        <w:t xml:space="preserve">“With Jack,</w:t>
-      </w:r>
-      <w:r>
-        <w:t xml:space="preserve"> </w:t>
-      </w:r>
-      <w:r>
-        <w:rPr>
-          <w:b/>
-          <w:bCs/>
-        </w:rPr>
-        <w:t xml:space="preserve">the more complex the problem, the more simple his solutions</w:t>
-      </w:r>
-      <w:r>
-        <w:t xml:space="preserve">. From eradicating dynamic php bugs to providing innovative javascript capabilities, Master Senechal is more than a mind to be reckoned with, he’s an</w:t>
-      </w:r>
-      <w:r>
-        <w:t xml:space="preserve"> </w:t>
-      </w:r>
-      <w:r>
-        <w:rPr>
-          <w:b/>
-          <w:bCs/>
-        </w:rPr>
-        <w:t xml:space="preserve">integrative capacity builder</w:t>
-      </w:r>
-      <w:r>
-        <w:t xml:space="preserve"> </w:t>
-      </w:r>
-      <w:r>
-        <w:t xml:space="preserve">with a wide range of technological expertise. If there is anything that can be done through web development, Jack can figure out how to do it, and make it happen.”</w:t>
-      </w:r>
-    </w:p>
-    <w:p>
-      <w:pPr>
-        <w:pStyle w:val="BodyText"/>
-      </w:pPr>
-      <w:r>
-        <w:rPr>
-          <w:i/>
-          <w:iCs/>
-        </w:rPr>
-        <w:t xml:space="preserve">— Adam Apollo, Cofounder &amp; CEO, Superluminal Systems</w:t>
-      </w:r>
-    </w:p>
-    <w:bookmarkEnd w:id="45"/>
+      <w:hyperlink r:id="rId22">
+        <w:r>
+          <w:rPr>
+            <w:rStyle w:val="Hyperlink"/>
+          </w:rPr>
+          <w:t xml:space="preserve">See additional recommendations on LinkedIn</w:t>
+        </w:r>
+      </w:hyperlink>
+    </w:p>
     <w:bookmarkEnd w:id="46"/>
+    <w:bookmarkEnd w:id="47"/>
     <w:sectPr/>
   </w:body>
 </w:document>

</xml_diff>

<commit_message>
Tailor resume for Ciridae Platform Engineer
</commit_message>
<xml_diff>
--- a/resume.docx
+++ b/resume.docx
@@ -2,7 +2,7 @@
 <file path=word/document.xml><?xml version="1.0" encoding="utf-8"?>
 <w:document xmlns:w="http://schemas.openxmlformats.org/wordprocessingml/2006/main" xmlns:m="http://schemas.openxmlformats.org/officeDocument/2006/math" xmlns:r="http://schemas.openxmlformats.org/officeDocument/2006/relationships" xmlns:o="urn:schemas-microsoft-com:office:office" xmlns:v="urn:schemas-microsoft-com:vml" xmlns:w10="urn:schemas-microsoft-com:office:word" xmlns:a="http://schemas.openxmlformats.org/drawingml/2006/main" xmlns:pic="http://schemas.openxmlformats.org/drawingml/2006/picture" xmlns:wp="http://schemas.openxmlformats.org/drawingml/2006/wordprocessingDrawing">
   <w:body>
-    <w:bookmarkStart w:id="46" w:name="jack-senechal"/>
+    <w:bookmarkStart w:id="47" w:name="jack-senechal"/>
     <w:p>
       <w:pPr>
         <w:pStyle w:val="Heading1"/>
@@ -11,13 +11,13 @@
         <w:t xml:space="preserve">Jack Senechal</w:t>
       </w:r>
     </w:p>
-    <w:bookmarkStart w:id="23" w:name="engineering-leader-entrepreneur"/>
+    <w:bookmarkStart w:id="23" w:name="ai-platform-engineer"/>
     <w:p>
       <w:pPr>
         <w:pStyle w:val="Heading2"/>
       </w:pPr>
       <w:r>
-        <w:t xml:space="preserve">Engineering Leader / Entrepreneur</w:t>
+        <w:t xml:space="preserve">AI Platform Engineer</w:t>
       </w:r>
     </w:p>
     <w:p>
@@ -32,13 +32,13 @@
         <w:t xml:space="preserve">Located in Novato, CA</w:t>
       </w:r>
       <w:r>
-        <w:br/>
+        <w:t xml:space="preserve"> </w:t>
       </w:r>
       <w:r>
         <w:t xml:space="preserve">Phone: 415-779-2701</w:t>
       </w:r>
       <w:r>
-        <w:br/>
+        <w:t xml:space="preserve"> </w:t>
       </w:r>
       <w:r>
         <w:t xml:space="preserve">Email:</w:t>
@@ -55,7 +55,7 @@
         </w:r>
       </w:hyperlink>
       <w:r>
-        <w:br/>
+        <w:t xml:space="preserve"> </w:t>
       </w:r>
       <w:r>
         <w:t xml:space="preserve">GitHub:</w:t>
@@ -68,11 +68,11 @@
           <w:rPr>
             <w:rStyle w:val="Hyperlink"/>
           </w:rPr>
-          <w:t xml:space="preserve">https://github.com/jacksenechal</w:t>
+          <w:t xml:space="preserve">github.com/jacksenechal</w:t>
         </w:r>
       </w:hyperlink>
       <w:r>
-        <w:br/>
+        <w:t xml:space="preserve"> </w:t>
       </w:r>
       <w:r>
         <w:t xml:space="preserve">LinkedIn:</w:t>
@@ -85,7 +85,7 @@
           <w:rPr>
             <w:rStyle w:val="Hyperlink"/>
           </w:rPr>
-          <w:t xml:space="preserve">https://linkedin.com/in/jacksenechal</w:t>
+          <w:t xml:space="preserve">linkedin.com/in/jacksenechal</w:t>
         </w:r>
       </w:hyperlink>
     </w:p>
@@ -108,27 +108,27 @@
         </w:numPr>
       </w:pPr>
       <w:r>
-        <w:t xml:space="preserve">Proven leader in software development, infrastructure, and</w:t>
-      </w:r>
-      <w:r>
-        <w:t xml:space="preserve"> </w:t>
-      </w:r>
-      <w:r>
-        <w:rPr>
-          <w:b/>
-          <w:bCs/>
-        </w:rPr>
-        <w:t xml:space="preserve">team management</w:t>
-      </w:r>
-      <w:r>
-        <w:t xml:space="preserve"> </w:t>
-      </w:r>
-      <w:r>
-        <w:t xml:space="preserve">with</w:t>
-      </w:r>
-      <w:r>
-        <w:t xml:space="preserve"> </w:t>
-      </w:r>
+        <w:rPr>
+          <w:b/>
+          <w:bCs/>
+        </w:rPr>
+        <w:t xml:space="preserve">Senior platform engineer</w:t>
+      </w:r>
+      <w:r>
+        <w:t xml:space="preserve"> </w:t>
+      </w:r>
+      <w:r>
+        <w:t xml:space="preserve">specializing in infrastructure and backend systems for AI-powered products, with deep experience deploying across multiple production environments</w:t>
+      </w:r>
+    </w:p>
+    <w:p>
+      <w:pPr>
+        <w:pStyle w:val="Compact"/>
+        <w:numPr>
+          <w:ilvl w:val="0"/>
+          <w:numId w:val="1001"/>
+        </w:numPr>
+      </w:pPr>
       <w:r>
         <w:rPr>
           <w:b/>
@@ -140,7 +140,23 @@
         <w:t xml:space="preserve"> </w:t>
       </w:r>
       <w:r>
-        <w:t xml:space="preserve">of hands-on experience</w:t>
+        <w:t xml:space="preserve">building and shipping software, with</w:t>
+      </w:r>
+      <w:r>
+        <w:t xml:space="preserve"> </w:t>
+      </w:r>
+      <w:r>
+        <w:rPr>
+          <w:b/>
+          <w:bCs/>
+        </w:rPr>
+        <w:t xml:space="preserve">6+ years leading teams</w:t>
+      </w:r>
+      <w:r>
+        <w:t xml:space="preserve"> </w:t>
+      </w:r>
+      <w:r>
+        <w:t xml:space="preserve">across platform, infrastructure, and product domains</w:t>
       </w:r>
     </w:p>
     <w:p>
@@ -152,6 +168,30 @@
         </w:numPr>
       </w:pPr>
       <w:r>
+        <w:t xml:space="preserve">Track record building repeatable, secure, and reliable deployment pipelines using Kubernetes, IaC, and cloud-native tooling</w:t>
+      </w:r>
+    </w:p>
+    <w:p>
+      <w:pPr>
+        <w:pStyle w:val="Compact"/>
+        <w:numPr>
+          <w:ilvl w:val="0"/>
+          <w:numId w:val="1001"/>
+        </w:numPr>
+      </w:pPr>
+      <w:r>
+        <w:t xml:space="preserve">Full-stack generalist with hands-on AI/LLM integration experience — from evaluation frameworks to production chatbots</w:t>
+      </w:r>
+    </w:p>
+    <w:p>
+      <w:pPr>
+        <w:pStyle w:val="Compact"/>
+        <w:numPr>
+          <w:ilvl w:val="0"/>
+          <w:numId w:val="1001"/>
+        </w:numPr>
+      </w:pPr>
+      <w:r>
         <w:t xml:space="preserve">Committed</w:t>
       </w:r>
       <w:r>
@@ -165,7 +205,10 @@
         <w:t xml:space="preserve">mentor and coach</w:t>
       </w:r>
       <w:r>
-        <w:t xml:space="preserve">, elevating team members’ skill sets and fostering professional growth</w:t>
+        <w:t xml:space="preserve"> </w:t>
+      </w:r>
+      <w:r>
+        <w:t xml:space="preserve">who elevated junior engineers to senior technical and engineering management positions</w:t>
       </w:r>
     </w:p>
     <w:p>
@@ -177,87 +220,11 @@
         </w:numPr>
       </w:pPr>
       <w:r>
-        <w:t xml:space="preserve">Strategic thinker, mercurial innovator, and expert problem solver</w:t>
-      </w:r>
-    </w:p>
-    <w:p>
-      <w:pPr>
-        <w:pStyle w:val="Compact"/>
-        <w:numPr>
-          <w:ilvl w:val="0"/>
-          <w:numId w:val="1001"/>
-        </w:numPr>
-      </w:pPr>
-      <w:r>
-        <w:t xml:space="preserve">Resilient and dedicated, ready to embrace challenges and opportunities</w:t>
-      </w:r>
-    </w:p>
-    <w:p>
-      <w:pPr>
-        <w:pStyle w:val="Compact"/>
-        <w:numPr>
-          <w:ilvl w:val="0"/>
-          <w:numId w:val="1001"/>
-        </w:numPr>
-      </w:pPr>
-      <w:r>
-        <w:t xml:space="preserve">Strong customer focus,</w:t>
-      </w:r>
-      <w:r>
-        <w:t xml:space="preserve"> </w:t>
-      </w:r>
-      <w:r>
-        <w:rPr>
-          <w:b/>
-          <w:bCs/>
-        </w:rPr>
-        <w:t xml:space="preserve">advocating for impactful changes</w:t>
-      </w:r>
-      <w:r>
-        <w:t xml:space="preserve"> </w:t>
-      </w:r>
-      <w:r>
-        <w:t xml:space="preserve">and ensuring product value</w:t>
-      </w:r>
-    </w:p>
-    <w:p>
-      <w:pPr>
-        <w:pStyle w:val="Compact"/>
-        <w:numPr>
-          <w:ilvl w:val="0"/>
-          <w:numId w:val="1001"/>
-        </w:numPr>
-      </w:pPr>
-      <w:r>
-        <w:t xml:space="preserve">Entrepreneurial spirit with multiple co-founding experiences</w:t>
-      </w:r>
-    </w:p>
-    <w:p>
-      <w:pPr>
-        <w:pStyle w:val="Compact"/>
-        <w:numPr>
-          <w:ilvl w:val="0"/>
-          <w:numId w:val="1001"/>
-        </w:numPr>
-      </w:pPr>
-      <w:r>
-        <w:t xml:space="preserve">Principal-level engineer specializing in AI-powered developer tooling, platform modernization, and large-scale engineering productivity</w:t>
-      </w:r>
-    </w:p>
-    <w:p>
-      <w:pPr>
-        <w:pStyle w:val="Compact"/>
-        <w:numPr>
-          <w:ilvl w:val="0"/>
-          <w:numId w:val="1001"/>
-        </w:numPr>
-      </w:pPr>
-      <w:r>
-        <w:t xml:space="preserve">Full-stack generalist with deep experience applying AI/LLMs, DevOps, and cloud-native systems to accelerate software delivery</w:t>
+        <w:t xml:space="preserve">Entrepreneurial spirit with multiple co-founding experiences at fast-moving startups</w:t>
       </w:r>
     </w:p>
     <w:bookmarkEnd w:id="24"/>
-    <w:bookmarkStart w:id="31" w:name="industry-experience"/>
+    <w:bookmarkStart w:id="36" w:name="industry-experience"/>
     <w:p>
       <w:pPr>
         <w:pStyle w:val="Heading2"/>
@@ -275,13 +242,13 @@
         <w:t xml:space="preserve">Technical Lead</w:t>
       </w:r>
     </w:p>
-    <w:bookmarkStart w:id="25" w:name="X75167482f34e06a01a656d1f4cef9a03bec6c7a"/>
+    <w:bookmarkStart w:id="25" w:name="X6dafa89e46c32694395442a9a6ca99eae379ab9"/>
     <w:p>
       <w:pPr>
         <w:pStyle w:val="Heading4"/>
       </w:pPr>
       <w:r>
-        <w:t xml:space="preserve">Building Humane Technology | June 2025 - Present | Remote (US)</w:t>
+        <w:t xml:space="preserve">Building Humane Technology | June 2025 - Present | Remote</w:t>
       </w:r>
     </w:p>
     <w:p>
@@ -293,7 +260,7 @@
         </w:numPr>
       </w:pPr>
       <w:r>
-        <w:t xml:space="preserve">Co-architecting and leading development of HumaneBench.ai, an open-source benchmark for evaluating AI systems against humane technology principles.</w:t>
+        <w:t xml:space="preserve">Co-architecting and leading development of HumaneBench.ai, an open-source AI evaluation framework built on AISI Inspect. Python.</w:t>
       </w:r>
     </w:p>
     <w:p>
@@ -305,7 +272,7 @@
         </w:numPr>
       </w:pPr>
       <w:r>
-        <w:t xml:space="preserve">Developing an extensible AI evaluation framework built on AISI Inspect, focused on measuring and improving LLM behavior in real-world developer and operational workflows.</w:t>
+        <w:t xml:space="preserve">Developing extensible evaluation tooling focused on measuring and improving LLM behavior in real-world developer and operational workflows.</w:t>
       </w:r>
     </w:p>
     <w:p>
@@ -317,51 +284,27 @@
         </w:numPr>
       </w:pPr>
       <w:r>
-        <w:t xml:space="preserve">Shaping product and technical roadmap for AI-driven tooling, including production monitoring concepts, multi-turn evaluation, and maturity models to support adoption, measurement, and continuous improvement.</w:t>
-      </w:r>
-    </w:p>
-    <w:p>
-      <w:pPr>
-        <w:pStyle w:val="Compact"/>
-        <w:numPr>
-          <w:ilvl w:val="0"/>
-          <w:numId w:val="1002"/>
-        </w:numPr>
-      </w:pPr>
-      <w:r>
-        <w:t xml:space="preserve">Contributing to education initiatives including Humane Tech and Agentic AI training for the UN Secretariat and broader developer community, plus coordinating hackathons and public AMAs.</w:t>
-      </w:r>
-    </w:p>
-    <w:p>
-      <w:pPr>
-        <w:pStyle w:val="Compact"/>
-        <w:numPr>
-          <w:ilvl w:val="0"/>
-          <w:numId w:val="1002"/>
-        </w:numPr>
-      </w:pPr>
-      <w:r>
-        <w:t xml:space="preserve">Building partnerships and fostering open-source community engagement around humane AI evaluation standards.</w:t>
+        <w:t xml:space="preserve">Shaping product and technical roadmap for AI-driven tooling, including production monitoring, multi-turn evaluation, and maturity models for adoption and continuous improvement.</w:t>
       </w:r>
     </w:p>
     <w:bookmarkEnd w:id="25"/>
     <w:bookmarkEnd w:id="26"/>
-    <w:bookmarkStart w:id="28" w:name="infrastructure-engineer"/>
+    <w:bookmarkStart w:id="28" w:name="co-founder-lead-developer"/>
     <w:p>
       <w:pPr>
         <w:pStyle w:val="Heading3"/>
       </w:pPr>
       <w:r>
-        <w:t xml:space="preserve">Infrastructure Engineer</w:t>
-      </w:r>
-    </w:p>
-    <w:bookmarkStart w:id="27" w:name="tobiko-mar-2024---oct-2024-remote-us"/>
+        <w:t xml:space="preserve">Co-founder &amp; Lead Developer</w:t>
+      </w:r>
+    </w:p>
+    <w:bookmarkStart w:id="27" w:name="Xffd4b369c0bcf0f7e3f28f0e84324bac520d95a"/>
     <w:p>
       <w:pPr>
         <w:pStyle w:val="Heading4"/>
       </w:pPr>
       <w:r>
-        <w:t xml:space="preserve">Tobiko | Mar 2024 - Oct 2024 | Remote (US)</w:t>
+        <w:t xml:space="preserve">Mirror Astrology | Nov 2024 - Present | Remote</w:t>
       </w:r>
     </w:p>
     <w:p>
@@ -373,7 +316,7 @@
         </w:numPr>
       </w:pPr>
       <w:r>
-        <w:t xml:space="preserve">Collaborated with a fast-paced team to architect and implement a robust, scalable, modern cloud platform serving customer workloads.</w:t>
+        <w:t xml:space="preserve">Owned the entire frontend: Ruby on Rails views, JavaScript, HTML+CSS, Tailwind, responsive UI/UX. Contributed to backend development.</w:t>
       </w:r>
     </w:p>
     <w:p>
@@ -385,7 +328,7 @@
         </w:numPr>
       </w:pPr>
       <w:r>
-        <w:t xml:space="preserve">Built out CI/CD patterns including mono-repo conditional workflows, workload identity federation, and continuous delivery.</w:t>
+        <w:t xml:space="preserve">Built AI chatbot integrating multiple LLMs with complex prompting, tool use, and context augmentation.</w:t>
       </w:r>
     </w:p>
     <w:p>
@@ -397,39 +340,27 @@
         </w:numPr>
       </w:pPr>
       <w:r>
-        <w:t xml:space="preserve">Implemented a Slack-based customer support and incident response platform, and onboarded teammates and customers.</w:t>
-      </w:r>
-    </w:p>
-    <w:p>
-      <w:pPr>
-        <w:pStyle w:val="Compact"/>
-        <w:numPr>
-          <w:ilvl w:val="0"/>
-          <w:numId w:val="1003"/>
-        </w:numPr>
-      </w:pPr>
-      <w:r>
-        <w:t xml:space="preserve">Python, Pulumi, Google Cloud Platform, Google Kubernetes Engine, Google Cloud Run, CI/CD with CircleCI, Helm, SQLMesh.</w:t>
+        <w:t xml:space="preserve">Collaborated closely with co-founders on product direction, Figma design, UX, roadmap planning, and prioritization.</w:t>
       </w:r>
     </w:p>
     <w:bookmarkEnd w:id="27"/>
     <w:bookmarkEnd w:id="28"/>
-    <w:bookmarkStart w:id="30" w:name="X7a2c313efdde198d901363c762c81839771c845"/>
+    <w:bookmarkStart w:id="30" w:name="infrastructure-engineer"/>
     <w:p>
       <w:pPr>
         <w:pStyle w:val="Heading3"/>
       </w:pPr>
       <w:r>
-        <w:t xml:space="preserve">Engineering Manager / Principal Software Engineer</w:t>
-      </w:r>
-    </w:p>
-    <w:bookmarkStart w:id="29" w:name="X47289269eb944414c9285d314973b45c253bcef"/>
+        <w:t xml:space="preserve">Infrastructure Engineer</w:t>
+      </w:r>
+    </w:p>
+    <w:bookmarkStart w:id="29" w:name="tobiko-mar-2024---oct-2024-remote"/>
     <w:p>
       <w:pPr>
         <w:pStyle w:val="Heading4"/>
       </w:pPr>
       <w:r>
-        <w:t xml:space="preserve">Mavenlink / Kantata | Apr 2017 - Dec 2023 | San Francisco, CA</w:t>
+        <w:t xml:space="preserve">Tobiko | Mar 2024 - Oct 2024 | Remote</w:t>
       </w:r>
     </w:p>
     <w:p>
@@ -441,14 +372,7 @@
         </w:numPr>
       </w:pPr>
       <w:r>
-        <w:rPr>
-          <w:b/>
-          <w:bCs/>
-        </w:rPr>
-        <w:t xml:space="preserve">Operations Team Leadership</w:t>
-      </w:r>
-      <w:r>
-        <w:t xml:space="preserve">: Over four years, recruited and led a new infrastructure team dedicated to building and scaling the platform. Instrumental in leading the organization’s transition towards a DevOps culture, serving as a change agent and technical authority across engineering. Created a clear, calm, and constructive environment that allowed the team to thrive. Responsible for roadmap stewardship, untangling requirements, and arranging priorities to maximize flow. Transitioned a large legacy infrastructure codebase to cutting-edge, cloud-native, IAC-oriented tools while remaining hands-on with coding, architecture, and collaboration on mission-critical projects.</w:t>
+        <w:t xml:space="preserve">Architected and implemented a scalable cloud platform serving customer workloads across multiple production environments at a fast-paced startup.</w:t>
       </w:r>
     </w:p>
     <w:p>
@@ -460,14 +384,7 @@
         </w:numPr>
       </w:pPr>
       <w:r>
-        <w:rPr>
-          <w:b/>
-          <w:bCs/>
-        </w:rPr>
-        <w:t xml:space="preserve">M-Bridge Platform Leadership</w:t>
-      </w:r>
-      <w:r>
-        <w:t xml:space="preserve">: For two years, spearheaded a team to stabilize and enhance an agent-based integration platform. Established operational metrics and monitoring systems that reduced platform errors and incidents by approximately 100x. Successfully performed a migration to Kubernetes with zero downtime, including relational, document, and cache databases. Demonstrated ability to measure impact and drive data-informed decisions.</w:t>
+        <w:t xml:space="preserve">Built repeatable CI/CD patterns including mono-repo conditional workflows, workload identity federation, and continuous delivery pipelines.</w:t>
       </w:r>
     </w:p>
     <w:p>
@@ -479,14 +396,7 @@
         </w:numPr>
       </w:pPr>
       <w:r>
-        <w:rPr>
-          <w:b/>
-          <w:bCs/>
-        </w:rPr>
-        <w:t xml:space="preserve">Insights Platform Leadership</w:t>
-      </w:r>
-      <w:r>
-        <w:t xml:space="preserve">: For three months, led a transition team responsible for overseeing and improving the BI data pipeline. Successfully migrated the pipeline to Kubernetes, accelerating modernization initiatives.</w:t>
+        <w:t xml:space="preserve">Designed infrastructure for secure multi-tenant deployments with environment isolation and automated provisioning.</w:t>
       </w:r>
     </w:p>
     <w:p>
@@ -498,207 +408,204 @@
         </w:numPr>
       </w:pPr>
       <w:r>
-        <w:rPr>
-          <w:b/>
-          <w:bCs/>
-        </w:rPr>
-        <w:t xml:space="preserve">Cross-Functional Leadership &amp; Organizational Impact</w:t>
-      </w:r>
-      <w:r>
-        <w:t xml:space="preserve">: Took on organization-wide roles including mentorship and coaching, interviewing and hiring, and organizational change management and process optimization. Influenced decisions at all levels and promoted best practices across the engineering organization. Recognized with Top Performer Award in 2021 for contributions to technical excellence and team development.</w:t>
+        <w:t xml:space="preserve">Implemented a Slack-based customer support and incident response platform; onboarded teammates and customers.</w:t>
+      </w:r>
+    </w:p>
+    <w:p>
+      <w:pPr>
+        <w:pStyle w:val="Compact"/>
+        <w:numPr>
+          <w:ilvl w:val="0"/>
+          <w:numId w:val="1004"/>
+        </w:numPr>
+      </w:pPr>
+      <w:r>
+        <w:t xml:space="preserve">Python, Pulumi, GCP, GKE, Cloud Run, CircleCI, Helm, SQLMesh.</w:t>
       </w:r>
     </w:p>
     <w:bookmarkEnd w:id="29"/>
     <w:bookmarkEnd w:id="30"/>
+    <w:bookmarkStart w:id="32" w:name="X7a2c313efdde198d901363c762c81839771c845"/>
+    <w:p>
+      <w:pPr>
+        <w:pStyle w:val="Heading3"/>
+      </w:pPr>
+      <w:r>
+        <w:t xml:space="preserve">Engineering Manager / Principal Software Engineer</w:t>
+      </w:r>
+    </w:p>
+    <w:bookmarkStart w:id="31" w:name="X47289269eb944414c9285d314973b45c253bcef"/>
+    <w:p>
+      <w:pPr>
+        <w:pStyle w:val="Heading4"/>
+      </w:pPr>
+      <w:r>
+        <w:t xml:space="preserve">Mavenlink / Kantata | Apr 2017 - Dec 2023 | San Francisco, CA</w:t>
+      </w:r>
+    </w:p>
+    <w:p>
+      <w:pPr>
+        <w:pStyle w:val="Compact"/>
+        <w:numPr>
+          <w:ilvl w:val="0"/>
+          <w:numId w:val="1005"/>
+        </w:numPr>
+      </w:pPr>
+      <w:r>
+        <w:rPr>
+          <w:b/>
+          <w:bCs/>
+        </w:rPr>
+        <w:t xml:space="preserve">Infrastructure Platform</w:t>
+      </w:r>
+      <w:r>
+        <w:t xml:space="preserve"> </w:t>
+      </w:r>
+      <w:r>
+        <w:t xml:space="preserve">(4 years): Recruited and built a new team from scratch dedicated to the infrastructure platform. Led the organization’s DevOps culture transformation, serving as a change agent and technical authority across engineering. Transitioned a large legacy codebase to cloud-native, Infrastructure-as-Code tooling (Terraform, Ansible, Kubernetes). Designed repeatable deployment pipelines serving multiple production environments with security and reliability as first-class concerns.</w:t>
+      </w:r>
+    </w:p>
+    <w:p>
+      <w:pPr>
+        <w:pStyle w:val="Compact"/>
+        <w:numPr>
+          <w:ilvl w:val="0"/>
+          <w:numId w:val="1005"/>
+        </w:numPr>
+      </w:pPr>
+      <w:r>
+        <w:rPr>
+          <w:b/>
+          <w:bCs/>
+        </w:rPr>
+        <w:t xml:space="preserve">M-Bridge Integration Platform</w:t>
+      </w:r>
+      <w:r>
+        <w:t xml:space="preserve"> </w:t>
+      </w:r>
+      <w:r>
+        <w:t xml:space="preserve">(2 years): Led a team to stabilize and scale an agent-based integration platform handling multi-system data orchestration. Established operational metrics and monitoring that reduced errors and incidents by ~100x. Executed a zero-downtime migration to Kubernetes including relational, document, and cache databases.</w:t>
+      </w:r>
+    </w:p>
+    <w:p>
+      <w:pPr>
+        <w:pStyle w:val="Compact"/>
+        <w:numPr>
+          <w:ilvl w:val="0"/>
+          <w:numId w:val="1005"/>
+        </w:numPr>
+      </w:pPr>
+      <w:r>
+        <w:rPr>
+          <w:b/>
+          <w:bCs/>
+        </w:rPr>
+        <w:t xml:space="preserve">BI Data Pipeline</w:t>
+      </w:r>
+      <w:r>
+        <w:t xml:space="preserve"> </w:t>
+      </w:r>
+      <w:r>
+        <w:t xml:space="preserve">(3 months): Led a transition team to take ownership of and improve the analytics data pipeline. Migrated the pipeline to Kubernetes.</w:t>
+      </w:r>
+    </w:p>
+    <w:p>
+      <w:pPr>
+        <w:pStyle w:val="Compact"/>
+        <w:numPr>
+          <w:ilvl w:val="0"/>
+          <w:numId w:val="1005"/>
+        </w:numPr>
+      </w:pPr>
+      <w:r>
+        <w:rPr>
+          <w:b/>
+          <w:bCs/>
+        </w:rPr>
+        <w:t xml:space="preserve">Cross-Functional Impact</w:t>
+      </w:r>
+      <w:r>
+        <w:t xml:space="preserve">: Mentored engineers across teams — notably coached a junior engineer who grew to Engineering Manager. Led interviewing and hiring. Drove organizational change management and process optimization.</w:t>
+      </w:r>
+      <w:r>
+        <w:t xml:space="preserve"> </w:t>
+      </w:r>
+      <w:r>
+        <w:rPr>
+          <w:b/>
+          <w:bCs/>
+        </w:rPr>
+        <w:t xml:space="preserve">Top Performer Award, 2021</w:t>
+      </w:r>
+      <w:r>
+        <w:t xml:space="preserve">.</w:t>
+      </w:r>
+    </w:p>
     <w:bookmarkEnd w:id="31"/>
-    <w:bookmarkStart w:id="36" w:name="skills"/>
-    <w:p>
-      <w:pPr>
-        <w:pStyle w:val="Heading2"/>
-      </w:pPr>
-      <w:r>
-        <w:t xml:space="preserve">Skills</w:t>
-      </w:r>
-    </w:p>
-    <w:bookmarkStart w:id="32" w:name="technical-skills"/>
+    <w:bookmarkEnd w:id="32"/>
+    <w:bookmarkStart w:id="34" w:name="lead-developer-co-founder"/>
     <w:p>
       <w:pPr>
         <w:pStyle w:val="Heading3"/>
       </w:pPr>
       <w:r>
-        <w:t xml:space="preserve">Technical Skills</w:t>
-      </w:r>
-    </w:p>
-    <w:p>
-      <w:pPr>
-        <w:pStyle w:val="Compact"/>
-        <w:numPr>
-          <w:ilvl w:val="0"/>
-          <w:numId w:val="1005"/>
-        </w:numPr>
-      </w:pPr>
-      <w:r>
-        <w:rPr>
-          <w:b/>
-          <w:bCs/>
-        </w:rPr>
-        <w:t xml:space="preserve">Languages &amp; Frameworks</w:t>
-      </w:r>
-      <w:r>
-        <w:t xml:space="preserve">: Ruby on Rails, Python, Node.js, JavaScript, TypeScript, Bash.</w:t>
-      </w:r>
-    </w:p>
-    <w:p>
-      <w:pPr>
-        <w:pStyle w:val="Compact"/>
-        <w:numPr>
-          <w:ilvl w:val="0"/>
-          <w:numId w:val="1005"/>
-        </w:numPr>
-      </w:pPr>
-      <w:r>
-        <w:rPr>
-          <w:b/>
-          <w:bCs/>
-        </w:rPr>
-        <w:t xml:space="preserve">AI/LLM Development</w:t>
-      </w:r>
-      <w:r>
-        <w:t xml:space="preserve">: MCP (Model Context Protocol), chatbot development, prompt engineering, tool use, context augmentation, AI-assisted developer workflows.</w:t>
-      </w:r>
-    </w:p>
-    <w:p>
-      <w:pPr>
-        <w:pStyle w:val="Compact"/>
-        <w:numPr>
-          <w:ilvl w:val="0"/>
-          <w:numId w:val="1005"/>
-        </w:numPr>
-      </w:pPr>
-      <w:r>
-        <w:rPr>
-          <w:b/>
-          <w:bCs/>
-        </w:rPr>
-        <w:t xml:space="preserve">Databases</w:t>
-      </w:r>
-      <w:r>
-        <w:t xml:space="preserve">: MySQL, PostgreSQL, MongoDB, Redis, Cloud-based data services.</w:t>
-      </w:r>
-    </w:p>
-    <w:p>
-      <w:pPr>
-        <w:pStyle w:val="Compact"/>
-        <w:numPr>
-          <w:ilvl w:val="0"/>
-          <w:numId w:val="1005"/>
-        </w:numPr>
-      </w:pPr>
-      <w:r>
-        <w:rPr>
-          <w:b/>
-          <w:bCs/>
-        </w:rPr>
-        <w:t xml:space="preserve">Tools &amp; Platforms</w:t>
-      </w:r>
-      <w:r>
-        <w:t xml:space="preserve">: Kubernetes, AWS (Amazon Web Services), Google Cloud Platform, CircleCI, GitHub Actions, Terraform, Ansible, Pulumi, Linux, Git, Webpack, Cloudfront, Helm.</w:t>
-      </w:r>
-    </w:p>
-    <w:p>
-      <w:pPr>
-        <w:pStyle w:val="Compact"/>
-        <w:numPr>
-          <w:ilvl w:val="0"/>
-          <w:numId w:val="1005"/>
-        </w:numPr>
-      </w:pPr>
-      <w:r>
-        <w:rPr>
-          <w:b/>
-          <w:bCs/>
-        </w:rPr>
-        <w:t xml:space="preserve">Web Technologies</w:t>
-      </w:r>
-      <w:r>
-        <w:t xml:space="preserve">: HTML, CSS, Tailwind, Front-end Development, Responsive Design, Back-end Development, Distributed Systems, Web3/DWeb, Decentralized Technologies.</w:t>
-      </w:r>
-    </w:p>
-    <w:p>
-      <w:pPr>
-        <w:pStyle w:val="Compact"/>
-        <w:numPr>
-          <w:ilvl w:val="0"/>
-          <w:numId w:val="1005"/>
-        </w:numPr>
-      </w:pPr>
-      <w:r>
-        <w:rPr>
-          <w:b/>
-          <w:bCs/>
-        </w:rPr>
-        <w:t xml:space="preserve">Software Development</w:t>
-      </w:r>
-      <w:r>
-        <w:t xml:space="preserve">: Object-oriented programming (OOP), Functional Programming, API Design and Development, Automated Testing, Continuous Integration, Continuous Deployment, CI/CD, System Architecture, Microservices.</w:t>
-      </w:r>
-    </w:p>
-    <w:bookmarkEnd w:id="32"/>
-    <w:bookmarkStart w:id="33" w:name="methodologies"/>
+        <w:t xml:space="preserve">Lead Developer, Co-founder</w:t>
+      </w:r>
+    </w:p>
+    <w:bookmarkStart w:id="33" w:name="pegg-2014---2017-san-francisco-ca"/>
+    <w:p>
+      <w:pPr>
+        <w:pStyle w:val="Heading4"/>
+      </w:pPr>
+      <w:r>
+        <w:t xml:space="preserve">Pegg | 2014 - 2017 | San Francisco, CA</w:t>
+      </w:r>
+    </w:p>
+    <w:p>
+      <w:pPr>
+        <w:pStyle w:val="Compact"/>
+        <w:numPr>
+          <w:ilvl w:val="0"/>
+          <w:numId w:val="1006"/>
+        </w:numPr>
+      </w:pPr>
+      <w:r>
+        <w:t xml:space="preserve">Designed, architected, and built a cross-platform mobile app from scratch (iOS/Android). Node.js backend, JS/Phonegap frontend, Firebase real-time systems, CI/CD to AWS/CloudFront via CircleCI.</w:t>
+      </w:r>
+    </w:p>
+    <w:p>
+      <w:pPr>
+        <w:pStyle w:val="Compact"/>
+        <w:numPr>
+          <w:ilvl w:val="0"/>
+          <w:numId w:val="1006"/>
+        </w:numPr>
+      </w:pPr>
+      <w:r>
+        <w:t xml:space="preserve">Established engineering workflow: pair programming, automated testing (Karma/Chai), continuous integration, and rapid deployment processes.</w:t>
+      </w:r>
+    </w:p>
+    <w:p>
+      <w:pPr>
+        <w:pStyle w:val="Compact"/>
+        <w:numPr>
+          <w:ilvl w:val="0"/>
+          <w:numId w:val="1006"/>
+        </w:numPr>
+      </w:pPr>
+      <w:r>
+        <w:t xml:space="preserve">Co-led product strategy, monetization, and launch planning.</w:t>
+      </w:r>
+    </w:p>
+    <w:bookmarkEnd w:id="33"/>
+    <w:bookmarkEnd w:id="34"/>
+    <w:bookmarkStart w:id="35" w:name="earlier-career-2001---2014"/>
     <w:p>
       <w:pPr>
         <w:pStyle w:val="Heading3"/>
       </w:pPr>
       <w:r>
-        <w:t xml:space="preserve">Methodologies</w:t>
-      </w:r>
-    </w:p>
-    <w:p>
-      <w:pPr>
-        <w:pStyle w:val="Compact"/>
-        <w:numPr>
-          <w:ilvl w:val="0"/>
-          <w:numId w:val="1006"/>
-        </w:numPr>
-      </w:pPr>
-      <w:r>
-        <w:rPr>
-          <w:b/>
-          <w:bCs/>
-        </w:rPr>
-        <w:t xml:space="preserve">Project Management</w:t>
-      </w:r>
-      <w:r>
-        <w:t xml:space="preserve">: Agile, Pair Programming, Test-Driven Development (TDD), DevOps, Lean Thinking, Rapid Prototyping, Scrum, Kanban.</w:t>
-      </w:r>
-    </w:p>
-    <w:p>
-      <w:pPr>
-        <w:pStyle w:val="Compact"/>
-        <w:numPr>
-          <w:ilvl w:val="0"/>
-          <w:numId w:val="1006"/>
-        </w:numPr>
-      </w:pPr>
-      <w:r>
-        <w:rPr>
-          <w:b/>
-          <w:bCs/>
-        </w:rPr>
-        <w:t xml:space="preserve">Design &amp; Architecture</w:t>
-      </w:r>
-      <w:r>
-        <w:t xml:space="preserve">: Software Design Patterns, Systems Design, Infrastructure as Code (IAC), Data Pipeline Design, Cloud-Native Architecture, User Interface Design.</w:t>
-      </w:r>
-    </w:p>
-    <w:bookmarkEnd w:id="33"/>
-    <w:bookmarkStart w:id="34" w:name="organizational-soft-skills"/>
-    <w:p>
-      <w:pPr>
-        <w:pStyle w:val="Heading3"/>
-      </w:pPr>
-      <w:r>
-        <w:t xml:space="preserve">Organizational &amp; Soft Skills</w:t>
+        <w:t xml:space="preserve">Earlier Career (2001 - 2014)</w:t>
       </w:r>
     </w:p>
     <w:p>
@@ -714,10 +621,13 @@
           <w:b/>
           <w:bCs/>
         </w:rPr>
-        <w:t xml:space="preserve">Leadership &amp; Management</w:t>
-      </w:r>
-      <w:r>
-        <w:t xml:space="preserve">: Team Building, Cross-Functional Leadership, Coaching &amp; Mentoring, Talent Recruitment &amp; Development, High-Performance Team Management, Strategic Planning, Decision Making, Change Management.</w:t>
+        <w:t xml:space="preserve">Consultant &amp; Entrepreneur</w:t>
+      </w:r>
+      <w:r>
+        <w:t xml:space="preserve"> </w:t>
+      </w:r>
+      <w:r>
+        <w:t xml:space="preserve">(2008 - 2014): Founded OpenTest Pro (automated testing education). Built e-commerce ordering system for Turnbull &amp; Asser shirtmakers. Full-stack consulting in Ruby on Rails, Node.js, D3 data visualization. Rapid prototyping and client delivery.</w:t>
       </w:r>
     </w:p>
     <w:p>
@@ -733,10 +643,13 @@
           <w:b/>
           <w:bCs/>
         </w:rPr>
-        <w:t xml:space="preserve">Communication &amp; Collaboration</w:t>
-      </w:r>
-      <w:r>
-        <w:t xml:space="preserve">: Effective Communication, Stakeholder Engagement, Negotiation, Problem-Solving, Conflict Resolution, Customer-Oriented Approach.</w:t>
+        <w:t xml:space="preserve">Web Developer, OnForce, Inc</w:t>
+      </w:r>
+      <w:r>
+        <w:t xml:space="preserve"> </w:t>
+      </w:r>
+      <w:r>
+        <w:t xml:space="preserve">(2006 - 2007): Introduced automated testing and CI. Built comprehensive API test suite. Integrated platform with Salesforce APIs.</w:t>
       </w:r>
     </w:p>
     <w:p>
@@ -752,143 +665,32 @@
           <w:b/>
           <w:bCs/>
         </w:rPr>
-        <w:t xml:space="preserve">Innovation &amp; Creativity</w:t>
-      </w:r>
-      <w:r>
-        <w:t xml:space="preserve">: Entrepreneurship, Creative Problem Solving, Product Development and Innovation, Adaptive Learning, Forward-Thinking.</w:t>
-      </w:r>
-    </w:p>
-    <w:bookmarkEnd w:id="34"/>
-    <w:bookmarkStart w:id="35" w:name="additional-competencies"/>
-    <w:p>
-      <w:pPr>
-        <w:pStyle w:val="Heading3"/>
-      </w:pPr>
-      <w:r>
-        <w:t xml:space="preserve">Additional Competencies</w:t>
-      </w:r>
-    </w:p>
-    <w:p>
-      <w:pPr>
-        <w:pStyle w:val="Compact"/>
-        <w:numPr>
-          <w:ilvl w:val="0"/>
-          <w:numId w:val="1008"/>
-        </w:numPr>
-      </w:pPr>
-      <w:r>
-        <w:rPr>
-          <w:b/>
-          <w:bCs/>
-        </w:rPr>
-        <w:t xml:space="preserve">Industry Knowledge</w:t>
-      </w:r>
-      <w:r>
-        <w:t xml:space="preserve">: Software Engineering, Web Development, Cloud Computing, AI/ML Development, Startup Ecosystem, SaaS, PaaS, B2B Software, Humane Technology.</w:t>
-      </w:r>
-    </w:p>
-    <w:p>
-      <w:pPr>
-        <w:pStyle w:val="Compact"/>
-        <w:numPr>
-          <w:ilvl w:val="0"/>
-          <w:numId w:val="1008"/>
-        </w:numPr>
-      </w:pPr>
-      <w:r>
-        <w:rPr>
-          <w:b/>
-          <w:bCs/>
-        </w:rPr>
-        <w:t xml:space="preserve">Personal Attributes</w:t>
-      </w:r>
-      <w:r>
-        <w:t xml:space="preserve">: Resilient, Innovative, Dedicated, Entrepreneurial, Strategic Thinker, Out of the Box Thinker, Detail-Oriented, Analytical, Kind and Compassionate, Truth Seeker.</w:t>
+        <w:t xml:space="preserve">Development Lead, JBA Network</w:t>
+      </w:r>
+      <w:r>
+        <w:t xml:space="preserve"> </w:t>
+      </w:r>
+      <w:r>
+        <w:t xml:space="preserve">(2003 - 2006): Lead programmer and project manager for mynewsletterbuilder.com — architected initial release, then built and scaled the development team.</w:t>
       </w:r>
     </w:p>
     <w:bookmarkEnd w:id="35"/>
     <w:bookmarkEnd w:id="36"/>
-    <w:bookmarkStart w:id="39" w:name="education"/>
+    <w:bookmarkStart w:id="41" w:name="open-source-projects"/>
     <w:p>
       <w:pPr>
         <w:pStyle w:val="Heading2"/>
       </w:pPr>
       <w:r>
-        <w:t xml:space="preserve">Education</w:t>
-      </w:r>
-    </w:p>
-    <w:bookmarkStart w:id="38" w:name="bachelor-of-arts-in-mathematics"/>
+        <w:t xml:space="preserve">Open Source Projects</w:t>
+      </w:r>
+    </w:p>
+    <w:bookmarkStart w:id="38" w:name="scan-mcp-2024---present"/>
     <w:p>
       <w:pPr>
         <w:pStyle w:val="Heading3"/>
       </w:pPr>
       <w:r>
-        <w:t xml:space="preserve">Bachelor of Arts in Mathematics</w:t>
-      </w:r>
-    </w:p>
-    <w:bookmarkStart w:id="37" w:name="Xe220d86d70cd5bf8ee7040adf9411d63a6235ab"/>
-    <w:p>
-      <w:pPr>
-        <w:pStyle w:val="Heading4"/>
-      </w:pPr>
-      <w:r>
-        <w:t xml:space="preserve">University of North Carolina at Asheville | May 2003</w:t>
-      </w:r>
-    </w:p>
-    <w:p>
-      <w:pPr>
-        <w:pStyle w:val="Compact"/>
-        <w:numPr>
-          <w:ilvl w:val="0"/>
-          <w:numId w:val="1009"/>
-        </w:numPr>
-      </w:pPr>
-      <w:r>
-        <w:t xml:space="preserve">Minor in Computer Science.</w:t>
-      </w:r>
-    </w:p>
-    <w:p>
-      <w:pPr>
-        <w:pStyle w:val="Compact"/>
-        <w:numPr>
-          <w:ilvl w:val="0"/>
-          <w:numId w:val="1009"/>
-        </w:numPr>
-      </w:pPr>
-      <w:r>
-        <w:t xml:space="preserve">Graduated with distinction in Mathematics.</w:t>
-      </w:r>
-    </w:p>
-    <w:p>
-      <w:pPr>
-        <w:pStyle w:val="Compact"/>
-        <w:numPr>
-          <w:ilvl w:val="0"/>
-          <w:numId w:val="1009"/>
-        </w:numPr>
-      </w:pPr>
-      <w:r>
-        <w:t xml:space="preserve">Undergraduate research in 4D fractals.</w:t>
-      </w:r>
-    </w:p>
-    <w:bookmarkEnd w:id="37"/>
-    <w:bookmarkEnd w:id="38"/>
-    <w:bookmarkEnd w:id="39"/>
-    <w:bookmarkStart w:id="44" w:name="open-source-projects"/>
-    <w:p>
-      <w:pPr>
-        <w:pStyle w:val="Heading2"/>
-      </w:pPr>
-      <w:r>
-        <w:t xml:space="preserve">Open Source Projects</w:t>
-      </w:r>
-    </w:p>
-    <w:bookmarkStart w:id="41" w:name="scan-mcp-2024---present"/>
-    <w:p>
-      <w:pPr>
-        <w:pStyle w:val="Heading3"/>
-      </w:pPr>
-      <w:r>
         <w:t xml:space="preserve">Scan MCP (2024 - Present)</w:t>
       </w:r>
     </w:p>
@@ -904,7 +706,7 @@
       <w:pPr>
         <w:pStyle w:val="BodyText"/>
       </w:pPr>
-      <w:hyperlink r:id="rId40">
+      <w:hyperlink r:id="rId37">
         <w:r>
           <w:rPr>
             <w:rStyle w:val="Hyperlink"/>
@@ -913,8 +715,8 @@
         </w:r>
       </w:hyperlink>
     </w:p>
-    <w:bookmarkEnd w:id="41"/>
-    <w:bookmarkStart w:id="43" w:name="humanebench-2024---present"/>
+    <w:bookmarkEnd w:id="38"/>
+    <w:bookmarkStart w:id="40" w:name="humanebench-2024---present"/>
     <w:p>
       <w:pPr>
         <w:pStyle w:val="Heading3"/>
@@ -935,7 +737,7 @@
       <w:pPr>
         <w:pStyle w:val="BodyText"/>
       </w:pPr>
-      <w:hyperlink r:id="rId42">
+      <w:hyperlink r:id="rId39">
         <w:r>
           <w:rPr>
             <w:rStyle w:val="Hyperlink"/>
@@ -944,9 +746,194 @@
         </w:r>
       </w:hyperlink>
     </w:p>
+    <w:bookmarkEnd w:id="40"/>
+    <w:bookmarkEnd w:id="41"/>
+    <w:bookmarkStart w:id="42" w:name="skills"/>
+    <w:p>
+      <w:pPr>
+        <w:pStyle w:val="Heading2"/>
+      </w:pPr>
+      <w:r>
+        <w:t xml:space="preserve">Skills</w:t>
+      </w:r>
+    </w:p>
+    <w:p>
+      <w:pPr>
+        <w:pStyle w:val="Compact"/>
+        <w:numPr>
+          <w:ilvl w:val="0"/>
+          <w:numId w:val="1008"/>
+        </w:numPr>
+      </w:pPr>
+      <w:r>
+        <w:rPr>
+          <w:b/>
+          <w:bCs/>
+        </w:rPr>
+        <w:t xml:space="preserve">Languages &amp; Frameworks</w:t>
+      </w:r>
+      <w:r>
+        <w:t xml:space="preserve">: JavaScript, TypeScript, Python, Ruby on Rails, Node.js, Bash.</w:t>
+      </w:r>
+    </w:p>
+    <w:p>
+      <w:pPr>
+        <w:pStyle w:val="Compact"/>
+        <w:numPr>
+          <w:ilvl w:val="0"/>
+          <w:numId w:val="1008"/>
+        </w:numPr>
+      </w:pPr>
+      <w:r>
+        <w:rPr>
+          <w:b/>
+          <w:bCs/>
+        </w:rPr>
+        <w:t xml:space="preserve">Front-end</w:t>
+      </w:r>
+      <w:r>
+        <w:t xml:space="preserve">: React, Vue, HTML, CSS, Tailwind, Responsive Design, UI/UX.</w:t>
+      </w:r>
+    </w:p>
+    <w:p>
+      <w:pPr>
+        <w:pStyle w:val="Compact"/>
+        <w:numPr>
+          <w:ilvl w:val="0"/>
+          <w:numId w:val="1008"/>
+        </w:numPr>
+      </w:pPr>
+      <w:r>
+        <w:rPr>
+          <w:b/>
+          <w:bCs/>
+        </w:rPr>
+        <w:t xml:space="preserve">Back-end &amp; Data</w:t>
+      </w:r>
+      <w:r>
+        <w:t xml:space="preserve">: API Design, Microservices, Distributed Systems, PostgreSQL, MySQL, MongoDB, Redis.</w:t>
+      </w:r>
+    </w:p>
+    <w:p>
+      <w:pPr>
+        <w:pStyle w:val="Compact"/>
+        <w:numPr>
+          <w:ilvl w:val="0"/>
+          <w:numId w:val="1008"/>
+        </w:numPr>
+      </w:pPr>
+      <w:r>
+        <w:rPr>
+          <w:b/>
+          <w:bCs/>
+        </w:rPr>
+        <w:t xml:space="preserve">Cloud &amp; Infrastructure</w:t>
+      </w:r>
+      <w:r>
+        <w:t xml:space="preserve">: AWS, Google Cloud Platform, Kubernetes, Docker, Terraform, Ansible, Pulumi, Helm, Multi-Environment Deployment, Security &amp; Compliance.</w:t>
+      </w:r>
+    </w:p>
+    <w:p>
+      <w:pPr>
+        <w:pStyle w:val="Compact"/>
+        <w:numPr>
+          <w:ilvl w:val="0"/>
+          <w:numId w:val="1008"/>
+        </w:numPr>
+      </w:pPr>
+      <w:r>
+        <w:rPr>
+          <w:b/>
+          <w:bCs/>
+        </w:rPr>
+        <w:t xml:space="preserve">CI/CD &amp; DevOps</w:t>
+      </w:r>
+      <w:r>
+        <w:t xml:space="preserve">: CircleCI, GitHub Actions, Automated Testing, TDD, Infrastructure as Code, Cloud-Native Architecture, Continuous Delivery.</w:t>
+      </w:r>
+    </w:p>
+    <w:p>
+      <w:pPr>
+        <w:pStyle w:val="Compact"/>
+        <w:numPr>
+          <w:ilvl w:val="0"/>
+          <w:numId w:val="1008"/>
+        </w:numPr>
+      </w:pPr>
+      <w:r>
+        <w:rPr>
+          <w:b/>
+          <w:bCs/>
+        </w:rPr>
+        <w:t xml:space="preserve">AI/LLM</w:t>
+      </w:r>
+      <w:r>
+        <w:t xml:space="preserve">: MCP (Model Context Protocol), LLM integration, prompt engineering, tool use, AI evaluation frameworks, production AI systems.</w:t>
+      </w:r>
+    </w:p>
+    <w:p>
+      <w:pPr>
+        <w:pStyle w:val="Compact"/>
+        <w:numPr>
+          <w:ilvl w:val="0"/>
+          <w:numId w:val="1008"/>
+        </w:numPr>
+      </w:pPr>
+      <w:r>
+        <w:rPr>
+          <w:b/>
+          <w:bCs/>
+        </w:rPr>
+        <w:t xml:space="preserve">Leadership</w:t>
+      </w:r>
+      <w:r>
+        <w:t xml:space="preserve">: Team Building, Coaching &amp; Mentoring, Cross-Functional Collaboration, Roadmap Ownership, Hiring, Agile/Scrum/Kanban, Change Management.</w:t>
+      </w:r>
+    </w:p>
+    <w:bookmarkEnd w:id="42"/>
+    <w:bookmarkStart w:id="45" w:name="education"/>
+    <w:p>
+      <w:pPr>
+        <w:pStyle w:val="Heading2"/>
+      </w:pPr>
+      <w:r>
+        <w:t xml:space="preserve">Education</w:t>
+      </w:r>
+    </w:p>
+    <w:bookmarkStart w:id="44" w:name="X8aa14d071da44b7f3006e1d49a262db674bce64"/>
+    <w:p>
+      <w:pPr>
+        <w:pStyle w:val="Heading3"/>
+      </w:pPr>
+      <w:r>
+        <w:t xml:space="preserve">BA in Mathematics, minor in Computer Science</w:t>
+      </w:r>
+    </w:p>
+    <w:bookmarkStart w:id="43" w:name="Xe220d86d70cd5bf8ee7040adf9411d63a6235ab"/>
+    <w:p>
+      <w:pPr>
+        <w:pStyle w:val="Heading4"/>
+      </w:pPr>
+      <w:r>
+        <w:t xml:space="preserve">University of North Carolina at Asheville | May 2003</w:t>
+      </w:r>
+    </w:p>
+    <w:p>
+      <w:pPr>
+        <w:pStyle w:val="Compact"/>
+        <w:numPr>
+          <w:ilvl w:val="0"/>
+          <w:numId w:val="1009"/>
+        </w:numPr>
+      </w:pPr>
+      <w:r>
+        <w:t xml:space="preserve">Graduated with distinction in Mathematics. Undergraduate research in 4D fractals.</w:t>
+      </w:r>
+    </w:p>
     <w:bookmarkEnd w:id="43"/>
     <w:bookmarkEnd w:id="44"/>
-    <w:bookmarkStart w:id="45" w:name="recommendations"/>
+    <w:bookmarkEnd w:id="45"/>
+    <w:bookmarkStart w:id="46" w:name="recommendations"/>
     <w:p>
       <w:pPr>
         <w:pStyle w:val="Heading2"/>
@@ -1002,7 +989,7 @@
         <w:t xml:space="preserve">the solutions he architects, builds, and collaborates on come out better</w:t>
       </w:r>
       <w:r>
-        <w:t xml:space="preserve">. Jack also strives to be at the forefront of new technology and assess how he can leverage it. Newer tech like GenAI can be complex and ever-evolving, and Jack is not one to back down but step up and embrace. He does all this with a</w:t>
+        <w:t xml:space="preserve">. Jack also strives to be at the forefront of new technology and assess how he can leverage it. He does all this with a</w:t>
       </w:r>
       <w:r>
         <w:t xml:space="preserve"> </w:t>
@@ -1048,33 +1035,46 @@
         <w:pStyle w:val="BodyText"/>
       </w:pPr>
       <w:r>
-        <w:t xml:space="preserve">“Jack is a fantastic engineer always ready to</w:t>
-      </w:r>
-      <w:r>
-        <w:t xml:space="preserve"> </w:t>
-      </w:r>
-      <w:r>
-        <w:rPr>
-          <w:b/>
-          <w:bCs/>
-        </w:rPr>
-        <w:t xml:space="preserve">help solve problems and more importantly, teach you how to solve them</w:t>
-      </w:r>
-      <w:r>
-        <w:t xml:space="preserve">. He guided me and my team through a bunch of challenging GitOps situations with patience and kindness, leading by example. Always diligent with his work, willing to roll up his sleeves to get things done and</w:t>
-      </w:r>
-      <w:r>
-        <w:t xml:space="preserve"> </w:t>
-      </w:r>
-      <w:r>
-        <w:rPr>
-          <w:b/>
-          <w:bCs/>
-        </w:rPr>
-        <w:t xml:space="preserve">find creative solutions</w:t>
-      </w:r>
-      <w:r>
-        <w:t xml:space="preserve">, maybe tinkering in some kind of script that would make the manual processes easier and more resilient. Everyone would be lucky to have someone like him in their teams!”</w:t>
+        <w:t xml:space="preserve">“Jack has</w:t>
+      </w:r>
+      <w:r>
+        <w:t xml:space="preserve"> </w:t>
+      </w:r>
+      <w:r>
+        <w:rPr>
+          <w:b/>
+          <w:bCs/>
+        </w:rPr>
+        <w:t xml:space="preserve">had quite a profound impact on my career</w:t>
+      </w:r>
+      <w:r>
+        <w:t xml:space="preserve">. As a young engineer, I was fortunate enough to work with Jack as my coach. He served as a great mentor, helping me build both technical and professional skills and</w:t>
+      </w:r>
+      <w:r>
+        <w:t xml:space="preserve"> </w:t>
+      </w:r>
+      <w:r>
+        <w:rPr>
+          <w:b/>
+          <w:bCs/>
+        </w:rPr>
+        <w:t xml:space="preserve">forming me into the engineer that I am today</w:t>
+      </w:r>
+      <w:r>
+        <w:t xml:space="preserve">.</w:t>
+      </w:r>
+      <w:r>
+        <w:t xml:space="preserve"> </w:t>
+      </w:r>
+      <w:r>
+        <w:rPr>
+          <w:b/>
+          <w:bCs/>
+        </w:rPr>
+        <w:t xml:space="preserve">His mentorship was a key factor in elevating me from an incoming Junior Engineer to an Engineering Manager</w:t>
+      </w:r>
+      <w:r>
+        <w:t xml:space="preserve">. Jack has a great curiosity and a strong set of technical capabilities that allow him to serve as a great example for others and a key contributor to any team!”</w:t>
       </w:r>
     </w:p>
     <w:p>
@@ -1086,7 +1086,7 @@
           <w:i/>
           <w:iCs/>
         </w:rPr>
-        <w:t xml:space="preserve">— Cesar Palafox Garza, Principal Software Engineer, Kantata</w:t>
+        <w:t xml:space="preserve">— Wesley Morlock, Engineering Manager, Kantata</w:t>
       </w:r>
     </w:p>
     <w:p>
@@ -1094,46 +1094,33 @@
         <w:pStyle w:val="BodyText"/>
       </w:pPr>
       <w:r>
-        <w:t xml:space="preserve">“Jack has</w:t>
-      </w:r>
-      <w:r>
-        <w:t xml:space="preserve"> </w:t>
-      </w:r>
-      <w:r>
-        <w:rPr>
-          <w:b/>
-          <w:bCs/>
-        </w:rPr>
-        <w:t xml:space="preserve">had quite a profound impact on my career</w:t>
-      </w:r>
-      <w:r>
-        <w:t xml:space="preserve">. As a young engineer, I was fortunate enough to work with Jack as my coach. He served as a great mentor, helping me build both technical and professional skills and</w:t>
-      </w:r>
-      <w:r>
-        <w:t xml:space="preserve"> </w:t>
-      </w:r>
-      <w:r>
-        <w:rPr>
-          <w:b/>
-          <w:bCs/>
-        </w:rPr>
-        <w:t xml:space="preserve">forming me into the engineer that I am today</w:t>
-      </w:r>
-      <w:r>
-        <w:t xml:space="preserve">. Throughout our time together, Jack was caring and invested in helping me set goals and develop my career.</w:t>
-      </w:r>
-      <w:r>
-        <w:t xml:space="preserve"> </w:t>
-      </w:r>
-      <w:r>
-        <w:rPr>
-          <w:b/>
-          <w:bCs/>
-        </w:rPr>
-        <w:t xml:space="preserve">His mentorship was a key factor in elevating me from an incoming Junior Engineer to an Engineering Manager</w:t>
-      </w:r>
-      <w:r>
-        <w:t xml:space="preserve">. Jack has a great curiosity and a strong set of technical capabilities that allow him to serve as a great example for others and a key contributor to any team!”</w:t>
+        <w:t xml:space="preserve">“Jack is a fantastic engineer always ready to</w:t>
+      </w:r>
+      <w:r>
+        <w:t xml:space="preserve"> </w:t>
+      </w:r>
+      <w:r>
+        <w:rPr>
+          <w:b/>
+          <w:bCs/>
+        </w:rPr>
+        <w:t xml:space="preserve">help solve problems and more importantly, teach you how to solve them</w:t>
+      </w:r>
+      <w:r>
+        <w:t xml:space="preserve">. He guided me and my team through a bunch of challenging GitOps situations with patience and kindness, leading by example. Always diligent with his work, willing to roll up his sleeves to get things done and</w:t>
+      </w:r>
+      <w:r>
+        <w:t xml:space="preserve"> </w:t>
+      </w:r>
+      <w:r>
+        <w:rPr>
+          <w:b/>
+          <w:bCs/>
+        </w:rPr>
+        <w:t xml:space="preserve">find creative solutions</w:t>
+      </w:r>
+      <w:r>
+        <w:t xml:space="preserve">. Everyone would be lucky to have someone like him in their teams!”</w:t>
       </w:r>
     </w:p>
     <w:p>
@@ -1145,7 +1132,7 @@
           <w:i/>
           <w:iCs/>
         </w:rPr>
-        <w:t xml:space="preserve">— Wesley Morlock, Engineering Manager, Kantata</w:t>
+        <w:t xml:space="preserve">— Cesar Palafox Garza, Principal Software Engineer, Kantata</w:t>
       </w:r>
     </w:p>
     <w:p>
@@ -1153,20 +1140,33 @@
         <w:pStyle w:val="BodyText"/>
       </w:pPr>
       <w:r>
-        <w:t xml:space="preserve">“Jack provided invaluable leadership as a Principal Software Engineer at Kantata. He was a powerful voice for the technology but made sure to</w:t>
-      </w:r>
-      <w:r>
-        <w:t xml:space="preserve"> </w:t>
-      </w:r>
-      <w:r>
-        <w:rPr>
-          <w:b/>
-          <w:bCs/>
-        </w:rPr>
-        <w:t xml:space="preserve">advocate for changes that were also certain to provide immediate impact to the customer</w:t>
-      </w:r>
-      <w:r>
-        <w:t xml:space="preserve">. I highly recommend Jack as an excellent dev ops engineer and as a technical leader.”</w:t>
+        <w:t xml:space="preserve">“Jack is</w:t>
+      </w:r>
+      <w:r>
+        <w:t xml:space="preserve"> </w:t>
+      </w:r>
+      <w:r>
+        <w:rPr>
+          <w:b/>
+          <w:bCs/>
+        </w:rPr>
+        <w:t xml:space="preserve">awesome at understanding the direction teams need to go to make important improvements in Kantata’s Engineering organization as a whole</w:t>
+      </w:r>
+      <w:r>
+        <w:t xml:space="preserve">. He has been instrumental in building and implementing strategies to upgrade Ruby, Rails, and React. If I had any questions about infrastructure and Kubernetes he would be able to answer and</w:t>
+      </w:r>
+      <w:r>
+        <w:t xml:space="preserve"> </w:t>
+      </w:r>
+      <w:r>
+        <w:rPr>
+          <w:b/>
+          <w:bCs/>
+        </w:rPr>
+        <w:t xml:space="preserve">provide solid explanations to the entire team</w:t>
+      </w:r>
+      <w:r>
+        <w:t xml:space="preserve">.”</w:t>
       </w:r>
     </w:p>
     <w:p>
@@ -1178,223 +1178,24 @@
           <w:i/>
           <w:iCs/>
         </w:rPr>
-        <w:t xml:space="preserve">— Nathan Perry, Principal Software Engineer, Kantata</w:t>
+        <w:t xml:space="preserve">— Justin Hurstwright, Principal Software Engineer, Kantata</w:t>
       </w:r>
     </w:p>
     <w:p>
       <w:pPr>
         <w:pStyle w:val="BodyText"/>
       </w:pPr>
-      <w:r>
-        <w:t xml:space="preserve">“Jack is talented both as a software developer and as an operations engineer. While working together in a Principal Engineer capacity, I saw how</w:t>
-      </w:r>
-      <w:r>
-        <w:t xml:space="preserve"> </w:t>
-      </w:r>
-      <w:r>
-        <w:rPr>
-          <w:b/>
-          <w:bCs/>
-        </w:rPr>
-        <w:t xml:space="preserve">passionate Jack is about helping his colleagues and his organization level up</w:t>
-      </w:r>
-      <w:r>
-        <w:t xml:space="preserve">. He is a great engineer with excellent leadership and organizational abilities.”</w:t>
-      </w:r>
-    </w:p>
-    <w:p>
-      <w:pPr>
-        <w:pStyle w:val="BodyText"/>
-      </w:pPr>
-      <w:r>
-        <w:rPr>
-          <w:i/>
-          <w:iCs/>
-        </w:rPr>
-        <w:t xml:space="preserve">— Jason Larsen, Software Engineering Manager, Kantata</w:t>
-      </w:r>
-    </w:p>
-    <w:p>
-      <w:pPr>
-        <w:pStyle w:val="BodyText"/>
-      </w:pPr>
-      <w:r>
-        <w:t xml:space="preserve">“Jack is a great co-worker. He is</w:t>
-      </w:r>
-      <w:r>
-        <w:t xml:space="preserve"> </w:t>
-      </w:r>
-      <w:r>
-        <w:rPr>
-          <w:b/>
-          <w:bCs/>
-        </w:rPr>
-        <w:t xml:space="preserve">awesome at understanding the direction teams need to go to make important improvements in Kantata’s Engineering organization as a whole</w:t>
-      </w:r>
-      <w:r>
-        <w:t xml:space="preserve">. He has been instrumental in building and implementing strategies to upgrade Ruby, Rails, and React. If I had any questions about infrastructure and Kubernetes he would be able to answer and</w:t>
-      </w:r>
-      <w:r>
-        <w:t xml:space="preserve"> </w:t>
-      </w:r>
-      <w:r>
-        <w:rPr>
-          <w:b/>
-          <w:bCs/>
-        </w:rPr>
-        <w:t xml:space="preserve">provide solid explanations to the entire team</w:t>
-      </w:r>
-      <w:r>
-        <w:t xml:space="preserve">.”</w:t>
-      </w:r>
-    </w:p>
-    <w:p>
-      <w:pPr>
-        <w:pStyle w:val="BodyText"/>
-      </w:pPr>
-      <w:r>
-        <w:rPr>
-          <w:i/>
-          <w:iCs/>
-        </w:rPr>
-        <w:t xml:space="preserve">— Justin Hurstwright, Principal Software Engineer, Kantata</w:t>
-      </w:r>
-    </w:p>
-    <w:p>
-      <w:pPr>
-        <w:pStyle w:val="BodyText"/>
-      </w:pPr>
-      <w:r>
-        <w:t xml:space="preserve">“Jack is a phenomenal resource to work with. He is</w:t>
-      </w:r>
-      <w:r>
-        <w:t xml:space="preserve"> </w:t>
-      </w:r>
-      <w:r>
-        <w:rPr>
-          <w:b/>
-          <w:bCs/>
-        </w:rPr>
-        <w:t xml:space="preserve">very knowledgeable about programming and cloud infrastructure</w:t>
-      </w:r>
-      <w:r>
-        <w:t xml:space="preserve"> </w:t>
-      </w:r>
-      <w:r>
-        <w:t xml:space="preserve">and is always eager to learn new things.”</w:t>
-      </w:r>
-    </w:p>
-    <w:p>
-      <w:pPr>
-        <w:pStyle w:val="BodyText"/>
-      </w:pPr>
-      <w:r>
-        <w:rPr>
-          <w:i/>
-          <w:iCs/>
-        </w:rPr>
-        <w:t xml:space="preserve">— Donovan Hubbard, Senior DevOps Engineer, Kantata</w:t>
-      </w:r>
-    </w:p>
-    <w:p>
-      <w:pPr>
-        <w:pStyle w:val="BodyText"/>
-      </w:pPr>
-      <w:r>
-        <w:t xml:space="preserve">“Jack has a flair for finding better, faster, and more reliable ways to get things done. He</w:t>
-      </w:r>
-      <w:r>
-        <w:t xml:space="preserve"> </w:t>
-      </w:r>
-      <w:r>
-        <w:rPr>
-          <w:b/>
-          <w:bCs/>
-        </w:rPr>
-        <w:t xml:space="preserve">advocates best practices, like unit testing, and has a deep knowledge of OO architecture</w:t>
-      </w:r>
-      <w:r>
-        <w:t xml:space="preserve">. Jack thinks on his toes, and will always be there with the team at 4 a.m. if circumstance requires it.</w:t>
-      </w:r>
-      <w:r>
-        <w:t xml:space="preserve"> </w:t>
-      </w:r>
-      <w:r>
-        <w:rPr>
-          <w:rStyle w:val="VerbatimChar"/>
-        </w:rPr>
-        <w:t xml:space="preserve">:%s/average developers/developers like jack/g</w:t>
-      </w:r>
-      <w:r>
-        <w:t xml:space="preserve"> </w:t>
-      </w:r>
-      <w:r>
-        <w:t xml:space="preserve">if you know what’s good for you.”</w:t>
-      </w:r>
-    </w:p>
-    <w:p>
-      <w:pPr>
-        <w:pStyle w:val="BodyText"/>
-      </w:pPr>
-      <w:r>
-        <w:rPr>
-          <w:i/>
-          <w:iCs/>
-        </w:rPr>
-        <w:t xml:space="preserve">— Greg Whitescarver, Founder, Mojave</w:t>
-      </w:r>
-    </w:p>
-    <w:p>
-      <w:pPr>
-        <w:pStyle w:val="BodyText"/>
-      </w:pPr>
-      <w:r>
-        <w:t xml:space="preserve">“With Jack,</w:t>
-      </w:r>
-      <w:r>
-        <w:t xml:space="preserve"> </w:t>
-      </w:r>
-      <w:r>
-        <w:rPr>
-          <w:b/>
-          <w:bCs/>
-        </w:rPr>
-        <w:t xml:space="preserve">the more complex the problem, the more simple his solutions</w:t>
-      </w:r>
-      <w:r>
-        <w:t xml:space="preserve">. From eradicating dynamic php bugs to providing innovative javascript capabilities, Master Senechal is more than a mind to be reckoned with, he’s an</w:t>
-      </w:r>
-      <w:r>
-        <w:t xml:space="preserve"> </w:t>
-      </w:r>
-      <w:r>
-        <w:rPr>
-          <w:b/>
-          <w:bCs/>
-        </w:rPr>
-        <w:t xml:space="preserve">integrative capacity builder</w:t>
-      </w:r>
-      <w:r>
-        <w:t xml:space="preserve"> </w:t>
-      </w:r>
-      <w:r>
-        <w:t xml:space="preserve">with a wide range of technological expertise. If there is anything that can be done through web development, Jack can figure out how to do it, and make it happen.”</w:t>
-      </w:r>
-    </w:p>
-    <w:p>
-      <w:pPr>
-        <w:pStyle w:val="BodyText"/>
-      </w:pPr>
-      <w:r>
-        <w:rPr>
-          <w:i/>
-          <w:iCs/>
-        </w:rPr>
-        <w:t xml:space="preserve">— Adam Apollo, Cofounder &amp; CEO, Superluminal Systems</w:t>
-      </w:r>
-    </w:p>
-    <w:bookmarkEnd w:id="45"/>
+      <w:hyperlink r:id="rId22">
+        <w:r>
+          <w:rPr>
+            <w:rStyle w:val="Hyperlink"/>
+          </w:rPr>
+          <w:t xml:space="preserve">See additional recommendations on LinkedIn</w:t>
+        </w:r>
+      </w:hyperlink>
+    </w:p>
     <w:bookmarkEnd w:id="46"/>
+    <w:bookmarkEnd w:id="47"/>
     <w:sectPr/>
   </w:body>
 </w:document>

</xml_diff>

<commit_message>
Honest down title to Platform Engineer
</commit_message>
<xml_diff>
--- a/resume.docx
+++ b/resume.docx
@@ -11,13 +11,13 @@
         <w:t xml:space="preserve">Jack Senechal</w:t>
       </w:r>
     </w:p>
-    <w:bookmarkStart w:id="23" w:name="ai-platform-engineer"/>
+    <w:bookmarkStart w:id="23" w:name="platform-engineer"/>
     <w:p>
       <w:pPr>
         <w:pStyle w:val="Heading2"/>
       </w:pPr>
       <w:r>
-        <w:t xml:space="preserve">AI Platform Engineer</w:t>
+        <w:t xml:space="preserve">Platform Engineer</w:t>
       </w:r>
     </w:p>
     <w:p>
@@ -118,7 +118,7 @@
         <w:t xml:space="preserve"> </w:t>
       </w:r>
       <w:r>
-        <w:t xml:space="preserve">specializing in infrastructure and backend systems for AI-powered products, with deep experience deploying across multiple production environments</w:t>
+        <w:t xml:space="preserve">with deep experience building and operating infrastructure across multiple production environments</w:t>
       </w:r>
     </w:p>
     <w:p>
@@ -180,7 +180,7 @@
         </w:numPr>
       </w:pPr>
       <w:r>
-        <w:t xml:space="preserve">Full-stack generalist with hands-on AI/LLM integration experience — from evaluation frameworks to production chatbots</w:t>
+        <w:t xml:space="preserve">Hands-on AI/LLM experience including evaluation frameworks, production chatbots, and developer tooling</w:t>
       </w:r>
     </w:p>
     <w:p>

</xml_diff>

<commit_message>
Tailor resume for Fieldguide Software Engineer, AgentOps
</commit_message>
<xml_diff>
--- a/resume.docx
+++ b/resume.docx
@@ -2,7 +2,7 @@
 <file path=word/document.xml><?xml version="1.0" encoding="utf-8"?>
 <w:document xmlns:w="http://schemas.openxmlformats.org/wordprocessingml/2006/main" xmlns:m="http://schemas.openxmlformats.org/officeDocument/2006/math" xmlns:r="http://schemas.openxmlformats.org/officeDocument/2006/relationships" xmlns:o="urn:schemas-microsoft-com:office:office" xmlns:v="urn:schemas-microsoft-com:vml" xmlns:w10="urn:schemas-microsoft-com:office:word" xmlns:a="http://schemas.openxmlformats.org/drawingml/2006/main" xmlns:pic="http://schemas.openxmlformats.org/drawingml/2006/picture" xmlns:wp="http://schemas.openxmlformats.org/drawingml/2006/wordprocessingDrawing">
   <w:body>
-    <w:bookmarkStart w:id="46" w:name="jack-senechal"/>
+    <w:bookmarkStart w:id="47" w:name="jack-senechal"/>
     <w:p>
       <w:pPr>
         <w:pStyle w:val="Heading1"/>
@@ -11,13 +11,13 @@
         <w:t xml:space="preserve">Jack Senechal</w:t>
       </w:r>
     </w:p>
-    <w:bookmarkStart w:id="23" w:name="engineering-leader-entrepreneur"/>
+    <w:bookmarkStart w:id="23" w:name="ai-tooling-platform-engineer"/>
     <w:p>
       <w:pPr>
         <w:pStyle w:val="Heading2"/>
       </w:pPr>
       <w:r>
-        <w:t xml:space="preserve">Engineering Leader / Entrepreneur</w:t>
+        <w:t xml:space="preserve">AI Tooling &amp; Platform Engineer</w:t>
       </w:r>
     </w:p>
     <w:p>
@@ -32,13 +32,13 @@
         <w:t xml:space="preserve">Located in Novato, CA</w:t>
       </w:r>
       <w:r>
-        <w:br/>
+        <w:t xml:space="preserve"> </w:t>
       </w:r>
       <w:r>
         <w:t xml:space="preserve">Phone: 415-779-2701</w:t>
       </w:r>
       <w:r>
-        <w:br/>
+        <w:t xml:space="preserve"> </w:t>
       </w:r>
       <w:r>
         <w:t xml:space="preserve">Email:</w:t>
@@ -55,7 +55,7 @@
         </w:r>
       </w:hyperlink>
       <w:r>
-        <w:br/>
+        <w:t xml:space="preserve"> </w:t>
       </w:r>
       <w:r>
         <w:t xml:space="preserve">GitHub:</w:t>
@@ -68,11 +68,11 @@
           <w:rPr>
             <w:rStyle w:val="Hyperlink"/>
           </w:rPr>
-          <w:t xml:space="preserve">https://github.com/jacksenechal</w:t>
+          <w:t xml:space="preserve">github.com/jacksenechal</w:t>
         </w:r>
       </w:hyperlink>
       <w:r>
-        <w:br/>
+        <w:t xml:space="preserve"> </w:t>
       </w:r>
       <w:r>
         <w:t xml:space="preserve">LinkedIn:</w:t>
@@ -85,7 +85,7 @@
           <w:rPr>
             <w:rStyle w:val="Hyperlink"/>
           </w:rPr>
-          <w:t xml:space="preserve">https://linkedin.com/in/jacksenechal</w:t>
+          <w:t xml:space="preserve">linkedin.com/in/jacksenechal</w:t>
         </w:r>
       </w:hyperlink>
     </w:p>
@@ -108,27 +108,27 @@
         </w:numPr>
       </w:pPr>
       <w:r>
-        <w:t xml:space="preserve">Proven leader in software development, infrastructure, and</w:t>
-      </w:r>
-      <w:r>
-        <w:t xml:space="preserve"> </w:t>
-      </w:r>
-      <w:r>
-        <w:rPr>
-          <w:b/>
-          <w:bCs/>
-        </w:rPr>
-        <w:t xml:space="preserve">team management</w:t>
-      </w:r>
-      <w:r>
-        <w:t xml:space="preserve"> </w:t>
-      </w:r>
-      <w:r>
-        <w:t xml:space="preserve">with</w:t>
-      </w:r>
-      <w:r>
-        <w:t xml:space="preserve"> </w:t>
-      </w:r>
+        <w:rPr>
+          <w:b/>
+          <w:bCs/>
+        </w:rPr>
+        <w:t xml:space="preserve">Principal-level engineer</w:t>
+      </w:r>
+      <w:r>
+        <w:t xml:space="preserve"> </w:t>
+      </w:r>
+      <w:r>
+        <w:t xml:space="preserve">specializing in AI agent infrastructure, developer tooling platforms, and engineering productivity at scale</w:t>
+      </w:r>
+    </w:p>
+    <w:p>
+      <w:pPr>
+        <w:pStyle w:val="Compact"/>
+        <w:numPr>
+          <w:ilvl w:val="0"/>
+          <w:numId w:val="1001"/>
+        </w:numPr>
+      </w:pPr>
       <w:r>
         <w:rPr>
           <w:b/>
@@ -140,7 +140,23 @@
         <w:t xml:space="preserve"> </w:t>
       </w:r>
       <w:r>
-        <w:t xml:space="preserve">of hands-on experience</w:t>
+        <w:t xml:space="preserve">building and shipping software, with</w:t>
+      </w:r>
+      <w:r>
+        <w:t xml:space="preserve"> </w:t>
+      </w:r>
+      <w:r>
+        <w:rPr>
+          <w:b/>
+          <w:bCs/>
+        </w:rPr>
+        <w:t xml:space="preserve">6+ years leading teams</w:t>
+      </w:r>
+      <w:r>
+        <w:t xml:space="preserve"> </w:t>
+      </w:r>
+      <w:r>
+        <w:t xml:space="preserve">across multiple product domains</w:t>
       </w:r>
     </w:p>
     <w:p>
@@ -152,6 +168,59 @@
         </w:numPr>
       </w:pPr>
       <w:r>
+        <w:t xml:space="preserve">Deep hands-on experience with</w:t>
+      </w:r>
+      <w:r>
+        <w:t xml:space="preserve"> </w:t>
+      </w:r>
+      <w:r>
+        <w:rPr>
+          <w:b/>
+          <w:bCs/>
+        </w:rPr>
+        <w:t xml:space="preserve">AI coding tools and agent workflows</w:t>
+      </w:r>
+      <w:r>
+        <w:t xml:space="preserve"> </w:t>
+      </w:r>
+      <w:r>
+        <w:t xml:space="preserve">— building MCP integrations, evaluation frameworks, prompt/skill libraries, and knowledge systems</w:t>
+      </w:r>
+    </w:p>
+    <w:p>
+      <w:pPr>
+        <w:pStyle w:val="Compact"/>
+        <w:numPr>
+          <w:ilvl w:val="0"/>
+          <w:numId w:val="1001"/>
+        </w:numPr>
+      </w:pPr>
+      <w:r>
+        <w:t xml:space="preserve">Track record of</w:t>
+      </w:r>
+      <w:r>
+        <w:t xml:space="preserve"> </w:t>
+      </w:r>
+      <w:r>
+        <w:rPr>
+          <w:b/>
+          <w:bCs/>
+        </w:rPr>
+        <w:t xml:space="preserve">rolling out internal platforms across engineering orgs</w:t>
+      </w:r>
+      <w:r>
+        <w:t xml:space="preserve">, driving adoption through documentation, coaching, and measurable outcomes</w:t>
+      </w:r>
+    </w:p>
+    <w:p>
+      <w:pPr>
+        <w:pStyle w:val="Compact"/>
+        <w:numPr>
+          <w:ilvl w:val="0"/>
+          <w:numId w:val="1001"/>
+        </w:numPr>
+      </w:pPr>
+      <w:r>
         <w:t xml:space="preserve">Committed</w:t>
       </w:r>
       <w:r>
@@ -165,7 +234,10 @@
         <w:t xml:space="preserve">mentor and coach</w:t>
       </w:r>
       <w:r>
-        <w:t xml:space="preserve">, elevating team members’ skill sets and fostering professional growth</w:t>
+        <w:t xml:space="preserve"> </w:t>
+      </w:r>
+      <w:r>
+        <w:t xml:space="preserve">who elevated junior engineers to senior technical and engineering management positions</w:t>
       </w:r>
     </w:p>
     <w:p>
@@ -177,87 +249,11 @@
         </w:numPr>
       </w:pPr>
       <w:r>
-        <w:t xml:space="preserve">Strategic thinker, mercurial innovator, and expert problem solver</w:t>
-      </w:r>
-    </w:p>
-    <w:p>
-      <w:pPr>
-        <w:pStyle w:val="Compact"/>
-        <w:numPr>
-          <w:ilvl w:val="0"/>
-          <w:numId w:val="1001"/>
-        </w:numPr>
-      </w:pPr>
-      <w:r>
-        <w:t xml:space="preserve">Resilient and dedicated, ready to embrace challenges and opportunities</w:t>
-      </w:r>
-    </w:p>
-    <w:p>
-      <w:pPr>
-        <w:pStyle w:val="Compact"/>
-        <w:numPr>
-          <w:ilvl w:val="0"/>
-          <w:numId w:val="1001"/>
-        </w:numPr>
-      </w:pPr>
-      <w:r>
-        <w:t xml:space="preserve">Strong customer focus,</w:t>
-      </w:r>
-      <w:r>
-        <w:t xml:space="preserve"> </w:t>
-      </w:r>
-      <w:r>
-        <w:rPr>
-          <w:b/>
-          <w:bCs/>
-        </w:rPr>
-        <w:t xml:space="preserve">advocating for impactful changes</w:t>
-      </w:r>
-      <w:r>
-        <w:t xml:space="preserve"> </w:t>
-      </w:r>
-      <w:r>
-        <w:t xml:space="preserve">and ensuring product value</w:t>
-      </w:r>
-    </w:p>
-    <w:p>
-      <w:pPr>
-        <w:pStyle w:val="Compact"/>
-        <w:numPr>
-          <w:ilvl w:val="0"/>
-          <w:numId w:val="1001"/>
-        </w:numPr>
-      </w:pPr>
-      <w:r>
         <w:t xml:space="preserve">Entrepreneurial spirit with multiple co-founding experiences</w:t>
       </w:r>
     </w:p>
-    <w:p>
-      <w:pPr>
-        <w:pStyle w:val="Compact"/>
-        <w:numPr>
-          <w:ilvl w:val="0"/>
-          <w:numId w:val="1001"/>
-        </w:numPr>
-      </w:pPr>
-      <w:r>
-        <w:t xml:space="preserve">Principal-level engineer specializing in AI-powered developer tooling, platform modernization, and large-scale engineering productivity</w:t>
-      </w:r>
-    </w:p>
-    <w:p>
-      <w:pPr>
-        <w:pStyle w:val="Compact"/>
-        <w:numPr>
-          <w:ilvl w:val="0"/>
-          <w:numId w:val="1001"/>
-        </w:numPr>
-      </w:pPr>
-      <w:r>
-        <w:t xml:space="preserve">Full-stack generalist with deep experience applying AI/LLMs, DevOps, and cloud-native systems to accelerate software delivery</w:t>
-      </w:r>
-    </w:p>
     <w:bookmarkEnd w:id="24"/>
-    <w:bookmarkStart w:id="31" w:name="industry-experience"/>
+    <w:bookmarkStart w:id="36" w:name="industry-experience"/>
     <w:p>
       <w:pPr>
         <w:pStyle w:val="Heading2"/>
@@ -275,13 +271,13 @@
         <w:t xml:space="preserve">Technical Lead</w:t>
       </w:r>
     </w:p>
-    <w:bookmarkStart w:id="25" w:name="X75167482f34e06a01a656d1f4cef9a03bec6c7a"/>
+    <w:bookmarkStart w:id="25" w:name="X6dafa89e46c32694395442a9a6ca99eae379ab9"/>
     <w:p>
       <w:pPr>
         <w:pStyle w:val="Heading4"/>
       </w:pPr>
       <w:r>
-        <w:t xml:space="preserve">Building Humane Technology | June 2025 - Present | Remote (US)</w:t>
+        <w:t xml:space="preserve">Building Humane Technology | June 2025 - Present | Remote</w:t>
       </w:r>
     </w:p>
     <w:p>
@@ -293,7 +289,7 @@
         </w:numPr>
       </w:pPr>
       <w:r>
-        <w:t xml:space="preserve">Co-architecting and leading development of HumaneBench.ai, an open-source benchmark for evaluating AI systems against humane technology principles.</w:t>
+        <w:t xml:space="preserve">Co-architecting and leading development of HumaneBench.ai, an open-source AI evaluation framework built on AISI Inspect. Python.</w:t>
       </w:r>
     </w:p>
     <w:p>
@@ -305,7 +301,7 @@
         </w:numPr>
       </w:pPr>
       <w:r>
-        <w:t xml:space="preserve">Developing an extensible AI evaluation framework built on AISI Inspect, focused on measuring and improving LLM behavior in real-world developer and operational workflows.</w:t>
+        <w:t xml:space="preserve">Building extensible evaluation tooling with prompt regression testing, cost/performance tracking, and structured experimentation across multiple LLM providers.</w:t>
       </w:r>
     </w:p>
     <w:p>
@@ -317,51 +313,27 @@
         </w:numPr>
       </w:pPr>
       <w:r>
-        <w:t xml:space="preserve">Shaping product and technical roadmap for AI-driven tooling, including production monitoring concepts, multi-turn evaluation, and maturity models to support adoption, measurement, and continuous improvement.</w:t>
-      </w:r>
-    </w:p>
-    <w:p>
-      <w:pPr>
-        <w:pStyle w:val="Compact"/>
-        <w:numPr>
-          <w:ilvl w:val="0"/>
-          <w:numId w:val="1002"/>
-        </w:numPr>
-      </w:pPr>
-      <w:r>
-        <w:t xml:space="preserve">Contributing to education initiatives including Humane Tech and Agentic AI training for the UN Secretariat and broader developer community, plus coordinating hackathons and public AMAs.</w:t>
-      </w:r>
-    </w:p>
-    <w:p>
-      <w:pPr>
-        <w:pStyle w:val="Compact"/>
-        <w:numPr>
-          <w:ilvl w:val="0"/>
-          <w:numId w:val="1002"/>
-        </w:numPr>
-      </w:pPr>
-      <w:r>
-        <w:t xml:space="preserve">Building partnerships and fostering open-source community engagement around humane AI evaluation standards.</w:t>
+        <w:t xml:space="preserve">Shaping product and technical roadmap for AI-driven tooling, including production monitoring, multi-turn evaluation, and maturity models for adoption and continuous improvement.</w:t>
       </w:r>
     </w:p>
     <w:bookmarkEnd w:id="25"/>
     <w:bookmarkEnd w:id="26"/>
-    <w:bookmarkStart w:id="28" w:name="infrastructure-engineer"/>
+    <w:bookmarkStart w:id="28" w:name="co-founder-lead-developer"/>
     <w:p>
       <w:pPr>
         <w:pStyle w:val="Heading3"/>
       </w:pPr>
       <w:r>
-        <w:t xml:space="preserve">Infrastructure Engineer</w:t>
-      </w:r>
-    </w:p>
-    <w:bookmarkStart w:id="27" w:name="tobiko-mar-2024---oct-2024-remote-us"/>
+        <w:t xml:space="preserve">Co-founder &amp; Lead Developer</w:t>
+      </w:r>
+    </w:p>
+    <w:bookmarkStart w:id="27" w:name="Xffd4b369c0bcf0f7e3f28f0e84324bac520d95a"/>
     <w:p>
       <w:pPr>
         <w:pStyle w:val="Heading4"/>
       </w:pPr>
       <w:r>
-        <w:t xml:space="preserve">Tobiko | Mar 2024 - Oct 2024 | Remote (US)</w:t>
+        <w:t xml:space="preserve">Mirror Astrology | Nov 2024 - Present | Remote</w:t>
       </w:r>
     </w:p>
     <w:p>
@@ -373,7 +345,7 @@
         </w:numPr>
       </w:pPr>
       <w:r>
-        <w:t xml:space="preserve">Collaborated with a fast-paced team to architect and implement a robust, scalable, modern cloud platform serving customer workloads.</w:t>
+        <w:t xml:space="preserve">Owned the entire frontend: Ruby on Rails views, JavaScript, HTML+CSS, Tailwind, responsive UI/UX. Contributed to backend development.</w:t>
       </w:r>
     </w:p>
     <w:p>
@@ -385,7 +357,7 @@
         </w:numPr>
       </w:pPr>
       <w:r>
-        <w:t xml:space="preserve">Built out CI/CD patterns including mono-repo conditional workflows, workload identity federation, and continuous delivery.</w:t>
+        <w:t xml:space="preserve">Built AI chatbot integrating multiple LLMs with complex prompting, tool use, context augmentation, and knowledge retrieval.</w:t>
       </w:r>
     </w:p>
     <w:p>
@@ -397,39 +369,27 @@
         </w:numPr>
       </w:pPr>
       <w:r>
-        <w:t xml:space="preserve">Implemented a Slack-based customer support and incident response platform, and onboarded teammates and customers.</w:t>
-      </w:r>
-    </w:p>
-    <w:p>
-      <w:pPr>
-        <w:pStyle w:val="Compact"/>
-        <w:numPr>
-          <w:ilvl w:val="0"/>
-          <w:numId w:val="1003"/>
-        </w:numPr>
-      </w:pPr>
-      <w:r>
-        <w:t xml:space="preserve">Python, Pulumi, Google Cloud Platform, Google Kubernetes Engine, Google Cloud Run, CI/CD with CircleCI, Helm, SQLMesh.</w:t>
+        <w:t xml:space="preserve">Collaborated closely with co-founders on product direction, Figma design, UX, roadmap planning, and prioritization.</w:t>
       </w:r>
     </w:p>
     <w:bookmarkEnd w:id="27"/>
     <w:bookmarkEnd w:id="28"/>
-    <w:bookmarkStart w:id="30" w:name="X7a2c313efdde198d901363c762c81839771c845"/>
+    <w:bookmarkStart w:id="30" w:name="infrastructure-engineer"/>
     <w:p>
       <w:pPr>
         <w:pStyle w:val="Heading3"/>
       </w:pPr>
       <w:r>
-        <w:t xml:space="preserve">Engineering Manager / Principal Software Engineer</w:t>
-      </w:r>
-    </w:p>
-    <w:bookmarkStart w:id="29" w:name="X47289269eb944414c9285d314973b45c253bcef"/>
+        <w:t xml:space="preserve">Infrastructure Engineer</w:t>
+      </w:r>
+    </w:p>
+    <w:bookmarkStart w:id="29" w:name="tobiko-mar-2024---oct-2024-remote"/>
     <w:p>
       <w:pPr>
         <w:pStyle w:val="Heading4"/>
       </w:pPr>
       <w:r>
-        <w:t xml:space="preserve">Mavenlink / Kantata | Apr 2017 - Dec 2023 | San Francisco, CA</w:t>
+        <w:t xml:space="preserve">Tobiko | Mar 2024 - Oct 2024 | Remote</w:t>
       </w:r>
     </w:p>
     <w:p>
@@ -441,14 +401,7 @@
         </w:numPr>
       </w:pPr>
       <w:r>
-        <w:rPr>
-          <w:b/>
-          <w:bCs/>
-        </w:rPr>
-        <w:t xml:space="preserve">Operations Team Leadership</w:t>
-      </w:r>
-      <w:r>
-        <w:t xml:space="preserve">: Over four years, recruited and led a new infrastructure team dedicated to building and scaling the platform. Instrumental in leading the organization’s transition towards a DevOps culture, serving as a change agent and technical authority across engineering. Created a clear, calm, and constructive environment that allowed the team to thrive. Responsible for roadmap stewardship, untangling requirements, and arranging priorities to maximize flow. Transitioned a large legacy infrastructure codebase to cutting-edge, cloud-native, IAC-oriented tools while remaining hands-on with coding, architecture, and collaboration on mission-critical projects.</w:t>
+        <w:t xml:space="preserve">Architected and implemented a scalable cloud platform serving customer workloads at a fast-paced startup.</w:t>
       </w:r>
     </w:p>
     <w:p>
@@ -460,14 +413,7 @@
         </w:numPr>
       </w:pPr>
       <w:r>
-        <w:rPr>
-          <w:b/>
-          <w:bCs/>
-        </w:rPr>
-        <w:t xml:space="preserve">M-Bridge Platform Leadership</w:t>
-      </w:r>
-      <w:r>
-        <w:t xml:space="preserve">: For two years, spearheaded a team to stabilize and enhance an agent-based integration platform. Established operational metrics and monitoring systems that reduced platform errors and incidents by approximately 100x. Successfully performed a migration to Kubernetes with zero downtime, including relational, document, and cache databases. Demonstrated ability to measure impact and drive data-informed decisions.</w:t>
+        <w:t xml:space="preserve">Built CI/CD patterns including mono-repo conditional workflows, workload identity federation, and continuous delivery.</w:t>
       </w:r>
     </w:p>
     <w:p>
@@ -479,14 +425,7 @@
         </w:numPr>
       </w:pPr>
       <w:r>
-        <w:rPr>
-          <w:b/>
-          <w:bCs/>
-        </w:rPr>
-        <w:t xml:space="preserve">Insights Platform Leadership</w:t>
-      </w:r>
-      <w:r>
-        <w:t xml:space="preserve">: For three months, led a transition team responsible for overseeing and improving the BI data pipeline. Successfully migrated the pipeline to Kubernetes, accelerating modernization initiatives.</w:t>
+        <w:t xml:space="preserve">Implemented a Slack-based customer support and incident response platform; onboarded teammates and customers.</w:t>
       </w:r>
     </w:p>
     <w:p>
@@ -498,207 +437,170 @@
         </w:numPr>
       </w:pPr>
       <w:r>
-        <w:rPr>
-          <w:b/>
-          <w:bCs/>
-        </w:rPr>
-        <w:t xml:space="preserve">Cross-Functional Leadership &amp; Organizational Impact</w:t>
-      </w:r>
-      <w:r>
-        <w:t xml:space="preserve">: Took on organization-wide roles including mentorship and coaching, interviewing and hiring, and organizational change management and process optimization. Influenced decisions at all levels and promoted best practices across the engineering organization. Recognized with Top Performer Award in 2021 for contributions to technical excellence and team development.</w:t>
+        <w:t xml:space="preserve">Python, Pulumi, GCP, GKE, Cloud Run, CircleCI, Helm, SQLMesh.</w:t>
       </w:r>
     </w:p>
     <w:bookmarkEnd w:id="29"/>
     <w:bookmarkEnd w:id="30"/>
+    <w:bookmarkStart w:id="32" w:name="X7a2c313efdde198d901363c762c81839771c845"/>
+    <w:p>
+      <w:pPr>
+        <w:pStyle w:val="Heading3"/>
+      </w:pPr>
+      <w:r>
+        <w:t xml:space="preserve">Engineering Manager / Principal Software Engineer</w:t>
+      </w:r>
+    </w:p>
+    <w:bookmarkStart w:id="31" w:name="X47289269eb944414c9285d314973b45c253bcef"/>
+    <w:p>
+      <w:pPr>
+        <w:pStyle w:val="Heading4"/>
+      </w:pPr>
+      <w:r>
+        <w:t xml:space="preserve">Mavenlink / Kantata | Apr 2017 - Dec 2023 | San Francisco, CA</w:t>
+      </w:r>
+    </w:p>
+    <w:p>
+      <w:pPr>
+        <w:pStyle w:val="Compact"/>
+        <w:numPr>
+          <w:ilvl w:val="0"/>
+          <w:numId w:val="1005"/>
+        </w:numPr>
+      </w:pPr>
+      <w:r>
+        <w:rPr>
+          <w:b/>
+          <w:bCs/>
+        </w:rPr>
+        <w:t xml:space="preserve">M-Bridge Integration Platform</w:t>
+      </w:r>
+      <w:r>
+        <w:t xml:space="preserve"> </w:t>
+      </w:r>
+      <w:r>
+        <w:t xml:space="preserve">(2 years): Led a team to stabilize and scale an agent-based integration platform handling multi-system data orchestration. Built instrumentation and operational metrics that reduced errors and incidents by ~100x.</w:t>
+      </w:r>
+    </w:p>
+    <w:p>
+      <w:pPr>
+        <w:pStyle w:val="Compact"/>
+        <w:numPr>
+          <w:ilvl w:val="0"/>
+          <w:numId w:val="1005"/>
+        </w:numPr>
+      </w:pPr>
+      <w:r>
+        <w:rPr>
+          <w:b/>
+          <w:bCs/>
+        </w:rPr>
+        <w:t xml:space="preserve">Infrastructure Platform</w:t>
+      </w:r>
+      <w:r>
+        <w:t xml:space="preserve"> </w:t>
+      </w:r>
+      <w:r>
+        <w:t xml:space="preserve">(4 years): Recruited and built a new team from scratch dedicated to the infrastructure platform. Led the organization’s DevOps culture transformation, driving adoption through documentation, practical examples, and results — not mandates. Owned roadmap stewardship while staying hands-on with coding, architecture, and code review. Transitioned a large legacy codebase to cloud-native, IaC tooling (Terraform, Ansible, Kubernetes).</w:t>
+      </w:r>
+    </w:p>
+    <w:p>
+      <w:pPr>
+        <w:pStyle w:val="Compact"/>
+        <w:numPr>
+          <w:ilvl w:val="0"/>
+          <w:numId w:val="1005"/>
+        </w:numPr>
+      </w:pPr>
+      <w:r>
+        <w:rPr>
+          <w:b/>
+          <w:bCs/>
+        </w:rPr>
+        <w:t xml:space="preserve">Cross-Functional Impact</w:t>
+      </w:r>
+      <w:r>
+        <w:t xml:space="preserve">: Mentored engineers across teams — notably coached a junior engineer who grew to Engineering Manager. Ran trainings, onboarding, and enablement that raised the floor across the org. Led interviewing and hiring.</w:t>
+      </w:r>
+      <w:r>
+        <w:t xml:space="preserve"> </w:t>
+      </w:r>
+      <w:r>
+        <w:rPr>
+          <w:b/>
+          <w:bCs/>
+        </w:rPr>
+        <w:t xml:space="preserve">Top Performer Award, 2021</w:t>
+      </w:r>
+      <w:r>
+        <w:t xml:space="preserve">.</w:t>
+      </w:r>
+    </w:p>
     <w:bookmarkEnd w:id="31"/>
-    <w:bookmarkStart w:id="36" w:name="skills"/>
-    <w:p>
-      <w:pPr>
-        <w:pStyle w:val="Heading2"/>
-      </w:pPr>
-      <w:r>
-        <w:t xml:space="preserve">Skills</w:t>
-      </w:r>
-    </w:p>
-    <w:bookmarkStart w:id="32" w:name="technical-skills"/>
+    <w:bookmarkEnd w:id="32"/>
+    <w:bookmarkStart w:id="34" w:name="lead-developer-co-founder"/>
     <w:p>
       <w:pPr>
         <w:pStyle w:val="Heading3"/>
       </w:pPr>
       <w:r>
-        <w:t xml:space="preserve">Technical Skills</w:t>
-      </w:r>
-    </w:p>
-    <w:p>
-      <w:pPr>
-        <w:pStyle w:val="Compact"/>
-        <w:numPr>
-          <w:ilvl w:val="0"/>
-          <w:numId w:val="1005"/>
-        </w:numPr>
-      </w:pPr>
-      <w:r>
-        <w:rPr>
-          <w:b/>
-          <w:bCs/>
-        </w:rPr>
-        <w:t xml:space="preserve">Languages &amp; Frameworks</w:t>
-      </w:r>
-      <w:r>
-        <w:t xml:space="preserve">: Ruby on Rails, Python, Node.js, JavaScript, TypeScript, Bash.</w:t>
-      </w:r>
-    </w:p>
-    <w:p>
-      <w:pPr>
-        <w:pStyle w:val="Compact"/>
-        <w:numPr>
-          <w:ilvl w:val="0"/>
-          <w:numId w:val="1005"/>
-        </w:numPr>
-      </w:pPr>
-      <w:r>
-        <w:rPr>
-          <w:b/>
-          <w:bCs/>
-        </w:rPr>
-        <w:t xml:space="preserve">AI/LLM Development</w:t>
-      </w:r>
-      <w:r>
-        <w:t xml:space="preserve">: MCP (Model Context Protocol), chatbot development, prompt engineering, tool use, context augmentation, AI-assisted developer workflows.</w:t>
-      </w:r>
-    </w:p>
-    <w:p>
-      <w:pPr>
-        <w:pStyle w:val="Compact"/>
-        <w:numPr>
-          <w:ilvl w:val="0"/>
-          <w:numId w:val="1005"/>
-        </w:numPr>
-      </w:pPr>
-      <w:r>
-        <w:rPr>
-          <w:b/>
-          <w:bCs/>
-        </w:rPr>
-        <w:t xml:space="preserve">Databases</w:t>
-      </w:r>
-      <w:r>
-        <w:t xml:space="preserve">: MySQL, PostgreSQL, MongoDB, Redis, Cloud-based data services.</w:t>
-      </w:r>
-    </w:p>
-    <w:p>
-      <w:pPr>
-        <w:pStyle w:val="Compact"/>
-        <w:numPr>
-          <w:ilvl w:val="0"/>
-          <w:numId w:val="1005"/>
-        </w:numPr>
-      </w:pPr>
-      <w:r>
-        <w:rPr>
-          <w:b/>
-          <w:bCs/>
-        </w:rPr>
-        <w:t xml:space="preserve">Tools &amp; Platforms</w:t>
-      </w:r>
-      <w:r>
-        <w:t xml:space="preserve">: Kubernetes, AWS (Amazon Web Services), Google Cloud Platform, CircleCI, GitHub Actions, Terraform, Ansible, Pulumi, Linux, Git, Webpack, Cloudfront, Helm.</w:t>
-      </w:r>
-    </w:p>
-    <w:p>
-      <w:pPr>
-        <w:pStyle w:val="Compact"/>
-        <w:numPr>
-          <w:ilvl w:val="0"/>
-          <w:numId w:val="1005"/>
-        </w:numPr>
-      </w:pPr>
-      <w:r>
-        <w:rPr>
-          <w:b/>
-          <w:bCs/>
-        </w:rPr>
-        <w:t xml:space="preserve">Web Technologies</w:t>
-      </w:r>
-      <w:r>
-        <w:t xml:space="preserve">: HTML, CSS, Tailwind, Front-end Development, Responsive Design, Back-end Development, Distributed Systems, Web3/DWeb, Decentralized Technologies.</w:t>
-      </w:r>
-    </w:p>
-    <w:p>
-      <w:pPr>
-        <w:pStyle w:val="Compact"/>
-        <w:numPr>
-          <w:ilvl w:val="0"/>
-          <w:numId w:val="1005"/>
-        </w:numPr>
-      </w:pPr>
-      <w:r>
-        <w:rPr>
-          <w:b/>
-          <w:bCs/>
-        </w:rPr>
-        <w:t xml:space="preserve">Software Development</w:t>
-      </w:r>
-      <w:r>
-        <w:t xml:space="preserve">: Object-oriented programming (OOP), Functional Programming, API Design and Development, Automated Testing, Continuous Integration, Continuous Deployment, CI/CD, System Architecture, Microservices.</w:t>
-      </w:r>
-    </w:p>
-    <w:bookmarkEnd w:id="32"/>
-    <w:bookmarkStart w:id="33" w:name="methodologies"/>
+        <w:t xml:space="preserve">Lead Developer, Co-founder</w:t>
+      </w:r>
+    </w:p>
+    <w:bookmarkStart w:id="33" w:name="pegg-2014---2017-san-francisco-ca"/>
+    <w:p>
+      <w:pPr>
+        <w:pStyle w:val="Heading4"/>
+      </w:pPr>
+      <w:r>
+        <w:t xml:space="preserve">Pegg | 2014 - 2017 | San Francisco, CA</w:t>
+      </w:r>
+    </w:p>
+    <w:p>
+      <w:pPr>
+        <w:pStyle w:val="Compact"/>
+        <w:numPr>
+          <w:ilvl w:val="0"/>
+          <w:numId w:val="1006"/>
+        </w:numPr>
+      </w:pPr>
+      <w:r>
+        <w:t xml:space="preserve">Designed, architected, and built a cross-platform mobile app from scratch (iOS/Android). Node.js backend, JS/Phonegap frontend, Firebase real-time systems, CI/CD to AWS/CloudFront via CircleCI.</w:t>
+      </w:r>
+    </w:p>
+    <w:p>
+      <w:pPr>
+        <w:pStyle w:val="Compact"/>
+        <w:numPr>
+          <w:ilvl w:val="0"/>
+          <w:numId w:val="1006"/>
+        </w:numPr>
+      </w:pPr>
+      <w:r>
+        <w:t xml:space="preserve">Established engineering workflow: pair programming, automated testing (Karma/Chai), continuous integration, and rapid deployment processes.</w:t>
+      </w:r>
+    </w:p>
+    <w:p>
+      <w:pPr>
+        <w:pStyle w:val="Compact"/>
+        <w:numPr>
+          <w:ilvl w:val="0"/>
+          <w:numId w:val="1006"/>
+        </w:numPr>
+      </w:pPr>
+      <w:r>
+        <w:t xml:space="preserve">Co-led product strategy, monetization, and launch planning.</w:t>
+      </w:r>
+    </w:p>
+    <w:bookmarkEnd w:id="33"/>
+    <w:bookmarkEnd w:id="34"/>
+    <w:bookmarkStart w:id="35" w:name="earlier-career-2001---2014"/>
     <w:p>
       <w:pPr>
         <w:pStyle w:val="Heading3"/>
       </w:pPr>
       <w:r>
-        <w:t xml:space="preserve">Methodologies</w:t>
-      </w:r>
-    </w:p>
-    <w:p>
-      <w:pPr>
-        <w:pStyle w:val="Compact"/>
-        <w:numPr>
-          <w:ilvl w:val="0"/>
-          <w:numId w:val="1006"/>
-        </w:numPr>
-      </w:pPr>
-      <w:r>
-        <w:rPr>
-          <w:b/>
-          <w:bCs/>
-        </w:rPr>
-        <w:t xml:space="preserve">Project Management</w:t>
-      </w:r>
-      <w:r>
-        <w:t xml:space="preserve">: Agile, Pair Programming, Test-Driven Development (TDD), DevOps, Lean Thinking, Rapid Prototyping, Scrum, Kanban.</w:t>
-      </w:r>
-    </w:p>
-    <w:p>
-      <w:pPr>
-        <w:pStyle w:val="Compact"/>
-        <w:numPr>
-          <w:ilvl w:val="0"/>
-          <w:numId w:val="1006"/>
-        </w:numPr>
-      </w:pPr>
-      <w:r>
-        <w:rPr>
-          <w:b/>
-          <w:bCs/>
-        </w:rPr>
-        <w:t xml:space="preserve">Design &amp; Architecture</w:t>
-      </w:r>
-      <w:r>
-        <w:t xml:space="preserve">: Software Design Patterns, Systems Design, Infrastructure as Code (IAC), Data Pipeline Design, Cloud-Native Architecture, User Interface Design.</w:t>
-      </w:r>
-    </w:p>
-    <w:bookmarkEnd w:id="33"/>
-    <w:bookmarkStart w:id="34" w:name="organizational-soft-skills"/>
-    <w:p>
-      <w:pPr>
-        <w:pStyle w:val="Heading3"/>
-      </w:pPr>
-      <w:r>
-        <w:t xml:space="preserve">Organizational &amp; Soft Skills</w:t>
+        <w:t xml:space="preserve">Earlier Career (2001 - 2014)</w:t>
       </w:r>
     </w:p>
     <w:p>
@@ -714,10 +616,13 @@
           <w:b/>
           <w:bCs/>
         </w:rPr>
-        <w:t xml:space="preserve">Leadership &amp; Management</w:t>
-      </w:r>
-      <w:r>
-        <w:t xml:space="preserve">: Team Building, Cross-Functional Leadership, Coaching &amp; Mentoring, Talent Recruitment &amp; Development, High-Performance Team Management, Strategic Planning, Decision Making, Change Management.</w:t>
+        <w:t xml:space="preserve">Consultant &amp; Entrepreneur</w:t>
+      </w:r>
+      <w:r>
+        <w:t xml:space="preserve"> </w:t>
+      </w:r>
+      <w:r>
+        <w:t xml:space="preserve">(2008 - 2014): Founded OpenTest Pro (automated testing education). Built e-commerce ordering system for Turnbull &amp; Asser shirtmakers. Full-stack consulting in Ruby on Rails, Node.js, D3 data visualization. Rapid prototyping and client delivery.</w:t>
       </w:r>
     </w:p>
     <w:p>
@@ -733,10 +638,13 @@
           <w:b/>
           <w:bCs/>
         </w:rPr>
-        <w:t xml:space="preserve">Communication &amp; Collaboration</w:t>
-      </w:r>
-      <w:r>
-        <w:t xml:space="preserve">: Effective Communication, Stakeholder Engagement, Negotiation, Problem-Solving, Conflict Resolution, Customer-Oriented Approach.</w:t>
+        <w:t xml:space="preserve">Web Developer, OnForce, Inc</w:t>
+      </w:r>
+      <w:r>
+        <w:t xml:space="preserve"> </w:t>
+      </w:r>
+      <w:r>
+        <w:t xml:space="preserve">(2006 - 2007): Introduced automated testing and CI. Built comprehensive API test suite. Integrated platform with Salesforce APIs.</w:t>
       </w:r>
     </w:p>
     <w:p>
@@ -752,143 +660,32 @@
           <w:b/>
           <w:bCs/>
         </w:rPr>
-        <w:t xml:space="preserve">Innovation &amp; Creativity</w:t>
-      </w:r>
-      <w:r>
-        <w:t xml:space="preserve">: Entrepreneurship, Creative Problem Solving, Product Development and Innovation, Adaptive Learning, Forward-Thinking.</w:t>
-      </w:r>
-    </w:p>
-    <w:bookmarkEnd w:id="34"/>
-    <w:bookmarkStart w:id="35" w:name="additional-competencies"/>
-    <w:p>
-      <w:pPr>
-        <w:pStyle w:val="Heading3"/>
-      </w:pPr>
-      <w:r>
-        <w:t xml:space="preserve">Additional Competencies</w:t>
-      </w:r>
-    </w:p>
-    <w:p>
-      <w:pPr>
-        <w:pStyle w:val="Compact"/>
-        <w:numPr>
-          <w:ilvl w:val="0"/>
-          <w:numId w:val="1008"/>
-        </w:numPr>
-      </w:pPr>
-      <w:r>
-        <w:rPr>
-          <w:b/>
-          <w:bCs/>
-        </w:rPr>
-        <w:t xml:space="preserve">Industry Knowledge</w:t>
-      </w:r>
-      <w:r>
-        <w:t xml:space="preserve">: Software Engineering, Web Development, Cloud Computing, AI/ML Development, Startup Ecosystem, SaaS, PaaS, B2B Software, Humane Technology.</w:t>
-      </w:r>
-    </w:p>
-    <w:p>
-      <w:pPr>
-        <w:pStyle w:val="Compact"/>
-        <w:numPr>
-          <w:ilvl w:val="0"/>
-          <w:numId w:val="1008"/>
-        </w:numPr>
-      </w:pPr>
-      <w:r>
-        <w:rPr>
-          <w:b/>
-          <w:bCs/>
-        </w:rPr>
-        <w:t xml:space="preserve">Personal Attributes</w:t>
-      </w:r>
-      <w:r>
-        <w:t xml:space="preserve">: Resilient, Innovative, Dedicated, Entrepreneurial, Strategic Thinker, Out of the Box Thinker, Detail-Oriented, Analytical, Kind and Compassionate, Truth Seeker.</w:t>
+        <w:t xml:space="preserve">Development Lead, JBA Network</w:t>
+      </w:r>
+      <w:r>
+        <w:t xml:space="preserve"> </w:t>
+      </w:r>
+      <w:r>
+        <w:t xml:space="preserve">(2003 - 2006): Lead programmer and project manager for mynewsletterbuilder.com — architected initial release, then built and scaled the development team.</w:t>
       </w:r>
     </w:p>
     <w:bookmarkEnd w:id="35"/>
     <w:bookmarkEnd w:id="36"/>
-    <w:bookmarkStart w:id="39" w:name="education"/>
+    <w:bookmarkStart w:id="41" w:name="open-source-projects"/>
     <w:p>
       <w:pPr>
         <w:pStyle w:val="Heading2"/>
       </w:pPr>
       <w:r>
-        <w:t xml:space="preserve">Education</w:t>
-      </w:r>
-    </w:p>
-    <w:bookmarkStart w:id="38" w:name="bachelor-of-arts-in-mathematics"/>
+        <w:t xml:space="preserve">Open Source Projects</w:t>
+      </w:r>
+    </w:p>
+    <w:bookmarkStart w:id="38" w:name="scan-mcp-2024---present"/>
     <w:p>
       <w:pPr>
         <w:pStyle w:val="Heading3"/>
       </w:pPr>
       <w:r>
-        <w:t xml:space="preserve">Bachelor of Arts in Mathematics</w:t>
-      </w:r>
-    </w:p>
-    <w:bookmarkStart w:id="37" w:name="Xe220d86d70cd5bf8ee7040adf9411d63a6235ab"/>
-    <w:p>
-      <w:pPr>
-        <w:pStyle w:val="Heading4"/>
-      </w:pPr>
-      <w:r>
-        <w:t xml:space="preserve">University of North Carolina at Asheville | May 2003</w:t>
-      </w:r>
-    </w:p>
-    <w:p>
-      <w:pPr>
-        <w:pStyle w:val="Compact"/>
-        <w:numPr>
-          <w:ilvl w:val="0"/>
-          <w:numId w:val="1009"/>
-        </w:numPr>
-      </w:pPr>
-      <w:r>
-        <w:t xml:space="preserve">Minor in Computer Science.</w:t>
-      </w:r>
-    </w:p>
-    <w:p>
-      <w:pPr>
-        <w:pStyle w:val="Compact"/>
-        <w:numPr>
-          <w:ilvl w:val="0"/>
-          <w:numId w:val="1009"/>
-        </w:numPr>
-      </w:pPr>
-      <w:r>
-        <w:t xml:space="preserve">Graduated with distinction in Mathematics.</w:t>
-      </w:r>
-    </w:p>
-    <w:p>
-      <w:pPr>
-        <w:pStyle w:val="Compact"/>
-        <w:numPr>
-          <w:ilvl w:val="0"/>
-          <w:numId w:val="1009"/>
-        </w:numPr>
-      </w:pPr>
-      <w:r>
-        <w:t xml:space="preserve">Undergraduate research in 4D fractals.</w:t>
-      </w:r>
-    </w:p>
-    <w:bookmarkEnd w:id="37"/>
-    <w:bookmarkEnd w:id="38"/>
-    <w:bookmarkEnd w:id="39"/>
-    <w:bookmarkStart w:id="44" w:name="open-source-projects"/>
-    <w:p>
-      <w:pPr>
-        <w:pStyle w:val="Heading2"/>
-      </w:pPr>
-      <w:r>
-        <w:t xml:space="preserve">Open Source Projects</w:t>
-      </w:r>
-    </w:p>
-    <w:bookmarkStart w:id="41" w:name="scan-mcp-2024---present"/>
-    <w:p>
-      <w:pPr>
-        <w:pStyle w:val="Heading3"/>
-      </w:pPr>
-      <w:r>
         <w:t xml:space="preserve">Scan MCP (2024 - Present)</w:t>
       </w:r>
     </w:p>
@@ -897,14 +694,14 @@
         <w:pStyle w:val="FirstParagraph"/>
       </w:pPr>
       <w:r>
-        <w:t xml:space="preserve">MCP (Model Context Protocol) server for scanner automation and document digitization. Privacy-first architecture with smart device discovery, JSON Schema validation, and support for both local stdio and network HTTP transports. TypeScript/Node.js.</w:t>
+        <w:t xml:space="preserve">MCP (Model Context Protocol) server for scanner automation and document digitization. Privacy-first architecture with smart device discovery, JSON Schema validation, and support for both local stdio and network HTTP transports. Hands-on experience building agent-compatible tooling and integrations. TypeScript/Node.js.</w:t>
       </w:r>
     </w:p>
     <w:p>
       <w:pPr>
         <w:pStyle w:val="BodyText"/>
       </w:pPr>
-      <w:hyperlink r:id="rId40">
+      <w:hyperlink r:id="rId37">
         <w:r>
           <w:rPr>
             <w:rStyle w:val="Hyperlink"/>
@@ -913,8 +710,8 @@
         </w:r>
       </w:hyperlink>
     </w:p>
-    <w:bookmarkEnd w:id="41"/>
-    <w:bookmarkStart w:id="43" w:name="humanebench-2024---present"/>
+    <w:bookmarkEnd w:id="38"/>
+    <w:bookmarkStart w:id="40" w:name="humanebench-2024---present"/>
     <w:p>
       <w:pPr>
         <w:pStyle w:val="Heading3"/>
@@ -935,7 +732,7 @@
       <w:pPr>
         <w:pStyle w:val="BodyText"/>
       </w:pPr>
-      <w:hyperlink r:id="rId42">
+      <w:hyperlink r:id="rId39">
         <w:r>
           <w:rPr>
             <w:rStyle w:val="Hyperlink"/>
@@ -944,9 +741,194 @@
         </w:r>
       </w:hyperlink>
     </w:p>
+    <w:bookmarkEnd w:id="40"/>
+    <w:bookmarkEnd w:id="41"/>
+    <w:bookmarkStart w:id="42" w:name="skills"/>
+    <w:p>
+      <w:pPr>
+        <w:pStyle w:val="Heading2"/>
+      </w:pPr>
+      <w:r>
+        <w:t xml:space="preserve">Skills</w:t>
+      </w:r>
+    </w:p>
+    <w:p>
+      <w:pPr>
+        <w:pStyle w:val="Compact"/>
+        <w:numPr>
+          <w:ilvl w:val="0"/>
+          <w:numId w:val="1008"/>
+        </w:numPr>
+      </w:pPr>
+      <w:r>
+        <w:rPr>
+          <w:b/>
+          <w:bCs/>
+        </w:rPr>
+        <w:t xml:space="preserve">Languages &amp; Frameworks</w:t>
+      </w:r>
+      <w:r>
+        <w:t xml:space="preserve">: JavaScript, TypeScript, Python, Ruby on Rails, Node.js, Bash.</w:t>
+      </w:r>
+    </w:p>
+    <w:p>
+      <w:pPr>
+        <w:pStyle w:val="Compact"/>
+        <w:numPr>
+          <w:ilvl w:val="0"/>
+          <w:numId w:val="1008"/>
+        </w:numPr>
+      </w:pPr>
+      <w:r>
+        <w:rPr>
+          <w:b/>
+          <w:bCs/>
+        </w:rPr>
+        <w:t xml:space="preserve">Front-end</w:t>
+      </w:r>
+      <w:r>
+        <w:t xml:space="preserve">: React, Vue, HTML, CSS, Tailwind, Responsive Design, UI/UX.</w:t>
+      </w:r>
+    </w:p>
+    <w:p>
+      <w:pPr>
+        <w:pStyle w:val="Compact"/>
+        <w:numPr>
+          <w:ilvl w:val="0"/>
+          <w:numId w:val="1008"/>
+        </w:numPr>
+      </w:pPr>
+      <w:r>
+        <w:rPr>
+          <w:b/>
+          <w:bCs/>
+        </w:rPr>
+        <w:t xml:space="preserve">Back-end &amp; Data</w:t>
+      </w:r>
+      <w:r>
+        <w:t xml:space="preserve">: API Design, Microservices, Distributed Systems, PostgreSQL, MySQL, MongoDB, Redis.</w:t>
+      </w:r>
+    </w:p>
+    <w:p>
+      <w:pPr>
+        <w:pStyle w:val="Compact"/>
+        <w:numPr>
+          <w:ilvl w:val="0"/>
+          <w:numId w:val="1008"/>
+        </w:numPr>
+      </w:pPr>
+      <w:r>
+        <w:rPr>
+          <w:b/>
+          <w:bCs/>
+        </w:rPr>
+        <w:t xml:space="preserve">Cloud &amp; Infrastructure</w:t>
+      </w:r>
+      <w:r>
+        <w:t xml:space="preserve">: AWS, Google Cloud Platform, Kubernetes, Docker, Terraform, Ansible, Pulumi, Helm.</w:t>
+      </w:r>
+    </w:p>
+    <w:p>
+      <w:pPr>
+        <w:pStyle w:val="Compact"/>
+        <w:numPr>
+          <w:ilvl w:val="0"/>
+          <w:numId w:val="1008"/>
+        </w:numPr>
+      </w:pPr>
+      <w:r>
+        <w:rPr>
+          <w:b/>
+          <w:bCs/>
+        </w:rPr>
+        <w:t xml:space="preserve">CI/CD &amp; DevOps</w:t>
+      </w:r>
+      <w:r>
+        <w:t xml:space="preserve">: CircleCI, GitHub Actions, Automated Testing, TDD, Infrastructure as Code, Cloud-Native Architecture.</w:t>
+      </w:r>
+    </w:p>
+    <w:p>
+      <w:pPr>
+        <w:pStyle w:val="Compact"/>
+        <w:numPr>
+          <w:ilvl w:val="0"/>
+          <w:numId w:val="1008"/>
+        </w:numPr>
+      </w:pPr>
+      <w:r>
+        <w:rPr>
+          <w:b/>
+          <w:bCs/>
+        </w:rPr>
+        <w:t xml:space="preserve">AI/LLM</w:t>
+      </w:r>
+      <w:r>
+        <w:t xml:space="preserve">: MCP (Model Context Protocol), agent infrastructure, prompt/skill libraries, evaluation frameworks, LLMOps, knowledge systems, RAG, AI-assisted developer workflows.</w:t>
+      </w:r>
+    </w:p>
+    <w:p>
+      <w:pPr>
+        <w:pStyle w:val="Compact"/>
+        <w:numPr>
+          <w:ilvl w:val="0"/>
+          <w:numId w:val="1008"/>
+        </w:numPr>
+      </w:pPr>
+      <w:r>
+        <w:rPr>
+          <w:b/>
+          <w:bCs/>
+        </w:rPr>
+        <w:t xml:space="preserve">Leadership</w:t>
+      </w:r>
+      <w:r>
+        <w:t xml:space="preserve">: Team Building, Coaching &amp; Mentoring, Cross-Functional Collaboration, Roadmap Ownership, Hiring, Agile/Scrum/Kanban, Change Management.</w:t>
+      </w:r>
+    </w:p>
+    <w:bookmarkEnd w:id="42"/>
+    <w:bookmarkStart w:id="45" w:name="education"/>
+    <w:p>
+      <w:pPr>
+        <w:pStyle w:val="Heading2"/>
+      </w:pPr>
+      <w:r>
+        <w:t xml:space="preserve">Education</w:t>
+      </w:r>
+    </w:p>
+    <w:bookmarkStart w:id="44" w:name="X8aa14d071da44b7f3006e1d49a262db674bce64"/>
+    <w:p>
+      <w:pPr>
+        <w:pStyle w:val="Heading3"/>
+      </w:pPr>
+      <w:r>
+        <w:t xml:space="preserve">BA in Mathematics, minor in Computer Science</w:t>
+      </w:r>
+    </w:p>
+    <w:bookmarkStart w:id="43" w:name="Xe220d86d70cd5bf8ee7040adf9411d63a6235ab"/>
+    <w:p>
+      <w:pPr>
+        <w:pStyle w:val="Heading4"/>
+      </w:pPr>
+      <w:r>
+        <w:t xml:space="preserve">University of North Carolina at Asheville | May 2003</w:t>
+      </w:r>
+    </w:p>
+    <w:p>
+      <w:pPr>
+        <w:pStyle w:val="Compact"/>
+        <w:numPr>
+          <w:ilvl w:val="0"/>
+          <w:numId w:val="1009"/>
+        </w:numPr>
+      </w:pPr>
+      <w:r>
+        <w:t xml:space="preserve">Graduated with distinction in Mathematics. Undergraduate research in 4D fractals.</w:t>
+      </w:r>
+    </w:p>
     <w:bookmarkEnd w:id="43"/>
     <w:bookmarkEnd w:id="44"/>
-    <w:bookmarkStart w:id="45" w:name="recommendations"/>
+    <w:bookmarkEnd w:id="45"/>
+    <w:bookmarkStart w:id="46" w:name="recommendations"/>
     <w:p>
       <w:pPr>
         <w:pStyle w:val="Heading2"/>
@@ -1002,7 +984,7 @@
         <w:t xml:space="preserve">the solutions he architects, builds, and collaborates on come out better</w:t>
       </w:r>
       <w:r>
-        <w:t xml:space="preserve">. Jack also strives to be at the forefront of new technology and assess how he can leverage it. Newer tech like GenAI can be complex and ever-evolving, and Jack is not one to back down but step up and embrace. He does all this with a</w:t>
+        <w:t xml:space="preserve">. Jack also strives to be at the forefront of new technology and assess how he can leverage it. He does all this with a</w:t>
       </w:r>
       <w:r>
         <w:t xml:space="preserve"> </w:t>
@@ -1048,33 +1030,46 @@
         <w:pStyle w:val="BodyText"/>
       </w:pPr>
       <w:r>
-        <w:t xml:space="preserve">“Jack is a fantastic engineer always ready to</w:t>
-      </w:r>
-      <w:r>
-        <w:t xml:space="preserve"> </w:t>
-      </w:r>
-      <w:r>
-        <w:rPr>
-          <w:b/>
-          <w:bCs/>
-        </w:rPr>
-        <w:t xml:space="preserve">help solve problems and more importantly, teach you how to solve them</w:t>
-      </w:r>
-      <w:r>
-        <w:t xml:space="preserve">. He guided me and my team through a bunch of challenging GitOps situations with patience and kindness, leading by example. Always diligent with his work, willing to roll up his sleeves to get things done and</w:t>
-      </w:r>
-      <w:r>
-        <w:t xml:space="preserve"> </w:t>
-      </w:r>
-      <w:r>
-        <w:rPr>
-          <w:b/>
-          <w:bCs/>
-        </w:rPr>
-        <w:t xml:space="preserve">find creative solutions</w:t>
-      </w:r>
-      <w:r>
-        <w:t xml:space="preserve">, maybe tinkering in some kind of script that would make the manual processes easier and more resilient. Everyone would be lucky to have someone like him in their teams!”</w:t>
+        <w:t xml:space="preserve">“Jack has</w:t>
+      </w:r>
+      <w:r>
+        <w:t xml:space="preserve"> </w:t>
+      </w:r>
+      <w:r>
+        <w:rPr>
+          <w:b/>
+          <w:bCs/>
+        </w:rPr>
+        <w:t xml:space="preserve">had quite a profound impact on my career</w:t>
+      </w:r>
+      <w:r>
+        <w:t xml:space="preserve">. As a young engineer, I was fortunate enough to work with Jack as my coach. He served as a great mentor, helping me build both technical and professional skills and</w:t>
+      </w:r>
+      <w:r>
+        <w:t xml:space="preserve"> </w:t>
+      </w:r>
+      <w:r>
+        <w:rPr>
+          <w:b/>
+          <w:bCs/>
+        </w:rPr>
+        <w:t xml:space="preserve">forming me into the engineer that I am today</w:t>
+      </w:r>
+      <w:r>
+        <w:t xml:space="preserve">.</w:t>
+      </w:r>
+      <w:r>
+        <w:t xml:space="preserve"> </w:t>
+      </w:r>
+      <w:r>
+        <w:rPr>
+          <w:b/>
+          <w:bCs/>
+        </w:rPr>
+        <w:t xml:space="preserve">His mentorship was a key factor in elevating me from an incoming Junior Engineer to an Engineering Manager</w:t>
+      </w:r>
+      <w:r>
+        <w:t xml:space="preserve">. Jack has a great curiosity and a strong set of technical capabilities that allow him to serve as a great example for others and a key contributor to any team!”</w:t>
       </w:r>
     </w:p>
     <w:p>
@@ -1086,7 +1081,7 @@
           <w:i/>
           <w:iCs/>
         </w:rPr>
-        <w:t xml:space="preserve">— Cesar Palafox Garza, Principal Software Engineer, Kantata</w:t>
+        <w:t xml:space="preserve">— Wesley Morlock, Engineering Manager, Kantata</w:t>
       </w:r>
     </w:p>
     <w:p>
@@ -1094,46 +1089,33 @@
         <w:pStyle w:val="BodyText"/>
       </w:pPr>
       <w:r>
-        <w:t xml:space="preserve">“Jack has</w:t>
-      </w:r>
-      <w:r>
-        <w:t xml:space="preserve"> </w:t>
-      </w:r>
-      <w:r>
-        <w:rPr>
-          <w:b/>
-          <w:bCs/>
-        </w:rPr>
-        <w:t xml:space="preserve">had quite a profound impact on my career</w:t>
-      </w:r>
-      <w:r>
-        <w:t xml:space="preserve">. As a young engineer, I was fortunate enough to work with Jack as my coach. He served as a great mentor, helping me build both technical and professional skills and</w:t>
-      </w:r>
-      <w:r>
-        <w:t xml:space="preserve"> </w:t>
-      </w:r>
-      <w:r>
-        <w:rPr>
-          <w:b/>
-          <w:bCs/>
-        </w:rPr>
-        <w:t xml:space="preserve">forming me into the engineer that I am today</w:t>
-      </w:r>
-      <w:r>
-        <w:t xml:space="preserve">. Throughout our time together, Jack was caring and invested in helping me set goals and develop my career.</w:t>
-      </w:r>
-      <w:r>
-        <w:t xml:space="preserve"> </w:t>
-      </w:r>
-      <w:r>
-        <w:rPr>
-          <w:b/>
-          <w:bCs/>
-        </w:rPr>
-        <w:t xml:space="preserve">His mentorship was a key factor in elevating me from an incoming Junior Engineer to an Engineering Manager</w:t>
-      </w:r>
-      <w:r>
-        <w:t xml:space="preserve">. Jack has a great curiosity and a strong set of technical capabilities that allow him to serve as a great example for others and a key contributor to any team!”</w:t>
+        <w:t xml:space="preserve">“Jack is a fantastic engineer always ready to</w:t>
+      </w:r>
+      <w:r>
+        <w:t xml:space="preserve"> </w:t>
+      </w:r>
+      <w:r>
+        <w:rPr>
+          <w:b/>
+          <w:bCs/>
+        </w:rPr>
+        <w:t xml:space="preserve">help solve problems and more importantly, teach you how to solve them</w:t>
+      </w:r>
+      <w:r>
+        <w:t xml:space="preserve">. He guided me and my team through a bunch of challenging GitOps situations with patience and kindness, leading by example. Always diligent with his work, willing to roll up his sleeves to get things done and</w:t>
+      </w:r>
+      <w:r>
+        <w:t xml:space="preserve"> </w:t>
+      </w:r>
+      <w:r>
+        <w:rPr>
+          <w:b/>
+          <w:bCs/>
+        </w:rPr>
+        <w:t xml:space="preserve">find creative solutions</w:t>
+      </w:r>
+      <w:r>
+        <w:t xml:space="preserve">. Everyone would be lucky to have someone like him in their teams!”</w:t>
       </w:r>
     </w:p>
     <w:p>
@@ -1145,7 +1127,7 @@
           <w:i/>
           <w:iCs/>
         </w:rPr>
-        <w:t xml:space="preserve">— Wesley Morlock, Engineering Manager, Kantata</w:t>
+        <w:t xml:space="preserve">— Cesar Palafox Garza, Principal Software Engineer, Kantata</w:t>
       </w:r>
     </w:p>
     <w:p>
@@ -1153,20 +1135,33 @@
         <w:pStyle w:val="BodyText"/>
       </w:pPr>
       <w:r>
-        <w:t xml:space="preserve">“Jack provided invaluable leadership as a Principal Software Engineer at Kantata. He was a powerful voice for the technology but made sure to</w:t>
-      </w:r>
-      <w:r>
-        <w:t xml:space="preserve"> </w:t>
-      </w:r>
-      <w:r>
-        <w:rPr>
-          <w:b/>
-          <w:bCs/>
-        </w:rPr>
-        <w:t xml:space="preserve">advocate for changes that were also certain to provide immediate impact to the customer</w:t>
-      </w:r>
-      <w:r>
-        <w:t xml:space="preserve">. I highly recommend Jack as an excellent dev ops engineer and as a technical leader.”</w:t>
+        <w:t xml:space="preserve">“Jack is</w:t>
+      </w:r>
+      <w:r>
+        <w:t xml:space="preserve"> </w:t>
+      </w:r>
+      <w:r>
+        <w:rPr>
+          <w:b/>
+          <w:bCs/>
+        </w:rPr>
+        <w:t xml:space="preserve">awesome at understanding the direction teams need to go to make important improvements in Kantata’s Engineering organization as a whole</w:t>
+      </w:r>
+      <w:r>
+        <w:t xml:space="preserve">. He has been instrumental in building and implementing strategies to upgrade Ruby, Rails, and React. If I had any questions about infrastructure and Kubernetes he would be able to answer and</w:t>
+      </w:r>
+      <w:r>
+        <w:t xml:space="preserve"> </w:t>
+      </w:r>
+      <w:r>
+        <w:rPr>
+          <w:b/>
+          <w:bCs/>
+        </w:rPr>
+        <w:t xml:space="preserve">provide solid explanations to the entire team</w:t>
+      </w:r>
+      <w:r>
+        <w:t xml:space="preserve">.”</w:t>
       </w:r>
     </w:p>
     <w:p>
@@ -1178,223 +1173,24 @@
           <w:i/>
           <w:iCs/>
         </w:rPr>
-        <w:t xml:space="preserve">— Nathan Perry, Principal Software Engineer, Kantata</w:t>
+        <w:t xml:space="preserve">— Justin Hurstwright, Principal Software Engineer, Kantata</w:t>
       </w:r>
     </w:p>
     <w:p>
       <w:pPr>
         <w:pStyle w:val="BodyText"/>
       </w:pPr>
-      <w:r>
-        <w:t xml:space="preserve">“Jack is talented both as a software developer and as an operations engineer. While working together in a Principal Engineer capacity, I saw how</w:t>
-      </w:r>
-      <w:r>
-        <w:t xml:space="preserve"> </w:t>
-      </w:r>
-      <w:r>
-        <w:rPr>
-          <w:b/>
-          <w:bCs/>
-        </w:rPr>
-        <w:t xml:space="preserve">passionate Jack is about helping his colleagues and his organization level up</w:t>
-      </w:r>
-      <w:r>
-        <w:t xml:space="preserve">. He is a great engineer with excellent leadership and organizational abilities.”</w:t>
-      </w:r>
-    </w:p>
-    <w:p>
-      <w:pPr>
-        <w:pStyle w:val="BodyText"/>
-      </w:pPr>
-      <w:r>
-        <w:rPr>
-          <w:i/>
-          <w:iCs/>
-        </w:rPr>
-        <w:t xml:space="preserve">— Jason Larsen, Software Engineering Manager, Kantata</w:t>
-      </w:r>
-    </w:p>
-    <w:p>
-      <w:pPr>
-        <w:pStyle w:val="BodyText"/>
-      </w:pPr>
-      <w:r>
-        <w:t xml:space="preserve">“Jack is a great co-worker. He is</w:t>
-      </w:r>
-      <w:r>
-        <w:t xml:space="preserve"> </w:t>
-      </w:r>
-      <w:r>
-        <w:rPr>
-          <w:b/>
-          <w:bCs/>
-        </w:rPr>
-        <w:t xml:space="preserve">awesome at understanding the direction teams need to go to make important improvements in Kantata’s Engineering organization as a whole</w:t>
-      </w:r>
-      <w:r>
-        <w:t xml:space="preserve">. He has been instrumental in building and implementing strategies to upgrade Ruby, Rails, and React. If I had any questions about infrastructure and Kubernetes he would be able to answer and</w:t>
-      </w:r>
-      <w:r>
-        <w:t xml:space="preserve"> </w:t>
-      </w:r>
-      <w:r>
-        <w:rPr>
-          <w:b/>
-          <w:bCs/>
-        </w:rPr>
-        <w:t xml:space="preserve">provide solid explanations to the entire team</w:t>
-      </w:r>
-      <w:r>
-        <w:t xml:space="preserve">.”</w:t>
-      </w:r>
-    </w:p>
-    <w:p>
-      <w:pPr>
-        <w:pStyle w:val="BodyText"/>
-      </w:pPr>
-      <w:r>
-        <w:rPr>
-          <w:i/>
-          <w:iCs/>
-        </w:rPr>
-        <w:t xml:space="preserve">— Justin Hurstwright, Principal Software Engineer, Kantata</w:t>
-      </w:r>
-    </w:p>
-    <w:p>
-      <w:pPr>
-        <w:pStyle w:val="BodyText"/>
-      </w:pPr>
-      <w:r>
-        <w:t xml:space="preserve">“Jack is a phenomenal resource to work with. He is</w:t>
-      </w:r>
-      <w:r>
-        <w:t xml:space="preserve"> </w:t>
-      </w:r>
-      <w:r>
-        <w:rPr>
-          <w:b/>
-          <w:bCs/>
-        </w:rPr>
-        <w:t xml:space="preserve">very knowledgeable about programming and cloud infrastructure</w:t>
-      </w:r>
-      <w:r>
-        <w:t xml:space="preserve"> </w:t>
-      </w:r>
-      <w:r>
-        <w:t xml:space="preserve">and is always eager to learn new things.”</w:t>
-      </w:r>
-    </w:p>
-    <w:p>
-      <w:pPr>
-        <w:pStyle w:val="BodyText"/>
-      </w:pPr>
-      <w:r>
-        <w:rPr>
-          <w:i/>
-          <w:iCs/>
-        </w:rPr>
-        <w:t xml:space="preserve">— Donovan Hubbard, Senior DevOps Engineer, Kantata</w:t>
-      </w:r>
-    </w:p>
-    <w:p>
-      <w:pPr>
-        <w:pStyle w:val="BodyText"/>
-      </w:pPr>
-      <w:r>
-        <w:t xml:space="preserve">“Jack has a flair for finding better, faster, and more reliable ways to get things done. He</w:t>
-      </w:r>
-      <w:r>
-        <w:t xml:space="preserve"> </w:t>
-      </w:r>
-      <w:r>
-        <w:rPr>
-          <w:b/>
-          <w:bCs/>
-        </w:rPr>
-        <w:t xml:space="preserve">advocates best practices, like unit testing, and has a deep knowledge of OO architecture</w:t>
-      </w:r>
-      <w:r>
-        <w:t xml:space="preserve">. Jack thinks on his toes, and will always be there with the team at 4 a.m. if circumstance requires it.</w:t>
-      </w:r>
-      <w:r>
-        <w:t xml:space="preserve"> </w:t>
-      </w:r>
-      <w:r>
-        <w:rPr>
-          <w:rStyle w:val="VerbatimChar"/>
-        </w:rPr>
-        <w:t xml:space="preserve">:%s/average developers/developers like jack/g</w:t>
-      </w:r>
-      <w:r>
-        <w:t xml:space="preserve"> </w:t>
-      </w:r>
-      <w:r>
-        <w:t xml:space="preserve">if you know what’s good for you.”</w:t>
-      </w:r>
-    </w:p>
-    <w:p>
-      <w:pPr>
-        <w:pStyle w:val="BodyText"/>
-      </w:pPr>
-      <w:r>
-        <w:rPr>
-          <w:i/>
-          <w:iCs/>
-        </w:rPr>
-        <w:t xml:space="preserve">— Greg Whitescarver, Founder, Mojave</w:t>
-      </w:r>
-    </w:p>
-    <w:p>
-      <w:pPr>
-        <w:pStyle w:val="BodyText"/>
-      </w:pPr>
-      <w:r>
-        <w:t xml:space="preserve">“With Jack,</w:t>
-      </w:r>
-      <w:r>
-        <w:t xml:space="preserve"> </w:t>
-      </w:r>
-      <w:r>
-        <w:rPr>
-          <w:b/>
-          <w:bCs/>
-        </w:rPr>
-        <w:t xml:space="preserve">the more complex the problem, the more simple his solutions</w:t>
-      </w:r>
-      <w:r>
-        <w:t xml:space="preserve">. From eradicating dynamic php bugs to providing innovative javascript capabilities, Master Senechal is more than a mind to be reckoned with, he’s an</w:t>
-      </w:r>
-      <w:r>
-        <w:t xml:space="preserve"> </w:t>
-      </w:r>
-      <w:r>
-        <w:rPr>
-          <w:b/>
-          <w:bCs/>
-        </w:rPr>
-        <w:t xml:space="preserve">integrative capacity builder</w:t>
-      </w:r>
-      <w:r>
-        <w:t xml:space="preserve"> </w:t>
-      </w:r>
-      <w:r>
-        <w:t xml:space="preserve">with a wide range of technological expertise. If there is anything that can be done through web development, Jack can figure out how to do it, and make it happen.”</w:t>
-      </w:r>
-    </w:p>
-    <w:p>
-      <w:pPr>
-        <w:pStyle w:val="BodyText"/>
-      </w:pPr>
-      <w:r>
-        <w:rPr>
-          <w:i/>
-          <w:iCs/>
-        </w:rPr>
-        <w:t xml:space="preserve">— Adam Apollo, Cofounder &amp; CEO, Superluminal Systems</w:t>
-      </w:r>
-    </w:p>
-    <w:bookmarkEnd w:id="45"/>
+      <w:hyperlink r:id="rId22">
+        <w:r>
+          <w:rPr>
+            <w:rStyle w:val="Hyperlink"/>
+          </w:rPr>
+          <w:t xml:space="preserve">See additional recommendations on LinkedIn</w:t>
+        </w:r>
+      </w:hyperlink>
+    </w:p>
     <w:bookmarkEnd w:id="46"/>
+    <w:bookmarkEnd w:id="47"/>
     <w:sectPr/>
   </w:body>
 </w:document>

</xml_diff>

<commit_message>
Tailor resume for ForUsAll Senior Ruby on Rails AI Systems Engineer
</commit_message>
<xml_diff>
--- a/resume.docx
+++ b/resume.docx
@@ -2,7 +2,7 @@
 <file path=word/document.xml><?xml version="1.0" encoding="utf-8"?>
 <w:document xmlns:w="http://schemas.openxmlformats.org/wordprocessingml/2006/main" xmlns:m="http://schemas.openxmlformats.org/officeDocument/2006/math" xmlns:r="http://schemas.openxmlformats.org/officeDocument/2006/relationships" xmlns:o="urn:schemas-microsoft-com:office:office" xmlns:v="urn:schemas-microsoft-com:vml" xmlns:w10="urn:schemas-microsoft-com:office:word" xmlns:a="http://schemas.openxmlformats.org/drawingml/2006/main" xmlns:pic="http://schemas.openxmlformats.org/drawingml/2006/picture" xmlns:wp="http://schemas.openxmlformats.org/drawingml/2006/wordprocessingDrawing">
   <w:body>
-    <w:bookmarkStart w:id="46" w:name="jack-senechal"/>
+    <w:bookmarkStart w:id="47" w:name="jack-senechal"/>
     <w:p>
       <w:pPr>
         <w:pStyle w:val="Heading1"/>
@@ -11,13 +11,13 @@
         <w:t xml:space="preserve">Jack Senechal</w:t>
       </w:r>
     </w:p>
-    <w:bookmarkStart w:id="23" w:name="engineering-leader-entrepreneur"/>
+    <w:bookmarkStart w:id="23" w:name="Xcbedefee9f8692a04e85db9d412449e8cc56811"/>
     <w:p>
       <w:pPr>
         <w:pStyle w:val="Heading2"/>
       </w:pPr>
       <w:r>
-        <w:t xml:space="preserve">Engineering Leader / Entrepreneur</w:t>
+        <w:t xml:space="preserve">Senior Ruby on Rails Engineer &amp; AI Systems Builder</w:t>
       </w:r>
     </w:p>
     <w:p>
@@ -32,13 +32,13 @@
         <w:t xml:space="preserve">Located in Novato, CA</w:t>
       </w:r>
       <w:r>
-        <w:br/>
+        <w:t xml:space="preserve"> </w:t>
       </w:r>
       <w:r>
         <w:t xml:space="preserve">Phone: 415-779-2701</w:t>
       </w:r>
       <w:r>
-        <w:br/>
+        <w:t xml:space="preserve"> </w:t>
       </w:r>
       <w:r>
         <w:t xml:space="preserve">Email:</w:t>
@@ -55,7 +55,7 @@
         </w:r>
       </w:hyperlink>
       <w:r>
-        <w:br/>
+        <w:t xml:space="preserve"> </w:t>
       </w:r>
       <w:r>
         <w:t xml:space="preserve">GitHub:</w:t>
@@ -68,11 +68,11 @@
           <w:rPr>
             <w:rStyle w:val="Hyperlink"/>
           </w:rPr>
-          <w:t xml:space="preserve">https://github.com/jacksenechal</w:t>
+          <w:t xml:space="preserve">github.com/jacksenechal</w:t>
         </w:r>
       </w:hyperlink>
       <w:r>
-        <w:br/>
+        <w:t xml:space="preserve"> </w:t>
       </w:r>
       <w:r>
         <w:t xml:space="preserve">LinkedIn:</w:t>
@@ -85,7 +85,7 @@
           <w:rPr>
             <w:rStyle w:val="Hyperlink"/>
           </w:rPr>
-          <w:t xml:space="preserve">https://linkedin.com/in/jacksenechal</w:t>
+          <w:t xml:space="preserve">linkedin.com/in/jacksenechal</w:t>
         </w:r>
       </w:hyperlink>
     </w:p>
@@ -108,39 +108,17 @@
         </w:numPr>
       </w:pPr>
       <w:r>
-        <w:t xml:space="preserve">Proven leader in software development, infrastructure, and</w:t>
-      </w:r>
-      <w:r>
-        <w:t xml:space="preserve"> </w:t>
-      </w:r>
-      <w:r>
-        <w:rPr>
-          <w:b/>
-          <w:bCs/>
-        </w:rPr>
-        <w:t xml:space="preserve">team management</w:t>
-      </w:r>
-      <w:r>
-        <w:t xml:space="preserve"> </w:t>
-      </w:r>
-      <w:r>
-        <w:t xml:space="preserve">with</w:t>
-      </w:r>
-      <w:r>
-        <w:t xml:space="preserve"> </w:t>
-      </w:r>
-      <w:r>
-        <w:rPr>
-          <w:b/>
-          <w:bCs/>
-        </w:rPr>
-        <w:t xml:space="preserve">15+ years</w:t>
-      </w:r>
-      <w:r>
-        <w:t xml:space="preserve"> </w:t>
-      </w:r>
-      <w:r>
-        <w:t xml:space="preserve">of hands-on experience</w:t>
+        <w:rPr>
+          <w:b/>
+          <w:bCs/>
+        </w:rPr>
+        <w:t xml:space="preserve">Senior full-stack Rails engineer</w:t>
+      </w:r>
+      <w:r>
+        <w:t xml:space="preserve"> </w:t>
+      </w:r>
+      <w:r>
+        <w:t xml:space="preserve">with 15+ years building production systems — currently deep in integrating AI/LLMs into the full stack</w:t>
       </w:r>
     </w:p>
     <w:p>
@@ -152,6 +130,52 @@
         </w:numPr>
       </w:pPr>
       <w:r>
+        <w:t xml:space="preserve">Rails practitioner since 2008, with hands-on experience in background job systems, PostgreSQL, and modern frontend patterns (Hotwire, StimulusJS)</w:t>
+      </w:r>
+    </w:p>
+    <w:p>
+      <w:pPr>
+        <w:pStyle w:val="Compact"/>
+        <w:numPr>
+          <w:ilvl w:val="0"/>
+          <w:numId w:val="1001"/>
+        </w:numPr>
+      </w:pPr>
+      <w:r>
+        <w:rPr>
+          <w:b/>
+          <w:bCs/>
+        </w:rPr>
+        <w:t xml:space="preserve">6+ years leading teams</w:t>
+      </w:r>
+      <w:r>
+        <w:t xml:space="preserve"> </w:t>
+      </w:r>
+      <w:r>
+        <w:t xml:space="preserve">across integrations, infrastructure, and product domains</w:t>
+      </w:r>
+    </w:p>
+    <w:p>
+      <w:pPr>
+        <w:pStyle w:val="Compact"/>
+        <w:numPr>
+          <w:ilvl w:val="0"/>
+          <w:numId w:val="1001"/>
+        </w:numPr>
+      </w:pPr>
+      <w:r>
+        <w:t xml:space="preserve">Currently building AI-powered apps using LLM APIs, tool use, multi-agent workflows, and eval frameworks</w:t>
+      </w:r>
+    </w:p>
+    <w:p>
+      <w:pPr>
+        <w:pStyle w:val="Compact"/>
+        <w:numPr>
+          <w:ilvl w:val="0"/>
+          <w:numId w:val="1001"/>
+        </w:numPr>
+      </w:pPr>
+      <w:r>
         <w:t xml:space="preserve">Committed</w:t>
       </w:r>
       <w:r>
@@ -165,7 +189,10 @@
         <w:t xml:space="preserve">mentor and coach</w:t>
       </w:r>
       <w:r>
-        <w:t xml:space="preserve">, elevating team members’ skill sets and fostering professional growth</w:t>
+        <w:t xml:space="preserve"> </w:t>
+      </w:r>
+      <w:r>
+        <w:t xml:space="preserve">who elevated junior engineers to senior and engineering management roles</w:t>
       </w:r>
     </w:p>
     <w:p>
@@ -177,87 +204,11 @@
         </w:numPr>
       </w:pPr>
       <w:r>
-        <w:t xml:space="preserve">Strategic thinker, mercurial innovator, and expert problem solver</w:t>
-      </w:r>
-    </w:p>
-    <w:p>
-      <w:pPr>
-        <w:pStyle w:val="Compact"/>
-        <w:numPr>
-          <w:ilvl w:val="0"/>
-          <w:numId w:val="1001"/>
-        </w:numPr>
-      </w:pPr>
-      <w:r>
-        <w:t xml:space="preserve">Resilient and dedicated, ready to embrace challenges and opportunities</w:t>
-      </w:r>
-    </w:p>
-    <w:p>
-      <w:pPr>
-        <w:pStyle w:val="Compact"/>
-        <w:numPr>
-          <w:ilvl w:val="0"/>
-          <w:numId w:val="1001"/>
-        </w:numPr>
-      </w:pPr>
-      <w:r>
-        <w:t xml:space="preserve">Strong customer focus,</w:t>
-      </w:r>
-      <w:r>
-        <w:t xml:space="preserve"> </w:t>
-      </w:r>
-      <w:r>
-        <w:rPr>
-          <w:b/>
-          <w:bCs/>
-        </w:rPr>
-        <w:t xml:space="preserve">advocating for impactful changes</w:t>
-      </w:r>
-      <w:r>
-        <w:t xml:space="preserve"> </w:t>
-      </w:r>
-      <w:r>
-        <w:t xml:space="preserve">and ensuring product value</w:t>
-      </w:r>
-    </w:p>
-    <w:p>
-      <w:pPr>
-        <w:pStyle w:val="Compact"/>
-        <w:numPr>
-          <w:ilvl w:val="0"/>
-          <w:numId w:val="1001"/>
-        </w:numPr>
-      </w:pPr>
-      <w:r>
-        <w:t xml:space="preserve">Entrepreneurial spirit with multiple co-founding experiences</w:t>
-      </w:r>
-    </w:p>
-    <w:p>
-      <w:pPr>
-        <w:pStyle w:val="Compact"/>
-        <w:numPr>
-          <w:ilvl w:val="0"/>
-          <w:numId w:val="1001"/>
-        </w:numPr>
-      </w:pPr>
-      <w:r>
-        <w:t xml:space="preserve">Principal-level engineer specializing in AI-powered developer tooling, platform modernization, and large-scale engineering productivity</w:t>
-      </w:r>
-    </w:p>
-    <w:p>
-      <w:pPr>
-        <w:pStyle w:val="Compact"/>
-        <w:numPr>
-          <w:ilvl w:val="0"/>
-          <w:numId w:val="1001"/>
-        </w:numPr>
-      </w:pPr>
-      <w:r>
-        <w:t xml:space="preserve">Full-stack generalist with deep experience applying AI/LLMs, DevOps, and cloud-native systems to accelerate software delivery</w:t>
+        <w:t xml:space="preserve">Entrepreneurial spirit with multiple co-founding experiences; strong customer focus</w:t>
       </w:r>
     </w:p>
     <w:bookmarkEnd w:id="24"/>
-    <w:bookmarkStart w:id="31" w:name="industry-experience"/>
+    <w:bookmarkStart w:id="36" w:name="industry-experience"/>
     <w:p>
       <w:pPr>
         <w:pStyle w:val="Heading2"/>
@@ -275,13 +226,13 @@
         <w:t xml:space="preserve">Technical Lead</w:t>
       </w:r>
     </w:p>
-    <w:bookmarkStart w:id="25" w:name="X75167482f34e06a01a656d1f4cef9a03bec6c7a"/>
+    <w:bookmarkStart w:id="25" w:name="X6dafa89e46c32694395442a9a6ca99eae379ab9"/>
     <w:p>
       <w:pPr>
         <w:pStyle w:val="Heading4"/>
       </w:pPr>
       <w:r>
-        <w:t xml:space="preserve">Building Humane Technology | June 2025 - Present | Remote (US)</w:t>
+        <w:t xml:space="preserve">Building Humane Technology | June 2025 - Present | Remote</w:t>
       </w:r>
     </w:p>
     <w:p>
@@ -293,7 +244,7 @@
         </w:numPr>
       </w:pPr>
       <w:r>
-        <w:t xml:space="preserve">Co-architecting and leading development of HumaneBench.ai, an open-source benchmark for evaluating AI systems against humane technology principles.</w:t>
+        <w:t xml:space="preserve">Co-architecting and leading development of HumaneBench.ai, an open-source AI evaluation framework built on AISI Inspect. Python.</w:t>
       </w:r>
     </w:p>
     <w:p>
@@ -305,7 +256,7 @@
         </w:numPr>
       </w:pPr>
       <w:r>
-        <w:t xml:space="preserve">Developing an extensible AI evaluation framework built on AISI Inspect, focused on measuring and improving LLM behavior in real-world developer and operational workflows.</w:t>
+        <w:t xml:space="preserve">Developing extensible evaluation tooling focused on measuring and improving LLM behavior in real-world developer and operational workflows.</w:t>
       </w:r>
     </w:p>
     <w:p>
@@ -317,51 +268,27 @@
         </w:numPr>
       </w:pPr>
       <w:r>
-        <w:t xml:space="preserve">Shaping product and technical roadmap for AI-driven tooling, including production monitoring concepts, multi-turn evaluation, and maturity models to support adoption, measurement, and continuous improvement.</w:t>
-      </w:r>
-    </w:p>
-    <w:p>
-      <w:pPr>
-        <w:pStyle w:val="Compact"/>
-        <w:numPr>
-          <w:ilvl w:val="0"/>
-          <w:numId w:val="1002"/>
-        </w:numPr>
-      </w:pPr>
-      <w:r>
-        <w:t xml:space="preserve">Contributing to education initiatives including Humane Tech and Agentic AI training for the UN Secretariat and broader developer community, plus coordinating hackathons and public AMAs.</w:t>
-      </w:r>
-    </w:p>
-    <w:p>
-      <w:pPr>
-        <w:pStyle w:val="Compact"/>
-        <w:numPr>
-          <w:ilvl w:val="0"/>
-          <w:numId w:val="1002"/>
-        </w:numPr>
-      </w:pPr>
-      <w:r>
-        <w:t xml:space="preserve">Building partnerships and fostering open-source community engagement around humane AI evaluation standards.</w:t>
+        <w:t xml:space="preserve">Shaping product and technical roadmap for AI-driven tooling, including production monitoring, multi-turn evaluation, and maturity models for adoption and continuous improvement.</w:t>
       </w:r>
     </w:p>
     <w:bookmarkEnd w:id="25"/>
     <w:bookmarkEnd w:id="26"/>
-    <w:bookmarkStart w:id="28" w:name="infrastructure-engineer"/>
+    <w:bookmarkStart w:id="28" w:name="co-founder-lead-developer"/>
     <w:p>
       <w:pPr>
         <w:pStyle w:val="Heading3"/>
       </w:pPr>
       <w:r>
-        <w:t xml:space="preserve">Infrastructure Engineer</w:t>
-      </w:r>
-    </w:p>
-    <w:bookmarkStart w:id="27" w:name="tobiko-mar-2024---oct-2024-remote-us"/>
+        <w:t xml:space="preserve">Co-founder &amp; Lead Developer</w:t>
+      </w:r>
+    </w:p>
+    <w:bookmarkStart w:id="27" w:name="Xffd4b369c0bcf0f7e3f28f0e84324bac520d95a"/>
     <w:p>
       <w:pPr>
         <w:pStyle w:val="Heading4"/>
       </w:pPr>
       <w:r>
-        <w:t xml:space="preserve">Tobiko | Mar 2024 - Oct 2024 | Remote (US)</w:t>
+        <w:t xml:space="preserve">Mirror Astrology | Nov 2024 - Present | Remote</w:t>
       </w:r>
     </w:p>
     <w:p>
@@ -373,7 +300,7 @@
         </w:numPr>
       </w:pPr>
       <w:r>
-        <w:t xml:space="preserve">Collaborated with a fast-paced team to architect and implement a robust, scalable, modern cloud platform serving customer workloads.</w:t>
+        <w:t xml:space="preserve">Owned full-stack development: Ruby on Rails, JavaScript, HTML+CSS, Tailwind, responsive UI/UX.</w:t>
       </w:r>
     </w:p>
     <w:p>
@@ -385,7 +312,7 @@
         </w:numPr>
       </w:pPr>
       <w:r>
-        <w:t xml:space="preserve">Built out CI/CD patterns including mono-repo conditional workflows, workload identity federation, and continuous delivery.</w:t>
+        <w:t xml:space="preserve">Built AI chatbot integrating multiple LLMs with complex prompting, tool use, and context augmentation.</w:t>
       </w:r>
     </w:p>
     <w:p>
@@ -397,39 +324,27 @@
         </w:numPr>
       </w:pPr>
       <w:r>
-        <w:t xml:space="preserve">Implemented a Slack-based customer support and incident response platform, and onboarded teammates and customers.</w:t>
-      </w:r>
-    </w:p>
-    <w:p>
-      <w:pPr>
-        <w:pStyle w:val="Compact"/>
-        <w:numPr>
-          <w:ilvl w:val="0"/>
-          <w:numId w:val="1003"/>
-        </w:numPr>
-      </w:pPr>
-      <w:r>
-        <w:t xml:space="preserve">Python, Pulumi, Google Cloud Platform, Google Kubernetes Engine, Google Cloud Run, CI/CD with CircleCI, Helm, SQLMesh.</w:t>
+        <w:t xml:space="preserve">Collaborated closely with co-founders on product direction, Figma design, UX, roadmap planning, and prioritization.</w:t>
       </w:r>
     </w:p>
     <w:bookmarkEnd w:id="27"/>
     <w:bookmarkEnd w:id="28"/>
-    <w:bookmarkStart w:id="30" w:name="X7a2c313efdde198d901363c762c81839771c845"/>
+    <w:bookmarkStart w:id="30" w:name="infrastructure-engineer"/>
     <w:p>
       <w:pPr>
         <w:pStyle w:val="Heading3"/>
       </w:pPr>
       <w:r>
-        <w:t xml:space="preserve">Engineering Manager / Principal Software Engineer</w:t>
-      </w:r>
-    </w:p>
-    <w:bookmarkStart w:id="29" w:name="X47289269eb944414c9285d314973b45c253bcef"/>
+        <w:t xml:space="preserve">Infrastructure Engineer</w:t>
+      </w:r>
+    </w:p>
+    <w:bookmarkStart w:id="29" w:name="tobiko-mar-2024---oct-2024-remote"/>
     <w:p>
       <w:pPr>
         <w:pStyle w:val="Heading4"/>
       </w:pPr>
       <w:r>
-        <w:t xml:space="preserve">Mavenlink / Kantata | Apr 2017 - Dec 2023 | San Francisco, CA</w:t>
+        <w:t xml:space="preserve">Tobiko | Mar 2024 - Oct 2024 | Remote</w:t>
       </w:r>
     </w:p>
     <w:p>
@@ -441,14 +356,7 @@
         </w:numPr>
       </w:pPr>
       <w:r>
-        <w:rPr>
-          <w:b/>
-          <w:bCs/>
-        </w:rPr>
-        <w:t xml:space="preserve">Operations Team Leadership</w:t>
-      </w:r>
-      <w:r>
-        <w:t xml:space="preserve">: Over four years, recruited and led a new infrastructure team dedicated to building and scaling the platform. Instrumental in leading the organization’s transition towards a DevOps culture, serving as a change agent and technical authority across engineering. Created a clear, calm, and constructive environment that allowed the team to thrive. Responsible for roadmap stewardship, untangling requirements, and arranging priorities to maximize flow. Transitioned a large legacy infrastructure codebase to cutting-edge, cloud-native, IAC-oriented tools while remaining hands-on with coding, architecture, and collaboration on mission-critical projects.</w:t>
+        <w:t xml:space="preserve">Architected and implemented a scalable cloud platform serving customer workloads at a fast-paced startup.</w:t>
       </w:r>
     </w:p>
     <w:p>
@@ -460,14 +368,7 @@
         </w:numPr>
       </w:pPr>
       <w:r>
-        <w:rPr>
-          <w:b/>
-          <w:bCs/>
-        </w:rPr>
-        <w:t xml:space="preserve">M-Bridge Platform Leadership</w:t>
-      </w:r>
-      <w:r>
-        <w:t xml:space="preserve">: For two years, spearheaded a team to stabilize and enhance an agent-based integration platform. Established operational metrics and monitoring systems that reduced platform errors and incidents by approximately 100x. Successfully performed a migration to Kubernetes with zero downtime, including relational, document, and cache databases. Demonstrated ability to measure impact and drive data-informed decisions.</w:t>
+        <w:t xml:space="preserve">Built CI/CD patterns including mono-repo conditional workflows, workload identity federation, and continuous delivery.</w:t>
       </w:r>
     </w:p>
     <w:p>
@@ -479,14 +380,7 @@
         </w:numPr>
       </w:pPr>
       <w:r>
-        <w:rPr>
-          <w:b/>
-          <w:bCs/>
-        </w:rPr>
-        <w:t xml:space="preserve">Insights Platform Leadership</w:t>
-      </w:r>
-      <w:r>
-        <w:t xml:space="preserve">: For three months, led a transition team responsible for overseeing and improving the BI data pipeline. Successfully migrated the pipeline to Kubernetes, accelerating modernization initiatives.</w:t>
+        <w:t xml:space="preserve">Implemented a Slack-based customer support and incident response platform; onboarded teammates and customers.</w:t>
       </w:r>
     </w:p>
     <w:p>
@@ -498,207 +392,208 @@
         </w:numPr>
       </w:pPr>
       <w:r>
-        <w:rPr>
-          <w:b/>
-          <w:bCs/>
-        </w:rPr>
-        <w:t xml:space="preserve">Cross-Functional Leadership &amp; Organizational Impact</w:t>
-      </w:r>
-      <w:r>
-        <w:t xml:space="preserve">: Took on organization-wide roles including mentorship and coaching, interviewing and hiring, and organizational change management and process optimization. Influenced decisions at all levels and promoted best practices across the engineering organization. Recognized with Top Performer Award in 2021 for contributions to technical excellence and team development.</w:t>
+        <w:t xml:space="preserve">Python, Pulumi, GCP, GKE, Cloud Run, CircleCI, Helm, SQLMesh.</w:t>
       </w:r>
     </w:p>
     <w:bookmarkEnd w:id="29"/>
     <w:bookmarkEnd w:id="30"/>
+    <w:bookmarkStart w:id="32" w:name="X7a2c313efdde198d901363c762c81839771c845"/>
+    <w:p>
+      <w:pPr>
+        <w:pStyle w:val="Heading3"/>
+      </w:pPr>
+      <w:r>
+        <w:t xml:space="preserve">Engineering Manager / Principal Software Engineer</w:t>
+      </w:r>
+    </w:p>
+    <w:bookmarkStart w:id="31" w:name="X47289269eb944414c9285d314973b45c253bcef"/>
+    <w:p>
+      <w:pPr>
+        <w:pStyle w:val="Heading4"/>
+      </w:pPr>
+      <w:r>
+        <w:t xml:space="preserve">Mavenlink / Kantata | Apr 2017 - Dec 2023 | San Francisco, CA</w:t>
+      </w:r>
+    </w:p>
+    <w:p>
+      <w:pPr>
+        <w:pStyle w:val="Compact"/>
+        <w:numPr>
+          <w:ilvl w:val="0"/>
+          <w:numId w:val="1005"/>
+        </w:numPr>
+      </w:pPr>
+      <w:r>
+        <w:rPr>
+          <w:b/>
+          <w:bCs/>
+        </w:rPr>
+        <w:t xml:space="preserve">M-Bridge Integration Platform</w:t>
+      </w:r>
+      <w:r>
+        <w:t xml:space="preserve"> </w:t>
+      </w:r>
+      <w:r>
+        <w:t xml:space="preserve">(2 years): Led a team to stabilize and scale an agent-based integration platform handling multi-system data orchestration. Established operational metrics and monitoring that reduced errors and incidents by ~100x. Executed a zero-downtime migration to Kubernetes including relational, document, and cache databases.</w:t>
+      </w:r>
+    </w:p>
+    <w:p>
+      <w:pPr>
+        <w:pStyle w:val="Compact"/>
+        <w:numPr>
+          <w:ilvl w:val="0"/>
+          <w:numId w:val="1005"/>
+        </w:numPr>
+      </w:pPr>
+      <w:r>
+        <w:rPr>
+          <w:b/>
+          <w:bCs/>
+        </w:rPr>
+        <w:t xml:space="preserve">Infrastructure Platform</w:t>
+      </w:r>
+      <w:r>
+        <w:t xml:space="preserve"> </w:t>
+      </w:r>
+      <w:r>
+        <w:t xml:space="preserve">(4 years): Recruited and built a new team from scratch dedicated to the infrastructure platform. Led migration of the</w:t>
+      </w:r>
+      <w:r>
+        <w:t xml:space="preserve"> </w:t>
+      </w:r>
+      <w:r>
+        <w:rPr>
+          <w:b/>
+          <w:bCs/>
+        </w:rPr>
+        <w:t xml:space="preserve">full Rails monolith and all services to Kubernetes</w:t>
+      </w:r>
+      <w:r>
+        <w:t xml:space="preserve"> </w:t>
+      </w:r>
+      <w:r>
+        <w:t xml:space="preserve">(zero-downtime) and MySQL → RDS, resolving chronic production segfaults. Drove Ruby/Rails upgrade strategy across the engineering org. Led the organization’s DevOps culture transformation, serving as technical authority and change agent. Top-line impact: dramatically reduced on-call incidents and error rates; strong team retention.</w:t>
+      </w:r>
+      <w:r>
+        <w:t xml:space="preserve"> </w:t>
+      </w:r>
+      <w:r>
+        <w:rPr>
+          <w:b/>
+          <w:bCs/>
+        </w:rPr>
+        <w:t xml:space="preserve">Top Performer Award, 2021</w:t>
+      </w:r>
+      <w:r>
+        <w:t xml:space="preserve">.</w:t>
+      </w:r>
+    </w:p>
+    <w:p>
+      <w:pPr>
+        <w:pStyle w:val="Compact"/>
+        <w:numPr>
+          <w:ilvl w:val="0"/>
+          <w:numId w:val="1005"/>
+        </w:numPr>
+      </w:pPr>
+      <w:r>
+        <w:rPr>
+          <w:b/>
+          <w:bCs/>
+        </w:rPr>
+        <w:t xml:space="preserve">BI Data Pipeline</w:t>
+      </w:r>
+      <w:r>
+        <w:t xml:space="preserve"> </w:t>
+      </w:r>
+      <w:r>
+        <w:t xml:space="preserve">(3 months): Led a transition team to take ownership of and improve the analytics data pipeline. Migrated the pipeline to Kubernetes.</w:t>
+      </w:r>
+    </w:p>
+    <w:p>
+      <w:pPr>
+        <w:pStyle w:val="Compact"/>
+        <w:numPr>
+          <w:ilvl w:val="0"/>
+          <w:numId w:val="1005"/>
+        </w:numPr>
+      </w:pPr>
+      <w:r>
+        <w:rPr>
+          <w:b/>
+          <w:bCs/>
+        </w:rPr>
+        <w:t xml:space="preserve">Cross-Functional Impact</w:t>
+      </w:r>
+      <w:r>
+        <w:t xml:space="preserve">: Mentored engineers across teams — notably coached a junior engineer who grew to Engineering Manager. Led interviewing and hiring. Drove organizational change management and process optimization.</w:t>
+      </w:r>
+    </w:p>
     <w:bookmarkEnd w:id="31"/>
-    <w:bookmarkStart w:id="36" w:name="skills"/>
-    <w:p>
-      <w:pPr>
-        <w:pStyle w:val="Heading2"/>
-      </w:pPr>
-      <w:r>
-        <w:t xml:space="preserve">Skills</w:t>
-      </w:r>
-    </w:p>
-    <w:bookmarkStart w:id="32" w:name="technical-skills"/>
+    <w:bookmarkEnd w:id="32"/>
+    <w:bookmarkStart w:id="34" w:name="lead-developer-co-founder"/>
     <w:p>
       <w:pPr>
         <w:pStyle w:val="Heading3"/>
       </w:pPr>
       <w:r>
-        <w:t xml:space="preserve">Technical Skills</w:t>
-      </w:r>
-    </w:p>
-    <w:p>
-      <w:pPr>
-        <w:pStyle w:val="Compact"/>
-        <w:numPr>
-          <w:ilvl w:val="0"/>
-          <w:numId w:val="1005"/>
-        </w:numPr>
-      </w:pPr>
-      <w:r>
-        <w:rPr>
-          <w:b/>
-          <w:bCs/>
-        </w:rPr>
-        <w:t xml:space="preserve">Languages &amp; Frameworks</w:t>
-      </w:r>
-      <w:r>
-        <w:t xml:space="preserve">: Ruby on Rails, Python, Node.js, JavaScript, TypeScript, Bash.</w:t>
-      </w:r>
-    </w:p>
-    <w:p>
-      <w:pPr>
-        <w:pStyle w:val="Compact"/>
-        <w:numPr>
-          <w:ilvl w:val="0"/>
-          <w:numId w:val="1005"/>
-        </w:numPr>
-      </w:pPr>
-      <w:r>
-        <w:rPr>
-          <w:b/>
-          <w:bCs/>
-        </w:rPr>
-        <w:t xml:space="preserve">AI/LLM Development</w:t>
-      </w:r>
-      <w:r>
-        <w:t xml:space="preserve">: MCP (Model Context Protocol), chatbot development, prompt engineering, tool use, context augmentation, AI-assisted developer workflows.</w:t>
-      </w:r>
-    </w:p>
-    <w:p>
-      <w:pPr>
-        <w:pStyle w:val="Compact"/>
-        <w:numPr>
-          <w:ilvl w:val="0"/>
-          <w:numId w:val="1005"/>
-        </w:numPr>
-      </w:pPr>
-      <w:r>
-        <w:rPr>
-          <w:b/>
-          <w:bCs/>
-        </w:rPr>
-        <w:t xml:space="preserve">Databases</w:t>
-      </w:r>
-      <w:r>
-        <w:t xml:space="preserve">: MySQL, PostgreSQL, MongoDB, Redis, Cloud-based data services.</w:t>
-      </w:r>
-    </w:p>
-    <w:p>
-      <w:pPr>
-        <w:pStyle w:val="Compact"/>
-        <w:numPr>
-          <w:ilvl w:val="0"/>
-          <w:numId w:val="1005"/>
-        </w:numPr>
-      </w:pPr>
-      <w:r>
-        <w:rPr>
-          <w:b/>
-          <w:bCs/>
-        </w:rPr>
-        <w:t xml:space="preserve">Tools &amp; Platforms</w:t>
-      </w:r>
-      <w:r>
-        <w:t xml:space="preserve">: Kubernetes, AWS (Amazon Web Services), Google Cloud Platform, CircleCI, GitHub Actions, Terraform, Ansible, Pulumi, Linux, Git, Webpack, Cloudfront, Helm.</w:t>
-      </w:r>
-    </w:p>
-    <w:p>
-      <w:pPr>
-        <w:pStyle w:val="Compact"/>
-        <w:numPr>
-          <w:ilvl w:val="0"/>
-          <w:numId w:val="1005"/>
-        </w:numPr>
-      </w:pPr>
-      <w:r>
-        <w:rPr>
-          <w:b/>
-          <w:bCs/>
-        </w:rPr>
-        <w:t xml:space="preserve">Web Technologies</w:t>
-      </w:r>
-      <w:r>
-        <w:t xml:space="preserve">: HTML, CSS, Tailwind, Front-end Development, Responsive Design, Back-end Development, Distributed Systems, Web3/DWeb, Decentralized Technologies.</w:t>
-      </w:r>
-    </w:p>
-    <w:p>
-      <w:pPr>
-        <w:pStyle w:val="Compact"/>
-        <w:numPr>
-          <w:ilvl w:val="0"/>
-          <w:numId w:val="1005"/>
-        </w:numPr>
-      </w:pPr>
-      <w:r>
-        <w:rPr>
-          <w:b/>
-          <w:bCs/>
-        </w:rPr>
-        <w:t xml:space="preserve">Software Development</w:t>
-      </w:r>
-      <w:r>
-        <w:t xml:space="preserve">: Object-oriented programming (OOP), Functional Programming, API Design and Development, Automated Testing, Continuous Integration, Continuous Deployment, CI/CD, System Architecture, Microservices.</w:t>
-      </w:r>
-    </w:p>
-    <w:bookmarkEnd w:id="32"/>
-    <w:bookmarkStart w:id="33" w:name="methodologies"/>
+        <w:t xml:space="preserve">Lead Developer, Co-founder</w:t>
+      </w:r>
+    </w:p>
+    <w:bookmarkStart w:id="33" w:name="pegg-2014---2017-san-francisco-ca"/>
+    <w:p>
+      <w:pPr>
+        <w:pStyle w:val="Heading4"/>
+      </w:pPr>
+      <w:r>
+        <w:t xml:space="preserve">Pegg | 2014 - 2017 | San Francisco, CA</w:t>
+      </w:r>
+    </w:p>
+    <w:p>
+      <w:pPr>
+        <w:pStyle w:val="Compact"/>
+        <w:numPr>
+          <w:ilvl w:val="0"/>
+          <w:numId w:val="1006"/>
+        </w:numPr>
+      </w:pPr>
+      <w:r>
+        <w:t xml:space="preserve">Designed, architected, and built a cross-platform mobile app from scratch (iOS/Android). Node.js backend, JS/Phonegap frontend, Firebase real-time systems, CI/CD to AWS/CloudFront via CircleCI.</w:t>
+      </w:r>
+    </w:p>
+    <w:p>
+      <w:pPr>
+        <w:pStyle w:val="Compact"/>
+        <w:numPr>
+          <w:ilvl w:val="0"/>
+          <w:numId w:val="1006"/>
+        </w:numPr>
+      </w:pPr>
+      <w:r>
+        <w:t xml:space="preserve">Established engineering workflow: pair programming, automated testing (Karma/Chai), continuous integration, and rapid deployment processes.</w:t>
+      </w:r>
+    </w:p>
+    <w:p>
+      <w:pPr>
+        <w:pStyle w:val="Compact"/>
+        <w:numPr>
+          <w:ilvl w:val="0"/>
+          <w:numId w:val="1006"/>
+        </w:numPr>
+      </w:pPr>
+      <w:r>
+        <w:t xml:space="preserve">Co-led product strategy, monetization, and launch planning.</w:t>
+      </w:r>
+    </w:p>
+    <w:bookmarkEnd w:id="33"/>
+    <w:bookmarkEnd w:id="34"/>
+    <w:bookmarkStart w:id="35" w:name="earlier-career-2001---2014"/>
     <w:p>
       <w:pPr>
         <w:pStyle w:val="Heading3"/>
       </w:pPr>
       <w:r>
-        <w:t xml:space="preserve">Methodologies</w:t>
-      </w:r>
-    </w:p>
-    <w:p>
-      <w:pPr>
-        <w:pStyle w:val="Compact"/>
-        <w:numPr>
-          <w:ilvl w:val="0"/>
-          <w:numId w:val="1006"/>
-        </w:numPr>
-      </w:pPr>
-      <w:r>
-        <w:rPr>
-          <w:b/>
-          <w:bCs/>
-        </w:rPr>
-        <w:t xml:space="preserve">Project Management</w:t>
-      </w:r>
-      <w:r>
-        <w:t xml:space="preserve">: Agile, Pair Programming, Test-Driven Development (TDD), DevOps, Lean Thinking, Rapid Prototyping, Scrum, Kanban.</w:t>
-      </w:r>
-    </w:p>
-    <w:p>
-      <w:pPr>
-        <w:pStyle w:val="Compact"/>
-        <w:numPr>
-          <w:ilvl w:val="0"/>
-          <w:numId w:val="1006"/>
-        </w:numPr>
-      </w:pPr>
-      <w:r>
-        <w:rPr>
-          <w:b/>
-          <w:bCs/>
-        </w:rPr>
-        <w:t xml:space="preserve">Design &amp; Architecture</w:t>
-      </w:r>
-      <w:r>
-        <w:t xml:space="preserve">: Software Design Patterns, Systems Design, Infrastructure as Code (IAC), Data Pipeline Design, Cloud-Native Architecture, User Interface Design.</w:t>
-      </w:r>
-    </w:p>
-    <w:bookmarkEnd w:id="33"/>
-    <w:bookmarkStart w:id="34" w:name="organizational-soft-skills"/>
-    <w:p>
-      <w:pPr>
-        <w:pStyle w:val="Heading3"/>
-      </w:pPr>
-      <w:r>
-        <w:t xml:space="preserve">Organizational &amp; Soft Skills</w:t>
+        <w:t xml:space="preserve">Earlier Career (2001 - 2014)</w:t>
       </w:r>
     </w:p>
     <w:p>
@@ -714,10 +609,13 @@
           <w:b/>
           <w:bCs/>
         </w:rPr>
-        <w:t xml:space="preserve">Leadership &amp; Management</w:t>
-      </w:r>
-      <w:r>
-        <w:t xml:space="preserve">: Team Building, Cross-Functional Leadership, Coaching &amp; Mentoring, Talent Recruitment &amp; Development, High-Performance Team Management, Strategic Planning, Decision Making, Change Management.</w:t>
+        <w:t xml:space="preserve">Consultant &amp; Entrepreneur</w:t>
+      </w:r>
+      <w:r>
+        <w:t xml:space="preserve"> </w:t>
+      </w:r>
+      <w:r>
+        <w:t xml:space="preserve">(2008 - 2014): Founded OpenTest Pro (automated testing education). Built e-commerce ordering system for Turnbull &amp; Asser shirtmakers. Full-stack consulting in Ruby on Rails, Node.js, D3 data visualization. Rapid prototyping and client delivery.</w:t>
       </w:r>
     </w:p>
     <w:p>
@@ -733,10 +631,13 @@
           <w:b/>
           <w:bCs/>
         </w:rPr>
-        <w:t xml:space="preserve">Communication &amp; Collaboration</w:t>
-      </w:r>
-      <w:r>
-        <w:t xml:space="preserve">: Effective Communication, Stakeholder Engagement, Negotiation, Problem-Solving, Conflict Resolution, Customer-Oriented Approach.</w:t>
+        <w:t xml:space="preserve">Web Developer, OnForce, Inc</w:t>
+      </w:r>
+      <w:r>
+        <w:t xml:space="preserve"> </w:t>
+      </w:r>
+      <w:r>
+        <w:t xml:space="preserve">(2006 - 2007): Introduced automated testing and CI. Built comprehensive API test suite. Integrated platform with Salesforce APIs.</w:t>
       </w:r>
     </w:p>
     <w:p>
@@ -752,143 +653,32 @@
           <w:b/>
           <w:bCs/>
         </w:rPr>
-        <w:t xml:space="preserve">Innovation &amp; Creativity</w:t>
-      </w:r>
-      <w:r>
-        <w:t xml:space="preserve">: Entrepreneurship, Creative Problem Solving, Product Development and Innovation, Adaptive Learning, Forward-Thinking.</w:t>
-      </w:r>
-    </w:p>
-    <w:bookmarkEnd w:id="34"/>
-    <w:bookmarkStart w:id="35" w:name="additional-competencies"/>
-    <w:p>
-      <w:pPr>
-        <w:pStyle w:val="Heading3"/>
-      </w:pPr>
-      <w:r>
-        <w:t xml:space="preserve">Additional Competencies</w:t>
-      </w:r>
-    </w:p>
-    <w:p>
-      <w:pPr>
-        <w:pStyle w:val="Compact"/>
-        <w:numPr>
-          <w:ilvl w:val="0"/>
-          <w:numId w:val="1008"/>
-        </w:numPr>
-      </w:pPr>
-      <w:r>
-        <w:rPr>
-          <w:b/>
-          <w:bCs/>
-        </w:rPr>
-        <w:t xml:space="preserve">Industry Knowledge</w:t>
-      </w:r>
-      <w:r>
-        <w:t xml:space="preserve">: Software Engineering, Web Development, Cloud Computing, AI/ML Development, Startup Ecosystem, SaaS, PaaS, B2B Software, Humane Technology.</w:t>
-      </w:r>
-    </w:p>
-    <w:p>
-      <w:pPr>
-        <w:pStyle w:val="Compact"/>
-        <w:numPr>
-          <w:ilvl w:val="0"/>
-          <w:numId w:val="1008"/>
-        </w:numPr>
-      </w:pPr>
-      <w:r>
-        <w:rPr>
-          <w:b/>
-          <w:bCs/>
-        </w:rPr>
-        <w:t xml:space="preserve">Personal Attributes</w:t>
-      </w:r>
-      <w:r>
-        <w:t xml:space="preserve">: Resilient, Innovative, Dedicated, Entrepreneurial, Strategic Thinker, Out of the Box Thinker, Detail-Oriented, Analytical, Kind and Compassionate, Truth Seeker.</w:t>
+        <w:t xml:space="preserve">Development Lead, JBA Network</w:t>
+      </w:r>
+      <w:r>
+        <w:t xml:space="preserve"> </w:t>
+      </w:r>
+      <w:r>
+        <w:t xml:space="preserve">(2003 - 2006): Lead programmer and project manager for mynewsletterbuilder.com — architected initial release, then built and scaled the development team.</w:t>
       </w:r>
     </w:p>
     <w:bookmarkEnd w:id="35"/>
     <w:bookmarkEnd w:id="36"/>
-    <w:bookmarkStart w:id="39" w:name="education"/>
+    <w:bookmarkStart w:id="41" w:name="open-source-projects"/>
     <w:p>
       <w:pPr>
         <w:pStyle w:val="Heading2"/>
       </w:pPr>
       <w:r>
-        <w:t xml:space="preserve">Education</w:t>
-      </w:r>
-    </w:p>
-    <w:bookmarkStart w:id="38" w:name="bachelor-of-arts-in-mathematics"/>
+        <w:t xml:space="preserve">Open Source Projects</w:t>
+      </w:r>
+    </w:p>
+    <w:bookmarkStart w:id="38" w:name="scan-mcp-2024---present"/>
     <w:p>
       <w:pPr>
         <w:pStyle w:val="Heading3"/>
       </w:pPr>
       <w:r>
-        <w:t xml:space="preserve">Bachelor of Arts in Mathematics</w:t>
-      </w:r>
-    </w:p>
-    <w:bookmarkStart w:id="37" w:name="Xe220d86d70cd5bf8ee7040adf9411d63a6235ab"/>
-    <w:p>
-      <w:pPr>
-        <w:pStyle w:val="Heading4"/>
-      </w:pPr>
-      <w:r>
-        <w:t xml:space="preserve">University of North Carolina at Asheville | May 2003</w:t>
-      </w:r>
-    </w:p>
-    <w:p>
-      <w:pPr>
-        <w:pStyle w:val="Compact"/>
-        <w:numPr>
-          <w:ilvl w:val="0"/>
-          <w:numId w:val="1009"/>
-        </w:numPr>
-      </w:pPr>
-      <w:r>
-        <w:t xml:space="preserve">Minor in Computer Science.</w:t>
-      </w:r>
-    </w:p>
-    <w:p>
-      <w:pPr>
-        <w:pStyle w:val="Compact"/>
-        <w:numPr>
-          <w:ilvl w:val="0"/>
-          <w:numId w:val="1009"/>
-        </w:numPr>
-      </w:pPr>
-      <w:r>
-        <w:t xml:space="preserve">Graduated with distinction in Mathematics.</w:t>
-      </w:r>
-    </w:p>
-    <w:p>
-      <w:pPr>
-        <w:pStyle w:val="Compact"/>
-        <w:numPr>
-          <w:ilvl w:val="0"/>
-          <w:numId w:val="1009"/>
-        </w:numPr>
-      </w:pPr>
-      <w:r>
-        <w:t xml:space="preserve">Undergraduate research in 4D fractals.</w:t>
-      </w:r>
-    </w:p>
-    <w:bookmarkEnd w:id="37"/>
-    <w:bookmarkEnd w:id="38"/>
-    <w:bookmarkEnd w:id="39"/>
-    <w:bookmarkStart w:id="44" w:name="open-source-projects"/>
-    <w:p>
-      <w:pPr>
-        <w:pStyle w:val="Heading2"/>
-      </w:pPr>
-      <w:r>
-        <w:t xml:space="preserve">Open Source Projects</w:t>
-      </w:r>
-    </w:p>
-    <w:bookmarkStart w:id="41" w:name="scan-mcp-2024---present"/>
-    <w:p>
-      <w:pPr>
-        <w:pStyle w:val="Heading3"/>
-      </w:pPr>
-      <w:r>
         <w:t xml:space="preserve">Scan MCP (2024 - Present)</w:t>
       </w:r>
     </w:p>
@@ -904,7 +694,7 @@
       <w:pPr>
         <w:pStyle w:val="BodyText"/>
       </w:pPr>
-      <w:hyperlink r:id="rId40">
+      <w:hyperlink r:id="rId37">
         <w:r>
           <w:rPr>
             <w:rStyle w:val="Hyperlink"/>
@@ -913,8 +703,8 @@
         </w:r>
       </w:hyperlink>
     </w:p>
-    <w:bookmarkEnd w:id="41"/>
-    <w:bookmarkStart w:id="43" w:name="humanebench-2024---present"/>
+    <w:bookmarkEnd w:id="38"/>
+    <w:bookmarkStart w:id="40" w:name="humanebench-2024---present"/>
     <w:p>
       <w:pPr>
         <w:pStyle w:val="Heading3"/>
@@ -935,7 +725,7 @@
       <w:pPr>
         <w:pStyle w:val="BodyText"/>
       </w:pPr>
-      <w:hyperlink r:id="rId42">
+      <w:hyperlink r:id="rId39">
         <w:r>
           <w:rPr>
             <w:rStyle w:val="Hyperlink"/>
@@ -944,9 +734,194 @@
         </w:r>
       </w:hyperlink>
     </w:p>
+    <w:bookmarkEnd w:id="40"/>
+    <w:bookmarkEnd w:id="41"/>
+    <w:bookmarkStart w:id="42" w:name="skills"/>
+    <w:p>
+      <w:pPr>
+        <w:pStyle w:val="Heading2"/>
+      </w:pPr>
+      <w:r>
+        <w:t xml:space="preserve">Skills</w:t>
+      </w:r>
+    </w:p>
+    <w:p>
+      <w:pPr>
+        <w:pStyle w:val="Compact"/>
+        <w:numPr>
+          <w:ilvl w:val="0"/>
+          <w:numId w:val="1008"/>
+        </w:numPr>
+      </w:pPr>
+      <w:r>
+        <w:rPr>
+          <w:b/>
+          <w:bCs/>
+        </w:rPr>
+        <w:t xml:space="preserve">Languages &amp; Frameworks</w:t>
+      </w:r>
+      <w:r>
+        <w:t xml:space="preserve">: Ruby on Rails, JavaScript, TypeScript, Python, Node.js, Bash.</w:t>
+      </w:r>
+    </w:p>
+    <w:p>
+      <w:pPr>
+        <w:pStyle w:val="Compact"/>
+        <w:numPr>
+          <w:ilvl w:val="0"/>
+          <w:numId w:val="1008"/>
+        </w:numPr>
+      </w:pPr>
+      <w:r>
+        <w:rPr>
+          <w:b/>
+          <w:bCs/>
+        </w:rPr>
+        <w:t xml:space="preserve">Front-end</w:t>
+      </w:r>
+      <w:r>
+        <w:t xml:space="preserve">: Hotwire, StimulusJS, React, Vue, HTML, CSS, Tailwind, Responsive Design.</w:t>
+      </w:r>
+    </w:p>
+    <w:p>
+      <w:pPr>
+        <w:pStyle w:val="Compact"/>
+        <w:numPr>
+          <w:ilvl w:val="0"/>
+          <w:numId w:val="1008"/>
+        </w:numPr>
+      </w:pPr>
+      <w:r>
+        <w:rPr>
+          <w:b/>
+          <w:bCs/>
+        </w:rPr>
+        <w:t xml:space="preserve">Back-end &amp; Data</w:t>
+      </w:r>
+      <w:r>
+        <w:t xml:space="preserve">: Sidekiq, Background Jobs, API Design, PostgreSQL, MySQL, MongoDB, Redis, Microservices, Distributed Systems.</w:t>
+      </w:r>
+    </w:p>
+    <w:p>
+      <w:pPr>
+        <w:pStyle w:val="Compact"/>
+        <w:numPr>
+          <w:ilvl w:val="0"/>
+          <w:numId w:val="1008"/>
+        </w:numPr>
+      </w:pPr>
+      <w:r>
+        <w:rPr>
+          <w:b/>
+          <w:bCs/>
+        </w:rPr>
+        <w:t xml:space="preserve">Cloud &amp; Infrastructure</w:t>
+      </w:r>
+      <w:r>
+        <w:t xml:space="preserve">: AWS, Google Cloud Platform, Kubernetes, Docker, Terraform, Ansible, Pulumi, Helm.</w:t>
+      </w:r>
+    </w:p>
+    <w:p>
+      <w:pPr>
+        <w:pStyle w:val="Compact"/>
+        <w:numPr>
+          <w:ilvl w:val="0"/>
+          <w:numId w:val="1008"/>
+        </w:numPr>
+      </w:pPr>
+      <w:r>
+        <w:rPr>
+          <w:b/>
+          <w:bCs/>
+        </w:rPr>
+        <w:t xml:space="preserve">CI/CD &amp; DevOps</w:t>
+      </w:r>
+      <w:r>
+        <w:t xml:space="preserve">: CircleCI, GitHub Actions, Automated Testing, TDD, Infrastructure as Code, Cloud-Native Architecture.</w:t>
+      </w:r>
+    </w:p>
+    <w:p>
+      <w:pPr>
+        <w:pStyle w:val="Compact"/>
+        <w:numPr>
+          <w:ilvl w:val="0"/>
+          <w:numId w:val="1008"/>
+        </w:numPr>
+      </w:pPr>
+      <w:r>
+        <w:rPr>
+          <w:b/>
+          <w:bCs/>
+        </w:rPr>
+        <w:t xml:space="preserve">AI/LLM</w:t>
+      </w:r>
+      <w:r>
+        <w:t xml:space="preserve">: Agentic workflows, LLM API integration, prompt engineering, tool use, context augmentation, MCP (Model Context Protocol), AI-assisted developer tooling, eval frameworks.</w:t>
+      </w:r>
+    </w:p>
+    <w:p>
+      <w:pPr>
+        <w:pStyle w:val="Compact"/>
+        <w:numPr>
+          <w:ilvl w:val="0"/>
+          <w:numId w:val="1008"/>
+        </w:numPr>
+      </w:pPr>
+      <w:r>
+        <w:rPr>
+          <w:b/>
+          <w:bCs/>
+        </w:rPr>
+        <w:t xml:space="preserve">Leadership</w:t>
+      </w:r>
+      <w:r>
+        <w:t xml:space="preserve">: Team Building, Coaching &amp; Mentoring, Cross-Functional Collaboration, Roadmap Ownership, Hiring, Agile/Scrum/Kanban, Change Management.</w:t>
+      </w:r>
+    </w:p>
+    <w:bookmarkEnd w:id="42"/>
+    <w:bookmarkStart w:id="45" w:name="education"/>
+    <w:p>
+      <w:pPr>
+        <w:pStyle w:val="Heading2"/>
+      </w:pPr>
+      <w:r>
+        <w:t xml:space="preserve">Education</w:t>
+      </w:r>
+    </w:p>
+    <w:bookmarkStart w:id="44" w:name="X8aa14d071da44b7f3006e1d49a262db674bce64"/>
+    <w:p>
+      <w:pPr>
+        <w:pStyle w:val="Heading3"/>
+      </w:pPr>
+      <w:r>
+        <w:t xml:space="preserve">BA in Mathematics, minor in Computer Science</w:t>
+      </w:r>
+    </w:p>
+    <w:bookmarkStart w:id="43" w:name="Xe220d86d70cd5bf8ee7040adf9411d63a6235ab"/>
+    <w:p>
+      <w:pPr>
+        <w:pStyle w:val="Heading4"/>
+      </w:pPr>
+      <w:r>
+        <w:t xml:space="preserve">University of North Carolina at Asheville | May 2003</w:t>
+      </w:r>
+    </w:p>
+    <w:p>
+      <w:pPr>
+        <w:pStyle w:val="Compact"/>
+        <w:numPr>
+          <w:ilvl w:val="0"/>
+          <w:numId w:val="1009"/>
+        </w:numPr>
+      </w:pPr>
+      <w:r>
+        <w:t xml:space="preserve">Graduated with distinction in Mathematics. Undergraduate research in 4D fractals.</w:t>
+      </w:r>
+    </w:p>
     <w:bookmarkEnd w:id="43"/>
     <w:bookmarkEnd w:id="44"/>
-    <w:bookmarkStart w:id="45" w:name="recommendations"/>
+    <w:bookmarkEnd w:id="45"/>
+    <w:bookmarkStart w:id="46" w:name="recommendations"/>
     <w:p>
       <w:pPr>
         <w:pStyle w:val="Heading2"/>
@@ -1002,7 +977,7 @@
         <w:t xml:space="preserve">the solutions he architects, builds, and collaborates on come out better</w:t>
       </w:r>
       <w:r>
-        <w:t xml:space="preserve">. Jack also strives to be at the forefront of new technology and assess how he can leverage it. Newer tech like GenAI can be complex and ever-evolving, and Jack is not one to back down but step up and embrace. He does all this with a</w:t>
+        <w:t xml:space="preserve">. Jack also strives to be at the forefront of new technology and assess how he can leverage it. He does all this with a</w:t>
       </w:r>
       <w:r>
         <w:t xml:space="preserve"> </w:t>
@@ -1048,33 +1023,46 @@
         <w:pStyle w:val="BodyText"/>
       </w:pPr>
       <w:r>
-        <w:t xml:space="preserve">“Jack is a fantastic engineer always ready to</w:t>
-      </w:r>
-      <w:r>
-        <w:t xml:space="preserve"> </w:t>
-      </w:r>
-      <w:r>
-        <w:rPr>
-          <w:b/>
-          <w:bCs/>
-        </w:rPr>
-        <w:t xml:space="preserve">help solve problems and more importantly, teach you how to solve them</w:t>
-      </w:r>
-      <w:r>
-        <w:t xml:space="preserve">. He guided me and my team through a bunch of challenging GitOps situations with patience and kindness, leading by example. Always diligent with his work, willing to roll up his sleeves to get things done and</w:t>
-      </w:r>
-      <w:r>
-        <w:t xml:space="preserve"> </w:t>
-      </w:r>
-      <w:r>
-        <w:rPr>
-          <w:b/>
-          <w:bCs/>
-        </w:rPr>
-        <w:t xml:space="preserve">find creative solutions</w:t>
-      </w:r>
-      <w:r>
-        <w:t xml:space="preserve">, maybe tinkering in some kind of script that would make the manual processes easier and more resilient. Everyone would be lucky to have someone like him in their teams!”</w:t>
+        <w:t xml:space="preserve">“Jack has</w:t>
+      </w:r>
+      <w:r>
+        <w:t xml:space="preserve"> </w:t>
+      </w:r>
+      <w:r>
+        <w:rPr>
+          <w:b/>
+          <w:bCs/>
+        </w:rPr>
+        <w:t xml:space="preserve">had quite a profound impact on my career</w:t>
+      </w:r>
+      <w:r>
+        <w:t xml:space="preserve">. As a young engineer, I was fortunate enough to work with Jack as my coach. He served as a great mentor, helping me build both technical and professional skills and</w:t>
+      </w:r>
+      <w:r>
+        <w:t xml:space="preserve"> </w:t>
+      </w:r>
+      <w:r>
+        <w:rPr>
+          <w:b/>
+          <w:bCs/>
+        </w:rPr>
+        <w:t xml:space="preserve">forming me into the engineer that I am today</w:t>
+      </w:r>
+      <w:r>
+        <w:t xml:space="preserve">.</w:t>
+      </w:r>
+      <w:r>
+        <w:t xml:space="preserve"> </w:t>
+      </w:r>
+      <w:r>
+        <w:rPr>
+          <w:b/>
+          <w:bCs/>
+        </w:rPr>
+        <w:t xml:space="preserve">His mentorship was a key factor in elevating me from an incoming Junior Engineer to an Engineering Manager</w:t>
+      </w:r>
+      <w:r>
+        <w:t xml:space="preserve">. Jack has a great curiosity and a strong set of technical capabilities that allow him to serve as a great example for others and a key contributor to any team!”</w:t>
       </w:r>
     </w:p>
     <w:p>
@@ -1086,7 +1074,7 @@
           <w:i/>
           <w:iCs/>
         </w:rPr>
-        <w:t xml:space="preserve">— Cesar Palafox Garza, Principal Software Engineer, Kantata</w:t>
+        <w:t xml:space="preserve">— Wesley Morlock, Engineering Manager, Kantata</w:t>
       </w:r>
     </w:p>
     <w:p>
@@ -1094,46 +1082,33 @@
         <w:pStyle w:val="BodyText"/>
       </w:pPr>
       <w:r>
-        <w:t xml:space="preserve">“Jack has</w:t>
-      </w:r>
-      <w:r>
-        <w:t xml:space="preserve"> </w:t>
-      </w:r>
-      <w:r>
-        <w:rPr>
-          <w:b/>
-          <w:bCs/>
-        </w:rPr>
-        <w:t xml:space="preserve">had quite a profound impact on my career</w:t>
-      </w:r>
-      <w:r>
-        <w:t xml:space="preserve">. As a young engineer, I was fortunate enough to work with Jack as my coach. He served as a great mentor, helping me build both technical and professional skills and</w:t>
-      </w:r>
-      <w:r>
-        <w:t xml:space="preserve"> </w:t>
-      </w:r>
-      <w:r>
-        <w:rPr>
-          <w:b/>
-          <w:bCs/>
-        </w:rPr>
-        <w:t xml:space="preserve">forming me into the engineer that I am today</w:t>
-      </w:r>
-      <w:r>
-        <w:t xml:space="preserve">. Throughout our time together, Jack was caring and invested in helping me set goals and develop my career.</w:t>
-      </w:r>
-      <w:r>
-        <w:t xml:space="preserve"> </w:t>
-      </w:r>
-      <w:r>
-        <w:rPr>
-          <w:b/>
-          <w:bCs/>
-        </w:rPr>
-        <w:t xml:space="preserve">His mentorship was a key factor in elevating me from an incoming Junior Engineer to an Engineering Manager</w:t>
-      </w:r>
-      <w:r>
-        <w:t xml:space="preserve">. Jack has a great curiosity and a strong set of technical capabilities that allow him to serve as a great example for others and a key contributor to any team!”</w:t>
+        <w:t xml:space="preserve">“Jack is a fantastic engineer always ready to</w:t>
+      </w:r>
+      <w:r>
+        <w:t xml:space="preserve"> </w:t>
+      </w:r>
+      <w:r>
+        <w:rPr>
+          <w:b/>
+          <w:bCs/>
+        </w:rPr>
+        <w:t xml:space="preserve">help solve problems and more importantly, teach you how to solve them</w:t>
+      </w:r>
+      <w:r>
+        <w:t xml:space="preserve">. He guided me and my team through a bunch of challenging GitOps situations with patience and kindness, leading by example. Always diligent with his work, willing to roll up his sleeves to get things done and</w:t>
+      </w:r>
+      <w:r>
+        <w:t xml:space="preserve"> </w:t>
+      </w:r>
+      <w:r>
+        <w:rPr>
+          <w:b/>
+          <w:bCs/>
+        </w:rPr>
+        <w:t xml:space="preserve">find creative solutions</w:t>
+      </w:r>
+      <w:r>
+        <w:t xml:space="preserve">. Everyone would be lucky to have someone like him in their teams!”</w:t>
       </w:r>
     </w:p>
     <w:p>
@@ -1145,7 +1120,7 @@
           <w:i/>
           <w:iCs/>
         </w:rPr>
-        <w:t xml:space="preserve">— Wesley Morlock, Engineering Manager, Kantata</w:t>
+        <w:t xml:space="preserve">— Cesar Palafox Garza, Principal Software Engineer, Kantata</w:t>
       </w:r>
     </w:p>
     <w:p>
@@ -1153,20 +1128,33 @@
         <w:pStyle w:val="BodyText"/>
       </w:pPr>
       <w:r>
-        <w:t xml:space="preserve">“Jack provided invaluable leadership as a Principal Software Engineer at Kantata. He was a powerful voice for the technology but made sure to</w:t>
-      </w:r>
-      <w:r>
-        <w:t xml:space="preserve"> </w:t>
-      </w:r>
-      <w:r>
-        <w:rPr>
-          <w:b/>
-          <w:bCs/>
-        </w:rPr>
-        <w:t xml:space="preserve">advocate for changes that were also certain to provide immediate impact to the customer</w:t>
-      </w:r>
-      <w:r>
-        <w:t xml:space="preserve">. I highly recommend Jack as an excellent dev ops engineer and as a technical leader.”</w:t>
+        <w:t xml:space="preserve">“Jack is</w:t>
+      </w:r>
+      <w:r>
+        <w:t xml:space="preserve"> </w:t>
+      </w:r>
+      <w:r>
+        <w:rPr>
+          <w:b/>
+          <w:bCs/>
+        </w:rPr>
+        <w:t xml:space="preserve">awesome at understanding the direction teams need to go to make important improvements in Kantata’s Engineering organization as a whole</w:t>
+      </w:r>
+      <w:r>
+        <w:t xml:space="preserve">. He has been instrumental in building and implementing strategies to upgrade Ruby, Rails, and React. If I had any questions about infrastructure and Kubernetes he would be able to answer and</w:t>
+      </w:r>
+      <w:r>
+        <w:t xml:space="preserve"> </w:t>
+      </w:r>
+      <w:r>
+        <w:rPr>
+          <w:b/>
+          <w:bCs/>
+        </w:rPr>
+        <w:t xml:space="preserve">provide solid explanations to the entire team</w:t>
+      </w:r>
+      <w:r>
+        <w:t xml:space="preserve">.”</w:t>
       </w:r>
     </w:p>
     <w:p>
@@ -1178,223 +1166,24 @@
           <w:i/>
           <w:iCs/>
         </w:rPr>
-        <w:t xml:space="preserve">— Nathan Perry, Principal Software Engineer, Kantata</w:t>
+        <w:t xml:space="preserve">— Justin Hurstwright, Principal Software Engineer, Kantata</w:t>
       </w:r>
     </w:p>
     <w:p>
       <w:pPr>
         <w:pStyle w:val="BodyText"/>
       </w:pPr>
-      <w:r>
-        <w:t xml:space="preserve">“Jack is talented both as a software developer and as an operations engineer. While working together in a Principal Engineer capacity, I saw how</w:t>
-      </w:r>
-      <w:r>
-        <w:t xml:space="preserve"> </w:t>
-      </w:r>
-      <w:r>
-        <w:rPr>
-          <w:b/>
-          <w:bCs/>
-        </w:rPr>
-        <w:t xml:space="preserve">passionate Jack is about helping his colleagues and his organization level up</w:t>
-      </w:r>
-      <w:r>
-        <w:t xml:space="preserve">. He is a great engineer with excellent leadership and organizational abilities.”</w:t>
-      </w:r>
-    </w:p>
-    <w:p>
-      <w:pPr>
-        <w:pStyle w:val="BodyText"/>
-      </w:pPr>
-      <w:r>
-        <w:rPr>
-          <w:i/>
-          <w:iCs/>
-        </w:rPr>
-        <w:t xml:space="preserve">— Jason Larsen, Software Engineering Manager, Kantata</w:t>
-      </w:r>
-    </w:p>
-    <w:p>
-      <w:pPr>
-        <w:pStyle w:val="BodyText"/>
-      </w:pPr>
-      <w:r>
-        <w:t xml:space="preserve">“Jack is a great co-worker. He is</w:t>
-      </w:r>
-      <w:r>
-        <w:t xml:space="preserve"> </w:t>
-      </w:r>
-      <w:r>
-        <w:rPr>
-          <w:b/>
-          <w:bCs/>
-        </w:rPr>
-        <w:t xml:space="preserve">awesome at understanding the direction teams need to go to make important improvements in Kantata’s Engineering organization as a whole</w:t>
-      </w:r>
-      <w:r>
-        <w:t xml:space="preserve">. He has been instrumental in building and implementing strategies to upgrade Ruby, Rails, and React. If I had any questions about infrastructure and Kubernetes he would be able to answer and</w:t>
-      </w:r>
-      <w:r>
-        <w:t xml:space="preserve"> </w:t>
-      </w:r>
-      <w:r>
-        <w:rPr>
-          <w:b/>
-          <w:bCs/>
-        </w:rPr>
-        <w:t xml:space="preserve">provide solid explanations to the entire team</w:t>
-      </w:r>
-      <w:r>
-        <w:t xml:space="preserve">.”</w:t>
-      </w:r>
-    </w:p>
-    <w:p>
-      <w:pPr>
-        <w:pStyle w:val="BodyText"/>
-      </w:pPr>
-      <w:r>
-        <w:rPr>
-          <w:i/>
-          <w:iCs/>
-        </w:rPr>
-        <w:t xml:space="preserve">— Justin Hurstwright, Principal Software Engineer, Kantata</w:t>
-      </w:r>
-    </w:p>
-    <w:p>
-      <w:pPr>
-        <w:pStyle w:val="BodyText"/>
-      </w:pPr>
-      <w:r>
-        <w:t xml:space="preserve">“Jack is a phenomenal resource to work with. He is</w:t>
-      </w:r>
-      <w:r>
-        <w:t xml:space="preserve"> </w:t>
-      </w:r>
-      <w:r>
-        <w:rPr>
-          <w:b/>
-          <w:bCs/>
-        </w:rPr>
-        <w:t xml:space="preserve">very knowledgeable about programming and cloud infrastructure</w:t>
-      </w:r>
-      <w:r>
-        <w:t xml:space="preserve"> </w:t>
-      </w:r>
-      <w:r>
-        <w:t xml:space="preserve">and is always eager to learn new things.”</w:t>
-      </w:r>
-    </w:p>
-    <w:p>
-      <w:pPr>
-        <w:pStyle w:val="BodyText"/>
-      </w:pPr>
-      <w:r>
-        <w:rPr>
-          <w:i/>
-          <w:iCs/>
-        </w:rPr>
-        <w:t xml:space="preserve">— Donovan Hubbard, Senior DevOps Engineer, Kantata</w:t>
-      </w:r>
-    </w:p>
-    <w:p>
-      <w:pPr>
-        <w:pStyle w:val="BodyText"/>
-      </w:pPr>
-      <w:r>
-        <w:t xml:space="preserve">“Jack has a flair for finding better, faster, and more reliable ways to get things done. He</w:t>
-      </w:r>
-      <w:r>
-        <w:t xml:space="preserve"> </w:t>
-      </w:r>
-      <w:r>
-        <w:rPr>
-          <w:b/>
-          <w:bCs/>
-        </w:rPr>
-        <w:t xml:space="preserve">advocates best practices, like unit testing, and has a deep knowledge of OO architecture</w:t>
-      </w:r>
-      <w:r>
-        <w:t xml:space="preserve">. Jack thinks on his toes, and will always be there with the team at 4 a.m. if circumstance requires it.</w:t>
-      </w:r>
-      <w:r>
-        <w:t xml:space="preserve"> </w:t>
-      </w:r>
-      <w:r>
-        <w:rPr>
-          <w:rStyle w:val="VerbatimChar"/>
-        </w:rPr>
-        <w:t xml:space="preserve">:%s/average developers/developers like jack/g</w:t>
-      </w:r>
-      <w:r>
-        <w:t xml:space="preserve"> </w:t>
-      </w:r>
-      <w:r>
-        <w:t xml:space="preserve">if you know what’s good for you.”</w:t>
-      </w:r>
-    </w:p>
-    <w:p>
-      <w:pPr>
-        <w:pStyle w:val="BodyText"/>
-      </w:pPr>
-      <w:r>
-        <w:rPr>
-          <w:i/>
-          <w:iCs/>
-        </w:rPr>
-        <w:t xml:space="preserve">— Greg Whitescarver, Founder, Mojave</w:t>
-      </w:r>
-    </w:p>
-    <w:p>
-      <w:pPr>
-        <w:pStyle w:val="BodyText"/>
-      </w:pPr>
-      <w:r>
-        <w:t xml:space="preserve">“With Jack,</w:t>
-      </w:r>
-      <w:r>
-        <w:t xml:space="preserve"> </w:t>
-      </w:r>
-      <w:r>
-        <w:rPr>
-          <w:b/>
-          <w:bCs/>
-        </w:rPr>
-        <w:t xml:space="preserve">the more complex the problem, the more simple his solutions</w:t>
-      </w:r>
-      <w:r>
-        <w:t xml:space="preserve">. From eradicating dynamic php bugs to providing innovative javascript capabilities, Master Senechal is more than a mind to be reckoned with, he’s an</w:t>
-      </w:r>
-      <w:r>
-        <w:t xml:space="preserve"> </w:t>
-      </w:r>
-      <w:r>
-        <w:rPr>
-          <w:b/>
-          <w:bCs/>
-        </w:rPr>
-        <w:t xml:space="preserve">integrative capacity builder</w:t>
-      </w:r>
-      <w:r>
-        <w:t xml:space="preserve"> </w:t>
-      </w:r>
-      <w:r>
-        <w:t xml:space="preserve">with a wide range of technological expertise. If there is anything that can be done through web development, Jack can figure out how to do it, and make it happen.”</w:t>
-      </w:r>
-    </w:p>
-    <w:p>
-      <w:pPr>
-        <w:pStyle w:val="BodyText"/>
-      </w:pPr>
-      <w:r>
-        <w:rPr>
-          <w:i/>
-          <w:iCs/>
-        </w:rPr>
-        <w:t xml:space="preserve">— Adam Apollo, Cofounder &amp; CEO, Superluminal Systems</w:t>
-      </w:r>
-    </w:p>
-    <w:bookmarkEnd w:id="45"/>
+      <w:hyperlink r:id="rId22">
+        <w:r>
+          <w:rPr>
+            <w:rStyle w:val="Hyperlink"/>
+          </w:rPr>
+          <w:t xml:space="preserve">See additional recommendations on LinkedIn</w:t>
+        </w:r>
+      </w:hyperlink>
+    </w:p>
     <w:bookmarkEnd w:id="46"/>
+    <w:bookmarkEnd w:id="47"/>
     <w:sectPr/>
   </w:body>
 </w:document>

</xml_diff>

<commit_message>
Tailor resume for Stanford AI Catalyst (full stack + AI)
</commit_message>
<xml_diff>
--- a/resume.docx
+++ b/resume.docx
@@ -11,13 +11,13 @@
         <w:t xml:space="preserve">Jack Senechal</w:t>
       </w:r>
     </w:p>
-    <w:bookmarkStart w:id="23" w:name="ai-tooling-platform-engineer"/>
+    <w:bookmarkStart w:id="23" w:name="full-stack-ai-engineer"/>
     <w:p>
       <w:pPr>
         <w:pStyle w:val="Heading2"/>
       </w:pPr>
       <w:r>
-        <w:t xml:space="preserve">AI Tooling &amp; Platform Engineer</w:t>
+        <w:t xml:space="preserve">Full Stack &amp; AI Engineer</w:t>
       </w:r>
     </w:p>
     <w:p>
@@ -112,13 +112,13 @@
           <w:b/>
           <w:bCs/>
         </w:rPr>
-        <w:t xml:space="preserve">Principal-level engineer</w:t>
-      </w:r>
-      <w:r>
-        <w:t xml:space="preserve"> </w:t>
-      </w:r>
-      <w:r>
-        <w:t xml:space="preserve">specializing in AI-powered developer tooling, platform modernization, and large-scale engineering productivity</w:t>
+        <w:t xml:space="preserve">Principal-level full-stack engineer</w:t>
+      </w:r>
+      <w:r>
+        <w:t xml:space="preserve"> </w:t>
+      </w:r>
+      <w:r>
+        <w:t xml:space="preserve">shipping AI-powered applications end-to-end — from LLM integration and prompt engineering through Rails/React UI to cloud-native deployment</w:t>
       </w:r>
     </w:p>
     <w:p>
@@ -168,7 +168,23 @@
         </w:numPr>
       </w:pPr>
       <w:r>
-        <w:t xml:space="preserve">Full-stack generalist with deep experience applying AI/LLMs, DevOps, and cloud-native systems to accelerate software delivery</w:t>
+        <w:t xml:space="preserve">Consultative engineer comfortable</w:t>
+      </w:r>
+      <w:r>
+        <w:t xml:space="preserve"> </w:t>
+      </w:r>
+      <w:r>
+        <w:rPr>
+          <w:b/>
+          <w:bCs/>
+        </w:rPr>
+        <w:t xml:space="preserve">partnering with non-technical stakeholders</w:t>
+      </w:r>
+      <w:r>
+        <w:t xml:space="preserve"> </w:t>
+      </w:r>
+      <w:r>
+        <w:t xml:space="preserve">to scope, prototype, and deliver custom solutions for real users</w:t>
       </w:r>
     </w:p>
     <w:p>
@@ -180,6 +196,18 @@
         </w:numPr>
       </w:pPr>
       <w:r>
+        <w:t xml:space="preserve">Hands-on with modern AI tooling: LLM application development, MCP servers, retrieval-augmented generation, AI evaluation frameworks, agent workflows</w:t>
+      </w:r>
+    </w:p>
+    <w:p>
+      <w:pPr>
+        <w:pStyle w:val="Compact"/>
+        <w:numPr>
+          <w:ilvl w:val="0"/>
+          <w:numId w:val="1001"/>
+        </w:numPr>
+      </w:pPr>
+      <w:r>
         <w:t xml:space="preserve">Committed</w:t>
       </w:r>
       <w:r>
@@ -197,34 +225,6 @@
       </w:r>
       <w:r>
         <w:t xml:space="preserve">who elevated junior engineers to senior technical and engineering management positions</w:t>
-      </w:r>
-    </w:p>
-    <w:p>
-      <w:pPr>
-        <w:pStyle w:val="Compact"/>
-        <w:numPr>
-          <w:ilvl w:val="0"/>
-          <w:numId w:val="1001"/>
-        </w:numPr>
-      </w:pPr>
-      <w:r>
-        <w:t xml:space="preserve">Strong customer focus,</w:t>
-      </w:r>
-      <w:r>
-        <w:t xml:space="preserve"> </w:t>
-      </w:r>
-      <w:r>
-        <w:rPr>
-          <w:b/>
-          <w:bCs/>
-        </w:rPr>
-        <w:t xml:space="preserve">advocating for impactful changes</w:t>
-      </w:r>
-      <w:r>
-        <w:t xml:space="preserve"> </w:t>
-      </w:r>
-      <w:r>
-        <w:t xml:space="preserve">and ensuring product value</w:t>
       </w:r>
     </w:p>
     <w:p>
@@ -348,7 +348,7 @@
         </w:numPr>
       </w:pPr>
       <w:r>
-        <w:t xml:space="preserve">Built AI chatbot integrating multiple LLMs with complex prompting, tool use, and context augmentation.</w:t>
+        <w:t xml:space="preserve">Built and shipped a production AI chatbot end-to-end: multi-LLM integration with complex prompting, tool use, and context augmentation, exposed through a polished consumer web app.</w:t>
       </w:r>
     </w:p>
     <w:p>
@@ -360,7 +360,7 @@
         </w:numPr>
       </w:pPr>
       <w:r>
-        <w:t xml:space="preserve">Front-end development: Ruby on Rails views, JavaScript, HTML+CSS, Tailwind, responsive UI/UX.</w:t>
+        <w:t xml:space="preserve">Full-stack development: Ruby on Rails MVC, Stripe integration, SSO authentication; React-flavored Rails views, JavaScript, HTML+CSS, Tailwind, responsive UI/UX.</w:t>
       </w:r>
     </w:p>
     <w:p>
@@ -372,19 +372,7 @@
         </w:numPr>
       </w:pPr>
       <w:r>
-        <w:t xml:space="preserve">Back-end development: Stripe integration, SSO authentication, Rails MVC.</w:t>
-      </w:r>
-    </w:p>
-    <w:p>
-      <w:pPr>
-        <w:pStyle w:val="Compact"/>
-        <w:numPr>
-          <w:ilvl w:val="0"/>
-          <w:numId w:val="1003"/>
-        </w:numPr>
-      </w:pPr>
-      <w:r>
-        <w:t xml:space="preserve">Collaborated closely with co-founders on product direction, Figma design, UX, roadmap planning, and prioritization.</w:t>
+        <w:t xml:space="preserve">Translated co-founders’ product vision and Figma designs into working features; owned roadmap, prioritization, and customer-facing iteration cycles.</w:t>
       </w:r>
     </w:p>
     <w:bookmarkEnd w:id="28"/>
@@ -802,6 +790,25 @@
           <w:b/>
           <w:bCs/>
         </w:rPr>
+        <w:t xml:space="preserve">AI/LLM</w:t>
+      </w:r>
+      <w:r>
+        <w:t xml:space="preserve">: LLM application development, prompt engineering, tool use, RAG, context augmentation, multi-LLM integration, AI evaluation (AISI Inspect), MCP (Model Context Protocol), agent workflows.</w:t>
+      </w:r>
+    </w:p>
+    <w:p>
+      <w:pPr>
+        <w:pStyle w:val="Compact"/>
+        <w:numPr>
+          <w:ilvl w:val="0"/>
+          <w:numId w:val="1008"/>
+        </w:numPr>
+      </w:pPr>
+      <w:r>
+        <w:rPr>
+          <w:b/>
+          <w:bCs/>
+        </w:rPr>
         <w:t xml:space="preserve">Languages &amp; Frameworks</w:t>
       </w:r>
       <w:r>
@@ -862,7 +869,7 @@
         <w:t xml:space="preserve">Cloud &amp; Infrastructure</w:t>
       </w:r>
       <w:r>
-        <w:t xml:space="preserve">: AWS, Google Cloud Platform, Kubernetes, Docker, Terraform, Ansible, Pulumi, Helm.</w:t>
+        <w:t xml:space="preserve">: AWS, Google Cloud Platform, Kubernetes, Docker, Terraform, Pulumi, Helm.</w:t>
       </w:r>
     </w:p>
     <w:p>
@@ -881,7 +888,7 @@
         <w:t xml:space="preserve">CI/CD &amp; DevOps</w:t>
       </w:r>
       <w:r>
-        <w:t xml:space="preserve">: CircleCI, GitHub Actions, Automated Testing, TDD, Infrastructure as Code, Cloud-Native Architecture.</w:t>
+        <w:t xml:space="preserve">: CircleCI, GitHub Actions, Automated Testing, TDD, Infrastructure as Code.</w:t>
       </w:r>
     </w:p>
     <w:p>
@@ -897,29 +904,10 @@
           <w:b/>
           <w:bCs/>
         </w:rPr>
-        <w:t xml:space="preserve">AI/LLM</w:t>
-      </w:r>
-      <w:r>
-        <w:t xml:space="preserve">: MCP (Model Context Protocol), chatbot development, prompt engineering, tool use, context augmentation, AI-assisted developer workflows.</w:t>
-      </w:r>
-    </w:p>
-    <w:p>
-      <w:pPr>
-        <w:pStyle w:val="Compact"/>
-        <w:numPr>
-          <w:ilvl w:val="0"/>
-          <w:numId w:val="1008"/>
-        </w:numPr>
-      </w:pPr>
-      <w:r>
-        <w:rPr>
-          <w:b/>
-          <w:bCs/>
-        </w:rPr>
-        <w:t xml:space="preserve">Leadership</w:t>
-      </w:r>
-      <w:r>
-        <w:t xml:space="preserve">: Team Building, Coaching &amp; Mentoring, Cross-Functional Collaboration, Roadmap Ownership, Hiring, Agile/Scrum/Kanban, Change Management.</w:t>
+        <w:t xml:space="preserve">Collaboration</w:t>
+      </w:r>
+      <w:r>
+        <w:t xml:space="preserve">: Partnering with non-technical stakeholders, requirements scoping, technical writing, mentoring, cross-functional delivery.</w:t>
       </w:r>
     </w:p>
     <w:bookmarkEnd w:id="43"/>

</xml_diff>

<commit_message>
Calibrate Stanford resume: drop Principal claim and RAG; lead with shipping + tech leadership
</commit_message>
<xml_diff>
--- a/resume.docx
+++ b/resume.docx
@@ -112,13 +112,13 @@
           <w:b/>
           <w:bCs/>
         </w:rPr>
-        <w:t xml:space="preserve">Principal-level full-stack engineer</w:t>
-      </w:r>
-      <w:r>
-        <w:t xml:space="preserve"> </w:t>
-      </w:r>
-      <w:r>
-        <w:t xml:space="preserve">shipping AI-powered applications end-to-end — from LLM integration and prompt engineering through Rails/React UI to cloud-native deployment</w:t>
+        <w:t xml:space="preserve">Senior full-stack engineer</w:t>
+      </w:r>
+      <w:r>
+        <w:t xml:space="preserve"> </w:t>
+      </w:r>
+      <w:r>
+        <w:t xml:space="preserve">shipping AI-powered applications end-to-end — LLM integration, prompt engineering, tool use, Rails/React UI, cloud-native deployment</w:t>
       </w:r>
     </w:p>
     <w:p>
@@ -156,7 +156,7 @@
         <w:t xml:space="preserve"> </w:t>
       </w:r>
       <w:r>
-        <w:t xml:space="preserve">across multiple product domains</w:t>
+        <w:t xml:space="preserve">as tech lead, architect, and engineering manager</w:t>
       </w:r>
     </w:p>
     <w:p>
@@ -196,7 +196,7 @@
         </w:numPr>
       </w:pPr>
       <w:r>
-        <w:t xml:space="preserve">Hands-on with modern AI tooling: LLM application development, MCP servers, retrieval-augmented generation, AI evaluation frameworks, agent workflows</w:t>
+        <w:t xml:space="preserve">Hands-on with modern AI tooling: multi-LLM application development, MCP servers, AI evaluation frameworks, agentic coding workflows</w:t>
       </w:r>
     </w:p>
     <w:p>
@@ -208,23 +208,20 @@
         </w:numPr>
       </w:pPr>
       <w:r>
-        <w:t xml:space="preserve">Committed</w:t>
-      </w:r>
-      <w:r>
-        <w:t xml:space="preserve"> </w:t>
-      </w:r>
-      <w:r>
-        <w:rPr>
-          <w:b/>
-          <w:bCs/>
-        </w:rPr>
-        <w:t xml:space="preserve">mentor and coach</w:t>
-      </w:r>
-      <w:r>
-        <w:t xml:space="preserve"> </w:t>
-      </w:r>
-      <w:r>
-        <w:t xml:space="preserve">who elevated junior engineers to senior technical and engineering management positions</w:t>
+        <w:t xml:space="preserve">Strength in</w:t>
+      </w:r>
+      <w:r>
+        <w:t xml:space="preserve"> </w:t>
+      </w:r>
+      <w:r>
+        <w:rPr>
+          <w:b/>
+          <w:bCs/>
+        </w:rPr>
+        <w:t xml:space="preserve">technical leadership and architecture</w:t>
+      </w:r>
+      <w:r>
+        <w:t xml:space="preserve">: roadmapping, system design, mentoring, and stewarding rag-tag teams to durable outcomes</w:t>
       </w:r>
     </w:p>
     <w:p>
@@ -793,7 +790,7 @@
         <w:t xml:space="preserve">AI/LLM</w:t>
       </w:r>
       <w:r>
-        <w:t xml:space="preserve">: LLM application development, prompt engineering, tool use, RAG, context augmentation, multi-LLM integration, AI evaluation (AISI Inspect), MCP (Model Context Protocol), agent workflows.</w:t>
+        <w:t xml:space="preserve">: LLM application development, prompt engineering, tool use, context augmentation, multi-LLM integration, AI evaluation (AISI Inspect), MCP (Model Context Protocol), agentic coding workflows.</w:t>
       </w:r>
     </w:p>
     <w:p>

</xml_diff>

<commit_message>
Mirror Astrology: end date Jul 2026, rebranded to Alchemy Astrology
</commit_message>
<xml_diff>
--- a/resume.docx
+++ b/resume.docx
@@ -330,13 +330,13 @@
         <w:t xml:space="preserve">Co-founder &amp; Software Engineer</w:t>
       </w:r>
     </w:p>
-    <w:bookmarkStart w:id="28" w:name="Xffd4b369c0bcf0f7e3f28f0e84324bac520d95a"/>
+    <w:bookmarkStart w:id="28" w:name="Xabfc89ad0ecf455a67a7dad8c9e074f0d6e313c"/>
     <w:p>
       <w:pPr>
         <w:pStyle w:val="Heading4"/>
       </w:pPr>
       <w:r>
-        <w:t xml:space="preserve">Mirror Astrology | Nov 2024 - Present | Remote</w:t>
+        <w:t xml:space="preserve">Alchemy Astrology (formerly Mirror Astrology) | Nov 2024 - Jul 2026 | Remote</w:t>
       </w:r>
     </w:p>
     <w:p>
@@ -1228,7 +1228,11 @@
     </w:p>
     <w:bookmarkEnd w:id="47"/>
     <w:bookmarkEnd w:id="48"/>
-    <w:sectPr/>
+    <w:sectPr>
+      <w:footnotePr>
+        <w:numRestart w:val="eachSect"/>
+      </w:footnotePr>
+    </w:sectPr>
   </w:body>
 </w:document>
 </file>

</xml_diff>

<commit_message>
BHT is ongoing: June 2025 - Present
</commit_message>
<xml_diff>
--- a/resume.docx
+++ b/resume.docx
@@ -258,13 +258,13 @@
         <w:t xml:space="preserve">Co-founder &amp; Fractional CTO</w:t>
       </w:r>
     </w:p>
-    <w:bookmarkStart w:id="26" w:name="Xcbcb0b4ae423d65aa67808c8eadefd17d06e436"/>
+    <w:bookmarkStart w:id="26" w:name="X6dafa89e46c32694395442a9a6ca99eae379ab9"/>
     <w:p>
       <w:pPr>
         <w:pStyle w:val="Heading4"/>
       </w:pPr>
       <w:r>
-        <w:t xml:space="preserve">Building Humane Technology | June 2025 - Mar 2026 | Remote</w:t>
+        <w:t xml:space="preserve">Building Humane Technology | June 2025 - Present | Remote</w:t>
       </w:r>
     </w:p>
     <w:p>

</xml_diff>

<commit_message>
Tailor resume for Anthropic Software Engineering Generalist contract (via BayOne)
Co-Authored-By: Claude Opus 5 <noreply@anthropic.com>
Claude-Session: https://claude.ai/code/session_01AFn2A9u39qvLMpvLN59SSo
</commit_message>
<xml_diff>
--- a/resume.docx
+++ b/resume.docx
@@ -11,13 +11,13 @@
         <w:t xml:space="preserve">Jack Senechal</w:t>
       </w:r>
     </w:p>
-    <w:bookmarkStart w:id="23" w:name="ai-tooling-platform-engineer"/>
+    <w:bookmarkStart w:id="23" w:name="product-engineer-full-stack-generalist"/>
     <w:p>
       <w:pPr>
         <w:pStyle w:val="Heading2"/>
       </w:pPr>
       <w:r>
-        <w:t xml:space="preserve">AI Tooling &amp; Platform Engineer</w:t>
+        <w:t xml:space="preserve">Product Engineer · Full-Stack Generalist</w:t>
       </w:r>
     </w:p>
     <w:p>
@@ -112,13 +112,10 @@
           <w:b/>
           <w:bCs/>
         </w:rPr>
-        <w:t xml:space="preserve">Principal-level engineer</w:t>
-      </w:r>
-      <w:r>
-        <w:t xml:space="preserve"> </w:t>
-      </w:r>
-      <w:r>
-        <w:t xml:space="preserve">specializing in AI-powered developer tooling, platform modernization, and large-scale engineering productivity</w:t>
+        <w:t xml:space="preserve">Full-stack product engineer, 20+ years shipping production software</w:t>
+      </w:r>
+      <w:r>
+        <w:t xml:space="preserve">, most of it at startups and as a founder. No big-company detour.</w:t>
       </w:r>
     </w:p>
     <w:p>
@@ -134,29 +131,13 @@
           <w:b/>
           <w:bCs/>
         </w:rPr>
-        <w:t xml:space="preserve">15+ years</w:t>
-      </w:r>
-      <w:r>
-        <w:t xml:space="preserve"> </w:t>
-      </w:r>
-      <w:r>
-        <w:t xml:space="preserve">building and shipping software, with</w:t>
-      </w:r>
-      <w:r>
-        <w:t xml:space="preserve"> </w:t>
-      </w:r>
-      <w:r>
-        <w:rPr>
-          <w:b/>
-          <w:bCs/>
-        </w:rPr>
-        <w:t xml:space="preserve">6+ years leading teams</w:t>
-      </w:r>
-      <w:r>
-        <w:t xml:space="preserve"> </w:t>
-      </w:r>
-      <w:r>
-        <w:t xml:space="preserve">across multiple product domains</w:t>
+        <w:t xml:space="preserve">Builds the platform behind the feature request.</w:t>
+      </w:r>
+      <w:r>
+        <w:t xml:space="preserve"> </w:t>
+      </w:r>
+      <w:r>
+        <w:t xml:space="preserve">Specializes in internal tools and platforms that other people build on: shared infrastructure, integration middleware, and developer-facing primitives with real internal customers.</w:t>
       </w:r>
     </w:p>
     <w:p>
@@ -168,7 +149,17 @@
         </w:numPr>
       </w:pPr>
       <w:r>
-        <w:t xml:space="preserve">Full-stack generalist with deep experience applying AI/LLMs, DevOps, and cloud-native systems to accelerate software delivery</w:t>
+        <w:rPr>
+          <w:b/>
+          <w:bCs/>
+        </w:rPr>
+        <w:t xml:space="preserve">Operates as a team of one when the job calls for it.</w:t>
+      </w:r>
+      <w:r>
+        <w:t xml:space="preserve"> </w:t>
+      </w:r>
+      <w:r>
+        <w:t xml:space="preserve">Four founding ventures, each taken from idea to a shipped, running product across backend, frontend, and infrastructure.</w:t>
       </w:r>
     </w:p>
     <w:p>
@@ -180,23 +171,17 @@
         </w:numPr>
       </w:pPr>
       <w:r>
-        <w:t xml:space="preserve">Committed</w:t>
-      </w:r>
-      <w:r>
-        <w:t xml:space="preserve"> </w:t>
-      </w:r>
-      <w:r>
-        <w:rPr>
-          <w:b/>
-          <w:bCs/>
-        </w:rPr>
-        <w:t xml:space="preserve">mentor and coach</w:t>
-      </w:r>
-      <w:r>
-        <w:t xml:space="preserve"> </w:t>
-      </w:r>
-      <w:r>
-        <w:t xml:space="preserve">who elevated junior engineers to senior technical and engineering management positions</w:t>
+        <w:rPr>
+          <w:b/>
+          <w:bCs/>
+        </w:rPr>
+        <w:t xml:space="preserve">Works directly with users.</w:t>
+      </w:r>
+      <w:r>
+        <w:t xml:space="preserve"> </w:t>
+      </w:r>
+      <w:r>
+        <w:t xml:space="preserve">Ran internal platform teams as a service organization: consulting with engineers and stakeholders, triaging requests, and turning recurring one-offs into general capabilities.</w:t>
       </w:r>
     </w:p>
     <w:p>
@@ -208,23 +193,17 @@
         </w:numPr>
       </w:pPr>
       <w:r>
-        <w:t xml:space="preserve">Strong customer focus,</w:t>
-      </w:r>
-      <w:r>
-        <w:t xml:space="preserve"> </w:t>
-      </w:r>
-      <w:r>
-        <w:rPr>
-          <w:b/>
-          <w:bCs/>
-        </w:rPr>
-        <w:t xml:space="preserve">advocating for impactful changes</w:t>
-      </w:r>
-      <w:r>
-        <w:t xml:space="preserve"> </w:t>
-      </w:r>
-      <w:r>
-        <w:t xml:space="preserve">and ensuring product value</w:t>
+        <w:rPr>
+          <w:b/>
+          <w:bCs/>
+        </w:rPr>
+        <w:t xml:space="preserve">Owns outcomes, not tickets.</w:t>
+      </w:r>
+      <w:r>
+        <w:t xml:space="preserve"> </w:t>
+      </w:r>
+      <w:r>
+        <w:t xml:space="preserve">Roadmap ownership, product and prioritization calls, and accountability for whether the thing actually solved the problem.</w:t>
       </w:r>
     </w:p>
     <w:p>
@@ -236,7 +215,14 @@
         </w:numPr>
       </w:pPr>
       <w:r>
-        <w:t xml:space="preserve">Entrepreneurial spirit with multiple co-founding experiences</w:t>
+        <w:rPr>
+          <w:b/>
+          <w:bCs/>
+        </w:rPr>
+        <w:t xml:space="preserve">Fluent in AI-assisted development</w:t>
+      </w:r>
+      <w:r>
+        <w:t xml:space="preserve">: builds with LLMs (evaluation frameworks, MCP servers, chat products) and works daily inside agentic coding systems.</w:t>
       </w:r>
     </w:p>
     <w:bookmarkEnd w:id="24"/>
@@ -258,13 +244,13 @@
         <w:t xml:space="preserve">Co-founder &amp; Fractional CTO</w:t>
       </w:r>
     </w:p>
-    <w:bookmarkStart w:id="26" w:name="X6dafa89e46c32694395442a9a6ca99eae379ab9"/>
+    <w:bookmarkStart w:id="26" w:name="X6d4a3e04cb0dd24aa8d860fb342aaa5143cfa7e"/>
     <w:p>
       <w:pPr>
         <w:pStyle w:val="Heading4"/>
       </w:pPr>
       <w:r>
-        <w:t xml:space="preserve">Building Humane Technology | June 2025 - Present | Remote</w:t>
+        <w:t xml:space="preserve">Building Humane Technology | June 2025 - Present | Remote (part-time)</w:t>
       </w:r>
     </w:p>
     <w:p>
@@ -276,7 +262,7 @@
         </w:numPr>
       </w:pPr>
       <w:r>
-        <w:t xml:space="preserve">Co-architecting and leading development of</w:t>
+        <w:t xml:space="preserve">Co-architected and lead development of</w:t>
       </w:r>
       <w:r>
         <w:t xml:space="preserve"> </w:t>
@@ -292,7 +278,17 @@
         </w:r>
       </w:hyperlink>
       <w:r>
-        <w:t xml:space="preserve">, an open-source AI evaluation framework built on AISI Inspect. Python.</w:t>
+        <w:t xml:space="preserve">, an open-source AI evaluation framework built on AISI Inspect.</w:t>
+      </w:r>
+      <w:r>
+        <w:t xml:space="preserve"> </w:t>
+      </w:r>
+      <w:r>
+        <w:rPr>
+          <w:b/>
+          <w:bCs/>
+        </w:rPr>
+        <w:t xml:space="preserve">Python.</w:t>
       </w:r>
     </w:p>
     <w:p>
@@ -304,7 +300,7 @@
         </w:numPr>
       </w:pPr>
       <w:r>
-        <w:t xml:space="preserve">Developing extensible evaluation tooling focused on measuring and improving LLM behavior in real-world developer and operational workflows.</w:t>
+        <w:t xml:space="preserve">Took the benchmark from concept to a published, externally usable product: scenario datasets, multi-provider LLM support, extensible scoring, and the documentation and positioning around it.</w:t>
       </w:r>
     </w:p>
     <w:p>
@@ -316,7 +312,7 @@
         </w:numPr>
       </w:pPr>
       <w:r>
-        <w:t xml:space="preserve">Shaping product and technical roadmap for AI-driven tooling, including production monitoring, multi-turn evaluation, and maturity models for adoption and continuous improvement.</w:t>
+        <w:t xml:space="preserve">Own product direction as well as code, including a client contract implementation sprint currently in flight, plus roadmap work on production monitoring, multi-turn evaluation, and adoption maturity models.</w:t>
       </w:r>
     </w:p>
     <w:bookmarkEnd w:id="26"/>
@@ -348,7 +344,20 @@
         </w:numPr>
       </w:pPr>
       <w:r>
-        <w:t xml:space="preserve">Built AI chatbot integrating multiple LLMs with complex prompting and context augmentation.</w:t>
+        <w:t xml:space="preserve">Built and shipped a</w:t>
+      </w:r>
+      <w:r>
+        <w:t xml:space="preserve"> </w:t>
+      </w:r>
+      <w:r>
+        <w:rPr>
+          <w:b/>
+          <w:bCs/>
+        </w:rPr>
+        <w:t xml:space="preserve">production consumer app end to end</w:t>
+      </w:r>
+      <w:r>
+        <w:t xml:space="preserve">, solo on the engineering side for much of its life: backend, frontend, payments, auth, and deployment.</w:t>
       </w:r>
     </w:p>
     <w:p>
@@ -360,7 +369,7 @@
         </w:numPr>
       </w:pPr>
       <w:r>
-        <w:t xml:space="preserve">Front-end development: Ruby on Rails views, JavaScript, HTML+CSS, Tailwind, responsive UI/UX.</w:t>
+        <w:t xml:space="preserve">Built the LLM chat experience: multi-provider integration, prompt design, and context augmentation for long-running conversations.</w:t>
       </w:r>
     </w:p>
     <w:p>
@@ -372,7 +381,14 @@
         </w:numPr>
       </w:pPr>
       <w:r>
-        <w:t xml:space="preserve">Back-end development: Stripe integration, SSO authentication, Rails MVC.</w:t>
+        <w:rPr>
+          <w:b/>
+          <w:bCs/>
+        </w:rPr>
+        <w:t xml:space="preserve">Front-end</w:t>
+      </w:r>
+      <w:r>
+        <w:t xml:space="preserve">: Rails views, JavaScript, HTML/CSS, Tailwind, responsive UI/UX built against Figma designs.</w:t>
       </w:r>
     </w:p>
     <w:p>
@@ -384,7 +400,26 @@
         </w:numPr>
       </w:pPr>
       <w:r>
-        <w:t xml:space="preserve">Collaborated closely with co-founders on product direction, Figma design, UX, roadmap planning, and prioritization.</w:t>
+        <w:rPr>
+          <w:b/>
+          <w:bCs/>
+        </w:rPr>
+        <w:t xml:space="preserve">Back-end</w:t>
+      </w:r>
+      <w:r>
+        <w:t xml:space="preserve">: Rails MVC, Stripe subscription billing, SSO authentication.</w:t>
+      </w:r>
+    </w:p>
+    <w:p>
+      <w:pPr>
+        <w:pStyle w:val="Compact"/>
+        <w:numPr>
+          <w:ilvl w:val="0"/>
+          <w:numId w:val="1003"/>
+        </w:numPr>
+      </w:pPr>
+      <w:r>
+        <w:t xml:space="preserve">Made the product and prioritization calls with co-founders: roadmap, scope, what to cut, what to ship next.</w:t>
       </w:r>
     </w:p>
     <w:bookmarkEnd w:id="28"/>
@@ -416,7 +451,20 @@
         </w:numPr>
       </w:pPr>
       <w:r>
-        <w:t xml:space="preserve">Architected and implemented a scalable cloud platform serving customer workloads at a fast-paced startup.</w:t>
+        <w:t xml:space="preserve">Architected and implemented a cloud platform serving customer workloads at an early-stage startup.</w:t>
+      </w:r>
+      <w:r>
+        <w:t xml:space="preserve"> </w:t>
+      </w:r>
+      <w:r>
+        <w:rPr>
+          <w:b/>
+          <w:bCs/>
+        </w:rPr>
+        <w:t xml:space="preserve">Python</w:t>
+      </w:r>
+      <w:r>
+        <w:t xml:space="preserve">, Pulumi, GCP, GKE, Cloud Run, Helm.</w:t>
       </w:r>
     </w:p>
     <w:p>
@@ -428,7 +476,7 @@
         </w:numPr>
       </w:pPr>
       <w:r>
-        <w:t xml:space="preserve">Built CI/CD patterns including mono-repo conditional workflows, workload identity federation, and continuous delivery.</w:t>
+        <w:t xml:space="preserve">Built CI/CD primitives the rest of engineering used: mono-repo conditional workflows, workload identity federation, continuous delivery.</w:t>
       </w:r>
     </w:p>
     <w:p>
@@ -440,30 +488,18 @@
         </w:numPr>
       </w:pPr>
       <w:r>
-        <w:t xml:space="preserve">Implemented a Slack-based customer support and incident response platform; onboarded teammates and customers.</w:t>
-      </w:r>
-    </w:p>
-    <w:p>
-      <w:pPr>
-        <w:pStyle w:val="Compact"/>
-        <w:numPr>
-          <w:ilvl w:val="0"/>
-          <w:numId w:val="1004"/>
-        </w:numPr>
-      </w:pPr>
-      <w:r>
-        <w:t xml:space="preserve">Python, Pulumi, GCP, GKE, Cloud Run, CircleCI, Helm, SQLMesh.</w:t>
+        <w:t xml:space="preserve">Built an internal Slack-based support and incident-response tool, then onboarded teammates and customers onto it.</w:t>
       </w:r>
     </w:p>
     <w:bookmarkEnd w:id="30"/>
     <w:bookmarkEnd w:id="31"/>
-    <w:bookmarkStart w:id="33" w:name="X7a2c313efdde198d901363c762c81839771c845"/>
+    <w:bookmarkStart w:id="33" w:name="Xb0214e1707a9d6363adb3661ec89e83821aff93"/>
     <w:p>
       <w:pPr>
         <w:pStyle w:val="Heading3"/>
       </w:pPr>
       <w:r>
-        <w:t xml:space="preserve">Engineering Manager / Principal Software Engineer</w:t>
+        <w:t xml:space="preserve">Principal Software Engineer / Engineering Manager</w:t>
       </w:r>
     </w:p>
     <w:bookmarkStart w:id="32" w:name="X47289269eb944414c9285d314973b45c253bcef"/>
@@ -494,7 +530,39 @@
         <w:t xml:space="preserve"> </w:t>
       </w:r>
       <w:r>
-        <w:t xml:space="preserve">(2 years): Led a team to stabilize and scale an agent-based integration platform handling multi-system data orchestration. Established operational metrics and monitoring that reduced errors and incidents by ~100x. Executed a zero-downtime migration to Kubernetes including relational, document, and cache databases.</w:t>
+        <w:t xml:space="preserve">(2 years): Took over an unreliable agent-based integration platform connecting the SaaS to customer systems (Salesforce, HRIS, accounting) and led its rearchitecture into a dependable one.</w:t>
+      </w:r>
+      <w:r>
+        <w:t xml:space="preserve"> </w:t>
+      </w:r>
+      <w:r>
+        <w:rPr>
+          <w:b/>
+          <w:bCs/>
+        </w:rPr>
+        <w:t xml:space="preserve">Cut error rates roughly 100x</w:t>
+      </w:r>
+      <w:r>
+        <w:t xml:space="preserve"> </w:t>
+      </w:r>
+      <w:r>
+        <w:t xml:space="preserve">by instrumenting the system and fixing what the data actually pointed at. Executed a</w:t>
+      </w:r>
+      <w:r>
+        <w:t xml:space="preserve"> </w:t>
+      </w:r>
+      <w:r>
+        <w:rPr>
+          <w:b/>
+          <w:bCs/>
+        </w:rPr>
+        <w:t xml:space="preserve">zero-downtime migration</w:t>
+      </w:r>
+      <w:r>
+        <w:t xml:space="preserve"> </w:t>
+      </w:r>
+      <w:r>
+        <w:t xml:space="preserve">from Heroku to Kubernetes and RDS, including relational, document, and cache stores.</w:t>
       </w:r>
     </w:p>
     <w:p>
@@ -510,13 +578,29 @@
           <w:b/>
           <w:bCs/>
         </w:rPr>
-        <w:t xml:space="preserve">Infrastructure Platform</w:t>
-      </w:r>
-      <w:r>
-        <w:t xml:space="preserve"> </w:t>
-      </w:r>
-      <w:r>
-        <w:t xml:space="preserve">(4 years): Recruited and built a new team from scratch dedicated to the infrastructure platform. Led the organization’s DevOps culture transformation, serving as a change agent and technical authority across engineering. Owned roadmap stewardship, requirements triage, and priority management while staying hands-on with coding, architecture, and code review. Transitioned a large legacy codebase to cloud-native, Infrastructure-as-Code tooling (Terraform, Ansible, Kubernetes).</w:t>
+        <w:t xml:space="preserve">Internal Infrastructure Platform</w:t>
+      </w:r>
+      <w:r>
+        <w:t xml:space="preserve"> </w:t>
+      </w:r>
+      <w:r>
+        <w:t xml:space="preserve">(4 years): Built a new team from scratch whose product was the platform the entire engineering organization built on. Ran it as a service org with internal customers: consulted with teams on their workflows, triaged requests, and</w:t>
+      </w:r>
+      <w:r>
+        <w:t xml:space="preserve"> </w:t>
+      </w:r>
+      <w:r>
+        <w:rPr>
+          <w:b/>
+          <w:bCs/>
+        </w:rPr>
+        <w:t xml:space="preserve">reduced recurring one-off asks into shared primitives and self-serve tooling</w:t>
+      </w:r>
+      <w:r>
+        <w:t xml:space="preserve"> </w:t>
+      </w:r>
+      <w:r>
+        <w:t xml:space="preserve">so teams could ship without waiting on us. Owned the roadmap while staying hands-on in code, architecture, and review. Migrated a large legacy Rails monolith and its service ecosystem to cloud-native infrastructure (Terraform, Ansible, Kubernetes).</w:t>
       </w:r>
     </w:p>
     <w:p>
@@ -532,13 +616,32 @@
           <w:b/>
           <w:bCs/>
         </w:rPr>
+        <w:t xml:space="preserve">Rebuilt the team after mass departures</w:t>
+      </w:r>
+      <w:r>
+        <w:t xml:space="preserve">: inherited a two-person DevOps team with one member two weeks from leaving, and rebuilt hiring, onboarding, documentation, and on-call practice from near zero into a stable team with strong developer relations.</w:t>
+      </w:r>
+    </w:p>
+    <w:p>
+      <w:pPr>
+        <w:pStyle w:val="Compact"/>
+        <w:numPr>
+          <w:ilvl w:val="0"/>
+          <w:numId w:val="1005"/>
+        </w:numPr>
+      </w:pPr>
+      <w:r>
+        <w:rPr>
+          <w:b/>
+          <w:bCs/>
+        </w:rPr>
         <w:t xml:space="preserve">BI Data Pipeline</w:t>
       </w:r>
       <w:r>
         <w:t xml:space="preserve"> </w:t>
       </w:r>
       <w:r>
-        <w:t xml:space="preserve">(3 months): Led a transition team to take ownership of and improve the analytics data pipeline. Migrated the pipeline to Kubernetes.</w:t>
+        <w:t xml:space="preserve">(3 months): Led a transition team that took ownership of the analytics pipeline and migrated it to Kubernetes.</w:t>
       </w:r>
     </w:p>
     <w:p>
@@ -554,23 +657,20 @@
           <w:b/>
           <w:bCs/>
         </w:rPr>
-        <w:t xml:space="preserve">Cross-Functional Impact</w:t>
-      </w:r>
-      <w:r>
-        <w:t xml:space="preserve">: Mentored engineers across teams — notably coached a junior engineer who grew to Engineering Manager. Led interviewing and hiring. Drove organizational change management and process optimization.</w:t>
-      </w:r>
-      <w:r>
-        <w:t xml:space="preserve"> </w:t>
-      </w:r>
-      <w:r>
-        <w:rPr>
-          <w:b/>
-          <w:bCs/>
-        </w:rPr>
-        <w:t xml:space="preserve">Top Performer Award, 2021</w:t>
-      </w:r>
-      <w:r>
-        <w:t xml:space="preserve">.</w:t>
+        <w:t xml:space="preserve">Grew multiple junior engineers into senior SWE and Engineering Manager roles</w:t>
+      </w:r>
+      <w:r>
+        <w:t xml:space="preserve">; led interviewing and hiring.</w:t>
+      </w:r>
+      <w:r>
+        <w:t xml:space="preserve"> </w:t>
+      </w:r>
+      <w:r>
+        <w:rPr>
+          <w:b/>
+          <w:bCs/>
+        </w:rPr>
+        <w:t xml:space="preserve">Top Performer Award, 2021.</w:t>
       </w:r>
     </w:p>
     <w:bookmarkEnd w:id="32"/>
@@ -602,7 +702,7 @@
         </w:numPr>
       </w:pPr>
       <w:r>
-        <w:t xml:space="preserve">Designed, architected, and built a cross-platform mobile app from scratch (iOS/Android). Node.js backend, JS/Phonegap frontend, Firebase real-time systems, CI/CD to AWS/CloudFront via CircleCI.</w:t>
+        <w:t xml:space="preserve">Designed, architected, and built a cross-platform mobile app from scratch for iOS and Android. Node.js backend, JavaScript frontend, Firebase real-time systems, CI/CD to AWS/CloudFront via CircleCI.</w:t>
       </w:r>
     </w:p>
     <w:p>
@@ -614,7 +714,7 @@
         </w:numPr>
       </w:pPr>
       <w:r>
-        <w:t xml:space="preserve">Established engineering workflow: pair programming, automated testing (Karma/Chai), continuous integration, and rapid deployment processes.</w:t>
+        <w:t xml:space="preserve">Established the engineering workflow from nothing: pair programming, automated testing, continuous integration, rapid deployment.</w:t>
       </w:r>
     </w:p>
     <w:p>
@@ -659,7 +759,7 @@
         <w:t xml:space="preserve"> </w:t>
       </w:r>
       <w:r>
-        <w:t xml:space="preserve">(2008 - 2014): Founded OpenTest Pro (automated testing education). Built e-commerce ordering system for Turnbull &amp; Asser shirtmakers. Full-stack consulting in Ruby on Rails, Node.js, D3 data visualization. Rapid prototyping and client delivery.</w:t>
+        <w:t xml:space="preserve">(2008 - 2014): Founded OpenTest Pro (automated testing education). Built an e-commerce ordering system for Turnbull &amp; Asser shirtmakers. Full-stack consulting in Ruby on Rails, Node.js, and D3 data visualization, with rapid prototyping and direct client delivery.</w:t>
       </w:r>
     </w:p>
     <w:p>
@@ -681,7 +781,7 @@
         <w:t xml:space="preserve"> </w:t>
       </w:r>
       <w:r>
-        <w:t xml:space="preserve">(2006 - 2007): Introduced automated testing and CI. Built comprehensive API test suite. Integrated platform with Salesforce APIs.</w:t>
+        <w:t xml:space="preserve">(2006 - 2007): Introduced automated testing and CI. Built a comprehensive API test suite. Integrated the platform with Salesforce APIs.</w:t>
       </w:r>
     </w:p>
     <w:p>
@@ -703,7 +803,7 @@
         <w:t xml:space="preserve"> </w:t>
       </w:r>
       <w:r>
-        <w:t xml:space="preserve">(2003 - 2006): Lead programmer and project manager for mynewsletterbuilder.com — architected initial release, then built and scaled the development team.</w:t>
+        <w:t xml:space="preserve">(2003 - 2006): Lead programmer and project manager for mynewsletterbuilder.com. Architected the initial release, then built and scaled the development team.</w:t>
       </w:r>
     </w:p>
     <w:bookmarkEnd w:id="36"/>
@@ -731,7 +831,17 @@
         <w:pStyle w:val="FirstParagraph"/>
       </w:pPr>
       <w:r>
-        <w:t xml:space="preserve">MCP (Model Context Protocol) server for scanner automation and document digitization. Privacy-first architecture with smart device discovery, JSON Schema validation, and support for both local stdio and network HTTP transports. TypeScript/Node.js.</w:t>
+        <w:t xml:space="preserve">MCP (Model Context Protocol) server that gives AI agents control of document scanners. Privacy-first architecture with smart device discovery, JSON Schema validation, and both local stdio and network HTTP transports.</w:t>
+      </w:r>
+      <w:r>
+        <w:t xml:space="preserve"> </w:t>
+      </w:r>
+      <w:r>
+        <w:rPr>
+          <w:b/>
+          <w:bCs/>
+        </w:rPr>
+        <w:t xml:space="preserve">TypeScript/Node.js.</w:t>
       </w:r>
     </w:p>
     <w:p>
@@ -762,7 +872,17 @@
         <w:pStyle w:val="FirstParagraph"/>
       </w:pPr>
       <w:r>
-        <w:t xml:space="preserve">Evaluation framework for measuring human-friendly behavior in AI assistants, built on AISI Inspect. Tests AI responses across humane technology principles including loneliness, mental health, transparency, and privacy. Supports multiple LLM providers with extensible scenario datasets. Python.</w:t>
+        <w:t xml:space="preserve">Evaluation framework for measuring human-friendly behavior in AI assistants, built on AISI Inspect. Tests AI responses across humane technology principles including loneliness, mental health, transparency, and privacy. Multi-provider LLM support with extensible scenario datasets.</w:t>
+      </w:r>
+      <w:r>
+        <w:t xml:space="preserve"> </w:t>
+      </w:r>
+      <w:r>
+        <w:rPr>
+          <w:b/>
+          <w:bCs/>
+        </w:rPr>
+        <w:t xml:space="preserve">Python.</w:t>
       </w:r>
     </w:p>
     <w:p>
@@ -802,10 +922,10 @@
           <w:b/>
           <w:bCs/>
         </w:rPr>
-        <w:t xml:space="preserve">Languages &amp; Frameworks</w:t>
-      </w:r>
-      <w:r>
-        <w:t xml:space="preserve">: JavaScript, TypeScript, Python, Ruby on Rails, Node.js, Bash.</w:t>
+        <w:t xml:space="preserve">Core</w:t>
+      </w:r>
+      <w:r>
+        <w:t xml:space="preserve">: Python, TypeScript, JavaScript, React, Node.js, Ruby on Rails, Bash.</w:t>
       </w:r>
     </w:p>
     <w:p>
@@ -824,7 +944,7 @@
         <w:t xml:space="preserve">Front-end</w:t>
       </w:r>
       <w:r>
-        <w:t xml:space="preserve">: React, Vue, HTML, CSS, Tailwind, Responsive Design, UI/UX.</w:t>
+        <w:t xml:space="preserve">: React, Vue, HTML, CSS, Tailwind, responsive design, UI/UX collaboration with designers.</w:t>
       </w:r>
     </w:p>
     <w:p>
@@ -843,7 +963,7 @@
         <w:t xml:space="preserve">Back-end &amp; Data</w:t>
       </w:r>
       <w:r>
-        <w:t xml:space="preserve">: API Design, Microservices, Distributed Systems, PostgreSQL, MySQL, MongoDB, Redis.</w:t>
+        <w:t xml:space="preserve">: API design, microservices, distributed systems, PostgreSQL, MySQL, MongoDB, Redis, Stripe, SSO/auth.</w:t>
       </w:r>
     </w:p>
     <w:p>
@@ -859,10 +979,10 @@
           <w:b/>
           <w:bCs/>
         </w:rPr>
-        <w:t xml:space="preserve">Cloud &amp; Infrastructure</w:t>
-      </w:r>
-      <w:r>
-        <w:t xml:space="preserve">: AWS, Google Cloud Platform, Kubernetes, Docker, Terraform, Ansible, Pulumi, Helm.</w:t>
+        <w:t xml:space="preserve">AI/LLM</w:t>
+      </w:r>
+      <w:r>
+        <w:t xml:space="preserve">: LLM evaluation frameworks (AISI Inspect), MCP (Model Context Protocol) servers, chatbot development, prompt engineering, context augmentation, agentic coding workflows.</w:t>
       </w:r>
     </w:p>
     <w:p>
@@ -878,10 +998,10 @@
           <w:b/>
           <w:bCs/>
         </w:rPr>
-        <w:t xml:space="preserve">CI/CD &amp; DevOps</w:t>
-      </w:r>
-      <w:r>
-        <w:t xml:space="preserve">: CircleCI, GitHub Actions, Automated Testing, TDD, Infrastructure as Code, Cloud-Native Architecture.</w:t>
+        <w:t xml:space="preserve">Infrastructure</w:t>
+      </w:r>
+      <w:r>
+        <w:t xml:space="preserve">: AWS, Google Cloud Platform, Kubernetes, Docker, Terraform, Pulumi, Ansible, Helm.</w:t>
       </w:r>
     </w:p>
     <w:p>
@@ -897,10 +1017,10 @@
           <w:b/>
           <w:bCs/>
         </w:rPr>
-        <w:t xml:space="preserve">AI/LLM</w:t>
-      </w:r>
-      <w:r>
-        <w:t xml:space="preserve">: MCP (Model Context Protocol), chatbot development, prompt engineering, tool use, context augmentation, AI-assisted developer workflows.</w:t>
+        <w:t xml:space="preserve">CI/CD &amp; Practice</w:t>
+      </w:r>
+      <w:r>
+        <w:t xml:space="preserve">: GitHub Actions, CircleCI, automated testing, TDD, infrastructure as code, rapid prototyping.</w:t>
       </w:r>
     </w:p>
     <w:p>
@@ -916,10 +1036,10 @@
           <w:b/>
           <w:bCs/>
         </w:rPr>
-        <w:t xml:space="preserve">Leadership</w:t>
-      </w:r>
-      <w:r>
-        <w:t xml:space="preserve">: Team Building, Coaching &amp; Mentoring, Cross-Functional Collaboration, Roadmap Ownership, Hiring, Agile/Scrum/Kanban, Change Management.</w:t>
+        <w:t xml:space="preserve">Product</w:t>
+      </w:r>
+      <w:r>
+        <w:t xml:space="preserve">: Roadmap ownership, product discovery with users, prioritization, scope negotiation, cross-functional collaboration with design and business stakeholders.</w:t>
       </w:r>
     </w:p>
     <w:bookmarkEnd w:id="43"/>
@@ -1067,46 +1187,33 @@
         <w:pStyle w:val="BodyText"/>
       </w:pPr>
       <w:r>
-        <w:t xml:space="preserve">“Jack has</w:t>
-      </w:r>
-      <w:r>
-        <w:t xml:space="preserve"> </w:t>
-      </w:r>
-      <w:r>
-        <w:rPr>
-          <w:b/>
-          <w:bCs/>
-        </w:rPr>
-        <w:t xml:space="preserve">had quite a profound impact on my career</w:t>
-      </w:r>
-      <w:r>
-        <w:t xml:space="preserve">. As a young engineer, I was fortunate enough to work with Jack as my coach. He served as a great mentor, helping me build both technical and professional skills and</w:t>
-      </w:r>
-      <w:r>
-        <w:t xml:space="preserve"> </w:t>
-      </w:r>
-      <w:r>
-        <w:rPr>
-          <w:b/>
-          <w:bCs/>
-        </w:rPr>
-        <w:t xml:space="preserve">forming me into the engineer that I am today</w:t>
-      </w:r>
-      <w:r>
-        <w:t xml:space="preserve">.</w:t>
-      </w:r>
-      <w:r>
-        <w:t xml:space="preserve"> </w:t>
-      </w:r>
-      <w:r>
-        <w:rPr>
-          <w:b/>
-          <w:bCs/>
-        </w:rPr>
-        <w:t xml:space="preserve">His mentorship was a key factor in elevating me from an incoming Junior Engineer to an Engineering Manager</w:t>
-      </w:r>
-      <w:r>
-        <w:t xml:space="preserve">. Jack has a great curiosity and a strong set of technical capabilities that allow him to serve as a great example for others and a key contributor to any team!”</w:t>
+        <w:t xml:space="preserve">“Jack is a fantastic engineer always ready to</w:t>
+      </w:r>
+      <w:r>
+        <w:t xml:space="preserve"> </w:t>
+      </w:r>
+      <w:r>
+        <w:rPr>
+          <w:b/>
+          <w:bCs/>
+        </w:rPr>
+        <w:t xml:space="preserve">help solve problems and more importantly, teach you how to solve them</w:t>
+      </w:r>
+      <w:r>
+        <w:t xml:space="preserve">. He guided me and my team through a bunch of challenging GitOps situations with patience and kindness, leading by example. Always diligent with his work, willing to roll up his sleeves to get things done and</w:t>
+      </w:r>
+      <w:r>
+        <w:t xml:space="preserve"> </w:t>
+      </w:r>
+      <w:r>
+        <w:rPr>
+          <w:b/>
+          <w:bCs/>
+        </w:rPr>
+        <w:t xml:space="preserve">find creative solutions</w:t>
+      </w:r>
+      <w:r>
+        <w:t xml:space="preserve">. Everyone would be lucky to have someone like him in their teams!”</w:t>
       </w:r>
     </w:p>
     <w:p>
@@ -1118,99 +1225,7 @@
           <w:i/>
           <w:iCs/>
         </w:rPr>
-        <w:t xml:space="preserve">— Wesley Morlock, Engineering Manager, Kantata</w:t>
-      </w:r>
-    </w:p>
-    <w:p>
-      <w:pPr>
-        <w:pStyle w:val="BodyText"/>
-      </w:pPr>
-      <w:r>
-        <w:t xml:space="preserve">“Jack is a fantastic engineer always ready to</w:t>
-      </w:r>
-      <w:r>
-        <w:t xml:space="preserve"> </w:t>
-      </w:r>
-      <w:r>
-        <w:rPr>
-          <w:b/>
-          <w:bCs/>
-        </w:rPr>
-        <w:t xml:space="preserve">help solve problems and more importantly, teach you how to solve them</w:t>
-      </w:r>
-      <w:r>
-        <w:t xml:space="preserve">. He guided me and my team through a bunch of challenging GitOps situations with patience and kindness, leading by example. Always diligent with his work, willing to roll up his sleeves to get things done and</w:t>
-      </w:r>
-      <w:r>
-        <w:t xml:space="preserve"> </w:t>
-      </w:r>
-      <w:r>
-        <w:rPr>
-          <w:b/>
-          <w:bCs/>
-        </w:rPr>
-        <w:t xml:space="preserve">find creative solutions</w:t>
-      </w:r>
-      <w:r>
-        <w:t xml:space="preserve">. Everyone would be lucky to have someone like him in their teams!”</w:t>
-      </w:r>
-    </w:p>
-    <w:p>
-      <w:pPr>
-        <w:pStyle w:val="BodyText"/>
-      </w:pPr>
-      <w:r>
-        <w:rPr>
-          <w:i/>
-          <w:iCs/>
-        </w:rPr>
         <w:t xml:space="preserve">— Cesar Palafox Garza, Principal Software Engineer, Kantata</w:t>
-      </w:r>
-    </w:p>
-    <w:p>
-      <w:pPr>
-        <w:pStyle w:val="BodyText"/>
-      </w:pPr>
-      <w:r>
-        <w:t xml:space="preserve">“Jack is</w:t>
-      </w:r>
-      <w:r>
-        <w:t xml:space="preserve"> </w:t>
-      </w:r>
-      <w:r>
-        <w:rPr>
-          <w:b/>
-          <w:bCs/>
-        </w:rPr>
-        <w:t xml:space="preserve">awesome at understanding the direction teams need to go to make important improvements in Kantata’s Engineering organization as a whole</w:t>
-      </w:r>
-      <w:r>
-        <w:t xml:space="preserve">. He has been instrumental in building and implementing strategies to upgrade Ruby, Rails, and React. If I had any questions about infrastructure and Kubernetes he would be able to answer and</w:t>
-      </w:r>
-      <w:r>
-        <w:t xml:space="preserve"> </w:t>
-      </w:r>
-      <w:r>
-        <w:rPr>
-          <w:b/>
-          <w:bCs/>
-        </w:rPr>
-        <w:t xml:space="preserve">provide solid explanations to the entire team</w:t>
-      </w:r>
-      <w:r>
-        <w:t xml:space="preserve">.”</w:t>
-      </w:r>
-    </w:p>
-    <w:p>
-      <w:pPr>
-        <w:pStyle w:val="BodyText"/>
-      </w:pPr>
-      <w:r>
-        <w:rPr>
-          <w:i/>
-          <w:iCs/>
-        </w:rPr>
-        <w:t xml:space="preserve">— Justin Hurstwright, Principal Software Engineer, Kantata</w:t>
       </w:r>
     </w:p>
     <w:p>

</xml_diff>

<commit_message>
Correct Alchemy Astrology scope: frontend/design ownership, not LLM chat authorship
The LLM chat system (multi-provider integration, prompting, context
augmentation) was written by cofounder Harlan. Jack owned frontend, design/UX,
and JS, and collaborated on backend.

Co-Authored-By: Claude Opus 5 <noreply@anthropic.com>
Claude-Session: https://claude.ai/code/session_01AFn2A9u39qvLMpvLN59SSo
</commit_message>
<xml_diff>
--- a/resume.docx
+++ b/resume.docx
@@ -348,7 +348,7 @@
         </w:numPr>
       </w:pPr>
       <w:r>
-        <w:t xml:space="preserve">Built AI chatbot integrating multiple LLMs with complex prompting and context augmentation.</w:t>
+        <w:t xml:space="preserve">Owned front-end development: Ruby on Rails views, JavaScript, HTML+CSS, Tailwind, responsive UI/UX.</w:t>
       </w:r>
     </w:p>
     <w:p>
@@ -360,7 +360,7 @@
         </w:numPr>
       </w:pPr>
       <w:r>
-        <w:t xml:space="preserve">Front-end development: Ruby on Rails views, JavaScript, HTML+CSS, Tailwind, responsive UI/UX.</w:t>
+        <w:t xml:space="preserve">Led design and UX delivery, working with freelance designers and translating their designs into the Rails framework.</w:t>
       </w:r>
     </w:p>
     <w:p>
@@ -372,7 +372,7 @@
         </w:numPr>
       </w:pPr>
       <w:r>
-        <w:t xml:space="preserve">Back-end development: Stripe integration, SSO authentication, Rails MVC.</w:t>
+        <w:t xml:space="preserve">Collaborated on back-end development: Stripe integration, SSO authentication, Rails MVC.</w:t>
       </w:r>
     </w:p>
     <w:p>

</xml_diff>

<commit_message>
Correct Alchemy Astrology scope; expand Tobiko and BHT detail
Alchemy: Jack owned frontend/design/UX and collaborated on backend. The LLM
chat system was written by a cofounder, not Jack. Prior bullets overstated this.

Co-Authored-By: Claude Opus 5 <noreply@anthropic.com>
Claude-Session: https://claude.ai/code/session_01AFn2A9u39qvLMpvLN59SSo
</commit_message>
<xml_diff>
--- a/resume.docx
+++ b/resume.docx
@@ -159,7 +159,7 @@
         <w:t xml:space="preserve"> </w:t>
       </w:r>
       <w:r>
-        <w:t xml:space="preserve">Four founding ventures, each taken from idea to a shipped, running product across backend, frontend, and infrastructure.</w:t>
+        <w:t xml:space="preserve">Four founding ventures, taking products from idea to shipped and running across backend, frontend, and infrastructure.</w:t>
       </w:r>
     </w:p>
     <w:p>
@@ -181,7 +181,7 @@
         <w:t xml:space="preserve"> </w:t>
       </w:r>
       <w:r>
-        <w:t xml:space="preserve">Ran internal platform teams as a service organization: consulting with engineers and stakeholders, triaging requests, and turning recurring one-offs into general capabilities.</w:t>
+        <w:t xml:space="preserve">Ran internal platform teams as a service organization, consulting with engineers and stakeholders, triaging requests, and turning recurring one-offs into general capabilities.</w:t>
       </w:r>
     </w:p>
     <w:p>
@@ -312,7 +312,89 @@
         </w:numPr>
       </w:pPr>
       <w:r>
-        <w:t xml:space="preserve">Own product direction as well as code, including a client contract implementation sprint currently in flight, plus roadmap work on production monitoring, multi-turn evaluation, and adoption maturity models.</w:t>
+        <w:t xml:space="preserve">Extending the framework toward</w:t>
+      </w:r>
+      <w:r>
+        <w:t xml:space="preserve"> </w:t>
+      </w:r>
+      <w:r>
+        <w:rPr>
+          <w:b/>
+          <w:bCs/>
+        </w:rPr>
+        <w:t xml:space="preserve">real-time evaluation</w:t>
+      </w:r>
+      <w:r>
+        <w:t xml:space="preserve">: built a</w:t>
+      </w:r>
+      <w:r>
+        <w:t xml:space="preserve"> </w:t>
+      </w:r>
+      <w:r>
+        <w:rPr>
+          <w:b/>
+          <w:bCs/>
+        </w:rPr>
+        <w:t xml:space="preserve">proof-of-concept classifier model</w:t>
+      </w:r>
+      <w:r>
+        <w:t xml:space="preserve"> </w:t>
+      </w:r>
+      <w:r>
+        <w:t xml:space="preserve">that scores model behavior against HumaneBench rubrics inline, rather than only in batch.</w:t>
+      </w:r>
+    </w:p>
+    <w:p>
+      <w:pPr>
+        <w:pStyle w:val="Compact"/>
+        <w:numPr>
+          <w:ilvl w:val="0"/>
+          <w:numId w:val="1002"/>
+        </w:numPr>
+      </w:pPr>
+      <w:r>
+        <w:t xml:space="preserve">Defined</w:t>
+      </w:r>
+      <w:r>
+        <w:t xml:space="preserve"> </w:t>
+      </w:r>
+      <w:r>
+        <w:rPr>
+          <w:b/>
+          <w:bCs/>
+        </w:rPr>
+        <w:t xml:space="preserve">operational visibility metrics</w:t>
+      </w:r>
+      <w:r>
+        <w:t xml:space="preserve"> </w:t>
+      </w:r>
+      <w:r>
+        <w:t xml:space="preserve">and the feedback path from evaluation results back into</w:t>
+      </w:r>
+      <w:r>
+        <w:t xml:space="preserve"> </w:t>
+      </w:r>
+      <w:r>
+        <w:rPr>
+          <w:b/>
+          <w:bCs/>
+        </w:rPr>
+        <w:t xml:space="preserve">system-prompt iteration and fine-tuning</w:t>
+      </w:r>
+      <w:r>
+        <w:t xml:space="preserve">.</w:t>
+      </w:r>
+    </w:p>
+    <w:p>
+      <w:pPr>
+        <w:pStyle w:val="Compact"/>
+        <w:numPr>
+          <w:ilvl w:val="0"/>
+          <w:numId w:val="1002"/>
+        </w:numPr>
+      </w:pPr>
+      <w:r>
+        <w:t xml:space="preserve">Own product direction as well as code, including roadmap work on production monitoring, multi-turn evaluation, and adoption maturity models.</w:t>
       </w:r>
     </w:p>
     <w:bookmarkEnd w:id="26"/>
@@ -344,20 +426,17 @@
         </w:numPr>
       </w:pPr>
       <w:r>
-        <w:t xml:space="preserve">Built and shipped a</w:t>
-      </w:r>
-      <w:r>
-        <w:t xml:space="preserve"> </w:t>
-      </w:r>
-      <w:r>
-        <w:rPr>
-          <w:b/>
-          <w:bCs/>
-        </w:rPr>
-        <w:t xml:space="preserve">production consumer app end to end</w:t>
-      </w:r>
-      <w:r>
-        <w:t xml:space="preserve">, solo on the engineering side for much of its life: backend, frontend, payments, auth, and deployment.</w:t>
+        <w:rPr>
+          <w:b/>
+          <w:bCs/>
+        </w:rPr>
+        <w:t xml:space="preserve">Owned the front end</w:t>
+      </w:r>
+      <w:r>
+        <w:t xml:space="preserve"> </w:t>
+      </w:r>
+      <w:r>
+        <w:t xml:space="preserve">of a production consumer subscription app: Rails views, JavaScript, HTML/CSS, Tailwind, and responsive UI/UX.</w:t>
       </w:r>
     </w:p>
     <w:p>
@@ -369,7 +448,14 @@
         </w:numPr>
       </w:pPr>
       <w:r>
-        <w:t xml:space="preserve">Built the LLM chat experience: multi-provider integration, prompt design, and context augmentation for long-running conversations.</w:t>
+        <w:rPr>
+          <w:b/>
+          <w:bCs/>
+        </w:rPr>
+        <w:t xml:space="preserve">Led design and UX delivery</w:t>
+      </w:r>
+      <w:r>
+        <w:t xml:space="preserve">: worked directly with freelance designers, then translated their Figma designs into the Rails framework.</w:t>
       </w:r>
     </w:p>
     <w:p>
@@ -381,14 +467,7 @@
         </w:numPr>
       </w:pPr>
       <w:r>
-        <w:rPr>
-          <w:b/>
-          <w:bCs/>
-        </w:rPr>
-        <w:t xml:space="preserve">Front-end</w:t>
-      </w:r>
-      <w:r>
-        <w:t xml:space="preserve">: Rails views, JavaScript, HTML/CSS, Tailwind, responsive UI/UX built against Figma designs.</w:t>
+        <w:t xml:space="preserve">Collaborated on the back end: Rails MVC, Stripe subscription billing, SSO authentication.</w:t>
       </w:r>
     </w:p>
     <w:p>
@@ -400,26 +479,7 @@
         </w:numPr>
       </w:pPr>
       <w:r>
-        <w:rPr>
-          <w:b/>
-          <w:bCs/>
-        </w:rPr>
-        <w:t xml:space="preserve">Back-end</w:t>
-      </w:r>
-      <w:r>
-        <w:t xml:space="preserve">: Rails MVC, Stripe subscription billing, SSO authentication.</w:t>
-      </w:r>
-    </w:p>
-    <w:p>
-      <w:pPr>
-        <w:pStyle w:val="Compact"/>
-        <w:numPr>
-          <w:ilvl w:val="0"/>
-          <w:numId w:val="1003"/>
-        </w:numPr>
-      </w:pPr>
-      <w:r>
-        <w:t xml:space="preserve">Made the product and prioritization calls with co-founders: roadmap, scope, what to cut, what to ship next.</w:t>
+        <w:t xml:space="preserve">Made product and prioritization calls with co-founders: roadmap, scope, what to cut, what to ship next.</w:t>
       </w:r>
     </w:p>
     <w:bookmarkEnd w:id="28"/>
@@ -488,7 +548,30 @@
         </w:numPr>
       </w:pPr>
       <w:r>
-        <w:t xml:space="preserve">Built an internal Slack-based support and incident-response tool, then onboarded teammates and customers onto it.</w:t>
+        <w:rPr>
+          <w:b/>
+          <w:bCs/>
+        </w:rPr>
+        <w:t xml:space="preserve">Owned the build-vs-buy decision</w:t>
+      </w:r>
+      <w:r>
+        <w:t xml:space="preserve"> </w:t>
+      </w:r>
+      <w:r>
+        <w:t xml:space="preserve">for customer support and incident response. Selected incident.io for incident management; after a thorough review of support tooling turned up nothing that handled Slack-based support cleanly,</w:t>
+      </w:r>
+      <w:r>
+        <w:t xml:space="preserve"> </w:t>
+      </w:r>
+      <w:r>
+        <w:rPr>
+          <w:b/>
+          <w:bCs/>
+        </w:rPr>
+        <w:t xml:space="preserve">built the Slack support agent from the ground up in Python</w:t>
+      </w:r>
+      <w:r>
+        <w:t xml:space="preserve">, then onboarded teammates and customers onto it.</w:t>
       </w:r>
     </w:p>
     <w:bookmarkEnd w:id="30"/>

</xml_diff>

<commit_message>
Strengthen BHT real-time eval bullets with confirmed performance detail
Co-Authored-By: Claude Opus 5 <noreply@anthropic.com>
Claude-Session: https://claude.ai/code/session_01AFn2A9u39qvLMpvLN59SSo
</commit_message>
<xml_diff>
--- a/resume.docx
+++ b/resume.docx
@@ -325,23 +325,36 @@
         <w:t xml:space="preserve">real-time evaluation</w:t>
       </w:r>
       <w:r>
-        <w:t xml:space="preserve">: built a</w:t>
-      </w:r>
-      <w:r>
-        <w:t xml:space="preserve"> </w:t>
-      </w:r>
-      <w:r>
-        <w:rPr>
-          <w:b/>
-          <w:bCs/>
-        </w:rPr>
-        <w:t xml:space="preserve">proof-of-concept classifier model</w:t>
-      </w:r>
-      <w:r>
-        <w:t xml:space="preserve"> </w:t>
-      </w:r>
-      <w:r>
-        <w:t xml:space="preserve">that scores model behavior against HumaneBench rubrics inline, rather than only in batch.</w:t>
+        <w:t xml:space="preserve">: engineered a</w:t>
+      </w:r>
+      <w:r>
+        <w:t xml:space="preserve"> </w:t>
+      </w:r>
+      <w:r>
+        <w:rPr>
+          <w:b/>
+          <w:bCs/>
+        </w:rPr>
+        <w:t xml:space="preserve">low-latency proof-of-concept classifier model</w:t>
+      </w:r>
+      <w:r>
+        <w:t xml:space="preserve"> </w:t>
+      </w:r>
+      <w:r>
+        <w:t xml:space="preserve">that scores model behavior against HumaneBench rubrics inline at</w:t>
+      </w:r>
+      <w:r>
+        <w:t xml:space="preserve"> </w:t>
+      </w:r>
+      <w:r>
+        <w:rPr>
+          <w:b/>
+          <w:bCs/>
+        </w:rPr>
+        <w:t xml:space="preserve">sub-100ms</w:t>
+      </w:r>
+      <w:r>
+        <w:t xml:space="preserve">, fast enough to sit in a production request path rather than run only in batch.</w:t>
       </w:r>
     </w:p>
     <w:p>
@@ -353,7 +366,20 @@
         </w:numPr>
       </w:pPr>
       <w:r>
-        <w:t xml:space="preserve">Defined</w:t>
+        <w:t xml:space="preserve">Translated qualitative behavioral rubrics into</w:t>
+      </w:r>
+      <w:r>
+        <w:t xml:space="preserve"> </w:t>
+      </w:r>
+      <w:r>
+        <w:rPr>
+          <w:b/>
+          <w:bCs/>
+        </w:rPr>
+        <w:t xml:space="preserve">structured, trainable signal definitions</w:t>
+      </w:r>
+      <w:r>
+        <w:t xml:space="preserve">, and designed the</w:t>
       </w:r>
       <w:r>
         <w:t xml:space="preserve"> </w:t>
@@ -369,17 +395,17 @@
         <w:t xml:space="preserve"> </w:t>
       </w:r>
       <w:r>
-        <w:t xml:space="preserve">and the feedback path from evaluation results back into</w:t>
-      </w:r>
-      <w:r>
-        <w:t xml:space="preserve"> </w:t>
-      </w:r>
-      <w:r>
-        <w:rPr>
-          <w:b/>
-          <w:bCs/>
-        </w:rPr>
-        <w:t xml:space="preserve">system-prompt iteration and fine-tuning</w:t>
+        <w:t xml:space="preserve">and automated feedback path carrying evaluation output back into</w:t>
+      </w:r>
+      <w:r>
+        <w:t xml:space="preserve"> </w:t>
+      </w:r>
+      <w:r>
+        <w:rPr>
+          <w:b/>
+          <w:bCs/>
+        </w:rPr>
+        <w:t xml:space="preserve">system-prompt iteration and model fine-tuning</w:t>
       </w:r>
       <w:r>
         <w:t xml:space="preserve">.</w:t>

</xml_diff>

<commit_message>
Correct BHT attribution: concept and direction are Jack's, build-out was the team's
Co-Authored-By: Claude Opus 5 <noreply@anthropic.com>
Claude-Session: https://claude.ai/code/session_01AFn2A9u39qvLMpvLN59SSo
</commit_message>
<xml_diff>
--- a/resume.docx
+++ b/resume.docx
@@ -262,9 +262,17 @@
         </w:numPr>
       </w:pPr>
       <w:r>
-        <w:t xml:space="preserve">Co-architected and lead development of</w:t>
-      </w:r>
-      <w:r>
+        <w:rPr>
+          <w:b/>
+          <w:bCs/>
+        </w:rPr>
+        <w:t xml:space="preserve">Originated the concept for</w:t>
+      </w:r>
+      <w:r>
+        <w:rPr>
+          <w:b/>
+          <w:bCs/>
+        </w:rPr>
         <w:t xml:space="preserve"> </w:t>
       </w:r>
       <w:hyperlink r:id="rId25">
@@ -278,7 +286,10 @@
         </w:r>
       </w:hyperlink>
       <w:r>
-        <w:t xml:space="preserve">, an open-source AI evaluation framework built on AISI Inspect.</w:t>
+        <w:t xml:space="preserve"> </w:t>
+      </w:r>
+      <w:r>
+        <w:t xml:space="preserve">and co-architected it: an open-source AI evaluation framework built on AISI Inspect.</w:t>
       </w:r>
       <w:r>
         <w:t xml:space="preserve"> </w:t>
@@ -300,7 +311,23 @@
         </w:numPr>
       </w:pPr>
       <w:r>
-        <w:t xml:space="preserve">Took the benchmark from concept to a published, externally usable product: scenario datasets, multi-provider LLM support, extensible scoring, and the documentation and positioning around it.</w:t>
+        <w:t xml:space="preserve">Act as</w:t>
+      </w:r>
+      <w:r>
+        <w:t xml:space="preserve"> </w:t>
+      </w:r>
+      <w:r>
+        <w:rPr>
+          <w:b/>
+          <w:bCs/>
+        </w:rPr>
+        <w:t xml:space="preserve">fractional CTO to the team</w:t>
+      </w:r>
+      <w:r>
+        <w:t xml:space="preserve"> </w:t>
+      </w:r>
+      <w:r>
+        <w:t xml:space="preserve">that built it out to a published, externally usable product, shaping architecture, scoring design, and multi-provider support, and guiding documentation and positioning.</w:t>
       </w:r>
     </w:p>
     <w:p>
@@ -420,7 +447,20 @@
         </w:numPr>
       </w:pPr>
       <w:r>
-        <w:t xml:space="preserve">Own product direction as well as code, including roadmap work on production monitoring, multi-turn evaluation, and adoption maturity models.</w:t>
+        <w:t xml:space="preserve">Own</w:t>
+      </w:r>
+      <w:r>
+        <w:t xml:space="preserve"> </w:t>
+      </w:r>
+      <w:r>
+        <w:rPr>
+          <w:b/>
+          <w:bCs/>
+        </w:rPr>
+        <w:t xml:space="preserve">product direction and roadmap</w:t>
+      </w:r>
+      <w:r>
+        <w:t xml:space="preserve">: production monitoring, multi-turn evaluation, and adoption maturity models.</w:t>
       </w:r>
     </w:p>
     <w:bookmarkEnd w:id="26"/>

</xml_diff>

<commit_message>
Add software-factory consulting section; honest agent-collaboration framing on classifier
Co-Authored-By: Claude Opus 5 <noreply@anthropic.com>
Claude-Session: https://claude.ai/code/session_01AFn2A9u39qvLMpvLN59SSo
</commit_message>
<xml_diff>
--- a/resume.docx
+++ b/resume.docx
@@ -2,7 +2,7 @@
 <file path=word/document.xml><?xml version="1.0" encoding="utf-8"?>
 <w:document xmlns:w="http://schemas.openxmlformats.org/wordprocessingml/2006/main" xmlns:m="http://schemas.openxmlformats.org/officeDocument/2006/math" xmlns:r="http://schemas.openxmlformats.org/officeDocument/2006/relationships" xmlns:o="urn:schemas-microsoft-com:office:office" xmlns:v="urn:schemas-microsoft-com:vml" xmlns:w10="urn:schemas-microsoft-com:office:word" xmlns:a="http://schemas.openxmlformats.org/drawingml/2006/main" xmlns:pic="http://schemas.openxmlformats.org/drawingml/2006/picture" xmlns:wp="http://schemas.openxmlformats.org/drawingml/2006/wordprocessingDrawing">
   <w:body>
-    <w:bookmarkStart w:id="48" w:name="jack-senechal"/>
+    <w:bookmarkStart w:id="50" w:name="jack-senechal"/>
     <w:p>
       <w:pPr>
         <w:pStyle w:val="Heading1"/>
@@ -219,14 +219,17 @@
           <w:b/>
           <w:bCs/>
         </w:rPr>
-        <w:t xml:space="preserve">Fluent in AI-assisted development</w:t>
-      </w:r>
-      <w:r>
-        <w:t xml:space="preserve">: builds with LLMs (evaluation frameworks, MCP servers, chat products) and works daily inside agentic coding systems.</w:t>
+        <w:t xml:space="preserve">Builds the machine that builds the software.</w:t>
+      </w:r>
+      <w:r>
+        <w:t xml:space="preserve"> </w:t>
+      </w:r>
+      <w:r>
+        <w:t xml:space="preserve">Designs and operates agent-driven delivery pipelines that ship production code end to end, and builds with LLMs directly (evaluation frameworks, MCP servers, chat products).</w:t>
       </w:r>
     </w:p>
     <w:bookmarkEnd w:id="24"/>
-    <w:bookmarkStart w:id="37" w:name="industry-experience"/>
+    <w:bookmarkStart w:id="39" w:name="industry-experience"/>
     <w:p>
       <w:pPr>
         <w:pStyle w:val="Heading2"/>
@@ -235,16 +238,234 @@
         <w:t xml:space="preserve">Industry Experience</w:t>
       </w:r>
     </w:p>
-    <w:bookmarkStart w:id="27" w:name="co-founder-fractional-cto"/>
+    <w:bookmarkStart w:id="26" w:name="Xee601f6099503a9e48b26ce62b1cbc6360c8cfa"/>
     <w:p>
       <w:pPr>
         <w:pStyle w:val="Heading3"/>
       </w:pPr>
       <w:r>
+        <w:t xml:space="preserve">Independent Consultant — AI-Native Software Delivery</w:t>
+      </w:r>
+    </w:p>
+    <w:bookmarkStart w:id="25" w:name="X5dd5559b1eea39500dfd9b3a47cf87c432af37e"/>
+    <w:p>
+      <w:pPr>
+        <w:pStyle w:val="Heading4"/>
+      </w:pPr>
+      <w:r>
+        <w:t xml:space="preserve">Client engagements | May 2026 - Present | Remote</w:t>
+      </w:r>
+    </w:p>
+    <w:p>
+      <w:pPr>
+        <w:pStyle w:val="Compact"/>
+        <w:numPr>
+          <w:ilvl w:val="0"/>
+          <w:numId w:val="1002"/>
+        </w:numPr>
+      </w:pPr>
+      <w:r>
+        <w:rPr>
+          <w:b/>
+          <w:bCs/>
+        </w:rPr>
+        <w:t xml:space="preserve">Build and operate</w:t>
+      </w:r>
+      <w:r>
+        <w:rPr>
+          <w:b/>
+          <w:bCs/>
+        </w:rPr>
+        <w:t xml:space="preserve"> </w:t>
+      </w:r>
+      <w:r>
+        <w:rPr>
+          <w:b/>
+          <w:bCs/>
+        </w:rPr>
+        <w:t xml:space="preserve">“software factories”</w:t>
+      </w:r>
+      <w:r>
+        <w:t xml:space="preserve">: agent-driven delivery pipelines that take engineering work from spec to shipped, with the human in the product seat. Two persistent orchestrating agent sessions delegate implementation to cheaper-model subagents, each isolated in its own</w:t>
+      </w:r>
+      <w:r>
+        <w:t xml:space="preserve"> </w:t>
+      </w:r>
+      <w:r>
+        <w:rPr>
+          <w:b/>
+          <w:bCs/>
+        </w:rPr>
+        <w:t xml:space="preserve">git worktree and database</w:t>
+      </w:r>
+      <w:r>
+        <w:t xml:space="preserve">.</w:t>
+      </w:r>
+    </w:p>
+    <w:p>
+      <w:pPr>
+        <w:pStyle w:val="Compact"/>
+        <w:numPr>
+          <w:ilvl w:val="0"/>
+          <w:numId w:val="1002"/>
+        </w:numPr>
+      </w:pPr>
+      <w:r>
+        <w:rPr>
+          <w:b/>
+          <w:bCs/>
+        </w:rPr>
+        <w:t xml:space="preserve">Delivered a production web app this way</w:t>
+      </w:r>
+      <w:r>
+        <w:t xml:space="preserve"> </w:t>
+      </w:r>
+      <w:r>
+        <w:t xml:space="preserve">(Next.js, Payload CMS, Postgres, Vercel):</w:t>
+      </w:r>
+      <w:r>
+        <w:t xml:space="preserve"> </w:t>
+      </w:r>
+      <w:r>
+        <w:rPr>
+          <w:b/>
+          <w:bCs/>
+        </w:rPr>
+        <w:t xml:space="preserve">~261 merged PRs across 190 issues in 13 weeks</w:t>
+      </w:r>
+      <w:r>
+        <w:t xml:space="preserve">, with roughly three-quarters of commits agent-produced behind automated and human review gates.</w:t>
+      </w:r>
+    </w:p>
+    <w:p>
+      <w:pPr>
+        <w:pStyle w:val="Compact"/>
+        <w:numPr>
+          <w:ilvl w:val="0"/>
+          <w:numId w:val="1002"/>
+        </w:numPr>
+      </w:pPr>
+      <w:r>
+        <w:rPr>
+          <w:b/>
+          <w:bCs/>
+        </w:rPr>
+        <w:t xml:space="preserve">Built the coordination substrate on GitHub itself</w:t>
+      </w:r>
+      <w:r>
+        <w:t xml:space="preserve"> </w:t>
+      </w:r>
+      <w:r>
+        <w:t xml:space="preserve">(issues, PRs, and Projects as the single ledger), including scheduled automation that</w:t>
+      </w:r>
+      <w:r>
+        <w:t xml:space="preserve"> </w:t>
+      </w:r>
+      <w:r>
+        <w:rPr>
+          <w:b/>
+          <w:bCs/>
+        </w:rPr>
+        <w:t xml:space="preserve">derives board state from PR, CI, and label reality</w:t>
+      </w:r>
+      <w:r>
+        <w:t xml:space="preserve"> </w:t>
+      </w:r>
+      <w:r>
+        <w:t xml:space="preserve">instead of relying on agents to remember to update it, after observing that instruction-based state tracking reliably drifts.</w:t>
+      </w:r>
+    </w:p>
+    <w:p>
+      <w:pPr>
+        <w:pStyle w:val="Compact"/>
+        <w:numPr>
+          <w:ilvl w:val="0"/>
+          <w:numId w:val="1002"/>
+        </w:numPr>
+      </w:pPr>
+      <w:r>
+        <w:rPr>
+          <w:b/>
+          <w:bCs/>
+        </w:rPr>
+        <w:t xml:space="preserve">Engineered a lifecycle hook that structurally prevents lost work</w:t>
+      </w:r>
+      <w:r>
+        <w:t xml:space="preserve">, refusing to let an agent session end while any dispatched worktree holds uncommitted or unpushed changes. Diagnosed why the first version missed the real failure population and rebuilt it with a staleness heuristic separating abandoned lanes from in-flight ones.</w:t>
+      </w:r>
+    </w:p>
+    <w:p>
+      <w:pPr>
+        <w:pStyle w:val="Compact"/>
+        <w:numPr>
+          <w:ilvl w:val="0"/>
+          <w:numId w:val="1002"/>
+        </w:numPr>
+      </w:pPr>
+      <w:r>
+        <w:rPr>
+          <w:b/>
+          <w:bCs/>
+        </w:rPr>
+        <w:t xml:space="preserve">Designed the concurrency model</w:t>
+      </w:r>
+      <w:r>
+        <w:t xml:space="preserve">: one worktree per task, stacked PR trains for multi-PR features, a correct procedure for GitHub’s squash-merge diff-base staleness, and</w:t>
+      </w:r>
+      <w:r>
+        <w:t xml:space="preserve"> </w:t>
+      </w:r>
+      <w:r>
+        <w:rPr>
+          <w:b/>
+          <w:bCs/>
+        </w:rPr>
+        <w:t xml:space="preserve">database migration governance</w:t>
+      </w:r>
+      <w:r>
+        <w:t xml:space="preserve"> </w:t>
+      </w:r>
+      <w:r>
+        <w:t xml:space="preserve">(mandatory committed migrations, a CI gate catching silent no-op migrations, and a recovery procedure for concurrent-migration snapshot drift) built in response to real incidents.</w:t>
+      </w:r>
+    </w:p>
+    <w:p>
+      <w:pPr>
+        <w:pStyle w:val="Compact"/>
+        <w:numPr>
+          <w:ilvl w:val="0"/>
+          <w:numId w:val="1002"/>
+        </w:numPr>
+      </w:pPr>
+      <w:r>
+        <w:t xml:space="preserve">Hold the</w:t>
+      </w:r>
+      <w:r>
+        <w:t xml:space="preserve"> </w:t>
+      </w:r>
+      <w:r>
+        <w:rPr>
+          <w:b/>
+          <w:bCs/>
+        </w:rPr>
+        <w:t xml:space="preserve">product role by design</w:t>
+      </w:r>
+      <w:r>
+        <w:t xml:space="preserve">: define and prioritize the work, QA against deployed previews, and own the one human sign-off gate before anything ships to users.</w:t>
+      </w:r>
+    </w:p>
+    <w:bookmarkEnd w:id="25"/>
+    <w:bookmarkEnd w:id="26"/>
+    <w:bookmarkStart w:id="29" w:name="co-founder-fractional-cto"/>
+    <w:p>
+      <w:pPr>
+        <w:pStyle w:val="Heading3"/>
+      </w:pPr>
+      <w:r>
         <w:t xml:space="preserve">Co-founder &amp; Fractional CTO</w:t>
       </w:r>
     </w:p>
-    <w:bookmarkStart w:id="26" w:name="X6d4a3e04cb0dd24aa8d860fb342aaa5143cfa7e"/>
+    <w:bookmarkStart w:id="28" w:name="X6d4a3e04cb0dd24aa8d860fb342aaa5143cfa7e"/>
     <w:p>
       <w:pPr>
         <w:pStyle w:val="Heading4"/>
@@ -258,7 +479,7 @@
         <w:pStyle w:val="Compact"/>
         <w:numPr>
           <w:ilvl w:val="0"/>
-          <w:numId w:val="1002"/>
+          <w:numId w:val="1003"/>
         </w:numPr>
       </w:pPr>
       <w:r>
@@ -275,7 +496,7 @@
         </w:rPr>
         <w:t xml:space="preserve"> </w:t>
       </w:r>
-      <w:hyperlink r:id="rId25">
+      <w:hyperlink r:id="rId27">
         <w:r>
           <w:rPr>
             <w:rStyle w:val="Hyperlink"/>
@@ -307,7 +528,7 @@
         <w:pStyle w:val="Compact"/>
         <w:numPr>
           <w:ilvl w:val="0"/>
-          <w:numId w:val="1002"/>
+          <w:numId w:val="1003"/>
         </w:numPr>
       </w:pPr>
       <w:r>
@@ -335,7 +556,7 @@
         <w:pStyle w:val="Compact"/>
         <w:numPr>
           <w:ilvl w:val="0"/>
-          <w:numId w:val="1002"/>
+          <w:numId w:val="1003"/>
         </w:numPr>
       </w:pPr>
       <w:r>
@@ -352,23 +573,20 @@
         <w:t xml:space="preserve">real-time evaluation</w:t>
       </w:r>
       <w:r>
-        <w:t xml:space="preserve">: engineered a</w:t>
-      </w:r>
-      <w:r>
-        <w:t xml:space="preserve"> </w:t>
-      </w:r>
-      <w:r>
-        <w:rPr>
-          <w:b/>
-          <w:bCs/>
-        </w:rPr>
-        <w:t xml:space="preserve">low-latency proof-of-concept classifier model</w:t>
-      </w:r>
-      <w:r>
-        <w:t xml:space="preserve"> </w:t>
-      </w:r>
-      <w:r>
-        <w:t xml:space="preserve">that scores model behavior against HumaneBench rubrics inline at</w:t>
+        <w:t xml:space="preserve">: specified and designed a</w:t>
+      </w:r>
+      <w:r>
+        <w:t xml:space="preserve"> </w:t>
+      </w:r>
+      <w:r>
+        <w:rPr>
+          <w:b/>
+          <w:bCs/>
+        </w:rPr>
+        <w:t xml:space="preserve">low-latency proof-of-concept classifier</w:t>
+      </w:r>
+      <w:r>
+        <w:t xml:space="preserve">, built in collaboration with coding agents, that scores model behavior against HumaneBench rubrics inline at</w:t>
       </w:r>
       <w:r>
         <w:t xml:space="preserve"> </w:t>
@@ -381,15 +599,18 @@
         <w:t xml:space="preserve">sub-100ms</w:t>
       </w:r>
       <w:r>
-        <w:t xml:space="preserve">, fast enough to sit in a production request path rather than run only in batch.</w:t>
-      </w:r>
-    </w:p>
-    <w:p>
-      <w:pPr>
-        <w:pStyle w:val="Compact"/>
-        <w:numPr>
-          <w:ilvl w:val="0"/>
-          <w:numId w:val="1002"/>
+        <w:t xml:space="preserve"> </w:t>
+      </w:r>
+      <w:r>
+        <w:t xml:space="preserve">and can sit in a production request path rather than run only in batch.</w:t>
+      </w:r>
+    </w:p>
+    <w:p>
+      <w:pPr>
+        <w:pStyle w:val="Compact"/>
+        <w:numPr>
+          <w:ilvl w:val="0"/>
+          <w:numId w:val="1003"/>
         </w:numPr>
       </w:pPr>
       <w:r>
@@ -443,7 +664,7 @@
         <w:pStyle w:val="Compact"/>
         <w:numPr>
           <w:ilvl w:val="0"/>
-          <w:numId w:val="1002"/>
+          <w:numId w:val="1003"/>
         </w:numPr>
       </w:pPr>
       <w:r>
@@ -461,111 +682,26 @@
       </w:r>
       <w:r>
         <w:t xml:space="preserve">: production monitoring, multi-turn evaluation, and adoption maturity models.</w:t>
-      </w:r>
-    </w:p>
-    <w:bookmarkEnd w:id="26"/>
-    <w:bookmarkEnd w:id="27"/>
-    <w:bookmarkStart w:id="29" w:name="co-founder-software-engineer"/>
-    <w:p>
-      <w:pPr>
-        <w:pStyle w:val="Heading3"/>
-      </w:pPr>
-      <w:r>
-        <w:t xml:space="preserve">Co-founder &amp; Software Engineer</w:t>
-      </w:r>
-    </w:p>
-    <w:bookmarkStart w:id="28" w:name="Xabfc89ad0ecf455a67a7dad8c9e074f0d6e313c"/>
-    <w:p>
-      <w:pPr>
-        <w:pStyle w:val="Heading4"/>
-      </w:pPr>
-      <w:r>
-        <w:t xml:space="preserve">Alchemy Astrology (formerly Mirror Astrology) | Nov 2024 - Jul 2026 | Remote</w:t>
-      </w:r>
-    </w:p>
-    <w:p>
-      <w:pPr>
-        <w:pStyle w:val="Compact"/>
-        <w:numPr>
-          <w:ilvl w:val="0"/>
-          <w:numId w:val="1003"/>
-        </w:numPr>
-      </w:pPr>
-      <w:r>
-        <w:rPr>
-          <w:b/>
-          <w:bCs/>
-        </w:rPr>
-        <w:t xml:space="preserve">Owned the front end</w:t>
-      </w:r>
-      <w:r>
-        <w:t xml:space="preserve"> </w:t>
-      </w:r>
-      <w:r>
-        <w:t xml:space="preserve">of a production consumer subscription app: Rails views, JavaScript, HTML/CSS, Tailwind, and responsive UI/UX.</w:t>
-      </w:r>
-    </w:p>
-    <w:p>
-      <w:pPr>
-        <w:pStyle w:val="Compact"/>
-        <w:numPr>
-          <w:ilvl w:val="0"/>
-          <w:numId w:val="1003"/>
-        </w:numPr>
-      </w:pPr>
-      <w:r>
-        <w:rPr>
-          <w:b/>
-          <w:bCs/>
-        </w:rPr>
-        <w:t xml:space="preserve">Led design and UX delivery</w:t>
-      </w:r>
-      <w:r>
-        <w:t xml:space="preserve">: worked directly with freelance designers, then translated their Figma designs into the Rails framework.</w:t>
-      </w:r>
-    </w:p>
-    <w:p>
-      <w:pPr>
-        <w:pStyle w:val="Compact"/>
-        <w:numPr>
-          <w:ilvl w:val="0"/>
-          <w:numId w:val="1003"/>
-        </w:numPr>
-      </w:pPr>
-      <w:r>
-        <w:t xml:space="preserve">Collaborated on the back end: Rails MVC, Stripe subscription billing, SSO authentication.</w:t>
-      </w:r>
-    </w:p>
-    <w:p>
-      <w:pPr>
-        <w:pStyle w:val="Compact"/>
-        <w:numPr>
-          <w:ilvl w:val="0"/>
-          <w:numId w:val="1003"/>
-        </w:numPr>
-      </w:pPr>
-      <w:r>
-        <w:t xml:space="preserve">Made product and prioritization calls with co-founders: roadmap, scope, what to cut, what to ship next.</w:t>
       </w:r>
     </w:p>
     <w:bookmarkEnd w:id="28"/>
     <w:bookmarkEnd w:id="29"/>
-    <w:bookmarkStart w:id="31" w:name="infrastructure-engineer"/>
+    <w:bookmarkStart w:id="31" w:name="co-founder-software-engineer"/>
     <w:p>
       <w:pPr>
         <w:pStyle w:val="Heading3"/>
       </w:pPr>
       <w:r>
-        <w:t xml:space="preserve">Infrastructure Engineer</w:t>
-      </w:r>
-    </w:p>
-    <w:bookmarkStart w:id="30" w:name="tobiko-mar-2024---oct-2024-remote"/>
+        <w:t xml:space="preserve">Co-founder &amp; Software Engineer</w:t>
+      </w:r>
+    </w:p>
+    <w:bookmarkStart w:id="30" w:name="Xabfc89ad0ecf455a67a7dad8c9e074f0d6e313c"/>
     <w:p>
       <w:pPr>
         <w:pStyle w:val="Heading4"/>
       </w:pPr>
       <w:r>
-        <w:t xml:space="preserve">Tobiko | Mar 2024 - Oct 2024 | Remote</w:t>
+        <w:t xml:space="preserve">Alchemy Astrology (formerly Mirror Astrology) | Nov 2024 - Jul 2026 | Remote</w:t>
       </w:r>
     </w:p>
     <w:p>
@@ -577,20 +713,17 @@
         </w:numPr>
       </w:pPr>
       <w:r>
-        <w:t xml:space="preserve">Architected and implemented a cloud platform serving customer workloads at an early-stage startup.</w:t>
-      </w:r>
-      <w:r>
-        <w:t xml:space="preserve"> </w:t>
-      </w:r>
-      <w:r>
-        <w:rPr>
-          <w:b/>
-          <w:bCs/>
-        </w:rPr>
-        <w:t xml:space="preserve">Python</w:t>
-      </w:r>
-      <w:r>
-        <w:t xml:space="preserve">, Pulumi, GCP, GKE, Cloud Run, Helm.</w:t>
+        <w:rPr>
+          <w:b/>
+          <w:bCs/>
+        </w:rPr>
+        <w:t xml:space="preserve">Owned the front end</w:t>
+      </w:r>
+      <w:r>
+        <w:t xml:space="preserve"> </w:t>
+      </w:r>
+      <w:r>
+        <w:t xml:space="preserve">of a production consumer subscription app: Rails views, JavaScript, HTML/CSS, Tailwind, and responsive UI/UX.</w:t>
       </w:r>
     </w:p>
     <w:p>
@@ -602,7 +735,14 @@
         </w:numPr>
       </w:pPr>
       <w:r>
-        <w:t xml:space="preserve">Built CI/CD primitives the rest of engineering used: mono-repo conditional workflows, workload identity federation, continuous delivery.</w:t>
+        <w:rPr>
+          <w:b/>
+          <w:bCs/>
+        </w:rPr>
+        <w:t xml:space="preserve">Led design and UX delivery</w:t>
+      </w:r>
+      <w:r>
+        <w:t xml:space="preserve">: worked directly with freelance designers, then translated their Figma designs into the Rails framework.</w:t>
       </w:r>
     </w:p>
     <w:p>
@@ -614,50 +754,39 @@
         </w:numPr>
       </w:pPr>
       <w:r>
-        <w:rPr>
-          <w:b/>
-          <w:bCs/>
-        </w:rPr>
-        <w:t xml:space="preserve">Owned the build-vs-buy decision</w:t>
-      </w:r>
-      <w:r>
-        <w:t xml:space="preserve"> </w:t>
-      </w:r>
-      <w:r>
-        <w:t xml:space="preserve">for customer support and incident response. Selected incident.io for incident management; after a thorough review of support tooling turned up nothing that handled Slack-based support cleanly,</w:t>
-      </w:r>
-      <w:r>
-        <w:t xml:space="preserve"> </w:t>
-      </w:r>
-      <w:r>
-        <w:rPr>
-          <w:b/>
-          <w:bCs/>
-        </w:rPr>
-        <w:t xml:space="preserve">built the Slack support agent from the ground up in Python</w:t>
-      </w:r>
-      <w:r>
-        <w:t xml:space="preserve">, then onboarded teammates and customers onto it.</w:t>
+        <w:t xml:space="preserve">Collaborated on the back end: Rails MVC, Stripe subscription billing, SSO authentication.</w:t>
+      </w:r>
+    </w:p>
+    <w:p>
+      <w:pPr>
+        <w:pStyle w:val="Compact"/>
+        <w:numPr>
+          <w:ilvl w:val="0"/>
+          <w:numId w:val="1004"/>
+        </w:numPr>
+      </w:pPr>
+      <w:r>
+        <w:t xml:space="preserve">Made product and prioritization calls with co-founders: roadmap, scope, what to cut, what to ship next.</w:t>
       </w:r>
     </w:p>
     <w:bookmarkEnd w:id="30"/>
     <w:bookmarkEnd w:id="31"/>
-    <w:bookmarkStart w:id="33" w:name="Xb0214e1707a9d6363adb3661ec89e83821aff93"/>
+    <w:bookmarkStart w:id="33" w:name="infrastructure-engineer"/>
     <w:p>
       <w:pPr>
         <w:pStyle w:val="Heading3"/>
       </w:pPr>
       <w:r>
-        <w:t xml:space="preserve">Principal Software Engineer / Engineering Manager</w:t>
-      </w:r>
-    </w:p>
-    <w:bookmarkStart w:id="32" w:name="X47289269eb944414c9285d314973b45c253bcef"/>
+        <w:t xml:space="preserve">Infrastructure Engineer</w:t>
+      </w:r>
+    </w:p>
+    <w:bookmarkStart w:id="32" w:name="tobiko-mar-2024---oct-2024-remote"/>
     <w:p>
       <w:pPr>
         <w:pStyle w:val="Heading4"/>
       </w:pPr>
       <w:r>
-        <w:t xml:space="preserve">Mavenlink / Kantata | Apr 2017 - Dec 2023 | San Francisco, CA</w:t>
+        <w:t xml:space="preserve">Tobiko | Mar 2024 - Oct 2024 | Remote</w:t>
       </w:r>
     </w:p>
     <w:p>
@@ -669,49 +798,20 @@
         </w:numPr>
       </w:pPr>
       <w:r>
-        <w:rPr>
-          <w:b/>
-          <w:bCs/>
-        </w:rPr>
-        <w:t xml:space="preserve">M-Bridge Integration Platform</w:t>
-      </w:r>
-      <w:r>
-        <w:t xml:space="preserve"> </w:t>
-      </w:r>
-      <w:r>
-        <w:t xml:space="preserve">(2 years): Took over an unreliable agent-based integration platform connecting the SaaS to customer systems (Salesforce, HRIS, accounting) and led its rearchitecture into a dependable one.</w:t>
-      </w:r>
-      <w:r>
-        <w:t xml:space="preserve"> </w:t>
-      </w:r>
-      <w:r>
-        <w:rPr>
-          <w:b/>
-          <w:bCs/>
-        </w:rPr>
-        <w:t xml:space="preserve">Cut error rates roughly 100x</w:t>
-      </w:r>
-      <w:r>
-        <w:t xml:space="preserve"> </w:t>
-      </w:r>
-      <w:r>
-        <w:t xml:space="preserve">by instrumenting the system and fixing what the data actually pointed at. Executed a</w:t>
-      </w:r>
-      <w:r>
-        <w:t xml:space="preserve"> </w:t>
-      </w:r>
-      <w:r>
-        <w:rPr>
-          <w:b/>
-          <w:bCs/>
-        </w:rPr>
-        <w:t xml:space="preserve">zero-downtime migration</w:t>
-      </w:r>
-      <w:r>
-        <w:t xml:space="preserve"> </w:t>
-      </w:r>
-      <w:r>
-        <w:t xml:space="preserve">from Heroku to Kubernetes and RDS, including relational, document, and cache stores.</w:t>
+        <w:t xml:space="preserve">Architected and implemented a cloud platform serving customer workloads at an early-stage startup.</w:t>
+      </w:r>
+      <w:r>
+        <w:t xml:space="preserve"> </w:t>
+      </w:r>
+      <w:r>
+        <w:rPr>
+          <w:b/>
+          <w:bCs/>
+        </w:rPr>
+        <w:t xml:space="preserve">Python</w:t>
+      </w:r>
+      <w:r>
+        <w:t xml:space="preserve">, Pulumi, GCP, GKE, Cloud Run, Helm.</w:t>
       </w:r>
     </w:p>
     <w:p>
@@ -723,33 +823,7 @@
         </w:numPr>
       </w:pPr>
       <w:r>
-        <w:rPr>
-          <w:b/>
-          <w:bCs/>
-        </w:rPr>
-        <w:t xml:space="preserve">Internal Infrastructure Platform</w:t>
-      </w:r>
-      <w:r>
-        <w:t xml:space="preserve"> </w:t>
-      </w:r>
-      <w:r>
-        <w:t xml:space="preserve">(4 years): Built a new team from scratch whose product was the platform the entire engineering organization built on. Ran it as a service org with internal customers: consulted with teams on their workflows, triaged requests, and</w:t>
-      </w:r>
-      <w:r>
-        <w:t xml:space="preserve"> </w:t>
-      </w:r>
-      <w:r>
-        <w:rPr>
-          <w:b/>
-          <w:bCs/>
-        </w:rPr>
-        <w:t xml:space="preserve">reduced recurring one-off asks into shared primitives and self-serve tooling</w:t>
-      </w:r>
-      <w:r>
-        <w:t xml:space="preserve"> </w:t>
-      </w:r>
-      <w:r>
-        <w:t xml:space="preserve">so teams could ship without waiting on us. Owned the roadmap while staying hands-on in code, architecture, and review. Migrated a large legacy Rails monolith and its service ecosystem to cloud-native infrastructure (Terraform, Ansible, Kubernetes).</w:t>
+        <w:t xml:space="preserve">Built CI/CD primitives the rest of engineering used: mono-repo conditional workflows, workload identity federation, continuous delivery.</w:t>
       </w:r>
     </w:p>
     <w:p>
@@ -765,81 +839,46 @@
           <w:b/>
           <w:bCs/>
         </w:rPr>
-        <w:t xml:space="preserve">Rebuilt the team after mass departures</w:t>
-      </w:r>
-      <w:r>
-        <w:t xml:space="preserve">: inherited a two-person DevOps team with one member two weeks from leaving, and rebuilt hiring, onboarding, documentation, and on-call practice from near zero into a stable team with strong developer relations.</w:t>
-      </w:r>
-    </w:p>
-    <w:p>
-      <w:pPr>
-        <w:pStyle w:val="Compact"/>
-        <w:numPr>
-          <w:ilvl w:val="0"/>
-          <w:numId w:val="1005"/>
-        </w:numPr>
-      </w:pPr>
-      <w:r>
-        <w:rPr>
-          <w:b/>
-          <w:bCs/>
-        </w:rPr>
-        <w:t xml:space="preserve">BI Data Pipeline</w:t>
-      </w:r>
-      <w:r>
-        <w:t xml:space="preserve"> </w:t>
-      </w:r>
-      <w:r>
-        <w:t xml:space="preserve">(3 months): Led a transition team that took ownership of the analytics pipeline and migrated it to Kubernetes.</w:t>
-      </w:r>
-    </w:p>
-    <w:p>
-      <w:pPr>
-        <w:pStyle w:val="Compact"/>
-        <w:numPr>
-          <w:ilvl w:val="0"/>
-          <w:numId w:val="1005"/>
-        </w:numPr>
-      </w:pPr>
-      <w:r>
-        <w:rPr>
-          <w:b/>
-          <w:bCs/>
-        </w:rPr>
-        <w:t xml:space="preserve">Grew multiple junior engineers into senior SWE and Engineering Manager roles</w:t>
-      </w:r>
-      <w:r>
-        <w:t xml:space="preserve">; led interviewing and hiring.</w:t>
-      </w:r>
-      <w:r>
-        <w:t xml:space="preserve"> </w:t>
-      </w:r>
-      <w:r>
-        <w:rPr>
-          <w:b/>
-          <w:bCs/>
-        </w:rPr>
-        <w:t xml:space="preserve">Top Performer Award, 2021.</w:t>
+        <w:t xml:space="preserve">Owned the build-vs-buy decision</w:t>
+      </w:r>
+      <w:r>
+        <w:t xml:space="preserve"> </w:t>
+      </w:r>
+      <w:r>
+        <w:t xml:space="preserve">for customer support and incident response. Selected incident.io for incident management; after a thorough review of support tooling turned up nothing that handled Slack-based support cleanly,</w:t>
+      </w:r>
+      <w:r>
+        <w:t xml:space="preserve"> </w:t>
+      </w:r>
+      <w:r>
+        <w:rPr>
+          <w:b/>
+          <w:bCs/>
+        </w:rPr>
+        <w:t xml:space="preserve">built the Slack support agent from the ground up in Python</w:t>
+      </w:r>
+      <w:r>
+        <w:t xml:space="preserve">, then onboarded teammates and customers onto it.</w:t>
       </w:r>
     </w:p>
     <w:bookmarkEnd w:id="32"/>
     <w:bookmarkEnd w:id="33"/>
-    <w:bookmarkStart w:id="35" w:name="lead-developer-co-founder"/>
+    <w:bookmarkStart w:id="35" w:name="Xb0214e1707a9d6363adb3661ec89e83821aff93"/>
     <w:p>
       <w:pPr>
         <w:pStyle w:val="Heading3"/>
       </w:pPr>
       <w:r>
-        <w:t xml:space="preserve">Lead Developer, Co-founder</w:t>
-      </w:r>
-    </w:p>
-    <w:bookmarkStart w:id="34" w:name="pegg-2014---2017-san-francisco-ca"/>
+        <w:t xml:space="preserve">Principal Software Engineer / Engineering Manager</w:t>
+      </w:r>
+    </w:p>
+    <w:bookmarkStart w:id="34" w:name="X47289269eb944414c9285d314973b45c253bcef"/>
     <w:p>
       <w:pPr>
         <w:pStyle w:val="Heading4"/>
       </w:pPr>
       <w:r>
-        <w:t xml:space="preserve">Pegg | 2014 - 2017 | San Francisco, CA</w:t>
+        <w:t xml:space="preserve">Mavenlink / Kantata | Apr 2017 - Dec 2023 | San Francisco, CA</w:t>
       </w:r>
     </w:p>
     <w:p>
@@ -851,7 +890,49 @@
         </w:numPr>
       </w:pPr>
       <w:r>
-        <w:t xml:space="preserve">Designed, architected, and built a cross-platform mobile app from scratch for iOS and Android. Node.js backend, JavaScript frontend, Firebase real-time systems, CI/CD to AWS/CloudFront via CircleCI.</w:t>
+        <w:rPr>
+          <w:b/>
+          <w:bCs/>
+        </w:rPr>
+        <w:t xml:space="preserve">M-Bridge Integration Platform</w:t>
+      </w:r>
+      <w:r>
+        <w:t xml:space="preserve"> </w:t>
+      </w:r>
+      <w:r>
+        <w:t xml:space="preserve">(2 years): Took over an unreliable agent-based integration platform connecting the SaaS to customer systems (Salesforce, HRIS, accounting) and led its rearchitecture into a dependable one.</w:t>
+      </w:r>
+      <w:r>
+        <w:t xml:space="preserve"> </w:t>
+      </w:r>
+      <w:r>
+        <w:rPr>
+          <w:b/>
+          <w:bCs/>
+        </w:rPr>
+        <w:t xml:space="preserve">Cut error rates roughly 100x</w:t>
+      </w:r>
+      <w:r>
+        <w:t xml:space="preserve"> </w:t>
+      </w:r>
+      <w:r>
+        <w:t xml:space="preserve">by instrumenting the system and fixing what the data actually pointed at. Executed a</w:t>
+      </w:r>
+      <w:r>
+        <w:t xml:space="preserve"> </w:t>
+      </w:r>
+      <w:r>
+        <w:rPr>
+          <w:b/>
+          <w:bCs/>
+        </w:rPr>
+        <w:t xml:space="preserve">zero-downtime migration</w:t>
+      </w:r>
+      <w:r>
+        <w:t xml:space="preserve"> </w:t>
+      </w:r>
+      <w:r>
+        <w:t xml:space="preserve">from Heroku to Kubernetes and RDS, including relational, document, and cache stores.</w:t>
       </w:r>
     </w:p>
     <w:p>
@@ -863,7 +944,33 @@
         </w:numPr>
       </w:pPr>
       <w:r>
-        <w:t xml:space="preserve">Established the engineering workflow from nothing: pair programming, automated testing, continuous integration, rapid deployment.</w:t>
+        <w:rPr>
+          <w:b/>
+          <w:bCs/>
+        </w:rPr>
+        <w:t xml:space="preserve">Internal Infrastructure Platform</w:t>
+      </w:r>
+      <w:r>
+        <w:t xml:space="preserve"> </w:t>
+      </w:r>
+      <w:r>
+        <w:t xml:space="preserve">(4 years): Built a new team from scratch whose product was the platform the entire engineering organization built on. Ran it as a service org with internal customers: consulted with teams on their workflows, triaged requests, and</w:t>
+      </w:r>
+      <w:r>
+        <w:t xml:space="preserve"> </w:t>
+      </w:r>
+      <w:r>
+        <w:rPr>
+          <w:b/>
+          <w:bCs/>
+        </w:rPr>
+        <w:t xml:space="preserve">reduced recurring one-off asks into shared primitives and self-serve tooling</w:t>
+      </w:r>
+      <w:r>
+        <w:t xml:space="preserve"> </w:t>
+      </w:r>
+      <w:r>
+        <w:t xml:space="preserve">so teams could ship without waiting on us. Owned the roadmap while staying hands-on in code, architecture, and review. Migrated a large legacy Rails monolith and its service ecosystem to cloud-native infrastructure (Terraform, Ansible, Kubernetes).</w:t>
       </w:r>
     </w:p>
     <w:p>
@@ -875,18 +982,85 @@
         </w:numPr>
       </w:pPr>
       <w:r>
-        <w:t xml:space="preserve">Co-led product strategy, monetization, and launch planning.</w:t>
+        <w:rPr>
+          <w:b/>
+          <w:bCs/>
+        </w:rPr>
+        <w:t xml:space="preserve">Rebuilt the team after mass departures</w:t>
+      </w:r>
+      <w:r>
+        <w:t xml:space="preserve">: inherited a two-person DevOps team with one member two weeks from leaving, and rebuilt hiring, onboarding, documentation, and on-call practice from near zero into a stable team with strong developer relations.</w:t>
+      </w:r>
+    </w:p>
+    <w:p>
+      <w:pPr>
+        <w:pStyle w:val="Compact"/>
+        <w:numPr>
+          <w:ilvl w:val="0"/>
+          <w:numId w:val="1006"/>
+        </w:numPr>
+      </w:pPr>
+      <w:r>
+        <w:rPr>
+          <w:b/>
+          <w:bCs/>
+        </w:rPr>
+        <w:t xml:space="preserve">BI Data Pipeline</w:t>
+      </w:r>
+      <w:r>
+        <w:t xml:space="preserve"> </w:t>
+      </w:r>
+      <w:r>
+        <w:t xml:space="preserve">(3 months): Led a transition team that took ownership of the analytics pipeline and migrated it to Kubernetes.</w:t>
+      </w:r>
+    </w:p>
+    <w:p>
+      <w:pPr>
+        <w:pStyle w:val="Compact"/>
+        <w:numPr>
+          <w:ilvl w:val="0"/>
+          <w:numId w:val="1006"/>
+        </w:numPr>
+      </w:pPr>
+      <w:r>
+        <w:rPr>
+          <w:b/>
+          <w:bCs/>
+        </w:rPr>
+        <w:t xml:space="preserve">Grew multiple junior engineers into senior SWE and Engineering Manager roles</w:t>
+      </w:r>
+      <w:r>
+        <w:t xml:space="preserve">; led interviewing and hiring.</w:t>
+      </w:r>
+      <w:r>
+        <w:t xml:space="preserve"> </w:t>
+      </w:r>
+      <w:r>
+        <w:rPr>
+          <w:b/>
+          <w:bCs/>
+        </w:rPr>
+        <w:t xml:space="preserve">Top Performer Award, 2021.</w:t>
       </w:r>
     </w:p>
     <w:bookmarkEnd w:id="34"/>
     <w:bookmarkEnd w:id="35"/>
-    <w:bookmarkStart w:id="36" w:name="earlier-career-2001---2014"/>
+    <w:bookmarkStart w:id="37" w:name="lead-developer-co-founder"/>
     <w:p>
       <w:pPr>
         <w:pStyle w:val="Heading3"/>
       </w:pPr>
       <w:r>
-        <w:t xml:space="preserve">Earlier Career (2001 - 2014)</w:t>
+        <w:t xml:space="preserve">Lead Developer, Co-founder</w:t>
+      </w:r>
+    </w:p>
+    <w:bookmarkStart w:id="36" w:name="pegg-2014---2017-san-francisco-ca"/>
+    <w:p>
+      <w:pPr>
+        <w:pStyle w:val="Heading4"/>
+      </w:pPr>
+      <w:r>
+        <w:t xml:space="preserve">Pegg | 2014 - 2017 | San Francisco, CA</w:t>
       </w:r>
     </w:p>
     <w:p>
@@ -898,17 +1072,7 @@
         </w:numPr>
       </w:pPr>
       <w:r>
-        <w:rPr>
-          <w:b/>
-          <w:bCs/>
-        </w:rPr>
-        <w:t xml:space="preserve">Consultant &amp; Entrepreneur</w:t>
-      </w:r>
-      <w:r>
-        <w:t xml:space="preserve"> </w:t>
-      </w:r>
-      <w:r>
-        <w:t xml:space="preserve">(2008 - 2014): Founded OpenTest Pro (automated testing education). Built an e-commerce ordering system for Turnbull &amp; Asser shirtmakers. Full-stack consulting in Ruby on Rails, Node.js, and D3 data visualization, with rapid prototyping and direct client delivery.</w:t>
+        <w:t xml:space="preserve">Designed, architected, and built a cross-platform mobile app from scratch for iOS and Android. Node.js backend, JavaScript frontend, Firebase real-time systems, CI/CD to AWS/CloudFront via CircleCI.</w:t>
       </w:r>
     </w:p>
     <w:p>
@@ -920,17 +1084,7 @@
         </w:numPr>
       </w:pPr>
       <w:r>
-        <w:rPr>
-          <w:b/>
-          <w:bCs/>
-        </w:rPr>
-        <w:t xml:space="preserve">Web Developer, OnForce, Inc</w:t>
-      </w:r>
-      <w:r>
-        <w:t xml:space="preserve"> </w:t>
-      </w:r>
-      <w:r>
-        <w:t xml:space="preserve">(2006 - 2007): Introduced automated testing and CI. Built a comprehensive API test suite. Integrated the platform with Salesforce APIs.</w:t>
+        <w:t xml:space="preserve">Established the engineering workflow from nothing: pair programming, automated testing, continuous integration, rapid deployment.</w:t>
       </w:r>
     </w:p>
     <w:p>
@@ -942,22 +1096,89 @@
         </w:numPr>
       </w:pPr>
       <w:r>
-        <w:rPr>
-          <w:b/>
-          <w:bCs/>
-        </w:rPr>
-        <w:t xml:space="preserve">Development Lead, JBA Network</w:t>
-      </w:r>
-      <w:r>
-        <w:t xml:space="preserve"> </w:t>
-      </w:r>
-      <w:r>
-        <w:t xml:space="preserve">(2003 - 2006): Lead programmer and project manager for mynewsletterbuilder.com. Architected the initial release, then built and scaled the development team.</w:t>
+        <w:t xml:space="preserve">Co-led product strategy, monetization, and launch planning.</w:t>
       </w:r>
     </w:p>
     <w:bookmarkEnd w:id="36"/>
     <w:bookmarkEnd w:id="37"/>
-    <w:bookmarkStart w:id="42" w:name="open-source-projects"/>
+    <w:bookmarkStart w:id="38" w:name="earlier-career-2001---2014"/>
+    <w:p>
+      <w:pPr>
+        <w:pStyle w:val="Heading3"/>
+      </w:pPr>
+      <w:r>
+        <w:t xml:space="preserve">Earlier Career (2001 - 2014)</w:t>
+      </w:r>
+    </w:p>
+    <w:p>
+      <w:pPr>
+        <w:pStyle w:val="Compact"/>
+        <w:numPr>
+          <w:ilvl w:val="0"/>
+          <w:numId w:val="1008"/>
+        </w:numPr>
+      </w:pPr>
+      <w:r>
+        <w:rPr>
+          <w:b/>
+          <w:bCs/>
+        </w:rPr>
+        <w:t xml:space="preserve">Consultant &amp; Entrepreneur</w:t>
+      </w:r>
+      <w:r>
+        <w:t xml:space="preserve"> </w:t>
+      </w:r>
+      <w:r>
+        <w:t xml:space="preserve">(2008 - 2014): Founded OpenTest Pro (automated testing education). Built an e-commerce ordering system for Turnbull &amp; Asser shirtmakers. Full-stack consulting in Ruby on Rails, Node.js, and D3 data visualization, with rapid prototyping and direct client delivery.</w:t>
+      </w:r>
+    </w:p>
+    <w:p>
+      <w:pPr>
+        <w:pStyle w:val="Compact"/>
+        <w:numPr>
+          <w:ilvl w:val="0"/>
+          <w:numId w:val="1008"/>
+        </w:numPr>
+      </w:pPr>
+      <w:r>
+        <w:rPr>
+          <w:b/>
+          <w:bCs/>
+        </w:rPr>
+        <w:t xml:space="preserve">Web Developer, OnForce, Inc</w:t>
+      </w:r>
+      <w:r>
+        <w:t xml:space="preserve"> </w:t>
+      </w:r>
+      <w:r>
+        <w:t xml:space="preserve">(2006 - 2007): Introduced automated testing and CI. Built a comprehensive API test suite. Integrated the platform with Salesforce APIs.</w:t>
+      </w:r>
+    </w:p>
+    <w:p>
+      <w:pPr>
+        <w:pStyle w:val="Compact"/>
+        <w:numPr>
+          <w:ilvl w:val="0"/>
+          <w:numId w:val="1008"/>
+        </w:numPr>
+      </w:pPr>
+      <w:r>
+        <w:rPr>
+          <w:b/>
+          <w:bCs/>
+        </w:rPr>
+        <w:t xml:space="preserve">Development Lead, JBA Network</w:t>
+      </w:r>
+      <w:r>
+        <w:t xml:space="preserve"> </w:t>
+      </w:r>
+      <w:r>
+        <w:t xml:space="preserve">(2003 - 2006): Lead programmer and project manager for mynewsletterbuilder.com. Architected the initial release, then built and scaled the development team.</w:t>
+      </w:r>
+    </w:p>
+    <w:bookmarkEnd w:id="38"/>
+    <w:bookmarkEnd w:id="39"/>
+    <w:bookmarkStart w:id="44" w:name="open-source-projects"/>
     <w:p>
       <w:pPr>
         <w:pStyle w:val="Heading2"/>
@@ -966,7 +1187,7 @@
         <w:t xml:space="preserve">Open Source Projects</w:t>
       </w:r>
     </w:p>
-    <w:bookmarkStart w:id="39" w:name="scan-mcp-2024---present"/>
+    <w:bookmarkStart w:id="41" w:name="scan-mcp-2024---present"/>
     <w:p>
       <w:pPr>
         <w:pStyle w:val="Heading3"/>
@@ -997,7 +1218,7 @@
       <w:pPr>
         <w:pStyle w:val="BodyText"/>
       </w:pPr>
-      <w:hyperlink r:id="rId38">
+      <w:hyperlink r:id="rId40">
         <w:r>
           <w:rPr>
             <w:rStyle w:val="Hyperlink"/>
@@ -1006,8 +1227,8 @@
         </w:r>
       </w:hyperlink>
     </w:p>
-    <w:bookmarkEnd w:id="39"/>
-    <w:bookmarkStart w:id="41" w:name="humanebench-2024---present"/>
+    <w:bookmarkEnd w:id="41"/>
+    <w:bookmarkStart w:id="43" w:name="humanebench-2024---present"/>
     <w:p>
       <w:pPr>
         <w:pStyle w:val="Heading3"/>
@@ -1038,7 +1259,7 @@
       <w:pPr>
         <w:pStyle w:val="BodyText"/>
       </w:pPr>
-      <w:hyperlink r:id="rId40">
+      <w:hyperlink r:id="rId42">
         <w:r>
           <w:rPr>
             <w:rStyle w:val="Hyperlink"/>
@@ -1047,9 +1268,9 @@
         </w:r>
       </w:hyperlink>
     </w:p>
-    <w:bookmarkEnd w:id="41"/>
-    <w:bookmarkEnd w:id="42"/>
-    <w:bookmarkStart w:id="43" w:name="skills"/>
+    <w:bookmarkEnd w:id="43"/>
+    <w:bookmarkEnd w:id="44"/>
+    <w:bookmarkStart w:id="45" w:name="skills"/>
     <w:p>
       <w:pPr>
         <w:pStyle w:val="Heading2"/>
@@ -1063,7 +1284,7 @@
         <w:pStyle w:val="Compact"/>
         <w:numPr>
           <w:ilvl w:val="0"/>
-          <w:numId w:val="1008"/>
+          <w:numId w:val="1009"/>
         </w:numPr>
       </w:pPr>
       <w:r>
@@ -1082,7 +1303,7 @@
         <w:pStyle w:val="Compact"/>
         <w:numPr>
           <w:ilvl w:val="0"/>
-          <w:numId w:val="1008"/>
+          <w:numId w:val="1009"/>
         </w:numPr>
       </w:pPr>
       <w:r>
@@ -1101,7 +1322,7 @@
         <w:pStyle w:val="Compact"/>
         <w:numPr>
           <w:ilvl w:val="0"/>
-          <w:numId w:val="1008"/>
+          <w:numId w:val="1009"/>
         </w:numPr>
       </w:pPr>
       <w:r>
@@ -1120,7 +1341,7 @@
         <w:pStyle w:val="Compact"/>
         <w:numPr>
           <w:ilvl w:val="0"/>
-          <w:numId w:val="1008"/>
+          <w:numId w:val="1009"/>
         </w:numPr>
       </w:pPr>
       <w:r>
@@ -1139,7 +1360,7 @@
         <w:pStyle w:val="Compact"/>
         <w:numPr>
           <w:ilvl w:val="0"/>
-          <w:numId w:val="1008"/>
+          <w:numId w:val="1009"/>
         </w:numPr>
       </w:pPr>
       <w:r>
@@ -1158,7 +1379,7 @@
         <w:pStyle w:val="Compact"/>
         <w:numPr>
           <w:ilvl w:val="0"/>
-          <w:numId w:val="1008"/>
+          <w:numId w:val="1009"/>
         </w:numPr>
       </w:pPr>
       <w:r>
@@ -1177,7 +1398,7 @@
         <w:pStyle w:val="Compact"/>
         <w:numPr>
           <w:ilvl w:val="0"/>
-          <w:numId w:val="1008"/>
+          <w:numId w:val="1009"/>
         </w:numPr>
       </w:pPr>
       <w:r>
@@ -1191,8 +1412,8 @@
         <w:t xml:space="preserve">: Roadmap ownership, product discovery with users, prioritization, scope negotiation, cross-functional collaboration with design and business stakeholders.</w:t>
       </w:r>
     </w:p>
-    <w:bookmarkEnd w:id="43"/>
-    <w:bookmarkStart w:id="46" w:name="education"/>
+    <w:bookmarkEnd w:id="45"/>
+    <w:bookmarkStart w:id="48" w:name="education"/>
     <w:p>
       <w:pPr>
         <w:pStyle w:val="Heading2"/>
@@ -1201,7 +1422,7 @@
         <w:t xml:space="preserve">Education</w:t>
       </w:r>
     </w:p>
-    <w:bookmarkStart w:id="45" w:name="X8aa14d071da44b7f3006e1d49a262db674bce64"/>
+    <w:bookmarkStart w:id="47" w:name="X8aa14d071da44b7f3006e1d49a262db674bce64"/>
     <w:p>
       <w:pPr>
         <w:pStyle w:val="Heading3"/>
@@ -1210,7 +1431,7 @@
         <w:t xml:space="preserve">BA in Mathematics, minor in Computer Science</w:t>
       </w:r>
     </w:p>
-    <w:bookmarkStart w:id="44" w:name="Xe220d86d70cd5bf8ee7040adf9411d63a6235ab"/>
+    <w:bookmarkStart w:id="46" w:name="Xe220d86d70cd5bf8ee7040adf9411d63a6235ab"/>
     <w:p>
       <w:pPr>
         <w:pStyle w:val="Heading4"/>
@@ -1224,17 +1445,17 @@
         <w:pStyle w:val="Compact"/>
         <w:numPr>
           <w:ilvl w:val="0"/>
-          <w:numId w:val="1009"/>
+          <w:numId w:val="1010"/>
         </w:numPr>
       </w:pPr>
       <w:r>
         <w:t xml:space="preserve">Graduated with distinction in Mathematics. Undergraduate research in 4D fractals.</w:t>
       </w:r>
     </w:p>
-    <w:bookmarkEnd w:id="44"/>
-    <w:bookmarkEnd w:id="45"/>
     <w:bookmarkEnd w:id="46"/>
-    <w:bookmarkStart w:id="47" w:name="recommendations"/>
+    <w:bookmarkEnd w:id="47"/>
+    <w:bookmarkEnd w:id="48"/>
+    <w:bookmarkStart w:id="49" w:name="recommendations"/>
     <w:p>
       <w:pPr>
         <w:pStyle w:val="Heading2"/>
@@ -1390,8 +1611,8 @@
         </w:r>
       </w:hyperlink>
     </w:p>
-    <w:bookmarkEnd w:id="47"/>
-    <w:bookmarkEnd w:id="48"/>
+    <w:bookmarkEnd w:id="49"/>
+    <w:bookmarkEnd w:id="50"/>
     <w:sectPr>
       <w:footnotePr>
         <w:numRestart w:val="eachSect"/>
@@ -1633,6 +1854,9 @@
     <w:abstractNumId w:val="991"/>
   </w:num>
   <w:num w:numId="1009">
+    <w:abstractNumId w:val="991"/>
+  </w:num>
+  <w:num w:numId="1010">
     <w:abstractNumId w:val="991"/>
   </w:num>
 </w:numbering>

</xml_diff>

<commit_message>
Add AI-native software delivery (software factory) consulting section
Co-Authored-By: Claude Opus 5 <noreply@anthropic.com>
Claude-Session: https://claude.ai/code/session_01AFn2A9u39qvLMpvLN59SSo
</commit_message>
<xml_diff>
--- a/resume.docx
+++ b/resume.docx
@@ -2,7 +2,7 @@
 <file path=word/document.xml><?xml version="1.0" encoding="utf-8"?>
 <w:document xmlns:w="http://schemas.openxmlformats.org/wordprocessingml/2006/main" xmlns:m="http://schemas.openxmlformats.org/officeDocument/2006/math" xmlns:r="http://schemas.openxmlformats.org/officeDocument/2006/relationships" xmlns:o="urn:schemas-microsoft-com:office:office" xmlns:v="urn:schemas-microsoft-com:vml" xmlns:w10="urn:schemas-microsoft-com:office:word" xmlns:a="http://schemas.openxmlformats.org/drawingml/2006/main" xmlns:pic="http://schemas.openxmlformats.org/drawingml/2006/picture" xmlns:wp="http://schemas.openxmlformats.org/drawingml/2006/wordprocessingDrawing">
   <w:body>
-    <w:bookmarkStart w:id="48" w:name="jack-senechal"/>
+    <w:bookmarkStart w:id="50" w:name="jack-senechal"/>
     <w:p>
       <w:pPr>
         <w:pStyle w:val="Heading1"/>
@@ -240,7 +240,7 @@
       </w:r>
     </w:p>
     <w:bookmarkEnd w:id="24"/>
-    <w:bookmarkStart w:id="37" w:name="industry-experience"/>
+    <w:bookmarkStart w:id="39" w:name="industry-experience"/>
     <w:p>
       <w:pPr>
         <w:pStyle w:val="Heading2"/>
@@ -249,16 +249,157 @@
         <w:t xml:space="preserve">Industry Experience</w:t>
       </w:r>
     </w:p>
-    <w:bookmarkStart w:id="27" w:name="co-founder-fractional-cto"/>
+    <w:bookmarkStart w:id="26" w:name="Xee601f6099503a9e48b26ce62b1cbc6360c8cfa"/>
     <w:p>
       <w:pPr>
         <w:pStyle w:val="Heading3"/>
       </w:pPr>
       <w:r>
+        <w:t xml:space="preserve">Independent Consultant — AI-Native Software Delivery</w:t>
+      </w:r>
+    </w:p>
+    <w:bookmarkStart w:id="25" w:name="X5dd5559b1eea39500dfd9b3a47cf87c432af37e"/>
+    <w:p>
+      <w:pPr>
+        <w:pStyle w:val="Heading4"/>
+      </w:pPr>
+      <w:r>
+        <w:t xml:space="preserve">Client engagements | May 2026 - Present | Remote</w:t>
+      </w:r>
+    </w:p>
+    <w:p>
+      <w:pPr>
+        <w:pStyle w:val="Compact"/>
+        <w:numPr>
+          <w:ilvl w:val="0"/>
+          <w:numId w:val="1002"/>
+        </w:numPr>
+      </w:pPr>
+      <w:r>
+        <w:rPr>
+          <w:b/>
+          <w:bCs/>
+        </w:rPr>
+        <w:t xml:space="preserve">Build and operate</w:t>
+      </w:r>
+      <w:r>
+        <w:rPr>
+          <w:b/>
+          <w:bCs/>
+        </w:rPr>
+        <w:t xml:space="preserve"> </w:t>
+      </w:r>
+      <w:r>
+        <w:rPr>
+          <w:b/>
+          <w:bCs/>
+        </w:rPr>
+        <w:t xml:space="preserve">“software factories”</w:t>
+      </w:r>
+      <w:r>
+        <w:t xml:space="preserve">: agent-driven delivery pipelines that take engineering work from spec to shipped, with the human in the product seat. Persistent orchestrating agent sessions delegate implementation to cheaper-model subagents, each isolated in its own git worktree and database.</w:t>
+      </w:r>
+    </w:p>
+    <w:p>
+      <w:pPr>
+        <w:pStyle w:val="Compact"/>
+        <w:numPr>
+          <w:ilvl w:val="0"/>
+          <w:numId w:val="1002"/>
+        </w:numPr>
+      </w:pPr>
+      <w:r>
+        <w:rPr>
+          <w:b/>
+          <w:bCs/>
+        </w:rPr>
+        <w:t xml:space="preserve">Delivered a production web app this way</w:t>
+      </w:r>
+      <w:r>
+        <w:t xml:space="preserve"> </w:t>
+      </w:r>
+      <w:r>
+        <w:t xml:space="preserve">(Next.js, Payload CMS, Postgres, Vercel): ~261 merged PRs across 190 issues in 13 weeks, with roughly three-quarters of commits agent-produced behind automated and human review gates.</w:t>
+      </w:r>
+    </w:p>
+    <w:p>
+      <w:pPr>
+        <w:pStyle w:val="Compact"/>
+        <w:numPr>
+          <w:ilvl w:val="0"/>
+          <w:numId w:val="1002"/>
+        </w:numPr>
+      </w:pPr>
+      <w:r>
+        <w:rPr>
+          <w:b/>
+          <w:bCs/>
+        </w:rPr>
+        <w:t xml:space="preserve">Built the coordination substrate on GitHub itself</w:t>
+      </w:r>
+      <w:r>
+        <w:t xml:space="preserve"> </w:t>
+      </w:r>
+      <w:r>
+        <w:t xml:space="preserve">(issues, PRs, Projects as the single ledger), with scheduled automation deriving board state from PR, CI, and label reality rather than relying on agents to update it.</w:t>
+      </w:r>
+    </w:p>
+    <w:p>
+      <w:pPr>
+        <w:pStyle w:val="Compact"/>
+        <w:numPr>
+          <w:ilvl w:val="0"/>
+          <w:numId w:val="1002"/>
+        </w:numPr>
+      </w:pPr>
+      <w:r>
+        <w:rPr>
+          <w:b/>
+          <w:bCs/>
+        </w:rPr>
+        <w:t xml:space="preserve">Engineered the reliability layer</w:t>
+      </w:r>
+      <w:r>
+        <w:t xml:space="preserve">: a lifecycle hook that refuses to end an agent session while any dispatched worktree holds uncommitted work, a worktree-per-task concurrency model with stacked PR trains, and database migration governance with CI gates, all built in response to real incidents.</w:t>
+      </w:r>
+    </w:p>
+    <w:p>
+      <w:pPr>
+        <w:pStyle w:val="Compact"/>
+        <w:numPr>
+          <w:ilvl w:val="0"/>
+          <w:numId w:val="1002"/>
+        </w:numPr>
+      </w:pPr>
+      <w:r>
+        <w:t xml:space="preserve">Hold the</w:t>
+      </w:r>
+      <w:r>
+        <w:t xml:space="preserve"> </w:t>
+      </w:r>
+      <w:r>
+        <w:rPr>
+          <w:b/>
+          <w:bCs/>
+        </w:rPr>
+        <w:t xml:space="preserve">product role by design</w:t>
+      </w:r>
+      <w:r>
+        <w:t xml:space="preserve">: define and prioritize the work, QA against deployed previews, own the human sign-off gate.</w:t>
+      </w:r>
+    </w:p>
+    <w:bookmarkEnd w:id="25"/>
+    <w:bookmarkEnd w:id="26"/>
+    <w:bookmarkStart w:id="29" w:name="co-founder-fractional-cto"/>
+    <w:p>
+      <w:pPr>
+        <w:pStyle w:val="Heading3"/>
+      </w:pPr>
+      <w:r>
         <w:t xml:space="preserve">Co-founder &amp; Fractional CTO</w:t>
       </w:r>
     </w:p>
-    <w:bookmarkStart w:id="26" w:name="X6dafa89e46c32694395442a9a6ca99eae379ab9"/>
+    <w:bookmarkStart w:id="28" w:name="X6dafa89e46c32694395442a9a6ca99eae379ab9"/>
     <w:p>
       <w:pPr>
         <w:pStyle w:val="Heading4"/>
@@ -272,7 +413,7 @@
         <w:pStyle w:val="Compact"/>
         <w:numPr>
           <w:ilvl w:val="0"/>
-          <w:numId w:val="1002"/>
+          <w:numId w:val="1003"/>
         </w:numPr>
       </w:pPr>
       <w:r>
@@ -281,7 +422,7 @@
       <w:r>
         <w:t xml:space="preserve"> </w:t>
       </w:r>
-      <w:hyperlink r:id="rId25">
+      <w:hyperlink r:id="rId27">
         <w:r>
           <w:rPr>
             <w:rStyle w:val="Hyperlink"/>
@@ -300,7 +441,7 @@
         <w:pStyle w:val="Compact"/>
         <w:numPr>
           <w:ilvl w:val="0"/>
-          <w:numId w:val="1002"/>
+          <w:numId w:val="1003"/>
         </w:numPr>
       </w:pPr>
       <w:r>
@@ -312,99 +453,31 @@
         <w:pStyle w:val="Compact"/>
         <w:numPr>
           <w:ilvl w:val="0"/>
-          <w:numId w:val="1002"/>
+          <w:numId w:val="1003"/>
         </w:numPr>
       </w:pPr>
       <w:r>
         <w:t xml:space="preserve">Shaping product and technical roadmap for AI-driven tooling, including production monitoring, multi-turn evaluation, and maturity models for adoption and continuous improvement.</w:t>
-      </w:r>
-    </w:p>
-    <w:bookmarkEnd w:id="26"/>
-    <w:bookmarkEnd w:id="27"/>
-    <w:bookmarkStart w:id="29" w:name="co-founder-software-engineer"/>
-    <w:p>
-      <w:pPr>
-        <w:pStyle w:val="Heading3"/>
-      </w:pPr>
-      <w:r>
-        <w:t xml:space="preserve">Co-founder &amp; Software Engineer</w:t>
-      </w:r>
-    </w:p>
-    <w:bookmarkStart w:id="28" w:name="Xabfc89ad0ecf455a67a7dad8c9e074f0d6e313c"/>
-    <w:p>
-      <w:pPr>
-        <w:pStyle w:val="Heading4"/>
-      </w:pPr>
-      <w:r>
-        <w:t xml:space="preserve">Alchemy Astrology (formerly Mirror Astrology) | Nov 2024 - Jul 2026 | Remote</w:t>
-      </w:r>
-    </w:p>
-    <w:p>
-      <w:pPr>
-        <w:pStyle w:val="Compact"/>
-        <w:numPr>
-          <w:ilvl w:val="0"/>
-          <w:numId w:val="1003"/>
-        </w:numPr>
-      </w:pPr>
-      <w:r>
-        <w:t xml:space="preserve">Owned front-end development: Ruby on Rails views, JavaScript, HTML+CSS, Tailwind, responsive UI/UX.</w:t>
-      </w:r>
-    </w:p>
-    <w:p>
-      <w:pPr>
-        <w:pStyle w:val="Compact"/>
-        <w:numPr>
-          <w:ilvl w:val="0"/>
-          <w:numId w:val="1003"/>
-        </w:numPr>
-      </w:pPr>
-      <w:r>
-        <w:t xml:space="preserve">Led design and UX delivery, working with freelance designers and translating their designs into the Rails framework.</w:t>
-      </w:r>
-    </w:p>
-    <w:p>
-      <w:pPr>
-        <w:pStyle w:val="Compact"/>
-        <w:numPr>
-          <w:ilvl w:val="0"/>
-          <w:numId w:val="1003"/>
-        </w:numPr>
-      </w:pPr>
-      <w:r>
-        <w:t xml:space="preserve">Collaborated on back-end development: Stripe integration, SSO authentication, Rails MVC.</w:t>
-      </w:r>
-    </w:p>
-    <w:p>
-      <w:pPr>
-        <w:pStyle w:val="Compact"/>
-        <w:numPr>
-          <w:ilvl w:val="0"/>
-          <w:numId w:val="1003"/>
-        </w:numPr>
-      </w:pPr>
-      <w:r>
-        <w:t xml:space="preserve">Collaborated closely with co-founders on product direction, Figma design, UX, roadmap planning, and prioritization.</w:t>
       </w:r>
     </w:p>
     <w:bookmarkEnd w:id="28"/>
     <w:bookmarkEnd w:id="29"/>
-    <w:bookmarkStart w:id="31" w:name="infrastructure-engineer"/>
+    <w:bookmarkStart w:id="31" w:name="co-founder-software-engineer"/>
     <w:p>
       <w:pPr>
         <w:pStyle w:val="Heading3"/>
       </w:pPr>
       <w:r>
-        <w:t xml:space="preserve">Infrastructure Engineer</w:t>
-      </w:r>
-    </w:p>
-    <w:bookmarkStart w:id="30" w:name="tobiko-mar-2024---oct-2024-remote"/>
+        <w:t xml:space="preserve">Co-founder &amp; Software Engineer</w:t>
+      </w:r>
+    </w:p>
+    <w:bookmarkStart w:id="30" w:name="Xabfc89ad0ecf455a67a7dad8c9e074f0d6e313c"/>
     <w:p>
       <w:pPr>
         <w:pStyle w:val="Heading4"/>
       </w:pPr>
       <w:r>
-        <w:t xml:space="preserve">Tobiko | Mar 2024 - Oct 2024 | Remote</w:t>
+        <w:t xml:space="preserve">Alchemy Astrology (formerly Mirror Astrology) | Nov 2024 - Jul 2026 | Remote</w:t>
       </w:r>
     </w:p>
     <w:p>
@@ -416,7 +489,7 @@
         </w:numPr>
       </w:pPr>
       <w:r>
-        <w:t xml:space="preserve">Architected and implemented a scalable cloud platform serving customer workloads at a fast-paced startup.</w:t>
+        <w:t xml:space="preserve">Owned front-end development: Ruby on Rails views, JavaScript, HTML+CSS, Tailwind, responsive UI/UX.</w:t>
       </w:r>
     </w:p>
     <w:p>
@@ -428,7 +501,7 @@
         </w:numPr>
       </w:pPr>
       <w:r>
-        <w:t xml:space="preserve">Built CI/CD patterns including mono-repo conditional workflows, workload identity federation, and continuous delivery.</w:t>
+        <w:t xml:space="preserve">Led design and UX delivery, working with freelance designers and translating their designs into the Rails framework.</w:t>
       </w:r>
     </w:p>
     <w:p>
@@ -440,7 +513,7 @@
         </w:numPr>
       </w:pPr>
       <w:r>
-        <w:t xml:space="preserve">Implemented a Slack-based customer support and incident response platform; onboarded teammates and customers.</w:t>
+        <w:t xml:space="preserve">Collaborated on back-end development: Stripe integration, SSO authentication, Rails MVC.</w:t>
       </w:r>
     </w:p>
     <w:p>
@@ -452,27 +525,27 @@
         </w:numPr>
       </w:pPr>
       <w:r>
-        <w:t xml:space="preserve">Python, Pulumi, GCP, GKE, Cloud Run, CircleCI, Helm, SQLMesh.</w:t>
+        <w:t xml:space="preserve">Collaborated closely with co-founders on product direction, Figma design, UX, roadmap planning, and prioritization.</w:t>
       </w:r>
     </w:p>
     <w:bookmarkEnd w:id="30"/>
     <w:bookmarkEnd w:id="31"/>
-    <w:bookmarkStart w:id="33" w:name="X7a2c313efdde198d901363c762c81839771c845"/>
+    <w:bookmarkStart w:id="33" w:name="infrastructure-engineer"/>
     <w:p>
       <w:pPr>
         <w:pStyle w:val="Heading3"/>
       </w:pPr>
       <w:r>
-        <w:t xml:space="preserve">Engineering Manager / Principal Software Engineer</w:t>
-      </w:r>
-    </w:p>
-    <w:bookmarkStart w:id="32" w:name="X47289269eb944414c9285d314973b45c253bcef"/>
+        <w:t xml:space="preserve">Infrastructure Engineer</w:t>
+      </w:r>
+    </w:p>
+    <w:bookmarkStart w:id="32" w:name="tobiko-mar-2024---oct-2024-remote"/>
     <w:p>
       <w:pPr>
         <w:pStyle w:val="Heading4"/>
       </w:pPr>
       <w:r>
-        <w:t xml:space="preserve">Mavenlink / Kantata | Apr 2017 - Dec 2023 | San Francisco, CA</w:t>
+        <w:t xml:space="preserve">Tobiko | Mar 2024 - Oct 2024 | Remote</w:t>
       </w:r>
     </w:p>
     <w:p>
@@ -484,17 +557,7 @@
         </w:numPr>
       </w:pPr>
       <w:r>
-        <w:rPr>
-          <w:b/>
-          <w:bCs/>
-        </w:rPr>
-        <w:t xml:space="preserve">M-Bridge Integration Platform</w:t>
-      </w:r>
-      <w:r>
-        <w:t xml:space="preserve"> </w:t>
-      </w:r>
-      <w:r>
-        <w:t xml:space="preserve">(2 years): Led a team to stabilize and scale an agent-based integration platform handling multi-system data orchestration. Established operational metrics and monitoring that reduced errors and incidents by ~100x. Executed a zero-downtime migration to Kubernetes including relational, document, and cache databases.</w:t>
+        <w:t xml:space="preserve">Architected and implemented a scalable cloud platform serving customer workloads at a fast-paced startup.</w:t>
       </w:r>
     </w:p>
     <w:p>
@@ -506,17 +569,7 @@
         </w:numPr>
       </w:pPr>
       <w:r>
-        <w:rPr>
-          <w:b/>
-          <w:bCs/>
-        </w:rPr>
-        <w:t xml:space="preserve">Infrastructure Platform</w:t>
-      </w:r>
-      <w:r>
-        <w:t xml:space="preserve"> </w:t>
-      </w:r>
-      <w:r>
-        <w:t xml:space="preserve">(4 years): Recruited and built a new team from scratch dedicated to the infrastructure platform. Led the organization’s DevOps culture transformation, serving as a change agent and technical authority across engineering. Owned roadmap stewardship, requirements triage, and priority management while staying hands-on with coding, architecture, and code review. Transitioned a large legacy codebase to cloud-native, Infrastructure-as-Code tooling (Terraform, Ansible, Kubernetes).</w:t>
+        <w:t xml:space="preserve">Built CI/CD patterns including mono-repo conditional workflows, workload identity federation, and continuous delivery.</w:t>
       </w:r>
     </w:p>
     <w:p>
@@ -528,17 +581,7 @@
         </w:numPr>
       </w:pPr>
       <w:r>
-        <w:rPr>
-          <w:b/>
-          <w:bCs/>
-        </w:rPr>
-        <w:t xml:space="preserve">BI Data Pipeline</w:t>
-      </w:r>
-      <w:r>
-        <w:t xml:space="preserve"> </w:t>
-      </w:r>
-      <w:r>
-        <w:t xml:space="preserve">(3 months): Led a transition team to take ownership of and improve the analytics data pipeline. Migrated the pipeline to Kubernetes.</w:t>
+        <w:t xml:space="preserve">Implemented a Slack-based customer support and incident response platform; onboarded teammates and customers.</w:t>
       </w:r>
     </w:p>
     <w:p>
@@ -550,47 +593,27 @@
         </w:numPr>
       </w:pPr>
       <w:r>
-        <w:rPr>
-          <w:b/>
-          <w:bCs/>
-        </w:rPr>
-        <w:t xml:space="preserve">Cross-Functional Impact</w:t>
-      </w:r>
-      <w:r>
-        <w:t xml:space="preserve">: Mentored engineers across teams — notably coached a junior engineer who grew to Engineering Manager. Led interviewing and hiring. Drove organizational change management and process optimization.</w:t>
-      </w:r>
-      <w:r>
-        <w:t xml:space="preserve"> </w:t>
-      </w:r>
-      <w:r>
-        <w:rPr>
-          <w:b/>
-          <w:bCs/>
-        </w:rPr>
-        <w:t xml:space="preserve">Top Performer Award, 2021</w:t>
-      </w:r>
-      <w:r>
-        <w:t xml:space="preserve">.</w:t>
+        <w:t xml:space="preserve">Python, Pulumi, GCP, GKE, Cloud Run, CircleCI, Helm, SQLMesh.</w:t>
       </w:r>
     </w:p>
     <w:bookmarkEnd w:id="32"/>
     <w:bookmarkEnd w:id="33"/>
-    <w:bookmarkStart w:id="35" w:name="lead-developer-co-founder"/>
+    <w:bookmarkStart w:id="35" w:name="X7a2c313efdde198d901363c762c81839771c845"/>
     <w:p>
       <w:pPr>
         <w:pStyle w:val="Heading3"/>
       </w:pPr>
       <w:r>
-        <w:t xml:space="preserve">Lead Developer, Co-founder</w:t>
-      </w:r>
-    </w:p>
-    <w:bookmarkStart w:id="34" w:name="pegg-2014---2017-san-francisco-ca"/>
+        <w:t xml:space="preserve">Engineering Manager / Principal Software Engineer</w:t>
+      </w:r>
+    </w:p>
+    <w:bookmarkStart w:id="34" w:name="X47289269eb944414c9285d314973b45c253bcef"/>
     <w:p>
       <w:pPr>
         <w:pStyle w:val="Heading4"/>
       </w:pPr>
       <w:r>
-        <w:t xml:space="preserve">Pegg | 2014 - 2017 | San Francisco, CA</w:t>
+        <w:t xml:space="preserve">Mavenlink / Kantata | Apr 2017 - Dec 2023 | San Francisco, CA</w:t>
       </w:r>
     </w:p>
     <w:p>
@@ -602,7 +625,17 @@
         </w:numPr>
       </w:pPr>
       <w:r>
-        <w:t xml:space="preserve">Designed, architected, and built a cross-platform mobile app from scratch (iOS/Android). Node.js backend, JS/Phonegap frontend, Firebase real-time systems, CI/CD to AWS/CloudFront via CircleCI.</w:t>
+        <w:rPr>
+          <w:b/>
+          <w:bCs/>
+        </w:rPr>
+        <w:t xml:space="preserve">M-Bridge Integration Platform</w:t>
+      </w:r>
+      <w:r>
+        <w:t xml:space="preserve"> </w:t>
+      </w:r>
+      <w:r>
+        <w:t xml:space="preserve">(2 years): Led a team to stabilize and scale an agent-based integration platform handling multi-system data orchestration. Established operational metrics and monitoring that reduced errors and incidents by ~100x. Executed a zero-downtime migration to Kubernetes including relational, document, and cache databases.</w:t>
       </w:r>
     </w:p>
     <w:p>
@@ -614,7 +647,17 @@
         </w:numPr>
       </w:pPr>
       <w:r>
-        <w:t xml:space="preserve">Established engineering workflow: pair programming, automated testing (Karma/Chai), continuous integration, and rapid deployment processes.</w:t>
+        <w:rPr>
+          <w:b/>
+          <w:bCs/>
+        </w:rPr>
+        <w:t xml:space="preserve">Infrastructure Platform</w:t>
+      </w:r>
+      <w:r>
+        <w:t xml:space="preserve"> </w:t>
+      </w:r>
+      <w:r>
+        <w:t xml:space="preserve">(4 years): Recruited and built a new team from scratch dedicated to the infrastructure platform. Led the organization’s DevOps culture transformation, serving as a change agent and technical authority across engineering. Owned roadmap stewardship, requirements triage, and priority management while staying hands-on with coding, architecture, and code review. Transitioned a large legacy codebase to cloud-native, Infrastructure-as-Code tooling (Terraform, Ansible, Kubernetes).</w:t>
       </w:r>
     </w:p>
     <w:p>
@@ -626,18 +669,69 @@
         </w:numPr>
       </w:pPr>
       <w:r>
-        <w:t xml:space="preserve">Co-led product strategy, monetization, and launch planning.</w:t>
+        <w:rPr>
+          <w:b/>
+          <w:bCs/>
+        </w:rPr>
+        <w:t xml:space="preserve">BI Data Pipeline</w:t>
+      </w:r>
+      <w:r>
+        <w:t xml:space="preserve"> </w:t>
+      </w:r>
+      <w:r>
+        <w:t xml:space="preserve">(3 months): Led a transition team to take ownership of and improve the analytics data pipeline. Migrated the pipeline to Kubernetes.</w:t>
+      </w:r>
+    </w:p>
+    <w:p>
+      <w:pPr>
+        <w:pStyle w:val="Compact"/>
+        <w:numPr>
+          <w:ilvl w:val="0"/>
+          <w:numId w:val="1006"/>
+        </w:numPr>
+      </w:pPr>
+      <w:r>
+        <w:rPr>
+          <w:b/>
+          <w:bCs/>
+        </w:rPr>
+        <w:t xml:space="preserve">Cross-Functional Impact</w:t>
+      </w:r>
+      <w:r>
+        <w:t xml:space="preserve">: Mentored engineers across teams — notably coached a junior engineer who grew to Engineering Manager. Led interviewing and hiring. Drove organizational change management and process optimization.</w:t>
+      </w:r>
+      <w:r>
+        <w:t xml:space="preserve"> </w:t>
+      </w:r>
+      <w:r>
+        <w:rPr>
+          <w:b/>
+          <w:bCs/>
+        </w:rPr>
+        <w:t xml:space="preserve">Top Performer Award, 2021</w:t>
+      </w:r>
+      <w:r>
+        <w:t xml:space="preserve">.</w:t>
       </w:r>
     </w:p>
     <w:bookmarkEnd w:id="34"/>
     <w:bookmarkEnd w:id="35"/>
-    <w:bookmarkStart w:id="36" w:name="earlier-career-2001---2014"/>
+    <w:bookmarkStart w:id="37" w:name="lead-developer-co-founder"/>
     <w:p>
       <w:pPr>
         <w:pStyle w:val="Heading3"/>
       </w:pPr>
       <w:r>
-        <w:t xml:space="preserve">Earlier Career (2001 - 2014)</w:t>
+        <w:t xml:space="preserve">Lead Developer, Co-founder</w:t>
+      </w:r>
+    </w:p>
+    <w:bookmarkStart w:id="36" w:name="pegg-2014---2017-san-francisco-ca"/>
+    <w:p>
+      <w:pPr>
+        <w:pStyle w:val="Heading4"/>
+      </w:pPr>
+      <w:r>
+        <w:t xml:space="preserve">Pegg | 2014 - 2017 | San Francisco, CA</w:t>
       </w:r>
     </w:p>
     <w:p>
@@ -649,17 +743,7 @@
         </w:numPr>
       </w:pPr>
       <w:r>
-        <w:rPr>
-          <w:b/>
-          <w:bCs/>
-        </w:rPr>
-        <w:t xml:space="preserve">Consultant &amp; Entrepreneur</w:t>
-      </w:r>
-      <w:r>
-        <w:t xml:space="preserve"> </w:t>
-      </w:r>
-      <w:r>
-        <w:t xml:space="preserve">(2008 - 2014): Founded OpenTest Pro (automated testing education). Built e-commerce ordering system for Turnbull &amp; Asser shirtmakers. Full-stack consulting in Ruby on Rails, Node.js, D3 data visualization. Rapid prototyping and client delivery.</w:t>
+        <w:t xml:space="preserve">Designed, architected, and built a cross-platform mobile app from scratch (iOS/Android). Node.js backend, JS/Phonegap frontend, Firebase real-time systems, CI/CD to AWS/CloudFront via CircleCI.</w:t>
       </w:r>
     </w:p>
     <w:p>
@@ -671,17 +755,7 @@
         </w:numPr>
       </w:pPr>
       <w:r>
-        <w:rPr>
-          <w:b/>
-          <w:bCs/>
-        </w:rPr>
-        <w:t xml:space="preserve">Web Developer, OnForce, Inc</w:t>
-      </w:r>
-      <w:r>
-        <w:t xml:space="preserve"> </w:t>
-      </w:r>
-      <w:r>
-        <w:t xml:space="preserve">(2006 - 2007): Introduced automated testing and CI. Built comprehensive API test suite. Integrated platform with Salesforce APIs.</w:t>
+        <w:t xml:space="preserve">Established engineering workflow: pair programming, automated testing (Karma/Chai), continuous integration, and rapid deployment processes.</w:t>
       </w:r>
     </w:p>
     <w:p>
@@ -693,22 +767,89 @@
         </w:numPr>
       </w:pPr>
       <w:r>
-        <w:rPr>
-          <w:b/>
-          <w:bCs/>
-        </w:rPr>
-        <w:t xml:space="preserve">Development Lead, JBA Network</w:t>
-      </w:r>
-      <w:r>
-        <w:t xml:space="preserve"> </w:t>
-      </w:r>
-      <w:r>
-        <w:t xml:space="preserve">(2003 - 2006): Lead programmer and project manager for mynewsletterbuilder.com — architected initial release, then built and scaled the development team.</w:t>
+        <w:t xml:space="preserve">Co-led product strategy, monetization, and launch planning.</w:t>
       </w:r>
     </w:p>
     <w:bookmarkEnd w:id="36"/>
     <w:bookmarkEnd w:id="37"/>
-    <w:bookmarkStart w:id="42" w:name="open-source-projects"/>
+    <w:bookmarkStart w:id="38" w:name="earlier-career-2001---2014"/>
+    <w:p>
+      <w:pPr>
+        <w:pStyle w:val="Heading3"/>
+      </w:pPr>
+      <w:r>
+        <w:t xml:space="preserve">Earlier Career (2001 - 2014)</w:t>
+      </w:r>
+    </w:p>
+    <w:p>
+      <w:pPr>
+        <w:pStyle w:val="Compact"/>
+        <w:numPr>
+          <w:ilvl w:val="0"/>
+          <w:numId w:val="1008"/>
+        </w:numPr>
+      </w:pPr>
+      <w:r>
+        <w:rPr>
+          <w:b/>
+          <w:bCs/>
+        </w:rPr>
+        <w:t xml:space="preserve">Consultant &amp; Entrepreneur</w:t>
+      </w:r>
+      <w:r>
+        <w:t xml:space="preserve"> </w:t>
+      </w:r>
+      <w:r>
+        <w:t xml:space="preserve">(2008 - 2014): Founded OpenTest Pro (automated testing education). Built e-commerce ordering system for Turnbull &amp; Asser shirtmakers. Full-stack consulting in Ruby on Rails, Node.js, D3 data visualization. Rapid prototyping and client delivery.</w:t>
+      </w:r>
+    </w:p>
+    <w:p>
+      <w:pPr>
+        <w:pStyle w:val="Compact"/>
+        <w:numPr>
+          <w:ilvl w:val="0"/>
+          <w:numId w:val="1008"/>
+        </w:numPr>
+      </w:pPr>
+      <w:r>
+        <w:rPr>
+          <w:b/>
+          <w:bCs/>
+        </w:rPr>
+        <w:t xml:space="preserve">Web Developer, OnForce, Inc</w:t>
+      </w:r>
+      <w:r>
+        <w:t xml:space="preserve"> </w:t>
+      </w:r>
+      <w:r>
+        <w:t xml:space="preserve">(2006 - 2007): Introduced automated testing and CI. Built comprehensive API test suite. Integrated platform with Salesforce APIs.</w:t>
+      </w:r>
+    </w:p>
+    <w:p>
+      <w:pPr>
+        <w:pStyle w:val="Compact"/>
+        <w:numPr>
+          <w:ilvl w:val="0"/>
+          <w:numId w:val="1008"/>
+        </w:numPr>
+      </w:pPr>
+      <w:r>
+        <w:rPr>
+          <w:b/>
+          <w:bCs/>
+        </w:rPr>
+        <w:t xml:space="preserve">Development Lead, JBA Network</w:t>
+      </w:r>
+      <w:r>
+        <w:t xml:space="preserve"> </w:t>
+      </w:r>
+      <w:r>
+        <w:t xml:space="preserve">(2003 - 2006): Lead programmer and project manager for mynewsletterbuilder.com — architected initial release, then built and scaled the development team.</w:t>
+      </w:r>
+    </w:p>
+    <w:bookmarkEnd w:id="38"/>
+    <w:bookmarkEnd w:id="39"/>
+    <w:bookmarkStart w:id="44" w:name="open-source-projects"/>
     <w:p>
       <w:pPr>
         <w:pStyle w:val="Heading2"/>
@@ -717,7 +858,7 @@
         <w:t xml:space="preserve">Open Source Projects</w:t>
       </w:r>
     </w:p>
-    <w:bookmarkStart w:id="39" w:name="scan-mcp-2024---present"/>
+    <w:bookmarkStart w:id="41" w:name="scan-mcp-2024---present"/>
     <w:p>
       <w:pPr>
         <w:pStyle w:val="Heading3"/>
@@ -738,7 +879,7 @@
       <w:pPr>
         <w:pStyle w:val="BodyText"/>
       </w:pPr>
-      <w:hyperlink r:id="rId38">
+      <w:hyperlink r:id="rId40">
         <w:r>
           <w:rPr>
             <w:rStyle w:val="Hyperlink"/>
@@ -747,8 +888,8 @@
         </w:r>
       </w:hyperlink>
     </w:p>
-    <w:bookmarkEnd w:id="39"/>
-    <w:bookmarkStart w:id="41" w:name="humanebench-2024---present"/>
+    <w:bookmarkEnd w:id="41"/>
+    <w:bookmarkStart w:id="43" w:name="humanebench-2024---present"/>
     <w:p>
       <w:pPr>
         <w:pStyle w:val="Heading3"/>
@@ -769,7 +910,7 @@
       <w:pPr>
         <w:pStyle w:val="BodyText"/>
       </w:pPr>
-      <w:hyperlink r:id="rId40">
+      <w:hyperlink r:id="rId42">
         <w:r>
           <w:rPr>
             <w:rStyle w:val="Hyperlink"/>
@@ -778,9 +919,9 @@
         </w:r>
       </w:hyperlink>
     </w:p>
-    <w:bookmarkEnd w:id="41"/>
-    <w:bookmarkEnd w:id="42"/>
-    <w:bookmarkStart w:id="43" w:name="skills"/>
+    <w:bookmarkEnd w:id="43"/>
+    <w:bookmarkEnd w:id="44"/>
+    <w:bookmarkStart w:id="45" w:name="skills"/>
     <w:p>
       <w:pPr>
         <w:pStyle w:val="Heading2"/>
@@ -794,7 +935,7 @@
         <w:pStyle w:val="Compact"/>
         <w:numPr>
           <w:ilvl w:val="0"/>
-          <w:numId w:val="1008"/>
+          <w:numId w:val="1009"/>
         </w:numPr>
       </w:pPr>
       <w:r>
@@ -813,7 +954,7 @@
         <w:pStyle w:val="Compact"/>
         <w:numPr>
           <w:ilvl w:val="0"/>
-          <w:numId w:val="1008"/>
+          <w:numId w:val="1009"/>
         </w:numPr>
       </w:pPr>
       <w:r>
@@ -832,7 +973,7 @@
         <w:pStyle w:val="Compact"/>
         <w:numPr>
           <w:ilvl w:val="0"/>
-          <w:numId w:val="1008"/>
+          <w:numId w:val="1009"/>
         </w:numPr>
       </w:pPr>
       <w:r>
@@ -851,7 +992,7 @@
         <w:pStyle w:val="Compact"/>
         <w:numPr>
           <w:ilvl w:val="0"/>
-          <w:numId w:val="1008"/>
+          <w:numId w:val="1009"/>
         </w:numPr>
       </w:pPr>
       <w:r>
@@ -870,7 +1011,7 @@
         <w:pStyle w:val="Compact"/>
         <w:numPr>
           <w:ilvl w:val="0"/>
-          <w:numId w:val="1008"/>
+          <w:numId w:val="1009"/>
         </w:numPr>
       </w:pPr>
       <w:r>
@@ -889,7 +1030,7 @@
         <w:pStyle w:val="Compact"/>
         <w:numPr>
           <w:ilvl w:val="0"/>
-          <w:numId w:val="1008"/>
+          <w:numId w:val="1009"/>
         </w:numPr>
       </w:pPr>
       <w:r>
@@ -908,7 +1049,7 @@
         <w:pStyle w:val="Compact"/>
         <w:numPr>
           <w:ilvl w:val="0"/>
-          <w:numId w:val="1008"/>
+          <w:numId w:val="1009"/>
         </w:numPr>
       </w:pPr>
       <w:r>
@@ -922,8 +1063,8 @@
         <w:t xml:space="preserve">: Team Building, Coaching &amp; Mentoring, Cross-Functional Collaboration, Roadmap Ownership, Hiring, Agile/Scrum/Kanban, Change Management.</w:t>
       </w:r>
     </w:p>
-    <w:bookmarkEnd w:id="43"/>
-    <w:bookmarkStart w:id="46" w:name="education"/>
+    <w:bookmarkEnd w:id="45"/>
+    <w:bookmarkStart w:id="48" w:name="education"/>
     <w:p>
       <w:pPr>
         <w:pStyle w:val="Heading2"/>
@@ -932,7 +1073,7 @@
         <w:t xml:space="preserve">Education</w:t>
       </w:r>
     </w:p>
-    <w:bookmarkStart w:id="45" w:name="X8aa14d071da44b7f3006e1d49a262db674bce64"/>
+    <w:bookmarkStart w:id="47" w:name="X8aa14d071da44b7f3006e1d49a262db674bce64"/>
     <w:p>
       <w:pPr>
         <w:pStyle w:val="Heading3"/>
@@ -941,7 +1082,7 @@
         <w:t xml:space="preserve">BA in Mathematics, minor in Computer Science</w:t>
       </w:r>
     </w:p>
-    <w:bookmarkStart w:id="44" w:name="Xe220d86d70cd5bf8ee7040adf9411d63a6235ab"/>
+    <w:bookmarkStart w:id="46" w:name="Xe220d86d70cd5bf8ee7040adf9411d63a6235ab"/>
     <w:p>
       <w:pPr>
         <w:pStyle w:val="Heading4"/>
@@ -955,17 +1096,17 @@
         <w:pStyle w:val="Compact"/>
         <w:numPr>
           <w:ilvl w:val="0"/>
-          <w:numId w:val="1009"/>
+          <w:numId w:val="1010"/>
         </w:numPr>
       </w:pPr>
       <w:r>
         <w:t xml:space="preserve">Graduated with distinction in Mathematics. Undergraduate research in 4D fractals.</w:t>
       </w:r>
     </w:p>
-    <w:bookmarkEnd w:id="44"/>
-    <w:bookmarkEnd w:id="45"/>
     <w:bookmarkEnd w:id="46"/>
-    <w:bookmarkStart w:id="47" w:name="recommendations"/>
+    <w:bookmarkEnd w:id="47"/>
+    <w:bookmarkEnd w:id="48"/>
+    <w:bookmarkStart w:id="49" w:name="recommendations"/>
     <w:p>
       <w:pPr>
         <w:pStyle w:val="Heading2"/>
@@ -1226,8 +1367,8 @@
         </w:r>
       </w:hyperlink>
     </w:p>
-    <w:bookmarkEnd w:id="47"/>
-    <w:bookmarkEnd w:id="48"/>
+    <w:bookmarkEnd w:id="49"/>
+    <w:bookmarkEnd w:id="50"/>
     <w:sectPr>
       <w:footnotePr>
         <w:numRestart w:val="eachSect"/>
@@ -1469,6 +1610,9 @@
     <w:abstractNumId w:val="991"/>
   </w:num>
   <w:num w:numId="1009">
+    <w:abstractNumId w:val="991"/>
+  </w:num>
+  <w:num w:numId="1010">
     <w:abstractNumId w:val="991"/>
   </w:num>
 </w:numbering>

</xml_diff>

<commit_message>
Tighten consulting section: lead with thesis, drop stats, weight the SDLC harness
Co-Authored-By: Claude Opus 5 <noreply@anthropic.com>
Claude-Session: https://claude.ai/code/session_01AFn2A9u39qvLMpvLN59SSo
</commit_message>
<xml_diff>
--- a/resume.docx
+++ b/resume.docx
@@ -244,7 +244,7 @@
         <w:pStyle w:val="Heading3"/>
       </w:pPr>
       <w:r>
-        <w:t xml:space="preserve">Independent Consultant — AI-Native Software Delivery</w:t>
+        <w:t xml:space="preserve">Independent Consultant · AI-Native Software Delivery</w:t>
       </w:r>
     </w:p>
     <w:bookmarkStart w:id="25" w:name="X5dd5559b1eea39500dfd9b3a47cf87c432af37e"/>
@@ -269,7 +269,7 @@
           <w:b/>
           <w:bCs/>
         </w:rPr>
-        <w:t xml:space="preserve">Build and operate</w:t>
+        <w:t xml:space="preserve">Run</w:t>
       </w:r>
       <w:r>
         <w:rPr>
@@ -286,20 +286,14 @@
         <w:t xml:space="preserve">“software factories”</w:t>
       </w:r>
       <w:r>
-        <w:t xml:space="preserve">: agent-driven delivery pipelines that take engineering work from spec to shipped, with the human in the product seat. Two persistent orchestrating agent sessions delegate implementation to cheaper-model subagents, each isolated in its own</w:t>
-      </w:r>
-      <w:r>
-        <w:t xml:space="preserve"> </w:t>
-      </w:r>
-      <w:r>
-        <w:rPr>
-          <w:b/>
-          <w:bCs/>
-        </w:rPr>
-        <w:t xml:space="preserve">git worktree and database</w:t>
-      </w:r>
-      <w:r>
-        <w:t xml:space="preserve">.</w:t>
+        <w:rPr>
+          <w:b/>
+          <w:bCs/>
+        </w:rPr>
+        <w:t xml:space="preserve">: agent-driven delivery pipelines that carry engineering work from spec to shipped</w:t>
+      </w:r>
+      <w:r>
+        <w:t xml:space="preserve">, with the human in the product seat. Persistent orchestrating agent sessions delegate implementation to cheaper-model subagents, each isolated in its own git worktree with its own database, so parallel work cannot collide.</w:t>
       </w:r>
     </w:p>
     <w:p>
@@ -315,26 +309,10 @@
           <w:b/>
           <w:bCs/>
         </w:rPr>
-        <w:t xml:space="preserve">Delivered a production web app this way</w:t>
-      </w:r>
-      <w:r>
-        <w:t xml:space="preserve"> </w:t>
-      </w:r>
-      <w:r>
-        <w:t xml:space="preserve">(Next.js, Payload CMS, Postgres, Vercel):</w:t>
-      </w:r>
-      <w:r>
-        <w:t xml:space="preserve"> </w:t>
-      </w:r>
-      <w:r>
-        <w:rPr>
-          <w:b/>
-          <w:bCs/>
-        </w:rPr>
-        <w:t xml:space="preserve">~261 merged PRs across 190 issues in 13 weeks</w:t>
-      </w:r>
-      <w:r>
-        <w:t xml:space="preserve">, with roughly three-quarters of commits agent-produced behind automated and human review gates.</w:t>
+        <w:t xml:space="preserve">Core thesis, proven in production</w:t>
+      </w:r>
+      <w:r>
+        <w:t xml:space="preserve">: the same DevOps and project-management discipline that makes human teams work is also the necessary and sufficient foundation for agent teams, encoded into the harness and context instead of taught to people.</w:t>
       </w:r>
     </w:p>
     <w:p>
@@ -353,26 +331,7 @@
         <w:t xml:space="preserve">Built the coordination substrate on GitHub itself</w:t>
       </w:r>
       <w:r>
-        <w:t xml:space="preserve"> </w:t>
-      </w:r>
-      <w:r>
-        <w:t xml:space="preserve">(issues, PRs, and Projects as the single ledger), including scheduled automation that</w:t>
-      </w:r>
-      <w:r>
-        <w:t xml:space="preserve"> </w:t>
-      </w:r>
-      <w:r>
-        <w:rPr>
-          <w:b/>
-          <w:bCs/>
-        </w:rPr>
-        <w:t xml:space="preserve">derives board state from PR, CI, and label reality</w:t>
-      </w:r>
-      <w:r>
-        <w:t xml:space="preserve"> </w:t>
-      </w:r>
-      <w:r>
-        <w:t xml:space="preserve">instead of relying on agents to remember to update it, after observing that instruction-based state tracking reliably drifts.</w:t>
+        <w:t xml:space="preserve">: issues, PRs, and Projects as the single ledger, kept honest by scheduled automation that derives board state from PR, CI, and label reality rather than trusting agents to remember to update it.</w:t>
       </w:r>
     </w:p>
     <w:p>
@@ -388,10 +347,10 @@
           <w:b/>
           <w:bCs/>
         </w:rPr>
-        <w:t xml:space="preserve">Engineered a lifecycle hook that structurally prevents lost work</w:t>
-      </w:r>
-      <w:r>
-        <w:t xml:space="preserve">, refusing to let an agent session end while any dispatched worktree holds uncommitted or unpushed changes. Diagnosed why the first version missed the real failure population and rebuilt it with a staleness heuristic separating abandoned lanes from in-flight ones.</w:t>
+        <w:t xml:space="preserve">Enforce the SDLC in the harness rather than by instruction</w:t>
+      </w:r>
+      <w:r>
+        <w:t xml:space="preserve">: every PR gated by an independent fresh-context reviewer agent and by branch protection (green CI, supply-chain scanning, deployment smoke check), plus a session lifecycle hook that refuses to let an agent session end while dispatched work sits uncommitted. Each of these was built in response to an observed production failure.</w:t>
       </w:r>
     </w:p>
     <w:p>
@@ -407,51 +366,10 @@
           <w:b/>
           <w:bCs/>
         </w:rPr>
-        <w:t xml:space="preserve">Designed the concurrency model</w:t>
-      </w:r>
-      <w:r>
-        <w:t xml:space="preserve">: one worktree per task, stacked PR trains for multi-PR features, a correct procedure for GitHub’s squash-merge diff-base staleness, and</w:t>
-      </w:r>
-      <w:r>
-        <w:t xml:space="preserve"> </w:t>
-      </w:r>
-      <w:r>
-        <w:rPr>
-          <w:b/>
-          <w:bCs/>
-        </w:rPr>
-        <w:t xml:space="preserve">database migration governance</w:t>
-      </w:r>
-      <w:r>
-        <w:t xml:space="preserve"> </w:t>
-      </w:r>
-      <w:r>
-        <w:t xml:space="preserve">(mandatory committed migrations, a CI gate catching silent no-op migrations, and a recovery procedure for concurrent-migration snapshot drift) built in response to real incidents.</w:t>
-      </w:r>
-    </w:p>
-    <w:p>
-      <w:pPr>
-        <w:pStyle w:val="Compact"/>
-        <w:numPr>
-          <w:ilvl w:val="0"/>
-          <w:numId w:val="1002"/>
-        </w:numPr>
-      </w:pPr>
-      <w:r>
-        <w:t xml:space="preserve">Hold the</w:t>
-      </w:r>
-      <w:r>
-        <w:t xml:space="preserve"> </w:t>
-      </w:r>
-      <w:r>
-        <w:rPr>
-          <w:b/>
-          <w:bCs/>
-        </w:rPr>
-        <w:t xml:space="preserve">product role by design</w:t>
-      </w:r>
-      <w:r>
-        <w:t xml:space="preserve">: define and prioritize the work, QA against deployed previews, and own the one human sign-off gate before anything ships to users.</w:t>
+        <w:t xml:space="preserve">Own the product role by design</w:t>
+      </w:r>
+      <w:r>
+        <w:t xml:space="preserve">: define and prioritize the work, then verify against deployed previews before anything ships to users.</w:t>
       </w:r>
     </w:p>
     <w:bookmarkEnd w:id="25"/>

</xml_diff>

<commit_message>
Tighten AI-native delivery section: lead with thesis, drop stats
Co-Authored-By: Claude Opus 5 <noreply@anthropic.com>
Claude-Session: https://claude.ai/code/session_01AFn2A9u39qvLMpvLN59SSo
</commit_message>
<xml_diff>
--- a/resume.docx
+++ b/resume.docx
@@ -255,7 +255,7 @@
         <w:pStyle w:val="Heading3"/>
       </w:pPr>
       <w:r>
-        <w:t xml:space="preserve">Independent Consultant — AI-Native Software Delivery</w:t>
+        <w:t xml:space="preserve">Independent Consultant · AI-Native Software Delivery</w:t>
       </w:r>
     </w:p>
     <w:bookmarkStart w:id="25" w:name="X5dd5559b1eea39500dfd9b3a47cf87c432af37e"/>
@@ -280,7 +280,7 @@
           <w:b/>
           <w:bCs/>
         </w:rPr>
-        <w:t xml:space="preserve">Build and operate</w:t>
+        <w:t xml:space="preserve">Run</w:t>
       </w:r>
       <w:r>
         <w:rPr>
@@ -297,7 +297,14 @@
         <w:t xml:space="preserve">“software factories”</w:t>
       </w:r>
       <w:r>
-        <w:t xml:space="preserve">: agent-driven delivery pipelines that take engineering work from spec to shipped, with the human in the product seat. Persistent orchestrating agent sessions delegate implementation to cheaper-model subagents, each isolated in its own git worktree and database.</w:t>
+        <w:rPr>
+          <w:b/>
+          <w:bCs/>
+        </w:rPr>
+        <w:t xml:space="preserve">: agent-driven delivery pipelines that carry engineering work from spec to shipped</w:t>
+      </w:r>
+      <w:r>
+        <w:t xml:space="preserve">, with the human in the product seat. Persistent orchestrating agent sessions delegate implementation to cheaper-model subagents, each isolated in its own git worktree with its own database, so parallel work cannot collide.</w:t>
       </w:r>
     </w:p>
     <w:p>
@@ -313,13 +320,10 @@
           <w:b/>
           <w:bCs/>
         </w:rPr>
-        <w:t xml:space="preserve">Delivered a production web app this way</w:t>
-      </w:r>
-      <w:r>
-        <w:t xml:space="preserve"> </w:t>
-      </w:r>
-      <w:r>
-        <w:t xml:space="preserve">(Next.js, Payload CMS, Postgres, Vercel): ~261 merged PRs across 190 issues in 13 weeks, with roughly three-quarters of commits agent-produced behind automated and human review gates.</w:t>
+        <w:t xml:space="preserve">Core thesis, proven in production</w:t>
+      </w:r>
+      <w:r>
+        <w:t xml:space="preserve">: the same DevOps and project-management discipline that makes human teams work is also the necessary and sufficient foundation for agent teams, encoded into the harness and context instead of taught to people.</w:t>
       </w:r>
     </w:p>
     <w:p>
@@ -338,10 +342,7 @@
         <w:t xml:space="preserve">Built the coordination substrate on GitHub itself</w:t>
       </w:r>
       <w:r>
-        <w:t xml:space="preserve"> </w:t>
-      </w:r>
-      <w:r>
-        <w:t xml:space="preserve">(issues, PRs, Projects as the single ledger), with scheduled automation deriving board state from PR, CI, and label reality rather than relying on agents to update it.</w:t>
+        <w:t xml:space="preserve">: issues, PRs, and Projects as the single ledger, kept honest by scheduled automation that derives board state from PR, CI, and label reality rather than trusting agents to remember to update it.</w:t>
       </w:r>
     </w:p>
     <w:p>
@@ -357,10 +358,10 @@
           <w:b/>
           <w:bCs/>
         </w:rPr>
-        <w:t xml:space="preserve">Engineered the reliability layer</w:t>
-      </w:r>
-      <w:r>
-        <w:t xml:space="preserve">: a lifecycle hook that refuses to end an agent session while any dispatched worktree holds uncommitted work, a worktree-per-task concurrency model with stacked PR trains, and database migration governance with CI gates, all built in response to real incidents.</w:t>
+        <w:t xml:space="preserve">Enforce the SDLC in the harness rather than by instruction</w:t>
+      </w:r>
+      <w:r>
+        <w:t xml:space="preserve">: every PR gated by an independent fresh-context reviewer agent and by branch protection (green CI, supply-chain scanning, deployment smoke check), plus a session lifecycle hook that refuses to let an agent session end while dispatched work sits uncommitted. Each of these was built in response to an observed production failure.</w:t>
       </w:r>
     </w:p>
     <w:p>
@@ -372,20 +373,14 @@
         </w:numPr>
       </w:pPr>
       <w:r>
-        <w:t xml:space="preserve">Hold the</w:t>
-      </w:r>
-      <w:r>
-        <w:t xml:space="preserve"> </w:t>
-      </w:r>
-      <w:r>
-        <w:rPr>
-          <w:b/>
-          <w:bCs/>
-        </w:rPr>
-        <w:t xml:space="preserve">product role by design</w:t>
-      </w:r>
-      <w:r>
-        <w:t xml:space="preserve">: define and prioritize the work, QA against deployed previews, own the human sign-off gate.</w:t>
+        <w:rPr>
+          <w:b/>
+          <w:bCs/>
+        </w:rPr>
+        <w:t xml:space="preserve">Own the product role by design</w:t>
+      </w:r>
+      <w:r>
+        <w:t xml:space="preserve">: define and prioritize the work, then verify against deployed previews before anything ships to users.</w:t>
       </w:r>
     </w:p>
     <w:bookmarkEnd w:id="25"/>

</xml_diff>

<commit_message>
Note self-improving harness; correct lifecycle hook attribution to the agents
Co-Authored-By: Claude Opus 5 <noreply@anthropic.com>
Claude-Session: https://claude.ai/code/session_01AFn2A9u39qvLMpvLN59SSo
</commit_message>
<xml_diff>
--- a/resume.docx
+++ b/resume.docx
@@ -350,7 +350,20 @@
         <w:t xml:space="preserve">Enforce the SDLC in the harness rather than by instruction</w:t>
       </w:r>
       <w:r>
-        <w:t xml:space="preserve">: every PR gated by an independent fresh-context reviewer agent and by branch protection (green CI, supply-chain scanning, deployment smoke check), plus a session lifecycle hook that refuses to let an agent session end while dispatched work sits uncommitted. Each of these was built in response to an observed production failure.</w:t>
+        <w:t xml:space="preserve">: every PR gated by an independent fresh-context reviewer agent and by branch protection (green CI, supply-chain scanning, deployment smoke check).</w:t>
+      </w:r>
+      <w:r>
+        <w:t xml:space="preserve"> </w:t>
+      </w:r>
+      <w:r>
+        <w:rPr>
+          <w:b/>
+          <w:bCs/>
+        </w:rPr>
+        <w:t xml:space="preserve">The harness has begun improving itself</w:t>
+      </w:r>
+      <w:r>
+        <w:t xml:space="preserve">, with the Architect and Team Lead agents (running on different frontier models) converging independently on process refinements and shipping them. The session lifecycle hook that blocks an agent from ending with dispatched work uncommitted was theirs, built after they observed the failure.</w:t>
       </w:r>
     </w:p>
     <w:p>
@@ -369,7 +382,7 @@
         <w:t xml:space="preserve">Own the product role by design</w:t>
       </w:r>
       <w:r>
-        <w:t xml:space="preserve">: define and prioritize the work, then verify against deployed previews before anything ships to users.</w:t>
+        <w:t xml:space="preserve">: define and prioritize the work, verify against deployed previews before anything ships, and steer how tight the human-in-the-loop gates run.</w:t>
       </w:r>
     </w:p>
     <w:bookmarkEnd w:id="25"/>

</xml_diff>

<commit_message>
Self-improvement is by design, not emergent
Co-Authored-By: Claude Opus 5 <noreply@anthropic.com>
Claude-Session: https://claude.ai/code/session_01AFn2A9u39qvLMpvLN59SSo
</commit_message>
<xml_diff>
--- a/resume.docx
+++ b/resume.docx
@@ -360,10 +360,10 @@
           <w:b/>
           <w:bCs/>
         </w:rPr>
-        <w:t xml:space="preserve">The harness has begun improving itself</w:t>
-      </w:r>
-      <w:r>
-        <w:t xml:space="preserve">, with the Architect and Team Lead agents (running on different frontier models) converging independently on process refinements and shipping them. The session lifecycle hook that blocks an agent from ending with dispatched work uncommitted was theirs, built after they observed the failure.</w:t>
+        <w:t xml:space="preserve">The harness improves itself by design</w:t>
+      </w:r>
+      <w:r>
+        <w:t xml:space="preserve">: the Architect and Team Lead agents (running on different frontier models) are tasked with refining the process, and converge independently on refinements that they ship and then evaluate. The session lifecycle hook that blocks an agent from ending with dispatched work uncommitted was theirs, built after they observed the failure.</w:t>
       </w:r>
     </w:p>
     <w:p>

</xml_diff>

<commit_message>
Tighten consulting and BHT sections; fix GitHub/substrate typos
Co-Authored-By: Claude Opus 5 <noreply@anthropic.com>
Claude-Session: https://claude.ai/code/session_01AFn2A9u39qvLMpvLN59SSo
</commit_message>
<xml_diff>
--- a/resume.docx
+++ b/resume.docx
@@ -269,7 +269,7 @@
           <w:b/>
           <w:bCs/>
         </w:rPr>
-        <w:t xml:space="preserve">Run</w:t>
+        <w:t xml:space="preserve">Running</w:t>
       </w:r>
       <w:r>
         <w:rPr>
@@ -293,7 +293,7 @@
         <w:t xml:space="preserve">: agent-driven delivery pipelines that carry engineering work from spec to shipped</w:t>
       </w:r>
       <w:r>
-        <w:t xml:space="preserve">, with the human in the product seat. Persistent orchestrating agent sessions delegate implementation to cheaper-model subagents, each isolated in its own git worktree with its own database, so parallel work cannot collide.</w:t>
+        <w:t xml:space="preserve">, with the human in the product seat.</w:t>
       </w:r>
     </w:p>
     <w:p>
@@ -309,10 +309,10 @@
           <w:b/>
           <w:bCs/>
         </w:rPr>
-        <w:t xml:space="preserve">Core thesis, proven in production</w:t>
-      </w:r>
-      <w:r>
-        <w:t xml:space="preserve">: the same DevOps and project-management discipline that makes human teams work is also the necessary and sufficient foundation for agent teams, encoded into the harness and context instead of taught to people.</w:t>
+        <w:t xml:space="preserve">Core thesis</w:t>
+      </w:r>
+      <w:r>
+        <w:t xml:space="preserve">: the same DevOps and project-management discipline that makes human teams work is also the necessary and sufficient foundation for agent teams, encoded into the harness and context.</w:t>
       </w:r>
     </w:p>
     <w:p>
@@ -328,10 +328,10 @@
           <w:b/>
           <w:bCs/>
         </w:rPr>
-        <w:t xml:space="preserve">Built the coordination substrate on GitHub itself</w:t>
-      </w:r>
-      <w:r>
-        <w:t xml:space="preserve">: issues, PRs, and Projects as the single ledger, kept honest by scheduled automation that derives board state from PR, CI, and label reality rather than trusting agents to remember to update it.</w:t>
+        <w:t xml:space="preserve">GitHub as the coordination substrate</w:t>
+      </w:r>
+      <w:r>
+        <w:t xml:space="preserve">: issues, PRs, and Projects are the single ledger.</w:t>
       </w:r>
     </w:p>
     <w:p>
@@ -347,23 +347,10 @@
           <w:b/>
           <w:bCs/>
         </w:rPr>
-        <w:t xml:space="preserve">Enforce the SDLC in the harness rather than by instruction</w:t>
-      </w:r>
-      <w:r>
-        <w:t xml:space="preserve">: every PR gated by an independent fresh-context reviewer agent and by branch protection (green CI, supply-chain scanning, deployment smoke check).</w:t>
-      </w:r>
-      <w:r>
-        <w:t xml:space="preserve"> </w:t>
-      </w:r>
-      <w:r>
-        <w:rPr>
-          <w:b/>
-          <w:bCs/>
-        </w:rPr>
-        <w:t xml:space="preserve">The harness improves itself by design</w:t>
-      </w:r>
-      <w:r>
-        <w:t xml:space="preserve">: the Architect and Team Lead agents (running on different frontier models) are tasked with refining the process, and converge independently on refinements that they ship and then evaluate. The session lifecycle hook that blocks an agent from ending with dispatched work uncommitted was theirs, built after they observed the failure.</w:t>
+        <w:t xml:space="preserve">Harness-enforced SDLC</w:t>
+      </w:r>
+      <w:r>
+        <w:t xml:space="preserve">: PRs gated by independent fresh-context reviewer, green CI, supply-chain scanning, deployment smoke check.</w:t>
       </w:r>
     </w:p>
     <w:p>
@@ -379,10 +366,29 @@
           <w:b/>
           <w:bCs/>
         </w:rPr>
-        <w:t xml:space="preserve">Own the product role by design</w:t>
-      </w:r>
-      <w:r>
-        <w:t xml:space="preserve">: define and prioritize the work, verify against deployed previews before anything ships, and steer how tight the human-in-the-loop gates run.</w:t>
+        <w:t xml:space="preserve">Self-improving harness</w:t>
+      </w:r>
+      <w:r>
+        <w:t xml:space="preserve">: Orchestration agents tasked with running, observing, and refining the process. Agents collaboratively converge on refinements, ship and evaluate.</w:t>
+      </w:r>
+    </w:p>
+    <w:p>
+      <w:pPr>
+        <w:pStyle w:val="Compact"/>
+        <w:numPr>
+          <w:ilvl w:val="0"/>
+          <w:numId w:val="1002"/>
+        </w:numPr>
+      </w:pPr>
+      <w:r>
+        <w:rPr>
+          <w:b/>
+          <w:bCs/>
+        </w:rPr>
+        <w:t xml:space="preserve">Human in the product role</w:t>
+      </w:r>
+      <w:r>
+        <w:t xml:space="preserve">: defining and prioritizing work, verifying against deployed previews, steering product and process.</w:t>
       </w:r>
     </w:p>
     <w:bookmarkEnd w:id="25"/>
@@ -418,7 +424,7 @@
           <w:b/>
           <w:bCs/>
         </w:rPr>
-        <w:t xml:space="preserve">Originated the concept for</w:t>
+        <w:t xml:space="preserve">Originated and co-architected</w:t>
       </w:r>
       <w:r>
         <w:rPr>
@@ -438,10 +444,7 @@
         </w:r>
       </w:hyperlink>
       <w:r>
-        <w:t xml:space="preserve"> </w:t>
-      </w:r>
-      <w:r>
-        <w:t xml:space="preserve">and co-architected it: an open-source AI evaluation framework built on AISI Inspect.</w:t>
+        <w:t xml:space="preserve">, an open-source AI evaluation framework built on AISI Inspect.</w:t>
       </w:r>
       <w:r>
         <w:t xml:space="preserve"> </w:t>
@@ -463,7 +466,7 @@
         </w:numPr>
       </w:pPr>
       <w:r>
-        <w:t xml:space="preserve">Act as</w:t>
+        <w:t xml:space="preserve">Acting as</w:t>
       </w:r>
       <w:r>
         <w:t xml:space="preserve"> </w:t>
@@ -504,7 +507,7 @@
         <w:t xml:space="preserve">real-time evaluation</w:t>
       </w:r>
       <w:r>
-        <w:t xml:space="preserve">: specified and designed a</w:t>
+        <w:t xml:space="preserve">: built a</w:t>
       </w:r>
       <w:r>
         <w:t xml:space="preserve"> </w:t>
@@ -517,7 +520,10 @@
         <w:t xml:space="preserve">low-latency proof-of-concept classifier</w:t>
       </w:r>
       <w:r>
-        <w:t xml:space="preserve">, built in collaboration with coding agents, that scores model behavior against HumaneBench rubrics inline at</w:t>
+        <w:t xml:space="preserve"> </w:t>
+      </w:r>
+      <w:r>
+        <w:t xml:space="preserve">that scores model behavior against HumaneBench rubrics inline at</w:t>
       </w:r>
       <w:r>
         <w:t xml:space="preserve"> </w:t>
@@ -545,49 +551,23 @@
         </w:numPr>
       </w:pPr>
       <w:r>
-        <w:t xml:space="preserve">Translated qualitative behavioral rubrics into</w:t>
-      </w:r>
-      <w:r>
-        <w:t xml:space="preserve"> </w:t>
-      </w:r>
-      <w:r>
-        <w:rPr>
-          <w:b/>
-          <w:bCs/>
-        </w:rPr>
-        <w:t xml:space="preserve">structured, trainable signal definitions</w:t>
-      </w:r>
-      <w:r>
-        <w:t xml:space="preserve">, and designed the</w:t>
-      </w:r>
-      <w:r>
-        <w:t xml:space="preserve"> </w:t>
-      </w:r>
-      <w:r>
-        <w:rPr>
-          <w:b/>
-          <w:bCs/>
-        </w:rPr>
-        <w:t xml:space="preserve">operational visibility metrics</w:t>
-      </w:r>
-      <w:r>
-        <w:t xml:space="preserve"> </w:t>
-      </w:r>
-      <w:r>
-        <w:t xml:space="preserve">and automated feedback path carrying evaluation output back into</w:t>
-      </w:r>
-      <w:r>
-        <w:t xml:space="preserve"> </w:t>
-      </w:r>
-      <w:r>
-        <w:rPr>
-          <w:b/>
-          <w:bCs/>
-        </w:rPr>
-        <w:t xml:space="preserve">system-prompt iteration and model fine-tuning</w:t>
-      </w:r>
-      <w:r>
-        <w:t xml:space="preserve">.</w:t>
+        <w:t xml:space="preserve">Designing telemetry for operational visibility, and evaluation feedback loops to inform</w:t>
+      </w:r>
+      <w:r>
+        <w:t xml:space="preserve"> </w:t>
+      </w:r>
+      <w:r>
+        <w:rPr>
+          <w:b/>
+          <w:bCs/>
+        </w:rPr>
+        <w:t xml:space="preserve">system-prompt iteration</w:t>
+      </w:r>
+      <w:r>
+        <w:t xml:space="preserve"> </w:t>
+      </w:r>
+      <w:r>
+        <w:t xml:space="preserve">and model fine-tuning.</w:t>
       </w:r>
     </w:p>
     <w:p>
@@ -599,17 +579,17 @@
         </w:numPr>
       </w:pPr>
       <w:r>
-        <w:t xml:space="preserve">Own</w:t>
-      </w:r>
-      <w:r>
-        <w:t xml:space="preserve"> </w:t>
-      </w:r>
-      <w:r>
-        <w:rPr>
-          <w:b/>
-          <w:bCs/>
-        </w:rPr>
-        <w:t xml:space="preserve">product direction and roadmap</w:t>
+        <w:t xml:space="preserve">Owning</w:t>
+      </w:r>
+      <w:r>
+        <w:t xml:space="preserve"> </w:t>
+      </w:r>
+      <w:r>
+        <w:rPr>
+          <w:b/>
+          <w:bCs/>
+        </w:rPr>
+        <w:t xml:space="preserve">technical product direction and roadmap</w:t>
       </w:r>
       <w:r>
         <w:t xml:space="preserve">: production monitoring, multi-turn evaluation, and adoption maturity models.</w:t>

</xml_diff>

<commit_message>
Tighten consulting section; correct BHT attribution to concept and fractional CTO
Co-Authored-By: Claude Opus 5 <noreply@anthropic.com>
Claude-Session: https://claude.ai/code/session_01AFn2A9u39qvLMpvLN59SSo
</commit_message>
<xml_diff>
--- a/resume.docx
+++ b/resume.docx
@@ -280,7 +280,7 @@
           <w:b/>
           <w:bCs/>
         </w:rPr>
-        <w:t xml:space="preserve">Run</w:t>
+        <w:t xml:space="preserve">Running</w:t>
       </w:r>
       <w:r>
         <w:rPr>
@@ -304,7 +304,7 @@
         <w:t xml:space="preserve">: agent-driven delivery pipelines that carry engineering work from spec to shipped</w:t>
       </w:r>
       <w:r>
-        <w:t xml:space="preserve">, with the human in the product seat. Persistent orchestrating agent sessions delegate implementation to cheaper-model subagents, each isolated in its own git worktree with its own database, so parallel work cannot collide.</w:t>
+        <w:t xml:space="preserve">, with the human in the product seat.</w:t>
       </w:r>
     </w:p>
     <w:p>
@@ -320,10 +320,10 @@
           <w:b/>
           <w:bCs/>
         </w:rPr>
-        <w:t xml:space="preserve">Core thesis, proven in production</w:t>
-      </w:r>
-      <w:r>
-        <w:t xml:space="preserve">: the same DevOps and project-management discipline that makes human teams work is also the necessary and sufficient foundation for agent teams, encoded into the harness and context instead of taught to people.</w:t>
+        <w:t xml:space="preserve">Core thesis</w:t>
+      </w:r>
+      <w:r>
+        <w:t xml:space="preserve">: the same DevOps and project-management discipline that makes human teams work is also the necessary and sufficient foundation for agent teams, encoded into the harness and context.</w:t>
       </w:r>
     </w:p>
     <w:p>
@@ -339,10 +339,10 @@
           <w:b/>
           <w:bCs/>
         </w:rPr>
-        <w:t xml:space="preserve">Built the coordination substrate on GitHub itself</w:t>
-      </w:r>
-      <w:r>
-        <w:t xml:space="preserve">: issues, PRs, and Projects as the single ledger, kept honest by scheduled automation that derives board state from PR, CI, and label reality rather than trusting agents to remember to update it.</w:t>
+        <w:t xml:space="preserve">GitHub as the coordination substrate</w:t>
+      </w:r>
+      <w:r>
+        <w:t xml:space="preserve">: issues, PRs, and Projects are the single ledger.</w:t>
       </w:r>
     </w:p>
     <w:p>
@@ -358,23 +358,10 @@
           <w:b/>
           <w:bCs/>
         </w:rPr>
-        <w:t xml:space="preserve">Enforce the SDLC in the harness rather than by instruction</w:t>
-      </w:r>
-      <w:r>
-        <w:t xml:space="preserve">: every PR gated by an independent fresh-context reviewer agent and by branch protection (green CI, supply-chain scanning, deployment smoke check).</w:t>
-      </w:r>
-      <w:r>
-        <w:t xml:space="preserve"> </w:t>
-      </w:r>
-      <w:r>
-        <w:rPr>
-          <w:b/>
-          <w:bCs/>
-        </w:rPr>
-        <w:t xml:space="preserve">The harness improves itself by design</w:t>
-      </w:r>
-      <w:r>
-        <w:t xml:space="preserve">: the Architect and Team Lead agents (running on different frontier models) are tasked with refining the process, and converge independently on refinements that they ship and then evaluate. The session lifecycle hook that blocks an agent from ending with dispatched work uncommitted was theirs, built after they observed the failure.</w:t>
+        <w:t xml:space="preserve">Harness-enforced SDLC</w:t>
+      </w:r>
+      <w:r>
+        <w:t xml:space="preserve">: PRs gated by independent fresh-context reviewer, green CI, supply-chain scanning, deployment smoke check.</w:t>
       </w:r>
     </w:p>
     <w:p>
@@ -390,10 +377,29 @@
           <w:b/>
           <w:bCs/>
         </w:rPr>
-        <w:t xml:space="preserve">Own the product role by design</w:t>
-      </w:r>
-      <w:r>
-        <w:t xml:space="preserve">: define and prioritize the work, verify against deployed previews before anything ships, and steer how tight the human-in-the-loop gates run.</w:t>
+        <w:t xml:space="preserve">Self-improving harness</w:t>
+      </w:r>
+      <w:r>
+        <w:t xml:space="preserve">: Orchestration agents tasked with running, observing, and refining the process. Agents collaboratively converge on refinements, ship and evaluate.</w:t>
+      </w:r>
+    </w:p>
+    <w:p>
+      <w:pPr>
+        <w:pStyle w:val="Compact"/>
+        <w:numPr>
+          <w:ilvl w:val="0"/>
+          <w:numId w:val="1002"/>
+        </w:numPr>
+      </w:pPr>
+      <w:r>
+        <w:rPr>
+          <w:b/>
+          <w:bCs/>
+        </w:rPr>
+        <w:t xml:space="preserve">Human in the product role</w:t>
+      </w:r>
+      <w:r>
+        <w:t xml:space="preserve">: defining and prioritizing work, verifying against deployed previews, steering product and process.</w:t>
       </w:r>
     </w:p>
     <w:bookmarkEnd w:id="25"/>
@@ -407,13 +413,13 @@
         <w:t xml:space="preserve">Co-founder &amp; Fractional CTO</w:t>
       </w:r>
     </w:p>
-    <w:bookmarkStart w:id="28" w:name="X6dafa89e46c32694395442a9a6ca99eae379ab9"/>
+    <w:bookmarkStart w:id="28" w:name="X6d4a3e04cb0dd24aa8d860fb342aaa5143cfa7e"/>
     <w:p>
       <w:pPr>
         <w:pStyle w:val="Heading4"/>
       </w:pPr>
       <w:r>
-        <w:t xml:space="preserve">Building Humane Technology | June 2025 - Present | Remote</w:t>
+        <w:t xml:space="preserve">Building Humane Technology | June 2025 - Present | Remote (part-time)</w:t>
       </w:r>
     </w:p>
     <w:p>
@@ -425,9 +431,17 @@
         </w:numPr>
       </w:pPr>
       <w:r>
-        <w:t xml:space="preserve">Co-architecting and leading development of</w:t>
-      </w:r>
-      <w:r>
+        <w:rPr>
+          <w:b/>
+          <w:bCs/>
+        </w:rPr>
+        <w:t xml:space="preserve">Originated and co-architected</w:t>
+      </w:r>
+      <w:r>
+        <w:rPr>
+          <w:b/>
+          <w:bCs/>
+        </w:rPr>
         <w:t xml:space="preserve"> </w:t>
       </w:r>
       <w:hyperlink r:id="rId27">
@@ -441,7 +455,17 @@
         </w:r>
       </w:hyperlink>
       <w:r>
-        <w:t xml:space="preserve">, an open-source AI evaluation framework built on AISI Inspect. Python.</w:t>
+        <w:t xml:space="preserve">, an open-source AI evaluation framework built on AISI Inspect.</w:t>
+      </w:r>
+      <w:r>
+        <w:t xml:space="preserve"> </w:t>
+      </w:r>
+      <w:r>
+        <w:rPr>
+          <w:b/>
+          <w:bCs/>
+        </w:rPr>
+        <w:t xml:space="preserve">Python.</w:t>
       </w:r>
     </w:p>
     <w:p>
@@ -453,7 +477,23 @@
         </w:numPr>
       </w:pPr>
       <w:r>
-        <w:t xml:space="preserve">Developing extensible evaluation tooling focused on measuring and improving LLM behavior in real-world developer and operational workflows.</w:t>
+        <w:t xml:space="preserve">Acting as</w:t>
+      </w:r>
+      <w:r>
+        <w:t xml:space="preserve"> </w:t>
+      </w:r>
+      <w:r>
+        <w:rPr>
+          <w:b/>
+          <w:bCs/>
+        </w:rPr>
+        <w:t xml:space="preserve">fractional CTO to the team</w:t>
+      </w:r>
+      <w:r>
+        <w:t xml:space="preserve"> </w:t>
+      </w:r>
+      <w:r>
+        <w:t xml:space="preserve">that built it out to a published, externally usable product, shaping architecture, scoring design, and multi-provider support, and guiding documentation and positioning.</w:t>
       </w:r>
     </w:p>
     <w:p>
@@ -465,7 +505,105 @@
         </w:numPr>
       </w:pPr>
       <w:r>
-        <w:t xml:space="preserve">Shaping product and technical roadmap for AI-driven tooling, including production monitoring, multi-turn evaluation, and maturity models for adoption and continuous improvement.</w:t>
+        <w:t xml:space="preserve">Extending the framework toward</w:t>
+      </w:r>
+      <w:r>
+        <w:t xml:space="preserve"> </w:t>
+      </w:r>
+      <w:r>
+        <w:rPr>
+          <w:b/>
+          <w:bCs/>
+        </w:rPr>
+        <w:t xml:space="preserve">real-time evaluation</w:t>
+      </w:r>
+      <w:r>
+        <w:t xml:space="preserve">: built a</w:t>
+      </w:r>
+      <w:r>
+        <w:t xml:space="preserve"> </w:t>
+      </w:r>
+      <w:r>
+        <w:rPr>
+          <w:b/>
+          <w:bCs/>
+        </w:rPr>
+        <w:t xml:space="preserve">low-latency proof-of-concept classifier</w:t>
+      </w:r>
+      <w:r>
+        <w:t xml:space="preserve"> </w:t>
+      </w:r>
+      <w:r>
+        <w:t xml:space="preserve">that scores model behavior against HumaneBench rubrics inline at</w:t>
+      </w:r>
+      <w:r>
+        <w:t xml:space="preserve"> </w:t>
+      </w:r>
+      <w:r>
+        <w:rPr>
+          <w:b/>
+          <w:bCs/>
+        </w:rPr>
+        <w:t xml:space="preserve">sub-100ms</w:t>
+      </w:r>
+      <w:r>
+        <w:t xml:space="preserve"> </w:t>
+      </w:r>
+      <w:r>
+        <w:t xml:space="preserve">and can sit in a production request path rather than run only in batch.</w:t>
+      </w:r>
+    </w:p>
+    <w:p>
+      <w:pPr>
+        <w:pStyle w:val="Compact"/>
+        <w:numPr>
+          <w:ilvl w:val="0"/>
+          <w:numId w:val="1003"/>
+        </w:numPr>
+      </w:pPr>
+      <w:r>
+        <w:t xml:space="preserve">Designing telemetry for operational visibility, and evaluation feedback loops to inform</w:t>
+      </w:r>
+      <w:r>
+        <w:t xml:space="preserve"> </w:t>
+      </w:r>
+      <w:r>
+        <w:rPr>
+          <w:b/>
+          <w:bCs/>
+        </w:rPr>
+        <w:t xml:space="preserve">system-prompt iteration</w:t>
+      </w:r>
+      <w:r>
+        <w:t xml:space="preserve"> </w:t>
+      </w:r>
+      <w:r>
+        <w:t xml:space="preserve">and model fine-tuning.</w:t>
+      </w:r>
+    </w:p>
+    <w:p>
+      <w:pPr>
+        <w:pStyle w:val="Compact"/>
+        <w:numPr>
+          <w:ilvl w:val="0"/>
+          <w:numId w:val="1003"/>
+        </w:numPr>
+      </w:pPr>
+      <w:r>
+        <w:t xml:space="preserve">Owning</w:t>
+      </w:r>
+      <w:r>
+        <w:t xml:space="preserve"> </w:t>
+      </w:r>
+      <w:r>
+        <w:rPr>
+          <w:b/>
+          <w:bCs/>
+        </w:rPr>
+        <w:t xml:space="preserve">technical product direction and roadmap</w:t>
+      </w:r>
+      <w:r>
+        <w:t xml:space="preserve">: production monitoring, multi-turn evaluation, and adoption maturity models.</w:t>
       </w:r>
     </w:p>
     <w:bookmarkEnd w:id="28"/>

</xml_diff>

<commit_message>
Rebalance emphasis in telemetry bullet
Co-Authored-By: Claude Opus 5 <noreply@anthropic.com>
Claude-Session: https://claude.ai/code/session_01AFn2A9u39qvLMpvLN59SSo
</commit_message>
<xml_diff>
--- a/resume.docx
+++ b/resume.docx
@@ -551,23 +551,20 @@
         </w:numPr>
       </w:pPr>
       <w:r>
-        <w:t xml:space="preserve">Designing telemetry for operational visibility, and evaluation feedback loops to inform</w:t>
-      </w:r>
-      <w:r>
-        <w:t xml:space="preserve"> </w:t>
-      </w:r>
-      <w:r>
-        <w:rPr>
-          <w:b/>
-          <w:bCs/>
-        </w:rPr>
-        <w:t xml:space="preserve">system-prompt iteration</w:t>
-      </w:r>
-      <w:r>
-        <w:t xml:space="preserve"> </w:t>
-      </w:r>
-      <w:r>
-        <w:t xml:space="preserve">and model fine-tuning.</w:t>
+        <w:t xml:space="preserve">Designing</w:t>
+      </w:r>
+      <w:r>
+        <w:t xml:space="preserve"> </w:t>
+      </w:r>
+      <w:r>
+        <w:rPr>
+          <w:b/>
+          <w:bCs/>
+        </w:rPr>
+        <w:t xml:space="preserve">telemetry for operational visibility</w:t>
+      </w:r>
+      <w:r>
+        <w:t xml:space="preserve">, and evaluation feedback loops to inform system-prompt iteration and model fine-tuning.</w:t>
       </w:r>
     </w:p>
     <w:p>

</xml_diff>

<commit_message>
Drop year-count claim from summary
Co-Authored-By: Claude Opus 5 <noreply@anthropic.com>
Claude-Session: https://claude.ai/code/session_01AFn2A9u39qvLMpvLN59SSo
</commit_message>
<xml_diff>
--- a/resume.docx
+++ b/resume.docx
@@ -134,13 +134,10 @@
           <w:b/>
           <w:bCs/>
         </w:rPr>
-        <w:t xml:space="preserve">15+ years</w:t>
-      </w:r>
-      <w:r>
-        <w:t xml:space="preserve"> </w:t>
-      </w:r>
-      <w:r>
-        <w:t xml:space="preserve">building and shipping software, with</w:t>
+        <w:t xml:space="preserve">Strong record building and shipping software</w:t>
+      </w:r>
+      <w:r>
+        <w:t xml:space="preserve">, with</w:t>
       </w:r>
       <w:r>
         <w:t xml:space="preserve"> </w:t>

</xml_diff>

<commit_message>
Close JD gaps: React/Redux evidence, non-technical UX, ambiguity, speed framing, founder recs
Co-Authored-By: Claude Opus 5 <noreply@anthropic.com>
Claude-Session: https://claude.ai/code/session_01AFn2A9u39qvLMpvLN59SSo
</commit_message>
<xml_diff>
--- a/resume.docx
+++ b/resume.docx
@@ -181,7 +181,7 @@
         <w:t xml:space="preserve"> </w:t>
       </w:r>
       <w:r>
-        <w:t xml:space="preserve">Ran internal platform teams as a service organization, consulting with engineers and stakeholders, triaging requests, and turning recurring one-offs into general capabilities.</w:t>
+        <w:t xml:space="preserve">Ran internal platform teams as a service organization, consulting with engineers and stakeholders, triaging requests, and turning recurring one-offs into self-serve capabilities. Every role here has shipped user-facing experience, for technical and non-technical audiences alike.</w:t>
       </w:r>
     </w:p>
     <w:p>
@@ -203,7 +203,7 @@
         <w:t xml:space="preserve"> </w:t>
       </w:r>
       <w:r>
-        <w:t xml:space="preserve">Roadmap ownership, product and prioritization calls, and accountability for whether the thing actually solved the problem.</w:t>
+        <w:t xml:space="preserve">Roadmap ownership, product and prioritization calls, and accountability for whether the thing actually solved the problem. A rescuer of burning platforms: at home with incomplete information, and able to take a room of stakeholders and engineers to clarity.</w:t>
       </w:r>
     </w:p>
     <w:p>
@@ -293,7 +293,20 @@
         <w:t xml:space="preserve">: agent-driven delivery pipelines that carry engineering work from spec to shipped</w:t>
       </w:r>
       <w:r>
-        <w:t xml:space="preserve">, with the human in the product seat.</w:t>
+        <w:t xml:space="preserve">, with the human in the product seat. The point is</w:t>
+      </w:r>
+      <w:r>
+        <w:t xml:space="preserve"> </w:t>
+      </w:r>
+      <w:r>
+        <w:rPr>
+          <w:b/>
+          <w:bCs/>
+        </w:rPr>
+        <w:t xml:space="preserve">speed without fragility</w:t>
+      </w:r>
+      <w:r>
+        <w:t xml:space="preserve">: production-quality output over long-horizon iteration, which is where agentic development still routinely falls down.</w:t>
       </w:r>
     </w:p>
     <w:p>
@@ -350,7 +363,10 @@
         <w:t xml:space="preserve">Harness-enforced SDLC</w:t>
       </w:r>
       <w:r>
-        <w:t xml:space="preserve">: PRs gated by independent fresh-context reviewer, green CI, supply-chain scanning, deployment smoke check.</w:t>
+        <w:t xml:space="preserve"> </w:t>
+      </w:r>
+      <w:r>
+        <w:t xml:space="preserve">so agents can move fast without breaking things: PRs gated by independent fresh-context reviewer, green CI, supply-chain scanning, deployment smoke check.</w:t>
       </w:r>
     </w:p>
     <w:p>
@@ -385,10 +401,29 @@
           <w:b/>
           <w:bCs/>
         </w:rPr>
+        <w:t xml:space="preserve">Stack chosen for agent legibility</w:t>
+      </w:r>
+      <w:r>
+        <w:t xml:space="preserve">: React, TypeScript, and Next.js, whose rich tooling and precise feedback loops make them markedly more tractable for agents than a Ruby on Rails stack.</w:t>
+      </w:r>
+    </w:p>
+    <w:p>
+      <w:pPr>
+        <w:pStyle w:val="Compact"/>
+        <w:numPr>
+          <w:ilvl w:val="0"/>
+          <w:numId w:val="1002"/>
+        </w:numPr>
+      </w:pPr>
+      <w:r>
+        <w:rPr>
+          <w:b/>
+          <w:bCs/>
+        </w:rPr>
         <w:t xml:space="preserve">Human in the product role</w:t>
       </w:r>
       <w:r>
-        <w:t xml:space="preserve">: defining and prioritizing work, verifying against deployed previews, steering product and process.</w:t>
+        <w:t xml:space="preserve">: defining and prioritizing work, verifying against deployed previews on behalf of a non-technical user base, steering product and process. Matching approach to the work: a prototype collapses to a fraction of the time driving an agent directly, while the factory earns its keep on production systems.</w:t>
       </w:r>
     </w:p>
     <w:bookmarkEnd w:id="25"/>
@@ -931,6 +966,50 @@
         </w:numPr>
       </w:pPr>
       <w:r>
+        <w:t xml:space="preserve">Shipped</w:t>
+      </w:r>
+      <w:r>
+        <w:t xml:space="preserve"> </w:t>
+      </w:r>
+      <w:r>
+        <w:rPr>
+          <w:b/>
+          <w:bCs/>
+        </w:rPr>
+        <w:t xml:space="preserve">React</w:t>
+      </w:r>
+      <w:r>
+        <w:t xml:space="preserve"> </w:t>
+      </w:r>
+      <w:r>
+        <w:t xml:space="preserve">features in the customer-facing product and worked in its</w:t>
+      </w:r>
+      <w:r>
+        <w:t xml:space="preserve"> </w:t>
+      </w:r>
+      <w:r>
+        <w:rPr>
+          <w:b/>
+          <w:bCs/>
+        </w:rPr>
+        <w:t xml:space="preserve">Redux</w:t>
+      </w:r>
+      <w:r>
+        <w:t xml:space="preserve"> </w:t>
+      </w:r>
+      <w:r>
+        <w:t xml:space="preserve">state management, alongside the platform and infrastructure work.</w:t>
+      </w:r>
+    </w:p>
+    <w:p>
+      <w:pPr>
+        <w:pStyle w:val="Compact"/>
+        <w:numPr>
+          <w:ilvl w:val="0"/>
+          <w:numId w:val="1006"/>
+        </w:numPr>
+      </w:pPr>
+      <w:r>
         <w:rPr>
           <w:b/>
           <w:bCs/>
@@ -980,7 +1059,23 @@
         </w:numPr>
       </w:pPr>
       <w:r>
-        <w:t xml:space="preserve">Designed, architected, and built a cross-platform mobile app from scratch for iOS and Android. Node.js backend, JavaScript frontend, Firebase real-time systems, CI/CD to AWS/CloudFront via CircleCI.</w:t>
+        <w:t xml:space="preserve">Designed, architected, and built a cross-platform mobile app from scratch for iOS and Android. Node.js backend, JavaScript frontend with</w:t>
+      </w:r>
+      <w:r>
+        <w:t xml:space="preserve"> </w:t>
+      </w:r>
+      <w:r>
+        <w:rPr>
+          <w:b/>
+          <w:bCs/>
+        </w:rPr>
+        <w:t xml:space="preserve">Redux</w:t>
+      </w:r>
+      <w:r>
+        <w:t xml:space="preserve"> </w:t>
+      </w:r>
+      <w:r>
+        <w:t xml:space="preserve">state management, Firebase real-time systems, CI/CD to AWS/CloudFront via CircleCI.</w:t>
       </w:r>
     </w:p>
     <w:p>
@@ -1150,7 +1245,7 @@
         <w:pStyle w:val="FirstParagraph"/>
       </w:pPr>
       <w:r>
-        <w:t xml:space="preserve">Evaluation framework for measuring human-friendly behavior in AI assistants, built on AISI Inspect. Tests AI responses across humane technology principles including loneliness, mental health, transparency, and privacy. Multi-provider LLM support with extensible scenario datasets.</w:t>
+        <w:t xml:space="preserve">Open-source LLM evaluation framework built on AISI Inspect. See Building Humane Technology above.</w:t>
       </w:r>
       <w:r>
         <w:t xml:space="preserve"> </w:t>
@@ -1377,75 +1472,49 @@
         <w:pStyle w:val="FirstParagraph"/>
       </w:pPr>
       <w:r>
-        <w:t xml:space="preserve">“Jack is</w:t>
-      </w:r>
-      <w:r>
-        <w:t xml:space="preserve"> </w:t>
-      </w:r>
-      <w:r>
-        <w:rPr>
-          <w:b/>
-          <w:bCs/>
-        </w:rPr>
-        <w:t xml:space="preserve">an exceptional engineer and leader</w:t>
-      </w:r>
-      <w:r>
-        <w:t xml:space="preserve">. He strives to</w:t>
-      </w:r>
-      <w:r>
-        <w:t xml:space="preserve"> </w:t>
-      </w:r>
-      <w:r>
-        <w:rPr>
-          <w:b/>
-          <w:bCs/>
-        </w:rPr>
-        <w:t xml:space="preserve">deeply understand the technology</w:t>
-      </w:r>
-      <w:r>
-        <w:t xml:space="preserve"> </w:t>
-      </w:r>
-      <w:r>
-        <w:t xml:space="preserve">he’s working on while remaining cognizant of the socio-technical components that may be a factor in any project. He’s thorough, detail-oriented, and outcome-oriented, which means</w:t>
-      </w:r>
-      <w:r>
-        <w:t xml:space="preserve"> </w:t>
-      </w:r>
-      <w:r>
-        <w:rPr>
-          <w:b/>
-          <w:bCs/>
-        </w:rPr>
-        <w:t xml:space="preserve">the solutions he architects, builds, and collaborates on come out better</w:t>
-      </w:r>
-      <w:r>
-        <w:t xml:space="preserve">. Jack also strives to be at the forefront of new technology and assess how he can leverage it. He does all this with a</w:t>
-      </w:r>
-      <w:r>
-        <w:t xml:space="preserve"> </w:t>
-      </w:r>
-      <w:r>
-        <w:rPr>
-          <w:b/>
-          <w:bCs/>
-        </w:rPr>
-        <w:t xml:space="preserve">strong team mentality</w:t>
-      </w:r>
-      <w:r>
-        <w:t xml:space="preserve">, is a phenomenal team player, and can</w:t>
-      </w:r>
-      <w:r>
-        <w:t xml:space="preserve"> </w:t>
-      </w:r>
-      <w:r>
-        <w:rPr>
-          <w:b/>
-          <w:bCs/>
-        </w:rPr>
-        <w:t xml:space="preserve">effectively delegate to help lift others’ skill sets</w:t>
-      </w:r>
-      <w:r>
-        <w:t xml:space="preserve">.”</w:t>
+        <w:t xml:space="preserve">“With Jack,</w:t>
+      </w:r>
+      <w:r>
+        <w:t xml:space="preserve"> </w:t>
+      </w:r>
+      <w:r>
+        <w:rPr>
+          <w:b/>
+          <w:bCs/>
+        </w:rPr>
+        <w:t xml:space="preserve">the more complex the problem, the more simple his solutions</w:t>
+      </w:r>
+      <w:r>
+        <w:t xml:space="preserve">. From eradicating dynamic php bugs to providing innovative javascript capabilities, Master Senechal is more than a mind to be reckoned with, he’s an</w:t>
+      </w:r>
+      <w:r>
+        <w:t xml:space="preserve"> </w:t>
+      </w:r>
+      <w:r>
+        <w:rPr>
+          <w:b/>
+          <w:bCs/>
+        </w:rPr>
+        <w:t xml:space="preserve">integrative capacity builder</w:t>
+      </w:r>
+      <w:r>
+        <w:t xml:space="preserve"> </w:t>
+      </w:r>
+      <w:r>
+        <w:t xml:space="preserve">with a wide range of technological expertise.</w:t>
+      </w:r>
+      <w:r>
+        <w:t xml:space="preserve"> </w:t>
+      </w:r>
+      <w:r>
+        <w:rPr>
+          <w:b/>
+          <w:bCs/>
+        </w:rPr>
+        <w:t xml:space="preserve">If there is anything that can be done through web development, Jack can figure out how to do it, and make it happen.</w:t>
+      </w:r>
+      <w:r>
+        <w:t xml:space="preserve">”</w:t>
       </w:r>
     </w:p>
     <w:p>
@@ -1457,7 +1526,7 @@
           <w:i/>
           <w:iCs/>
         </w:rPr>
-        <w:t xml:space="preserve">— Brandon Clifford, Director of DevOps, Kantata</w:t>
+        <w:t xml:space="preserve">— Adam Apollo, Cofounder &amp; CEO, Superluminal Systems</w:t>
       </w:r>
     </w:p>
     <w:p>
@@ -1465,33 +1534,33 @@
         <w:pStyle w:val="BodyText"/>
       </w:pPr>
       <w:r>
-        <w:t xml:space="preserve">“Jack is a fantastic engineer always ready to</w:t>
-      </w:r>
-      <w:r>
-        <w:t xml:space="preserve"> </w:t>
-      </w:r>
-      <w:r>
-        <w:rPr>
-          <w:b/>
-          <w:bCs/>
-        </w:rPr>
-        <w:t xml:space="preserve">help solve problems and more importantly, teach you how to solve them</w:t>
-      </w:r>
-      <w:r>
-        <w:t xml:space="preserve">. He guided me and my team through a bunch of challenging GitOps situations with patience and kindness, leading by example. Always diligent with his work, willing to roll up his sleeves to get things done and</w:t>
-      </w:r>
-      <w:r>
-        <w:t xml:space="preserve"> </w:t>
-      </w:r>
-      <w:r>
-        <w:rPr>
-          <w:b/>
-          <w:bCs/>
-        </w:rPr>
-        <w:t xml:space="preserve">find creative solutions</w:t>
-      </w:r>
-      <w:r>
-        <w:t xml:space="preserve">. Everyone would be lucky to have someone like him in their teams!”</w:t>
+        <w:t xml:space="preserve">“Jack has a flair for</w:t>
+      </w:r>
+      <w:r>
+        <w:t xml:space="preserve"> </w:t>
+      </w:r>
+      <w:r>
+        <w:rPr>
+          <w:b/>
+          <w:bCs/>
+        </w:rPr>
+        <w:t xml:space="preserve">finding better, faster, and more reliable ways to get things done</w:t>
+      </w:r>
+      <w:r>
+        <w:t xml:space="preserve">. He advocates best practices, like unit testing, and has a deep knowledge of OO architecture.</w:t>
+      </w:r>
+      <w:r>
+        <w:t xml:space="preserve"> </w:t>
+      </w:r>
+      <w:r>
+        <w:rPr>
+          <w:b/>
+          <w:bCs/>
+        </w:rPr>
+        <w:t xml:space="preserve">Jack thinks on his toes</w:t>
+      </w:r>
+      <w:r>
+        <w:t xml:space="preserve">, and will always be there with the team at 4 a.m. if circumstance requires it.”</w:t>
       </w:r>
     </w:p>
     <w:p>
@@ -1503,7 +1572,7 @@
           <w:i/>
           <w:iCs/>
         </w:rPr>
-        <w:t xml:space="preserve">— Cesar Palafox Garza, Principal Software Engineer, Kantata</w:t>
+        <w:t xml:space="preserve">— Greg Whitescarver, Founder, Mojave</w:t>
       </w:r>
     </w:p>
     <w:p>

</xml_diff>

<commit_message>
Compact resume: denser bullets, cut recommendations, merge skills lines
Co-Authored-By: Claude Opus 5 <noreply@anthropic.com>
Claude-Session: https://claude.ai/code/session_01AFn2A9u39qvLMpvLN59SSo
</commit_message>
<xml_diff>
--- a/resume.docx
+++ b/resume.docx
@@ -2,7 +2,7 @@
 <file path=word/document.xml><?xml version="1.0" encoding="utf-8"?>
 <w:document xmlns:w="http://schemas.openxmlformats.org/wordprocessingml/2006/main" xmlns:m="http://schemas.openxmlformats.org/officeDocument/2006/math" xmlns:r="http://schemas.openxmlformats.org/officeDocument/2006/relationships" xmlns:o="urn:schemas-microsoft-com:office:office" xmlns:v="urn:schemas-microsoft-com:vml" xmlns:w10="urn:schemas-microsoft-com:office:word" xmlns:a="http://schemas.openxmlformats.org/drawingml/2006/main" xmlns:pic="http://schemas.openxmlformats.org/drawingml/2006/picture" xmlns:wp="http://schemas.openxmlformats.org/drawingml/2006/wordprocessingDrawing">
   <w:body>
-    <w:bookmarkStart w:id="50" w:name="jack-senechal"/>
+    <w:bookmarkStart w:id="47" w:name="jack-senechal"/>
     <w:p>
       <w:pPr>
         <w:pStyle w:val="Heading1"/>
@@ -29,19 +29,13 @@
           <w:b/>
           <w:bCs/>
         </w:rPr>
-        <w:t xml:space="preserve">Located in Novato, CA</w:t>
-      </w:r>
-      <w:r>
-        <w:t xml:space="preserve"> </w:t>
-      </w:r>
-      <w:r>
-        <w:t xml:space="preserve">Phone: 415-779-2701</w:t>
-      </w:r>
-      <w:r>
-        <w:t xml:space="preserve"> </w:t>
-      </w:r>
-      <w:r>
-        <w:t xml:space="preserve">Email:</w:t>
+        <w:t xml:space="preserve">Novato, CA</w:t>
+      </w:r>
+      <w:r>
+        <w:t xml:space="preserve"> </w:t>
+      </w:r>
+      <w:r>
+        <w:t xml:space="preserve">· 415-779-2701 ·</w:t>
       </w:r>
       <w:r>
         <w:t xml:space="preserve"> </w:t>
@@ -75,7 +69,7 @@
         <w:t xml:space="preserve"> </w:t>
       </w:r>
       <w:r>
-        <w:t xml:space="preserve">LinkedIn:</w:t>
+        <w:t xml:space="preserve">· LinkedIn:</w:t>
       </w:r>
       <w:r>
         <w:t xml:space="preserve"> </w:t>
@@ -101,6 +95,14 @@
     </w:p>
     <w:p>
       <w:pPr>
+        <w:pStyle w:val="FirstParagraph"/>
+      </w:pPr>
+      <w:r>
+        <w:t xml:space="preserve">Full-stack product engineer with a strong record of shipping production software and infrastructure, most of it at startups and as a founder. No big-company detour.</w:t>
+      </w:r>
+    </w:p>
+    <w:p>
+      <w:pPr>
         <w:pStyle w:val="Compact"/>
         <w:numPr>
           <w:ilvl w:val="0"/>
@@ -112,10 +114,13 @@
           <w:b/>
           <w:bCs/>
         </w:rPr>
-        <w:t xml:space="preserve">Full-stack product engineer with a strong record of shipping production software and infrastructure</w:t>
-      </w:r>
-      <w:r>
-        <w:t xml:space="preserve">, most of it at startups and as a founder. No big-company detour.</w:t>
+        <w:t xml:space="preserve">Platform architect</w:t>
+      </w:r>
+      <w:r>
+        <w:t xml:space="preserve"> </w:t>
+      </w:r>
+      <w:r>
+        <w:t xml:space="preserve">for internal tools other people build on: shared infrastructure, integration middleware, and developer-facing primitives with real internal customers.</w:t>
       </w:r>
     </w:p>
     <w:p>
@@ -131,13 +136,13 @@
           <w:b/>
           <w:bCs/>
         </w:rPr>
-        <w:t xml:space="preserve">Platform architect</w:t>
-      </w:r>
-      <w:r>
-        <w:t xml:space="preserve"> </w:t>
-      </w:r>
-      <w:r>
-        <w:t xml:space="preserve">specializing in internal tools and platforms that other people build on: shared infrastructure, integration middleware, and developer-facing primitives with real internal customers.</w:t>
+        <w:t xml:space="preserve">Team of one, with leadership chops.</w:t>
+      </w:r>
+      <w:r>
+        <w:t xml:space="preserve"> </w:t>
+      </w:r>
+      <w:r>
+        <w:t xml:space="preserve">Comfortable taking products from idea to shipped across backend, frontend, and infrastructure, with the product judgment to know what is worth building.</w:t>
       </w:r>
     </w:p>
     <w:p>
@@ -153,13 +158,13 @@
           <w:b/>
           <w:bCs/>
         </w:rPr>
-        <w:t xml:space="preserve">Team of one, with leadership chops.</w:t>
-      </w:r>
-      <w:r>
-        <w:t xml:space="preserve"> </w:t>
-      </w:r>
-      <w:r>
-        <w:t xml:space="preserve">Hands-on engineering and leadership across founding roles and mid-to-late-stage startups. Comfortable taking products from idea to shipped and running across backend, frontend, and infrastructure, with the product and business judgment to know what is worth building.</w:t>
+        <w:t xml:space="preserve">Owns outcomes, not tickets.</w:t>
+      </w:r>
+      <w:r>
+        <w:t xml:space="preserve"> </w:t>
+      </w:r>
+      <w:r>
+        <w:t xml:space="preserve">A rescuer of burning platforms, at home with incomplete information, able to take a room of stakeholders and engineers to clarity.</w:t>
       </w:r>
     </w:p>
     <w:p>
@@ -171,61 +176,20 @@
         </w:numPr>
       </w:pPr>
       <w:r>
-        <w:rPr>
-          <w:b/>
-          <w:bCs/>
-        </w:rPr>
-        <w:t xml:space="preserve">Working directly with users.</w:t>
-      </w:r>
-      <w:r>
-        <w:t xml:space="preserve"> </w:t>
-      </w:r>
-      <w:r>
-        <w:t xml:space="preserve">Ran internal platform teams as a service organization, consulting with engineers and stakeholders, triaging requests, and turning recurring one-offs into self-serve capabilities. Every role here has shipped user-facing experience, for technical and non-technical audiences alike.</w:t>
-      </w:r>
-    </w:p>
-    <w:p>
-      <w:pPr>
-        <w:pStyle w:val="Compact"/>
-        <w:numPr>
-          <w:ilvl w:val="0"/>
-          <w:numId w:val="1001"/>
-        </w:numPr>
-      </w:pPr>
-      <w:r>
-        <w:rPr>
-          <w:b/>
-          <w:bCs/>
-        </w:rPr>
-        <w:t xml:space="preserve">Owning outcomes, not tickets.</w:t>
-      </w:r>
-      <w:r>
-        <w:t xml:space="preserve"> </w:t>
-      </w:r>
-      <w:r>
-        <w:t xml:space="preserve">Roadmap ownership, product and prioritization calls, and accountability for whether the thing actually solved the problem. A rescuer of burning platforms: at home with incomplete information, and able to take a room of stakeholders and engineers to clarity.</w:t>
-      </w:r>
-    </w:p>
-    <w:p>
-      <w:pPr>
-        <w:pStyle w:val="Compact"/>
-        <w:numPr>
-          <w:ilvl w:val="0"/>
-          <w:numId w:val="1001"/>
-        </w:numPr>
-      </w:pPr>
-      <w:r>
-        <w:rPr>
-          <w:b/>
-          <w:bCs/>
-        </w:rPr>
-        <w:t xml:space="preserve">Building the machine that builds the software.</w:t>
-      </w:r>
-      <w:r>
-        <w:t xml:space="preserve"> </w:t>
-      </w:r>
-      <w:r>
-        <w:t xml:space="preserve">Designing and operating agent-driven delivery pipelines that ship production code end to end, and building with LLMs directly (evaluation frameworks, MCP servers, chat products).</w:t>
+        <w:t xml:space="preserve">Every role here has shipped</w:t>
+      </w:r>
+      <w:r>
+        <w:t xml:space="preserve"> </w:t>
+      </w:r>
+      <w:r>
+        <w:rPr>
+          <w:b/>
+          <w:bCs/>
+        </w:rPr>
+        <w:t xml:space="preserve">user-facing experience</w:t>
+      </w:r>
+      <w:r>
+        <w:t xml:space="preserve">, for technical and non-technical audiences alike.</w:t>
       </w:r>
     </w:p>
     <w:bookmarkEnd w:id="24"/>
@@ -265,48 +229,29 @@
         </w:numPr>
       </w:pPr>
       <w:r>
-        <w:rPr>
-          <w:b/>
-          <w:bCs/>
-        </w:rPr>
-        <w:t xml:space="preserve">Running</w:t>
-      </w:r>
-      <w:r>
-        <w:rPr>
-          <w:b/>
-          <w:bCs/>
-        </w:rPr>
-        <w:t xml:space="preserve"> </w:t>
-      </w:r>
-      <w:r>
-        <w:rPr>
-          <w:b/>
-          <w:bCs/>
-        </w:rPr>
+        <w:t xml:space="preserve">Run</w:t>
+      </w:r>
+      <w:r>
+        <w:t xml:space="preserve"> </w:t>
+      </w:r>
+      <w:r>
         <w:t xml:space="preserve">“software factories”</w:t>
       </w:r>
       <w:r>
-        <w:rPr>
-          <w:b/>
-          <w:bCs/>
-        </w:rPr>
-        <w:t xml:space="preserve">: agent-driven delivery pipelines that carry engineering work from spec to shipped</w:t>
-      </w:r>
-      <w:r>
-        <w:t xml:space="preserve">, with the human in the product seat. The point is</w:t>
-      </w:r>
-      <w:r>
-        <w:t xml:space="preserve"> </w:t>
-      </w:r>
-      <w:r>
-        <w:rPr>
-          <w:b/>
-          <w:bCs/>
-        </w:rPr>
-        <w:t xml:space="preserve">speed without fragility</w:t>
-      </w:r>
-      <w:r>
-        <w:t xml:space="preserve">: production-quality output over long-horizon iteration, which is where agentic development still routinely falls down.</w:t>
+        <w:t xml:space="preserve">: agent-driven delivery pipelines that carry engineering work from spec to shipped, human in the product seat.</w:t>
+      </w:r>
+      <w:r>
+        <w:t xml:space="preserve"> </w:t>
+      </w:r>
+      <w:r>
+        <w:rPr>
+          <w:b/>
+          <w:bCs/>
+        </w:rPr>
+        <w:t xml:space="preserve">Speed without fragility</w:t>
+      </w:r>
+      <w:r>
+        <w:t xml:space="preserve">: production-quality output over long-horizon iteration, where agentic development typically falls down.</w:t>
       </w:r>
     </w:p>
     <w:p>
@@ -325,7 +270,7 @@
         <w:t xml:space="preserve">Core thesis</w:t>
       </w:r>
       <w:r>
-        <w:t xml:space="preserve">: the same DevOps and project-management discipline that makes human teams work is also the necessary and sufficient foundation for agent teams, encoded into the harness and context.</w:t>
+        <w:t xml:space="preserve">: the same DevOps and project-management discipline that makes human teams work is the necessary and sufficient foundation for agent teams, encoded into the harness and context.</w:t>
       </w:r>
     </w:p>
     <w:p>
@@ -341,10 +286,10 @@
           <w:b/>
           <w:bCs/>
         </w:rPr>
-        <w:t xml:space="preserve">GitHub as the coordination substrate</w:t>
-      </w:r>
-      <w:r>
-        <w:t xml:space="preserve">: issues, PRs, and Projects are the single ledger.</w:t>
+        <w:t xml:space="preserve">GitHub as coordination substrate</w:t>
+      </w:r>
+      <w:r>
+        <w:t xml:space="preserve">: issues, PRs, and Projects as the single ledger. Harness-enforced SDLC (independent fresh-context reviewer, green CI, supply-chain scanning, deployment smoke check) so agents move fast without breaking things.</w:t>
       </w:r>
     </w:p>
     <w:p>
@@ -360,13 +305,10 @@
           <w:b/>
           <w:bCs/>
         </w:rPr>
-        <w:t xml:space="preserve">Harness-enforced SDLC</w:t>
-      </w:r>
-      <w:r>
-        <w:t xml:space="preserve"> </w:t>
-      </w:r>
-      <w:r>
-        <w:t xml:space="preserve">so agents can move fast without breaking things: PRs gated by independent fresh-context reviewer, green CI, supply-chain scanning, deployment smoke check.</w:t>
+        <w:t xml:space="preserve">Self-improving harness</w:t>
+      </w:r>
+      <w:r>
+        <w:t xml:space="preserve">: orchestration agents run, observe, and refine the process, converging on and shipping their own refinements.</w:t>
       </w:r>
     </w:p>
     <w:p>
@@ -378,14 +320,23 @@
         </w:numPr>
       </w:pPr>
       <w:r>
-        <w:rPr>
-          <w:b/>
-          <w:bCs/>
-        </w:rPr>
-        <w:t xml:space="preserve">Self-improving harness</w:t>
-      </w:r>
-      <w:r>
-        <w:t xml:space="preserve">: Orchestration agents tasked with running, observing, and refining the process. Agents collaboratively converge on refinements, ship and evaluate.</w:t>
+        <w:t xml:space="preserve">Chose</w:t>
+      </w:r>
+      <w:r>
+        <w:t xml:space="preserve"> </w:t>
+      </w:r>
+      <w:r>
+        <w:rPr>
+          <w:b/>
+          <w:bCs/>
+        </w:rPr>
+        <w:t xml:space="preserve">React, TypeScript, and Next.js</w:t>
+      </w:r>
+      <w:r>
+        <w:t xml:space="preserve"> </w:t>
+      </w:r>
+      <w:r>
+        <w:t xml:space="preserve">over Ruby on Rails for this client’s stack: their tooling and feedback loops are markedly more tractable for agents to work in.</w:t>
       </w:r>
     </w:p>
     <w:p>
@@ -397,33 +348,7 @@
         </w:numPr>
       </w:pPr>
       <w:r>
-        <w:rPr>
-          <w:b/>
-          <w:bCs/>
-        </w:rPr>
-        <w:t xml:space="preserve">Stack chosen for agent legibility</w:t>
-      </w:r>
-      <w:r>
-        <w:t xml:space="preserve">: React, TypeScript, and Next.js, whose rich tooling and precise feedback loops make them markedly more tractable for agents than a Ruby on Rails stack.</w:t>
-      </w:r>
-    </w:p>
-    <w:p>
-      <w:pPr>
-        <w:pStyle w:val="Compact"/>
-        <w:numPr>
-          <w:ilvl w:val="0"/>
-          <w:numId w:val="1002"/>
-        </w:numPr>
-      </w:pPr>
-      <w:r>
-        <w:rPr>
-          <w:b/>
-          <w:bCs/>
-        </w:rPr>
-        <w:t xml:space="preserve">Human in the product role</w:t>
-      </w:r>
-      <w:r>
-        <w:t xml:space="preserve">: defining and prioritizing work, verifying against deployed previews on behalf of a non-technical user base, steering product and process. Matching approach to the work: a prototype collapses to a fraction of the time driving an agent directly, while the factory earns its keep on production systems.</w:t>
+        <w:t xml:space="preserve">Defines and prioritizes work, verifies against deployed previews on behalf of a non-technical user base. A prototype is far faster driving an agent directly; the factory earns its keep on production systems, which is where the industry is converging.</w:t>
       </w:r>
     </w:p>
     <w:bookmarkEnd w:id="25"/>
@@ -455,25 +380,15 @@
         </w:numPr>
       </w:pPr>
       <w:r>
-        <w:rPr>
-          <w:b/>
-          <w:bCs/>
-        </w:rPr>
         <w:t xml:space="preserve">Originated and co-architected</w:t>
       </w:r>
       <w:r>
-        <w:rPr>
-          <w:b/>
-          <w:bCs/>
-        </w:rPr>
         <w:t xml:space="preserve"> </w:t>
       </w:r>
       <w:hyperlink r:id="rId27">
         <w:r>
           <w:rPr>
             <w:rStyle w:val="Hyperlink"/>
-            <w:b/>
-            <w:bCs/>
           </w:rPr>
           <w:t xml:space="preserve">HumaneBench.ai</w:t>
         </w:r>
@@ -501,23 +416,7 @@
         </w:numPr>
       </w:pPr>
       <w:r>
-        <w:t xml:space="preserve">Acting as</w:t>
-      </w:r>
-      <w:r>
-        <w:t xml:space="preserve"> </w:t>
-      </w:r>
-      <w:r>
-        <w:rPr>
-          <w:b/>
-          <w:bCs/>
-        </w:rPr>
-        <w:t xml:space="preserve">fractional CTO to the team</w:t>
-      </w:r>
-      <w:r>
-        <w:t xml:space="preserve"> </w:t>
-      </w:r>
-      <w:r>
-        <w:t xml:space="preserve">that built it out to a published, externally usable product, shaping architecture, scoring design, and multi-provider support, and guiding documentation and positioning.</w:t>
+        <w:t xml:space="preserve">Fractional CTO to the team that built it into a published, externally usable product, shaping architecture, scoring design, multi-provider support, documentation, and positioning.</w:t>
       </w:r>
     </w:p>
     <w:p>
@@ -529,36 +428,7 @@
         </w:numPr>
       </w:pPr>
       <w:r>
-        <w:t xml:space="preserve">Extending the framework toward</w:t>
-      </w:r>
-      <w:r>
-        <w:t xml:space="preserve"> </w:t>
-      </w:r>
-      <w:r>
-        <w:rPr>
-          <w:b/>
-          <w:bCs/>
-        </w:rPr>
-        <w:t xml:space="preserve">real-time evaluation</w:t>
-      </w:r>
-      <w:r>
-        <w:t xml:space="preserve">: built a</w:t>
-      </w:r>
-      <w:r>
-        <w:t xml:space="preserve"> </w:t>
-      </w:r>
-      <w:r>
-        <w:rPr>
-          <w:b/>
-          <w:bCs/>
-        </w:rPr>
-        <w:t xml:space="preserve">low-latency proof-of-concept classifier</w:t>
-      </w:r>
-      <w:r>
-        <w:t xml:space="preserve"> </w:t>
-      </w:r>
-      <w:r>
-        <w:t xml:space="preserve">that scores model behavior against HumaneBench rubrics inline at</w:t>
+        <w:t xml:space="preserve">Built a low-latency proof-of-concept classifier scoring model behavior against HumaneBench rubrics inline at</w:t>
       </w:r>
       <w:r>
         <w:t xml:space="preserve"> </w:t>
@@ -571,10 +441,7 @@
         <w:t xml:space="preserve">sub-100ms</w:t>
       </w:r>
       <w:r>
-        <w:t xml:space="preserve"> </w:t>
-      </w:r>
-      <w:r>
-        <w:t xml:space="preserve">and can sit in a production request path rather than run only in batch.</w:t>
+        <w:t xml:space="preserve">, suitable for a production request path rather than batch only.</w:t>
       </w:r>
     </w:p>
     <w:p>
@@ -586,45 +453,7 @@
         </w:numPr>
       </w:pPr>
       <w:r>
-        <w:t xml:space="preserve">Designing</w:t>
-      </w:r>
-      <w:r>
-        <w:t xml:space="preserve"> </w:t>
-      </w:r>
-      <w:r>
-        <w:rPr>
-          <w:b/>
-          <w:bCs/>
-        </w:rPr>
-        <w:t xml:space="preserve">telemetry for operational visibility</w:t>
-      </w:r>
-      <w:r>
-        <w:t xml:space="preserve">, and evaluation feedback loops to inform system-prompt iteration and model fine-tuning.</w:t>
-      </w:r>
-    </w:p>
-    <w:p>
-      <w:pPr>
-        <w:pStyle w:val="Compact"/>
-        <w:numPr>
-          <w:ilvl w:val="0"/>
-          <w:numId w:val="1003"/>
-        </w:numPr>
-      </w:pPr>
-      <w:r>
-        <w:t xml:space="preserve">Owning</w:t>
-      </w:r>
-      <w:r>
-        <w:t xml:space="preserve"> </w:t>
-      </w:r>
-      <w:r>
-        <w:rPr>
-          <w:b/>
-          <w:bCs/>
-        </w:rPr>
-        <w:t xml:space="preserve">technical product direction and roadmap</w:t>
-      </w:r>
-      <w:r>
-        <w:t xml:space="preserve">: production monitoring, multi-turn evaluation, and adoption maturity models.</w:t>
+        <w:t xml:space="preserve">Designs telemetry for operational visibility and evaluation feedback loops informing system-prompt iteration and fine-tuning. Owns the technical roadmap: production monitoring, multi-turn evaluation, adoption maturity models.</w:t>
       </w:r>
     </w:p>
     <w:bookmarkEnd w:id="28"/>
@@ -656,17 +485,7 @@
         </w:numPr>
       </w:pPr>
       <w:r>
-        <w:rPr>
-          <w:b/>
-          <w:bCs/>
-        </w:rPr>
-        <w:t xml:space="preserve">Owned the front end</w:t>
-      </w:r>
-      <w:r>
-        <w:t xml:space="preserve"> </w:t>
-      </w:r>
-      <w:r>
-        <w:t xml:space="preserve">of a production consumer subscription app: Rails views, JavaScript, HTML/CSS, Tailwind, and responsive UI/UX.</w:t>
+        <w:t xml:space="preserve">Owned the front end of a production consumer subscription app: Rails views, JavaScript, HTML/CSS, Tailwind, responsive UI/UX.</w:t>
       </w:r>
     </w:p>
     <w:p>
@@ -678,14 +497,7 @@
         </w:numPr>
       </w:pPr>
       <w:r>
-        <w:rPr>
-          <w:b/>
-          <w:bCs/>
-        </w:rPr>
-        <w:t xml:space="preserve">Led design and UX delivery</w:t>
-      </w:r>
-      <w:r>
-        <w:t xml:space="preserve">: worked directly with freelance designers, then translated their Figma designs into the Rails framework.</w:t>
+        <w:t xml:space="preserve">Led design and UX delivery: worked directly with freelance designers, translated Figma into the Rails framework. Collaborated on the back end: Rails MVC, Stripe subscription billing, SSO authentication.</w:t>
       </w:r>
     </w:p>
     <w:p>
@@ -697,19 +509,7 @@
         </w:numPr>
       </w:pPr>
       <w:r>
-        <w:t xml:space="preserve">Collaborated on the back end: Rails MVC, Stripe subscription billing, SSO authentication.</w:t>
-      </w:r>
-    </w:p>
-    <w:p>
-      <w:pPr>
-        <w:pStyle w:val="Compact"/>
-        <w:numPr>
-          <w:ilvl w:val="0"/>
-          <w:numId w:val="1004"/>
-        </w:numPr>
-      </w:pPr>
-      <w:r>
-        <w:t xml:space="preserve">Made product and prioritization calls with co-founders: roadmap, scope, what to cut, what to ship next.</w:t>
+        <w:t xml:space="preserve">Made product and prioritization calls with co-founders: roadmap, scope, what to ship next.</w:t>
       </w:r>
     </w:p>
     <w:bookmarkEnd w:id="30"/>
@@ -778,30 +578,7 @@
         </w:numPr>
       </w:pPr>
       <w:r>
-        <w:rPr>
-          <w:b/>
-          <w:bCs/>
-        </w:rPr>
-        <w:t xml:space="preserve">Owned the build-vs-buy decision</w:t>
-      </w:r>
-      <w:r>
-        <w:t xml:space="preserve"> </w:t>
-      </w:r>
-      <w:r>
-        <w:t xml:space="preserve">for customer support and incident response. Selected incident.io for incident management; after a thorough review of support tooling turned up nothing that handled Slack-based support cleanly,</w:t>
-      </w:r>
-      <w:r>
-        <w:t xml:space="preserve"> </w:t>
-      </w:r>
-      <w:r>
-        <w:rPr>
-          <w:b/>
-          <w:bCs/>
-        </w:rPr>
-        <w:t xml:space="preserve">built the Slack support agent from the ground up in Python</w:t>
-      </w:r>
-      <w:r>
-        <w:t xml:space="preserve">, then onboarded teammates and customers onto it.</w:t>
+        <w:t xml:space="preserve">Owned build-vs-buy for support and incident response: selected incident.io for incident management; after support tooling review found nothing that handled Slack-based support cleanly, built the Slack support agent from the ground up in Python and onboarded teammates and customers onto it.</w:t>
       </w:r>
     </w:p>
     <w:bookmarkEnd w:id="32"/>
@@ -843,7 +620,7 @@
         <w:t xml:space="preserve"> </w:t>
       </w:r>
       <w:r>
-        <w:t xml:space="preserve">(2 years): Took over an unreliable agent-based integration platform connecting the SaaS to customer systems (Salesforce, HRIS, accounting) and led its rearchitecture into a dependable one.</w:t>
+        <w:t xml:space="preserve">(2 yrs): Took over an unreliable agent-based integration platform connecting the SaaS to customer systems (Salesforce, HRIS, accounting) and led its rearchitecture into a dependable one.</w:t>
       </w:r>
       <w:r>
         <w:t xml:space="preserve"> </w:t>
@@ -859,7 +636,7 @@
         <w:t xml:space="preserve"> </w:t>
       </w:r>
       <w:r>
-        <w:t xml:space="preserve">by instrumenting the system and fixing what the data actually pointed at. Executed a</w:t>
+        <w:t xml:space="preserve">by instrumenting the system and fixing what the data pointed at. Executed a</w:t>
       </w:r>
       <w:r>
         <w:t xml:space="preserve"> </w:t>
@@ -897,23 +674,7 @@
         <w:t xml:space="preserve"> </w:t>
       </w:r>
       <w:r>
-        <w:t xml:space="preserve">(4 years): Built a new team from scratch whose product was the platform the entire engineering organization built on. Ran it as a service org with internal customers: consulted with teams on their workflows, triaged requests, and</w:t>
-      </w:r>
-      <w:r>
-        <w:t xml:space="preserve"> </w:t>
-      </w:r>
-      <w:r>
-        <w:rPr>
-          <w:b/>
-          <w:bCs/>
-        </w:rPr>
-        <w:t xml:space="preserve">reduced recurring one-off asks into shared primitives and self-serve tooling</w:t>
-      </w:r>
-      <w:r>
-        <w:t xml:space="preserve"> </w:t>
-      </w:r>
-      <w:r>
-        <w:t xml:space="preserve">so teams could ship without waiting on us. Owned the roadmap while staying hands-on in code, architecture, and review. Migrated a large legacy Rails monolith and its service ecosystem to cloud-native infrastructure (Terraform, Ansible, Kubernetes).</w:t>
+        <w:t xml:space="preserve">(4 yrs): Built a new team from scratch whose product was the platform the entire engineering org built on. Ran it as a service org with internal customers: consulted with teams on their workflows, triaged requests, and turned recurring one-off asks into shared primitives and self-serve tooling so teams could ship without waiting on us. Owned the roadmap while staying hands-on in code, architecture, and review. Migrated a large legacy Rails monolith and its service ecosystem to cloud-native infrastructure (Terraform, Ansible, Kubernetes).</w:t>
       </w:r>
     </w:p>
     <w:p>
@@ -925,14 +686,7 @@
         </w:numPr>
       </w:pPr>
       <w:r>
-        <w:rPr>
-          <w:b/>
-          <w:bCs/>
-        </w:rPr>
-        <w:t xml:space="preserve">Rebuilt the team after mass departures</w:t>
-      </w:r>
-      <w:r>
-        <w:t xml:space="preserve">: inherited a two-person DevOps team with one member two weeks from leaving, and rebuilt hiring, onboarding, documentation, and on-call practice from near zero into a stable team with strong developer relations.</w:t>
+        <w:t xml:space="preserve">Rebuilt the team after mass departures: inherited a two-person DevOps team with one member two weeks from leaving, rebuilt hiring, onboarding, documentation, and on-call practice into a stable team with strong developer relations.</w:t>
       </w:r>
     </w:p>
     <w:p>
@@ -944,17 +698,7 @@
         </w:numPr>
       </w:pPr>
       <w:r>
-        <w:rPr>
-          <w:b/>
-          <w:bCs/>
-        </w:rPr>
-        <w:t xml:space="preserve">BI Data Pipeline</w:t>
-      </w:r>
-      <w:r>
-        <w:t xml:space="preserve"> </w:t>
-      </w:r>
-      <w:r>
-        <w:t xml:space="preserve">(3 months): Led a transition team that took ownership of the analytics pipeline and migrated it to Kubernetes.</w:t>
+        <w:t xml:space="preserve">Led a transition team that took ownership of the BI/analytics pipeline and migrated it to Kubernetes.</w:t>
       </w:r>
     </w:p>
     <w:p>
@@ -1010,14 +754,7 @@
         </w:numPr>
       </w:pPr>
       <w:r>
-        <w:rPr>
-          <w:b/>
-          <w:bCs/>
-        </w:rPr>
-        <w:t xml:space="preserve">Grew multiple junior engineers into senior SWE and Engineering Manager roles</w:t>
-      </w:r>
-      <w:r>
-        <w:t xml:space="preserve">; led interviewing and hiring.</w:t>
+        <w:t xml:space="preserve">Grew multiple junior engineers into senior SWE and Engineering Manager roles; led interviewing and hiring.</w:t>
       </w:r>
       <w:r>
         <w:t xml:space="preserve"> </w:t>
@@ -1087,19 +824,7 @@
         </w:numPr>
       </w:pPr>
       <w:r>
-        <w:t xml:space="preserve">Established the engineering workflow from nothing: pair programming, automated testing, continuous integration, rapid deployment.</w:t>
-      </w:r>
-    </w:p>
-    <w:p>
-      <w:pPr>
-        <w:pStyle w:val="Compact"/>
-        <w:numPr>
-          <w:ilvl w:val="0"/>
-          <w:numId w:val="1007"/>
-        </w:numPr>
-      </w:pPr>
-      <w:r>
-        <w:t xml:space="preserve">Co-led product strategy, monetization, and launch planning.</w:t>
+        <w:t xml:space="preserve">Established the engineering workflow from nothing (pair programming, automated testing, CI, rapid deployment) and co-led product strategy, monetization, and launch planning.</w:t>
       </w:r>
     </w:p>
     <w:bookmarkEnd w:id="36"/>
@@ -1115,73 +840,15 @@
     </w:p>
     <w:p>
       <w:pPr>
-        <w:pStyle w:val="Compact"/>
-        <w:numPr>
-          <w:ilvl w:val="0"/>
-          <w:numId w:val="1008"/>
-        </w:numPr>
-      </w:pPr>
-      <w:r>
-        <w:rPr>
-          <w:b/>
-          <w:bCs/>
-        </w:rPr>
-        <w:t xml:space="preserve">Consultant &amp; Entrepreneur</w:t>
-      </w:r>
-      <w:r>
-        <w:t xml:space="preserve"> </w:t>
-      </w:r>
-      <w:r>
-        <w:t xml:space="preserve">(2008 - 2014): Founded OpenTest Pro (automated testing education). Built an e-commerce ordering system for Turnbull &amp; Asser shirtmakers. Full-stack consulting in Ruby on Rails, Node.js, and D3 data visualization, with rapid prototyping and direct client delivery.</w:t>
-      </w:r>
-    </w:p>
-    <w:p>
-      <w:pPr>
-        <w:pStyle w:val="Compact"/>
-        <w:numPr>
-          <w:ilvl w:val="0"/>
-          <w:numId w:val="1008"/>
-        </w:numPr>
-      </w:pPr>
-      <w:r>
-        <w:rPr>
-          <w:b/>
-          <w:bCs/>
-        </w:rPr>
-        <w:t xml:space="preserve">Web Developer, OnForce, Inc</w:t>
-      </w:r>
-      <w:r>
-        <w:t xml:space="preserve"> </w:t>
-      </w:r>
-      <w:r>
-        <w:t xml:space="preserve">(2006 - 2007): Introduced automated testing and CI. Built a comprehensive API test suite. Integrated the platform with Salesforce APIs.</w:t>
-      </w:r>
-    </w:p>
-    <w:p>
-      <w:pPr>
-        <w:pStyle w:val="Compact"/>
-        <w:numPr>
-          <w:ilvl w:val="0"/>
-          <w:numId w:val="1008"/>
-        </w:numPr>
-      </w:pPr>
-      <w:r>
-        <w:rPr>
-          <w:b/>
-          <w:bCs/>
-        </w:rPr>
-        <w:t xml:space="preserve">Development Lead, JBA Network</w:t>
-      </w:r>
-      <w:r>
-        <w:t xml:space="preserve"> </w:t>
-      </w:r>
-      <w:r>
-        <w:t xml:space="preserve">(2003 - 2006): Lead programmer and project manager for mynewsletterbuilder.com. Architected the initial release, then built and scaled the development team.</w:t>
+        <w:pStyle w:val="FirstParagraph"/>
+      </w:pPr>
+      <w:r>
+        <w:t xml:space="preserve">Full-stack consulting and lead roles in Ruby on Rails, Node.js, and D3 (OpenTest Pro, Turnbull &amp; Asser e-commerce). Introduced automated testing and CI at OnForce. Architected the initial release of mynewsletterbuilder.com and built its dev team at JBA Network.</w:t>
       </w:r>
     </w:p>
     <w:bookmarkEnd w:id="38"/>
     <w:bookmarkEnd w:id="39"/>
-    <w:bookmarkStart w:id="44" w:name="open-source-projects"/>
+    <w:bookmarkStart w:id="42" w:name="open-source-projects"/>
     <w:p>
       <w:pPr>
         <w:pStyle w:val="Heading2"/>
@@ -1190,21 +857,22 @@
         <w:t xml:space="preserve">Open Source Projects</w:t>
       </w:r>
     </w:p>
-    <w:bookmarkStart w:id="41" w:name="scan-mcp-2024---present"/>
-    <w:p>
-      <w:pPr>
-        <w:pStyle w:val="Heading3"/>
-      </w:pPr>
-      <w:r>
-        <w:t xml:space="preserve">Scan MCP (2024 - Present)</w:t>
-      </w:r>
-    </w:p>
     <w:p>
       <w:pPr>
         <w:pStyle w:val="FirstParagraph"/>
       </w:pPr>
       <w:r>
-        <w:t xml:space="preserve">MCP (Model Context Protocol) server that gives AI agents control of document scanners. Privacy-first architecture with smart device discovery, JSON Schema validation, and both local stdio and network HTTP transports.</w:t>
+        <w:rPr>
+          <w:b/>
+          <w:bCs/>
+        </w:rPr>
+        <w:t xml:space="preserve">Scan MCP</w:t>
+      </w:r>
+      <w:r>
+        <w:t xml:space="preserve"> </w:t>
+      </w:r>
+      <w:r>
+        <w:t xml:space="preserve">(2024 - Present): MCP server giving AI agents control of document scanners. Privacy-first architecture, device discovery, JSON Schema validation, stdio and HTTP transports.</w:t>
       </w:r>
       <w:r>
         <w:t xml:space="preserve"> </w:t>
@@ -1216,11 +884,9 @@
         </w:rPr>
         <w:t xml:space="preserve">TypeScript/Node.js.</w:t>
       </w:r>
-    </w:p>
-    <w:p>
-      <w:pPr>
-        <w:pStyle w:val="BodyText"/>
-      </w:pPr>
+      <w:r>
+        <w:t xml:space="preserve"> </w:t>
+      </w:r>
       <w:hyperlink r:id="rId40">
         <w:r>
           <w:rPr>
@@ -1230,22 +896,22 @@
         </w:r>
       </w:hyperlink>
     </w:p>
-    <w:bookmarkEnd w:id="41"/>
-    <w:bookmarkStart w:id="43" w:name="humanebench-2024---present"/>
-    <w:p>
-      <w:pPr>
-        <w:pStyle w:val="Heading3"/>
-      </w:pPr>
-      <w:r>
-        <w:t xml:space="preserve">HumaneBench (2024 - Present)</w:t>
-      </w:r>
-    </w:p>
-    <w:p>
-      <w:pPr>
-        <w:pStyle w:val="FirstParagraph"/>
-      </w:pPr>
-      <w:r>
-        <w:t xml:space="preserve">Open-source LLM evaluation framework built on AISI Inspect. See Building Humane Technology above.</w:t>
+    <w:p>
+      <w:pPr>
+        <w:pStyle w:val="BodyText"/>
+      </w:pPr>
+      <w:r>
+        <w:rPr>
+          <w:b/>
+          <w:bCs/>
+        </w:rPr>
+        <w:t xml:space="preserve">HumaneBench</w:t>
+      </w:r>
+      <w:r>
+        <w:t xml:space="preserve"> </w:t>
+      </w:r>
+      <w:r>
+        <w:t xml:space="preserve">(2024 - Present): Open-source LLM evaluation framework built on AISI Inspect. See Building Humane Technology above.</w:t>
       </w:r>
       <w:r>
         <w:t xml:space="preserve"> </w:t>
@@ -1257,12 +923,10 @@
         </w:rPr>
         <w:t xml:space="preserve">Python.</w:t>
       </w:r>
-    </w:p>
-    <w:p>
-      <w:pPr>
-        <w:pStyle w:val="BodyText"/>
-      </w:pPr>
-      <w:hyperlink r:id="rId42">
+      <w:r>
+        <w:t xml:space="preserve"> </w:t>
+      </w:r>
+      <w:hyperlink r:id="rId41">
         <w:r>
           <w:rPr>
             <w:rStyle w:val="Hyperlink"/>
@@ -1271,325 +935,170 @@
         </w:r>
       </w:hyperlink>
     </w:p>
+    <w:bookmarkEnd w:id="42"/>
+    <w:bookmarkStart w:id="43" w:name="skills"/>
+    <w:p>
+      <w:pPr>
+        <w:pStyle w:val="Heading2"/>
+      </w:pPr>
+      <w:r>
+        <w:t xml:space="preserve">Skills</w:t>
+      </w:r>
+    </w:p>
+    <w:p>
+      <w:pPr>
+        <w:pStyle w:val="Compact"/>
+        <w:numPr>
+          <w:ilvl w:val="0"/>
+          <w:numId w:val="1008"/>
+        </w:numPr>
+      </w:pPr>
+      <w:r>
+        <w:rPr>
+          <w:b/>
+          <w:bCs/>
+        </w:rPr>
+        <w:t xml:space="preserve">Languages &amp; Frameworks</w:t>
+      </w:r>
+      <w:r>
+        <w:t xml:space="preserve">: Python, TypeScript, JavaScript, React, Vue, Node.js, Ruby on Rails, Bash, HTML, CSS, Tailwind.</w:t>
+      </w:r>
+    </w:p>
+    <w:p>
+      <w:pPr>
+        <w:pStyle w:val="Compact"/>
+        <w:numPr>
+          <w:ilvl w:val="0"/>
+          <w:numId w:val="1008"/>
+        </w:numPr>
+      </w:pPr>
+      <w:r>
+        <w:rPr>
+          <w:b/>
+          <w:bCs/>
+        </w:rPr>
+        <w:t xml:space="preserve">Front-end</w:t>
+      </w:r>
+      <w:r>
+        <w:t xml:space="preserve">: responsive design, UI/UX collaboration with designers, Figma handoff.</w:t>
+      </w:r>
+    </w:p>
+    <w:p>
+      <w:pPr>
+        <w:pStyle w:val="Compact"/>
+        <w:numPr>
+          <w:ilvl w:val="0"/>
+          <w:numId w:val="1008"/>
+        </w:numPr>
+      </w:pPr>
+      <w:r>
+        <w:rPr>
+          <w:b/>
+          <w:bCs/>
+        </w:rPr>
+        <w:t xml:space="preserve">Back-end &amp; Data</w:t>
+      </w:r>
+      <w:r>
+        <w:t xml:space="preserve">: API design, microservices, distributed systems, PostgreSQL, MySQL, MongoDB, Redis, Stripe, SSO/auth.</w:t>
+      </w:r>
+    </w:p>
+    <w:p>
+      <w:pPr>
+        <w:pStyle w:val="Compact"/>
+        <w:numPr>
+          <w:ilvl w:val="0"/>
+          <w:numId w:val="1008"/>
+        </w:numPr>
+      </w:pPr>
+      <w:r>
+        <w:rPr>
+          <w:b/>
+          <w:bCs/>
+        </w:rPr>
+        <w:t xml:space="preserve">AI/LLM</w:t>
+      </w:r>
+      <w:r>
+        <w:t xml:space="preserve">: LLM evaluation frameworks (AISI Inspect), MCP servers, chatbot development, prompt engineering, context augmentation, agentic coding workflows.</w:t>
+      </w:r>
+    </w:p>
+    <w:p>
+      <w:pPr>
+        <w:pStyle w:val="Compact"/>
+        <w:numPr>
+          <w:ilvl w:val="0"/>
+          <w:numId w:val="1008"/>
+        </w:numPr>
+      </w:pPr>
+      <w:r>
+        <w:rPr>
+          <w:b/>
+          <w:bCs/>
+        </w:rPr>
+        <w:t xml:space="preserve">Infrastructure &amp; CI/CD</w:t>
+      </w:r>
+      <w:r>
+        <w:t xml:space="preserve">: AWS, GCP, Kubernetes, Docker, Terraform, Pulumi, Ansible, Helm, GitHub Actions, CircleCI, infrastructure as code, automated testing, TDD.</w:t>
+      </w:r>
+    </w:p>
+    <w:p>
+      <w:pPr>
+        <w:pStyle w:val="Compact"/>
+        <w:numPr>
+          <w:ilvl w:val="0"/>
+          <w:numId w:val="1008"/>
+        </w:numPr>
+      </w:pPr>
+      <w:r>
+        <w:rPr>
+          <w:b/>
+          <w:bCs/>
+        </w:rPr>
+        <w:t xml:space="preserve">Product</w:t>
+      </w:r>
+      <w:r>
+        <w:t xml:space="preserve">: Roadmap ownership, product discovery with users, prioritization, scope negotiation, cross-functional collaboration.</w:t>
+      </w:r>
+    </w:p>
     <w:bookmarkEnd w:id="43"/>
+    <w:bookmarkStart w:id="46" w:name="education"/>
+    <w:p>
+      <w:pPr>
+        <w:pStyle w:val="Heading2"/>
+      </w:pPr>
+      <w:r>
+        <w:t xml:space="preserve">Education</w:t>
+      </w:r>
+    </w:p>
+    <w:bookmarkStart w:id="45" w:name="X8aa14d071da44b7f3006e1d49a262db674bce64"/>
+    <w:p>
+      <w:pPr>
+        <w:pStyle w:val="Heading3"/>
+      </w:pPr>
+      <w:r>
+        <w:t xml:space="preserve">BA in Mathematics, minor in Computer Science</w:t>
+      </w:r>
+    </w:p>
+    <w:bookmarkStart w:id="44" w:name="Xe220d86d70cd5bf8ee7040adf9411d63a6235ab"/>
+    <w:p>
+      <w:pPr>
+        <w:pStyle w:val="Heading4"/>
+      </w:pPr>
+      <w:r>
+        <w:t xml:space="preserve">University of North Carolina at Asheville | May 2003</w:t>
+      </w:r>
+    </w:p>
+    <w:p>
+      <w:pPr>
+        <w:pStyle w:val="FirstParagraph"/>
+      </w:pPr>
+      <w:r>
+        <w:t xml:space="preserve">Graduated with distinction in Mathematics. Undergraduate research in 4D fractals.</w:t>
+      </w:r>
+    </w:p>
     <w:bookmarkEnd w:id="44"/>
-    <w:bookmarkStart w:id="45" w:name="skills"/>
-    <w:p>
-      <w:pPr>
-        <w:pStyle w:val="Heading2"/>
-      </w:pPr>
-      <w:r>
-        <w:t xml:space="preserve">Skills</w:t>
-      </w:r>
-    </w:p>
-    <w:p>
-      <w:pPr>
-        <w:pStyle w:val="Compact"/>
-        <w:numPr>
-          <w:ilvl w:val="0"/>
-          <w:numId w:val="1009"/>
-        </w:numPr>
-      </w:pPr>
-      <w:r>
-        <w:rPr>
-          <w:b/>
-          <w:bCs/>
-        </w:rPr>
-        <w:t xml:space="preserve">Core</w:t>
-      </w:r>
-      <w:r>
-        <w:t xml:space="preserve">: Python, TypeScript, JavaScript, React, Node.js, Ruby on Rails, Bash.</w:t>
-      </w:r>
-    </w:p>
-    <w:p>
-      <w:pPr>
-        <w:pStyle w:val="Compact"/>
-        <w:numPr>
-          <w:ilvl w:val="0"/>
-          <w:numId w:val="1009"/>
-        </w:numPr>
-      </w:pPr>
-      <w:r>
-        <w:rPr>
-          <w:b/>
-          <w:bCs/>
-        </w:rPr>
-        <w:t xml:space="preserve">Front-end</w:t>
-      </w:r>
-      <w:r>
-        <w:t xml:space="preserve">: React, Vue, HTML, CSS, Tailwind, responsive design, UI/UX collaboration with designers.</w:t>
-      </w:r>
-    </w:p>
-    <w:p>
-      <w:pPr>
-        <w:pStyle w:val="Compact"/>
-        <w:numPr>
-          <w:ilvl w:val="0"/>
-          <w:numId w:val="1009"/>
-        </w:numPr>
-      </w:pPr>
-      <w:r>
-        <w:rPr>
-          <w:b/>
-          <w:bCs/>
-        </w:rPr>
-        <w:t xml:space="preserve">Back-end &amp; Data</w:t>
-      </w:r>
-      <w:r>
-        <w:t xml:space="preserve">: API design, microservices, distributed systems, PostgreSQL, MySQL, MongoDB, Redis, Stripe, SSO/auth.</w:t>
-      </w:r>
-    </w:p>
-    <w:p>
-      <w:pPr>
-        <w:pStyle w:val="Compact"/>
-        <w:numPr>
-          <w:ilvl w:val="0"/>
-          <w:numId w:val="1009"/>
-        </w:numPr>
-      </w:pPr>
-      <w:r>
-        <w:rPr>
-          <w:b/>
-          <w:bCs/>
-        </w:rPr>
-        <w:t xml:space="preserve">AI/LLM</w:t>
-      </w:r>
-      <w:r>
-        <w:t xml:space="preserve">: LLM evaluation frameworks (AISI Inspect), MCP (Model Context Protocol) servers, chatbot development, prompt engineering, context augmentation, agentic coding workflows.</w:t>
-      </w:r>
-    </w:p>
-    <w:p>
-      <w:pPr>
-        <w:pStyle w:val="Compact"/>
-        <w:numPr>
-          <w:ilvl w:val="0"/>
-          <w:numId w:val="1009"/>
-        </w:numPr>
-      </w:pPr>
-      <w:r>
-        <w:rPr>
-          <w:b/>
-          <w:bCs/>
-        </w:rPr>
-        <w:t xml:space="preserve">Infrastructure</w:t>
-      </w:r>
-      <w:r>
-        <w:t xml:space="preserve">: AWS, Google Cloud Platform, Kubernetes, Docker, Terraform, Pulumi, Ansible, Helm.</w:t>
-      </w:r>
-    </w:p>
-    <w:p>
-      <w:pPr>
-        <w:pStyle w:val="Compact"/>
-        <w:numPr>
-          <w:ilvl w:val="0"/>
-          <w:numId w:val="1009"/>
-        </w:numPr>
-      </w:pPr>
-      <w:r>
-        <w:rPr>
-          <w:b/>
-          <w:bCs/>
-        </w:rPr>
-        <w:t xml:space="preserve">CI/CD &amp; Practice</w:t>
-      </w:r>
-      <w:r>
-        <w:t xml:space="preserve">: GitHub Actions, CircleCI, automated testing, TDD, infrastructure as code, rapid prototyping.</w:t>
-      </w:r>
-    </w:p>
-    <w:p>
-      <w:pPr>
-        <w:pStyle w:val="Compact"/>
-        <w:numPr>
-          <w:ilvl w:val="0"/>
-          <w:numId w:val="1009"/>
-        </w:numPr>
-      </w:pPr>
-      <w:r>
-        <w:rPr>
-          <w:b/>
-          <w:bCs/>
-        </w:rPr>
-        <w:t xml:space="preserve">Product</w:t>
-      </w:r>
-      <w:r>
-        <w:t xml:space="preserve">: Roadmap ownership, product discovery with users, prioritization, scope negotiation, cross-functional collaboration with design and business stakeholders.</w:t>
-      </w:r>
-    </w:p>
     <w:bookmarkEnd w:id="45"/>
-    <w:bookmarkStart w:id="48" w:name="education"/>
-    <w:p>
-      <w:pPr>
-        <w:pStyle w:val="Heading2"/>
-      </w:pPr>
-      <w:r>
-        <w:t xml:space="preserve">Education</w:t>
-      </w:r>
-    </w:p>
-    <w:bookmarkStart w:id="47" w:name="X8aa14d071da44b7f3006e1d49a262db674bce64"/>
-    <w:p>
-      <w:pPr>
-        <w:pStyle w:val="Heading3"/>
-      </w:pPr>
-      <w:r>
-        <w:t xml:space="preserve">BA in Mathematics, minor in Computer Science</w:t>
-      </w:r>
-    </w:p>
-    <w:bookmarkStart w:id="46" w:name="Xe220d86d70cd5bf8ee7040adf9411d63a6235ab"/>
-    <w:p>
-      <w:pPr>
-        <w:pStyle w:val="Heading4"/>
-      </w:pPr>
-      <w:r>
-        <w:t xml:space="preserve">University of North Carolina at Asheville | May 2003</w:t>
-      </w:r>
-    </w:p>
-    <w:p>
-      <w:pPr>
-        <w:pStyle w:val="Compact"/>
-        <w:numPr>
-          <w:ilvl w:val="0"/>
-          <w:numId w:val="1010"/>
-        </w:numPr>
-      </w:pPr>
-      <w:r>
-        <w:t xml:space="preserve">Graduated with distinction in Mathematics. Undergraduate research in 4D fractals.</w:t>
-      </w:r>
-    </w:p>
     <w:bookmarkEnd w:id="46"/>
     <w:bookmarkEnd w:id="47"/>
-    <w:bookmarkEnd w:id="48"/>
-    <w:bookmarkStart w:id="49" w:name="recommendations"/>
-    <w:p>
-      <w:pPr>
-        <w:pStyle w:val="Heading2"/>
-      </w:pPr>
-      <w:r>
-        <w:t xml:space="preserve">Recommendations</w:t>
-      </w:r>
-    </w:p>
-    <w:p>
-      <w:pPr>
-        <w:pStyle w:val="FirstParagraph"/>
-      </w:pPr>
-      <w:r>
-        <w:t xml:space="preserve">“With Jack,</w:t>
-      </w:r>
-      <w:r>
-        <w:t xml:space="preserve"> </w:t>
-      </w:r>
-      <w:r>
-        <w:rPr>
-          <w:b/>
-          <w:bCs/>
-        </w:rPr>
-        <w:t xml:space="preserve">the more complex the problem, the more simple his solutions</w:t>
-      </w:r>
-      <w:r>
-        <w:t xml:space="preserve">. From eradicating dynamic php bugs to providing innovative javascript capabilities, Master Senechal is more than a mind to be reckoned with, he’s an</w:t>
-      </w:r>
-      <w:r>
-        <w:t xml:space="preserve"> </w:t>
-      </w:r>
-      <w:r>
-        <w:rPr>
-          <w:b/>
-          <w:bCs/>
-        </w:rPr>
-        <w:t xml:space="preserve">integrative capacity builder</w:t>
-      </w:r>
-      <w:r>
-        <w:t xml:space="preserve"> </w:t>
-      </w:r>
-      <w:r>
-        <w:t xml:space="preserve">with a wide range of technological expertise.</w:t>
-      </w:r>
-      <w:r>
-        <w:t xml:space="preserve"> </w:t>
-      </w:r>
-      <w:r>
-        <w:rPr>
-          <w:b/>
-          <w:bCs/>
-        </w:rPr>
-        <w:t xml:space="preserve">If there is anything that can be done through web development, Jack can figure out how to do it, and make it happen.</w:t>
-      </w:r>
-      <w:r>
-        <w:t xml:space="preserve">”</w:t>
-      </w:r>
-    </w:p>
-    <w:p>
-      <w:pPr>
-        <w:pStyle w:val="BodyText"/>
-      </w:pPr>
-      <w:r>
-        <w:rPr>
-          <w:i/>
-          <w:iCs/>
-        </w:rPr>
-        <w:t xml:space="preserve">— Adam Apollo, Cofounder &amp; CEO, Superluminal Systems</w:t>
-      </w:r>
-    </w:p>
-    <w:p>
-      <w:pPr>
-        <w:pStyle w:val="BodyText"/>
-      </w:pPr>
-      <w:r>
-        <w:t xml:space="preserve">“Jack has a flair for</w:t>
-      </w:r>
-      <w:r>
-        <w:t xml:space="preserve"> </w:t>
-      </w:r>
-      <w:r>
-        <w:rPr>
-          <w:b/>
-          <w:bCs/>
-        </w:rPr>
-        <w:t xml:space="preserve">finding better, faster, and more reliable ways to get things done</w:t>
-      </w:r>
-      <w:r>
-        <w:t xml:space="preserve">. He advocates best practices, like unit testing, and has a deep knowledge of OO architecture.</w:t>
-      </w:r>
-      <w:r>
-        <w:t xml:space="preserve"> </w:t>
-      </w:r>
-      <w:r>
-        <w:rPr>
-          <w:b/>
-          <w:bCs/>
-        </w:rPr>
-        <w:t xml:space="preserve">Jack thinks on his toes</w:t>
-      </w:r>
-      <w:r>
-        <w:t xml:space="preserve">, and will always be there with the team at 4 a.m. if circumstance requires it.”</w:t>
-      </w:r>
-    </w:p>
-    <w:p>
-      <w:pPr>
-        <w:pStyle w:val="BodyText"/>
-      </w:pPr>
-      <w:r>
-        <w:rPr>
-          <w:i/>
-          <w:iCs/>
-        </w:rPr>
-        <w:t xml:space="preserve">— Greg Whitescarver, Founder, Mojave</w:t>
-      </w:r>
-    </w:p>
-    <w:p>
-      <w:pPr>
-        <w:pStyle w:val="BodyText"/>
-      </w:pPr>
-      <w:hyperlink r:id="rId22">
-        <w:r>
-          <w:rPr>
-            <w:rStyle w:val="Hyperlink"/>
-          </w:rPr>
-          <w:t xml:space="preserve">See additional recommendations on LinkedIn</w:t>
-        </w:r>
-      </w:hyperlink>
-    </w:p>
-    <w:bookmarkEnd w:id="49"/>
-    <w:bookmarkEnd w:id="50"/>
     <w:sectPr>
       <w:footnotePr>
         <w:numRestart w:val="eachSect"/>
@@ -1828,12 +1337,6 @@
     <w:abstractNumId w:val="991"/>
   </w:num>
   <w:num w:numId="1008">
-    <w:abstractNumId w:val="991"/>
-  </w:num>
-  <w:num w:numId="1009">
-    <w:abstractNumId w:val="991"/>
-  </w:num>
-  <w:num w:numId="1010">
     <w:abstractNumId w:val="991"/>
   </w:num>
 </w:numbering>

</xml_diff>

<commit_message>
Split product ownership and approach-matching into separate bullets
Co-Authored-By: Claude Opus 5 <noreply@anthropic.com>
Claude-Session: https://claude.ai/code/session_01AFn2A9u39qvLMpvLN59SSo
</commit_message>
<xml_diff>
--- a/resume.docx
+++ b/resume.docx
@@ -348,7 +348,33 @@
         </w:numPr>
       </w:pPr>
       <w:r>
-        <w:t xml:space="preserve">Defines and prioritizes work, verifies against deployed previews on behalf of a non-technical user base. A prototype is far faster driving an agent directly; the factory earns its keep on production systems, which is where the industry is converging.</w:t>
+        <w:rPr>
+          <w:b/>
+          <w:bCs/>
+        </w:rPr>
+        <w:t xml:space="preserve">Product ownership</w:t>
+      </w:r>
+      <w:r>
+        <w:t xml:space="preserve">: defining and prioritizing the work, and verifying against deployed previews on behalf of a non-technical user base.</w:t>
+      </w:r>
+    </w:p>
+    <w:p>
+      <w:pPr>
+        <w:pStyle w:val="Compact"/>
+        <w:numPr>
+          <w:ilvl w:val="0"/>
+          <w:numId w:val="1002"/>
+        </w:numPr>
+      </w:pPr>
+      <w:r>
+        <w:rPr>
+          <w:b/>
+          <w:bCs/>
+        </w:rPr>
+        <w:t xml:space="preserve">Matching approach to the work</w:t>
+      </w:r>
+      <w:r>
+        <w:t xml:space="preserve">: a prototype is far faster driving an agent directly; the factory earns its keep on production systems, where the industry is converging.</w:t>
       </w:r>
     </w:p>
     <w:bookmarkEnd w:id="25"/>

</xml_diff>

<commit_message>
Fold rapid prototyping and requirements gathering into product ownership
Co-Authored-By: Claude Opus 5 <noreply@anthropic.com>
Claude-Session: https://claude.ai/code/session_01AFn2A9u39qvLMpvLN59SSo
</commit_message>
<xml_diff>
--- a/resume.docx
+++ b/resume.docx
@@ -355,26 +355,7 @@
         <w:t xml:space="preserve">Product ownership</w:t>
       </w:r>
       <w:r>
-        <w:t xml:space="preserve">: defining and prioritizing the work, and verifying against deployed previews on behalf of a non-technical user base.</w:t>
-      </w:r>
-    </w:p>
-    <w:p>
-      <w:pPr>
-        <w:pStyle w:val="Compact"/>
-        <w:numPr>
-          <w:ilvl w:val="0"/>
-          <w:numId w:val="1002"/>
-        </w:numPr>
-      </w:pPr>
-      <w:r>
-        <w:rPr>
-          <w:b/>
-          <w:bCs/>
-        </w:rPr>
-        <w:t xml:space="preserve">Matching approach to the work</w:t>
-      </w:r>
-      <w:r>
-        <w:t xml:space="preserve">: a prototype is far faster driving an agent directly; the factory earns its keep on production systems, where the industry is converging.</w:t>
+        <w:t xml:space="preserve">: rapid prototyping, requirements gathering, defining and prioritizing the work, and verifying output against deployed previews on behalf of a non-technical user base.</w:t>
       </w:r>
     </w:p>
     <w:bookmarkEnd w:id="25"/>

</xml_diff>

<commit_message>
Refresh summary: lead with AI-native delivery, cut filler and objective statement
Co-Authored-By: Claude Opus 5 <noreply@anthropic.com>
Claude-Session: https://claude.ai/code/session_01AFn2A9u39qvLMpvLN59SSo
</commit_message>
<xml_diff>
--- a/resume.docx
+++ b/resume.docx
@@ -101,6 +101,14 @@
     </w:p>
     <w:p>
       <w:pPr>
+        <w:pStyle w:val="FirstParagraph"/>
+      </w:pPr>
+      <w:r>
+        <w:t xml:space="preserve">AI tooling and platform engineer building the infrastructure that lets engineering teams, human and agentic, ship faster without breaking things.</w:t>
+      </w:r>
+    </w:p>
+    <w:p>
+      <w:pPr>
         <w:pStyle w:val="Compact"/>
         <w:numPr>
           <w:ilvl w:val="0"/>
@@ -112,13 +120,10 @@
           <w:b/>
           <w:bCs/>
         </w:rPr>
-        <w:t xml:space="preserve">Principal-level engineer</w:t>
-      </w:r>
-      <w:r>
-        <w:t xml:space="preserve"> </w:t>
-      </w:r>
-      <w:r>
-        <w:t xml:space="preserve">specializing in AI-powered developer tooling, platform modernization, and large-scale engineering productivity</w:t>
+        <w:t xml:space="preserve">Software factory architect</w:t>
+      </w:r>
+      <w:r>
+        <w:t xml:space="preserve">: designs and operates agent-driven delivery pipelines that carry work from spec to shipped, encoding the same DevOps and project-management discipline that makes any team actually work.</w:t>
       </w:r>
     </w:p>
     <w:p>
@@ -134,26 +139,10 @@
           <w:b/>
           <w:bCs/>
         </w:rPr>
-        <w:t xml:space="preserve">Strong record building and shipping software</w:t>
-      </w:r>
-      <w:r>
-        <w:t xml:space="preserve">, with</w:t>
-      </w:r>
-      <w:r>
-        <w:t xml:space="preserve"> </w:t>
-      </w:r>
-      <w:r>
-        <w:rPr>
-          <w:b/>
-          <w:bCs/>
-        </w:rPr>
-        <w:t xml:space="preserve">6+ years leading teams</w:t>
-      </w:r>
-      <w:r>
-        <w:t xml:space="preserve"> </w:t>
-      </w:r>
-      <w:r>
-        <w:t xml:space="preserve">across multiple product domains</w:t>
+        <w:t xml:space="preserve">Harness-enforced SDLC</w:t>
+      </w:r>
+      <w:r>
+        <w:t xml:space="preserve">: independent fresh-context review, green CI, supply-chain scanning, and deployment smoke checks, so speed does not trade off against fragility.</w:t>
       </w:r>
     </w:p>
     <w:p>
@@ -165,7 +154,30 @@
         </w:numPr>
       </w:pPr>
       <w:r>
-        <w:t xml:space="preserve">Full-stack generalist with deep experience applying AI/LLMs, DevOps, and cloud-native systems to accelerate software delivery</w:t>
+        <w:rPr>
+          <w:b/>
+          <w:bCs/>
+        </w:rPr>
+        <w:t xml:space="preserve">AI/LLM hands-on</w:t>
+      </w:r>
+      <w:r>
+        <w:t xml:space="preserve">: originated an open-source LLM evaluation framework built on AISI Inspect, ships MCP servers, and built a</w:t>
+      </w:r>
+      <w:r>
+        <w:t xml:space="preserve"> </w:t>
+      </w:r>
+      <w:r>
+        <w:rPr>
+          <w:b/>
+          <w:bCs/>
+        </w:rPr>
+        <w:t xml:space="preserve">sub-100ms</w:t>
+      </w:r>
+      <w:r>
+        <w:t xml:space="preserve"> </w:t>
+      </w:r>
+      <w:r>
+        <w:t xml:space="preserve">real-time evaluation classifier.</w:t>
       </w:r>
     </w:p>
     <w:p>
@@ -177,23 +189,14 @@
         </w:numPr>
       </w:pPr>
       <w:r>
-        <w:t xml:space="preserve">Committed</w:t>
-      </w:r>
-      <w:r>
-        <w:t xml:space="preserve"> </w:t>
-      </w:r>
-      <w:r>
-        <w:rPr>
-          <w:b/>
-          <w:bCs/>
-        </w:rPr>
-        <w:t xml:space="preserve">mentor and coach</w:t>
-      </w:r>
-      <w:r>
-        <w:t xml:space="preserve"> </w:t>
-      </w:r>
-      <w:r>
-        <w:t xml:space="preserve">who elevated junior engineers to senior technical and engineering management positions</w:t>
+        <w:rPr>
+          <w:b/>
+          <w:bCs/>
+        </w:rPr>
+        <w:t xml:space="preserve">Platform builder</w:t>
+      </w:r>
+      <w:r>
+        <w:t xml:space="preserve">: turns recurring one-off requests into shared primitives and self-serve tooling other engineers build on.</w:t>
       </w:r>
     </w:p>
     <w:p>
@@ -205,35 +208,14 @@
         </w:numPr>
       </w:pPr>
       <w:r>
-        <w:t xml:space="preserve">Strong customer focus,</w:t>
-      </w:r>
-      <w:r>
-        <w:t xml:space="preserve"> </w:t>
-      </w:r>
-      <w:r>
-        <w:rPr>
-          <w:b/>
-          <w:bCs/>
-        </w:rPr>
-        <w:t xml:space="preserve">advocating for impactful changes</w:t>
-      </w:r>
-      <w:r>
-        <w:t xml:space="preserve"> </w:t>
-      </w:r>
-      <w:r>
-        <w:t xml:space="preserve">and ensuring product value</w:t>
-      </w:r>
-    </w:p>
-    <w:p>
-      <w:pPr>
-        <w:pStyle w:val="Compact"/>
-        <w:numPr>
-          <w:ilvl w:val="0"/>
-          <w:numId w:val="1001"/>
-        </w:numPr>
-      </w:pPr>
-      <w:r>
-        <w:t xml:space="preserve">Entrepreneurial spirit with multiple co-founding experiences</w:t>
+        <w:rPr>
+          <w:b/>
+          <w:bCs/>
+        </w:rPr>
+        <w:t xml:space="preserve">Full-stack foundation</w:t>
+      </w:r>
+      <w:r>
+        <w:t xml:space="preserve">: Python, TypeScript, Node.js, and cloud-native infrastructure, applied to developer productivity rather than product features alone.</w:t>
       </w:r>
     </w:p>
     <w:bookmarkEnd w:id="24"/>

</xml_diff>

<commit_message>
Sync factual claims from main: M-Bridge error-rate wording, drop unverified "tool use" claim
- M-Bridge bullet said "reduced errors and incidents by ~100x"; main states the
  measured improvement was error RATES, not incidents. Corrected to match.
- Skills line claimed "tool use" as an AI/LLM skill; per facts.md guardrail,
  Alchemy Astrology's chatbot (Jack's only LLM-app work) has no tool use, and
  main's Skills section does not claim it. Removed.
</commit_message>
<xml_diff>
--- a/resume.docx
+++ b/resume.docx
@@ -2,7 +2,7 @@
 <file path=word/document.xml><?xml version="1.0" encoding="utf-8"?>
 <w:document xmlns:w="http://schemas.openxmlformats.org/wordprocessingml/2006/main" xmlns:m="http://schemas.openxmlformats.org/officeDocument/2006/math" xmlns:r="http://schemas.openxmlformats.org/officeDocument/2006/relationships" xmlns:o="urn:schemas-microsoft-com:office:office" xmlns:v="urn:schemas-microsoft-com:vml" xmlns:w10="urn:schemas-microsoft-com:office:word" xmlns:a="http://schemas.openxmlformats.org/drawingml/2006/main" xmlns:pic="http://schemas.openxmlformats.org/drawingml/2006/picture" xmlns:wp="http://schemas.openxmlformats.org/drawingml/2006/wordprocessingDrawing">
   <w:body>
-    <w:bookmarkStart w:id="50" w:name="jack-senechal"/>
+    <w:bookmarkStart w:id="39" w:name="jack-senechal"/>
     <w:p>
       <w:pPr>
         <w:pStyle w:val="Heading1"/>
@@ -11,7 +11,7 @@
         <w:t xml:space="preserve">Jack Senechal</w:t>
       </w:r>
     </w:p>
-    <w:bookmarkStart w:id="23" w:name="ai-tooling-platform-engineer"/>
+    <w:bookmarkStart w:id="12" w:name="ai-tooling-platform-engineer"/>
     <w:p>
       <w:pPr>
         <w:pStyle w:val="Heading2"/>
@@ -46,7 +46,7 @@
       <w:r>
         <w:t xml:space="preserve"> </w:t>
       </w:r>
-      <w:hyperlink r:id="rId20">
+      <w:hyperlink r:id="rId9">
         <w:r>
           <w:rPr>
             <w:rStyle w:val="Hyperlink"/>
@@ -63,7 +63,7 @@
       <w:r>
         <w:t xml:space="preserve"> </w:t>
       </w:r>
-      <w:hyperlink r:id="rId21">
+      <w:hyperlink r:id="rId10">
         <w:r>
           <w:rPr>
             <w:rStyle w:val="Hyperlink"/>
@@ -80,7 +80,7 @@
       <w:r>
         <w:t xml:space="preserve"> </w:t>
       </w:r>
-      <w:hyperlink r:id="rId22">
+      <w:hyperlink r:id="rId11">
         <w:r>
           <w:rPr>
             <w:rStyle w:val="Hyperlink"/>
@@ -89,8 +89,8 @@
         </w:r>
       </w:hyperlink>
     </w:p>
-    <w:bookmarkEnd w:id="23"/>
-    <w:bookmarkStart w:id="24" w:name="summary"/>
+    <w:bookmarkEnd w:id="12"/>
+    <w:bookmarkStart w:id="13" w:name="summary"/>
     <w:p>
       <w:pPr>
         <w:pStyle w:val="Heading2"/>
@@ -218,8 +218,8 @@
         <w:t xml:space="preserve">: Python, TypeScript, Node.js, and cloud-native infrastructure, applied to developer productivity rather than product features alone.</w:t>
       </w:r>
     </w:p>
-    <w:bookmarkEnd w:id="24"/>
-    <w:bookmarkStart w:id="39" w:name="industry-experience"/>
+    <w:bookmarkEnd w:id="13"/>
+    <w:bookmarkStart w:id="28" w:name="industry-experience"/>
     <w:p>
       <w:pPr>
         <w:pStyle w:val="Heading2"/>
@@ -228,7 +228,7 @@
         <w:t xml:space="preserve">Industry Experience</w:t>
       </w:r>
     </w:p>
-    <w:bookmarkStart w:id="26" w:name="Xee601f6099503a9e48b26ce62b1cbc6360c8cfa"/>
+    <w:bookmarkStart w:id="15" w:name="Xee601f6099503a9e48b26ce62b1cbc6360c8cfa"/>
     <w:p>
       <w:pPr>
         <w:pStyle w:val="Heading3"/>
@@ -237,7 +237,7 @@
         <w:t xml:space="preserve">Independent Consultant · AI-Native Software Delivery</w:t>
       </w:r>
     </w:p>
-    <w:bookmarkStart w:id="25" w:name="X5dd5559b1eea39500dfd9b3a47cf87c432af37e"/>
+    <w:bookmarkStart w:id="14" w:name="X5dd5559b1eea39500dfd9b3a47cf87c432af37e"/>
     <w:p>
       <w:pPr>
         <w:pStyle w:val="Heading4"/>
@@ -381,9 +381,9 @@
         <w:t xml:space="preserve">: defining and prioritizing work, verifying against deployed previews, steering product and process.</w:t>
       </w:r>
     </w:p>
-    <w:bookmarkEnd w:id="25"/>
-    <w:bookmarkEnd w:id="26"/>
-    <w:bookmarkStart w:id="29" w:name="co-founder-fractional-cto"/>
+    <w:bookmarkEnd w:id="14"/>
+    <w:bookmarkEnd w:id="15"/>
+    <w:bookmarkStart w:id="18" w:name="co-founder-fractional-cto"/>
     <w:p>
       <w:pPr>
         <w:pStyle w:val="Heading3"/>
@@ -392,7 +392,7 @@
         <w:t xml:space="preserve">Co-founder &amp; Fractional CTO</w:t>
       </w:r>
     </w:p>
-    <w:bookmarkStart w:id="28" w:name="X6d4a3e04cb0dd24aa8d860fb342aaa5143cfa7e"/>
+    <w:bookmarkStart w:id="17" w:name="X6d4a3e04cb0dd24aa8d860fb342aaa5143cfa7e"/>
     <w:p>
       <w:pPr>
         <w:pStyle w:val="Heading4"/>
@@ -423,7 +423,7 @@
         </w:rPr>
         <w:t xml:space="preserve"> </w:t>
       </w:r>
-      <w:hyperlink r:id="rId27">
+      <w:hyperlink r:id="rId16">
         <w:r>
           <w:rPr>
             <w:rStyle w:val="Hyperlink"/>
@@ -582,410 +582,410 @@
         <w:t xml:space="preserve">: production monitoring, multi-turn evaluation, and adoption maturity models.</w:t>
       </w:r>
     </w:p>
+    <w:bookmarkEnd w:id="17"/>
+    <w:bookmarkEnd w:id="18"/>
+    <w:bookmarkStart w:id="20" w:name="co-founder-software-engineer"/>
+    <w:p>
+      <w:pPr>
+        <w:pStyle w:val="Heading3"/>
+      </w:pPr>
+      <w:r>
+        <w:t xml:space="preserve">Co-founder &amp; Software Engineer</w:t>
+      </w:r>
+    </w:p>
+    <w:bookmarkStart w:id="19" w:name="Xabfc89ad0ecf455a67a7dad8c9e074f0d6e313c"/>
+    <w:p>
+      <w:pPr>
+        <w:pStyle w:val="Heading4"/>
+      </w:pPr>
+      <w:r>
+        <w:t xml:space="preserve">Alchemy Astrology (formerly Mirror Astrology) | Nov 2024 - Jul 2026 | Remote</w:t>
+      </w:r>
+    </w:p>
+    <w:p>
+      <w:pPr>
+        <w:pStyle w:val="Compact"/>
+        <w:numPr>
+          <w:ilvl w:val="0"/>
+          <w:numId w:val="1004"/>
+        </w:numPr>
+      </w:pPr>
+      <w:r>
+        <w:t xml:space="preserve">Owned front-end development: Ruby on Rails views, JavaScript, HTML+CSS, Tailwind, responsive UI/UX.</w:t>
+      </w:r>
+    </w:p>
+    <w:p>
+      <w:pPr>
+        <w:pStyle w:val="Compact"/>
+        <w:numPr>
+          <w:ilvl w:val="0"/>
+          <w:numId w:val="1004"/>
+        </w:numPr>
+      </w:pPr>
+      <w:r>
+        <w:t xml:space="preserve">Led design and UX delivery, working with freelance designers and translating their designs into the Rails framework.</w:t>
+      </w:r>
+    </w:p>
+    <w:p>
+      <w:pPr>
+        <w:pStyle w:val="Compact"/>
+        <w:numPr>
+          <w:ilvl w:val="0"/>
+          <w:numId w:val="1004"/>
+        </w:numPr>
+      </w:pPr>
+      <w:r>
+        <w:t xml:space="preserve">Collaborated on back-end development: Stripe integration, SSO authentication, Rails MVC.</w:t>
+      </w:r>
+    </w:p>
+    <w:p>
+      <w:pPr>
+        <w:pStyle w:val="Compact"/>
+        <w:numPr>
+          <w:ilvl w:val="0"/>
+          <w:numId w:val="1004"/>
+        </w:numPr>
+      </w:pPr>
+      <w:r>
+        <w:t xml:space="preserve">Collaborated closely with co-founders on product direction, Figma design, UX, roadmap planning, and prioritization.</w:t>
+      </w:r>
+    </w:p>
+    <w:bookmarkEnd w:id="19"/>
+    <w:bookmarkEnd w:id="20"/>
+    <w:bookmarkStart w:id="22" w:name="infrastructure-engineer"/>
+    <w:p>
+      <w:pPr>
+        <w:pStyle w:val="Heading3"/>
+      </w:pPr>
+      <w:r>
+        <w:t xml:space="preserve">Infrastructure Engineer</w:t>
+      </w:r>
+    </w:p>
+    <w:bookmarkStart w:id="21" w:name="tobiko-mar-2024---oct-2024-remote"/>
+    <w:p>
+      <w:pPr>
+        <w:pStyle w:val="Heading4"/>
+      </w:pPr>
+      <w:r>
+        <w:t xml:space="preserve">Tobiko | Mar 2024 - Oct 2024 | Remote</w:t>
+      </w:r>
+    </w:p>
+    <w:p>
+      <w:pPr>
+        <w:pStyle w:val="Compact"/>
+        <w:numPr>
+          <w:ilvl w:val="0"/>
+          <w:numId w:val="1005"/>
+        </w:numPr>
+      </w:pPr>
+      <w:r>
+        <w:t xml:space="preserve">Architected and implemented a scalable cloud platform serving customer workloads at a fast-paced startup.</w:t>
+      </w:r>
+    </w:p>
+    <w:p>
+      <w:pPr>
+        <w:pStyle w:val="Compact"/>
+        <w:numPr>
+          <w:ilvl w:val="0"/>
+          <w:numId w:val="1005"/>
+        </w:numPr>
+      </w:pPr>
+      <w:r>
+        <w:t xml:space="preserve">Built CI/CD patterns including mono-repo conditional workflows, workload identity federation, and continuous delivery.</w:t>
+      </w:r>
+    </w:p>
+    <w:p>
+      <w:pPr>
+        <w:pStyle w:val="Compact"/>
+        <w:numPr>
+          <w:ilvl w:val="0"/>
+          <w:numId w:val="1005"/>
+        </w:numPr>
+      </w:pPr>
+      <w:r>
+        <w:t xml:space="preserve">Implemented a Slack-based customer support and incident response platform; onboarded teammates and customers.</w:t>
+      </w:r>
+    </w:p>
+    <w:p>
+      <w:pPr>
+        <w:pStyle w:val="Compact"/>
+        <w:numPr>
+          <w:ilvl w:val="0"/>
+          <w:numId w:val="1005"/>
+        </w:numPr>
+      </w:pPr>
+      <w:r>
+        <w:t xml:space="preserve">Python, Pulumi, GCP, GKE, Cloud Run, CircleCI, Helm, SQLMesh.</w:t>
+      </w:r>
+    </w:p>
+    <w:bookmarkEnd w:id="21"/>
+    <w:bookmarkEnd w:id="22"/>
+    <w:bookmarkStart w:id="24" w:name="X7a2c313efdde198d901363c762c81839771c845"/>
+    <w:p>
+      <w:pPr>
+        <w:pStyle w:val="Heading3"/>
+      </w:pPr>
+      <w:r>
+        <w:t xml:space="preserve">Engineering Manager / Principal Software Engineer</w:t>
+      </w:r>
+    </w:p>
+    <w:bookmarkStart w:id="23" w:name="X47289269eb944414c9285d314973b45c253bcef"/>
+    <w:p>
+      <w:pPr>
+        <w:pStyle w:val="Heading4"/>
+      </w:pPr>
+      <w:r>
+        <w:t xml:space="preserve">Mavenlink / Kantata | Apr 2017 - Dec 2023 | San Francisco, CA</w:t>
+      </w:r>
+    </w:p>
+    <w:p>
+      <w:pPr>
+        <w:pStyle w:val="Compact"/>
+        <w:numPr>
+          <w:ilvl w:val="0"/>
+          <w:numId w:val="1006"/>
+        </w:numPr>
+      </w:pPr>
+      <w:r>
+        <w:rPr>
+          <w:b/>
+          <w:bCs/>
+        </w:rPr>
+        <w:t xml:space="preserve">M-Bridge Integration Platform</w:t>
+      </w:r>
+      <w:r>
+        <w:t xml:space="preserve"> </w:t>
+      </w:r>
+      <w:r>
+        <w:t xml:space="preserve">(2 years): Led a team to stabilize and scale an agent-based integration platform handling multi-system data orchestration. Established operational metrics and monitoring that cut error rates roughly 100x. Executed a zero-downtime migration to Kubernetes including relational, document, and cache databases.</w:t>
+      </w:r>
+    </w:p>
+    <w:p>
+      <w:pPr>
+        <w:pStyle w:val="Compact"/>
+        <w:numPr>
+          <w:ilvl w:val="0"/>
+          <w:numId w:val="1006"/>
+        </w:numPr>
+      </w:pPr>
+      <w:r>
+        <w:rPr>
+          <w:b/>
+          <w:bCs/>
+        </w:rPr>
+        <w:t xml:space="preserve">Infrastructure Platform</w:t>
+      </w:r>
+      <w:r>
+        <w:t xml:space="preserve"> </w:t>
+      </w:r>
+      <w:r>
+        <w:t xml:space="preserve">(4 years): Recruited and built a new team from scratch dedicated to the infrastructure platform. Led the organization’s DevOps culture transformation, serving as a change agent and technical authority across engineering. Owned roadmap stewardship, requirements triage, and priority management while staying hands-on with coding, architecture, and code review. Transitioned a large legacy codebase to cloud-native, Infrastructure-as-Code tooling (Terraform, Ansible, Kubernetes).</w:t>
+      </w:r>
+    </w:p>
+    <w:p>
+      <w:pPr>
+        <w:pStyle w:val="Compact"/>
+        <w:numPr>
+          <w:ilvl w:val="0"/>
+          <w:numId w:val="1006"/>
+        </w:numPr>
+      </w:pPr>
+      <w:r>
+        <w:rPr>
+          <w:b/>
+          <w:bCs/>
+        </w:rPr>
+        <w:t xml:space="preserve">BI Data Pipeline</w:t>
+      </w:r>
+      <w:r>
+        <w:t xml:space="preserve"> </w:t>
+      </w:r>
+      <w:r>
+        <w:t xml:space="preserve">(3 months): Led a transition team to take ownership of and improve the analytics data pipeline. Migrated the pipeline to Kubernetes.</w:t>
+      </w:r>
+    </w:p>
+    <w:p>
+      <w:pPr>
+        <w:pStyle w:val="Compact"/>
+        <w:numPr>
+          <w:ilvl w:val="0"/>
+          <w:numId w:val="1006"/>
+        </w:numPr>
+      </w:pPr>
+      <w:r>
+        <w:rPr>
+          <w:b/>
+          <w:bCs/>
+        </w:rPr>
+        <w:t xml:space="preserve">Cross-Functional Impact</w:t>
+      </w:r>
+      <w:r>
+        <w:t xml:space="preserve">: Grew multiple junior engineers into senior SWE and Engineering Manager roles, and mentored engineers across teams. Led interviewing and hiring. Drove organizational change management and process optimization.</w:t>
+      </w:r>
+      <w:r>
+        <w:t xml:space="preserve"> </w:t>
+      </w:r>
+      <w:r>
+        <w:rPr>
+          <w:b/>
+          <w:bCs/>
+        </w:rPr>
+        <w:t xml:space="preserve">Top Performer Award, 2021</w:t>
+      </w:r>
+      <w:r>
+        <w:t xml:space="preserve">.</w:t>
+      </w:r>
+    </w:p>
+    <w:bookmarkEnd w:id="23"/>
+    <w:bookmarkEnd w:id="24"/>
+    <w:bookmarkStart w:id="26" w:name="lead-developer-co-founder"/>
+    <w:p>
+      <w:pPr>
+        <w:pStyle w:val="Heading3"/>
+      </w:pPr>
+      <w:r>
+        <w:t xml:space="preserve">Lead Developer, Co-founder</w:t>
+      </w:r>
+    </w:p>
+    <w:bookmarkStart w:id="25" w:name="pegg-2014---2017-san-francisco-ca"/>
+    <w:p>
+      <w:pPr>
+        <w:pStyle w:val="Heading4"/>
+      </w:pPr>
+      <w:r>
+        <w:t xml:space="preserve">Pegg | 2014 - 2017 | San Francisco, CA</w:t>
+      </w:r>
+    </w:p>
+    <w:p>
+      <w:pPr>
+        <w:pStyle w:val="Compact"/>
+        <w:numPr>
+          <w:ilvl w:val="0"/>
+          <w:numId w:val="1007"/>
+        </w:numPr>
+      </w:pPr>
+      <w:r>
+        <w:t xml:space="preserve">Designed, architected, and built a cross-platform mobile app from scratch (iOS/Android). Node.js backend, JS/Phonegap frontend, Firebase real-time systems, CI/CD to AWS/CloudFront via CircleCI.</w:t>
+      </w:r>
+    </w:p>
+    <w:p>
+      <w:pPr>
+        <w:pStyle w:val="Compact"/>
+        <w:numPr>
+          <w:ilvl w:val="0"/>
+          <w:numId w:val="1007"/>
+        </w:numPr>
+      </w:pPr>
+      <w:r>
+        <w:t xml:space="preserve">Established engineering workflow: pair programming, automated testing (Karma/Chai), continuous integration, and rapid deployment processes.</w:t>
+      </w:r>
+    </w:p>
+    <w:p>
+      <w:pPr>
+        <w:pStyle w:val="Compact"/>
+        <w:numPr>
+          <w:ilvl w:val="0"/>
+          <w:numId w:val="1007"/>
+        </w:numPr>
+      </w:pPr>
+      <w:r>
+        <w:t xml:space="preserve">Co-led product strategy, monetization, and launch planning.</w:t>
+      </w:r>
+    </w:p>
+    <w:bookmarkEnd w:id="25"/>
+    <w:bookmarkEnd w:id="26"/>
+    <w:bookmarkStart w:id="27" w:name="earlier-career-2001---2014"/>
+    <w:p>
+      <w:pPr>
+        <w:pStyle w:val="Heading3"/>
+      </w:pPr>
+      <w:r>
+        <w:t xml:space="preserve">Earlier Career (2001 - 2014)</w:t>
+      </w:r>
+    </w:p>
+    <w:p>
+      <w:pPr>
+        <w:pStyle w:val="Compact"/>
+        <w:numPr>
+          <w:ilvl w:val="0"/>
+          <w:numId w:val="1008"/>
+        </w:numPr>
+      </w:pPr>
+      <w:r>
+        <w:rPr>
+          <w:b/>
+          <w:bCs/>
+        </w:rPr>
+        <w:t xml:space="preserve">Consultant &amp; Entrepreneur</w:t>
+      </w:r>
+      <w:r>
+        <w:t xml:space="preserve"> </w:t>
+      </w:r>
+      <w:r>
+        <w:t xml:space="preserve">(2008 - 2014): Founded OpenTest Pro (automated testing education). Built e-commerce ordering system for Turnbull &amp; Asser shirtmakers. Full-stack consulting in Ruby on Rails, Node.js, D3 data visualization. Rapid prototyping and client delivery.</w:t>
+      </w:r>
+    </w:p>
+    <w:p>
+      <w:pPr>
+        <w:pStyle w:val="Compact"/>
+        <w:numPr>
+          <w:ilvl w:val="0"/>
+          <w:numId w:val="1008"/>
+        </w:numPr>
+      </w:pPr>
+      <w:r>
+        <w:rPr>
+          <w:b/>
+          <w:bCs/>
+        </w:rPr>
+        <w:t xml:space="preserve">Web Developer, OnForce, Inc</w:t>
+      </w:r>
+      <w:r>
+        <w:t xml:space="preserve"> </w:t>
+      </w:r>
+      <w:r>
+        <w:t xml:space="preserve">(2006 - 2007): Introduced automated testing and CI. Built comprehensive API test suite. Integrated platform with Salesforce APIs.</w:t>
+      </w:r>
+    </w:p>
+    <w:p>
+      <w:pPr>
+        <w:pStyle w:val="Compact"/>
+        <w:numPr>
+          <w:ilvl w:val="0"/>
+          <w:numId w:val="1008"/>
+        </w:numPr>
+      </w:pPr>
+      <w:r>
+        <w:rPr>
+          <w:b/>
+          <w:bCs/>
+        </w:rPr>
+        <w:t xml:space="preserve">Development Lead, JBA Network</w:t>
+      </w:r>
+      <w:r>
+        <w:t xml:space="preserve"> </w:t>
+      </w:r>
+      <w:r>
+        <w:t xml:space="preserve">(2003 - 2006): Lead programmer and project manager for mynewsletterbuilder.com. Architected the initial release, then built and scaled the development team.</w:t>
+      </w:r>
+    </w:p>
+    <w:bookmarkEnd w:id="27"/>
     <w:bookmarkEnd w:id="28"/>
-    <w:bookmarkEnd w:id="29"/>
-    <w:bookmarkStart w:id="31" w:name="co-founder-software-engineer"/>
+    <w:bookmarkStart w:id="33" w:name="open-source-projects"/>
+    <w:p>
+      <w:pPr>
+        <w:pStyle w:val="Heading2"/>
+      </w:pPr>
+      <w:r>
+        <w:t xml:space="preserve">Open Source Projects</w:t>
+      </w:r>
+    </w:p>
+    <w:bookmarkStart w:id="30" w:name="scan-mcp-2024---present"/>
     <w:p>
       <w:pPr>
         <w:pStyle w:val="Heading3"/>
       </w:pPr>
       <w:r>
-        <w:t xml:space="preserve">Co-founder &amp; Software Engineer</w:t>
-      </w:r>
-    </w:p>
-    <w:bookmarkStart w:id="30" w:name="Xabfc89ad0ecf455a67a7dad8c9e074f0d6e313c"/>
-    <w:p>
-      <w:pPr>
-        <w:pStyle w:val="Heading4"/>
-      </w:pPr>
-      <w:r>
-        <w:t xml:space="preserve">Alchemy Astrology (formerly Mirror Astrology) | Nov 2024 - Jul 2026 | Remote</w:t>
-      </w:r>
-    </w:p>
-    <w:p>
-      <w:pPr>
-        <w:pStyle w:val="Compact"/>
-        <w:numPr>
-          <w:ilvl w:val="0"/>
-          <w:numId w:val="1004"/>
-        </w:numPr>
-      </w:pPr>
-      <w:r>
-        <w:t xml:space="preserve">Owned front-end development: Ruby on Rails views, JavaScript, HTML+CSS, Tailwind, responsive UI/UX.</w:t>
-      </w:r>
-    </w:p>
-    <w:p>
-      <w:pPr>
-        <w:pStyle w:val="Compact"/>
-        <w:numPr>
-          <w:ilvl w:val="0"/>
-          <w:numId w:val="1004"/>
-        </w:numPr>
-      </w:pPr>
-      <w:r>
-        <w:t xml:space="preserve">Led design and UX delivery, working with freelance designers and translating their designs into the Rails framework.</w:t>
-      </w:r>
-    </w:p>
-    <w:p>
-      <w:pPr>
-        <w:pStyle w:val="Compact"/>
-        <w:numPr>
-          <w:ilvl w:val="0"/>
-          <w:numId w:val="1004"/>
-        </w:numPr>
-      </w:pPr>
-      <w:r>
-        <w:t xml:space="preserve">Collaborated on back-end development: Stripe integration, SSO authentication, Rails MVC.</w:t>
-      </w:r>
-    </w:p>
-    <w:p>
-      <w:pPr>
-        <w:pStyle w:val="Compact"/>
-        <w:numPr>
-          <w:ilvl w:val="0"/>
-          <w:numId w:val="1004"/>
-        </w:numPr>
-      </w:pPr>
-      <w:r>
-        <w:t xml:space="preserve">Collaborated closely with co-founders on product direction, Figma design, UX, roadmap planning, and prioritization.</w:t>
-      </w:r>
-    </w:p>
-    <w:bookmarkEnd w:id="30"/>
-    <w:bookmarkEnd w:id="31"/>
-    <w:bookmarkStart w:id="33" w:name="infrastructure-engineer"/>
-    <w:p>
-      <w:pPr>
-        <w:pStyle w:val="Heading3"/>
-      </w:pPr>
-      <w:r>
-        <w:t xml:space="preserve">Infrastructure Engineer</w:t>
-      </w:r>
-    </w:p>
-    <w:bookmarkStart w:id="32" w:name="tobiko-mar-2024---oct-2024-remote"/>
-    <w:p>
-      <w:pPr>
-        <w:pStyle w:val="Heading4"/>
-      </w:pPr>
-      <w:r>
-        <w:t xml:space="preserve">Tobiko | Mar 2024 - Oct 2024 | Remote</w:t>
-      </w:r>
-    </w:p>
-    <w:p>
-      <w:pPr>
-        <w:pStyle w:val="Compact"/>
-        <w:numPr>
-          <w:ilvl w:val="0"/>
-          <w:numId w:val="1005"/>
-        </w:numPr>
-      </w:pPr>
-      <w:r>
-        <w:t xml:space="preserve">Architected and implemented a scalable cloud platform serving customer workloads at a fast-paced startup.</w:t>
-      </w:r>
-    </w:p>
-    <w:p>
-      <w:pPr>
-        <w:pStyle w:val="Compact"/>
-        <w:numPr>
-          <w:ilvl w:val="0"/>
-          <w:numId w:val="1005"/>
-        </w:numPr>
-      </w:pPr>
-      <w:r>
-        <w:t xml:space="preserve">Built CI/CD patterns including mono-repo conditional workflows, workload identity federation, and continuous delivery.</w:t>
-      </w:r>
-    </w:p>
-    <w:p>
-      <w:pPr>
-        <w:pStyle w:val="Compact"/>
-        <w:numPr>
-          <w:ilvl w:val="0"/>
-          <w:numId w:val="1005"/>
-        </w:numPr>
-      </w:pPr>
-      <w:r>
-        <w:t xml:space="preserve">Implemented a Slack-based customer support and incident response platform; onboarded teammates and customers.</w:t>
-      </w:r>
-    </w:p>
-    <w:p>
-      <w:pPr>
-        <w:pStyle w:val="Compact"/>
-        <w:numPr>
-          <w:ilvl w:val="0"/>
-          <w:numId w:val="1005"/>
-        </w:numPr>
-      </w:pPr>
-      <w:r>
-        <w:t xml:space="preserve">Python, Pulumi, GCP, GKE, Cloud Run, CircleCI, Helm, SQLMesh.</w:t>
-      </w:r>
-    </w:p>
-    <w:bookmarkEnd w:id="32"/>
-    <w:bookmarkEnd w:id="33"/>
-    <w:bookmarkStart w:id="35" w:name="X7a2c313efdde198d901363c762c81839771c845"/>
-    <w:p>
-      <w:pPr>
-        <w:pStyle w:val="Heading3"/>
-      </w:pPr>
-      <w:r>
-        <w:t xml:space="preserve">Engineering Manager / Principal Software Engineer</w:t>
-      </w:r>
-    </w:p>
-    <w:bookmarkStart w:id="34" w:name="X47289269eb944414c9285d314973b45c253bcef"/>
-    <w:p>
-      <w:pPr>
-        <w:pStyle w:val="Heading4"/>
-      </w:pPr>
-      <w:r>
-        <w:t xml:space="preserve">Mavenlink / Kantata | Apr 2017 - Dec 2023 | San Francisco, CA</w:t>
-      </w:r>
-    </w:p>
-    <w:p>
-      <w:pPr>
-        <w:pStyle w:val="Compact"/>
-        <w:numPr>
-          <w:ilvl w:val="0"/>
-          <w:numId w:val="1006"/>
-        </w:numPr>
-      </w:pPr>
-      <w:r>
-        <w:rPr>
-          <w:b/>
-          <w:bCs/>
-        </w:rPr>
-        <w:t xml:space="preserve">M-Bridge Integration Platform</w:t>
-      </w:r>
-      <w:r>
-        <w:t xml:space="preserve"> </w:t>
-      </w:r>
-      <w:r>
-        <w:t xml:space="preserve">(2 years): Led a team to stabilize and scale an agent-based integration platform handling multi-system data orchestration. Established operational metrics and monitoring that reduced errors and incidents by ~100x. Executed a zero-downtime migration to Kubernetes including relational, document, and cache databases.</w:t>
-      </w:r>
-    </w:p>
-    <w:p>
-      <w:pPr>
-        <w:pStyle w:val="Compact"/>
-        <w:numPr>
-          <w:ilvl w:val="0"/>
-          <w:numId w:val="1006"/>
-        </w:numPr>
-      </w:pPr>
-      <w:r>
-        <w:rPr>
-          <w:b/>
-          <w:bCs/>
-        </w:rPr>
-        <w:t xml:space="preserve">Infrastructure Platform</w:t>
-      </w:r>
-      <w:r>
-        <w:t xml:space="preserve"> </w:t>
-      </w:r>
-      <w:r>
-        <w:t xml:space="preserve">(4 years): Recruited and built a new team from scratch dedicated to the infrastructure platform. Led the organization’s DevOps culture transformation, serving as a change agent and technical authority across engineering. Owned roadmap stewardship, requirements triage, and priority management while staying hands-on with coding, architecture, and code review. Transitioned a large legacy codebase to cloud-native, Infrastructure-as-Code tooling (Terraform, Ansible, Kubernetes).</w:t>
-      </w:r>
-    </w:p>
-    <w:p>
-      <w:pPr>
-        <w:pStyle w:val="Compact"/>
-        <w:numPr>
-          <w:ilvl w:val="0"/>
-          <w:numId w:val="1006"/>
-        </w:numPr>
-      </w:pPr>
-      <w:r>
-        <w:rPr>
-          <w:b/>
-          <w:bCs/>
-        </w:rPr>
-        <w:t xml:space="preserve">BI Data Pipeline</w:t>
-      </w:r>
-      <w:r>
-        <w:t xml:space="preserve"> </w:t>
-      </w:r>
-      <w:r>
-        <w:t xml:space="preserve">(3 months): Led a transition team to take ownership of and improve the analytics data pipeline. Migrated the pipeline to Kubernetes.</w:t>
-      </w:r>
-    </w:p>
-    <w:p>
-      <w:pPr>
-        <w:pStyle w:val="Compact"/>
-        <w:numPr>
-          <w:ilvl w:val="0"/>
-          <w:numId w:val="1006"/>
-        </w:numPr>
-      </w:pPr>
-      <w:r>
-        <w:rPr>
-          <w:b/>
-          <w:bCs/>
-        </w:rPr>
-        <w:t xml:space="preserve">Cross-Functional Impact</w:t>
-      </w:r>
-      <w:r>
-        <w:t xml:space="preserve">: Grew multiple junior engineers into senior SWE and Engineering Manager roles, and mentored engineers across teams. Led interviewing and hiring. Drove organizational change management and process optimization.</w:t>
-      </w:r>
-      <w:r>
-        <w:t xml:space="preserve"> </w:t>
-      </w:r>
-      <w:r>
-        <w:rPr>
-          <w:b/>
-          <w:bCs/>
-        </w:rPr>
-        <w:t xml:space="preserve">Top Performer Award, 2021</w:t>
-      </w:r>
-      <w:r>
-        <w:t xml:space="preserve">.</w:t>
-      </w:r>
-    </w:p>
-    <w:bookmarkEnd w:id="34"/>
-    <w:bookmarkEnd w:id="35"/>
-    <w:bookmarkStart w:id="37" w:name="lead-developer-co-founder"/>
-    <w:p>
-      <w:pPr>
-        <w:pStyle w:val="Heading3"/>
-      </w:pPr>
-      <w:r>
-        <w:t xml:space="preserve">Lead Developer, Co-founder</w:t>
-      </w:r>
-    </w:p>
-    <w:bookmarkStart w:id="36" w:name="pegg-2014---2017-san-francisco-ca"/>
-    <w:p>
-      <w:pPr>
-        <w:pStyle w:val="Heading4"/>
-      </w:pPr>
-      <w:r>
-        <w:t xml:space="preserve">Pegg | 2014 - 2017 | San Francisco, CA</w:t>
-      </w:r>
-    </w:p>
-    <w:p>
-      <w:pPr>
-        <w:pStyle w:val="Compact"/>
-        <w:numPr>
-          <w:ilvl w:val="0"/>
-          <w:numId w:val="1007"/>
-        </w:numPr>
-      </w:pPr>
-      <w:r>
-        <w:t xml:space="preserve">Designed, architected, and built a cross-platform mobile app from scratch (iOS/Android). Node.js backend, JS/Phonegap frontend, Firebase real-time systems, CI/CD to AWS/CloudFront via CircleCI.</w:t>
-      </w:r>
-    </w:p>
-    <w:p>
-      <w:pPr>
-        <w:pStyle w:val="Compact"/>
-        <w:numPr>
-          <w:ilvl w:val="0"/>
-          <w:numId w:val="1007"/>
-        </w:numPr>
-      </w:pPr>
-      <w:r>
-        <w:t xml:space="preserve">Established engineering workflow: pair programming, automated testing (Karma/Chai), continuous integration, and rapid deployment processes.</w:t>
-      </w:r>
-    </w:p>
-    <w:p>
-      <w:pPr>
-        <w:pStyle w:val="Compact"/>
-        <w:numPr>
-          <w:ilvl w:val="0"/>
-          <w:numId w:val="1007"/>
-        </w:numPr>
-      </w:pPr>
-      <w:r>
-        <w:t xml:space="preserve">Co-led product strategy, monetization, and launch planning.</w:t>
-      </w:r>
-    </w:p>
-    <w:bookmarkEnd w:id="36"/>
-    <w:bookmarkEnd w:id="37"/>
-    <w:bookmarkStart w:id="38" w:name="earlier-career-2001---2014"/>
-    <w:p>
-      <w:pPr>
-        <w:pStyle w:val="Heading3"/>
-      </w:pPr>
-      <w:r>
-        <w:t xml:space="preserve">Earlier Career (2001 - 2014)</w:t>
-      </w:r>
-    </w:p>
-    <w:p>
-      <w:pPr>
-        <w:pStyle w:val="Compact"/>
-        <w:numPr>
-          <w:ilvl w:val="0"/>
-          <w:numId w:val="1008"/>
-        </w:numPr>
-      </w:pPr>
-      <w:r>
-        <w:rPr>
-          <w:b/>
-          <w:bCs/>
-        </w:rPr>
-        <w:t xml:space="preserve">Consultant &amp; Entrepreneur</w:t>
-      </w:r>
-      <w:r>
-        <w:t xml:space="preserve"> </w:t>
-      </w:r>
-      <w:r>
-        <w:t xml:space="preserve">(2008 - 2014): Founded OpenTest Pro (automated testing education). Built e-commerce ordering system for Turnbull &amp; Asser shirtmakers. Full-stack consulting in Ruby on Rails, Node.js, D3 data visualization. Rapid prototyping and client delivery.</w:t>
-      </w:r>
-    </w:p>
-    <w:p>
-      <w:pPr>
-        <w:pStyle w:val="Compact"/>
-        <w:numPr>
-          <w:ilvl w:val="0"/>
-          <w:numId w:val="1008"/>
-        </w:numPr>
-      </w:pPr>
-      <w:r>
-        <w:rPr>
-          <w:b/>
-          <w:bCs/>
-        </w:rPr>
-        <w:t xml:space="preserve">Web Developer, OnForce, Inc</w:t>
-      </w:r>
-      <w:r>
-        <w:t xml:space="preserve"> </w:t>
-      </w:r>
-      <w:r>
-        <w:t xml:space="preserve">(2006 - 2007): Introduced automated testing and CI. Built comprehensive API test suite. Integrated platform with Salesforce APIs.</w:t>
-      </w:r>
-    </w:p>
-    <w:p>
-      <w:pPr>
-        <w:pStyle w:val="Compact"/>
-        <w:numPr>
-          <w:ilvl w:val="0"/>
-          <w:numId w:val="1008"/>
-        </w:numPr>
-      </w:pPr>
-      <w:r>
-        <w:rPr>
-          <w:b/>
-          <w:bCs/>
-        </w:rPr>
-        <w:t xml:space="preserve">Development Lead, JBA Network</w:t>
-      </w:r>
-      <w:r>
-        <w:t xml:space="preserve"> </w:t>
-      </w:r>
-      <w:r>
-        <w:t xml:space="preserve">(2003 - 2006): Lead programmer and project manager for mynewsletterbuilder.com. Architected the initial release, then built and scaled the development team.</w:t>
-      </w:r>
-    </w:p>
-    <w:bookmarkEnd w:id="38"/>
-    <w:bookmarkEnd w:id="39"/>
-    <w:bookmarkStart w:id="44" w:name="open-source-projects"/>
-    <w:p>
-      <w:pPr>
-        <w:pStyle w:val="Heading2"/>
-      </w:pPr>
-      <w:r>
-        <w:t xml:space="preserve">Open Source Projects</w:t>
-      </w:r>
-    </w:p>
-    <w:bookmarkStart w:id="41" w:name="scan-mcp-2024---present"/>
-    <w:p>
-      <w:pPr>
-        <w:pStyle w:val="Heading3"/>
-      </w:pPr>
-      <w:r>
         <w:t xml:space="preserve">Scan MCP (2024 - Present)</w:t>
       </w:r>
     </w:p>
@@ -1001,7 +1001,7 @@
       <w:pPr>
         <w:pStyle w:val="BodyText"/>
       </w:pPr>
-      <w:hyperlink r:id="rId40">
+      <w:hyperlink r:id="rId29">
         <w:r>
           <w:rPr>
             <w:rStyle w:val="Hyperlink"/>
@@ -1010,8 +1010,8 @@
         </w:r>
       </w:hyperlink>
     </w:p>
-    <w:bookmarkEnd w:id="41"/>
-    <w:bookmarkStart w:id="43" w:name="humanebench-2024---present"/>
+    <w:bookmarkEnd w:id="30"/>
+    <w:bookmarkStart w:id="32" w:name="humanebench-2024---present"/>
     <w:p>
       <w:pPr>
         <w:pStyle w:val="Heading3"/>
@@ -1032,7 +1032,7 @@
       <w:pPr>
         <w:pStyle w:val="BodyText"/>
       </w:pPr>
-      <w:hyperlink r:id="rId42">
+      <w:hyperlink r:id="rId31">
         <w:r>
           <w:rPr>
             <w:rStyle w:val="Hyperlink"/>
@@ -1041,9 +1041,9 @@
         </w:r>
       </w:hyperlink>
     </w:p>
-    <w:bookmarkEnd w:id="43"/>
-    <w:bookmarkEnd w:id="44"/>
-    <w:bookmarkStart w:id="45" w:name="skills"/>
+    <w:bookmarkEnd w:id="32"/>
+    <w:bookmarkEnd w:id="33"/>
+    <w:bookmarkStart w:id="34" w:name="skills"/>
     <w:p>
       <w:pPr>
         <w:pStyle w:val="Heading2"/>
@@ -1163,7 +1163,7 @@
         <w:t xml:space="preserve">AI/LLM</w:t>
       </w:r>
       <w:r>
-        <w:t xml:space="preserve">: MCP (Model Context Protocol), chatbot development, prompt engineering, tool use, context augmentation, AI-assisted developer workflows.</w:t>
+        <w:t xml:space="preserve">: MCP (Model Context Protocol), chatbot development, prompt engineering, context augmentation, AI-assisted developer workflows.</w:t>
       </w:r>
     </w:p>
     <w:p>
@@ -1185,8 +1185,8 @@
         <w:t xml:space="preserve">: Team Building, Coaching &amp; Mentoring, Cross-Functional Collaboration, Roadmap Ownership, Hiring, Agile/Scrum/Kanban, Change Management.</w:t>
       </w:r>
     </w:p>
-    <w:bookmarkEnd w:id="45"/>
-    <w:bookmarkStart w:id="48" w:name="education"/>
+    <w:bookmarkEnd w:id="34"/>
+    <w:bookmarkStart w:id="37" w:name="education"/>
     <w:p>
       <w:pPr>
         <w:pStyle w:val="Heading2"/>
@@ -1195,7 +1195,7 @@
         <w:t xml:space="preserve">Education</w:t>
       </w:r>
     </w:p>
-    <w:bookmarkStart w:id="47" w:name="X8aa14d071da44b7f3006e1d49a262db674bce64"/>
+    <w:bookmarkStart w:id="36" w:name="X8aa14d071da44b7f3006e1d49a262db674bce64"/>
     <w:p>
       <w:pPr>
         <w:pStyle w:val="Heading3"/>
@@ -1204,7 +1204,7 @@
         <w:t xml:space="preserve">BA in Mathematics, minor in Computer Science</w:t>
       </w:r>
     </w:p>
-    <w:bookmarkStart w:id="46" w:name="Xe220d86d70cd5bf8ee7040adf9411d63a6235ab"/>
+    <w:bookmarkStart w:id="35" w:name="Xe220d86d70cd5bf8ee7040adf9411d63a6235ab"/>
     <w:p>
       <w:pPr>
         <w:pStyle w:val="Heading4"/>
@@ -1225,10 +1225,10 @@
         <w:t xml:space="preserve">Graduated with distinction in Mathematics. Undergraduate research in 4D fractals.</w:t>
       </w:r>
     </w:p>
-    <w:bookmarkEnd w:id="46"/>
-    <w:bookmarkEnd w:id="47"/>
-    <w:bookmarkEnd w:id="48"/>
-    <w:bookmarkStart w:id="49" w:name="recommendations"/>
+    <w:bookmarkEnd w:id="35"/>
+    <w:bookmarkEnd w:id="36"/>
+    <w:bookmarkEnd w:id="37"/>
+    <w:bookmarkStart w:id="38" w:name="recommendations"/>
     <w:p>
       <w:pPr>
         <w:pStyle w:val="Heading2"/>
@@ -1480,7 +1480,7 @@
       <w:pPr>
         <w:pStyle w:val="BodyText"/>
       </w:pPr>
-      <w:hyperlink r:id="rId22">
+      <w:hyperlink r:id="rId11">
         <w:r>
           <w:rPr>
             <w:rStyle w:val="Hyperlink"/>
@@ -1489,8 +1489,8 @@
         </w:r>
       </w:hyperlink>
     </w:p>
-    <w:bookmarkEnd w:id="49"/>
-    <w:bookmarkEnd w:id="50"/>
+    <w:bookmarkEnd w:id="38"/>
+    <w:bookmarkEnd w:id="39"/>
     <w:sectPr>
       <w:footnotePr>
         <w:numRestart w:val="eachSect"/>
@@ -1745,10 +1745,10 @@
   <w:docDefaults>
     <w:rPrDefault>
       <w:rPr>
-        <w:rFonts w:asciiTheme="minorHAnsi" w:cstheme="minorBidi" w:eastAsiaTheme="minorHAnsi" w:hAnsiTheme="minorHAnsi"/>
+        <w:rFonts w:asciiTheme="minorHAnsi" w:cstheme="minorBidi" w:eastAsiaTheme="minorEastAsia" w:hAnsiTheme="minorHAnsi"/>
         <w:sz w:val="24"/>
         <w:szCs w:val="24"/>
-        <w:lang w:bidi="ar-SA" w:eastAsia="en-US" w:val="en-US"/>
+        <w:lang w:bidi="ar-SA" w:eastAsia="zh-CN" w:val="en-US"/>
       </w:rPr>
     </w:rPrDefault>
     <w:pPrDefault>
@@ -1800,8 +1800,6 @@
     </w:pPr>
     <w:rPr>
       <w:rFonts w:asciiTheme="majorHAnsi" w:cstheme="majorBidi" w:eastAsiaTheme="majorEastAsia" w:hAnsiTheme="majorHAnsi"/>
-      <w:spacing w:val="-10"/>
-      <w:kern w:val="28"/>
       <w:sz w:val="56"/>
       <w:szCs w:val="56"/>
     </w:rPr>
@@ -1814,8 +1812,6 @@
     <w:rsid w:val="00A10FD9"/>
     <w:rPr>
       <w:rFonts w:asciiTheme="majorHAnsi" w:cstheme="majorBidi" w:eastAsiaTheme="majorEastAsia" w:hAnsiTheme="majorHAnsi"/>
-      <w:spacing w:val="-10"/>
-      <w:kern w:val="28"/>
       <w:sz w:val="56"/>
       <w:szCs w:val="56"/>
     </w:rPr>
@@ -1856,23 +1852,31 @@
   </w:style>
   <w:style w:customStyle="1" w:styleId="Author" w:type="paragraph">
     <w:name w:val="Author"/>
+    <w:basedOn w:val="Title"/>
     <w:next w:val="BodyText"/>
     <w:qFormat/>
     <w:pPr>
       <w:keepNext/>
       <w:keepLines/>
-      <w:jc w:val="center"/>
     </w:pPr>
+    <w:rPr>
+      <w:sz w:val="24"/>
+      <w:szCs w:val="24"/>
+    </w:rPr>
   </w:style>
   <w:style w:styleId="Date" w:type="paragraph">
     <w:name w:val="Date"/>
+    <w:basedOn w:val="Title"/>
     <w:next w:val="BodyText"/>
     <w:qFormat/>
     <w:pPr>
       <w:keepNext/>
       <w:keepLines/>
-      <w:jc w:val="center"/>
     </w:pPr>
+    <w:rPr>
+      <w:sz w:val="24"/>
+      <w:szCs w:val="24"/>
+    </w:rPr>
   </w:style>
   <w:style w:customStyle="1" w:styleId="AbstractTitle" w:type="paragraph">
     <w:name w:val="Abstract Title"/>
@@ -2285,13 +2289,6 @@
       </w:tblCellMar>
     </w:tblPr>
     <w:tblStylePr w:type="firstRow">
-      <w:tblPr>
-        <w:jc w:val="left"/>
-        <w:tblInd w:type="dxa" w:w="0"/>
-      </w:tblPr>
-      <w:trPr>
-        <w:jc w:val="left"/>
-      </w:trPr>
       <w:tcPr>
         <w:tcBorders>
           <w:bottom w:val="single"/>

</xml_diff>

<commit_message>
Recommendations: restore verbatim LinkedIn quote text
Co-Authored-By: Claude Sonnet 5 <noreply@anthropic.com>
Claude-Session: https://claude.ai/code/session_01Nz6BxGRTxi9CroabChJsyu
</commit_message>
<xml_diff>
--- a/resume.docx
+++ b/resume.docx
@@ -1284,7 +1284,36 @@
         <w:t xml:space="preserve">the solutions he architects, builds, and collaborates on come out better</w:t>
       </w:r>
       <w:r>
-        <w:t xml:space="preserve">. Jack also strives to be at the forefront of new technology and assess how he can leverage it. He does all this with a</w:t>
+        <w:t xml:space="preserve">. Jack also strives to be</w:t>
+      </w:r>
+      <w:r>
+        <w:t xml:space="preserve"> </w:t>
+      </w:r>
+      <w:r>
+        <w:rPr>
+          <w:b/>
+          <w:bCs/>
+        </w:rPr>
+        <w:t xml:space="preserve">at the forefront of new technology</w:t>
+      </w:r>
+      <w:r>
+        <w:t xml:space="preserve"> </w:t>
+      </w:r>
+      <w:r>
+        <w:t xml:space="preserve">and assess how he can leverage it. Newer tech like GenAI can be complex and ever-evolving, and</w:t>
+      </w:r>
+      <w:r>
+        <w:t xml:space="preserve"> </w:t>
+      </w:r>
+      <w:r>
+        <w:rPr>
+          <w:b/>
+          <w:bCs/>
+        </w:rPr>
+        <w:t xml:space="preserve">Jack is not one to back down but step up and embrace</w:t>
+      </w:r>
+      <w:r>
+        <w:t xml:space="preserve">. He does all this with a</w:t>
       </w:r>
       <w:r>
         <w:t xml:space="preserve"> </w:t>
@@ -1356,17 +1385,17 @@
         <w:t xml:space="preserve">forming me into the engineer that I am today</w:t>
       </w:r>
       <w:r>
-        <w:t xml:space="preserve">.</w:t>
-      </w:r>
-      <w:r>
-        <w:t xml:space="preserve"> </w:t>
-      </w:r>
-      <w:r>
-        <w:rPr>
-          <w:b/>
-          <w:bCs/>
-        </w:rPr>
-        <w:t xml:space="preserve">His mentorship was a key factor in elevating me from an incoming Junior Engineer to an Engineering Manager</w:t>
+        <w:t xml:space="preserve">. Throughout our time together, Jack was caring and invested in helping me set goals and develop my career.</w:t>
+      </w:r>
+      <w:r>
+        <w:t xml:space="preserve"> </w:t>
+      </w:r>
+      <w:r>
+        <w:rPr>
+          <w:b/>
+          <w:bCs/>
+        </w:rPr>
+        <w:t xml:space="preserve">His mentorship was a key factor in elevating myself from an incoming Junior Engineer to an Engineering Manager</w:t>
       </w:r>
       <w:r>
         <w:t xml:space="preserve">. Jack has a great curiosity and a strong set of technical capabilities that allow him to serve as a great example for others and a key contributor to any team!”</w:t>
@@ -1381,7 +1410,7 @@
           <w:i/>
           <w:iCs/>
         </w:rPr>
-        <w:t xml:space="preserve">— Wesley Morlock, Engineering Manager, Kantata</w:t>
+        <w:t xml:space="preserve">— Wesley Morlock, Engineering Director, Kantata</w:t>
       </w:r>
     </w:p>
     <w:p>

</xml_diff>